<commit_message>
feat: add terrain GRID and contour conversion APIs
</commit_message>
<xml_diff>
--- a/docs/manuals/dterrain_DLL开发使用手册.docx
+++ b/docs/manuals/dterrain_DLL开发使用手册.docx
@@ -70,7 +70,7 @@
           <w:color w:val="1F4D78"/>
           <w:sz w:val="28"/>
         </w:rPr>
-        <w:t>面向测绘地形建模的批量建网、动态编辑与空间查询</w:t>
+        <w:t>面向测绘地形建模的 TIN、GRID、等高线转换、动态编辑与空间查询</w:t>
       </w:r>
     </w:p>
     <w:p>
@@ -85,7 +85,7 @@
           <w:color w:val="203748"/>
           <w:sz w:val="22"/>
         </w:rPr>
-        <w:t>版本 0.2.0  |  2026-07-14</w:t>
+        <w:t>版本 0.3.0  |  2026-07-15</w:t>
       </w:r>
     </w:p>
     <w:p>
@@ -237,7 +237,7 @@
                 <w:rFonts w:ascii="Calibri" w:hAnsi="Calibri" w:eastAsia="Microsoft YaHei"/>
                 <w:sz w:val="18"/>
               </w:rPr>
-              <w:t>0.2.0</w:t>
+              <w:t>0.3.0</w:t>
             </w:r>
           </w:p>
         </w:tc>
@@ -289,7 +289,7 @@
                 <w:rFonts w:ascii="Calibri" w:hAnsi="Calibri" w:eastAsia="Microsoft YaHei"/>
                 <w:sz w:val="18"/>
               </w:rPr>
-              <w:t>2026-07-14</w:t>
+              <w:t>2026-07-15</w:t>
             </w:r>
           </w:p>
         </w:tc>
@@ -445,7 +445,7 @@
                 <w:rFonts w:ascii="Calibri" w:hAnsi="Calibri" w:eastAsia="Microsoft YaHei"/>
                 <w:sz w:val="18"/>
               </w:rPr>
-              <w:t>架构、构建部署、稳定 C ABI、12 个兼容接口、文件格式、性能、线程安全、故障排查。</w:t>
+              <w:t>架构、构建部署、稳定 C ABI、GRID/等高线转换、异步任务、12 个兼容接口、文件格式、性能、线程安全、故障排查。</w:t>
             </w:r>
           </w:p>
         </w:tc>
@@ -483,6 +483,17 @@
         <w:rPr>
           <w:rFonts w:ascii="Calibri" w:hAnsi="Calibri" w:eastAsia="Microsoft YaHei"/>
         </w:rPr>
+        <w:t>地形转换：重点阅读第 4.6 章和第 6 章。</w:t>
+      </w:r>
+    </w:p>
+    <w:p>
+      <w:pPr>
+        <w:pStyle w:val="ListBullet"/>
+      </w:pPr>
+      <w:r>
+        <w:rPr>
+          <w:rFonts w:ascii="Calibri" w:hAnsi="Calibri" w:eastAsia="Microsoft YaHei"/>
+        </w:rPr>
         <w:t>兼容既有系统：重点阅读第 5 章的 12 个 Legacy 接口。</w:t>
       </w:r>
     </w:p>
@@ -526,7 +537,7 @@
         <w:rPr>
           <w:rFonts w:ascii="Calibri" w:hAnsi="Calibri" w:eastAsia="Microsoft YaHei"/>
         </w:rPr>
-        <w:t>本手册对应普通 Delaunay TIN 版本 0.2.0。约束线、外边界、孔洞和约束 Delaunay 为后续扩展，不属于当前已交付能力。</w:t>
+        <w:t>本手册对应 dterrain 0.3.0：已提供普通 Delaunay TIN、GRID、TIN/GRID 等高线和异步转换任务。GDAL 地理格式、约束线、外边界、孔洞、约束 Delaunay 和三维 GUI 属于后续阶段。</w:t>
       </w:r>
     </w:p>
     <w:p>
@@ -606,6 +617,39 @@
           <w:rFonts w:ascii="Calibri" w:hAnsi="Calibri" w:eastAsia="Microsoft YaHei"/>
         </w:rPr>
         <w:t>DTIN 二进制保存加载，以及 DTMESH 可读文本三角网交换。</w:t>
+      </w:r>
+    </w:p>
+    <w:p>
+      <w:pPr>
+        <w:pStyle w:val="ListBullet"/>
+      </w:pPr>
+      <w:r>
+        <w:rPr>
+          <w:rFonts w:ascii="Calibri" w:hAnsi="Calibri" w:eastAsia="Microsoft YaHei"/>
+        </w:rPr>
+        <w:t>双精度 GRID、仿射节点坐标、NoData、窗口读写和 DGRID 文本往返。</w:t>
+      </w:r>
+    </w:p>
+    <w:p>
+      <w:pPr>
+        <w:pStyle w:val="ListBullet"/>
+      </w:pPr>
+      <w:r>
+        <w:rPr>
+          <w:rFonts w:ascii="Calibri" w:hAnsi="Calibri" w:eastAsia="Microsoft YaHei"/>
+        </w:rPr>
+        <w:t>TIN→GRID、GRID→TIN，以及 TIN/GRID→等高线和 DCONTOUR 文本往返。</w:t>
+      </w:r>
+    </w:p>
+    <w:p>
+      <w:pPr>
+        <w:pStyle w:val="ListBullet"/>
+      </w:pPr>
+      <w:r>
+        <w:rPr>
+          <w:rFonts w:ascii="Calibri" w:hAnsi="Calibri" w:eastAsia="Microsoft YaHei"/>
+        </w:rPr>
+        <w:t>耗时转换的异步任务、进度、等待、协作取消和结果提取。</w:t>
       </w:r>
     </w:p>
     <w:p>
@@ -961,6 +1005,58 @@
           </w:p>
         </w:tc>
       </w:tr>
+      <w:tr>
+        <w:tc>
+          <w:tcPr>
+            <w:tcW w:type="dxa" w:w="2200"/>
+            <w:tcMar>
+              <w:top w:w="80" w:type="dxa"/>
+              <w:start w:w="120" w:type="dxa"/>
+              <w:bottom w:w="80" w:type="dxa"/>
+              <w:end w:w="120" w:type="dxa"/>
+            </w:tcMar>
+            <w:vAlign w:val="center"/>
+          </w:tcPr>
+          <w:p>
+            <w:pPr>
+              <w:spacing w:before="0" w:after="0" w:line="276" w:lineRule="auto"/>
+              <w:jc w:val="center"/>
+            </w:pPr>
+            <w:r>
+              <w:rPr>
+                <w:rFonts w:ascii="Calibri" w:hAnsi="Calibri" w:eastAsia="Microsoft YaHei"/>
+                <w:sz w:val="18"/>
+              </w:rPr>
+              <w:t>转换边界</w:t>
+            </w:r>
+          </w:p>
+        </w:tc>
+        <w:tc>
+          <w:tcPr>
+            <w:tcW w:type="dxa" w:w="7160"/>
+            <w:tcMar>
+              <w:top w:w="80" w:type="dxa"/>
+              <w:start w:w="120" w:type="dxa"/>
+              <w:bottom w:w="80" w:type="dxa"/>
+              <w:end w:w="120" w:type="dxa"/>
+            </w:tcMar>
+            <w:vAlign w:val="center"/>
+          </w:tcPr>
+          <w:p>
+            <w:pPr>
+              <w:spacing w:before="0" w:after="0" w:line="276" w:lineRule="auto"/>
+              <w:jc w:val="left"/>
+            </w:pPr>
+            <w:r>
+              <w:rPr>
+                <w:rFonts w:ascii="Calibri" w:hAnsi="Calibri" w:eastAsia="Microsoft YaHei"/>
+                <w:sz w:val="18"/>
+              </w:rPr>
+              <w:t>等高线是派生表达；0.3 尚未实现等高线反推 TIN/GRID。</w:t>
+            </w:r>
+          </w:p>
+        </w:tc>
+      </w:tr>
     </w:tbl>
     <w:p>
       <w:pPr>
@@ -985,7 +1081,7 @@
         <w:rPr>
           <w:rFonts w:ascii="Calibri" w:hAnsi="Calibri" w:eastAsia="Microsoft YaHei"/>
         </w:rPr>
-        <w:t>当前版本不处理断裂线、外边界、孔洞及强制约束边；这些能力计划由后续约束 Delaunay 后端提供。</w:t>
+        <w:t>GRID→TIN 当前重建普通 Delaunay；遇到 NoData 默认拒绝，显式允许时可能跨空洞构网。严格边界、孔洞和强制约束边计划由后续约束 Delaunay 后端提供。</w:t>
       </w:r>
     </w:p>
     <w:p>
@@ -1034,7 +1130,7 @@
           <w:rFonts w:ascii="Consolas" w:hAnsi="Consolas" w:eastAsia="Microsoft YaHei"/>
           <w:sz w:val="17"/>
         </w:rPr>
-        <w:t>稳定 C ABI + Legacy 兼容层</w:t>
+        <w:t>稳定 C ABI + Terrain API + Task API + Legacy 兼容层</w:t>
       </w:r>
       <w:r>
         <w:br/>
@@ -1114,7 +1210,27 @@
           <w:rFonts w:ascii="Consolas" w:hAnsi="Consolas" w:eastAsia="Microsoft YaHei"/>
           <w:sz w:val="17"/>
         </w:rPr>
-        <w:t>DTIN / DTMESH / XYZ 持久化</w:t>
+        <w:t>DTIN / DTMESH / XYZ / DGRID / DCONTOUR 持久化</w:t>
+      </w:r>
+      <w:r>
+        <w:br/>
+      </w:r>
+      <w:r>
+        <w:rPr>
+          <w:rFonts w:ascii="Consolas" w:hAnsi="Consolas" w:eastAsia="Microsoft YaHei"/>
+          <w:sz w:val="17"/>
+        </w:rPr>
+        <w:t xml:space="preserve">        |</w:t>
+      </w:r>
+      <w:r>
+        <w:br/>
+      </w:r>
+      <w:r>
+        <w:rPr>
+          <w:rFonts w:ascii="Consolas" w:hAnsi="Consolas" w:eastAsia="Microsoft YaHei"/>
+          <w:sz w:val="17"/>
+        </w:rPr>
+        <w:t>GRID &lt;---- 转换引擎 ----&gt; TIN ----&gt; 等高线</w:t>
       </w:r>
     </w:p>
     <w:p>
@@ -1540,6 +1656,160 @@
                 <w:sz w:val="18"/>
               </w:rPr>
               <w:t>加速当前视口和矩形范围查询。</w:t>
+            </w:r>
+          </w:p>
+        </w:tc>
+      </w:tr>
+      <w:tr>
+        <w:tc>
+          <w:tcPr>
+            <w:tcW w:type="dxa" w:w="2400"/>
+            <w:tcMar>
+              <w:top w:w="80" w:type="dxa"/>
+              <w:start w:w="120" w:type="dxa"/>
+              <w:bottom w:w="80" w:type="dxa"/>
+              <w:end w:w="120" w:type="dxa"/>
+            </w:tcMar>
+            <w:vAlign w:val="center"/>
+          </w:tcPr>
+          <w:p>
+            <w:pPr>
+              <w:spacing w:before="0" w:after="0" w:line="276" w:lineRule="auto"/>
+              <w:jc w:val="center"/>
+            </w:pPr>
+            <w:r>
+              <w:rPr>
+                <w:rFonts w:ascii="Calibri" w:hAnsi="Calibri" w:eastAsia="Microsoft YaHei"/>
+                <w:sz w:val="18"/>
+              </w:rPr>
+              <w:t>Terrain Core</w:t>
+            </w:r>
+          </w:p>
+        </w:tc>
+        <w:tc>
+          <w:tcPr>
+            <w:tcW w:type="dxa" w:w="2500"/>
+            <w:tcMar>
+              <w:top w:w="80" w:type="dxa"/>
+              <w:start w:w="120" w:type="dxa"/>
+              <w:bottom w:w="80" w:type="dxa"/>
+              <w:end w:w="120" w:type="dxa"/>
+            </w:tcMar>
+            <w:vAlign w:val="center"/>
+          </w:tcPr>
+          <w:p>
+            <w:pPr>
+              <w:spacing w:before="0" w:after="0" w:line="276" w:lineRule="auto"/>
+              <w:jc w:val="left"/>
+            </w:pPr>
+            <w:r>
+              <w:rPr>
+                <w:rFonts w:ascii="Calibri" w:hAnsi="Calibri" w:eastAsia="Microsoft YaHei"/>
+                <w:sz w:val="18"/>
+              </w:rPr>
+              <w:t>GRID 与等高线转换</w:t>
+            </w:r>
+          </w:p>
+        </w:tc>
+        <w:tc>
+          <w:tcPr>
+            <w:tcW w:type="dxa" w:w="4460"/>
+            <w:tcMar>
+              <w:top w:w="80" w:type="dxa"/>
+              <w:start w:w="120" w:type="dxa"/>
+              <w:bottom w:w="80" w:type="dxa"/>
+              <w:end w:w="120" w:type="dxa"/>
+            </w:tcMar>
+            <w:vAlign w:val="center"/>
+          </w:tcPr>
+          <w:p>
+            <w:pPr>
+              <w:spacing w:before="0" w:after="0" w:line="276" w:lineRule="auto"/>
+              <w:jc w:val="left"/>
+            </w:pPr>
+            <w:r>
+              <w:rPr>
+                <w:rFonts w:ascii="Calibri" w:hAnsi="Calibri" w:eastAsia="Microsoft YaHei"/>
+                <w:sz w:val="18"/>
+              </w:rPr>
+              <w:t>不向 DLL 外暴露 C++ 容器和 CGAL 类型。</w:t>
+            </w:r>
+          </w:p>
+        </w:tc>
+      </w:tr>
+      <w:tr>
+        <w:tc>
+          <w:tcPr>
+            <w:tcW w:type="dxa" w:w="2400"/>
+            <w:tcMar>
+              <w:top w:w="80" w:type="dxa"/>
+              <w:start w:w="120" w:type="dxa"/>
+              <w:bottom w:w="80" w:type="dxa"/>
+              <w:end w:w="120" w:type="dxa"/>
+            </w:tcMar>
+            <w:vAlign w:val="center"/>
+          </w:tcPr>
+          <w:p>
+            <w:pPr>
+              <w:spacing w:before="0" w:after="0" w:line="276" w:lineRule="auto"/>
+              <w:jc w:val="center"/>
+            </w:pPr>
+            <w:r>
+              <w:rPr>
+                <w:rFonts w:ascii="Calibri" w:hAnsi="Calibri" w:eastAsia="Microsoft YaHei"/>
+                <w:sz w:val="18"/>
+              </w:rPr>
+              <w:t>Task Runtime</w:t>
+            </w:r>
+          </w:p>
+        </w:tc>
+        <w:tc>
+          <w:tcPr>
+            <w:tcW w:type="dxa" w:w="2500"/>
+            <w:tcMar>
+              <w:top w:w="80" w:type="dxa"/>
+              <w:start w:w="120" w:type="dxa"/>
+              <w:bottom w:w="80" w:type="dxa"/>
+              <w:end w:w="120" w:type="dxa"/>
+            </w:tcMar>
+            <w:vAlign w:val="center"/>
+          </w:tcPr>
+          <w:p>
+            <w:pPr>
+              <w:spacing w:before="0" w:after="0" w:line="276" w:lineRule="auto"/>
+              <w:jc w:val="left"/>
+            </w:pPr>
+            <w:r>
+              <w:rPr>
+                <w:rFonts w:ascii="Calibri" w:hAnsi="Calibri" w:eastAsia="Microsoft YaHei"/>
+                <w:sz w:val="18"/>
+              </w:rPr>
+              <w:t>后台转换任务</w:t>
+            </w:r>
+          </w:p>
+        </w:tc>
+        <w:tc>
+          <w:tcPr>
+            <w:tcW w:type="dxa" w:w="4460"/>
+            <w:tcMar>
+              <w:top w:w="80" w:type="dxa"/>
+              <w:start w:w="120" w:type="dxa"/>
+              <w:bottom w:w="80" w:type="dxa"/>
+              <w:end w:w="120" w:type="dxa"/>
+            </w:tcMar>
+            <w:vAlign w:val="center"/>
+          </w:tcPr>
+          <w:p>
+            <w:pPr>
+              <w:spacing w:before="0" w:after="0" w:line="276" w:lineRule="auto"/>
+              <w:jc w:val="left"/>
+            </w:pPr>
+            <w:r>
+              <w:rPr>
+                <w:rFonts w:ascii="Calibri" w:hAnsi="Calibri" w:eastAsia="Microsoft YaHei"/>
+                <w:sz w:val="18"/>
+              </w:rPr>
+              <w:t>保持源对象生命周期并提供协作取消。</w:t>
             </w:r>
           </w:p>
         </w:tc>
@@ -2442,6 +2712,160 @@
                 <w:sz w:val="18"/>
               </w:rPr>
               <w:t>推荐的稳定 C ABI。</w:t>
+            </w:r>
+          </w:p>
+        </w:tc>
+      </w:tr>
+      <w:tr>
+        <w:tc>
+          <w:tcPr>
+            <w:tcW w:type="dxa" w:w="3300"/>
+            <w:tcMar>
+              <w:top w:w="80" w:type="dxa"/>
+              <w:start w:w="120" w:type="dxa"/>
+              <w:bottom w:w="80" w:type="dxa"/>
+              <w:end w:w="120" w:type="dxa"/>
+            </w:tcMar>
+            <w:vAlign w:val="center"/>
+          </w:tcPr>
+          <w:p>
+            <w:pPr>
+              <w:spacing w:before="0" w:after="0" w:line="276" w:lineRule="auto"/>
+              <w:jc w:val="left"/>
+            </w:pPr>
+            <w:r>
+              <w:rPr>
+                <w:rFonts w:ascii="Calibri" w:hAnsi="Calibri" w:eastAsia="Microsoft YaHei"/>
+                <w:sz w:val="18"/>
+              </w:rPr>
+              <w:t>dt_terrain_api.h</w:t>
+            </w:r>
+          </w:p>
+        </w:tc>
+        <w:tc>
+          <w:tcPr>
+            <w:tcW w:type="dxa" w:w="1700"/>
+            <w:tcMar>
+              <w:top w:w="80" w:type="dxa"/>
+              <w:start w:w="120" w:type="dxa"/>
+              <w:bottom w:w="80" w:type="dxa"/>
+              <w:end w:w="120" w:type="dxa"/>
+            </w:tcMar>
+            <w:vAlign w:val="center"/>
+          </w:tcPr>
+          <w:p>
+            <w:pPr>
+              <w:spacing w:before="0" w:after="0" w:line="276" w:lineRule="auto"/>
+              <w:jc w:val="center"/>
+            </w:pPr>
+            <w:r>
+              <w:rPr>
+                <w:rFonts w:ascii="Calibri" w:hAnsi="Calibri" w:eastAsia="Microsoft YaHei"/>
+                <w:sz w:val="18"/>
+              </w:rPr>
+              <w:t>开发期</w:t>
+            </w:r>
+          </w:p>
+        </w:tc>
+        <w:tc>
+          <w:tcPr>
+            <w:tcW w:type="dxa" w:w="4360"/>
+            <w:tcMar>
+              <w:top w:w="80" w:type="dxa"/>
+              <w:start w:w="120" w:type="dxa"/>
+              <w:bottom w:w="80" w:type="dxa"/>
+              <w:end w:w="120" w:type="dxa"/>
+            </w:tcMar>
+            <w:vAlign w:val="center"/>
+          </w:tcPr>
+          <w:p>
+            <w:pPr>
+              <w:spacing w:before="0" w:after="0" w:line="276" w:lineRule="auto"/>
+              <w:jc w:val="left"/>
+            </w:pPr>
+            <w:r>
+              <w:rPr>
+                <w:rFonts w:ascii="Calibri" w:hAnsi="Calibri" w:eastAsia="Microsoft YaHei"/>
+                <w:sz w:val="18"/>
+              </w:rPr>
+              <w:t>GRID、等高线和同步转换接口。</w:t>
+            </w:r>
+          </w:p>
+        </w:tc>
+      </w:tr>
+      <w:tr>
+        <w:tc>
+          <w:tcPr>
+            <w:tcW w:type="dxa" w:w="3300"/>
+            <w:tcMar>
+              <w:top w:w="80" w:type="dxa"/>
+              <w:start w:w="120" w:type="dxa"/>
+              <w:bottom w:w="80" w:type="dxa"/>
+              <w:end w:w="120" w:type="dxa"/>
+            </w:tcMar>
+            <w:vAlign w:val="center"/>
+          </w:tcPr>
+          <w:p>
+            <w:pPr>
+              <w:spacing w:before="0" w:after="0" w:line="276" w:lineRule="auto"/>
+              <w:jc w:val="left"/>
+            </w:pPr>
+            <w:r>
+              <w:rPr>
+                <w:rFonts w:ascii="Calibri" w:hAnsi="Calibri" w:eastAsia="Microsoft YaHei"/>
+                <w:sz w:val="18"/>
+              </w:rPr>
+              <w:t>dt_task_api.h</w:t>
+            </w:r>
+          </w:p>
+        </w:tc>
+        <w:tc>
+          <w:tcPr>
+            <w:tcW w:type="dxa" w:w="1700"/>
+            <w:tcMar>
+              <w:top w:w="80" w:type="dxa"/>
+              <w:start w:w="120" w:type="dxa"/>
+              <w:bottom w:w="80" w:type="dxa"/>
+              <w:end w:w="120" w:type="dxa"/>
+            </w:tcMar>
+            <w:vAlign w:val="center"/>
+          </w:tcPr>
+          <w:p>
+            <w:pPr>
+              <w:spacing w:before="0" w:after="0" w:line="276" w:lineRule="auto"/>
+              <w:jc w:val="center"/>
+            </w:pPr>
+            <w:r>
+              <w:rPr>
+                <w:rFonts w:ascii="Calibri" w:hAnsi="Calibri" w:eastAsia="Microsoft YaHei"/>
+                <w:sz w:val="18"/>
+              </w:rPr>
+              <w:t>按需</w:t>
+            </w:r>
+          </w:p>
+        </w:tc>
+        <w:tc>
+          <w:tcPr>
+            <w:tcW w:type="dxa" w:w="4360"/>
+            <w:tcMar>
+              <w:top w:w="80" w:type="dxa"/>
+              <w:start w:w="120" w:type="dxa"/>
+              <w:bottom w:w="80" w:type="dxa"/>
+              <w:end w:w="120" w:type="dxa"/>
+            </w:tcMar>
+            <w:vAlign w:val="center"/>
+          </w:tcPr>
+          <w:p>
+            <w:pPr>
+              <w:spacing w:before="0" w:after="0" w:line="276" w:lineRule="auto"/>
+              <w:jc w:val="left"/>
+            </w:pPr>
+            <w:r>
+              <w:rPr>
+                <w:rFonts w:ascii="Calibri" w:hAnsi="Calibri" w:eastAsia="Microsoft YaHei"/>
+                <w:sz w:val="18"/>
+              </w:rPr>
+              <w:t>异步转换任务接口。</w:t>
             </w:r>
           </w:p>
         </w:tc>
@@ -4711,6 +5135,160 @@
           </w:p>
         </w:tc>
       </w:tr>
+      <w:tr>
+        <w:tc>
+          <w:tcPr>
+            <w:tcW w:type="dxa" w:w="3200"/>
+            <w:tcMar>
+              <w:top w:w="80" w:type="dxa"/>
+              <w:start w:w="120" w:type="dxa"/>
+              <w:bottom w:w="80" w:type="dxa"/>
+              <w:end w:w="120" w:type="dxa"/>
+            </w:tcMar>
+            <w:vAlign w:val="center"/>
+          </w:tcPr>
+          <w:p>
+            <w:pPr>
+              <w:spacing w:before="0" w:after="0" w:line="276" w:lineRule="auto"/>
+              <w:jc w:val="left"/>
+            </w:pPr>
+            <w:r>
+              <w:rPr>
+                <w:rFonts w:ascii="Calibri" w:hAnsi="Calibri" w:eastAsia="Microsoft YaHei"/>
+                <w:sz w:val="18"/>
+              </w:rPr>
+              <w:t>dt_grid_save/load_text</w:t>
+            </w:r>
+          </w:p>
+        </w:tc>
+        <w:tc>
+          <w:tcPr>
+            <w:tcW w:type="dxa" w:w="1800"/>
+            <w:tcMar>
+              <w:top w:w="80" w:type="dxa"/>
+              <w:start w:w="120" w:type="dxa"/>
+              <w:bottom w:w="80" w:type="dxa"/>
+              <w:end w:w="120" w:type="dxa"/>
+            </w:tcMar>
+            <w:vAlign w:val="center"/>
+          </w:tcPr>
+          <w:p>
+            <w:pPr>
+              <w:spacing w:before="0" w:after="0" w:line="276" w:lineRule="auto"/>
+              <w:jc w:val="center"/>
+            </w:pPr>
+            <w:r>
+              <w:rPr>
+                <w:rFonts w:ascii="Calibri" w:hAnsi="Calibri" w:eastAsia="Microsoft YaHei"/>
+                <w:sz w:val="18"/>
+              </w:rPr>
+              <w:t>DGRID 1</w:t>
+            </w:r>
+          </w:p>
+        </w:tc>
+        <w:tc>
+          <w:tcPr>
+            <w:tcW w:type="dxa" w:w="4360"/>
+            <w:tcMar>
+              <w:top w:w="80" w:type="dxa"/>
+              <w:start w:w="120" w:type="dxa"/>
+              <w:bottom w:w="80" w:type="dxa"/>
+              <w:end w:w="120" w:type="dxa"/>
+            </w:tcMar>
+            <w:vAlign w:val="center"/>
+          </w:tcPr>
+          <w:p>
+            <w:pPr>
+              <w:spacing w:before="0" w:after="0" w:line="276" w:lineRule="auto"/>
+              <w:jc w:val="left"/>
+            </w:pPr>
+            <w:r>
+              <w:rPr>
+                <w:rFonts w:ascii="Calibri" w:hAnsi="Calibri" w:eastAsia="Microsoft YaHei"/>
+                <w:sz w:val="18"/>
+              </w:rPr>
+              <w:t>规则高程节点文本往返。</w:t>
+            </w:r>
+          </w:p>
+        </w:tc>
+      </w:tr>
+      <w:tr>
+        <w:tc>
+          <w:tcPr>
+            <w:tcW w:type="dxa" w:w="3200"/>
+            <w:tcMar>
+              <w:top w:w="80" w:type="dxa"/>
+              <w:start w:w="120" w:type="dxa"/>
+              <w:bottom w:w="80" w:type="dxa"/>
+              <w:end w:w="120" w:type="dxa"/>
+            </w:tcMar>
+            <w:vAlign w:val="center"/>
+          </w:tcPr>
+          <w:p>
+            <w:pPr>
+              <w:spacing w:before="0" w:after="0" w:line="276" w:lineRule="auto"/>
+              <w:jc w:val="left"/>
+            </w:pPr>
+            <w:r>
+              <w:rPr>
+                <w:rFonts w:ascii="Calibri" w:hAnsi="Calibri" w:eastAsia="Microsoft YaHei"/>
+                <w:sz w:val="18"/>
+              </w:rPr>
+              <w:t>dt_contours_save/load_text</w:t>
+            </w:r>
+          </w:p>
+        </w:tc>
+        <w:tc>
+          <w:tcPr>
+            <w:tcW w:type="dxa" w:w="1800"/>
+            <w:tcMar>
+              <w:top w:w="80" w:type="dxa"/>
+              <w:start w:w="120" w:type="dxa"/>
+              <w:bottom w:w="80" w:type="dxa"/>
+              <w:end w:w="120" w:type="dxa"/>
+            </w:tcMar>
+            <w:vAlign w:val="center"/>
+          </w:tcPr>
+          <w:p>
+            <w:pPr>
+              <w:spacing w:before="0" w:after="0" w:line="276" w:lineRule="auto"/>
+              <w:jc w:val="center"/>
+            </w:pPr>
+            <w:r>
+              <w:rPr>
+                <w:rFonts w:ascii="Calibri" w:hAnsi="Calibri" w:eastAsia="Microsoft YaHei"/>
+                <w:sz w:val="18"/>
+              </w:rPr>
+              <w:t>DCONTOUR 1</w:t>
+            </w:r>
+          </w:p>
+        </w:tc>
+        <w:tc>
+          <w:tcPr>
+            <w:tcW w:type="dxa" w:w="4360"/>
+            <w:tcMar>
+              <w:top w:w="80" w:type="dxa"/>
+              <w:start w:w="120" w:type="dxa"/>
+              <w:bottom w:w="80" w:type="dxa"/>
+              <w:end w:w="120" w:type="dxa"/>
+            </w:tcMar>
+            <w:vAlign w:val="center"/>
+          </w:tcPr>
+          <w:p>
+            <w:pPr>
+              <w:spacing w:before="0" w:after="0" w:line="276" w:lineRule="auto"/>
+              <w:jc w:val="left"/>
+            </w:pPr>
+            <w:r>
+              <w:rPr>
+                <w:rFonts w:ascii="Calibri" w:hAnsi="Calibri" w:eastAsia="Microsoft YaHei"/>
+                <w:sz w:val="18"/>
+              </w:rPr>
+              <w:t>等高折线文本往返。</w:t>
+            </w:r>
+          </w:p>
+        </w:tc>
+      </w:tr>
     </w:tbl>
     <w:p>
       <w:pPr>
@@ -4788,6 +5366,724 @@
           <w:sz w:val="17"/>
         </w:rPr>
         <w:t>}</w:t>
+      </w:r>
+    </w:p>
+    <w:p>
+      <w:pPr>
+        <w:pStyle w:val="Heading2"/>
+      </w:pPr>
+      <w:r>
+        <w:t>4.6 GRID、等高线与异步转换</w:t>
+      </w:r>
+    </w:p>
+    <w:p>
+      <w:r>
+        <w:rPr>
+          <w:rFonts w:ascii="Calibri" w:hAnsi="Calibri" w:eastAsia="Microsoft YaHei"/>
+        </w:rPr>
+        <w:t>新增接口分别位于 dt_terrain_api.h 和 dt_task_api.h。GRID 节点采用六参数仿射变换定位；TIN→GRID 在覆盖三角面上进行分片线性插值，凸包外写入 NoData。</w:t>
+      </w:r>
+    </w:p>
+    <w:p>
+      <w:pPr>
+        <w:pStyle w:val="DterrainCode"/>
+        <w:shd w:fill="F2F4F7"/>
+      </w:pPr>
+      <w:r>
+        <w:rPr>
+          <w:rFonts w:ascii="Consolas" w:hAnsi="Consolas" w:eastAsia="Microsoft YaHei"/>
+          <w:sz w:val="17"/>
+        </w:rPr>
+        <w:t>dt_tin_to_grid_options options{};</w:t>
+      </w:r>
+      <w:r>
+        <w:br/>
+      </w:r>
+      <w:r>
+        <w:rPr>
+          <w:rFonts w:ascii="Consolas" w:hAnsi="Consolas" w:eastAsia="Microsoft YaHei"/>
+          <w:sz w:val="17"/>
+        </w:rPr>
+        <w:t>options.struct_size = sizeof(options);</w:t>
+      </w:r>
+      <w:r>
+        <w:br/>
+      </w:r>
+      <w:r>
+        <w:rPr>
+          <w:rFonts w:ascii="Consolas" w:hAnsi="Consolas" w:eastAsia="Microsoft YaHei"/>
+          <w:sz w:val="17"/>
+        </w:rPr>
+        <w:t>options.width = 1001;</w:t>
+      </w:r>
+      <w:r>
+        <w:br/>
+      </w:r>
+      <w:r>
+        <w:rPr>
+          <w:rFonts w:ascii="Consolas" w:hAnsi="Consolas" w:eastAsia="Microsoft YaHei"/>
+          <w:sz w:val="17"/>
+        </w:rPr>
+        <w:t>options.height = 1001;</w:t>
+      </w:r>
+      <w:r>
+        <w:br/>
+      </w:r>
+      <w:r>
+        <w:rPr>
+          <w:rFonts w:ascii="Consolas" w:hAnsi="Consolas" w:eastAsia="Microsoft YaHei"/>
+          <w:sz w:val="17"/>
+        </w:rPr>
+        <w:t>options.geo_transform[0] = xmin;</w:t>
+      </w:r>
+      <w:r>
+        <w:br/>
+      </w:r>
+      <w:r>
+        <w:rPr>
+          <w:rFonts w:ascii="Consolas" w:hAnsi="Consolas" w:eastAsia="Microsoft YaHei"/>
+          <w:sz w:val="17"/>
+        </w:rPr>
+        <w:t>options.geo_transform[1] = (xmax - xmin) / 1000.0;</w:t>
+      </w:r>
+      <w:r>
+        <w:br/>
+      </w:r>
+      <w:r>
+        <w:rPr>
+          <w:rFonts w:ascii="Consolas" w:hAnsi="Consolas" w:eastAsia="Microsoft YaHei"/>
+          <w:sz w:val="17"/>
+        </w:rPr>
+        <w:t>options.geo_transform[3] = ymin;</w:t>
+      </w:r>
+      <w:r>
+        <w:br/>
+      </w:r>
+      <w:r>
+        <w:rPr>
+          <w:rFonts w:ascii="Consolas" w:hAnsi="Consolas" w:eastAsia="Microsoft YaHei"/>
+          <w:sz w:val="17"/>
+        </w:rPr>
+        <w:t>options.geo_transform[5] = (ymax - ymin) / 1000.0;</w:t>
+      </w:r>
+      <w:r>
+        <w:br/>
+      </w:r>
+      <w:r>
+        <w:rPr>
+          <w:rFonts w:ascii="Consolas" w:hAnsi="Consolas" w:eastAsia="Microsoft YaHei"/>
+          <w:sz w:val="17"/>
+        </w:rPr>
+        <w:t>options.nodata_value = -9999.0;</w:t>
+      </w:r>
+      <w:r>
+        <w:br/>
+      </w:r>
+      <w:r>
+        <w:rPr>
+          <w:rFonts w:ascii="Consolas" w:hAnsi="Consolas" w:eastAsia="Microsoft YaHei"/>
+          <w:sz w:val="17"/>
+        </w:rPr>
+      </w:r>
+      <w:r>
+        <w:br/>
+      </w:r>
+      <w:r>
+        <w:rPr>
+          <w:rFonts w:ascii="Consolas" w:hAnsi="Consolas" w:eastAsia="Microsoft YaHei"/>
+          <w:sz w:val="17"/>
+        </w:rPr>
+        <w:t>dt_grid_handle grid = nullptr;</w:t>
+      </w:r>
+      <w:r>
+        <w:br/>
+      </w:r>
+      <w:r>
+        <w:rPr>
+          <w:rFonts w:ascii="Consolas" w:hAnsi="Consolas" w:eastAsia="Microsoft YaHei"/>
+          <w:sz w:val="17"/>
+        </w:rPr>
+        <w:t>dt_grid_from_tin(mesh, &amp;options, &amp;grid);</w:t>
+      </w:r>
+      <w:r>
+        <w:br/>
+      </w:r>
+      <w:r>
+        <w:rPr>
+          <w:rFonts w:ascii="Consolas" w:hAnsi="Consolas" w:eastAsia="Microsoft YaHei"/>
+          <w:sz w:val="17"/>
+        </w:rPr>
+        <w:t>dt_grid_destroy(grid);</w:t>
+      </w:r>
+    </w:p>
+    <w:tbl>
+      <w:tblPr>
+        <w:tblStyle w:val="TableGrid"/>
+        <w:tblW w:type="dxa" w:w="9360"/>
+        <w:jc w:val="left"/>
+        <w:tblLayout w:type="fixed"/>
+        <w:tblLook w:firstColumn="1" w:firstRow="1" w:lastColumn="0" w:lastRow="0" w:noHBand="0" w:noVBand="1" w:val="04A0"/>
+        <w:tblInd w:w="120" w:type="dxa"/>
+      </w:tblPr>
+      <w:tblGrid>
+        <w:gridCol w:w="2300"/>
+        <w:gridCol w:w="4700"/>
+        <w:gridCol w:w="2360"/>
+      </w:tblGrid>
+      <w:tr>
+        <w:trPr>
+          <w:tblHeader w:val="true"/>
+        </w:trPr>
+        <w:tc>
+          <w:tcPr>
+            <w:tcW w:type="dxa" w:w="2300"/>
+            <w:shd w:fill="E8EEF5"/>
+            <w:tcMar>
+              <w:top w:w="80" w:type="dxa"/>
+              <w:start w:w="120" w:type="dxa"/>
+              <w:bottom w:w="80" w:type="dxa"/>
+              <w:end w:w="120" w:type="dxa"/>
+            </w:tcMar>
+            <w:vAlign w:val="center"/>
+          </w:tcPr>
+          <w:p>
+            <w:pPr>
+              <w:spacing w:before="0" w:after="0"/>
+              <w:jc w:val="center"/>
+            </w:pPr>
+            <w:r>
+              <w:rPr>
+                <w:rFonts w:ascii="Calibri" w:hAnsi="Calibri" w:eastAsia="Microsoft YaHei"/>
+                <w:b/>
+                <w:color w:val="203748"/>
+                <w:sz w:val="19"/>
+              </w:rPr>
+              <w:t>接口组</w:t>
+            </w:r>
+          </w:p>
+        </w:tc>
+        <w:tc>
+          <w:tcPr>
+            <w:tcW w:type="dxa" w:w="4700"/>
+            <w:shd w:fill="E8EEF5"/>
+            <w:tcMar>
+              <w:top w:w="80" w:type="dxa"/>
+              <w:start w:w="120" w:type="dxa"/>
+              <w:bottom w:w="80" w:type="dxa"/>
+              <w:end w:w="120" w:type="dxa"/>
+            </w:tcMar>
+            <w:vAlign w:val="center"/>
+          </w:tcPr>
+          <w:p>
+            <w:pPr>
+              <w:spacing w:before="0" w:after="0"/>
+              <w:jc w:val="center"/>
+            </w:pPr>
+            <w:r>
+              <w:rPr>
+                <w:rFonts w:ascii="Calibri" w:hAnsi="Calibri" w:eastAsia="Microsoft YaHei"/>
+                <w:b/>
+                <w:color w:val="203748"/>
+                <w:sz w:val="19"/>
+              </w:rPr>
+              <w:t>主要功能</w:t>
+            </w:r>
+          </w:p>
+        </w:tc>
+        <w:tc>
+          <w:tcPr>
+            <w:tcW w:type="dxa" w:w="2360"/>
+            <w:shd w:fill="E8EEF5"/>
+            <w:tcMar>
+              <w:top w:w="80" w:type="dxa"/>
+              <w:start w:w="120" w:type="dxa"/>
+              <w:bottom w:w="80" w:type="dxa"/>
+              <w:end w:w="120" w:type="dxa"/>
+            </w:tcMar>
+            <w:vAlign w:val="center"/>
+          </w:tcPr>
+          <w:p>
+            <w:pPr>
+              <w:spacing w:before="0" w:after="0"/>
+              <w:jc w:val="center"/>
+            </w:pPr>
+            <w:r>
+              <w:rPr>
+                <w:rFonts w:ascii="Calibri" w:hAnsi="Calibri" w:eastAsia="Microsoft YaHei"/>
+                <w:b/>
+                <w:color w:val="203748"/>
+                <w:sz w:val="19"/>
+              </w:rPr>
+              <w:t>释放方式</w:t>
+            </w:r>
+          </w:p>
+        </w:tc>
+      </w:tr>
+      <w:tr>
+        <w:tc>
+          <w:tcPr>
+            <w:tcW w:type="dxa" w:w="2300"/>
+            <w:tcMar>
+              <w:top w:w="80" w:type="dxa"/>
+              <w:start w:w="120" w:type="dxa"/>
+              <w:bottom w:w="80" w:type="dxa"/>
+              <w:end w:w="120" w:type="dxa"/>
+            </w:tcMar>
+            <w:vAlign w:val="center"/>
+          </w:tcPr>
+          <w:p>
+            <w:pPr>
+              <w:spacing w:before="0" w:after="0" w:line="276" w:lineRule="auto"/>
+              <w:jc w:val="left"/>
+            </w:pPr>
+            <w:r>
+              <w:rPr>
+                <w:rFonts w:ascii="Calibri" w:hAnsi="Calibri" w:eastAsia="Microsoft YaHei"/>
+                <w:sz w:val="18"/>
+              </w:rPr>
+              <w:t>dt_grid_*</w:t>
+            </w:r>
+          </w:p>
+        </w:tc>
+        <w:tc>
+          <w:tcPr>
+            <w:tcW w:type="dxa" w:w="4700"/>
+            <w:tcMar>
+              <w:top w:w="80" w:type="dxa"/>
+              <w:start w:w="120" w:type="dxa"/>
+              <w:bottom w:w="80" w:type="dxa"/>
+              <w:end w:w="120" w:type="dxa"/>
+            </w:tcMar>
+            <w:vAlign w:val="center"/>
+          </w:tcPr>
+          <w:p>
+            <w:pPr>
+              <w:spacing w:before="0" w:after="0" w:line="276" w:lineRule="auto"/>
+              <w:jc w:val="left"/>
+            </w:pPr>
+            <w:r>
+              <w:rPr>
+                <w:rFonts w:ascii="Calibri" w:hAnsi="Calibri" w:eastAsia="Microsoft YaHei"/>
+                <w:sz w:val="18"/>
+              </w:rPr>
+              <w:t>GRID 创建、信息、窗口读写、文本往返</w:t>
+            </w:r>
+          </w:p>
+        </w:tc>
+        <w:tc>
+          <w:tcPr>
+            <w:tcW w:type="dxa" w:w="2360"/>
+            <w:tcMar>
+              <w:top w:w="80" w:type="dxa"/>
+              <w:start w:w="120" w:type="dxa"/>
+              <w:bottom w:w="80" w:type="dxa"/>
+              <w:end w:w="120" w:type="dxa"/>
+            </w:tcMar>
+            <w:vAlign w:val="center"/>
+          </w:tcPr>
+          <w:p>
+            <w:pPr>
+              <w:spacing w:before="0" w:after="0" w:line="276" w:lineRule="auto"/>
+              <w:jc w:val="center"/>
+            </w:pPr>
+            <w:r>
+              <w:rPr>
+                <w:rFonts w:ascii="Calibri" w:hAnsi="Calibri" w:eastAsia="Microsoft YaHei"/>
+                <w:sz w:val="18"/>
+              </w:rPr>
+              <w:t>dt_grid_destroy</w:t>
+            </w:r>
+          </w:p>
+        </w:tc>
+      </w:tr>
+      <w:tr>
+        <w:tc>
+          <w:tcPr>
+            <w:tcW w:type="dxa" w:w="2300"/>
+            <w:tcMar>
+              <w:top w:w="80" w:type="dxa"/>
+              <w:start w:w="120" w:type="dxa"/>
+              <w:bottom w:w="80" w:type="dxa"/>
+              <w:end w:w="120" w:type="dxa"/>
+            </w:tcMar>
+            <w:vAlign w:val="center"/>
+          </w:tcPr>
+          <w:p>
+            <w:pPr>
+              <w:spacing w:before="0" w:after="0" w:line="276" w:lineRule="auto"/>
+              <w:jc w:val="left"/>
+            </w:pPr>
+            <w:r>
+              <w:rPr>
+                <w:rFonts w:ascii="Calibri" w:hAnsi="Calibri" w:eastAsia="Microsoft YaHei"/>
+                <w:sz w:val="18"/>
+              </w:rPr>
+              <w:t>dt_*_from_*</w:t>
+            </w:r>
+          </w:p>
+        </w:tc>
+        <w:tc>
+          <w:tcPr>
+            <w:tcW w:type="dxa" w:w="4700"/>
+            <w:tcMar>
+              <w:top w:w="80" w:type="dxa"/>
+              <w:start w:w="120" w:type="dxa"/>
+              <w:bottom w:w="80" w:type="dxa"/>
+              <w:end w:w="120" w:type="dxa"/>
+            </w:tcMar>
+            <w:vAlign w:val="center"/>
+          </w:tcPr>
+          <w:p>
+            <w:pPr>
+              <w:spacing w:before="0" w:after="0" w:line="276" w:lineRule="auto"/>
+              <w:jc w:val="left"/>
+            </w:pPr>
+            <w:r>
+              <w:rPr>
+                <w:rFonts w:ascii="Calibri" w:hAnsi="Calibri" w:eastAsia="Microsoft YaHei"/>
+                <w:sz w:val="18"/>
+              </w:rPr>
+              <w:t>TIN/GRID 同步转换和等高线生成</w:t>
+            </w:r>
+          </w:p>
+        </w:tc>
+        <w:tc>
+          <w:tcPr>
+            <w:tcW w:type="dxa" w:w="2360"/>
+            <w:tcMar>
+              <w:top w:w="80" w:type="dxa"/>
+              <w:start w:w="120" w:type="dxa"/>
+              <w:bottom w:w="80" w:type="dxa"/>
+              <w:end w:w="120" w:type="dxa"/>
+            </w:tcMar>
+            <w:vAlign w:val="center"/>
+          </w:tcPr>
+          <w:p>
+            <w:pPr>
+              <w:spacing w:before="0" w:after="0" w:line="276" w:lineRule="auto"/>
+              <w:jc w:val="center"/>
+            </w:pPr>
+            <w:r>
+              <w:rPr>
+                <w:rFonts w:ascii="Calibri" w:hAnsi="Calibri" w:eastAsia="Microsoft YaHei"/>
+                <w:sz w:val="18"/>
+              </w:rPr>
+              <w:t>按输出句柄释放</w:t>
+            </w:r>
+          </w:p>
+        </w:tc>
+      </w:tr>
+      <w:tr>
+        <w:tc>
+          <w:tcPr>
+            <w:tcW w:type="dxa" w:w="2300"/>
+            <w:tcMar>
+              <w:top w:w="80" w:type="dxa"/>
+              <w:start w:w="120" w:type="dxa"/>
+              <w:bottom w:w="80" w:type="dxa"/>
+              <w:end w:w="120" w:type="dxa"/>
+            </w:tcMar>
+            <w:vAlign w:val="center"/>
+          </w:tcPr>
+          <w:p>
+            <w:pPr>
+              <w:spacing w:before="0" w:after="0" w:line="276" w:lineRule="auto"/>
+              <w:jc w:val="left"/>
+            </w:pPr>
+            <w:r>
+              <w:rPr>
+                <w:rFonts w:ascii="Calibri" w:hAnsi="Calibri" w:eastAsia="Microsoft YaHei"/>
+                <w:sz w:val="18"/>
+              </w:rPr>
+              <w:t>dt_task_*</w:t>
+            </w:r>
+          </w:p>
+        </w:tc>
+        <w:tc>
+          <w:tcPr>
+            <w:tcW w:type="dxa" w:w="4700"/>
+            <w:tcMar>
+              <w:top w:w="80" w:type="dxa"/>
+              <w:start w:w="120" w:type="dxa"/>
+              <w:bottom w:w="80" w:type="dxa"/>
+              <w:end w:w="120" w:type="dxa"/>
+            </w:tcMar>
+            <w:vAlign w:val="center"/>
+          </w:tcPr>
+          <w:p>
+            <w:pPr>
+              <w:spacing w:before="0" w:after="0" w:line="276" w:lineRule="auto"/>
+              <w:jc w:val="left"/>
+            </w:pPr>
+            <w:r>
+              <w:rPr>
+                <w:rFonts w:ascii="Calibri" w:hAnsi="Calibri" w:eastAsia="Microsoft YaHei"/>
+                <w:sz w:val="18"/>
+              </w:rPr>
+              <w:t>异步启动、进度、等待、取消、结果提取</w:t>
+            </w:r>
+          </w:p>
+        </w:tc>
+        <w:tc>
+          <w:tcPr>
+            <w:tcW w:type="dxa" w:w="2360"/>
+            <w:tcMar>
+              <w:top w:w="80" w:type="dxa"/>
+              <w:start w:w="120" w:type="dxa"/>
+              <w:bottom w:w="80" w:type="dxa"/>
+              <w:end w:w="120" w:type="dxa"/>
+            </w:tcMar>
+            <w:vAlign w:val="center"/>
+          </w:tcPr>
+          <w:p>
+            <w:pPr>
+              <w:spacing w:before="0" w:after="0" w:line="276" w:lineRule="auto"/>
+              <w:jc w:val="center"/>
+            </w:pPr>
+            <w:r>
+              <w:rPr>
+                <w:rFonts w:ascii="Calibri" w:hAnsi="Calibri" w:eastAsia="Microsoft YaHei"/>
+                <w:sz w:val="18"/>
+              </w:rPr>
+              <w:t>dt_task_destroy</w:t>
+            </w:r>
+          </w:p>
+        </w:tc>
+      </w:tr>
+      <w:tr>
+        <w:tc>
+          <w:tcPr>
+            <w:tcW w:type="dxa" w:w="2300"/>
+            <w:tcMar>
+              <w:top w:w="80" w:type="dxa"/>
+              <w:start w:w="120" w:type="dxa"/>
+              <w:bottom w:w="80" w:type="dxa"/>
+              <w:end w:w="120" w:type="dxa"/>
+            </w:tcMar>
+            <w:vAlign w:val="center"/>
+          </w:tcPr>
+          <w:p>
+            <w:pPr>
+              <w:spacing w:before="0" w:after="0" w:line="276" w:lineRule="auto"/>
+              <w:jc w:val="left"/>
+            </w:pPr>
+            <w:r>
+              <w:rPr>
+                <w:rFonts w:ascii="Calibri" w:hAnsi="Calibri" w:eastAsia="Microsoft YaHei"/>
+                <w:sz w:val="18"/>
+              </w:rPr>
+              <w:t>dt_contours_*</w:t>
+            </w:r>
+          </w:p>
+        </w:tc>
+        <w:tc>
+          <w:tcPr>
+            <w:tcW w:type="dxa" w:w="4700"/>
+            <w:tcMar>
+              <w:top w:w="80" w:type="dxa"/>
+              <w:start w:w="120" w:type="dxa"/>
+              <w:bottom w:w="80" w:type="dxa"/>
+              <w:end w:w="120" w:type="dxa"/>
+            </w:tcMar>
+            <w:vAlign w:val="center"/>
+          </w:tcPr>
+          <w:p>
+            <w:pPr>
+              <w:spacing w:before="0" w:after="0" w:line="276" w:lineRule="auto"/>
+              <w:jc w:val="left"/>
+            </w:pPr>
+            <w:r>
+              <w:rPr>
+                <w:rFonts w:ascii="Calibri" w:hAnsi="Calibri" w:eastAsia="Microsoft YaHei"/>
+                <w:sz w:val="18"/>
+              </w:rPr>
+              <w:t>等高线信息、逐线视图和文本往返</w:t>
+            </w:r>
+          </w:p>
+        </w:tc>
+        <w:tc>
+          <w:tcPr>
+            <w:tcW w:type="dxa" w:w="2360"/>
+            <w:tcMar>
+              <w:top w:w="80" w:type="dxa"/>
+              <w:start w:w="120" w:type="dxa"/>
+              <w:bottom w:w="80" w:type="dxa"/>
+              <w:end w:w="120" w:type="dxa"/>
+            </w:tcMar>
+            <w:vAlign w:val="center"/>
+          </w:tcPr>
+          <w:p>
+            <w:pPr>
+              <w:spacing w:before="0" w:after="0" w:line="276" w:lineRule="auto"/>
+              <w:jc w:val="center"/>
+            </w:pPr>
+            <w:r>
+              <w:rPr>
+                <w:rFonts w:ascii="Calibri" w:hAnsi="Calibri" w:eastAsia="Microsoft YaHei"/>
+                <w:sz w:val="18"/>
+              </w:rPr>
+              <w:t>dt_contours_destroy</w:t>
+            </w:r>
+          </w:p>
+        </w:tc>
+      </w:tr>
+    </w:tbl>
+    <w:p>
+      <w:pPr>
+        <w:spacing w:before="0" w:after="40"/>
+      </w:pPr>
+    </w:p>
+    <w:p>
+      <w:pPr>
+        <w:spacing w:before="100" w:after="160" w:line="288" w:lineRule="auto"/>
+        <w:ind w:left="230" w:right="230"/>
+        <w:shd w:fill="FFF7E0"/>
+      </w:pPr>
+      <w:r>
+        <w:rPr>
+          <w:rFonts w:ascii="Calibri" w:hAnsi="Calibri" w:eastAsia="Microsoft YaHei"/>
+          <w:b/>
+          <w:color w:val="7A5A00"/>
+        </w:rPr>
+        <w:t xml:space="preserve">NoData  </w:t>
+      </w:r>
+      <w:r>
+        <w:rPr>
+          <w:rFonts w:ascii="Calibri" w:hAnsi="Calibri" w:eastAsia="Microsoft YaHei"/>
+        </w:rPr>
+        <w:t>GRID→TIN 遇到 NoData 默认返回 DT_E_UNSUPPORTED。DT_GRID_TO_TIN_ALLOW_NODATA_BRIDGING 只适合调用方明确接受跨空洞三角化的场景。</w:t>
+      </w:r>
+    </w:p>
+    <w:p>
+      <w:pPr>
+        <w:pStyle w:val="DterrainCode"/>
+        <w:shd w:fill="F2F4F7"/>
+      </w:pPr>
+      <w:r>
+        <w:rPr>
+          <w:rFonts w:ascii="Consolas" w:hAnsi="Consolas" w:eastAsia="Microsoft YaHei"/>
+          <w:sz w:val="17"/>
+        </w:rPr>
+        <w:t>dt_task_handle task = nullptr;</w:t>
+      </w:r>
+      <w:r>
+        <w:br/>
+      </w:r>
+      <w:r>
+        <w:rPr>
+          <w:rFonts w:ascii="Consolas" w:hAnsi="Consolas" w:eastAsia="Microsoft YaHei"/>
+          <w:sz w:val="17"/>
+        </w:rPr>
+        <w:t>dt_grid_from_tin_async(mesh, &amp;options, &amp;task);</w:t>
+      </w:r>
+      <w:r>
+        <w:br/>
+      </w:r>
+      <w:r>
+        <w:rPr>
+          <w:rFonts w:ascii="Consolas" w:hAnsi="Consolas" w:eastAsia="Microsoft YaHei"/>
+          <w:sz w:val="17"/>
+        </w:rPr>
+        <w:t>int32_t completed = 0;</w:t>
+      </w:r>
+      <w:r>
+        <w:br/>
+      </w:r>
+      <w:r>
+        <w:rPr>
+          <w:rFonts w:ascii="Consolas" w:hAnsi="Consolas" w:eastAsia="Microsoft YaHei"/>
+          <w:sz w:val="17"/>
+        </w:rPr>
+        <w:t>dt_task_wait(task, UINT32_MAX, &amp;completed);</w:t>
+      </w:r>
+      <w:r>
+        <w:br/>
+      </w:r>
+      <w:r>
+        <w:rPr>
+          <w:rFonts w:ascii="Consolas" w:hAnsi="Consolas" w:eastAsia="Microsoft YaHei"/>
+          <w:sz w:val="17"/>
+        </w:rPr>
+      </w:r>
+      <w:r>
+        <w:br/>
+      </w:r>
+      <w:r>
+        <w:rPr>
+          <w:rFonts w:ascii="Consolas" w:hAnsi="Consolas" w:eastAsia="Microsoft YaHei"/>
+          <w:sz w:val="17"/>
+        </w:rPr>
+        <w:t>dt_task_info info{};</w:t>
+      </w:r>
+      <w:r>
+        <w:br/>
+      </w:r>
+      <w:r>
+        <w:rPr>
+          <w:rFonts w:ascii="Consolas" w:hAnsi="Consolas" w:eastAsia="Microsoft YaHei"/>
+          <w:sz w:val="17"/>
+        </w:rPr>
+        <w:t>dt_task_get_info(task, &amp;info);</w:t>
+      </w:r>
+      <w:r>
+        <w:br/>
+      </w:r>
+      <w:r>
+        <w:rPr>
+          <w:rFonts w:ascii="Consolas" w:hAnsi="Consolas" w:eastAsia="Microsoft YaHei"/>
+          <w:sz w:val="17"/>
+        </w:rPr>
+        <w:t>if (info.state == DT_TASK_SUCCEEDED) {</w:t>
+      </w:r>
+      <w:r>
+        <w:br/>
+      </w:r>
+      <w:r>
+        <w:rPr>
+          <w:rFonts w:ascii="Consolas" w:hAnsi="Consolas" w:eastAsia="Microsoft YaHei"/>
+          <w:sz w:val="17"/>
+        </w:rPr>
+        <w:t xml:space="preserve">    dt_grid_handle result = nullptr;</w:t>
+      </w:r>
+      <w:r>
+        <w:br/>
+      </w:r>
+      <w:r>
+        <w:rPr>
+          <w:rFonts w:ascii="Consolas" w:hAnsi="Consolas" w:eastAsia="Microsoft YaHei"/>
+          <w:sz w:val="17"/>
+        </w:rPr>
+        <w:t xml:space="preserve">    dt_task_get_grid_result(task, &amp;result);</w:t>
+      </w:r>
+      <w:r>
+        <w:br/>
+      </w:r>
+      <w:r>
+        <w:rPr>
+          <w:rFonts w:ascii="Consolas" w:hAnsi="Consolas" w:eastAsia="Microsoft YaHei"/>
+          <w:sz w:val="17"/>
+        </w:rPr>
+        <w:t xml:space="preserve">    dt_grid_destroy(result);</w:t>
+      </w:r>
+      <w:r>
+        <w:br/>
+      </w:r>
+      <w:r>
+        <w:rPr>
+          <w:rFonts w:ascii="Consolas" w:hAnsi="Consolas" w:eastAsia="Microsoft YaHei"/>
+          <w:sz w:val="17"/>
+        </w:rPr>
+        <w:t>}</w:t>
+      </w:r>
+      <w:r>
+        <w:br/>
+      </w:r>
+      <w:r>
+        <w:rPr>
+          <w:rFonts w:ascii="Consolas" w:hAnsi="Consolas" w:eastAsia="Microsoft YaHei"/>
+          <w:sz w:val="17"/>
+        </w:rPr>
+        <w:t>dt_task_destroy(task);</w:t>
       </w:r>
     </w:p>
     <w:p>
@@ -6301,6 +7597,38 @@
     </w:p>
     <w:p>
       <w:pPr>
+        <w:pStyle w:val="Heading2"/>
+      </w:pPr>
+      <w:r>
+        <w:t>6.4 DGRID 规则高程节点文本</w:t>
+      </w:r>
+    </w:p>
+    <w:p>
+      <w:r>
+        <w:rPr>
+          <w:rFonts w:ascii="Calibri" w:hAnsi="Calibri" w:eastAsia="Microsoft YaHei"/>
+        </w:rPr>
+        <w:t>DGRID 1 保存 SIZE、FLAGS、六参数 GEOTRANSFORM、NODATA 和按行优先排列的 VALUES。该格式用于测试、研究和简单交换；当前变换描述节点位置，不等同于 GDAL 像元左上角语义。</w:t>
+      </w:r>
+    </w:p>
+    <w:p>
+      <w:pPr>
+        <w:pStyle w:val="Heading2"/>
+      </w:pPr>
+      <w:r>
+        <w:t>6.5 DCONTOUR 等高线文本</w:t>
+      </w:r>
+    </w:p>
+    <w:p>
+      <w:r>
+        <w:rPr>
+          <w:rFonts w:ascii="Calibri" w:hAnsi="Calibri" w:eastAsia="Microsoft YaHei"/>
+        </w:rPr>
+        <w:t>DCONTOUR 1 由 LINES 计数和若干 LINE 记录组成。每条 LINE 保存等高值、闭合标志、点数及 XYZ 顶点。逐线视图中的点数组只在等高线句柄释放前有效。</w:t>
+      </w:r>
+    </w:p>
+    <w:p>
+      <w:pPr>
         <w:pStyle w:val="Heading1"/>
       </w:pPr>
       <w:r>
@@ -6961,6 +8289,162 @@
           </w:p>
         </w:tc>
       </w:tr>
+      <w:tr>
+        <w:tc>
+          <w:tcPr>
+            <w:tcW w:type="dxa" w:w="3200"/>
+            <w:tcMar>
+              <w:top w:w="80" w:type="dxa"/>
+              <w:start w:w="120" w:type="dxa"/>
+              <w:bottom w:w="80" w:type="dxa"/>
+              <w:end w:w="120" w:type="dxa"/>
+            </w:tcMar>
+            <w:vAlign w:val="center"/>
+          </w:tcPr>
+          <w:p>
+            <w:pPr>
+              <w:spacing w:before="0" w:after="0" w:line="276" w:lineRule="auto"/>
+              <w:jc w:val="left"/>
+            </w:pPr>
+            <w:r>
+              <w:rPr>
+                <w:rFonts w:ascii="Calibri" w:hAnsi="Calibri" w:eastAsia="Microsoft YaHei"/>
+                <w:sz w:val="18"/>
+              </w:rPr>
+              <w:t>DT_E_UNSUPPORTED</w:t>
+            </w:r>
+          </w:p>
+        </w:tc>
+        <w:tc>
+          <w:tcPr>
+            <w:tcW w:type="dxa" w:w="6160"/>
+            <w:tcMar>
+              <w:top w:w="80" w:type="dxa"/>
+              <w:start w:w="120" w:type="dxa"/>
+              <w:bottom w:w="80" w:type="dxa"/>
+              <w:end w:w="120" w:type="dxa"/>
+            </w:tcMar>
+            <w:vAlign w:val="center"/>
+          </w:tcPr>
+          <w:p>
+            <w:pPr>
+              <w:spacing w:before="0" w:after="0" w:line="276" w:lineRule="auto"/>
+              <w:jc w:val="left"/>
+            </w:pPr>
+            <w:r>
+              <w:rPr>
+                <w:rFonts w:ascii="Calibri" w:hAnsi="Calibri" w:eastAsia="Microsoft YaHei"/>
+                <w:sz w:val="18"/>
+              </w:rPr>
+              <w:t>当前后端不支持所请求语义，例如未允许的 NoData 空洞</w:t>
+            </w:r>
+          </w:p>
+        </w:tc>
+      </w:tr>
+      <w:tr>
+        <w:tc>
+          <w:tcPr>
+            <w:tcW w:type="dxa" w:w="3200"/>
+            <w:tcMar>
+              <w:top w:w="80" w:type="dxa"/>
+              <w:start w:w="120" w:type="dxa"/>
+              <w:bottom w:w="80" w:type="dxa"/>
+              <w:end w:w="120" w:type="dxa"/>
+            </w:tcMar>
+            <w:vAlign w:val="center"/>
+          </w:tcPr>
+          <w:p>
+            <w:pPr>
+              <w:spacing w:before="0" w:after="0" w:line="276" w:lineRule="auto"/>
+              <w:jc w:val="left"/>
+            </w:pPr>
+            <w:r>
+              <w:rPr>
+                <w:rFonts w:ascii="Calibri" w:hAnsi="Calibri" w:eastAsia="Microsoft YaHei"/>
+                <w:sz w:val="18"/>
+              </w:rPr>
+              <w:t>DT_E_CANCELLED</w:t>
+            </w:r>
+          </w:p>
+        </w:tc>
+        <w:tc>
+          <w:tcPr>
+            <w:tcW w:type="dxa" w:w="6160"/>
+            <w:tcMar>
+              <w:top w:w="80" w:type="dxa"/>
+              <w:start w:w="120" w:type="dxa"/>
+              <w:bottom w:w="80" w:type="dxa"/>
+              <w:end w:w="120" w:type="dxa"/>
+            </w:tcMar>
+            <w:vAlign w:val="center"/>
+          </w:tcPr>
+          <w:p>
+            <w:pPr>
+              <w:spacing w:before="0" w:after="0" w:line="276" w:lineRule="auto"/>
+              <w:jc w:val="left"/>
+            </w:pPr>
+            <w:r>
+              <w:rPr>
+                <w:rFonts w:ascii="Calibri" w:hAnsi="Calibri" w:eastAsia="Microsoft YaHei"/>
+                <w:sz w:val="18"/>
+              </w:rPr>
+              <w:t>异步地形任务收到协作取消请求</w:t>
+            </w:r>
+          </w:p>
+        </w:tc>
+      </w:tr>
+      <w:tr>
+        <w:tc>
+          <w:tcPr>
+            <w:tcW w:type="dxa" w:w="3200"/>
+            <w:tcMar>
+              <w:top w:w="80" w:type="dxa"/>
+              <w:start w:w="120" w:type="dxa"/>
+              <w:bottom w:w="80" w:type="dxa"/>
+              <w:end w:w="120" w:type="dxa"/>
+            </w:tcMar>
+            <w:vAlign w:val="center"/>
+          </w:tcPr>
+          <w:p>
+            <w:pPr>
+              <w:spacing w:before="0" w:after="0" w:line="276" w:lineRule="auto"/>
+              <w:jc w:val="left"/>
+            </w:pPr>
+            <w:r>
+              <w:rPr>
+                <w:rFonts w:ascii="Calibri" w:hAnsi="Calibri" w:eastAsia="Microsoft YaHei"/>
+                <w:sz w:val="18"/>
+              </w:rPr>
+              <w:t>DT_E_LIMIT_EXCEEDED</w:t>
+            </w:r>
+          </w:p>
+        </w:tc>
+        <w:tc>
+          <w:tcPr>
+            <w:tcW w:type="dxa" w:w="6160"/>
+            <w:tcMar>
+              <w:top w:w="80" w:type="dxa"/>
+              <w:start w:w="120" w:type="dxa"/>
+              <w:bottom w:w="80" w:type="dxa"/>
+              <w:end w:w="120" w:type="dxa"/>
+            </w:tcMar>
+            <w:vAlign w:val="center"/>
+          </w:tcPr>
+          <w:p>
+            <w:pPr>
+              <w:spacing w:before="0" w:after="0" w:line="276" w:lineRule="auto"/>
+              <w:jc w:val="left"/>
+            </w:pPr>
+            <w:r>
+              <w:rPr>
+                <w:rFonts w:ascii="Calibri" w:hAnsi="Calibri" w:eastAsia="Microsoft YaHei"/>
+                <w:sz w:val="18"/>
+              </w:rPr>
+              <w:t>GRID、等高层或文本对象数量超过安全限制</w:t>
+            </w:r>
+          </w:p>
+        </w:tc>
+      </w:tr>
     </w:tbl>
     <w:p>
       <w:pPr>
@@ -7354,6 +8838,237 @@
                 <w:sz w:val="18"/>
               </w:rPr>
               <w:t>dt_release_query_result</w:t>
+            </w:r>
+          </w:p>
+        </w:tc>
+      </w:tr>
+      <w:tr>
+        <w:tc>
+          <w:tcPr>
+            <w:tcW w:type="dxa" w:w="2500"/>
+            <w:tcMar>
+              <w:top w:w="80" w:type="dxa"/>
+              <w:start w:w="120" w:type="dxa"/>
+              <w:bottom w:w="80" w:type="dxa"/>
+              <w:end w:w="120" w:type="dxa"/>
+            </w:tcMar>
+            <w:vAlign w:val="center"/>
+          </w:tcPr>
+          <w:p>
+            <w:pPr>
+              <w:spacing w:before="0" w:after="0" w:line="276" w:lineRule="auto"/>
+              <w:jc w:val="left"/>
+            </w:pPr>
+            <w:r>
+              <w:rPr>
+                <w:rFonts w:ascii="Calibri" w:hAnsi="Calibri" w:eastAsia="Microsoft YaHei"/>
+                <w:sz w:val="18"/>
+              </w:rPr>
+              <w:t>dt_grid_handle</w:t>
+            </w:r>
+          </w:p>
+        </w:tc>
+        <w:tc>
+          <w:tcPr>
+            <w:tcW w:type="dxa" w:w="3100"/>
+            <w:tcMar>
+              <w:top w:w="80" w:type="dxa"/>
+              <w:start w:w="120" w:type="dxa"/>
+              <w:bottom w:w="80" w:type="dxa"/>
+              <w:end w:w="120" w:type="dxa"/>
+            </w:tcMar>
+            <w:vAlign w:val="center"/>
+          </w:tcPr>
+          <w:p>
+            <w:pPr>
+              <w:spacing w:before="0" w:after="0" w:line="276" w:lineRule="auto"/>
+              <w:jc w:val="left"/>
+            </w:pPr>
+            <w:r>
+              <w:rPr>
+                <w:rFonts w:ascii="Calibri" w:hAnsi="Calibri" w:eastAsia="Microsoft YaHei"/>
+                <w:sz w:val="18"/>
+              </w:rPr>
+              <w:t>GRID 创建/加载/转换</w:t>
+            </w:r>
+          </w:p>
+        </w:tc>
+        <w:tc>
+          <w:tcPr>
+            <w:tcW w:type="dxa" w:w="3760"/>
+            <w:tcMar>
+              <w:top w:w="80" w:type="dxa"/>
+              <w:start w:w="120" w:type="dxa"/>
+              <w:bottom w:w="80" w:type="dxa"/>
+              <w:end w:w="120" w:type="dxa"/>
+            </w:tcMar>
+            <w:vAlign w:val="center"/>
+          </w:tcPr>
+          <w:p>
+            <w:pPr>
+              <w:spacing w:before="0" w:after="0" w:line="276" w:lineRule="auto"/>
+              <w:jc w:val="left"/>
+            </w:pPr>
+            <w:r>
+              <w:rPr>
+                <w:rFonts w:ascii="Calibri" w:hAnsi="Calibri" w:eastAsia="Microsoft YaHei"/>
+                <w:sz w:val="18"/>
+              </w:rPr>
+              <w:t>dt_grid_destroy</w:t>
+            </w:r>
+          </w:p>
+        </w:tc>
+      </w:tr>
+      <w:tr>
+        <w:tc>
+          <w:tcPr>
+            <w:tcW w:type="dxa" w:w="2500"/>
+            <w:tcMar>
+              <w:top w:w="80" w:type="dxa"/>
+              <w:start w:w="120" w:type="dxa"/>
+              <w:bottom w:w="80" w:type="dxa"/>
+              <w:end w:w="120" w:type="dxa"/>
+            </w:tcMar>
+            <w:vAlign w:val="center"/>
+          </w:tcPr>
+          <w:p>
+            <w:pPr>
+              <w:spacing w:before="0" w:after="0" w:line="276" w:lineRule="auto"/>
+              <w:jc w:val="left"/>
+            </w:pPr>
+            <w:r>
+              <w:rPr>
+                <w:rFonts w:ascii="Calibri" w:hAnsi="Calibri" w:eastAsia="Microsoft YaHei"/>
+                <w:sz w:val="18"/>
+              </w:rPr>
+              <w:t>dt_contour_handle</w:t>
+            </w:r>
+          </w:p>
+        </w:tc>
+        <w:tc>
+          <w:tcPr>
+            <w:tcW w:type="dxa" w:w="3100"/>
+            <w:tcMar>
+              <w:top w:w="80" w:type="dxa"/>
+              <w:start w:w="120" w:type="dxa"/>
+              <w:bottom w:w="80" w:type="dxa"/>
+              <w:end w:w="120" w:type="dxa"/>
+            </w:tcMar>
+            <w:vAlign w:val="center"/>
+          </w:tcPr>
+          <w:p>
+            <w:pPr>
+              <w:spacing w:before="0" w:after="0" w:line="276" w:lineRule="auto"/>
+              <w:jc w:val="left"/>
+            </w:pPr>
+            <w:r>
+              <w:rPr>
+                <w:rFonts w:ascii="Calibri" w:hAnsi="Calibri" w:eastAsia="Microsoft YaHei"/>
+                <w:sz w:val="18"/>
+              </w:rPr>
+              <w:t>等高线生成/加载</w:t>
+            </w:r>
+          </w:p>
+        </w:tc>
+        <w:tc>
+          <w:tcPr>
+            <w:tcW w:type="dxa" w:w="3760"/>
+            <w:tcMar>
+              <w:top w:w="80" w:type="dxa"/>
+              <w:start w:w="120" w:type="dxa"/>
+              <w:bottom w:w="80" w:type="dxa"/>
+              <w:end w:w="120" w:type="dxa"/>
+            </w:tcMar>
+            <w:vAlign w:val="center"/>
+          </w:tcPr>
+          <w:p>
+            <w:pPr>
+              <w:spacing w:before="0" w:after="0" w:line="276" w:lineRule="auto"/>
+              <w:jc w:val="left"/>
+            </w:pPr>
+            <w:r>
+              <w:rPr>
+                <w:rFonts w:ascii="Calibri" w:hAnsi="Calibri" w:eastAsia="Microsoft YaHei"/>
+                <w:sz w:val="18"/>
+              </w:rPr>
+              <w:t>dt_contours_destroy</w:t>
+            </w:r>
+          </w:p>
+        </w:tc>
+      </w:tr>
+      <w:tr>
+        <w:tc>
+          <w:tcPr>
+            <w:tcW w:type="dxa" w:w="2500"/>
+            <w:tcMar>
+              <w:top w:w="80" w:type="dxa"/>
+              <w:start w:w="120" w:type="dxa"/>
+              <w:bottom w:w="80" w:type="dxa"/>
+              <w:end w:w="120" w:type="dxa"/>
+            </w:tcMar>
+            <w:vAlign w:val="center"/>
+          </w:tcPr>
+          <w:p>
+            <w:pPr>
+              <w:spacing w:before="0" w:after="0" w:line="276" w:lineRule="auto"/>
+              <w:jc w:val="left"/>
+            </w:pPr>
+            <w:r>
+              <w:rPr>
+                <w:rFonts w:ascii="Calibri" w:hAnsi="Calibri" w:eastAsia="Microsoft YaHei"/>
+                <w:sz w:val="18"/>
+              </w:rPr>
+              <w:t>dt_task_handle</w:t>
+            </w:r>
+          </w:p>
+        </w:tc>
+        <w:tc>
+          <w:tcPr>
+            <w:tcW w:type="dxa" w:w="3100"/>
+            <w:tcMar>
+              <w:top w:w="80" w:type="dxa"/>
+              <w:start w:w="120" w:type="dxa"/>
+              <w:bottom w:w="80" w:type="dxa"/>
+              <w:end w:w="120" w:type="dxa"/>
+            </w:tcMar>
+            <w:vAlign w:val="center"/>
+          </w:tcPr>
+          <w:p>
+            <w:pPr>
+              <w:spacing w:before="0" w:after="0" w:line="276" w:lineRule="auto"/>
+              <w:jc w:val="left"/>
+            </w:pPr>
+            <w:r>
+              <w:rPr>
+                <w:rFonts w:ascii="Calibri" w:hAnsi="Calibri" w:eastAsia="Microsoft YaHei"/>
+                <w:sz w:val="18"/>
+              </w:rPr>
+              <w:t>异步转换启动</w:t>
+            </w:r>
+          </w:p>
+        </w:tc>
+        <w:tc>
+          <w:tcPr>
+            <w:tcW w:type="dxa" w:w="3760"/>
+            <w:tcMar>
+              <w:top w:w="80" w:type="dxa"/>
+              <w:start w:w="120" w:type="dxa"/>
+              <w:bottom w:w="80" w:type="dxa"/>
+              <w:end w:w="120" w:type="dxa"/>
+            </w:tcMar>
+            <w:vAlign w:val="center"/>
+          </w:tcPr>
+          <w:p>
+            <w:pPr>
+              <w:spacing w:before="0" w:after="0" w:line="276" w:lineRule="auto"/>
+              <w:jc w:val="left"/>
+            </w:pPr>
+            <w:r>
+              <w:rPr>
+                <w:rFonts w:ascii="Calibri" w:hAnsi="Calibri" w:eastAsia="Microsoft YaHei"/>
+                <w:sz w:val="18"/>
+              </w:rPr>
+              <w:t>dt_task_destroy</w:t>
             </w:r>
           </w:p>
         </w:tc>
@@ -8149,7 +9864,7 @@
         <w:rPr>
           <w:rFonts w:ascii="Calibri" w:hAnsi="Calibri" w:eastAsia="Microsoft YaHei"/>
         </w:rPr>
-        <w:t>测试覆盖生命周期、批量建网、最近点、点定位、范围查询、动态插入/删除、高程更新、DTIN 往返、XYZ 导入、DTMESH 往返及随机编辑序列。</w:t>
+        <w:t>测试覆盖生命周期、批量建网、最近点、点定位、范围查询、动态插入/删除、高程更新、DTIN 往返、XYZ 导入、DTMESH 往返、TIN/GRID 转换、等高线拼接、DGRID/DCONTOUR 往返、异步成功与失败任务及随机编辑序列。</w:t>
       </w:r>
     </w:p>
     <w:p>
@@ -8699,7 +10414,7 @@
         <w:rPr>
           <w:rFonts w:ascii="Calibri" w:hAnsi="Calibri" w:eastAsia="Microsoft YaHei"/>
         </w:rPr>
-        <w:t>后续约束 Delaunay 阶段计划增加折线约束、地形外边界、孔洞、约束顶点保护规则和约束数据文件块。稳定 C ABI 不暴露 CGAL 类型，可在保持现有调用方兼容的前提下扩展。</w:t>
+        <w:t>下一阶段计划接入 GDAL/PROJ，实现 GeoTIFF/COG GRID 和 GeoPackage 等高线交换；随后增加折线约束、地形外边界、孔洞、约束顶点保护规则和约束数据文件块。稳定 C ABI 不暴露 CGAL 类型，可在保持现有调用方兼容的前提下扩展。</w:t>
       </w:r>
     </w:p>
     <w:sectPr>
@@ -8729,7 +10444,7 @@
         <w:color w:val="66727D"/>
         <w:sz w:val="18"/>
       </w:rPr>
-      <w:t xml:space="preserve">版本 0.2.0  |  第 </w:t>
+      <w:t xml:space="preserve">版本 0.3.0  |  第 </w:t>
     </w:r>
     <w:r>
       <w:rPr>

</xml_diff>

<commit_message>
feat: add optional GDAL terrain exchange
</commit_message>
<xml_diff>
--- a/docs/manuals/dterrain_DLL开发使用手册.docx
+++ b/docs/manuals/dterrain_DLL开发使用手册.docx
@@ -85,7 +85,7 @@
           <w:color w:val="203748"/>
           <w:sz w:val="22"/>
         </w:rPr>
-        <w:t>版本 0.3.0  |  2026-07-15</w:t>
+        <w:t>版本 0.4.0  |  2026-07-15</w:t>
       </w:r>
     </w:p>
     <w:p>
@@ -237,7 +237,7 @@
                 <w:rFonts w:ascii="Calibri" w:hAnsi="Calibri" w:eastAsia="Microsoft YaHei"/>
                 <w:sz w:val="18"/>
               </w:rPr>
-              <w:t>0.3.0</w:t>
+              <w:t>0.4.0</w:t>
             </w:r>
           </w:p>
         </w:tc>
@@ -445,7 +445,7 @@
                 <w:rFonts w:ascii="Calibri" w:hAnsi="Calibri" w:eastAsia="Microsoft YaHei"/>
                 <w:sz w:val="18"/>
               </w:rPr>
-              <w:t>架构、构建部署、稳定 C ABI、GRID/等高线转换、异步任务、12 个兼容接口、文件格式、性能、线程安全、故障排查。</w:t>
+              <w:t>架构、构建部署、稳定 C ABI、GRID/等高线转换、GDAL 格式交换、异步任务、12 个兼容接口、文件格式、性能、线程安全、故障排查。</w:t>
             </w:r>
           </w:p>
         </w:tc>
@@ -516,7 +516,7 @@
         <w:rPr>
           <w:rFonts w:ascii="Calibri" w:hAnsi="Calibri" w:eastAsia="Microsoft YaHei"/>
         </w:rPr>
-        <w:t>文件交换：重点阅读第 6 章的 XYZ、DTMESH 和 DTIN。</w:t>
+        <w:t>文件交换：重点阅读第 4.7 章和第 6 章。</w:t>
       </w:r>
     </w:p>
     <w:p>
@@ -537,7 +537,7 @@
         <w:rPr>
           <w:rFonts w:ascii="Calibri" w:hAnsi="Calibri" w:eastAsia="Microsoft YaHei"/>
         </w:rPr>
-        <w:t>本手册对应 dterrain 0.3.0：已提供普通 Delaunay TIN、GRID、TIN/GRID 等高线和异步转换任务。GDAL 地理格式、约束线、外边界、孔洞、约束 Delaunay 和三维 GUI 属于后续阶段。</w:t>
+        <w:t>本手册对应 dterrain 0.4.0：已提供普通 Delaunay TIN、GRID、TIN/GRID 等高线、异步转换任务、CRS WKT，以及可选 GeoTIFF/COG/GeoPackage 交换。约束线、外边界、孔洞、约束 Delaunay 和三维 GUI 属于后续阶段。</w:t>
       </w:r>
     </w:p>
     <w:p>
@@ -650,6 +650,17 @@
           <w:rFonts w:ascii="Calibri" w:hAnsi="Calibri" w:eastAsia="Microsoft YaHei"/>
         </w:rPr>
         <w:t>耗时转换的异步任务、进度、等待、协作取消和结果提取。</w:t>
+      </w:r>
+    </w:p>
+    <w:p>
+      <w:pPr>
+        <w:pStyle w:val="ListBullet"/>
+      </w:pPr>
+      <w:r>
+        <w:rPr>
+          <w:rFonts w:ascii="Calibri" w:hAnsi="Calibri" w:eastAsia="Microsoft YaHei"/>
+        </w:rPr>
+        <w:t>TIN/GRID/等高线 CRS WKT 元数据，以及可选 GeoTIFF/COG/GeoPackage 交换。</w:t>
       </w:r>
     </w:p>
     <w:p>
@@ -1052,7 +1063,7 @@
                 <w:rFonts w:ascii="Calibri" w:hAnsi="Calibri" w:eastAsia="Microsoft YaHei"/>
                 <w:sz w:val="18"/>
               </w:rPr>
-              <w:t>等高线是派生表达；0.3 尚未实现等高线反推 TIN/GRID。</w:t>
+              <w:t>等高线是派生表达；0.4 尚未实现等高线反推 TIN/GRID。</w:t>
             </w:r>
           </w:p>
         </w:tc>
@@ -1130,7 +1141,7 @@
           <w:rFonts w:ascii="Consolas" w:hAnsi="Consolas" w:eastAsia="Microsoft YaHei"/>
           <w:sz w:val="17"/>
         </w:rPr>
-        <w:t>稳定 C ABI + Terrain API + Task API + Legacy 兼容层</w:t>
+        <w:t>稳定 C ABI + Terrain API + Task API + GDAL API + Legacy 兼容层</w:t>
       </w:r>
       <w:r>
         <w:br/>
@@ -1231,6 +1242,16 @@
           <w:sz w:val="17"/>
         </w:rPr>
         <w:t>GRID &lt;---- 转换引擎 ----&gt; TIN ----&gt; 等高线</w:t>
+      </w:r>
+      <w:r>
+        <w:br/>
+      </w:r>
+      <w:r>
+        <w:rPr>
+          <w:rFonts w:ascii="Consolas" w:hAnsi="Consolas" w:eastAsia="Microsoft YaHei"/>
+          <w:sz w:val="17"/>
+        </w:rPr>
+        <w:t xml:space="preserve">  \------------- 可选 GDAL Adapter -------------/</w:t>
       </w:r>
     </w:p>
     <w:p>
@@ -6087,8 +6108,501 @@
       </w:r>
     </w:p>
     <w:p>
-      <w:r>
-        <w:br w:type="page"/>
+      <w:pPr>
+        <w:pStyle w:val="Heading2"/>
+      </w:pPr>
+      <w:r>
+        <w:t>4.7 CRS 与 GDAL 格式交换</w:t>
+      </w:r>
+    </w:p>
+    <w:p>
+      <w:r>
+        <w:rPr>
+          <w:rFonts w:ascii="Calibri" w:hAnsi="Calibri" w:eastAsia="Microsoft YaHei"/>
+        </w:rPr>
+        <w:t>dt_gdal_api.h 是可选适配层。默认 DT_WITH_GDAL=OFF 时函数仍然导出，但返回 DT_E_UNSUPPORTED；启用后可导入导出 GeoTIFF/COG GRID 和 GeoPackage 等高线。TIN、GRID 与等高线的 CRS 以 UTF-8 WKT 保存并在转换时传播，当前不执行坐标重投影。</w:t>
+      </w:r>
+    </w:p>
+    <w:p>
+      <w:pPr>
+        <w:pStyle w:val="DterrainCode"/>
+        <w:shd w:fill="F2F4F7"/>
+      </w:pPr>
+      <w:r>
+        <w:rPr>
+          <w:rFonts w:ascii="Consolas" w:hAnsi="Consolas" w:eastAsia="Microsoft YaHei"/>
+          <w:sz w:val="17"/>
+        </w:rPr>
+        <w:t>#include "dt_gdal_api.h"</w:t>
+      </w:r>
+      <w:r>
+        <w:br/>
+      </w:r>
+      <w:r>
+        <w:rPr>
+          <w:rFonts w:ascii="Consolas" w:hAnsi="Consolas" w:eastAsia="Microsoft YaHei"/>
+          <w:sz w:val="17"/>
+        </w:rPr>
+      </w:r>
+      <w:r>
+        <w:br/>
+      </w:r>
+      <w:r>
+        <w:rPr>
+          <w:rFonts w:ascii="Consolas" w:hAnsi="Consolas" w:eastAsia="Microsoft YaHei"/>
+          <w:sz w:val="17"/>
+        </w:rPr>
+        <w:t>dt_gdal_raster_save_options save{};</w:t>
+      </w:r>
+      <w:r>
+        <w:br/>
+      </w:r>
+      <w:r>
+        <w:rPr>
+          <w:rFonts w:ascii="Consolas" w:hAnsi="Consolas" w:eastAsia="Microsoft YaHei"/>
+          <w:sz w:val="17"/>
+        </w:rPr>
+        <w:t>save.struct_size = sizeof(save);</w:t>
+      </w:r>
+      <w:r>
+        <w:br/>
+      </w:r>
+      <w:r>
+        <w:rPr>
+          <w:rFonts w:ascii="Consolas" w:hAnsi="Consolas" w:eastAsia="Microsoft YaHei"/>
+          <w:sz w:val="17"/>
+        </w:rPr>
+        <w:t>save.driver_name = "COG";</w:t>
+      </w:r>
+      <w:r>
+        <w:br/>
+      </w:r>
+      <w:r>
+        <w:rPr>
+          <w:rFonts w:ascii="Consolas" w:hAnsi="Consolas" w:eastAsia="Microsoft YaHei"/>
+          <w:sz w:val="17"/>
+        </w:rPr>
+        <w:t>const char* co[] = {"COMPRESS=DEFLATE", nullptr};</w:t>
+      </w:r>
+      <w:r>
+        <w:br/>
+      </w:r>
+      <w:r>
+        <w:rPr>
+          <w:rFonts w:ascii="Consolas" w:hAnsi="Consolas" w:eastAsia="Microsoft YaHei"/>
+          <w:sz w:val="17"/>
+        </w:rPr>
+        <w:t>save.creation_options = co;</w:t>
+      </w:r>
+      <w:r>
+        <w:br/>
+      </w:r>
+      <w:r>
+        <w:rPr>
+          <w:rFonts w:ascii="Consolas" w:hAnsi="Consolas" w:eastAsia="Microsoft YaHei"/>
+          <w:sz w:val="17"/>
+        </w:rPr>
+        <w:t>dt_grid_save_gdal_raster(grid, "terrain.tif", &amp;save);</w:t>
+      </w:r>
+      <w:r>
+        <w:br/>
+      </w:r>
+      <w:r>
+        <w:rPr>
+          <w:rFonts w:ascii="Consolas" w:hAnsi="Consolas" w:eastAsia="Microsoft YaHei"/>
+          <w:sz w:val="17"/>
+        </w:rPr>
+      </w:r>
+      <w:r>
+        <w:br/>
+      </w:r>
+      <w:r>
+        <w:rPr>
+          <w:rFonts w:ascii="Consolas" w:hAnsi="Consolas" w:eastAsia="Microsoft YaHei"/>
+          <w:sz w:val="17"/>
+        </w:rPr>
+        <w:t>dt_grid_handle loaded = nullptr;</w:t>
+      </w:r>
+      <w:r>
+        <w:br/>
+      </w:r>
+      <w:r>
+        <w:rPr>
+          <w:rFonts w:ascii="Consolas" w:hAnsi="Consolas" w:eastAsia="Microsoft YaHei"/>
+          <w:sz w:val="17"/>
+        </w:rPr>
+        <w:t>dt_grid_load_gdal_raster("terrain.tif", nullptr, &amp;loaded);</w:t>
+      </w:r>
+      <w:r>
+        <w:br/>
+      </w:r>
+      <w:r>
+        <w:rPr>
+          <w:rFonts w:ascii="Consolas" w:hAnsi="Consolas" w:eastAsia="Microsoft YaHei"/>
+          <w:sz w:val="17"/>
+        </w:rPr>
+        <w:t>dt_grid_destroy(loaded);</w:t>
+      </w:r>
+    </w:p>
+    <w:tbl>
+      <w:tblPr>
+        <w:tblStyle w:val="TableGrid"/>
+        <w:tblW w:type="dxa" w:w="9360"/>
+        <w:jc w:val="left"/>
+        <w:tblLayout w:type="fixed"/>
+        <w:tblLook w:firstColumn="1" w:firstRow="1" w:lastColumn="0" w:lastRow="0" w:noHBand="0" w:noVBand="1" w:val="04A0"/>
+        <w:tblInd w:w="120" w:type="dxa"/>
+      </w:tblPr>
+      <w:tblGrid>
+        <w:gridCol w:w="2000"/>
+        <w:gridCol w:w="2500"/>
+        <w:gridCol w:w="4860"/>
+      </w:tblGrid>
+      <w:tr>
+        <w:trPr>
+          <w:tblHeader w:val="true"/>
+        </w:trPr>
+        <w:tc>
+          <w:tcPr>
+            <w:tcW w:type="dxa" w:w="2000"/>
+            <w:shd w:fill="E8EEF5"/>
+            <w:tcMar>
+              <w:top w:w="80" w:type="dxa"/>
+              <w:start w:w="120" w:type="dxa"/>
+              <w:bottom w:w="80" w:type="dxa"/>
+              <w:end w:w="120" w:type="dxa"/>
+            </w:tcMar>
+            <w:vAlign w:val="center"/>
+          </w:tcPr>
+          <w:p>
+            <w:pPr>
+              <w:spacing w:before="0" w:after="0"/>
+              <w:jc w:val="center"/>
+            </w:pPr>
+            <w:r>
+              <w:rPr>
+                <w:rFonts w:ascii="Calibri" w:hAnsi="Calibri" w:eastAsia="Microsoft YaHei"/>
+                <w:b/>
+                <w:color w:val="203748"/>
+                <w:sz w:val="19"/>
+              </w:rPr>
+              <w:t>对象</w:t>
+            </w:r>
+          </w:p>
+        </w:tc>
+        <w:tc>
+          <w:tcPr>
+            <w:tcW w:type="dxa" w:w="2500"/>
+            <w:shd w:fill="E8EEF5"/>
+            <w:tcMar>
+              <w:top w:w="80" w:type="dxa"/>
+              <w:start w:w="120" w:type="dxa"/>
+              <w:bottom w:w="80" w:type="dxa"/>
+              <w:end w:w="120" w:type="dxa"/>
+            </w:tcMar>
+            <w:vAlign w:val="center"/>
+          </w:tcPr>
+          <w:p>
+            <w:pPr>
+              <w:spacing w:before="0" w:after="0"/>
+              <w:jc w:val="center"/>
+            </w:pPr>
+            <w:r>
+              <w:rPr>
+                <w:rFonts w:ascii="Calibri" w:hAnsi="Calibri" w:eastAsia="Microsoft YaHei"/>
+                <w:b/>
+                <w:color w:val="203748"/>
+                <w:sz w:val="19"/>
+              </w:rPr>
+              <w:t>格式/驱动</w:t>
+            </w:r>
+          </w:p>
+        </w:tc>
+        <w:tc>
+          <w:tcPr>
+            <w:tcW w:type="dxa" w:w="4860"/>
+            <w:shd w:fill="E8EEF5"/>
+            <w:tcMar>
+              <w:top w:w="80" w:type="dxa"/>
+              <w:start w:w="120" w:type="dxa"/>
+              <w:bottom w:w="80" w:type="dxa"/>
+              <w:end w:w="120" w:type="dxa"/>
+            </w:tcMar>
+            <w:vAlign w:val="center"/>
+          </w:tcPr>
+          <w:p>
+            <w:pPr>
+              <w:spacing w:before="0" w:after="0"/>
+              <w:jc w:val="center"/>
+            </w:pPr>
+            <w:r>
+              <w:rPr>
+                <w:rFonts w:ascii="Calibri" w:hAnsi="Calibri" w:eastAsia="Microsoft YaHei"/>
+                <w:b/>
+                <w:color w:val="203748"/>
+                <w:sz w:val="19"/>
+              </w:rPr>
+              <w:t>保真内容</w:t>
+            </w:r>
+          </w:p>
+        </w:tc>
+      </w:tr>
+      <w:tr>
+        <w:tc>
+          <w:tcPr>
+            <w:tcW w:type="dxa" w:w="2000"/>
+            <w:tcMar>
+              <w:top w:w="80" w:type="dxa"/>
+              <w:start w:w="120" w:type="dxa"/>
+              <w:bottom w:w="80" w:type="dxa"/>
+              <w:end w:w="120" w:type="dxa"/>
+            </w:tcMar>
+            <w:vAlign w:val="center"/>
+          </w:tcPr>
+          <w:p>
+            <w:pPr>
+              <w:spacing w:before="0" w:after="0" w:line="276" w:lineRule="auto"/>
+              <w:jc w:val="left"/>
+            </w:pPr>
+            <w:r>
+              <w:rPr>
+                <w:rFonts w:ascii="Calibri" w:hAnsi="Calibri" w:eastAsia="Microsoft YaHei"/>
+                <w:sz w:val="18"/>
+              </w:rPr>
+              <w:t>GRID</w:t>
+            </w:r>
+          </w:p>
+        </w:tc>
+        <w:tc>
+          <w:tcPr>
+            <w:tcW w:type="dxa" w:w="2500"/>
+            <w:tcMar>
+              <w:top w:w="80" w:type="dxa"/>
+              <w:start w:w="120" w:type="dxa"/>
+              <w:bottom w:w="80" w:type="dxa"/>
+              <w:end w:w="120" w:type="dxa"/>
+            </w:tcMar>
+            <w:vAlign w:val="center"/>
+          </w:tcPr>
+          <w:p>
+            <w:pPr>
+              <w:spacing w:before="0" w:after="0" w:line="276" w:lineRule="auto"/>
+              <w:jc w:val="left"/>
+            </w:pPr>
+            <w:r>
+              <w:rPr>
+                <w:rFonts w:ascii="Calibri" w:hAnsi="Calibri" w:eastAsia="Microsoft YaHei"/>
+                <w:sz w:val="18"/>
+              </w:rPr>
+              <w:t>GTiff / COG</w:t>
+            </w:r>
+          </w:p>
+        </w:tc>
+        <w:tc>
+          <w:tcPr>
+            <w:tcW w:type="dxa" w:w="4860"/>
+            <w:tcMar>
+              <w:top w:w="80" w:type="dxa"/>
+              <w:start w:w="120" w:type="dxa"/>
+              <w:bottom w:w="80" w:type="dxa"/>
+              <w:end w:w="120" w:type="dxa"/>
+            </w:tcMar>
+            <w:vAlign w:val="center"/>
+          </w:tcPr>
+          <w:p>
+            <w:pPr>
+              <w:spacing w:before="0" w:after="0" w:line="276" w:lineRule="auto"/>
+              <w:jc w:val="left"/>
+            </w:pPr>
+            <w:r>
+              <w:rPr>
+                <w:rFonts w:ascii="Calibri" w:hAnsi="Calibri" w:eastAsia="Microsoft YaHei"/>
+                <w:sz w:val="18"/>
+              </w:rPr>
+              <w:t>double 高程、NoData、仿射变换、CRS WKT</w:t>
+            </w:r>
+          </w:p>
+        </w:tc>
+      </w:tr>
+      <w:tr>
+        <w:tc>
+          <w:tcPr>
+            <w:tcW w:type="dxa" w:w="2000"/>
+            <w:tcMar>
+              <w:top w:w="80" w:type="dxa"/>
+              <w:start w:w="120" w:type="dxa"/>
+              <w:bottom w:w="80" w:type="dxa"/>
+              <w:end w:w="120" w:type="dxa"/>
+            </w:tcMar>
+            <w:vAlign w:val="center"/>
+          </w:tcPr>
+          <w:p>
+            <w:pPr>
+              <w:spacing w:before="0" w:after="0" w:line="276" w:lineRule="auto"/>
+              <w:jc w:val="left"/>
+            </w:pPr>
+            <w:r>
+              <w:rPr>
+                <w:rFonts w:ascii="Calibri" w:hAnsi="Calibri" w:eastAsia="Microsoft YaHei"/>
+                <w:sz w:val="18"/>
+              </w:rPr>
+              <w:t>等高线</w:t>
+            </w:r>
+          </w:p>
+        </w:tc>
+        <w:tc>
+          <w:tcPr>
+            <w:tcW w:type="dxa" w:w="2500"/>
+            <w:tcMar>
+              <w:top w:w="80" w:type="dxa"/>
+              <w:start w:w="120" w:type="dxa"/>
+              <w:bottom w:w="80" w:type="dxa"/>
+              <w:end w:w="120" w:type="dxa"/>
+            </w:tcMar>
+            <w:vAlign w:val="center"/>
+          </w:tcPr>
+          <w:p>
+            <w:pPr>
+              <w:spacing w:before="0" w:after="0" w:line="276" w:lineRule="auto"/>
+              <w:jc w:val="left"/>
+            </w:pPr>
+            <w:r>
+              <w:rPr>
+                <w:rFonts w:ascii="Calibri" w:hAnsi="Calibri" w:eastAsia="Microsoft YaHei"/>
+                <w:sz w:val="18"/>
+              </w:rPr>
+              <w:t>GPKG</w:t>
+            </w:r>
+          </w:p>
+        </w:tc>
+        <w:tc>
+          <w:tcPr>
+            <w:tcW w:type="dxa" w:w="4860"/>
+            <w:tcMar>
+              <w:top w:w="80" w:type="dxa"/>
+              <w:start w:w="120" w:type="dxa"/>
+              <w:bottom w:w="80" w:type="dxa"/>
+              <w:end w:w="120" w:type="dxa"/>
+            </w:tcMar>
+            <w:vAlign w:val="center"/>
+          </w:tcPr>
+          <w:p>
+            <w:pPr>
+              <w:spacing w:before="0" w:after="0" w:line="276" w:lineRule="auto"/>
+              <w:jc w:val="left"/>
+            </w:pPr>
+            <w:r>
+              <w:rPr>
+                <w:rFonts w:ascii="Calibri" w:hAnsi="Calibri" w:eastAsia="Microsoft YaHei"/>
+                <w:sz w:val="18"/>
+              </w:rPr>
+              <w:t>LineStringZ、elevation、closed、CRS WKT</w:t>
+            </w:r>
+          </w:p>
+        </w:tc>
+      </w:tr>
+      <w:tr>
+        <w:tc>
+          <w:tcPr>
+            <w:tcW w:type="dxa" w:w="2000"/>
+            <w:tcMar>
+              <w:top w:w="80" w:type="dxa"/>
+              <w:start w:w="120" w:type="dxa"/>
+              <w:bottom w:w="80" w:type="dxa"/>
+              <w:end w:w="120" w:type="dxa"/>
+            </w:tcMar>
+            <w:vAlign w:val="center"/>
+          </w:tcPr>
+          <w:p>
+            <w:pPr>
+              <w:spacing w:before="0" w:after="0" w:line="276" w:lineRule="auto"/>
+              <w:jc w:val="left"/>
+            </w:pPr>
+            <w:r>
+              <w:rPr>
+                <w:rFonts w:ascii="Calibri" w:hAnsi="Calibri" w:eastAsia="Microsoft YaHei"/>
+                <w:sz w:val="18"/>
+              </w:rPr>
+              <w:t>坐标换算</w:t>
+            </w:r>
+          </w:p>
+        </w:tc>
+        <w:tc>
+          <w:tcPr>
+            <w:tcW w:type="dxa" w:w="2500"/>
+            <w:tcMar>
+              <w:top w:w="80" w:type="dxa"/>
+              <w:start w:w="120" w:type="dxa"/>
+              <w:bottom w:w="80" w:type="dxa"/>
+              <w:end w:w="120" w:type="dxa"/>
+            </w:tcMar>
+            <w:vAlign w:val="center"/>
+          </w:tcPr>
+          <w:p>
+            <w:pPr>
+              <w:spacing w:before="0" w:after="0" w:line="276" w:lineRule="auto"/>
+              <w:jc w:val="left"/>
+            </w:pPr>
+            <w:r>
+              <w:rPr>
+                <w:rFonts w:ascii="Calibri" w:hAnsi="Calibri" w:eastAsia="Microsoft YaHei"/>
+                <w:sz w:val="18"/>
+              </w:rPr>
+              <w:t>GDAL ↔ GRID</w:t>
+            </w:r>
+          </w:p>
+        </w:tc>
+        <w:tc>
+          <w:tcPr>
+            <w:tcW w:type="dxa" w:w="4860"/>
+            <w:tcMar>
+              <w:top w:w="80" w:type="dxa"/>
+              <w:start w:w="120" w:type="dxa"/>
+              <w:bottom w:w="80" w:type="dxa"/>
+              <w:end w:w="120" w:type="dxa"/>
+            </w:tcMar>
+            <w:vAlign w:val="center"/>
+          </w:tcPr>
+          <w:p>
+            <w:pPr>
+              <w:spacing w:before="0" w:after="0" w:line="276" w:lineRule="auto"/>
+              <w:jc w:val="left"/>
+            </w:pPr>
+            <w:r>
+              <w:rPr>
+                <w:rFonts w:ascii="Calibri" w:hAnsi="Calibri" w:eastAsia="Microsoft YaHei"/>
+                <w:sz w:val="18"/>
+              </w:rPr>
+              <w:t>像元角点与节点中心自动进行半像元偏移</w:t>
+            </w:r>
+          </w:p>
+        </w:tc>
+      </w:tr>
+    </w:tbl>
+    <w:p>
+      <w:pPr>
+        <w:spacing w:before="0" w:after="40"/>
+      </w:pPr>
+    </w:p>
+    <w:p>
+      <w:pPr>
+        <w:spacing w:before="100" w:after="160" w:line="288" w:lineRule="auto"/>
+        <w:ind w:left="230" w:right="230"/>
+        <w:shd w:fill="FFF7E0"/>
+      </w:pPr>
+      <w:r>
+        <w:rPr>
+          <w:rFonts w:ascii="Calibri" w:hAnsi="Calibri" w:eastAsia="Microsoft YaHei"/>
+          <w:b/>
+          <w:color w:val="7A5A00"/>
+        </w:rPr>
+        <w:t xml:space="preserve">部署  </w:t>
+      </w:r>
+      <w:r>
+        <w:rPr>
+          <w:rFonts w:ascii="Calibri" w:hAnsi="Calibri" w:eastAsia="Microsoft YaHei"/>
+        </w:rPr>
+        <w:t>启用 GDAL 的便携目录必须携带构建目录复制出的 GDAL、PROJ、SQLite、GeoTIFF 等运行时 DLL，以及 DLL 同级 share/proj/proj.db。COG 使用 CreateCopy，会比普通 GTiff 需要更多临时内存/存储。</w:t>
       </w:r>
     </w:p>
     <w:p>
@@ -7629,6 +8143,22 @@
     </w:p>
     <w:p>
       <w:pPr>
+        <w:pStyle w:val="Heading2"/>
+      </w:pPr>
+      <w:r>
+        <w:t>6.6 GeoTIFF、COG 与 GeoPackage</w:t>
+      </w:r>
+    </w:p>
+    <w:p>
+      <w:r>
+        <w:rPr>
+          <w:rFonts w:ascii="Calibri" w:hAnsi="Calibri" w:eastAsia="Microsoft YaHei"/>
+        </w:rPr>
+        <w:t>启用 DT_WITH_GDAL 后，dt_grid_load/save_gdal_raster 读写 GDAL 单波段高程栅格；dt_contours_load/save_gdal_vector 读写等高线矢量层。普通 GeoTIFF 逐行写入；COG 按驱动要求通过临时数据集 CreateCopy；GeoPackage 输出 LineStringZ 和 elevation/closed 字段。</w:t>
+      </w:r>
+    </w:p>
+    <w:p>
+      <w:pPr>
         <w:pStyle w:val="Heading1"/>
       </w:pPr>
       <w:r>
@@ -9864,7 +10394,7 @@
         <w:rPr>
           <w:rFonts w:ascii="Calibri" w:hAnsi="Calibri" w:eastAsia="Microsoft YaHei"/>
         </w:rPr>
-        <w:t>测试覆盖生命周期、批量建网、最近点、点定位、范围查询、动态插入/删除、高程更新、DTIN 往返、XYZ 导入、DTMESH 往返、TIN/GRID 转换、等高线拼接、DGRID/DCONTOUR 往返、异步成功与失败任务及随机编辑序列。</w:t>
+        <w:t>测试覆盖生命周期、批量建网、最近点、点定位、范围查询、动态插入/删除、高程更新、DTIN 往返、XYZ 导入、DTMESH 往返、TIN/GRID 转换、CRS 传播、等高线拼接、DGRID/DCONTOUR 往返、异步任务及随机编辑序列。GDAL 构建还执行 GTiff、COG、GPKG 驱动探测和真实文件往返。</w:t>
       </w:r>
     </w:p>
     <w:p>
@@ -10387,6 +10917,110 @@
           </w:p>
         </w:tc>
       </w:tr>
+      <w:tr>
+        <w:tc>
+          <w:tcPr>
+            <w:tcW w:type="dxa" w:w="2600"/>
+            <w:tcMar>
+              <w:top w:w="80" w:type="dxa"/>
+              <w:start w:w="120" w:type="dxa"/>
+              <w:bottom w:w="80" w:type="dxa"/>
+              <w:end w:w="120" w:type="dxa"/>
+            </w:tcMar>
+            <w:vAlign w:val="center"/>
+          </w:tcPr>
+          <w:p>
+            <w:pPr>
+              <w:spacing w:before="0" w:after="0" w:line="276" w:lineRule="auto"/>
+              <w:jc w:val="left"/>
+            </w:pPr>
+            <w:r>
+              <w:rPr>
+                <w:rFonts w:ascii="Calibri" w:hAnsi="Calibri" w:eastAsia="Microsoft YaHei"/>
+                <w:sz w:val="18"/>
+              </w:rPr>
+              <w:t>GDAL 接口不支持</w:t>
+            </w:r>
+          </w:p>
+        </w:tc>
+        <w:tc>
+          <w:tcPr>
+            <w:tcW w:type="dxa" w:w="6760"/>
+            <w:tcMar>
+              <w:top w:w="80" w:type="dxa"/>
+              <w:start w:w="120" w:type="dxa"/>
+              <w:bottom w:w="80" w:type="dxa"/>
+              <w:end w:w="120" w:type="dxa"/>
+            </w:tcMar>
+            <w:vAlign w:val="center"/>
+          </w:tcPr>
+          <w:p>
+            <w:pPr>
+              <w:spacing w:before="0" w:after="0" w:line="276" w:lineRule="auto"/>
+              <w:jc w:val="left"/>
+            </w:pPr>
+            <w:r>
+              <w:rPr>
+                <w:rFonts w:ascii="Calibri" w:hAnsi="Calibri" w:eastAsia="Microsoft YaHei"/>
+                <w:sz w:val="18"/>
+              </w:rPr>
+              <w:t>重新配置 DT_WITH_GDAL=ON，并确认 GDAL::GDAL 可被 CMake 找到。</w:t>
+            </w:r>
+          </w:p>
+        </w:tc>
+      </w:tr>
+      <w:tr>
+        <w:tc>
+          <w:tcPr>
+            <w:tcW w:type="dxa" w:w="2600"/>
+            <w:tcMar>
+              <w:top w:w="80" w:type="dxa"/>
+              <w:start w:w="120" w:type="dxa"/>
+              <w:bottom w:w="80" w:type="dxa"/>
+              <w:end w:w="120" w:type="dxa"/>
+            </w:tcMar>
+            <w:vAlign w:val="center"/>
+          </w:tcPr>
+          <w:p>
+            <w:pPr>
+              <w:spacing w:before="0" w:after="0" w:line="276" w:lineRule="auto"/>
+              <w:jc w:val="left"/>
+            </w:pPr>
+            <w:r>
+              <w:rPr>
+                <w:rFonts w:ascii="Calibri" w:hAnsi="Calibri" w:eastAsia="Microsoft YaHei"/>
+                <w:sz w:val="18"/>
+              </w:rPr>
+              <w:t>GDAL 版 DLL 无法加载</w:t>
+            </w:r>
+          </w:p>
+        </w:tc>
+        <w:tc>
+          <w:tcPr>
+            <w:tcW w:type="dxa" w:w="6760"/>
+            <w:tcMar>
+              <w:top w:w="80" w:type="dxa"/>
+              <w:start w:w="120" w:type="dxa"/>
+              <w:bottom w:w="80" w:type="dxa"/>
+              <w:end w:w="120" w:type="dxa"/>
+            </w:tcMar>
+            <w:vAlign w:val="center"/>
+          </w:tcPr>
+          <w:p>
+            <w:pPr>
+              <w:spacing w:before="0" w:after="0" w:line="276" w:lineRule="auto"/>
+              <w:jc w:val="left"/>
+            </w:pPr>
+            <w:r>
+              <w:rPr>
+                <w:rFonts w:ascii="Calibri" w:hAnsi="Calibri" w:eastAsia="Microsoft YaHei"/>
+                <w:sz w:val="18"/>
+              </w:rPr>
+              <w:t>将构建目录复制出的 GDAL/PROJ/SQLite/GeoTIFF 等依赖 DLL 与 dterrain.dll 放在同目录。</w:t>
+            </w:r>
+          </w:p>
+        </w:tc>
+      </w:tr>
     </w:tbl>
     <w:p>
       <w:pPr>
@@ -10414,7 +11048,7 @@
         <w:rPr>
           <w:rFonts w:ascii="Calibri" w:hAnsi="Calibri" w:eastAsia="Microsoft YaHei"/>
         </w:rPr>
-        <w:t>下一阶段计划接入 GDAL/PROJ，实现 GeoTIFF/COG GRID 和 GeoPackage 等高线交换；随后增加折线约束、地形外边界、孔洞、约束顶点保护规则和约束数据文件块。稳定 C ABI 不暴露 CGAL 类型，可在保持现有调用方兼容的前提下扩展。</w:t>
+        <w:t>当前已完成可选 GDAL/PROJ 数据交换层。下一阶段将增加折线约束、地形外边界、孔洞、约束顶点保护规则和约束数据文件块；随后建设 Qt/VTK 三维图层、拾取与漫游。稳定 C ABI 不暴露 CGAL/GDAL 类型，可在保持现有调用方兼容的前提下扩展。</w:t>
       </w:r>
     </w:p>
     <w:sectPr>
@@ -10444,7 +11078,7 @@
         <w:color w:val="66727D"/>
         <w:sz w:val="18"/>
       </w:rPr>
-      <w:t xml:space="preserve">版本 0.3.0  |  第 </w:t>
+      <w:t xml:space="preserve">版本 0.4.0  |  第 </w:t>
     </w:r>
     <w:r>
       <w:rPr>

</xml_diff>

<commit_message>
feat: add interactive 3D terrain viewer
</commit_message>
<xml_diff>
--- a/docs/manuals/dterrain_DLL开发使用手册.docx
+++ b/docs/manuals/dterrain_DLL开发使用手册.docx
@@ -85,7 +85,7 @@
           <w:color w:val="203748"/>
           <w:sz w:val="22"/>
         </w:rPr>
-        <w:t>版本 0.4.0  |  2026-07-15</w:t>
+        <w:t>版本 0.5.0  |  2026-07-16</w:t>
       </w:r>
     </w:p>
     <w:p>
@@ -237,7 +237,7 @@
                 <w:rFonts w:ascii="Calibri" w:hAnsi="Calibri" w:eastAsia="Microsoft YaHei"/>
                 <w:sz w:val="18"/>
               </w:rPr>
-              <w:t>0.4.0</w:t>
+              <w:t>0.5.0</w:t>
             </w:r>
           </w:p>
         </w:tc>
@@ -289,7 +289,7 @@
                 <w:rFonts w:ascii="Calibri" w:hAnsi="Calibri" w:eastAsia="Microsoft YaHei"/>
                 <w:sz w:val="18"/>
               </w:rPr>
-              <w:t>2026-07-15</w:t>
+              <w:t>2026-07-16</w:t>
             </w:r>
           </w:p>
         </w:tc>
@@ -537,7 +537,7 @@
         <w:rPr>
           <w:rFonts w:ascii="Calibri" w:hAnsi="Calibri" w:eastAsia="Microsoft YaHei"/>
         </w:rPr>
-        <w:t>本手册对应 dterrain 0.4.0：已提供普通 Delaunay TIN、GRID、TIN/GRID 等高线、异步转换任务、CRS WKT，以及可选 GeoTIFF/COG/GeoPackage 交换。约束线、外边界、孔洞、约束 Delaunay 和三维 GUI 属于后续阶段。</w:t>
+        <w:t>本手册对应 dterrain 0.5.0：已提供普通 Delaunay TIN、GRID、TIN/GRID 等高线、异步转换任务、CRS WKT、可选 GeoTIFF/COG/GeoPackage 交换，以及 Win32 2D/3D 地形查看与漫游。约束线、外边界、孔洞、约束 Delaunay、GRID/等高线 GUI 图层和生产级 GPU LOD 属于后续阶段。</w:t>
       </w:r>
     </w:p>
     <w:p>
@@ -11048,7 +11048,7 @@
         <w:rPr>
           <w:rFonts w:ascii="Calibri" w:hAnsi="Calibri" w:eastAsia="Microsoft YaHei"/>
         </w:rPr>
-        <w:t>当前已完成可选 GDAL/PROJ 数据交换层。下一阶段将增加折线约束、地形外边界、孔洞、约束顶点保护规则和约束数据文件块；随后建设 Qt/VTK 三维图层、拾取与漫游。稳定 C ABI 不暴露 CGAL/GDAL 类型，可在保持现有调用方兼容的前提下扩展。</w:t>
+        <w:t>当前已完成可选 GDAL/PROJ 数据交换层和轻量 Win32/GDI 三维 TIN 查看器，支持透视投影、环视、平移、缩放、键盘漫游与垂直夸张。下一阶段将增加折线约束、地形外边界、孔洞、约束顶点保护规则和约束数据文件块；生产级 GUI 再引入 GPU 分块 LOD、GRID/等高线图层、拾取测量和贴地碰撞。稳定 C ABI 不暴露 CGAL/GDAL 类型，可在保持现有调用方兼容的前提下扩展。</w:t>
       </w:r>
     </w:p>
     <w:sectPr>
@@ -11078,7 +11078,7 @@
         <w:color w:val="66727D"/>
         <w:sz w:val="18"/>
       </w:rPr>
-      <w:t xml:space="preserve">版本 0.4.0  |  第 </w:t>
+      <w:t xml:space="preserve">版本 0.5.0  |  第 </w:t>
     </w:r>
     <w:r>
       <w:rPr>

</xml_diff>

<commit_message>
feat: add TIN GRID contour GUI layers
</commit_message>
<xml_diff>
--- a/docs/manuals/dterrain_DLL开发使用手册.docx
+++ b/docs/manuals/dterrain_DLL开发使用手册.docx
@@ -85,7 +85,7 @@
           <w:color w:val="203748"/>
           <w:sz w:val="22"/>
         </w:rPr>
-        <w:t>版本 0.5.0  |  2026-07-16</w:t>
+        <w:t>版本 0.6.0  |  2026-07-16</w:t>
       </w:r>
     </w:p>
     <w:p>
@@ -237,7 +237,7 @@
                 <w:rFonts w:ascii="Calibri" w:hAnsi="Calibri" w:eastAsia="Microsoft YaHei"/>
                 <w:sz w:val="18"/>
               </w:rPr>
-              <w:t>0.5.0</w:t>
+              <w:t>0.6.0</w:t>
             </w:r>
           </w:p>
         </w:tc>
@@ -537,7 +537,7 @@
         <w:rPr>
           <w:rFonts w:ascii="Calibri" w:hAnsi="Calibri" w:eastAsia="Microsoft YaHei"/>
         </w:rPr>
-        <w:t>本手册对应 dterrain 0.5.0：已提供普通 Delaunay TIN、GRID、TIN/GRID 等高线、异步转换任务、CRS WKT、可选 GeoTIFF/COG/GeoPackage 交换，以及 Win32 2D/3D 地形查看与漫游。约束线、外边界、孔洞、约束 Delaunay、GRID/等高线 GUI 图层和生产级 GPU LOD 属于后续阶段。</w:t>
+        <w:t>本手册对应 dterrain 0.6.0：已提供普通 Delaunay TIN、GRID、TIN/GRID 等高线、异步转换任务、CRS WKT、可选 GeoTIFF/COG/GeoPackage 交换，以及 Win32 2D/3D 地形查看、TIN/GRID/等高线图层与文本交换。约束线、外边界、孔洞、约束 Delaunay 和生产级 GPU LOD 属于后续阶段。</w:t>
       </w:r>
     </w:p>
     <w:p>
@@ -1063,7 +1063,7 @@
                 <w:rFonts w:ascii="Calibri" w:hAnsi="Calibri" w:eastAsia="Microsoft YaHei"/>
                 <w:sz w:val="18"/>
               </w:rPr>
-              <w:t>等高线是派生表达；0.4 尚未实现等高线反推 TIN/GRID。</w:t>
+              <w:t>等高线是派生表达；当前尚未实现等高线反推 TIN/GRID。</w:t>
             </w:r>
           </w:p>
         </w:tc>
@@ -11048,7 +11048,7 @@
         <w:rPr>
           <w:rFonts w:ascii="Calibri" w:hAnsi="Calibri" w:eastAsia="Microsoft YaHei"/>
         </w:rPr>
-        <w:t>当前已完成可选 GDAL/PROJ 数据交换层和轻量 Win32/GDI 三维 TIN 查看器，支持透视投影、环视、平移、缩放、键盘漫游与垂直夸张。下一阶段将增加折线约束、地形外边界、孔洞、约束顶点保护规则和约束数据文件块；生产级 GUI 再引入 GPU 分块 LOD、GRID/等高线图层、拾取测量和贴地碰撞。稳定 C ABI 不暴露 CGAL/GDAL 类型，可在保持现有调用方兼容的前提下扩展。</w:t>
+        <w:t>当前已完成可选 GDAL/PROJ 数据交换层、轻量 Win32/GDI 三维 TIN 查看器，以及 TIN/GRID/等高线二维图层、转换和文本交换菜单。下一阶段将增加折线约束、地形外边界、孔洞、约束顶点保护规则和约束数据文件块；生产级 GUI 再引入 GPU 分块 LOD、GeoTIFF/GeoPackage 图层操作、拾取测量和贴地碰撞。稳定 C ABI 不暴露 CGAL/GDAL 类型，可在保持现有调用方兼容的前提下扩展。</w:t>
       </w:r>
     </w:p>
     <w:sectPr>
@@ -11078,7 +11078,7 @@
         <w:color w:val="66727D"/>
         <w:sz w:val="18"/>
       </w:rPr>
-      <w:t xml:space="preserve">版本 0.5.0  |  第 </w:t>
+      <w:t xml:space="preserve">版本 0.6.0  |  第 </w:t>
     </w:r>
     <w:r>
       <w:rPr>

</xml_diff>

<commit_message>
feat: add constrained Delaunay terrain domains
</commit_message>
<xml_diff>
--- a/docs/manuals/dterrain_DLL开发使用手册.docx
+++ b/docs/manuals/dterrain_DLL开发使用手册.docx
@@ -85,7 +85,7 @@
           <w:color w:val="203748"/>
           <w:sz w:val="22"/>
         </w:rPr>
-        <w:t>版本 0.6.0  |  2026-07-16</w:t>
+        <w:t>版本 0.7.0  |  2026-07-16</w:t>
       </w:r>
     </w:p>
     <w:p>
@@ -237,7 +237,7 @@
                 <w:rFonts w:ascii="Calibri" w:hAnsi="Calibri" w:eastAsia="Microsoft YaHei"/>
                 <w:sz w:val="18"/>
               </w:rPr>
-              <w:t>0.6.0</w:t>
+              <w:t>0.7.0</w:t>
             </w:r>
           </w:p>
         </w:tc>
@@ -445,7 +445,7 @@
                 <w:rFonts w:ascii="Calibri" w:hAnsi="Calibri" w:eastAsia="Microsoft YaHei"/>
                 <w:sz w:val="18"/>
               </w:rPr>
-              <w:t>架构、构建部署、稳定 C ABI、GRID/等高线转换、GDAL 格式交换、异步任务、12 个兼容接口、文件格式、性能、线程安全、故障排查。</w:t>
+              <w:t>架构、构建部署、稳定 C ABI、约束 Delaunay、GRID/等高线转换、GDAL 格式交换、异步任务、12 个兼容接口、文件格式、性能、线程安全、故障排查。</w:t>
             </w:r>
           </w:p>
         </w:tc>
@@ -537,7 +537,7 @@
         <w:rPr>
           <w:rFonts w:ascii="Calibri" w:hAnsi="Calibri" w:eastAsia="Microsoft YaHei"/>
         </w:rPr>
-        <w:t>本手册对应 dterrain 0.6.0：已提供普通 Delaunay TIN、GRID、TIN/GRID 等高线、异步转换任务、CRS WKT、可选 GeoTIFF/COG/GeoPackage 交换，以及 Win32 2D/3D 地形查看、TIN/GRID/等高线图层与文本交换。约束线、外边界、孔洞、约束 Delaunay 和生产级 GPU LOD 属于后续阶段。</w:t>
+        <w:t>本手册对应 dterrain 0.7.0：除普通 TIN、GRID、等高线和 GDAL 交换外，已增加独立约束 Delaunay 句柄、断裂线、外边界、孔洞、域内查询、DCDT 文本和 GUI 约束图层。百万点局部约束编辑和生产级 GPU LOD 属于后续阶段。</w:t>
       </w:r>
     </w:p>
     <w:p>
@@ -661,6 +661,17 @@
           <w:rFonts w:ascii="Calibri" w:hAnsi="Calibri" w:eastAsia="Microsoft YaHei"/>
         </w:rPr>
         <w:t>TIN/GRID/等高线 CRS WKT 元数据，以及可选 GeoTIFF/COG/GeoPackage 交换。</w:t>
+      </w:r>
+    </w:p>
+    <w:p>
+      <w:pPr>
+        <w:pStyle w:val="ListBullet"/>
+      </w:pPr>
+      <w:r>
+        <w:rPr>
+          <w:rFonts w:ascii="Calibri" w:hAnsi="Calibri" w:eastAsia="Microsoft YaHei"/>
+        </w:rPr>
+        <w:t>独立 CDT 句柄、断裂线、外边界、孔洞、域内查询、约束增删与 DCDT 文本往返。</w:t>
       </w:r>
     </w:p>
     <w:p>
@@ -1092,7 +1103,7 @@
         <w:rPr>
           <w:rFonts w:ascii="Calibri" w:hAnsi="Calibri" w:eastAsia="Microsoft YaHei"/>
         </w:rPr>
-        <w:t>GRID→TIN 当前重建普通 Delaunay；遇到 NoData 默认拒绝，显式允许时可能跨空洞构网。严格边界、孔洞和强制约束边计划由后续约束 Delaunay 后端提供。</w:t>
+        <w:t>GRID→TIN 仍重建普通 Delaunay；严格边界和孔洞应使用独立 dt_cdt_handle。v0.7 约束增删采用候选网全量重建，尚未达到百万点实时局部 CDT 编辑。</w:t>
       </w:r>
     </w:p>
     <w:p>
@@ -1141,7 +1152,7 @@
           <w:rFonts w:ascii="Consolas" w:hAnsi="Consolas" w:eastAsia="Microsoft YaHei"/>
           <w:sz w:val="17"/>
         </w:rPr>
-        <w:t>稳定 C ABI + Terrain API + Task API + GDAL API + Legacy 兼容层</w:t>
+        <w:t>稳定 C ABI + CDT API + Terrain API + Task API + GDAL API + Legacy 兼容层</w:t>
       </w:r>
       <w:r>
         <w:br/>
@@ -1181,7 +1192,7 @@
           <w:rFonts w:ascii="Consolas" w:hAnsi="Consolas" w:eastAsia="Microsoft YaHei"/>
           <w:sz w:val="17"/>
         </w:rPr>
-        <w:t>CGAL Delaunay hierarchy ---- Boost R-tree</w:t>
+        <w:t>CGAL Delaunay hierarchy ---- Boost R-tree ---- 独立 Constrained Delaunay</w:t>
       </w:r>
       <w:r>
         <w:br/>
@@ -1221,7 +1232,7 @@
           <w:rFonts w:ascii="Consolas" w:hAnsi="Consolas" w:eastAsia="Microsoft YaHei"/>
           <w:sz w:val="17"/>
         </w:rPr>
-        <w:t>DTIN / DTMESH / XYZ / DGRID / DCONTOUR 持久化</w:t>
+        <w:t>DTIN / DTMESH / XYZ / DGRID / DCONTOUR / DCDT 持久化</w:t>
       </w:r>
       <w:r>
         <w:br/>
@@ -1835,6 +1846,83 @@
           </w:p>
         </w:tc>
       </w:tr>
+      <w:tr>
+        <w:tc>
+          <w:tcPr>
+            <w:tcW w:type="dxa" w:w="2400"/>
+            <w:tcMar>
+              <w:top w:w="80" w:type="dxa"/>
+              <w:start w:w="120" w:type="dxa"/>
+              <w:bottom w:w="80" w:type="dxa"/>
+              <w:end w:w="120" w:type="dxa"/>
+            </w:tcMar>
+            <w:vAlign w:val="center"/>
+          </w:tcPr>
+          <w:p>
+            <w:pPr>
+              <w:spacing w:before="0" w:after="0" w:line="276" w:lineRule="auto"/>
+              <w:jc w:val="center"/>
+            </w:pPr>
+            <w:r>
+              <w:rPr>
+                <w:rFonts w:ascii="Calibri" w:hAnsi="Calibri" w:eastAsia="Microsoft YaHei"/>
+                <w:sz w:val="18"/>
+              </w:rPr>
+              <w:t>Constrained Delaunay</w:t>
+            </w:r>
+          </w:p>
+        </w:tc>
+        <w:tc>
+          <w:tcPr>
+            <w:tcW w:type="dxa" w:w="2500"/>
+            <w:tcMar>
+              <w:top w:w="80" w:type="dxa"/>
+              <w:start w:w="120" w:type="dxa"/>
+              <w:bottom w:w="80" w:type="dxa"/>
+              <w:end w:w="120" w:type="dxa"/>
+            </w:tcMar>
+            <w:vAlign w:val="center"/>
+          </w:tcPr>
+          <w:p>
+            <w:pPr>
+              <w:spacing w:before="0" w:after="0" w:line="276" w:lineRule="auto"/>
+              <w:jc w:val="left"/>
+            </w:pPr>
+            <w:r>
+              <w:rPr>
+                <w:rFonts w:ascii="Calibri" w:hAnsi="Calibri" w:eastAsia="Microsoft YaHei"/>
+                <w:sz w:val="18"/>
+              </w:rPr>
+              <w:t>断裂线与域裁剪</w:t>
+            </w:r>
+          </w:p>
+        </w:tc>
+        <w:tc>
+          <w:tcPr>
+            <w:tcW w:type="dxa" w:w="4460"/>
+            <w:tcMar>
+              <w:top w:w="80" w:type="dxa"/>
+              <w:start w:w="120" w:type="dxa"/>
+              <w:bottom w:w="80" w:type="dxa"/>
+              <w:end w:w="120" w:type="dxa"/>
+            </w:tcMar>
+            <w:vAlign w:val="center"/>
+          </w:tcPr>
+          <w:p>
+            <w:pPr>
+              <w:spacing w:before="0" w:after="0" w:line="276" w:lineRule="auto"/>
+              <w:jc w:val="left"/>
+            </w:pPr>
+            <w:r>
+              <w:rPr>
+                <w:rFonts w:ascii="Calibri" w:hAnsi="Calibri" w:eastAsia="Microsoft YaHei"/>
+                <w:sz w:val="18"/>
+              </w:rPr>
+              <w:t>独立句柄保持普通 TIN ABI 和性能语义。</w:t>
+            </w:r>
+          </w:p>
+        </w:tc>
+      </w:tr>
     </w:tbl>
     <w:p>
       <w:pPr>
@@ -2733,6 +2821,83 @@
                 <w:sz w:val="18"/>
               </w:rPr>
               <w:t>推荐的稳定 C ABI。</w:t>
+            </w:r>
+          </w:p>
+        </w:tc>
+      </w:tr>
+      <w:tr>
+        <w:tc>
+          <w:tcPr>
+            <w:tcW w:type="dxa" w:w="3300"/>
+            <w:tcMar>
+              <w:top w:w="80" w:type="dxa"/>
+              <w:start w:w="120" w:type="dxa"/>
+              <w:bottom w:w="80" w:type="dxa"/>
+              <w:end w:w="120" w:type="dxa"/>
+            </w:tcMar>
+            <w:vAlign w:val="center"/>
+          </w:tcPr>
+          <w:p>
+            <w:pPr>
+              <w:spacing w:before="0" w:after="0" w:line="276" w:lineRule="auto"/>
+              <w:jc w:val="left"/>
+            </w:pPr>
+            <w:r>
+              <w:rPr>
+                <w:rFonts w:ascii="Calibri" w:hAnsi="Calibri" w:eastAsia="Microsoft YaHei"/>
+                <w:sz w:val="18"/>
+              </w:rPr>
+              <w:t>dt_cdt_api.h</w:t>
+            </w:r>
+          </w:p>
+        </w:tc>
+        <w:tc>
+          <w:tcPr>
+            <w:tcW w:type="dxa" w:w="1700"/>
+            <w:tcMar>
+              <w:top w:w="80" w:type="dxa"/>
+              <w:start w:w="120" w:type="dxa"/>
+              <w:bottom w:w="80" w:type="dxa"/>
+              <w:end w:w="120" w:type="dxa"/>
+            </w:tcMar>
+            <w:vAlign w:val="center"/>
+          </w:tcPr>
+          <w:p>
+            <w:pPr>
+              <w:spacing w:before="0" w:after="0" w:line="276" w:lineRule="auto"/>
+              <w:jc w:val="center"/>
+            </w:pPr>
+            <w:r>
+              <w:rPr>
+                <w:rFonts w:ascii="Calibri" w:hAnsi="Calibri" w:eastAsia="Microsoft YaHei"/>
+                <w:sz w:val="18"/>
+              </w:rPr>
+              <w:t>按需</w:t>
+            </w:r>
+          </w:p>
+        </w:tc>
+        <w:tc>
+          <w:tcPr>
+            <w:tcW w:type="dxa" w:w="4360"/>
+            <w:tcMar>
+              <w:top w:w="80" w:type="dxa"/>
+              <w:start w:w="120" w:type="dxa"/>
+              <w:bottom w:w="80" w:type="dxa"/>
+              <w:end w:w="120" w:type="dxa"/>
+            </w:tcMar>
+            <w:vAlign w:val="center"/>
+          </w:tcPr>
+          <w:p>
+            <w:pPr>
+              <w:spacing w:before="0" w:after="0" w:line="276" w:lineRule="auto"/>
+              <w:jc w:val="left"/>
+            </w:pPr>
+            <w:r>
+              <w:rPr>
+                <w:rFonts w:ascii="Calibri" w:hAnsi="Calibri" w:eastAsia="Microsoft YaHei"/>
+                <w:sz w:val="18"/>
+              </w:rPr>
+              <w:t>约束 Delaunay、边界与孔洞接口。</w:t>
             </w:r>
           </w:p>
         </w:tc>
@@ -5310,6 +5475,83 @@
           </w:p>
         </w:tc>
       </w:tr>
+      <w:tr>
+        <w:tc>
+          <w:tcPr>
+            <w:tcW w:type="dxa" w:w="3200"/>
+            <w:tcMar>
+              <w:top w:w="80" w:type="dxa"/>
+              <w:start w:w="120" w:type="dxa"/>
+              <w:bottom w:w="80" w:type="dxa"/>
+              <w:end w:w="120" w:type="dxa"/>
+            </w:tcMar>
+            <w:vAlign w:val="center"/>
+          </w:tcPr>
+          <w:p>
+            <w:pPr>
+              <w:spacing w:before="0" w:after="0" w:line="276" w:lineRule="auto"/>
+              <w:jc w:val="left"/>
+            </w:pPr>
+            <w:r>
+              <w:rPr>
+                <w:rFonts w:ascii="Calibri" w:hAnsi="Calibri" w:eastAsia="Microsoft YaHei"/>
+                <w:sz w:val="18"/>
+              </w:rPr>
+              <w:t>dt_cdt_save/load_text</w:t>
+            </w:r>
+          </w:p>
+        </w:tc>
+        <w:tc>
+          <w:tcPr>
+            <w:tcW w:type="dxa" w:w="1800"/>
+            <w:tcMar>
+              <w:top w:w="80" w:type="dxa"/>
+              <w:start w:w="120" w:type="dxa"/>
+              <w:bottom w:w="80" w:type="dxa"/>
+              <w:end w:w="120" w:type="dxa"/>
+            </w:tcMar>
+            <w:vAlign w:val="center"/>
+          </w:tcPr>
+          <w:p>
+            <w:pPr>
+              <w:spacing w:before="0" w:after="0" w:line="276" w:lineRule="auto"/>
+              <w:jc w:val="center"/>
+            </w:pPr>
+            <w:r>
+              <w:rPr>
+                <w:rFonts w:ascii="Calibri" w:hAnsi="Calibri" w:eastAsia="Microsoft YaHei"/>
+                <w:sz w:val="18"/>
+              </w:rPr>
+              <w:t>DCDT 1</w:t>
+            </w:r>
+          </w:p>
+        </w:tc>
+        <w:tc>
+          <w:tcPr>
+            <w:tcW w:type="dxa" w:w="4360"/>
+            <w:tcMar>
+              <w:top w:w="80" w:type="dxa"/>
+              <w:start w:w="120" w:type="dxa"/>
+              <w:bottom w:w="80" w:type="dxa"/>
+              <w:end w:w="120" w:type="dxa"/>
+            </w:tcMar>
+            <w:vAlign w:val="center"/>
+          </w:tcPr>
+          <w:p>
+            <w:pPr>
+              <w:spacing w:before="0" w:after="0" w:line="276" w:lineRule="auto"/>
+              <w:jc w:val="left"/>
+            </w:pPr>
+            <w:r>
+              <w:rPr>
+                <w:rFonts w:ascii="Calibri" w:hAnsi="Calibri" w:eastAsia="Microsoft YaHei"/>
+                <w:sz w:val="18"/>
+              </w:rPr>
+              <w:t>散点、约束和 CRS 文本往返。</w:t>
+            </w:r>
+          </w:p>
+        </w:tc>
+      </w:tr>
     </w:tbl>
     <w:p>
       <w:pPr>
@@ -6603,6 +6845,495 @@
           <w:rFonts w:ascii="Calibri" w:hAnsi="Calibri" w:eastAsia="Microsoft YaHei"/>
         </w:rPr>
         <w:t>启用 GDAL 的便携目录必须携带构建目录复制出的 GDAL、PROJ、SQLite、GeoTIFF 等运行时 DLL，以及 DLL 同级 share/proj/proj.db。COG 使用 CreateCopy，会比普通 GTiff 需要更多临时内存/存储。</w:t>
+      </w:r>
+    </w:p>
+    <w:p>
+      <w:pPr>
+        <w:pStyle w:val="Heading2"/>
+      </w:pPr>
+      <w:r>
+        <w:t>4.8 约束 Delaunay</w:t>
+      </w:r>
+    </w:p>
+    <w:p>
+      <w:r>
+        <w:rPr>
+          <w:rFonts w:ascii="Calibri" w:hAnsi="Calibri" w:eastAsia="Microsoft YaHei"/>
+        </w:rPr>
+        <w:t>dt_cdt_api.h 提供独立 dt_cdt_handle。基础点与普通 TIN 相互独立；断裂线只强制成边，外边界和孔洞通过奇偶嵌套层级决定有效域。没有外边界时全部有限面均为有效域。</w:t>
+      </w:r>
+    </w:p>
+    <w:p>
+      <w:pPr>
+        <w:pStyle w:val="DterrainCode"/>
+        <w:shd w:fill="F2F4F7"/>
+      </w:pPr>
+      <w:r>
+        <w:rPr>
+          <w:rFonts w:ascii="Consolas" w:hAnsi="Consolas" w:eastAsia="Microsoft YaHei"/>
+          <w:sz w:val="17"/>
+        </w:rPr>
+        <w:t>#include "dt_cdt_api.h"</w:t>
+      </w:r>
+      <w:r>
+        <w:br/>
+      </w:r>
+      <w:r>
+        <w:rPr>
+          <w:rFonts w:ascii="Consolas" w:hAnsi="Consolas" w:eastAsia="Microsoft YaHei"/>
+          <w:sz w:val="17"/>
+        </w:rPr>
+      </w:r>
+      <w:r>
+        <w:br/>
+      </w:r>
+      <w:r>
+        <w:rPr>
+          <w:rFonts w:ascii="Consolas" w:hAnsi="Consolas" w:eastAsia="Microsoft YaHei"/>
+          <w:sz w:val="17"/>
+        </w:rPr>
+        <w:t>dt_cdt_handle cdt = nullptr;</w:t>
+      </w:r>
+      <w:r>
+        <w:br/>
+      </w:r>
+      <w:r>
+        <w:rPr>
+          <w:rFonts w:ascii="Consolas" w:hAnsi="Consolas" w:eastAsia="Microsoft YaHei"/>
+          <w:sz w:val="17"/>
+        </w:rPr>
+        <w:t>dt_cdt_create(nullptr, &amp;cdt);</w:t>
+      </w:r>
+      <w:r>
+        <w:br/>
+      </w:r>
+      <w:r>
+        <w:rPr>
+          <w:rFonts w:ascii="Consolas" w:hAnsi="Consolas" w:eastAsia="Microsoft YaHei"/>
+          <w:sz w:val="17"/>
+        </w:rPr>
+        <w:t>dt_cdt_build(cdt, points, point_count);</w:t>
+      </w:r>
+      <w:r>
+        <w:br/>
+      </w:r>
+      <w:r>
+        <w:rPr>
+          <w:rFonts w:ascii="Consolas" w:hAnsi="Consolas" w:eastAsia="Microsoft YaHei"/>
+          <w:sz w:val="17"/>
+        </w:rPr>
+        <w:t>dt_cdt_add_constraint(cdt, DT_CONSTRAINT_OUTER_BOUNDARY, 0,</w:t>
+      </w:r>
+      <w:r>
+        <w:br/>
+      </w:r>
+      <w:r>
+        <w:rPr>
+          <w:rFonts w:ascii="Consolas" w:hAnsi="Consolas" w:eastAsia="Microsoft YaHei"/>
+          <w:sz w:val="17"/>
+        </w:rPr>
+        <w:t xml:space="preserve">                      boundary, boundary_count, nullptr);</w:t>
+      </w:r>
+      <w:r>
+        <w:br/>
+      </w:r>
+      <w:r>
+        <w:rPr>
+          <w:rFonts w:ascii="Consolas" w:hAnsi="Consolas" w:eastAsia="Microsoft YaHei"/>
+          <w:sz w:val="17"/>
+        </w:rPr>
+        <w:t>dt_cdt_add_constraint(cdt, DT_CONSTRAINT_HOLE_BOUNDARY, 0,</w:t>
+      </w:r>
+      <w:r>
+        <w:br/>
+      </w:r>
+      <w:r>
+        <w:rPr>
+          <w:rFonts w:ascii="Consolas" w:hAnsi="Consolas" w:eastAsia="Microsoft YaHei"/>
+          <w:sz w:val="17"/>
+        </w:rPr>
+        <w:t xml:space="preserve">                      hole, hole_count, nullptr);</w:t>
+      </w:r>
+      <w:r>
+        <w:br/>
+      </w:r>
+      <w:r>
+        <w:rPr>
+          <w:rFonts w:ascii="Consolas" w:hAnsi="Consolas" w:eastAsia="Microsoft YaHei"/>
+          <w:sz w:val="17"/>
+        </w:rPr>
+        <w:t>dt_cdt_save_text(cdt, "terrain.dcdt");</w:t>
+      </w:r>
+      <w:r>
+        <w:br/>
+      </w:r>
+      <w:r>
+        <w:rPr>
+          <w:rFonts w:ascii="Consolas" w:hAnsi="Consolas" w:eastAsia="Microsoft YaHei"/>
+          <w:sz w:val="17"/>
+        </w:rPr>
+        <w:t>dt_cdt_destroy(cdt);</w:t>
+      </w:r>
+    </w:p>
+    <w:tbl>
+      <w:tblPr>
+        <w:tblStyle w:val="TableGrid"/>
+        <w:tblW w:type="dxa" w:w="9360"/>
+        <w:jc w:val="left"/>
+        <w:tblLayout w:type="fixed"/>
+        <w:tblLook w:firstColumn="1" w:firstRow="1" w:lastColumn="0" w:lastRow="0" w:noHBand="0" w:noVBand="1" w:val="04A0"/>
+        <w:tblInd w:w="120" w:type="dxa"/>
+      </w:tblPr>
+      <w:tblGrid>
+        <w:gridCol w:w="2600"/>
+        <w:gridCol w:w="4300"/>
+        <w:gridCol w:w="2460"/>
+      </w:tblGrid>
+      <w:tr>
+        <w:trPr>
+          <w:tblHeader w:val="true"/>
+        </w:trPr>
+        <w:tc>
+          <w:tcPr>
+            <w:tcW w:type="dxa" w:w="2600"/>
+            <w:shd w:fill="E8EEF5"/>
+            <w:tcMar>
+              <w:top w:w="80" w:type="dxa"/>
+              <w:start w:w="120" w:type="dxa"/>
+              <w:bottom w:w="80" w:type="dxa"/>
+              <w:end w:w="120" w:type="dxa"/>
+            </w:tcMar>
+            <w:vAlign w:val="center"/>
+          </w:tcPr>
+          <w:p>
+            <w:pPr>
+              <w:spacing w:before="0" w:after="0"/>
+              <w:jc w:val="center"/>
+            </w:pPr>
+            <w:r>
+              <w:rPr>
+                <w:rFonts w:ascii="Calibri" w:hAnsi="Calibri" w:eastAsia="Microsoft YaHei"/>
+                <w:b/>
+                <w:color w:val="203748"/>
+                <w:sz w:val="19"/>
+              </w:rPr>
+              <w:t>类型</w:t>
+            </w:r>
+          </w:p>
+        </w:tc>
+        <w:tc>
+          <w:tcPr>
+            <w:tcW w:type="dxa" w:w="4300"/>
+            <w:shd w:fill="E8EEF5"/>
+            <w:tcMar>
+              <w:top w:w="80" w:type="dxa"/>
+              <w:start w:w="120" w:type="dxa"/>
+              <w:bottom w:w="80" w:type="dxa"/>
+              <w:end w:w="120" w:type="dxa"/>
+            </w:tcMar>
+            <w:vAlign w:val="center"/>
+          </w:tcPr>
+          <w:p>
+            <w:pPr>
+              <w:spacing w:before="0" w:after="0"/>
+              <w:jc w:val="center"/>
+            </w:pPr>
+            <w:r>
+              <w:rPr>
+                <w:rFonts w:ascii="Calibri" w:hAnsi="Calibri" w:eastAsia="Microsoft YaHei"/>
+                <w:b/>
+                <w:color w:val="203748"/>
+                <w:sz w:val="19"/>
+              </w:rPr>
+              <w:t>作用</w:t>
+            </w:r>
+          </w:p>
+        </w:tc>
+        <w:tc>
+          <w:tcPr>
+            <w:tcW w:type="dxa" w:w="2460"/>
+            <w:shd w:fill="E8EEF5"/>
+            <w:tcMar>
+              <w:top w:w="80" w:type="dxa"/>
+              <w:start w:w="120" w:type="dxa"/>
+              <w:bottom w:w="80" w:type="dxa"/>
+              <w:end w:w="120" w:type="dxa"/>
+            </w:tcMar>
+            <w:vAlign w:val="center"/>
+          </w:tcPr>
+          <w:p>
+            <w:pPr>
+              <w:spacing w:before="0" w:after="0"/>
+              <w:jc w:val="center"/>
+            </w:pPr>
+            <w:r>
+              <w:rPr>
+                <w:rFonts w:ascii="Calibri" w:hAnsi="Calibri" w:eastAsia="Microsoft YaHei"/>
+                <w:b/>
+                <w:color w:val="203748"/>
+                <w:sz w:val="19"/>
+              </w:rPr>
+              <w:t>闭合规则</w:t>
+            </w:r>
+          </w:p>
+        </w:tc>
+      </w:tr>
+      <w:tr>
+        <w:tc>
+          <w:tcPr>
+            <w:tcW w:type="dxa" w:w="2600"/>
+            <w:tcMar>
+              <w:top w:w="80" w:type="dxa"/>
+              <w:start w:w="120" w:type="dxa"/>
+              <w:bottom w:w="80" w:type="dxa"/>
+              <w:end w:w="120" w:type="dxa"/>
+            </w:tcMar>
+            <w:vAlign w:val="center"/>
+          </w:tcPr>
+          <w:p>
+            <w:pPr>
+              <w:spacing w:before="0" w:after="0" w:line="276" w:lineRule="auto"/>
+              <w:jc w:val="center"/>
+            </w:pPr>
+            <w:r>
+              <w:rPr>
+                <w:rFonts w:ascii="Calibri" w:hAnsi="Calibri" w:eastAsia="Microsoft YaHei"/>
+                <w:sz w:val="18"/>
+              </w:rPr>
+              <w:t>BREAKLINE</w:t>
+            </w:r>
+          </w:p>
+        </w:tc>
+        <w:tc>
+          <w:tcPr>
+            <w:tcW w:type="dxa" w:w="4300"/>
+            <w:tcMar>
+              <w:top w:w="80" w:type="dxa"/>
+              <w:start w:w="120" w:type="dxa"/>
+              <w:bottom w:w="80" w:type="dxa"/>
+              <w:end w:w="120" w:type="dxa"/>
+            </w:tcMar>
+            <w:vAlign w:val="center"/>
+          </w:tcPr>
+          <w:p>
+            <w:pPr>
+              <w:spacing w:before="0" w:after="0" w:line="276" w:lineRule="auto"/>
+              <w:jc w:val="left"/>
+            </w:pPr>
+            <w:r>
+              <w:rPr>
+                <w:rFonts w:ascii="Calibri" w:hAnsi="Calibri" w:eastAsia="Microsoft YaHei"/>
+                <w:sz w:val="18"/>
+              </w:rPr>
+              <w:t>强制三角网沿折线分边，不改变域内外</w:t>
+            </w:r>
+          </w:p>
+        </w:tc>
+        <w:tc>
+          <w:tcPr>
+            <w:tcW w:type="dxa" w:w="2460"/>
+            <w:tcMar>
+              <w:top w:w="80" w:type="dxa"/>
+              <w:start w:w="120" w:type="dxa"/>
+              <w:bottom w:w="80" w:type="dxa"/>
+              <w:end w:w="120" w:type="dxa"/>
+            </w:tcMar>
+            <w:vAlign w:val="center"/>
+          </w:tcPr>
+          <w:p>
+            <w:pPr>
+              <w:spacing w:before="0" w:after="0" w:line="276" w:lineRule="auto"/>
+              <w:jc w:val="left"/>
+            </w:pPr>
+            <w:r>
+              <w:rPr>
+                <w:rFonts w:ascii="Calibri" w:hAnsi="Calibri" w:eastAsia="Microsoft YaHei"/>
+                <w:sz w:val="18"/>
+              </w:rPr>
+              <w:t>可开可闭</w:t>
+            </w:r>
+          </w:p>
+        </w:tc>
+      </w:tr>
+      <w:tr>
+        <w:tc>
+          <w:tcPr>
+            <w:tcW w:type="dxa" w:w="2600"/>
+            <w:tcMar>
+              <w:top w:w="80" w:type="dxa"/>
+              <w:start w:w="120" w:type="dxa"/>
+              <w:bottom w:w="80" w:type="dxa"/>
+              <w:end w:w="120" w:type="dxa"/>
+            </w:tcMar>
+            <w:vAlign w:val="center"/>
+          </w:tcPr>
+          <w:p>
+            <w:pPr>
+              <w:spacing w:before="0" w:after="0" w:line="276" w:lineRule="auto"/>
+              <w:jc w:val="center"/>
+            </w:pPr>
+            <w:r>
+              <w:rPr>
+                <w:rFonts w:ascii="Calibri" w:hAnsi="Calibri" w:eastAsia="Microsoft YaHei"/>
+                <w:sz w:val="18"/>
+              </w:rPr>
+              <w:t>OUTER_BOUNDARY</w:t>
+            </w:r>
+          </w:p>
+        </w:tc>
+        <w:tc>
+          <w:tcPr>
+            <w:tcW w:type="dxa" w:w="4300"/>
+            <w:tcMar>
+              <w:top w:w="80" w:type="dxa"/>
+              <w:start w:w="120" w:type="dxa"/>
+              <w:bottom w:w="80" w:type="dxa"/>
+              <w:end w:w="120" w:type="dxa"/>
+            </w:tcMar>
+            <w:vAlign w:val="center"/>
+          </w:tcPr>
+          <w:p>
+            <w:pPr>
+              <w:spacing w:before="0" w:after="0" w:line="276" w:lineRule="auto"/>
+              <w:jc w:val="left"/>
+            </w:pPr>
+            <w:r>
+              <w:rPr>
+                <w:rFonts w:ascii="Calibri" w:hAnsi="Calibri" w:eastAsia="Microsoft YaHei"/>
+                <w:sz w:val="18"/>
+              </w:rPr>
+              <w:t>地形有效域外边界</w:t>
+            </w:r>
+          </w:p>
+        </w:tc>
+        <w:tc>
+          <w:tcPr>
+            <w:tcW w:type="dxa" w:w="2460"/>
+            <w:tcMar>
+              <w:top w:w="80" w:type="dxa"/>
+              <w:start w:w="120" w:type="dxa"/>
+              <w:bottom w:w="80" w:type="dxa"/>
+              <w:end w:w="120" w:type="dxa"/>
+            </w:tcMar>
+            <w:vAlign w:val="center"/>
+          </w:tcPr>
+          <w:p>
+            <w:pPr>
+              <w:spacing w:before="0" w:after="0" w:line="276" w:lineRule="auto"/>
+              <w:jc w:val="left"/>
+            </w:pPr>
+            <w:r>
+              <w:rPr>
+                <w:rFonts w:ascii="Calibri" w:hAnsi="Calibri" w:eastAsia="Microsoft YaHei"/>
+                <w:sz w:val="18"/>
+              </w:rPr>
+              <w:t>自动闭合</w:t>
+            </w:r>
+          </w:p>
+        </w:tc>
+      </w:tr>
+      <w:tr>
+        <w:tc>
+          <w:tcPr>
+            <w:tcW w:type="dxa" w:w="2600"/>
+            <w:tcMar>
+              <w:top w:w="80" w:type="dxa"/>
+              <w:start w:w="120" w:type="dxa"/>
+              <w:bottom w:w="80" w:type="dxa"/>
+              <w:end w:w="120" w:type="dxa"/>
+            </w:tcMar>
+            <w:vAlign w:val="center"/>
+          </w:tcPr>
+          <w:p>
+            <w:pPr>
+              <w:spacing w:before="0" w:after="0" w:line="276" w:lineRule="auto"/>
+              <w:jc w:val="center"/>
+            </w:pPr>
+            <w:r>
+              <w:rPr>
+                <w:rFonts w:ascii="Calibri" w:hAnsi="Calibri" w:eastAsia="Microsoft YaHei"/>
+                <w:sz w:val="18"/>
+              </w:rPr>
+              <w:t>HOLE_BOUNDARY</w:t>
+            </w:r>
+          </w:p>
+        </w:tc>
+        <w:tc>
+          <w:tcPr>
+            <w:tcW w:type="dxa" w:w="4300"/>
+            <w:tcMar>
+              <w:top w:w="80" w:type="dxa"/>
+              <w:start w:w="120" w:type="dxa"/>
+              <w:bottom w:w="80" w:type="dxa"/>
+              <w:end w:w="120" w:type="dxa"/>
+            </w:tcMar>
+            <w:vAlign w:val="center"/>
+          </w:tcPr>
+          <w:p>
+            <w:pPr>
+              <w:spacing w:before="0" w:after="0" w:line="276" w:lineRule="auto"/>
+              <w:jc w:val="left"/>
+            </w:pPr>
+            <w:r>
+              <w:rPr>
+                <w:rFonts w:ascii="Calibri" w:hAnsi="Calibri" w:eastAsia="Microsoft YaHei"/>
+                <w:sz w:val="18"/>
+              </w:rPr>
+              <w:t>从外边界域中排除孔洞</w:t>
+            </w:r>
+          </w:p>
+        </w:tc>
+        <w:tc>
+          <w:tcPr>
+            <w:tcW w:type="dxa" w:w="2460"/>
+            <w:tcMar>
+              <w:top w:w="80" w:type="dxa"/>
+              <w:start w:w="120" w:type="dxa"/>
+              <w:bottom w:w="80" w:type="dxa"/>
+              <w:end w:w="120" w:type="dxa"/>
+            </w:tcMar>
+            <w:vAlign w:val="center"/>
+          </w:tcPr>
+          <w:p>
+            <w:pPr>
+              <w:spacing w:before="0" w:after="0" w:line="276" w:lineRule="auto"/>
+              <w:jc w:val="left"/>
+            </w:pPr>
+            <w:r>
+              <w:rPr>
+                <w:rFonts w:ascii="Calibri" w:hAnsi="Calibri" w:eastAsia="Microsoft YaHei"/>
+                <w:sz w:val="18"/>
+              </w:rPr>
+              <w:t>自动闭合；必须已有外边界</w:t>
+            </w:r>
+          </w:p>
+        </w:tc>
+      </w:tr>
+    </w:tbl>
+    <w:p>
+      <w:pPr>
+        <w:spacing w:before="0" w:after="40"/>
+      </w:pPr>
+    </w:p>
+    <w:p>
+      <w:pPr>
+        <w:spacing w:before="100" w:after="160" w:line="288" w:lineRule="auto"/>
+        <w:ind w:left="230" w:right="230"/>
+        <w:shd w:fill="FFF7E0"/>
+      </w:pPr>
+      <w:r>
+        <w:rPr>
+          <w:rFonts w:ascii="Calibri" w:hAnsi="Calibri" w:eastAsia="Microsoft YaHei"/>
+          <w:b/>
+          <w:color w:val="7A5A00"/>
+        </w:rPr>
+        <w:t xml:space="preserve">性能与交叉  </w:t>
+      </w:r>
+      <w:r>
+        <w:rPr>
+          <w:rFonts w:ascii="Calibri" w:hAnsi="Calibri" w:eastAsia="Microsoft YaHei"/>
+        </w:rPr>
+        <w:t>v0.7 添加或删除约束会在候选状态中完整重建 CDT，成功后原子替换。未分段交叉必须先在交点处加入共享顶点，否则返回 DT_E_UNSUPPORTED。</w:t>
       </w:r>
     </w:p>
     <w:p>
@@ -8159,6 +8890,22 @@
     </w:p>
     <w:p>
       <w:pPr>
+        <w:pStyle w:val="Heading2"/>
+      </w:pPr>
+      <w:r>
+        <w:t>6.7 DCDT 约束网文本</w:t>
+      </w:r>
+    </w:p>
+    <w:p>
+      <w:r>
+        <w:rPr>
+          <w:rFonts w:ascii="Calibri" w:hAnsi="Calibri" w:eastAsia="Microsoft YaHei"/>
+        </w:rPr>
+        <w:t>DCDT 1 保存 CRS、基础 XYZ 点和约束记录。每条约束包含稳定 ID、类型、闭合标志、点数和 XYZ；加载时完整重建 CDT 并重新标记域，失败不会覆盖原对象。</w:t>
+      </w:r>
+    </w:p>
+    <w:p>
+      <w:pPr>
         <w:pStyle w:val="Heading1"/>
       </w:pPr>
       <w:r>
@@ -9625,6 +10372,160 @@
                 <w:rFonts w:ascii="Calibri" w:hAnsi="Calibri" w:eastAsia="Microsoft YaHei"/>
                 <w:sz w:val="18"/>
               </w:rPr>
+              <w:t>dt_cdt_handle</w:t>
+            </w:r>
+          </w:p>
+        </w:tc>
+        <w:tc>
+          <w:tcPr>
+            <w:tcW w:type="dxa" w:w="3100"/>
+            <w:tcMar>
+              <w:top w:w="80" w:type="dxa"/>
+              <w:start w:w="120" w:type="dxa"/>
+              <w:bottom w:w="80" w:type="dxa"/>
+              <w:end w:w="120" w:type="dxa"/>
+            </w:tcMar>
+            <w:vAlign w:val="center"/>
+          </w:tcPr>
+          <w:p>
+            <w:pPr>
+              <w:spacing w:before="0" w:after="0" w:line="276" w:lineRule="auto"/>
+              <w:jc w:val="left"/>
+            </w:pPr>
+            <w:r>
+              <w:rPr>
+                <w:rFonts w:ascii="Calibri" w:hAnsi="Calibri" w:eastAsia="Microsoft YaHei"/>
+                <w:sz w:val="18"/>
+              </w:rPr>
+              <w:t>dt_cdt_create</w:t>
+            </w:r>
+          </w:p>
+        </w:tc>
+        <w:tc>
+          <w:tcPr>
+            <w:tcW w:type="dxa" w:w="3760"/>
+            <w:tcMar>
+              <w:top w:w="80" w:type="dxa"/>
+              <w:start w:w="120" w:type="dxa"/>
+              <w:bottom w:w="80" w:type="dxa"/>
+              <w:end w:w="120" w:type="dxa"/>
+            </w:tcMar>
+            <w:vAlign w:val="center"/>
+          </w:tcPr>
+          <w:p>
+            <w:pPr>
+              <w:spacing w:before="0" w:after="0" w:line="276" w:lineRule="auto"/>
+              <w:jc w:val="left"/>
+            </w:pPr>
+            <w:r>
+              <w:rPr>
+                <w:rFonts w:ascii="Calibri" w:hAnsi="Calibri" w:eastAsia="Microsoft YaHei"/>
+                <w:sz w:val="18"/>
+              </w:rPr>
+              <w:t>dt_cdt_destroy</w:t>
+            </w:r>
+          </w:p>
+        </w:tc>
+      </w:tr>
+      <w:tr>
+        <w:tc>
+          <w:tcPr>
+            <w:tcW w:type="dxa" w:w="2500"/>
+            <w:tcMar>
+              <w:top w:w="80" w:type="dxa"/>
+              <w:start w:w="120" w:type="dxa"/>
+              <w:bottom w:w="80" w:type="dxa"/>
+              <w:end w:w="120" w:type="dxa"/>
+            </w:tcMar>
+            <w:vAlign w:val="center"/>
+          </w:tcPr>
+          <w:p>
+            <w:pPr>
+              <w:spacing w:before="0" w:after="0" w:line="276" w:lineRule="auto"/>
+              <w:jc w:val="left"/>
+            </w:pPr>
+            <w:r>
+              <w:rPr>
+                <w:rFonts w:ascii="Calibri" w:hAnsi="Calibri" w:eastAsia="Microsoft YaHei"/>
+                <w:sz w:val="18"/>
+              </w:rPr>
+              <w:t>dt_cdt_query_result</w:t>
+            </w:r>
+          </w:p>
+        </w:tc>
+        <w:tc>
+          <w:tcPr>
+            <w:tcW w:type="dxa" w:w="3100"/>
+            <w:tcMar>
+              <w:top w:w="80" w:type="dxa"/>
+              <w:start w:w="120" w:type="dxa"/>
+              <w:bottom w:w="80" w:type="dxa"/>
+              <w:end w:w="120" w:type="dxa"/>
+            </w:tcMar>
+            <w:vAlign w:val="center"/>
+          </w:tcPr>
+          <w:p>
+            <w:pPr>
+              <w:spacing w:before="0" w:after="0" w:line="276" w:lineRule="auto"/>
+              <w:jc w:val="left"/>
+            </w:pPr>
+            <w:r>
+              <w:rPr>
+                <w:rFonts w:ascii="Calibri" w:hAnsi="Calibri" w:eastAsia="Microsoft YaHei"/>
+                <w:sz w:val="18"/>
+              </w:rPr>
+              <w:t>dt_cdt_query_triangles</w:t>
+            </w:r>
+          </w:p>
+        </w:tc>
+        <w:tc>
+          <w:tcPr>
+            <w:tcW w:type="dxa" w:w="3760"/>
+            <w:tcMar>
+              <w:top w:w="80" w:type="dxa"/>
+              <w:start w:w="120" w:type="dxa"/>
+              <w:bottom w:w="80" w:type="dxa"/>
+              <w:end w:w="120" w:type="dxa"/>
+            </w:tcMar>
+            <w:vAlign w:val="center"/>
+          </w:tcPr>
+          <w:p>
+            <w:pPr>
+              <w:spacing w:before="0" w:after="0" w:line="276" w:lineRule="auto"/>
+              <w:jc w:val="left"/>
+            </w:pPr>
+            <w:r>
+              <w:rPr>
+                <w:rFonts w:ascii="Calibri" w:hAnsi="Calibri" w:eastAsia="Microsoft YaHei"/>
+                <w:sz w:val="18"/>
+              </w:rPr>
+              <w:t>dt_cdt_release_query_result</w:t>
+            </w:r>
+          </w:p>
+        </w:tc>
+      </w:tr>
+      <w:tr>
+        <w:tc>
+          <w:tcPr>
+            <w:tcW w:type="dxa" w:w="2500"/>
+            <w:tcMar>
+              <w:top w:w="80" w:type="dxa"/>
+              <w:start w:w="120" w:type="dxa"/>
+              <w:bottom w:w="80" w:type="dxa"/>
+              <w:end w:w="120" w:type="dxa"/>
+            </w:tcMar>
+            <w:vAlign w:val="center"/>
+          </w:tcPr>
+          <w:p>
+            <w:pPr>
+              <w:spacing w:before="0" w:after="0" w:line="276" w:lineRule="auto"/>
+              <w:jc w:val="left"/>
+            </w:pPr>
+            <w:r>
+              <w:rPr>
+                <w:rFonts w:ascii="Calibri" w:hAnsi="Calibri" w:eastAsia="Microsoft YaHei"/>
+                <w:sz w:val="18"/>
+              </w:rPr>
               <w:t>Legacy double*</w:t>
             </w:r>
           </w:p>
@@ -10394,7 +11295,7 @@
         <w:rPr>
           <w:rFonts w:ascii="Calibri" w:hAnsi="Calibri" w:eastAsia="Microsoft YaHei"/>
         </w:rPr>
-        <w:t>测试覆盖生命周期、批量建网、最近点、点定位、范围查询、动态插入/删除、高程更新、DTIN 往返、XYZ 导入、DTMESH 往返、TIN/GRID 转换、CRS 传播、等高线拼接、DGRID/DCONTOUR 往返、异步任务及随机编辑序列。GDAL 构建还执行 GTiff、COG、GPKG 驱动探测和真实文件往返。</w:t>
+        <w:t>测试覆盖生命周期、普通 TIN 动态编辑、DTIN/DTMESH/XYZ、TIN/GRID/等高线、异步任务，以及 CDT 外边界、孔洞、断裂线、交叉失败原子性、约束删除和 DCDT 往返。GDAL 构建还执行 GTiff、COG、GPKG 驱动探测和真实文件往返。</w:t>
       </w:r>
     </w:p>
     <w:p>
@@ -11032,7 +11933,7 @@
         <w:pStyle w:val="Heading1"/>
       </w:pPr>
       <w:r>
-        <w:t>11 许可证与后续路线</w:t>
+        <w:t>11 许可证</w:t>
       </w:r>
     </w:p>
     <w:p>
@@ -11041,14 +11942,6 @@
           <w:rFonts w:ascii="Calibri" w:hAnsi="Calibri" w:eastAsia="Microsoft YaHei"/>
         </w:rPr>
         <w:t>当前后端使用 CGAL 2D Triangulations 包。该包采用 GPL 或商业许可双重模式；本工程定位为研究和演示用途。对外分发、闭源集成或用途改变前，应再次核查 CGAL 及依赖许可。</w:t>
-      </w:r>
-    </w:p>
-    <w:p>
-      <w:r>
-        <w:rPr>
-          <w:rFonts w:ascii="Calibri" w:hAnsi="Calibri" w:eastAsia="Microsoft YaHei"/>
-        </w:rPr>
-        <w:t>当前已完成可选 GDAL/PROJ 数据交换层、轻量 Win32/GDI 三维 TIN 查看器，以及 TIN/GRID/等高线二维图层、转换和文本交换菜单。下一阶段将增加折线约束、地形外边界、孔洞、约束顶点保护规则和约束数据文件块；生产级 GUI 再引入 GPU 分块 LOD、GeoTIFF/GeoPackage 图层操作、拾取测量和贴地碰撞。稳定 C ABI 不暴露 CGAL/GDAL 类型，可在保持现有调用方兼容的前提下扩展。</w:t>
       </w:r>
     </w:p>
     <w:sectPr>
@@ -11078,7 +11971,7 @@
         <w:color w:val="66727D"/>
         <w:sz w:val="18"/>
       </w:rPr>
-      <w:t xml:space="preserve">版本 0.6.0  |  第 </w:t>
+      <w:t xml:space="preserve">版本 0.7.0  |  第 </w:t>
     </w:r>
     <w:r>
       <w:rPr>

</xml_diff>

<commit_message>
feat: add interactive CDT terrain workflows
</commit_message>
<xml_diff>
--- a/docs/manuals/dterrain_DLL开发使用手册.docx
+++ b/docs/manuals/dterrain_DLL开发使用手册.docx
@@ -85,7 +85,7 @@
           <w:color w:val="203748"/>
           <w:sz w:val="22"/>
         </w:rPr>
-        <w:t>版本 0.7.0  |  2026-07-16</w:t>
+        <w:t>版本 0.8.0  |  2026-07-16</w:t>
       </w:r>
     </w:p>
     <w:p>
@@ -131,6 +131,7 @@
       </w:tblGrid>
       <w:tr>
         <w:trPr>
+          <w:cantSplit/>
           <w:tblHeader w:val="true"/>
         </w:trPr>
         <w:tc>
@@ -191,6 +192,9 @@
         </w:tc>
       </w:tr>
       <w:tr>
+        <w:trPr>
+          <w:cantSplit/>
+        </w:trPr>
         <w:tc>
           <w:tcPr>
             <w:tcW w:type="dxa" w:w="2700"/>
@@ -237,12 +241,15 @@
                 <w:rFonts w:ascii="Calibri" w:hAnsi="Calibri" w:eastAsia="Microsoft YaHei"/>
                 <w:sz w:val="18"/>
               </w:rPr>
-              <w:t>0.7.0</w:t>
+              <w:t>0.8.0</w:t>
             </w:r>
           </w:p>
         </w:tc>
       </w:tr>
       <w:tr>
+        <w:trPr>
+          <w:cantSplit/>
+        </w:trPr>
         <w:tc>
           <w:tcPr>
             <w:tcW w:type="dxa" w:w="2700"/>
@@ -295,6 +302,9 @@
         </w:tc>
       </w:tr>
       <w:tr>
+        <w:trPr>
+          <w:cantSplit/>
+        </w:trPr>
         <w:tc>
           <w:tcPr>
             <w:tcW w:type="dxa" w:w="2700"/>
@@ -347,6 +357,9 @@
         </w:tc>
       </w:tr>
       <w:tr>
+        <w:trPr>
+          <w:cantSplit/>
+        </w:trPr>
         <w:tc>
           <w:tcPr>
             <w:tcW w:type="dxa" w:w="2700"/>
@@ -399,6 +412,9 @@
         </w:tc>
       </w:tr>
       <w:tr>
+        <w:trPr>
+          <w:cantSplit/>
+        </w:trPr>
         <w:tc>
           <w:tcPr>
             <w:tcW w:type="dxa" w:w="2700"/>
@@ -537,7 +553,7 @@
         <w:rPr>
           <w:rFonts w:ascii="Calibri" w:hAnsi="Calibri" w:eastAsia="Microsoft YaHei"/>
         </w:rPr>
-        <w:t>本手册对应 dterrain 0.7.0：除普通 TIN、GRID、等高线和 GDAL 交换外，已增加独立约束 Delaunay 句柄、断裂线、外边界、孔洞、域内查询、DCDT 文本和 GUI 约束图层。百万点局部约束编辑和生产级 GPU LOD 属于后续阶段。</w:t>
+        <w:t>本手册对应 dterrain 0.8.0：约束 Delaunay 已支持断裂线、外边界、孔洞、域内查询、DCDT 文本、TIN→CDT、域内高程采样、CDT→GRID/等高线和 GUI 单约束编辑。百万点局部约束更新和生产级 GPU LOD 属于后续阶段。</w:t>
       </w:r>
     </w:p>
     <w:p>
@@ -672,6 +688,17 @@
           <w:rFonts w:ascii="Calibri" w:hAnsi="Calibri" w:eastAsia="Microsoft YaHei"/>
         </w:rPr>
         <w:t>独立 CDT 句柄、断裂线、外边界、孔洞、域内查询、约束增删与 DCDT 文本往返。</w:t>
+      </w:r>
+    </w:p>
+    <w:p>
+      <w:pPr>
+        <w:pStyle w:val="ListBullet"/>
+      </w:pPr>
+      <w:r>
+        <w:rPr>
+          <w:rFonts w:ascii="Calibri" w:hAnsi="Calibri" w:eastAsia="Microsoft YaHei"/>
+        </w:rPr>
+        <w:t>普通 TIN→CDT、CDT 域内高程采样，以及保留外边界/孔洞的 GRID 和等高线派生。</w:t>
       </w:r>
     </w:p>
     <w:p>
@@ -708,6 +735,7 @@
       </w:tblGrid>
       <w:tr>
         <w:trPr>
+          <w:cantSplit/>
           <w:tblHeader w:val="true"/>
         </w:trPr>
         <w:tc>
@@ -768,6 +796,9 @@
         </w:tc>
       </w:tr>
       <w:tr>
+        <w:trPr>
+          <w:cantSplit/>
+        </w:trPr>
         <w:tc>
           <w:tcPr>
             <w:tcW w:type="dxa" w:w="2200"/>
@@ -820,6 +851,9 @@
         </w:tc>
       </w:tr>
       <w:tr>
+        <w:trPr>
+          <w:cantSplit/>
+        </w:trPr>
         <w:tc>
           <w:tcPr>
             <w:tcW w:type="dxa" w:w="2200"/>
@@ -872,6 +906,9 @@
         </w:tc>
       </w:tr>
       <w:tr>
+        <w:trPr>
+          <w:cantSplit/>
+        </w:trPr>
         <w:tc>
           <w:tcPr>
             <w:tcW w:type="dxa" w:w="2200"/>
@@ -924,6 +961,9 @@
         </w:tc>
       </w:tr>
       <w:tr>
+        <w:trPr>
+          <w:cantSplit/>
+        </w:trPr>
         <w:tc>
           <w:tcPr>
             <w:tcW w:type="dxa" w:w="2200"/>
@@ -976,6 +1016,9 @@
         </w:tc>
       </w:tr>
       <w:tr>
+        <w:trPr>
+          <w:cantSplit/>
+        </w:trPr>
         <w:tc>
           <w:tcPr>
             <w:tcW w:type="dxa" w:w="2200"/>
@@ -1028,6 +1071,9 @@
         </w:tc>
       </w:tr>
       <w:tr>
+        <w:trPr>
+          <w:cantSplit/>
+        </w:trPr>
         <w:tc>
           <w:tcPr>
             <w:tcW w:type="dxa" w:w="2200"/>
@@ -1103,7 +1149,7 @@
         <w:rPr>
           <w:rFonts w:ascii="Calibri" w:hAnsi="Calibri" w:eastAsia="Microsoft YaHei"/>
         </w:rPr>
-        <w:t>GRID→TIN 仍重建普通 Delaunay；严格边界和孔洞应使用独立 dt_cdt_handle。v0.7 约束增删采用候选网全量重建，尚未达到百万点实时局部 CDT 编辑。</w:t>
+        <w:t>GRID→TIN 仍重建普通 Delaunay；严格边界和孔洞应使用独立 dt_cdt_handle。v0.8 约束增删采用候选网全量重建，尚未达到百万点实时局部 CDT 编辑。</w:t>
       </w:r>
     </w:p>
     <w:p>
@@ -1297,6 +1343,7 @@
       </w:tblGrid>
       <w:tr>
         <w:trPr>
+          <w:cantSplit/>
           <w:tblHeader w:val="true"/>
         </w:trPr>
         <w:tc>
@@ -1385,6 +1432,9 @@
         </w:tc>
       </w:tr>
       <w:tr>
+        <w:trPr>
+          <w:cantSplit/>
+        </w:trPr>
         <w:tc>
           <w:tcPr>
             <w:tcW w:type="dxa" w:w="2400"/>
@@ -1462,6 +1512,9 @@
         </w:tc>
       </w:tr>
       <w:tr>
+        <w:trPr>
+          <w:cantSplit/>
+        </w:trPr>
         <w:tc>
           <w:tcPr>
             <w:tcW w:type="dxa" w:w="2400"/>
@@ -1539,6 +1592,9 @@
         </w:tc>
       </w:tr>
       <w:tr>
+        <w:trPr>
+          <w:cantSplit/>
+        </w:trPr>
         <w:tc>
           <w:tcPr>
             <w:tcW w:type="dxa" w:w="2400"/>
@@ -1616,6 +1672,9 @@
         </w:tc>
       </w:tr>
       <w:tr>
+        <w:trPr>
+          <w:cantSplit/>
+        </w:trPr>
         <w:tc>
           <w:tcPr>
             <w:tcW w:type="dxa" w:w="2400"/>
@@ -1693,6 +1752,9 @@
         </w:tc>
       </w:tr>
       <w:tr>
+        <w:trPr>
+          <w:cantSplit/>
+        </w:trPr>
         <w:tc>
           <w:tcPr>
             <w:tcW w:type="dxa" w:w="2400"/>
@@ -1770,6 +1832,9 @@
         </w:tc>
       </w:tr>
       <w:tr>
+        <w:trPr>
+          <w:cantSplit/>
+        </w:trPr>
         <w:tc>
           <w:tcPr>
             <w:tcW w:type="dxa" w:w="2400"/>
@@ -1847,6 +1912,9 @@
         </w:tc>
       </w:tr>
       <w:tr>
+        <w:trPr>
+          <w:cantSplit/>
+        </w:trPr>
         <w:tc>
           <w:tcPr>
             <w:tcW w:type="dxa" w:w="2400"/>
@@ -1966,6 +2034,7 @@
       </w:tblGrid>
       <w:tr>
         <w:trPr>
+          <w:cantSplit/>
           <w:tblHeader w:val="true"/>
         </w:trPr>
         <w:tc>
@@ -2054,6 +2123,9 @@
         </w:tc>
       </w:tr>
       <w:tr>
+        <w:trPr>
+          <w:cantSplit/>
+        </w:trPr>
         <w:tc>
           <w:tcPr>
             <w:tcW w:type="dxa" w:w="1800"/>
@@ -2131,6 +2203,9 @@
         </w:tc>
       </w:tr>
       <w:tr>
+        <w:trPr>
+          <w:cantSplit/>
+        </w:trPr>
         <w:tc>
           <w:tcPr>
             <w:tcW w:type="dxa" w:w="1800"/>
@@ -2208,6 +2283,9 @@
         </w:tc>
       </w:tr>
       <w:tr>
+        <w:trPr>
+          <w:cantSplit/>
+        </w:trPr>
         <w:tc>
           <w:tcPr>
             <w:tcW w:type="dxa" w:w="1800"/>
@@ -2285,6 +2363,9 @@
         </w:tc>
       </w:tr>
       <w:tr>
+        <w:trPr>
+          <w:cantSplit/>
+        </w:trPr>
         <w:tc>
           <w:tcPr>
             <w:tcW w:type="dxa" w:w="1800"/>
@@ -2362,6 +2443,9 @@
         </w:tc>
       </w:tr>
       <w:tr>
+        <w:trPr>
+          <w:cantSplit/>
+        </w:trPr>
         <w:tc>
           <w:tcPr>
             <w:tcW w:type="dxa" w:w="1800"/>
@@ -2584,6 +2668,7 @@
       </w:tblGrid>
       <w:tr>
         <w:trPr>
+          <w:cantSplit/>
           <w:tblHeader w:val="true"/>
         </w:trPr>
         <w:tc>
@@ -2672,6 +2757,9 @@
         </w:tc>
       </w:tr>
       <w:tr>
+        <w:trPr>
+          <w:cantSplit/>
+        </w:trPr>
         <w:tc>
           <w:tcPr>
             <w:tcW w:type="dxa" w:w="3300"/>
@@ -2749,6 +2837,9 @@
         </w:tc>
       </w:tr>
       <w:tr>
+        <w:trPr>
+          <w:cantSplit/>
+        </w:trPr>
         <w:tc>
           <w:tcPr>
             <w:tcW w:type="dxa" w:w="3300"/>
@@ -2826,6 +2917,9 @@
         </w:tc>
       </w:tr>
       <w:tr>
+        <w:trPr>
+          <w:cantSplit/>
+        </w:trPr>
         <w:tc>
           <w:tcPr>
             <w:tcW w:type="dxa" w:w="3300"/>
@@ -2903,6 +2997,9 @@
         </w:tc>
       </w:tr>
       <w:tr>
+        <w:trPr>
+          <w:cantSplit/>
+        </w:trPr>
         <w:tc>
           <w:tcPr>
             <w:tcW w:type="dxa" w:w="3300"/>
@@ -2980,6 +3077,9 @@
         </w:tc>
       </w:tr>
       <w:tr>
+        <w:trPr>
+          <w:cantSplit/>
+        </w:trPr>
         <w:tc>
           <w:tcPr>
             <w:tcW w:type="dxa" w:w="3300"/>
@@ -3057,6 +3157,9 @@
         </w:tc>
       </w:tr>
       <w:tr>
+        <w:trPr>
+          <w:cantSplit/>
+        </w:trPr>
         <w:tc>
           <w:tcPr>
             <w:tcW w:type="dxa" w:w="3300"/>
@@ -3134,6 +3237,9 @@
         </w:tc>
       </w:tr>
       <w:tr>
+        <w:trPr>
+          <w:cantSplit/>
+        </w:trPr>
         <w:tc>
           <w:tcPr>
             <w:tcW w:type="dxa" w:w="3300"/>
@@ -3211,6 +3317,9 @@
         </w:tc>
       </w:tr>
       <w:tr>
+        <w:trPr>
+          <w:cantSplit/>
+        </w:trPr>
         <w:tc>
           <w:tcPr>
             <w:tcW w:type="dxa" w:w="3300"/>
@@ -3288,6 +3397,9 @@
         </w:tc>
       </w:tr>
       <w:tr>
+        <w:trPr>
+          <w:cantSplit/>
+        </w:trPr>
         <w:tc>
           <w:tcPr>
             <w:tcW w:type="dxa" w:w="3300"/>
@@ -3741,6 +3853,7 @@
       </w:tblGrid>
       <w:tr>
         <w:trPr>
+          <w:cantSplit/>
           <w:tblHeader w:val="true"/>
         </w:trPr>
         <w:tc>
@@ -3829,6 +3942,9 @@
         </w:tc>
       </w:tr>
       <w:tr>
+        <w:trPr>
+          <w:cantSplit/>
+        </w:trPr>
         <w:tc>
           <w:tcPr>
             <w:tcW w:type="dxa" w:w="2700"/>
@@ -3906,6 +4022,9 @@
         </w:tc>
       </w:tr>
       <w:tr>
+        <w:trPr>
+          <w:cantSplit/>
+        </w:trPr>
         <w:tc>
           <w:tcPr>
             <w:tcW w:type="dxa" w:w="2700"/>
@@ -3983,6 +4102,9 @@
         </w:tc>
       </w:tr>
       <w:tr>
+        <w:trPr>
+          <w:cantSplit/>
+        </w:trPr>
         <w:tc>
           <w:tcPr>
             <w:tcW w:type="dxa" w:w="2700"/>
@@ -4060,6 +4182,9 @@
         </w:tc>
       </w:tr>
       <w:tr>
+        <w:trPr>
+          <w:cantSplit/>
+        </w:trPr>
         <w:tc>
           <w:tcPr>
             <w:tcW w:type="dxa" w:w="2700"/>
@@ -4137,6 +4262,9 @@
         </w:tc>
       </w:tr>
       <w:tr>
+        <w:trPr>
+          <w:cantSplit/>
+        </w:trPr>
         <w:tc>
           <w:tcPr>
             <w:tcW w:type="dxa" w:w="2700"/>
@@ -4214,6 +4342,9 @@
         </w:tc>
       </w:tr>
       <w:tr>
+        <w:trPr>
+          <w:cantSplit/>
+        </w:trPr>
         <w:tc>
           <w:tcPr>
             <w:tcW w:type="dxa" w:w="2700"/>
@@ -4320,6 +4451,7 @@
       </w:tblGrid>
       <w:tr>
         <w:trPr>
+          <w:cantSplit/>
           <w:tblHeader w:val="true"/>
         </w:trPr>
         <w:tc>
@@ -4408,6 +4540,9 @@
         </w:tc>
       </w:tr>
       <w:tr>
+        <w:trPr>
+          <w:cantSplit/>
+        </w:trPr>
         <w:tc>
           <w:tcPr>
             <w:tcW w:type="dxa" w:w="3300"/>
@@ -4485,6 +4620,9 @@
         </w:tc>
       </w:tr>
       <w:tr>
+        <w:trPr>
+          <w:cantSplit/>
+        </w:trPr>
         <w:tc>
           <w:tcPr>
             <w:tcW w:type="dxa" w:w="3300"/>
@@ -4562,6 +4700,9 @@
         </w:tc>
       </w:tr>
       <w:tr>
+        <w:trPr>
+          <w:cantSplit/>
+        </w:trPr>
         <w:tc>
           <w:tcPr>
             <w:tcW w:type="dxa" w:w="3300"/>
@@ -4639,6 +4780,9 @@
         </w:tc>
       </w:tr>
       <w:tr>
+        <w:trPr>
+          <w:cantSplit/>
+        </w:trPr>
         <w:tc>
           <w:tcPr>
             <w:tcW w:type="dxa" w:w="3300"/>
@@ -4716,6 +4860,9 @@
         </w:tc>
       </w:tr>
       <w:tr>
+        <w:trPr>
+          <w:cantSplit/>
+        </w:trPr>
         <w:tc>
           <w:tcPr>
             <w:tcW w:type="dxa" w:w="3300"/>
@@ -4926,6 +5073,7 @@
       </w:tblGrid>
       <w:tr>
         <w:trPr>
+          <w:cantSplit/>
           <w:tblHeader w:val="true"/>
         </w:trPr>
         <w:tc>
@@ -5014,6 +5162,9 @@
         </w:tc>
       </w:tr>
       <w:tr>
+        <w:trPr>
+          <w:cantSplit/>
+        </w:trPr>
         <w:tc>
           <w:tcPr>
             <w:tcW w:type="dxa" w:w="3200"/>
@@ -5091,6 +5242,9 @@
         </w:tc>
       </w:tr>
       <w:tr>
+        <w:trPr>
+          <w:cantSplit/>
+        </w:trPr>
         <w:tc>
           <w:tcPr>
             <w:tcW w:type="dxa" w:w="3200"/>
@@ -5168,6 +5322,9 @@
         </w:tc>
       </w:tr>
       <w:tr>
+        <w:trPr>
+          <w:cantSplit/>
+        </w:trPr>
         <w:tc>
           <w:tcPr>
             <w:tcW w:type="dxa" w:w="3200"/>
@@ -5245,6 +5402,9 @@
         </w:tc>
       </w:tr>
       <w:tr>
+        <w:trPr>
+          <w:cantSplit/>
+        </w:trPr>
         <w:tc>
           <w:tcPr>
             <w:tcW w:type="dxa" w:w="3200"/>
@@ -5322,6 +5482,9 @@
         </w:tc>
       </w:tr>
       <w:tr>
+        <w:trPr>
+          <w:cantSplit/>
+        </w:trPr>
         <w:tc>
           <w:tcPr>
             <w:tcW w:type="dxa" w:w="3200"/>
@@ -5399,6 +5562,9 @@
         </w:tc>
       </w:tr>
       <w:tr>
+        <w:trPr>
+          <w:cantSplit/>
+        </w:trPr>
         <w:tc>
           <w:tcPr>
             <w:tcW w:type="dxa" w:w="3200"/>
@@ -5476,6 +5642,9 @@
         </w:tc>
       </w:tr>
       <w:tr>
+        <w:trPr>
+          <w:cantSplit/>
+        </w:trPr>
         <w:tc>
           <w:tcPr>
             <w:tcW w:type="dxa" w:w="3200"/>
@@ -5795,6 +5964,7 @@
       </w:tblGrid>
       <w:tr>
         <w:trPr>
+          <w:cantSplit/>
           <w:tblHeader w:val="true"/>
         </w:trPr>
         <w:tc>
@@ -5883,6 +6053,9 @@
         </w:tc>
       </w:tr>
       <w:tr>
+        <w:trPr>
+          <w:cantSplit/>
+        </w:trPr>
         <w:tc>
           <w:tcPr>
             <w:tcW w:type="dxa" w:w="2300"/>
@@ -5960,6 +6133,9 @@
         </w:tc>
       </w:tr>
       <w:tr>
+        <w:trPr>
+          <w:cantSplit/>
+        </w:trPr>
         <w:tc>
           <w:tcPr>
             <w:tcW w:type="dxa" w:w="2300"/>
@@ -6037,6 +6213,9 @@
         </w:tc>
       </w:tr>
       <w:tr>
+        <w:trPr>
+          <w:cantSplit/>
+        </w:trPr>
         <w:tc>
           <w:tcPr>
             <w:tcW w:type="dxa" w:w="2300"/>
@@ -6114,6 +6293,9 @@
         </w:tc>
       </w:tr>
       <w:tr>
+        <w:trPr>
+          <w:cantSplit/>
+        </w:trPr>
         <w:tc>
           <w:tcPr>
             <w:tcW w:type="dxa" w:w="2300"/>
@@ -6502,6 +6684,7 @@
       </w:tblGrid>
       <w:tr>
         <w:trPr>
+          <w:cantSplit/>
           <w:tblHeader w:val="true"/>
         </w:trPr>
         <w:tc>
@@ -6590,6 +6773,9 @@
         </w:tc>
       </w:tr>
       <w:tr>
+        <w:trPr>
+          <w:cantSplit/>
+        </w:trPr>
         <w:tc>
           <w:tcPr>
             <w:tcW w:type="dxa" w:w="2000"/>
@@ -6667,6 +6853,9 @@
         </w:tc>
       </w:tr>
       <w:tr>
+        <w:trPr>
+          <w:cantSplit/>
+        </w:trPr>
         <w:tc>
           <w:tcPr>
             <w:tcW w:type="dxa" w:w="2000"/>
@@ -6744,6 +6933,9 @@
         </w:tc>
       </w:tr>
       <w:tr>
+        <w:trPr>
+          <w:cantSplit/>
+        </w:trPr>
         <w:tc>
           <w:tcPr>
             <w:tcW w:type="dxa" w:w="2000"/>
@@ -6912,7 +7104,7 @@
           <w:rFonts w:ascii="Consolas" w:hAnsi="Consolas" w:eastAsia="Microsoft YaHei"/>
           <w:sz w:val="17"/>
         </w:rPr>
-        <w:t>dt_cdt_build(cdt, points, point_count);</w:t>
+        <w:t>dt_cdt_build_from_tin(cdt, tin);</w:t>
       </w:r>
       <w:r>
         <w:br/>
@@ -6953,6 +7145,26 @@
           <w:sz w:val="17"/>
         </w:rPr>
         <w:t xml:space="preserve">                      hole, hole_count, nullptr);</w:t>
+      </w:r>
+      <w:r>
+        <w:br/>
+      </w:r>
+      <w:r>
+        <w:rPr>
+          <w:rFonts w:ascii="Consolas" w:hAnsi="Consolas" w:eastAsia="Microsoft YaHei"/>
+          <w:sz w:val="17"/>
+        </w:rPr>
+        <w:t>dt_grid_from_cdt(cdt, &amp;grid_options, &amp;grid);</w:t>
+      </w:r>
+      <w:r>
+        <w:br/>
+      </w:r>
+      <w:r>
+        <w:rPr>
+          <w:rFonts w:ascii="Consolas" w:hAnsi="Consolas" w:eastAsia="Microsoft YaHei"/>
+          <w:sz w:val="17"/>
+        </w:rPr>
+        <w:t>dt_contours_from_cdt(cdt, &amp;contour_options, &amp;contours);</w:t>
       </w:r>
       <w:r>
         <w:br/>
@@ -6991,6 +7203,7 @@
       </w:tblGrid>
       <w:tr>
         <w:trPr>
+          <w:cantSplit/>
           <w:tblHeader w:val="true"/>
         </w:trPr>
         <w:tc>
@@ -7079,6 +7292,9 @@
         </w:tc>
       </w:tr>
       <w:tr>
+        <w:trPr>
+          <w:cantSplit/>
+        </w:trPr>
         <w:tc>
           <w:tcPr>
             <w:tcW w:type="dxa" w:w="2600"/>
@@ -7156,6 +7372,9 @@
         </w:tc>
       </w:tr>
       <w:tr>
+        <w:trPr>
+          <w:cantSplit/>
+        </w:trPr>
         <w:tc>
           <w:tcPr>
             <w:tcW w:type="dxa" w:w="2600"/>
@@ -7233,6 +7452,9 @@
         </w:tc>
       </w:tr>
       <w:tr>
+        <w:trPr>
+          <w:cantSplit/>
+        </w:trPr>
         <w:tc>
           <w:tcPr>
             <w:tcW w:type="dxa" w:w="2600"/>
@@ -7316,6 +7538,14 @@
       </w:pPr>
     </w:p>
     <w:p>
+      <w:r>
+        <w:rPr>
+          <w:rFonts w:ascii="Calibri" w:hAnsi="Calibri" w:eastAsia="Microsoft YaHei"/>
+        </w:rPr>
+        <w:t>dt_cdt_sample_height_xy() 只在有效域内插值；外边界以外和孔洞内部返回 DT_E_NOT_FOUND。dt_grid_from_cdt() 将这些位置写为 NoData，dt_contours_from_cdt() 只遍历域内三角形并继承 CRS。</w:t>
+      </w:r>
+    </w:p>
+    <w:p>
       <w:pPr>
         <w:spacing w:before="100" w:after="160" w:line="288" w:lineRule="auto"/>
         <w:ind w:left="230" w:right="230"/>
@@ -7333,7 +7563,7 @@
         <w:rPr>
           <w:rFonts w:ascii="Calibri" w:hAnsi="Calibri" w:eastAsia="Microsoft YaHei"/>
         </w:rPr>
-        <w:t>v0.7 添加或删除约束会在候选状态中完整重建 CDT，成功后原子替换。未分段交叉必须先在交点处加入共享顶点，否则返回 DT_E_UNSUPPORTED。</w:t>
+        <w:t>v0.8 添加或删除约束仍会在候选状态中完整重建 CDT，成功后原子替换。未分段交叉必须先在交点处加入共享顶点，否则返回 DT_E_UNSUPPORTED。</w:t>
       </w:r>
     </w:p>
     <w:p>
@@ -7368,6 +7598,7 @@
       </w:tblGrid>
       <w:tr>
         <w:trPr>
+          <w:cantSplit/>
           <w:tblHeader w:val="true"/>
         </w:trPr>
         <w:tc>
@@ -7456,6 +7687,9 @@
         </w:tc>
       </w:tr>
       <w:tr>
+        <w:trPr>
+          <w:cantSplit/>
+        </w:trPr>
         <w:tc>
           <w:tcPr>
             <w:tcW w:type="dxa" w:w="850"/>
@@ -7533,6 +7767,9 @@
         </w:tc>
       </w:tr>
       <w:tr>
+        <w:trPr>
+          <w:cantSplit/>
+        </w:trPr>
         <w:tc>
           <w:tcPr>
             <w:tcW w:type="dxa" w:w="850"/>
@@ -7610,6 +7847,9 @@
         </w:tc>
       </w:tr>
       <w:tr>
+        <w:trPr>
+          <w:cantSplit/>
+        </w:trPr>
         <w:tc>
           <w:tcPr>
             <w:tcW w:type="dxa" w:w="850"/>
@@ -7687,6 +7927,9 @@
         </w:tc>
       </w:tr>
       <w:tr>
+        <w:trPr>
+          <w:cantSplit/>
+        </w:trPr>
         <w:tc>
           <w:tcPr>
             <w:tcW w:type="dxa" w:w="850"/>
@@ -7764,6 +8007,9 @@
         </w:tc>
       </w:tr>
       <w:tr>
+        <w:trPr>
+          <w:cantSplit/>
+        </w:trPr>
         <w:tc>
           <w:tcPr>
             <w:tcW w:type="dxa" w:w="850"/>
@@ -7841,6 +8087,9 @@
         </w:tc>
       </w:tr>
       <w:tr>
+        <w:trPr>
+          <w:cantSplit/>
+        </w:trPr>
         <w:tc>
           <w:tcPr>
             <w:tcW w:type="dxa" w:w="850"/>
@@ -7918,6 +8167,9 @@
         </w:tc>
       </w:tr>
       <w:tr>
+        <w:trPr>
+          <w:cantSplit/>
+        </w:trPr>
         <w:tc>
           <w:tcPr>
             <w:tcW w:type="dxa" w:w="850"/>
@@ -7995,6 +8247,9 @@
         </w:tc>
       </w:tr>
       <w:tr>
+        <w:trPr>
+          <w:cantSplit/>
+        </w:trPr>
         <w:tc>
           <w:tcPr>
             <w:tcW w:type="dxa" w:w="850"/>
@@ -8072,6 +8327,9 @@
         </w:tc>
       </w:tr>
       <w:tr>
+        <w:trPr>
+          <w:cantSplit/>
+        </w:trPr>
         <w:tc>
           <w:tcPr>
             <w:tcW w:type="dxa" w:w="850"/>
@@ -8149,6 +8407,9 @@
         </w:tc>
       </w:tr>
       <w:tr>
+        <w:trPr>
+          <w:cantSplit/>
+        </w:trPr>
         <w:tc>
           <w:tcPr>
             <w:tcW w:type="dxa" w:w="850"/>
@@ -8226,6 +8487,9 @@
         </w:tc>
       </w:tr>
       <w:tr>
+        <w:trPr>
+          <w:cantSplit/>
+        </w:trPr>
         <w:tc>
           <w:tcPr>
             <w:tcW w:type="dxa" w:w="850"/>
@@ -8303,6 +8567,9 @@
         </w:tc>
       </w:tr>
       <w:tr>
+        <w:trPr>
+          <w:cantSplit/>
+        </w:trPr>
         <w:tc>
           <w:tcPr>
             <w:tcW w:type="dxa" w:w="850"/>
@@ -8935,6 +9202,7 @@
       </w:tblGrid>
       <w:tr>
         <w:trPr>
+          <w:cantSplit/>
           <w:tblHeader w:val="true"/>
         </w:trPr>
         <w:tc>
@@ -8995,6 +9263,9 @@
         </w:tc>
       </w:tr>
       <w:tr>
+        <w:trPr>
+          <w:cantSplit/>
+        </w:trPr>
         <w:tc>
           <w:tcPr>
             <w:tcW w:type="dxa" w:w="3200"/>
@@ -9047,6 +9318,9 @@
         </w:tc>
       </w:tr>
       <w:tr>
+        <w:trPr>
+          <w:cantSplit/>
+        </w:trPr>
         <w:tc>
           <w:tcPr>
             <w:tcW w:type="dxa" w:w="3200"/>
@@ -9099,6 +9373,9 @@
         </w:tc>
       </w:tr>
       <w:tr>
+        <w:trPr>
+          <w:cantSplit/>
+        </w:trPr>
         <w:tc>
           <w:tcPr>
             <w:tcW w:type="dxa" w:w="3200"/>
@@ -9151,6 +9428,9 @@
         </w:tc>
       </w:tr>
       <w:tr>
+        <w:trPr>
+          <w:cantSplit/>
+        </w:trPr>
         <w:tc>
           <w:tcPr>
             <w:tcW w:type="dxa" w:w="3200"/>
@@ -9203,6 +9483,9 @@
         </w:tc>
       </w:tr>
       <w:tr>
+        <w:trPr>
+          <w:cantSplit/>
+        </w:trPr>
         <w:tc>
           <w:tcPr>
             <w:tcW w:type="dxa" w:w="3200"/>
@@ -9255,6 +9538,9 @@
         </w:tc>
       </w:tr>
       <w:tr>
+        <w:trPr>
+          <w:cantSplit/>
+        </w:trPr>
         <w:tc>
           <w:tcPr>
             <w:tcW w:type="dxa" w:w="3200"/>
@@ -9307,6 +9593,9 @@
         </w:tc>
       </w:tr>
       <w:tr>
+        <w:trPr>
+          <w:cantSplit/>
+        </w:trPr>
         <w:tc>
           <w:tcPr>
             <w:tcW w:type="dxa" w:w="3200"/>
@@ -9359,6 +9648,9 @@
         </w:tc>
       </w:tr>
       <w:tr>
+        <w:trPr>
+          <w:cantSplit/>
+        </w:trPr>
         <w:tc>
           <w:tcPr>
             <w:tcW w:type="dxa" w:w="3200"/>
@@ -9411,6 +9703,9 @@
         </w:tc>
       </w:tr>
       <w:tr>
+        <w:trPr>
+          <w:cantSplit/>
+        </w:trPr>
         <w:tc>
           <w:tcPr>
             <w:tcW w:type="dxa" w:w="3200"/>
@@ -9463,6 +9758,9 @@
         </w:tc>
       </w:tr>
       <w:tr>
+        <w:trPr>
+          <w:cantSplit/>
+        </w:trPr>
         <w:tc>
           <w:tcPr>
             <w:tcW w:type="dxa" w:w="3200"/>
@@ -9515,6 +9813,9 @@
         </w:tc>
       </w:tr>
       <w:tr>
+        <w:trPr>
+          <w:cantSplit/>
+        </w:trPr>
         <w:tc>
           <w:tcPr>
             <w:tcW w:type="dxa" w:w="3200"/>
@@ -9567,6 +9868,9 @@
         </w:tc>
       </w:tr>
       <w:tr>
+        <w:trPr>
+          <w:cantSplit/>
+        </w:trPr>
         <w:tc>
           <w:tcPr>
             <w:tcW w:type="dxa" w:w="3200"/>
@@ -9619,6 +9923,9 @@
         </w:tc>
       </w:tr>
       <w:tr>
+        <w:trPr>
+          <w:cantSplit/>
+        </w:trPr>
         <w:tc>
           <w:tcPr>
             <w:tcW w:type="dxa" w:w="3200"/>
@@ -9671,6 +9978,9 @@
         </w:tc>
       </w:tr>
       <w:tr>
+        <w:trPr>
+          <w:cantSplit/>
+        </w:trPr>
         <w:tc>
           <w:tcPr>
             <w:tcW w:type="dxa" w:w="3200"/>
@@ -9801,6 +10111,7 @@
       </w:tblGrid>
       <w:tr>
         <w:trPr>
+          <w:cantSplit/>
           <w:tblHeader w:val="true"/>
         </w:trPr>
         <w:tc>
@@ -9889,6 +10200,9 @@
         </w:tc>
       </w:tr>
       <w:tr>
+        <w:trPr>
+          <w:cantSplit/>
+        </w:trPr>
         <w:tc>
           <w:tcPr>
             <w:tcW w:type="dxa" w:w="2500"/>
@@ -9966,6 +10280,9 @@
         </w:tc>
       </w:tr>
       <w:tr>
+        <w:trPr>
+          <w:cantSplit/>
+        </w:trPr>
         <w:tc>
           <w:tcPr>
             <w:tcW w:type="dxa" w:w="2500"/>
@@ -10043,6 +10360,9 @@
         </w:tc>
       </w:tr>
       <w:tr>
+        <w:trPr>
+          <w:cantSplit/>
+        </w:trPr>
         <w:tc>
           <w:tcPr>
             <w:tcW w:type="dxa" w:w="2500"/>
@@ -10120,6 +10440,9 @@
         </w:tc>
       </w:tr>
       <w:tr>
+        <w:trPr>
+          <w:cantSplit/>
+        </w:trPr>
         <w:tc>
           <w:tcPr>
             <w:tcW w:type="dxa" w:w="2500"/>
@@ -10197,6 +10520,9 @@
         </w:tc>
       </w:tr>
       <w:tr>
+        <w:trPr>
+          <w:cantSplit/>
+        </w:trPr>
         <w:tc>
           <w:tcPr>
             <w:tcW w:type="dxa" w:w="2500"/>
@@ -10274,6 +10600,9 @@
         </w:tc>
       </w:tr>
       <w:tr>
+        <w:trPr>
+          <w:cantSplit/>
+        </w:trPr>
         <w:tc>
           <w:tcPr>
             <w:tcW w:type="dxa" w:w="2500"/>
@@ -10351,6 +10680,9 @@
         </w:tc>
       </w:tr>
       <w:tr>
+        <w:trPr>
+          <w:cantSplit/>
+        </w:trPr>
         <w:tc>
           <w:tcPr>
             <w:tcW w:type="dxa" w:w="2500"/>
@@ -10428,6 +10760,9 @@
         </w:tc>
       </w:tr>
       <w:tr>
+        <w:trPr>
+          <w:cantSplit/>
+        </w:trPr>
         <w:tc>
           <w:tcPr>
             <w:tcW w:type="dxa" w:w="2500"/>
@@ -10505,6 +10840,9 @@
         </w:tc>
       </w:tr>
       <w:tr>
+        <w:trPr>
+          <w:cantSplit/>
+        </w:trPr>
         <w:tc>
           <w:tcPr>
             <w:tcW w:type="dxa" w:w="2500"/>
@@ -10650,6 +10988,7 @@
       </w:tblGrid>
       <w:tr>
         <w:trPr>
+          <w:cantSplit/>
           <w:tblHeader w:val="true"/>
         </w:trPr>
         <w:tc>
@@ -10794,6 +11133,9 @@
         </w:tc>
       </w:tr>
       <w:tr>
+        <w:trPr>
+          <w:cantSplit/>
+        </w:trPr>
         <w:tc>
           <w:tcPr>
             <w:tcW w:type="dxa" w:w="1700"/>
@@ -10921,6 +11263,9 @@
         </w:tc>
       </w:tr>
       <w:tr>
+        <w:trPr>
+          <w:cantSplit/>
+        </w:trPr>
         <w:tc>
           <w:tcPr>
             <w:tcW w:type="dxa" w:w="1700"/>
@@ -11048,6 +11393,9 @@
         </w:tc>
       </w:tr>
       <w:tr>
+        <w:trPr>
+          <w:cantSplit/>
+        </w:trPr>
         <w:tc>
           <w:tcPr>
             <w:tcW w:type="dxa" w:w="1700"/>
@@ -11295,7 +11643,7 @@
         <w:rPr>
           <w:rFonts w:ascii="Calibri" w:hAnsi="Calibri" w:eastAsia="Microsoft YaHei"/>
         </w:rPr>
-        <w:t>测试覆盖生命周期、普通 TIN 动态编辑、DTIN/DTMESH/XYZ、TIN/GRID/等高线、异步任务，以及 CDT 外边界、孔洞、断裂线、交叉失败原子性、约束删除和 DCDT 往返。GDAL 构建还执行 GTiff、COG、GPKG 驱动探测和真实文件往返。</w:t>
+        <w:t>测试覆盖生命周期、普通 TIN 动态编辑、DTIN/DTMESH/XYZ、TIN/GRID/等高线、异步任务，以及 CDT 空网清理、外边界、孔洞、断裂线、交叉失败原子性、TIN→CDT、域内采样、CDT→GRID/等高线、约束删除和 DCDT 往返。GDAL 构建还执行 GTiff、COG、GPKG 驱动探测和真实文件往返。</w:t>
       </w:r>
     </w:p>
     <w:p>
@@ -11395,6 +11743,7 @@
       </w:tblGrid>
       <w:tr>
         <w:trPr>
+          <w:cantSplit/>
           <w:tblHeader w:val="true"/>
         </w:trPr>
         <w:tc>
@@ -11455,6 +11804,9 @@
         </w:tc>
       </w:tr>
       <w:tr>
+        <w:trPr>
+          <w:cantSplit/>
+        </w:trPr>
         <w:tc>
           <w:tcPr>
             <w:tcW w:type="dxa" w:w="2600"/>
@@ -11507,6 +11859,9 @@
         </w:tc>
       </w:tr>
       <w:tr>
+        <w:trPr>
+          <w:cantSplit/>
+        </w:trPr>
         <w:tc>
           <w:tcPr>
             <w:tcW w:type="dxa" w:w="2600"/>
@@ -11559,6 +11914,9 @@
         </w:tc>
       </w:tr>
       <w:tr>
+        <w:trPr>
+          <w:cantSplit/>
+        </w:trPr>
         <w:tc>
           <w:tcPr>
             <w:tcW w:type="dxa" w:w="2600"/>
@@ -11611,6 +11969,9 @@
         </w:tc>
       </w:tr>
       <w:tr>
+        <w:trPr>
+          <w:cantSplit/>
+        </w:trPr>
         <w:tc>
           <w:tcPr>
             <w:tcW w:type="dxa" w:w="2600"/>
@@ -11663,6 +12024,9 @@
         </w:tc>
       </w:tr>
       <w:tr>
+        <w:trPr>
+          <w:cantSplit/>
+        </w:trPr>
         <w:tc>
           <w:tcPr>
             <w:tcW w:type="dxa" w:w="2600"/>
@@ -11715,6 +12079,9 @@
         </w:tc>
       </w:tr>
       <w:tr>
+        <w:trPr>
+          <w:cantSplit/>
+        </w:trPr>
         <w:tc>
           <w:tcPr>
             <w:tcW w:type="dxa" w:w="2600"/>
@@ -11767,6 +12134,9 @@
         </w:tc>
       </w:tr>
       <w:tr>
+        <w:trPr>
+          <w:cantSplit/>
+        </w:trPr>
         <w:tc>
           <w:tcPr>
             <w:tcW w:type="dxa" w:w="2600"/>
@@ -11819,6 +12189,9 @@
         </w:tc>
       </w:tr>
       <w:tr>
+        <w:trPr>
+          <w:cantSplit/>
+        </w:trPr>
         <w:tc>
           <w:tcPr>
             <w:tcW w:type="dxa" w:w="2600"/>
@@ -11871,6 +12244,9 @@
         </w:tc>
       </w:tr>
       <w:tr>
+        <w:trPr>
+          <w:cantSplit/>
+        </w:trPr>
         <w:tc>
           <w:tcPr>
             <w:tcW w:type="dxa" w:w="2600"/>
@@ -11971,7 +12347,7 @@
         <w:color w:val="66727D"/>
         <w:sz w:val="18"/>
       </w:rPr>
-      <w:t xml:space="preserve">版本 0.7.0  |  第 </w:t>
+      <w:t xml:space="preserve">版本 0.8.0  |  第 </w:t>
     </w:r>
     <w:r>
       <w:rPr>

</xml_diff>

<commit_message>
feat: add atomic CDT constraint updates
</commit_message>
<xml_diff>
--- a/docs/manuals/dterrain_DLL开发使用手册.docx
+++ b/docs/manuals/dterrain_DLL开发使用手册.docx
@@ -85,7 +85,7 @@
           <w:color w:val="203748"/>
           <w:sz w:val="22"/>
         </w:rPr>
-        <w:t>版本 0.8.0  |  2026-07-16</w:t>
+        <w:t>版本 0.9.0  |  2026-07-16</w:t>
       </w:r>
     </w:p>
     <w:p>
@@ -148,6 +148,7 @@
           </w:tcPr>
           <w:p>
             <w:pPr>
+              <w:keepNext/>
               <w:spacing w:before="0" w:after="0"/>
               <w:jc w:val="center"/>
             </w:pPr>
@@ -176,6 +177,7 @@
           </w:tcPr>
           <w:p>
             <w:pPr>
+              <w:keepNext/>
               <w:spacing w:before="0" w:after="0"/>
               <w:jc w:val="center"/>
             </w:pPr>
@@ -241,7 +243,7 @@
                 <w:rFonts w:ascii="Calibri" w:hAnsi="Calibri" w:eastAsia="Microsoft YaHei"/>
                 <w:sz w:val="18"/>
               </w:rPr>
-              <w:t>0.8.0</w:t>
+              <w:t>0.9.0</w:t>
             </w:r>
           </w:p>
         </w:tc>
@@ -553,7 +555,7 @@
         <w:rPr>
           <w:rFonts w:ascii="Calibri" w:hAnsi="Calibri" w:eastAsia="Microsoft YaHei"/>
         </w:rPr>
-        <w:t>本手册对应 dterrain 0.8.0：约束 Delaunay 已支持断裂线、外边界、孔洞、域内查询、DCDT 文本、TIN→CDT、域内高程采样、CDT→GRID/等高线和 GUI 单约束编辑。百万点局部约束更新和生产级 GPU LOD 属于后续阶段。</w:t>
+        <w:t>本手册对应 dterrain 0.9.0：约束 Delaunay 已支持断裂线、外边界、孔洞、域内查询、DCDT 文本、TIN→CDT、域内高程采样、CDT→GRID/等高线，以及保持约束 ID 的原子几何更新与可选影响结果。GUI 已支持两次单击移动约束顶点并显示红/黄/绿影响区。百万点局部约束更新和生产级 GPU LOD 属于后续阶段。</w:t>
       </w:r>
     </w:p>
     <w:p>
@@ -688,6 +690,17 @@
           <w:rFonts w:ascii="Calibri" w:hAnsi="Calibri" w:eastAsia="Microsoft YaHei"/>
         </w:rPr>
         <w:t>独立 CDT 句柄、断裂线、外边界、孔洞、域内查询、约束增删与 DCDT 文本往返。</w:t>
+      </w:r>
+    </w:p>
+    <w:p>
+      <w:pPr>
+        <w:pStyle w:val="ListBullet"/>
+      </w:pPr>
+      <w:r>
+        <w:rPr>
+          <w:rFonts w:ascii="Calibri" w:hAnsi="Calibri" w:eastAsia="Microsoft YaHei"/>
+        </w:rPr>
+        <w:t>保持约束 ID 和类型的原子几何更新；可选返回更新前后的完整域差异。</w:t>
       </w:r>
     </w:p>
     <w:p>
@@ -752,6 +765,7 @@
           </w:tcPr>
           <w:p>
             <w:pPr>
+              <w:keepNext/>
               <w:spacing w:before="0" w:after="0"/>
               <w:jc w:val="center"/>
             </w:pPr>
@@ -780,6 +794,7 @@
           </w:tcPr>
           <w:p>
             <w:pPr>
+              <w:keepNext/>
               <w:spacing w:before="0" w:after="0"/>
               <w:jc w:val="center"/>
             </w:pPr>
@@ -1149,7 +1164,7 @@
         <w:rPr>
           <w:rFonts w:ascii="Calibri" w:hAnsi="Calibri" w:eastAsia="Microsoft YaHei"/>
         </w:rPr>
-        <w:t>GRID→TIN 仍重建普通 Delaunay；严格边界和孔洞应使用独立 dt_cdt_handle。v0.8 约束增删采用候选网全量重建，尚未达到百万点实时局部 CDT 编辑。</w:t>
+        <w:t>GRID→TIN 仍重建普通 Delaunay；严格边界和孔洞应使用独立 dt_cdt_handle。v0.9 约束新增、更新和删除均采用候选网全量重建，尚未达到百万点实时局部 CDT 编辑。</w:t>
       </w:r>
     </w:p>
     <w:p>
@@ -1360,6 +1375,7 @@
           </w:tcPr>
           <w:p>
             <w:pPr>
+              <w:keepNext/>
               <w:spacing w:before="0" w:after="0"/>
               <w:jc w:val="center"/>
             </w:pPr>
@@ -1388,6 +1404,7 @@
           </w:tcPr>
           <w:p>
             <w:pPr>
+              <w:keepNext/>
               <w:spacing w:before="0" w:after="0"/>
               <w:jc w:val="center"/>
             </w:pPr>
@@ -1416,6 +1433,7 @@
           </w:tcPr>
           <w:p>
             <w:pPr>
+              <w:keepNext/>
               <w:spacing w:before="0" w:after="0"/>
               <w:jc w:val="center"/>
             </w:pPr>
@@ -2051,6 +2069,7 @@
           </w:tcPr>
           <w:p>
             <w:pPr>
+              <w:keepNext/>
               <w:spacing w:before="0" w:after="0"/>
               <w:jc w:val="center"/>
             </w:pPr>
@@ -2079,6 +2098,7 @@
           </w:tcPr>
           <w:p>
             <w:pPr>
+              <w:keepNext/>
               <w:spacing w:before="0" w:after="0"/>
               <w:jc w:val="center"/>
             </w:pPr>
@@ -2107,6 +2127,7 @@
           </w:tcPr>
           <w:p>
             <w:pPr>
+              <w:keepNext/>
               <w:spacing w:before="0" w:after="0"/>
               <w:jc w:val="center"/>
             </w:pPr>
@@ -2685,6 +2706,7 @@
           </w:tcPr>
           <w:p>
             <w:pPr>
+              <w:keepNext/>
               <w:spacing w:before="0" w:after="0"/>
               <w:jc w:val="center"/>
             </w:pPr>
@@ -2713,6 +2735,7 @@
           </w:tcPr>
           <w:p>
             <w:pPr>
+              <w:keepNext/>
               <w:spacing w:before="0" w:after="0"/>
               <w:jc w:val="center"/>
             </w:pPr>
@@ -2741,6 +2764,7 @@
           </w:tcPr>
           <w:p>
             <w:pPr>
+              <w:keepNext/>
               <w:spacing w:before="0" w:after="0"/>
               <w:jc w:val="center"/>
             </w:pPr>
@@ -3870,6 +3894,7 @@
           </w:tcPr>
           <w:p>
             <w:pPr>
+              <w:keepNext/>
               <w:spacing w:before="0" w:after="0"/>
               <w:jc w:val="center"/>
             </w:pPr>
@@ -3898,6 +3923,7 @@
           </w:tcPr>
           <w:p>
             <w:pPr>
+              <w:keepNext/>
               <w:spacing w:before="0" w:after="0"/>
               <w:jc w:val="center"/>
             </w:pPr>
@@ -3926,6 +3952,7 @@
           </w:tcPr>
           <w:p>
             <w:pPr>
+              <w:keepNext/>
               <w:spacing w:before="0" w:after="0"/>
               <w:jc w:val="center"/>
             </w:pPr>
@@ -4468,6 +4495,7 @@
           </w:tcPr>
           <w:p>
             <w:pPr>
+              <w:keepNext/>
               <w:spacing w:before="0" w:after="0"/>
               <w:jc w:val="center"/>
             </w:pPr>
@@ -4496,6 +4524,7 @@
           </w:tcPr>
           <w:p>
             <w:pPr>
+              <w:keepNext/>
               <w:spacing w:before="0" w:after="0"/>
               <w:jc w:val="center"/>
             </w:pPr>
@@ -4524,6 +4553,7 @@
           </w:tcPr>
           <w:p>
             <w:pPr>
+              <w:keepNext/>
               <w:spacing w:before="0" w:after="0"/>
               <w:jc w:val="center"/>
             </w:pPr>
@@ -5090,6 +5120,7 @@
           </w:tcPr>
           <w:p>
             <w:pPr>
+              <w:keepNext/>
               <w:spacing w:before="0" w:after="0"/>
               <w:jc w:val="center"/>
             </w:pPr>
@@ -5118,6 +5149,7 @@
           </w:tcPr>
           <w:p>
             <w:pPr>
+              <w:keepNext/>
               <w:spacing w:before="0" w:after="0"/>
               <w:jc w:val="center"/>
             </w:pPr>
@@ -5146,6 +5178,7 @@
           </w:tcPr>
           <w:p>
             <w:pPr>
+              <w:keepNext/>
               <w:spacing w:before="0" w:after="0"/>
               <w:jc w:val="center"/>
             </w:pPr>
@@ -5981,6 +6014,7 @@
           </w:tcPr>
           <w:p>
             <w:pPr>
+              <w:keepNext/>
               <w:spacing w:before="0" w:after="0"/>
               <w:jc w:val="center"/>
             </w:pPr>
@@ -6009,6 +6043,7 @@
           </w:tcPr>
           <w:p>
             <w:pPr>
+              <w:keepNext/>
               <w:spacing w:before="0" w:after="0"/>
               <w:jc w:val="center"/>
             </w:pPr>
@@ -6037,6 +6072,7 @@
           </w:tcPr>
           <w:p>
             <w:pPr>
+              <w:keepNext/>
               <w:spacing w:before="0" w:after="0"/>
               <w:jc w:val="center"/>
             </w:pPr>
@@ -6701,6 +6737,7 @@
           </w:tcPr>
           <w:p>
             <w:pPr>
+              <w:keepNext/>
               <w:spacing w:before="0" w:after="0"/>
               <w:jc w:val="center"/>
             </w:pPr>
@@ -6729,6 +6766,7 @@
           </w:tcPr>
           <w:p>
             <w:pPr>
+              <w:keepNext/>
               <w:spacing w:before="0" w:after="0"/>
               <w:jc w:val="center"/>
             </w:pPr>
@@ -6757,6 +6795,7 @@
           </w:tcPr>
           <w:p>
             <w:pPr>
+              <w:keepNext/>
               <w:spacing w:before="0" w:after="0"/>
               <w:jc w:val="center"/>
             </w:pPr>
@@ -7114,7 +7153,7 @@
           <w:rFonts w:ascii="Consolas" w:hAnsi="Consolas" w:eastAsia="Microsoft YaHei"/>
           <w:sz w:val="17"/>
         </w:rPr>
-        <w:t>dt_cdt_add_constraint(cdt, DT_CONSTRAINT_OUTER_BOUNDARY, 0,</w:t>
+        <w:t>dt_constraint_id boundary_id = 0;</w:t>
       </w:r>
       <w:r>
         <w:br/>
@@ -7124,7 +7163,17 @@
           <w:rFonts w:ascii="Consolas" w:hAnsi="Consolas" w:eastAsia="Microsoft YaHei"/>
           <w:sz w:val="17"/>
         </w:rPr>
-        <w:t xml:space="preserve">                      boundary, boundary_count, nullptr);</w:t>
+        <w:t>dt_cdt_add_constraint(cdt, DT_CONSTRAINT_OUTER_BOUNDARY, 0,</w:t>
+      </w:r>
+      <w:r>
+        <w:br/>
+      </w:r>
+      <w:r>
+        <w:rPr>
+          <w:rFonts w:ascii="Consolas" w:hAnsi="Consolas" w:eastAsia="Microsoft YaHei"/>
+          <w:sz w:val="17"/>
+        </w:rPr>
+        <w:t xml:space="preserve">                      boundary, boundary_count, &amp;boundary_id);</w:t>
       </w:r>
       <w:r>
         <w:br/>
@@ -7145,6 +7194,125 @@
           <w:sz w:val="17"/>
         </w:rPr>
         <w:t xml:space="preserve">                      hole, hole_count, nullptr);</w:t>
+      </w:r>
+      <w:r>
+        <w:br/>
+      </w:r>
+      <w:r>
+        <w:rPr>
+          <w:rFonts w:ascii="Consolas" w:hAnsi="Consolas" w:eastAsia="Microsoft YaHei"/>
+          <w:sz w:val="17"/>
+        </w:rPr>
+      </w:r>
+      <w:r>
+        <w:br/>
+      </w:r>
+      <w:r>
+        <w:rPr>
+          <w:rFonts w:ascii="Consolas" w:hAnsi="Consolas" w:eastAsia="Microsoft YaHei"/>
+          <w:sz w:val="17"/>
+        </w:rPr>
+        <w:t>// 保持 boundary_id 和 OUTER_BOUNDARY 类型，原子替换几何。</w:t>
+      </w:r>
+      <w:r>
+        <w:br/>
+      </w:r>
+      <w:r>
+        <w:rPr>
+          <w:rFonts w:ascii="Consolas" w:hAnsi="Consolas" w:eastAsia="Microsoft YaHei"/>
+          <w:sz w:val="17"/>
+        </w:rPr>
+        <w:t>// 不需要影响区时将最后一个参数设为 nullptr，可避免完整差异计算。</w:t>
+      </w:r>
+      <w:r>
+        <w:br/>
+      </w:r>
+      <w:r>
+        <w:rPr>
+          <w:rFonts w:ascii="Consolas" w:hAnsi="Consolas" w:eastAsia="Microsoft YaHei"/>
+          <w:sz w:val="17"/>
+        </w:rPr>
+        <w:t>dt_edit_result effect = nullptr;</w:t>
+      </w:r>
+      <w:r>
+        <w:br/>
+      </w:r>
+      <w:r>
+        <w:rPr>
+          <w:rFonts w:ascii="Consolas" w:hAnsi="Consolas" w:eastAsia="Microsoft YaHei"/>
+          <w:sz w:val="17"/>
+        </w:rPr>
+        <w:t>if (dt_cdt_update_constraint(cdt, boundary_id, 0,</w:t>
+      </w:r>
+      <w:r>
+        <w:br/>
+      </w:r>
+      <w:r>
+        <w:rPr>
+          <w:rFonts w:ascii="Consolas" w:hAnsi="Consolas" w:eastAsia="Microsoft YaHei"/>
+          <w:sz w:val="17"/>
+        </w:rPr>
+        <w:t xml:space="preserve">                             moved_boundary, moved_boundary_count,</w:t>
+      </w:r>
+      <w:r>
+        <w:br/>
+      </w:r>
+      <w:r>
+        <w:rPr>
+          <w:rFonts w:ascii="Consolas" w:hAnsi="Consolas" w:eastAsia="Microsoft YaHei"/>
+          <w:sz w:val="17"/>
+        </w:rPr>
+        <w:t xml:space="preserve">                             &amp;effect) == DT_OK) {</w:t>
+      </w:r>
+      <w:r>
+        <w:br/>
+      </w:r>
+      <w:r>
+        <w:rPr>
+          <w:rFonts w:ascii="Consolas" w:hAnsi="Consolas" w:eastAsia="Microsoft YaHei"/>
+          <w:sz w:val="17"/>
+        </w:rPr>
+        <w:t xml:space="preserve">    dt_edit_result_view view{sizeof(dt_edit_result_view)};</w:t>
+      </w:r>
+      <w:r>
+        <w:br/>
+      </w:r>
+      <w:r>
+        <w:rPr>
+          <w:rFonts w:ascii="Consolas" w:hAnsi="Consolas" w:eastAsia="Microsoft YaHei"/>
+          <w:sz w:val="17"/>
+        </w:rPr>
+        <w:t xml:space="preserve">    dt_edit_result_get_view(effect, &amp;view);</w:t>
+      </w:r>
+      <w:r>
+        <w:br/>
+      </w:r>
+      <w:r>
+        <w:rPr>
+          <w:rFonts w:ascii="Consolas" w:hAnsi="Consolas" w:eastAsia="Microsoft YaHei"/>
+          <w:sz w:val="17"/>
+        </w:rPr>
+        <w:t xml:space="preserve">    // view 中包含删除面、新增面、边界边、删除边和新增边。</w:t>
+      </w:r>
+      <w:r>
+        <w:br/>
+      </w:r>
+      <w:r>
+        <w:rPr>
+          <w:rFonts w:ascii="Consolas" w:hAnsi="Consolas" w:eastAsia="Microsoft YaHei"/>
+          <w:sz w:val="17"/>
+        </w:rPr>
+        <w:t xml:space="preserve">    dt_release_edit_result(effect);</w:t>
+      </w:r>
+      <w:r>
+        <w:br/>
+      </w:r>
+      <w:r>
+        <w:rPr>
+          <w:rFonts w:ascii="Consolas" w:hAnsi="Consolas" w:eastAsia="Microsoft YaHei"/>
+          <w:sz w:val="17"/>
+        </w:rPr>
+        <w:t>}</w:t>
       </w:r>
       <w:r>
         <w:br/>
@@ -7220,6 +7388,7 @@
           </w:tcPr>
           <w:p>
             <w:pPr>
+              <w:keepNext/>
               <w:spacing w:before="0" w:after="0"/>
               <w:jc w:val="center"/>
             </w:pPr>
@@ -7248,6 +7417,7 @@
           </w:tcPr>
           <w:p>
             <w:pPr>
+              <w:keepNext/>
               <w:spacing w:before="0" w:after="0"/>
               <w:jc w:val="center"/>
             </w:pPr>
@@ -7276,6 +7446,7 @@
           </w:tcPr>
           <w:p>
             <w:pPr>
+              <w:keepNext/>
               <w:spacing w:before="0" w:after="0"/>
               <w:jc w:val="center"/>
             </w:pPr>
@@ -7542,7 +7713,7 @@
         <w:rPr>
           <w:rFonts w:ascii="Calibri" w:hAnsi="Calibri" w:eastAsia="Microsoft YaHei"/>
         </w:rPr>
-        <w:t>dt_cdt_sample_height_xy() 只在有效域内插值；外边界以外和孔洞内部返回 DT_E_NOT_FOUND。dt_grid_from_cdt() 将这些位置写为 NoData，dt_contours_from_cdt() 只遍历域内三角形并继承 CRS。</w:t>
+        <w:t>dt_cdt_sample_height_xy() 只在有效域内插值；外边界以外和孔洞内部返回 DT_E_NOT_FOUND。dt_grid_from_cdt() 将这些位置写为 NoData，dt_contours_from_cdt() 只遍历域内三角形并继承 CRS。dt_cdt_update_constraint() 成功时保持约束 ID 与类型，失败时原几何和 generation 均不改变；output_effect 可为 nullptr。</w:t>
       </w:r>
     </w:p>
     <w:p>
@@ -7563,7 +7734,7 @@
         <w:rPr>
           <w:rFonts w:ascii="Calibri" w:hAnsi="Calibri" w:eastAsia="Microsoft YaHei"/>
         </w:rPr>
-        <w:t>v0.8 添加或删除约束仍会在候选状态中完整重建 CDT，成功后原子替换。未分段交叉必须先在交点处加入共享顶点，否则返回 DT_E_UNSUPPORTED。</w:t>
+        <w:t>v0.9 添加、更新或删除约束仍会在候选状态中完整重建 CDT，成功后原子替换。请求 output_effect 还会计算更新前后的完整域差异；仅需更新数据时应传 nullptr。未分段交叉必须先在交点处加入共享顶点，否则返回 DT_E_UNSUPPORTED。</w:t>
       </w:r>
     </w:p>
     <w:p>
@@ -7615,6 +7786,7 @@
           </w:tcPr>
           <w:p>
             <w:pPr>
+              <w:keepNext/>
               <w:spacing w:before="0" w:after="0"/>
               <w:jc w:val="center"/>
             </w:pPr>
@@ -7643,6 +7815,7 @@
           </w:tcPr>
           <w:p>
             <w:pPr>
+              <w:keepNext/>
               <w:spacing w:before="0" w:after="0"/>
               <w:jc w:val="center"/>
             </w:pPr>
@@ -7671,6 +7844,7 @@
           </w:tcPr>
           <w:p>
             <w:pPr>
+              <w:keepNext/>
               <w:spacing w:before="0" w:after="0"/>
               <w:jc w:val="center"/>
             </w:pPr>
@@ -9219,6 +9393,7 @@
           </w:tcPr>
           <w:p>
             <w:pPr>
+              <w:keepNext/>
               <w:spacing w:before="0" w:after="0"/>
               <w:jc w:val="center"/>
             </w:pPr>
@@ -9247,6 +9422,7 @@
           </w:tcPr>
           <w:p>
             <w:pPr>
+              <w:keepNext/>
               <w:spacing w:before="0" w:after="0"/>
               <w:jc w:val="center"/>
             </w:pPr>
@@ -10128,6 +10304,7 @@
           </w:tcPr>
           <w:p>
             <w:pPr>
+              <w:keepNext/>
               <w:spacing w:before="0" w:after="0"/>
               <w:jc w:val="center"/>
             </w:pPr>
@@ -10156,6 +10333,7 @@
           </w:tcPr>
           <w:p>
             <w:pPr>
+              <w:keepNext/>
               <w:spacing w:before="0" w:after="0"/>
               <w:jc w:val="center"/>
             </w:pPr>
@@ -10184,6 +10362,7 @@
           </w:tcPr>
           <w:p>
             <w:pPr>
+              <w:keepNext/>
               <w:spacing w:before="0" w:after="0"/>
               <w:jc w:val="center"/>
             </w:pPr>
@@ -11005,6 +11184,7 @@
           </w:tcPr>
           <w:p>
             <w:pPr>
+              <w:keepNext/>
               <w:spacing w:before="0" w:after="0"/>
               <w:jc w:val="center"/>
             </w:pPr>
@@ -11033,6 +11213,7 @@
           </w:tcPr>
           <w:p>
             <w:pPr>
+              <w:keepNext/>
               <w:spacing w:before="0" w:after="0"/>
               <w:jc w:val="center"/>
             </w:pPr>
@@ -11061,6 +11242,7 @@
           </w:tcPr>
           <w:p>
             <w:pPr>
+              <w:keepNext/>
               <w:spacing w:before="0" w:after="0"/>
               <w:jc w:val="center"/>
             </w:pPr>
@@ -11089,6 +11271,7 @@
           </w:tcPr>
           <w:p>
             <w:pPr>
+              <w:keepNext/>
               <w:spacing w:before="0" w:after="0"/>
               <w:jc w:val="center"/>
             </w:pPr>
@@ -11117,6 +11300,7 @@
           </w:tcPr>
           <w:p>
             <w:pPr>
+              <w:keepNext/>
               <w:spacing w:before="0" w:after="0"/>
               <w:jc w:val="center"/>
             </w:pPr>
@@ -11760,6 +11944,7 @@
           </w:tcPr>
           <w:p>
             <w:pPr>
+              <w:keepNext/>
               <w:spacing w:before="0" w:after="0"/>
               <w:jc w:val="center"/>
             </w:pPr>
@@ -11788,6 +11973,7 @@
           </w:tcPr>
           <w:p>
             <w:pPr>
+              <w:keepNext/>
               <w:spacing w:before="0" w:after="0"/>
               <w:jc w:val="center"/>
             </w:pPr>
@@ -12347,7 +12533,7 @@
         <w:color w:val="66727D"/>
         <w:sz w:val="18"/>
       </w:rPr>
-      <w:t xml:space="preserve">版本 0.8.0  |  第 </w:t>
+      <w:t xml:space="preserve">版本 0.9.0  |  第 </w:t>
     </w:r>
     <w:r>
       <w:rPr>

</xml_diff>

<commit_message>
feat: add protected CDT vertex removal
</commit_message>
<xml_diff>
--- a/docs/manuals/dterrain_DLL开发使用手册.docx
+++ b/docs/manuals/dterrain_DLL开发使用手册.docx
@@ -85,7 +85,7 @@
           <w:color w:val="203748"/>
           <w:sz w:val="22"/>
         </w:rPr>
-        <w:t>版本 0.9.0  |  2026-07-16</w:t>
+        <w:t>版本 0.10.0  |  2026-07-16</w:t>
       </w:r>
     </w:p>
     <w:p>
@@ -243,7 +243,7 @@
                 <w:rFonts w:ascii="Calibri" w:hAnsi="Calibri" w:eastAsia="Microsoft YaHei"/>
                 <w:sz w:val="18"/>
               </w:rPr>
-              <w:t>0.9.0</w:t>
+              <w:t>0.10.0</w:t>
             </w:r>
           </w:p>
         </w:tc>
@@ -555,7 +555,7 @@
         <w:rPr>
           <w:rFonts w:ascii="Calibri" w:hAnsi="Calibri" w:eastAsia="Microsoft YaHei"/>
         </w:rPr>
-        <w:t>本手册对应 dterrain 0.9.0：约束 Delaunay 已支持断裂线、外边界、孔洞、域内查询、DCDT 文本、TIN→CDT、域内高程采样、CDT→GRID/等高线，以及保持约束 ID 的原子几何更新与可选影响结果。GUI 已支持两次单击移动约束顶点并显示红/黄/绿影响区。百万点局部约束更新和生产级 GPU LOD 属于后续阶段。</w:t>
+        <w:t>本手册对应 dterrain 0.10.0：在 v0.9 稳定 ID 原子更新基础上，新增约束顶点引用查询、共享顶点默认保护、显式单约束脱离删除和 GUI 单击安全删除。百万点局部约束更新和生产级 GPU LOD 属于后续阶段。</w:t>
       </w:r>
     </w:p>
     <w:p>
@@ -701,6 +701,17 @@
           <w:rFonts w:ascii="Calibri" w:hAnsi="Calibri" w:eastAsia="Microsoft YaHei"/>
         </w:rPr>
         <w:t>保持约束 ID 和类型的原子几何更新；可选返回更新前后的完整域差异。</w:t>
+      </w:r>
+    </w:p>
+    <w:p>
+      <w:pPr>
+        <w:pStyle w:val="ListBullet"/>
+      </w:pPr>
+      <w:r>
+        <w:rPr>
+          <w:rFonts w:ascii="Calibri" w:hAnsi="Calibri" w:eastAsia="Microsoft YaHei"/>
+        </w:rPr>
+        <w:t>约束顶点引用查询、共享顶点默认保护和显式单约束脱离删除。</w:t>
       </w:r>
     </w:p>
     <w:p>
@@ -1164,7 +1175,7 @@
         <w:rPr>
           <w:rFonts w:ascii="Calibri" w:hAnsi="Calibri" w:eastAsia="Microsoft YaHei"/>
         </w:rPr>
-        <w:t>GRID→TIN 仍重建普通 Delaunay；严格边界和孔洞应使用独立 dt_cdt_handle。v0.9 约束新增、更新和删除均采用候选网全量重建，尚未达到百万点实时局部 CDT 编辑。</w:t>
+        <w:t>GRID→TIN 仍重建普通 Delaunay；严格边界和孔洞应使用独立 dt_cdt_handle。v0.10 约束新增、更新、顶点删除和整条删除均采用候选网全量重建，尚未达到百万点实时局部 CDT 编辑。</w:t>
       </w:r>
     </w:p>
     <w:p>
@@ -2014,11 +2025,6 @@
       <w:pPr>
         <w:spacing w:before="0" w:after="40"/>
       </w:pPr>
-    </w:p>
-    <w:p>
-      <w:r>
-        <w:br w:type="page"/>
-      </w:r>
     </w:p>
     <w:p>
       <w:pPr>
@@ -7322,6 +7328,75 @@
           <w:rFonts w:ascii="Consolas" w:hAnsi="Consolas" w:eastAsia="Microsoft YaHei"/>
           <w:sz w:val="17"/>
         </w:rPr>
+      </w:r>
+      <w:r>
+        <w:br/>
+      </w:r>
+      <w:r>
+        <w:rPr>
+          <w:rFonts w:ascii="Consolas" w:hAnsi="Consolas" w:eastAsia="Microsoft YaHei"/>
+          <w:sz w:val="17"/>
+        </w:rPr>
+        <w:t>dt_cdt_vertex_usage usage{};</w:t>
+      </w:r>
+      <w:r>
+        <w:br/>
+      </w:r>
+      <w:r>
+        <w:rPr>
+          <w:rFonts w:ascii="Consolas" w:hAnsi="Consolas" w:eastAsia="Microsoft YaHei"/>
+          <w:sz w:val="17"/>
+        </w:rPr>
+        <w:t>dt_cdt_get_constraint_vertex_usage(cdt, boundary_id, 1, &amp;usage);</w:t>
+      </w:r>
+      <w:r>
+        <w:br/>
+      </w:r>
+      <w:r>
+        <w:rPr>
+          <w:rFonts w:ascii="Consolas" w:hAnsi="Consolas" w:eastAsia="Microsoft YaHei"/>
+          <w:sz w:val="17"/>
+        </w:rPr>
+        <w:t>uint32_t remove_flags = usage.constraint_count &gt; 1</w:t>
+      </w:r>
+      <w:r>
+        <w:br/>
+      </w:r>
+      <w:r>
+        <w:rPr>
+          <w:rFonts w:ascii="Consolas" w:hAnsi="Consolas" w:eastAsia="Microsoft YaHei"/>
+          <w:sz w:val="17"/>
+        </w:rPr>
+        <w:t xml:space="preserve">    ? DT_CDT_REMOVE_VERTEX_ALLOW_SHARED_DETACH : 0;</w:t>
+      </w:r>
+      <w:r>
+        <w:br/>
+      </w:r>
+      <w:r>
+        <w:rPr>
+          <w:rFonts w:ascii="Consolas" w:hAnsi="Consolas" w:eastAsia="Microsoft YaHei"/>
+          <w:sz w:val="17"/>
+        </w:rPr>
+        <w:t>dt_cdt_remove_constraint_vertex(cdt, boundary_id, 1,</w:t>
+      </w:r>
+      <w:r>
+        <w:br/>
+      </w:r>
+      <w:r>
+        <w:rPr>
+          <w:rFonts w:ascii="Consolas" w:hAnsi="Consolas" w:eastAsia="Microsoft YaHei"/>
+          <w:sz w:val="17"/>
+        </w:rPr>
+        <w:t xml:space="preserve">                                remove_flags, nullptr);</w:t>
+      </w:r>
+      <w:r>
+        <w:br/>
+      </w:r>
+      <w:r>
+        <w:rPr>
+          <w:rFonts w:ascii="Consolas" w:hAnsi="Consolas" w:eastAsia="Microsoft YaHei"/>
+          <w:sz w:val="17"/>
+        </w:rPr>
         <w:t>dt_grid_from_cdt(cdt, &amp;grid_options, &amp;grid);</w:t>
       </w:r>
       <w:r>
@@ -7713,7 +7788,15 @@
         <w:rPr>
           <w:rFonts w:ascii="Calibri" w:hAnsi="Calibri" w:eastAsia="Microsoft YaHei"/>
         </w:rPr>
-        <w:t>dt_cdt_sample_height_xy() 只在有效域内插值；外边界以外和孔洞内部返回 DT_E_NOT_FOUND。dt_grid_from_cdt() 将这些位置写为 NoData，dt_contours_from_cdt() 只遍历域内三角形并继承 CRS。dt_cdt_update_constraint() 成功时保持约束 ID 与类型，失败时原几何和 generation 均不改变；output_effect 可为 nullptr。</w:t>
+        <w:t>dt_cdt_get_constraint_vertex_usage() 报告指定点被多少条约束、多少个点序列位置引用，以及是否也是基础地形点。dt_cdt_remove_constraint_vertex() 默认拒绝共享顶点；显式传 DT_CDT_REMOVE_VERTEX_ALLOW_SHARED_DETACH 时只从目标约束脱离，其他约束和基础点保持不变。删除后仍统一校验最小点数和拓扑，失败时 generation 不变。</w:t>
+      </w:r>
+    </w:p>
+    <w:p>
+      <w:r>
+        <w:rPr>
+          <w:rFonts w:ascii="Calibri" w:hAnsi="Calibri" w:eastAsia="Microsoft YaHei"/>
+        </w:rPr>
+        <w:t>dt_cdt_sample_height_xy() 只在有效域内插值；外边界以外和孔洞内部返回 DT_E_NOT_FOUND。dt_grid_from_cdt() 将这些位置写为 NoData，dt_contours_from_cdt() 只遍历域内三角形并继承 CRS。更新和顶点删除的 output_effect 均可为 nullptr。</w:t>
       </w:r>
     </w:p>
     <w:p>
@@ -7734,7 +7817,7 @@
         <w:rPr>
           <w:rFonts w:ascii="Calibri" w:hAnsi="Calibri" w:eastAsia="Microsoft YaHei"/>
         </w:rPr>
-        <w:t>v0.9 添加、更新或删除约束仍会在候选状态中完整重建 CDT，成功后原子替换。请求 output_effect 还会计算更新前后的完整域差异；仅需更新数据时应传 nullptr。未分段交叉必须先在交点处加入共享顶点，否则返回 DT_E_UNSUPPORTED。</w:t>
+        <w:t>v0.10 添加、更新、顶点删除或整条删除约束仍会完整重建候选 CDT，成功后原子替换。请求 output_effect 还会计算完整域差异。未分段交叉必须先在交点处加入共享顶点，否则返回 DT_E_UNSUPPORTED。</w:t>
       </w:r>
     </w:p>
     <w:p>
@@ -12533,7 +12616,7 @@
         <w:color w:val="66727D"/>
         <w:sz w:val="18"/>
       </w:rPr>
-      <w:t xml:space="preserve">版本 0.9.0  |  第 </w:t>
+      <w:t xml:space="preserve">版本 0.10.0  |  第 </w:t>
     </w:r>
     <w:r>
       <w:rPr>

</xml_diff>

<commit_message>
feat: add atomic CDT constraint batches
</commit_message>
<xml_diff>
--- a/docs/manuals/dterrain_DLL开发使用手册.docx
+++ b/docs/manuals/dterrain_DLL开发使用手册.docx
@@ -85,7 +85,7 @@
           <w:color w:val="203748"/>
           <w:sz w:val="22"/>
         </w:rPr>
-        <w:t>版本 0.10.0  |  2026-07-16</w:t>
+        <w:t>版本 0.11.0  |  2026-07-16</w:t>
       </w:r>
     </w:p>
     <w:p>
@@ -243,7 +243,7 @@
                 <w:rFonts w:ascii="Calibri" w:hAnsi="Calibri" w:eastAsia="Microsoft YaHei"/>
                 <w:sz w:val="18"/>
               </w:rPr>
-              <w:t>0.10.0</w:t>
+              <w:t>0.11.0</w:t>
             </w:r>
           </w:p>
         </w:tc>
@@ -555,7 +555,7 @@
         <w:rPr>
           <w:rFonts w:ascii="Calibri" w:hAnsi="Calibri" w:eastAsia="Microsoft YaHei"/>
         </w:rPr>
-        <w:t>本手册对应 dterrain 0.10.0：在 v0.9 稳定 ID 原子更新基础上，新增约束顶点引用查询、共享顶点默认保护、显式单约束脱离删除和 GUI 单击安全删除。百万点局部约束更新和生产级 GPU LOD 属于后续阶段。</w:t>
+        <w:t>本手册对应 dterrain 0.11.0：在共享顶点安全删除基础上，新增原子批量约束事务，一次提交多条新增、更新和删除并只重建一次；GUI 提供 12 条断裂线批量演示。真正局部拓扑更新和生产级 GPU LOD 属于后续阶段。</w:t>
       </w:r>
     </w:p>
     <w:p>
@@ -712,6 +712,17 @@
           <w:rFonts w:ascii="Calibri" w:hAnsi="Calibri" w:eastAsia="Microsoft YaHei"/>
         </w:rPr>
         <w:t>约束顶点引用查询、共享顶点默认保护和显式单约束脱离删除。</w:t>
+      </w:r>
+    </w:p>
+    <w:p>
+      <w:pPr>
+        <w:pStyle w:val="ListBullet"/>
+      </w:pPr>
+      <w:r>
+        <w:rPr>
+          <w:rFonts w:ascii="Calibri" w:hAnsi="Calibri" w:eastAsia="Microsoft YaHei"/>
+        </w:rPr>
+        <w:t>原子批量约束事务，一次提交多条新增、更新和删除并统一回滚。</w:t>
       </w:r>
     </w:p>
     <w:p>
@@ -1175,7 +1186,7 @@
         <w:rPr>
           <w:rFonts w:ascii="Calibri" w:hAnsi="Calibri" w:eastAsia="Microsoft YaHei"/>
         </w:rPr>
-        <w:t>GRID→TIN 仍重建普通 Delaunay；严格边界和孔洞应使用独立 dt_cdt_handle。v0.10 约束新增、更新、顶点删除和整条删除均采用候选网全量重建，尚未达到百万点实时局部 CDT 编辑。</w:t>
+        <w:t>GRID→TIN 仍重建普通 Delaunay；严格边界和孔洞应使用独立 dt_cdt_handle。v0.11 单项约束编辑仍采用候选网全量重建；批量事务把 N 次重建降为 1 次，但尚未达到百万点实时局部 CDT 编辑。</w:t>
       </w:r>
     </w:p>
     <w:p>
@@ -7397,6 +7408,154 @@
           <w:rFonts w:ascii="Consolas" w:hAnsi="Consolas" w:eastAsia="Microsoft YaHei"/>
           <w:sz w:val="17"/>
         </w:rPr>
+      </w:r>
+      <w:r>
+        <w:br/>
+      </w:r>
+      <w:r>
+        <w:rPr>
+          <w:rFonts w:ascii="Consolas" w:hAnsi="Consolas" w:eastAsia="Microsoft YaHei"/>
+          <w:sz w:val="17"/>
+        </w:rPr>
+        <w:t>dt_cdt_constraint_edit edits[2]{};</w:t>
+      </w:r>
+      <w:r>
+        <w:br/>
+      </w:r>
+      <w:r>
+        <w:rPr>
+          <w:rFonts w:ascii="Consolas" w:hAnsi="Consolas" w:eastAsia="Microsoft YaHei"/>
+          <w:sz w:val="17"/>
+        </w:rPr>
+        <w:t>edits[0].struct_size = sizeof(edits[0]);</w:t>
+      </w:r>
+      <w:r>
+        <w:br/>
+      </w:r>
+      <w:r>
+        <w:rPr>
+          <w:rFonts w:ascii="Consolas" w:hAnsi="Consolas" w:eastAsia="Microsoft YaHei"/>
+          <w:sz w:val="17"/>
+        </w:rPr>
+        <w:t>edits[0].operation = DT_CDT_EDIT_UPDATE;</w:t>
+      </w:r>
+      <w:r>
+        <w:br/>
+      </w:r>
+      <w:r>
+        <w:rPr>
+          <w:rFonts w:ascii="Consolas" w:hAnsi="Consolas" w:eastAsia="Microsoft YaHei"/>
+          <w:sz w:val="17"/>
+        </w:rPr>
+        <w:t>edits[0].constraint_id = boundary_id;</w:t>
+      </w:r>
+      <w:r>
+        <w:br/>
+      </w:r>
+      <w:r>
+        <w:rPr>
+          <w:rFonts w:ascii="Consolas" w:hAnsi="Consolas" w:eastAsia="Microsoft YaHei"/>
+          <w:sz w:val="17"/>
+        </w:rPr>
+        <w:t>edits[0].points = moved_boundary;</w:t>
+      </w:r>
+      <w:r>
+        <w:br/>
+      </w:r>
+      <w:r>
+        <w:rPr>
+          <w:rFonts w:ascii="Consolas" w:hAnsi="Consolas" w:eastAsia="Microsoft YaHei"/>
+          <w:sz w:val="17"/>
+        </w:rPr>
+        <w:t>edits[0].point_count = moved_boundary_count;</w:t>
+      </w:r>
+      <w:r>
+        <w:br/>
+      </w:r>
+      <w:r>
+        <w:rPr>
+          <w:rFonts w:ascii="Consolas" w:hAnsi="Consolas" w:eastAsia="Microsoft YaHei"/>
+          <w:sz w:val="17"/>
+        </w:rPr>
+        <w:t>edits[1].struct_size = sizeof(edits[1]);</w:t>
+      </w:r>
+      <w:r>
+        <w:br/>
+      </w:r>
+      <w:r>
+        <w:rPr>
+          <w:rFonts w:ascii="Consolas" w:hAnsi="Consolas" w:eastAsia="Microsoft YaHei"/>
+          <w:sz w:val="17"/>
+        </w:rPr>
+        <w:t>edits[1].operation = DT_CDT_EDIT_ADD;</w:t>
+      </w:r>
+      <w:r>
+        <w:br/>
+      </w:r>
+      <w:r>
+        <w:rPr>
+          <w:rFonts w:ascii="Consolas" w:hAnsi="Consolas" w:eastAsia="Microsoft YaHei"/>
+          <w:sz w:val="17"/>
+        </w:rPr>
+        <w:t>edits[1].kind = DT_CONSTRAINT_BREAKLINE;</w:t>
+      </w:r>
+      <w:r>
+        <w:br/>
+      </w:r>
+      <w:r>
+        <w:rPr>
+          <w:rFonts w:ascii="Consolas" w:hAnsi="Consolas" w:eastAsia="Microsoft YaHei"/>
+          <w:sz w:val="17"/>
+        </w:rPr>
+        <w:t>edits[1].points = ridge;</w:t>
+      </w:r>
+      <w:r>
+        <w:br/>
+      </w:r>
+      <w:r>
+        <w:rPr>
+          <w:rFonts w:ascii="Consolas" w:hAnsi="Consolas" w:eastAsia="Microsoft YaHei"/>
+          <w:sz w:val="17"/>
+        </w:rPr>
+        <w:t>edits[1].point_count = ridge_count;</w:t>
+      </w:r>
+      <w:r>
+        <w:br/>
+      </w:r>
+      <w:r>
+        <w:rPr>
+          <w:rFonts w:ascii="Consolas" w:hAnsi="Consolas" w:eastAsia="Microsoft YaHei"/>
+          <w:sz w:val="17"/>
+        </w:rPr>
+        <w:t>dt_constraint_id result_ids[2]{};</w:t>
+      </w:r>
+      <w:r>
+        <w:br/>
+      </w:r>
+      <w:r>
+        <w:rPr>
+          <w:rFonts w:ascii="Consolas" w:hAnsi="Consolas" w:eastAsia="Microsoft YaHei"/>
+          <w:sz w:val="17"/>
+        </w:rPr>
+        <w:t>dt_cdt_apply_constraint_edits(cdt, edits, 2, result_ids, nullptr);</w:t>
+      </w:r>
+      <w:r>
+        <w:br/>
+      </w:r>
+      <w:r>
+        <w:rPr>
+          <w:rFonts w:ascii="Consolas" w:hAnsi="Consolas" w:eastAsia="Microsoft YaHei"/>
+          <w:sz w:val="17"/>
+        </w:rPr>
+      </w:r>
+      <w:r>
+        <w:br/>
+      </w:r>
+      <w:r>
+        <w:rPr>
+          <w:rFonts w:ascii="Consolas" w:hAnsi="Consolas" w:eastAsia="Microsoft YaHei"/>
+          <w:sz w:val="17"/>
+        </w:rPr>
         <w:t>dt_grid_from_cdt(cdt, &amp;grid_options, &amp;grid);</w:t>
       </w:r>
       <w:r>
@@ -7796,6 +7955,14 @@
         <w:rPr>
           <w:rFonts w:ascii="Calibri" w:hAnsi="Calibri" w:eastAsia="Microsoft YaHei"/>
         </w:rPr>
+        <w:t>dt_cdt_apply_constraint_edits() 按数组顺序组合 ADD、UPDATE 和 REMOVE。ADD 分配新稳定 ID，UPDATE 保留原类型，REMOVE 不携带几何。任一参数、ID 或最终拓扑失败时整批回滚且不消耗 ID；成功时 generation 只增加一次。output_constraint_ids 和整批 output_effect 均可为空。</w:t>
+      </w:r>
+    </w:p>
+    <w:p>
+      <w:r>
+        <w:rPr>
+          <w:rFonts w:ascii="Calibri" w:hAnsi="Calibri" w:eastAsia="Microsoft YaHei"/>
+        </w:rPr>
         <w:t>dt_cdt_sample_height_xy() 只在有效域内插值；外边界以外和孔洞内部返回 DT_E_NOT_FOUND。dt_grid_from_cdt() 将这些位置写为 NoData，dt_contours_from_cdt() 只遍历域内三角形并继承 CRS。更新和顶点删除的 output_effect 均可为 nullptr。</w:t>
       </w:r>
     </w:p>
@@ -7817,7 +7984,7 @@
         <w:rPr>
           <w:rFonts w:ascii="Calibri" w:hAnsi="Calibri" w:eastAsia="Microsoft YaHei"/>
         </w:rPr>
-        <w:t>v0.10 添加、更新、顶点删除或整条删除约束仍会完整重建候选 CDT，成功后原子替换。请求 output_effect 还会计算完整域差异。未分段交叉必须先在交点处加入共享顶点，否则返回 DT_E_UNSUPPORTED。</w:t>
+        <w:t>v0.11 单项约束编辑仍完整重建候选 CDT；批量事务只重建一次。100,000 基础点添加 12 条断裂线的本机对比为逐条 3.259 s、批量 0.528 s，约 6.17 倍。请求 output_effect 还会计算完整域差异。未分段交叉仍须先加入共享顶点。</w:t>
       </w:r>
     </w:p>
     <w:p>
@@ -11803,6 +11970,254 @@
         <w:t>数据来自 Windows x64 Release/MinGW、随机均匀 XY 点集，用于说明数量级，不是对任意硬件和坐标分布的固定承诺。</w:t>
       </w:r>
     </w:p>
+    <w:tbl>
+      <w:tblPr>
+        <w:tblStyle w:val="TableGrid"/>
+        <w:tblW w:type="dxa" w:w="9360"/>
+        <w:jc w:val="left"/>
+        <w:tblLayout w:type="fixed"/>
+        <w:tblLook w:firstColumn="1" w:firstRow="1" w:lastColumn="0" w:lastRow="0" w:noHBand="0" w:noVBand="1" w:val="04A0"/>
+        <w:tblInd w:w="120" w:type="dxa"/>
+      </w:tblPr>
+      <w:tblGrid>
+        <w:gridCol w:w="3500"/>
+        <w:gridCol w:w="1900"/>
+        <w:gridCol w:w="1900"/>
+        <w:gridCol w:w="2060"/>
+      </w:tblGrid>
+      <w:tr>
+        <w:trPr>
+          <w:cantSplit/>
+          <w:tblHeader w:val="true"/>
+        </w:trPr>
+        <w:tc>
+          <w:tcPr>
+            <w:tcW w:type="dxa" w:w="3500"/>
+            <w:shd w:fill="E8EEF5"/>
+            <w:tcMar>
+              <w:top w:w="80" w:type="dxa"/>
+              <w:start w:w="120" w:type="dxa"/>
+              <w:bottom w:w="80" w:type="dxa"/>
+              <w:end w:w="120" w:type="dxa"/>
+            </w:tcMar>
+            <w:vAlign w:val="center"/>
+          </w:tcPr>
+          <w:p>
+            <w:pPr>
+              <w:keepNext/>
+              <w:spacing w:before="0" w:after="0"/>
+              <w:jc w:val="center"/>
+            </w:pPr>
+            <w:r>
+              <w:rPr>
+                <w:rFonts w:ascii="Calibri" w:hAnsi="Calibri" w:eastAsia="Microsoft YaHei"/>
+                <w:b/>
+                <w:color w:val="203748"/>
+                <w:sz w:val="19"/>
+              </w:rPr>
+              <w:t>CDT 场景</w:t>
+            </w:r>
+          </w:p>
+        </w:tc>
+        <w:tc>
+          <w:tcPr>
+            <w:tcW w:type="dxa" w:w="1900"/>
+            <w:shd w:fill="E8EEF5"/>
+            <w:tcMar>
+              <w:top w:w="80" w:type="dxa"/>
+              <w:start w:w="120" w:type="dxa"/>
+              <w:bottom w:w="80" w:type="dxa"/>
+              <w:end w:w="120" w:type="dxa"/>
+            </w:tcMar>
+            <w:vAlign w:val="center"/>
+          </w:tcPr>
+          <w:p>
+            <w:pPr>
+              <w:keepNext/>
+              <w:spacing w:before="0" w:after="0"/>
+              <w:jc w:val="center"/>
+            </w:pPr>
+            <w:r>
+              <w:rPr>
+                <w:rFonts w:ascii="Calibri" w:hAnsi="Calibri" w:eastAsia="Microsoft YaHei"/>
+                <w:b/>
+                <w:color w:val="203748"/>
+                <w:sz w:val="19"/>
+              </w:rPr>
+              <w:t>逐条调用</w:t>
+            </w:r>
+          </w:p>
+        </w:tc>
+        <w:tc>
+          <w:tcPr>
+            <w:tcW w:type="dxa" w:w="1900"/>
+            <w:shd w:fill="E8EEF5"/>
+            <w:tcMar>
+              <w:top w:w="80" w:type="dxa"/>
+              <w:start w:w="120" w:type="dxa"/>
+              <w:bottom w:w="80" w:type="dxa"/>
+              <w:end w:w="120" w:type="dxa"/>
+            </w:tcMar>
+            <w:vAlign w:val="center"/>
+          </w:tcPr>
+          <w:p>
+            <w:pPr>
+              <w:keepNext/>
+              <w:spacing w:before="0" w:after="0"/>
+              <w:jc w:val="center"/>
+            </w:pPr>
+            <w:r>
+              <w:rPr>
+                <w:rFonts w:ascii="Calibri" w:hAnsi="Calibri" w:eastAsia="Microsoft YaHei"/>
+                <w:b/>
+                <w:color w:val="203748"/>
+                <w:sz w:val="19"/>
+              </w:rPr>
+              <w:t>批量事务</w:t>
+            </w:r>
+          </w:p>
+        </w:tc>
+        <w:tc>
+          <w:tcPr>
+            <w:tcW w:type="dxa" w:w="2060"/>
+            <w:shd w:fill="E8EEF5"/>
+            <w:tcMar>
+              <w:top w:w="80" w:type="dxa"/>
+              <w:start w:w="120" w:type="dxa"/>
+              <w:bottom w:w="80" w:type="dxa"/>
+              <w:end w:w="120" w:type="dxa"/>
+            </w:tcMar>
+            <w:vAlign w:val="center"/>
+          </w:tcPr>
+          <w:p>
+            <w:pPr>
+              <w:keepNext/>
+              <w:spacing w:before="0" w:after="0"/>
+              <w:jc w:val="center"/>
+            </w:pPr>
+            <w:r>
+              <w:rPr>
+                <w:rFonts w:ascii="Calibri" w:hAnsi="Calibri" w:eastAsia="Microsoft YaHei"/>
+                <w:b/>
+                <w:color w:val="203748"/>
+                <w:sz w:val="19"/>
+              </w:rPr>
+              <w:t>本次加速</w:t>
+            </w:r>
+          </w:p>
+        </w:tc>
+      </w:tr>
+      <w:tr>
+        <w:trPr>
+          <w:cantSplit/>
+        </w:trPr>
+        <w:tc>
+          <w:tcPr>
+            <w:tcW w:type="dxa" w:w="3500"/>
+            <w:tcMar>
+              <w:top w:w="80" w:type="dxa"/>
+              <w:start w:w="120" w:type="dxa"/>
+              <w:bottom w:w="80" w:type="dxa"/>
+              <w:end w:w="120" w:type="dxa"/>
+            </w:tcMar>
+            <w:vAlign w:val="center"/>
+          </w:tcPr>
+          <w:p>
+            <w:pPr>
+              <w:spacing w:before="0" w:after="0" w:line="276" w:lineRule="auto"/>
+              <w:jc w:val="left"/>
+            </w:pPr>
+            <w:r>
+              <w:rPr>
+                <w:rFonts w:ascii="Calibri" w:hAnsi="Calibri" w:eastAsia="Microsoft YaHei"/>
+                <w:sz w:val="18"/>
+              </w:rPr>
+              <w:t>100,000 点 + 12 条断裂线</w:t>
+            </w:r>
+          </w:p>
+        </w:tc>
+        <w:tc>
+          <w:tcPr>
+            <w:tcW w:type="dxa" w:w="1900"/>
+            <w:tcMar>
+              <w:top w:w="80" w:type="dxa"/>
+              <w:start w:w="120" w:type="dxa"/>
+              <w:bottom w:w="80" w:type="dxa"/>
+              <w:end w:w="120" w:type="dxa"/>
+            </w:tcMar>
+            <w:vAlign w:val="center"/>
+          </w:tcPr>
+          <w:p>
+            <w:pPr>
+              <w:spacing w:before="0" w:after="0" w:line="276" w:lineRule="auto"/>
+              <w:jc w:val="center"/>
+            </w:pPr>
+            <w:r>
+              <w:rPr>
+                <w:rFonts w:ascii="Calibri" w:hAnsi="Calibri" w:eastAsia="Microsoft YaHei"/>
+                <w:sz w:val="18"/>
+              </w:rPr>
+              <w:t>3.259 s</w:t>
+            </w:r>
+          </w:p>
+        </w:tc>
+        <w:tc>
+          <w:tcPr>
+            <w:tcW w:type="dxa" w:w="1900"/>
+            <w:tcMar>
+              <w:top w:w="80" w:type="dxa"/>
+              <w:start w:w="120" w:type="dxa"/>
+              <w:bottom w:w="80" w:type="dxa"/>
+              <w:end w:w="120" w:type="dxa"/>
+            </w:tcMar>
+            <w:vAlign w:val="center"/>
+          </w:tcPr>
+          <w:p>
+            <w:pPr>
+              <w:spacing w:before="0" w:after="0" w:line="276" w:lineRule="auto"/>
+              <w:jc w:val="center"/>
+            </w:pPr>
+            <w:r>
+              <w:rPr>
+                <w:rFonts w:ascii="Calibri" w:hAnsi="Calibri" w:eastAsia="Microsoft YaHei"/>
+                <w:sz w:val="18"/>
+              </w:rPr>
+              <w:t>0.528 s</w:t>
+            </w:r>
+          </w:p>
+        </w:tc>
+        <w:tc>
+          <w:tcPr>
+            <w:tcW w:type="dxa" w:w="2060"/>
+            <w:tcMar>
+              <w:top w:w="80" w:type="dxa"/>
+              <w:start w:w="120" w:type="dxa"/>
+              <w:bottom w:w="80" w:type="dxa"/>
+              <w:end w:w="120" w:type="dxa"/>
+            </w:tcMar>
+            <w:vAlign w:val="center"/>
+          </w:tcPr>
+          <w:p>
+            <w:pPr>
+              <w:spacing w:before="0" w:after="0" w:line="276" w:lineRule="auto"/>
+              <w:jc w:val="center"/>
+            </w:pPr>
+            <w:r>
+              <w:rPr>
+                <w:rFonts w:ascii="Calibri" w:hAnsi="Calibri" w:eastAsia="Microsoft YaHei"/>
+                <w:sz w:val="18"/>
+              </w:rPr>
+              <w:t>6.17×</w:t>
+            </w:r>
+          </w:p>
+        </w:tc>
+      </w:tr>
+    </w:tbl>
+    <w:p>
+      <w:pPr>
+        <w:spacing w:before="0" w:after="40"/>
+      </w:pPr>
+    </w:p>
     <w:p>
       <w:pPr>
         <w:pStyle w:val="Heading2"/>
@@ -11910,7 +12325,7 @@
         <w:rPr>
           <w:rFonts w:ascii="Calibri" w:hAnsi="Calibri" w:eastAsia="Microsoft YaHei"/>
         </w:rPr>
-        <w:t>测试覆盖生命周期、普通 TIN 动态编辑、DTIN/DTMESH/XYZ、TIN/GRID/等高线、异步任务，以及 CDT 空网清理、外边界、孔洞、断裂线、交叉失败原子性、TIN→CDT、域内采样、CDT→GRID/等高线、约束删除和 DCDT 往返。GDAL 构建还执行 GTiff、COG、GPKG 驱动探测和真实文件往返。</w:t>
+        <w:t>测试覆盖生命周期、普通 TIN 动态编辑、DTIN/DTMESH/XYZ、TIN/GRID/等高线、异步任务，以及 CDT 空网清理、外边界、孔洞、断裂线、交叉失败原子性、TIN→CDT、域内采样、CDT→GRID/等高线、共享顶点保护、批量新增/更新/删除、整批失败回滚和 DCDT 往返。GDAL 构建还执行 GTiff、COG、GPKG 驱动探测和真实文件往返。</w:t>
       </w:r>
     </w:p>
     <w:p>
@@ -12616,7 +13031,7 @@
         <w:color w:val="66727D"/>
         <w:sz w:val="18"/>
       </w:rPr>
-      <w:t xml:space="preserve">版本 0.10.0  |  第 </w:t>
+      <w:t xml:space="preserve">版本 0.11.0  |  第 </w:t>
     </w:r>
     <w:r>
       <w:rPr>

</xml_diff>

<commit_message>
feat: add contour reverse terrain conversion
</commit_message>
<xml_diff>
--- a/docs/manuals/dterrain_DLL开发使用手册.docx
+++ b/docs/manuals/dterrain_DLL开发使用手册.docx
@@ -85,7 +85,7 @@
           <w:color w:val="203748"/>
           <w:sz w:val="22"/>
         </w:rPr>
-        <w:t>版本 0.11.0  |  2026-07-16</w:t>
+        <w:t>版本 0.12.0  |  2026-07-17</w:t>
       </w:r>
     </w:p>
     <w:p>
@@ -243,7 +243,7 @@
                 <w:rFonts w:ascii="Calibri" w:hAnsi="Calibri" w:eastAsia="Microsoft YaHei"/>
                 <w:sz w:val="18"/>
               </w:rPr>
-              <w:t>0.11.0</w:t>
+              <w:t>0.12.0</w:t>
             </w:r>
           </w:p>
         </w:tc>
@@ -298,7 +298,7 @@
                 <w:rFonts w:ascii="Calibri" w:hAnsi="Calibri" w:eastAsia="Microsoft YaHei"/>
                 <w:sz w:val="18"/>
               </w:rPr>
-              <w:t>2026-07-16</w:t>
+              <w:t>2026-07-17</w:t>
             </w:r>
           </w:p>
         </w:tc>
@@ -555,7 +555,7 @@
         <w:rPr>
           <w:rFonts w:ascii="Calibri" w:hAnsi="Calibri" w:eastAsia="Microsoft YaHei"/>
         </w:rPr>
-        <w:t>本手册对应 dterrain 0.11.0：在共享顶点安全删除基础上，新增原子批量约束事务，一次提交多条新增、更新和删除并只重建一次；GUI 提供 12 条断裂线批量演示。真正局部拓扑更新和生产级 GPU LOD 属于后续阶段。</w:t>
+        <w:t>本手册对应 dterrain 0.12.0：新增等高线折点/加密样本反向生成普通 TIN 和 GRID，并保留 v0.11 原子批量约束事务。反向转换是近似重建，不强制原等高线成为普通 TIN 网边；真正局部 CDT 更新和生产级 GPU LOD 属于后续阶段。</w:t>
       </w:r>
     </w:p>
     <w:p>
@@ -656,7 +656,7 @@
         <w:rPr>
           <w:rFonts w:ascii="Calibri" w:hAnsi="Calibri" w:eastAsia="Microsoft YaHei"/>
         </w:rPr>
-        <w:t>TIN→GRID、GRID→TIN，以及 TIN/GRID→等高线和 DCONTOUR 文本往返。</w:t>
+        <w:t>TIN→GRID、GRID→TIN、TIN/GRID→等高线，以及等高线→TIN/GRID 近似重建。</w:t>
       </w:r>
     </w:p>
     <w:p>
@@ -1157,7 +1157,7 @@
                 <w:rFonts w:ascii="Calibri" w:hAnsi="Calibri" w:eastAsia="Microsoft YaHei"/>
                 <w:sz w:val="18"/>
               </w:rPr>
-              <w:t>等高线是派生表达；当前尚未实现等高线反推 TIN/GRID。</w:t>
+              <w:t>等高线反推只能由有限折点近似恢复表面；普通 TIN 不强制保留原折线边。</w:t>
             </w:r>
           </w:p>
         </w:tc>
@@ -1186,7 +1186,7 @@
         <w:rPr>
           <w:rFonts w:ascii="Calibri" w:hAnsi="Calibri" w:eastAsia="Microsoft YaHei"/>
         </w:rPr>
-        <w:t>GRID→TIN 仍重建普通 Delaunay；严格边界和孔洞应使用独立 dt_cdt_handle。v0.11 单项约束编辑仍采用候选网全量重建；批量事务把 N 次重建降为 1 次，但尚未达到百万点实时局部 CDT 编辑。</w:t>
+        <w:t>GRID→TIN 和等高线→TIN 都重建普通 Delaunay；严格折线、边界和孔洞应使用独立 dt_cdt_handle。v0.12 单项约束编辑仍采用候选网全量重建；批量事务把 N 次重建降为 1 次，但尚未达到百万点实时局部 CDT 编辑。</w:t>
       </w:r>
     </w:p>
     <w:p>
@@ -1335,7 +1335,7 @@
           <w:rFonts w:ascii="Consolas" w:hAnsi="Consolas" w:eastAsia="Microsoft YaHei"/>
           <w:sz w:val="17"/>
         </w:rPr>
-        <w:t>GRID &lt;---- 转换引擎 ----&gt; TIN ----&gt; 等高线</w:t>
+        <w:t>GRID &lt;---- 转换引擎 ----&gt; TIN &lt;----&gt; 等高线</w:t>
       </w:r>
       <w:r>
         <w:br/>
@@ -5998,6 +5998,107 @@
         <w:t>dt_grid_destroy(grid);</w:t>
       </w:r>
     </w:p>
+    <w:p>
+      <w:r>
+        <w:rPr>
+          <w:rFonts w:ascii="Calibri" w:hAnsi="Calibri" w:eastAsia="Microsoft YaHei"/>
+        </w:rPr>
+        <w:t>v0.12 可把等高线的 LINE elevation 作为权威高程，以折点或按最大段长加密后的样本重建普通 TIN，并可直接插值 GRID。重复 XY 高程一致时合并，冲突时整次转换失败且原 TIN 不变。</w:t>
+      </w:r>
+    </w:p>
+    <w:p>
+      <w:pPr>
+        <w:pStyle w:val="DterrainCode"/>
+        <w:shd w:fill="F2F4F7"/>
+      </w:pPr>
+      <w:r>
+        <w:rPr>
+          <w:rFonts w:ascii="Consolas" w:hAnsi="Consolas" w:eastAsia="Microsoft YaHei"/>
+          <w:sz w:val="17"/>
+        </w:rPr>
+        <w:t>dt_contours_to_tin_options sampling{};</w:t>
+      </w:r>
+      <w:r>
+        <w:br/>
+      </w:r>
+      <w:r>
+        <w:rPr>
+          <w:rFonts w:ascii="Consolas" w:hAnsi="Consolas" w:eastAsia="Microsoft YaHei"/>
+          <w:sz w:val="17"/>
+        </w:rPr>
+        <w:t>sampling.struct_size = sizeof(sampling);</w:t>
+      </w:r>
+      <w:r>
+        <w:br/>
+      </w:r>
+      <w:r>
+        <w:rPr>
+          <w:rFonts w:ascii="Consolas" w:hAnsi="Consolas" w:eastAsia="Microsoft YaHei"/>
+          <w:sz w:val="17"/>
+        </w:rPr>
+        <w:t>sampling.maximum_segment_length = 5.0; // 0: 只用原折点</w:t>
+      </w:r>
+      <w:r>
+        <w:br/>
+      </w:r>
+      <w:r>
+        <w:rPr>
+          <w:rFonts w:ascii="Consolas" w:hAnsi="Consolas" w:eastAsia="Microsoft YaHei"/>
+          <w:sz w:val="17"/>
+        </w:rPr>
+        <w:t>sampling.merge_tolerance = 1.0e-8;      // 0: 只合并完全相同 XY</w:t>
+      </w:r>
+      <w:r>
+        <w:br/>
+      </w:r>
+      <w:r>
+        <w:rPr>
+          <w:rFonts w:ascii="Consolas" w:hAnsi="Consolas" w:eastAsia="Microsoft YaHei"/>
+          <w:sz w:val="17"/>
+        </w:rPr>
+      </w:r>
+      <w:r>
+        <w:br/>
+      </w:r>
+      <w:r>
+        <w:rPr>
+          <w:rFonts w:ascii="Consolas" w:hAnsi="Consolas" w:eastAsia="Microsoft YaHei"/>
+          <w:sz w:val="17"/>
+        </w:rPr>
+        <w:t>dt_tin_from_contours(contours, &amp;sampling, mesh);</w:t>
+      </w:r>
+      <w:r>
+        <w:br/>
+      </w:r>
+      <w:r>
+        <w:rPr>
+          <w:rFonts w:ascii="Consolas" w:hAnsi="Consolas" w:eastAsia="Microsoft YaHei"/>
+          <w:sz w:val="17"/>
+        </w:rPr>
+        <w:t>dt_grid_from_contours(contours, &amp;sampling, &amp;options, &amp;grid);</w:t>
+      </w:r>
+    </w:p>
+    <w:p>
+      <w:pPr>
+        <w:spacing w:before="100" w:after="160" w:line="288" w:lineRule="auto"/>
+        <w:ind w:left="230" w:right="230"/>
+        <w:shd w:fill="FFF7E0"/>
+      </w:pPr>
+      <w:r>
+        <w:rPr>
+          <w:rFonts w:ascii="Calibri" w:hAnsi="Calibri" w:eastAsia="Microsoft YaHei"/>
+          <w:b/>
+          <w:color w:val="7A5A00"/>
+        </w:rPr>
+        <w:t xml:space="preserve">反向转换边界  </w:t>
+      </w:r>
+      <w:r>
+        <w:rPr>
+          <w:rFonts w:ascii="Calibri" w:hAnsi="Calibri" w:eastAsia="Microsoft YaHei"/>
+        </w:rPr>
+        <w:t>等高线之间的极值和曲面细节已经丢失，不能唯一恢复。输出是普通 Delaunay，原等高线段不保证成为网边；硬折线应使用 CDT。</w:t>
+      </w:r>
+    </w:p>
     <w:tbl>
       <w:tblPr>
         <w:tblStyle w:val="TableGrid"/>
@@ -6235,7 +6336,7 @@
                 <w:rFonts w:ascii="Calibri" w:hAnsi="Calibri" w:eastAsia="Microsoft YaHei"/>
                 <w:sz w:val="18"/>
               </w:rPr>
-              <w:t>TIN/GRID 同步转换和等高线生成</w:t>
+              <w:t>TIN/GRID/等高线同步转换与近似重建</w:t>
             </w:r>
           </w:p>
         </w:tc>
@@ -7331,18 +7432,12 @@
         </w:rPr>
         <w:t>}</w:t>
       </w:r>
-      <w:r>
-        <w:br/>
-      </w:r>
-      <w:r>
-        <w:rPr>
-          <w:rFonts w:ascii="Consolas" w:hAnsi="Consolas" w:eastAsia="Microsoft YaHei"/>
-          <w:sz w:val="17"/>
-        </w:rPr>
-      </w:r>
-      <w:r>
-        <w:br/>
-      </w:r>
+    </w:p>
+    <w:p>
+      <w:pPr>
+        <w:pStyle w:val="DterrainCode"/>
+        <w:shd w:fill="F2F4F7"/>
+      </w:pPr>
       <w:r>
         <w:rPr>
           <w:rFonts w:ascii="Consolas" w:hAnsi="Consolas" w:eastAsia="Microsoft YaHei"/>
@@ -7984,7 +8079,7 @@
         <w:rPr>
           <w:rFonts w:ascii="Calibri" w:hAnsi="Calibri" w:eastAsia="Microsoft YaHei"/>
         </w:rPr>
-        <w:t>v0.11 单项约束编辑仍完整重建候选 CDT；批量事务只重建一次。100,000 基础点添加 12 条断裂线的本机对比为逐条 3.259 s、批量 0.528 s，约 6.17 倍。请求 output_effect 还会计算完整域差异。未分段交叉仍须先加入共享顶点。</w:t>
+        <w:t>v0.12 单项约束编辑仍完整重建候选 CDT；批量事务只重建一次。100,000 基础点添加 12 条断裂线的本机对比为逐条 3.259 s、批量 0.528 s，约 6.17 倍。请求 output_effect 还会计算完整域差异。未分段交叉仍须先加入共享顶点。</w:t>
       </w:r>
     </w:p>
     <w:p>
@@ -12325,7 +12420,7 @@
         <w:rPr>
           <w:rFonts w:ascii="Calibri" w:hAnsi="Calibri" w:eastAsia="Microsoft YaHei"/>
         </w:rPr>
-        <w:t>测试覆盖生命周期、普通 TIN 动态编辑、DTIN/DTMESH/XYZ、TIN/GRID/等高线、异步任务，以及 CDT 空网清理、外边界、孔洞、断裂线、交叉失败原子性、TIN→CDT、域内采样、CDT→GRID/等高线、共享顶点保护、批量新增/更新/删除、整批失败回滚和 DCDT 往返。GDAL 构建还执行 GTiff、COG、GPKG 驱动探测和真实文件往返。</w:t>
+        <w:t>测试覆盖生命周期、普通 TIN 动态编辑、DTIN/DTMESH/XYZ、TIN/GRID/等高线、等高线反向重建与高程冲突回滚、异步任务，以及 CDT 空网清理、外边界、孔洞、断裂线、交叉失败原子性、TIN→CDT、域内采样、CDT→GRID/等高线、共享顶点保护、批量新增/更新/删除、整批失败回滚和 DCDT 往返。GDAL 构建还执行 GTiff、COG、GPKG 驱动探测和真实文件往返。</w:t>
       </w:r>
     </w:p>
     <w:p>
@@ -13031,7 +13126,7 @@
         <w:color w:val="66727D"/>
         <w:sz w:val="18"/>
       </w:rPr>
-      <w:t xml:space="preserve">版本 0.11.0  |  第 </w:t>
+      <w:t xml:space="preserve">版本 0.12.0  |  第 </w:t>
     </w:r>
     <w:r>
       <w:rPr>

</xml_diff>

<commit_message>
feat: add GDAL exchange to GUI
</commit_message>
<xml_diff>
--- a/docs/manuals/dterrain_DLL开发使用手册.docx
+++ b/docs/manuals/dterrain_DLL开发使用手册.docx
@@ -85,7 +85,7 @@
           <w:color w:val="203748"/>
           <w:sz w:val="22"/>
         </w:rPr>
-        <w:t>版本 0.12.0  |  2026-07-17</w:t>
+        <w:t>版本 0.13.0  |  2026-07-17</w:t>
       </w:r>
     </w:p>
     <w:p>
@@ -243,7 +243,7 @@
                 <w:rFonts w:ascii="Calibri" w:hAnsi="Calibri" w:eastAsia="Microsoft YaHei"/>
                 <w:sz w:val="18"/>
               </w:rPr>
-              <w:t>0.12.0</w:t>
+              <w:t>0.13.0</w:t>
             </w:r>
           </w:p>
         </w:tc>
@@ -555,7 +555,7 @@
         <w:rPr>
           <w:rFonts w:ascii="Calibri" w:hAnsi="Calibri" w:eastAsia="Microsoft YaHei"/>
         </w:rPr>
-        <w:t>本手册对应 dterrain 0.12.0：新增等高线折点/加密样本反向生成普通 TIN 和 GRID，并保留 v0.11 原子批量约束事务。反向转换是近似重建，不强制原等高线成为普通 TIN 网边；真正局部 CDT 更新和生产级 GPU LOD 属于后续阶段。</w:t>
+        <w:t>本手册对应 dterrain 0.13.0：Win32 GUI 已接入 GeoTIFF/COG GRID 与 GeoPackage 等高线交换，并保留等高线反向转换和原子批量约束事务。GDAL 菜单按运行环境驱动能力启用；真正局部 CDT 更新和生产级 GPU LOD 属于后续阶段。</w:t>
       </w:r>
     </w:p>
     <w:p>
@@ -1186,7 +1186,7 @@
         <w:rPr>
           <w:rFonts w:ascii="Calibri" w:hAnsi="Calibri" w:eastAsia="Microsoft YaHei"/>
         </w:rPr>
-        <w:t>GRID→TIN 和等高线→TIN 都重建普通 Delaunay；严格折线、边界和孔洞应使用独立 dt_cdt_handle。v0.12 单项约束编辑仍采用候选网全量重建；批量事务把 N 次重建降为 1 次，但尚未达到百万点实时局部 CDT 编辑。</w:t>
+        <w:t>GRID→TIN 和等高线→TIN 都重建普通 Delaunay；严格折线、边界和孔洞应使用独立 dt_cdt_handle。v0.13 单项约束编辑仍采用候选网全量重建；批量事务把 N 次重建降为 1 次，但尚未达到百万点实时局部 CDT 编辑。</w:t>
       </w:r>
     </w:p>
     <w:p>
@@ -7194,6 +7194,27 @@
           <w:rFonts w:ascii="Calibri" w:hAnsi="Calibri" w:eastAsia="Microsoft YaHei"/>
         </w:rPr>
         <w:t>启用 GDAL 的便携目录必须携带构建目录复制出的 GDAL、PROJ、SQLite、GeoTIFF 等运行时 DLL，以及 DLL 同级 share/proj/proj.db。COG 使用 CreateCopy，会比普通 GTiff 需要更多临时内存/存储。</w:t>
+      </w:r>
+    </w:p>
+    <w:p>
+      <w:pPr>
+        <w:spacing w:before="100" w:after="160" w:line="288" w:lineRule="auto"/>
+        <w:ind w:left="230" w:right="230"/>
+        <w:shd w:fill="E8EEF5"/>
+      </w:pPr>
+      <w:r>
+        <w:rPr>
+          <w:rFonts w:ascii="Calibri" w:hAnsi="Calibri" w:eastAsia="Microsoft YaHei"/>
+          <w:b/>
+          <w:color w:val="1F4D78"/>
+        </w:rPr>
+        <w:t xml:space="preserve">GUI 集成  </w:t>
+      </w:r>
+      <w:r>
+        <w:rPr>
+          <w:rFonts w:ascii="Calibri" w:hAnsi="Calibri" w:eastAsia="Microsoft YaHei"/>
+        </w:rPr>
+        <w:t>v0.13 的演示程序启动时探测 GTiff、COG、GPKG 驱动，按能力启用五个数据交换菜单。栅格导入只替换 GRID，GeoPackage 导入只替换等高线，普通 TIN、CDT 和无关图层保持不变。</w:t>
       </w:r>
     </w:p>
     <w:p>
@@ -13126,7 +13147,7 @@
         <w:color w:val="66727D"/>
         <w:sz w:val="18"/>
       </w:rPr>
-      <w:t xml:space="preserve">版本 0.12.0  |  第 </w:t>
+      <w:t xml:space="preserve">版本 0.13.0  |  第 </w:t>
     </w:r>
     <w:r>
       <w:rPr>

</xml_diff>

<commit_message>
feat: add terrain profile analysis
</commit_message>
<xml_diff>
--- a/docs/manuals/dterrain_DLL开发使用手册.docx
+++ b/docs/manuals/dterrain_DLL开发使用手册.docx
@@ -85,7 +85,7 @@
           <w:color w:val="203748"/>
           <w:sz w:val="22"/>
         </w:rPr>
-        <w:t>版本 0.13.0  |  2026-07-17</w:t>
+        <w:t>版本 0.14.0  |  2026-07-17</w:t>
       </w:r>
     </w:p>
     <w:p>
@@ -243,7 +243,7 @@
                 <w:rFonts w:ascii="Calibri" w:hAnsi="Calibri" w:eastAsia="Microsoft YaHei"/>
                 <w:sz w:val="18"/>
               </w:rPr>
-              <w:t>0.13.0</w:t>
+              <w:t>0.14.0</w:t>
             </w:r>
           </w:p>
         </w:tc>
@@ -555,7 +555,7 @@
         <w:rPr>
           <w:rFonts w:ascii="Calibri" w:hAnsi="Calibri" w:eastAsia="Microsoft YaHei"/>
         </w:rPr>
-        <w:t>本手册对应 dterrain 0.13.0：Win32 GUI 已接入 GeoTIFF/COG GRID 与 GeoPackage 等高线交换，并保留等高线反向转换和原子批量约束事务。GDAL 菜单按运行环境驱动能力启用；真正局部 CDT 更新和生产级 GPU LOD 属于后续阶段。</w:t>
+        <w:t>本手册对应 dterrain 0.14.0：Win32 GUI 已接入任意直线剖面分析及 CSV 导出，并保留 GeoTIFF/COG、GeoPackage、等高线反向转换和原子批量约束事务。剖面复用既有稳定 ABI；真正局部 CDT 更新和生产级 GPU LOD 属于后续阶段。</w:t>
       </w:r>
     </w:p>
     <w:p>
@@ -624,6 +624,17 @@
           <w:rFonts w:ascii="Calibri" w:hAnsi="Calibri" w:eastAsia="Microsoft YaHei"/>
         </w:rPr>
         <w:t>最近顶点、点定位、矩形范围三角形查询、统计与完整校验。</w:t>
+      </w:r>
+    </w:p>
+    <w:p>
+      <w:pPr>
+        <w:pStyle w:val="ListBullet"/>
+      </w:pPr>
+      <w:r>
+        <w:rPr>
+          <w:rFonts w:ascii="Calibri" w:hAnsi="Calibri" w:eastAsia="Microsoft YaHei"/>
+        </w:rPr>
+        <w:t>GUI 两点定义任意地形剖面，固定 CDT/TIN/GRID 数据源采样、统计并导出 CSV。</w:t>
       </w:r>
     </w:p>
     <w:p>
@@ -1186,7 +1197,7 @@
         <w:rPr>
           <w:rFonts w:ascii="Calibri" w:hAnsi="Calibri" w:eastAsia="Microsoft YaHei"/>
         </w:rPr>
-        <w:t>GRID→TIN 和等高线→TIN 都重建普通 Delaunay；严格折线、边界和孔洞应使用独立 dt_cdt_handle。v0.13 单项约束编辑仍采用候选网全量重建；批量事务把 N 次重建降为 1 次，但尚未达到百万点实时局部 CDT 编辑。</w:t>
+        <w:t>GRID→TIN 和等高线→TIN 都重建普通 Delaunay；严格折线、边界和孔洞应使用独立 dt_cdt_handle。v0.14 单项约束编辑仍采用候选网全量重建；批量事务把 N 次重建降为 1 次，但尚未达到百万点实时局部 CDT 编辑。</w:t>
       </w:r>
     </w:p>
     <w:p>
@@ -12441,7 +12452,7 @@
         <w:rPr>
           <w:rFonts w:ascii="Calibri" w:hAnsi="Calibri" w:eastAsia="Microsoft YaHei"/>
         </w:rPr>
-        <w:t>测试覆盖生命周期、普通 TIN 动态编辑、DTIN/DTMESH/XYZ、TIN/GRID/等高线、等高线反向重建与高程冲突回滚、异步任务，以及 CDT 空网清理、外边界、孔洞、断裂线、交叉失败原子性、TIN→CDT、域内采样、CDT→GRID/等高线、共享顶点保护、批量新增/更新/删除、整批失败回滚和 DCDT 往返。GDAL 构建还执行 GTiff、COG、GPKG 驱动探测和真实文件往返。</w:t>
+        <w:t>测试覆盖生命周期、普通 TIN 动态编辑、DTIN/DTMESH/XYZ、TIN/GRID/等高线、等高线反向重建与高程冲突回滚、异步任务，以及 CDT 空网清理、外边界、孔洞、断裂线、交叉失败原子性、TIN→CDT、域内采样、CDT→GRID/等高线、共享顶点保护、批量新增/更新/删除、整批失败回滚和 DCDT 往返。独立剖面数学测试覆盖线性采样、三角形高程、旋转仿射 GRID 双线性插值、NoData 断点和升降/坡度统计；GDAL 构建还执行 GTiff、COG、GPKG 驱动探测和真实文件往返。</w:t>
       </w:r>
     </w:p>
     <w:p>
@@ -13147,7 +13158,7 @@
         <w:color w:val="66727D"/>
         <w:sz w:val="18"/>
       </w:rPr>
-      <w:t xml:space="preserve">版本 0.13.0  |  第 </w:t>
+      <w:t xml:space="preserve">版本 0.14.0  |  第 </w:t>
     </w:r>
     <w:r>
       <w:rPr>

</xml_diff>

<commit_message>
feat: add polygon earthwork measurement
</commit_message>
<xml_diff>
--- a/docs/manuals/dterrain_DLL开发使用手册.docx
+++ b/docs/manuals/dterrain_DLL开发使用手册.docx
@@ -85,7 +85,7 @@
           <w:color w:val="203748"/>
           <w:sz w:val="22"/>
         </w:rPr>
-        <w:t>版本 0.14.0  |  2026-07-17</w:t>
+        <w:t>版本 0.15.0  |  2026-07-17</w:t>
       </w:r>
     </w:p>
     <w:p>
@@ -243,7 +243,7 @@
                 <w:rFonts w:ascii="Calibri" w:hAnsi="Calibri" w:eastAsia="Microsoft YaHei"/>
                 <w:sz w:val="18"/>
               </w:rPr>
-              <w:t>0.14.0</w:t>
+              <w:t>0.15.0</w:t>
             </w:r>
           </w:p>
         </w:tc>
@@ -555,7 +555,7 @@
         <w:rPr>
           <w:rFonts w:ascii="Calibri" w:hAnsi="Calibri" w:eastAsia="Microsoft YaHei"/>
         </w:rPr>
-        <w:t>本手册对应 dterrain 0.14.0：Win32 GUI 已接入任意直线剖面分析及 CSV 导出，并保留 GeoTIFF/COG、GeoPackage、等高线反向转换和原子批量约束事务。剖面复用既有稳定 ABI；真正局部 CDT 更新和生产级 GPU LOD 属于后续阶段。</w:t>
+        <w:t>本手册对应 dterrain 0.15.0：Win32 GUI 已接入任意直线剖面、多边形面积/水平基准面土方量测及 CSV 导出，并保留 GeoTIFF/COG、GeoPackage、等高线反向转换和原子批量约束事务。两类分析复用既有稳定 ABI；工程级双表面土方、真正局部 CDT 更新和生产级 GPU LOD 属于后续阶段。</w:t>
       </w:r>
     </w:p>
     <w:p>
@@ -635,6 +635,17 @@
           <w:rFonts w:ascii="Calibri" w:hAnsi="Calibri" w:eastAsia="Microsoft YaHei"/>
         </w:rPr>
         <w:t>GUI 两点定义任意地形剖面，固定 CDT/TIN/GRID 数据源采样、统计并导出 CSV。</w:t>
+      </w:r>
+    </w:p>
+    <w:p>
+      <w:pPr>
+        <w:pStyle w:val="ListBullet"/>
+      </w:pPr>
+      <w:r>
+        <w:rPr>
+          <w:rFonts w:ascii="Calibri" w:hAnsi="Calibri" w:eastAsia="Microsoft YaHei"/>
+        </w:rPr>
+        <w:t>GUI 逐点圈定简单多边形，计算平面量并数值估算地表面积和水平基准面挖填方。</w:t>
       </w:r>
     </w:p>
     <w:p>
@@ -1197,7 +1208,7 @@
         <w:rPr>
           <w:rFonts w:ascii="Calibri" w:hAnsi="Calibri" w:eastAsia="Microsoft YaHei"/>
         </w:rPr>
-        <w:t>GRID→TIN 和等高线→TIN 都重建普通 Delaunay；严格折线、边界和孔洞应使用独立 dt_cdt_handle。v0.14 单项约束编辑仍采用候选网全量重建；批量事务把 N 次重建降为 1 次，但尚未达到百万点实时局部 CDT 编辑。</w:t>
+        <w:t>GRID→TIN 和等高线→TIN 都重建普通 Delaunay；严格折线、边界和孔洞应使用独立 dt_cdt_handle。v0.15 单项约束编辑仍采用候选网全量重建；批量事务把 N 次重建降为 1 次，但尚未达到百万点实时局部 CDT 编辑。GUI 土方量测针对水平基准面并使用固定预算数值积分，不等同于工程结算。</w:t>
       </w:r>
     </w:p>
     <w:p>
@@ -12452,7 +12463,7 @@
         <w:rPr>
           <w:rFonts w:ascii="Calibri" w:hAnsi="Calibri" w:eastAsia="Microsoft YaHei"/>
         </w:rPr>
-        <w:t>测试覆盖生命周期、普通 TIN 动态编辑、DTIN/DTMESH/XYZ、TIN/GRID/等高线、等高线反向重建与高程冲突回滚、异步任务，以及 CDT 空网清理、外边界、孔洞、断裂线、交叉失败原子性、TIN→CDT、域内采样、CDT→GRID/等高线、共享顶点保护、批量新增/更新/删除、整批失败回滚和 DCDT 往返。独立剖面数学测试覆盖线性采样、三角形高程、旋转仿射 GRID 双线性插值、NoData 断点和升降/坡度统计；GDAL 构建还执行 GTiff、COG、GPKG 驱动探测和真实文件往返。</w:t>
+        <w:t>测试覆盖生命周期、普通 TIN 动态编辑、DTIN/DTMESH/XYZ、TIN/GRID/等高线、等高线反向重建与高程冲突回滚、异步任务，以及 CDT 空网清理、外边界、孔洞、断裂线、交叉失败原子性、TIN→CDT、域内采样、CDT→GRID/等高线、共享顶点保护、批量新增/更新/删除、整批失败回滚和 DCDT 往返。独立剖面数学测试覆盖线性采样、三角形高程、旋转仿射 GRID 双线性插值、NoData 断点和升降/坡度统计；多边形量测测试覆盖凹多边形耳切、大坐标面积稳定性、自相交拒绝、平面解析结果、挖填符号和部分/完全无效域。GDAL 构建还执行 GTiff、COG、GPKG 驱动探测和真实文件往返。</w:t>
       </w:r>
     </w:p>
     <w:p>
@@ -13158,7 +13169,7 @@
         <w:color w:val="66727D"/>
         <w:sz w:val="18"/>
       </w:rPr>
-      <w:t xml:space="preserve">版本 0.14.0  |  第 </w:t>
+      <w:t xml:space="preserve">版本 0.15.0  |  第 </w:t>
     </w:r>
     <w:r>
       <w:rPr>

</xml_diff>

<commit_message>
feat: add terrain slope and aspect analysis
</commit_message>
<xml_diff>
--- a/docs/manuals/dterrain_DLL开发使用手册.docx
+++ b/docs/manuals/dterrain_DLL开发使用手册.docx
@@ -85,7 +85,7 @@
           <w:color w:val="203748"/>
           <w:sz w:val="22"/>
         </w:rPr>
-        <w:t>版本 0.15.0  |  2026-07-17</w:t>
+        <w:t>版本 0.16.0  |  2026-07-17</w:t>
       </w:r>
     </w:p>
     <w:p>
@@ -243,7 +243,7 @@
                 <w:rFonts w:ascii="Calibri" w:hAnsi="Calibri" w:eastAsia="Microsoft YaHei"/>
                 <w:sz w:val="18"/>
               </w:rPr>
-              <w:t>0.15.0</w:t>
+              <w:t>0.16.0</w:t>
             </w:r>
           </w:p>
         </w:tc>
@@ -463,7 +463,7 @@
                 <w:rFonts w:ascii="Calibri" w:hAnsi="Calibri" w:eastAsia="Microsoft YaHei"/>
                 <w:sz w:val="18"/>
               </w:rPr>
-              <w:t>架构、构建部署、稳定 C ABI、约束 Delaunay、GRID/等高线转换、GDAL 格式交换、异步任务、12 个兼容接口、文件格式、性能、线程安全、故障排查。</w:t>
+              <w:t>架构、构建部署、稳定 C ABI、坡度/坡向/法向分析、约束 Delaunay、GRID/等高线转换、GDAL 格式交换、异步任务、12 个兼容接口、文件格式、性能、线程安全、故障排查。</w:t>
             </w:r>
           </w:p>
         </w:tc>
@@ -555,7 +555,7 @@
         <w:rPr>
           <w:rFonts w:ascii="Calibri" w:hAnsi="Calibri" w:eastAsia="Microsoft YaHei"/>
         </w:rPr>
-        <w:t>本手册对应 dterrain 0.15.0：Win32 GUI 已接入任意直线剖面、多边形面积/水平基准面土方量测及 CSV 导出，并保留 GeoTIFF/COG、GeoPackage、等高线反向转换和原子批量约束事务。两类分析复用既有稳定 ABI；工程级双表面土方、真正局部 CDT 更新和生产级 GPU LOD 属于后续阶段。</w:t>
+        <w:t>本手册对应 dterrain 0.16.0：稳定 C ABI 已统一支持普通 TIN、约束 CDT 和仿射 GRID 的坡度、下坡坡向与单位法向分析；Win32 GUI 可单击显示支撑单元、下坡箭头和数值面板，并保留剖面、面积/土方、GDAL 交换、等高线反向转换和原子批量约束事务。工程级双表面土方、真正局部 CDT 更新和生产级 GPU LOD 属于后续阶段。</w:t>
       </w:r>
     </w:p>
     <w:p>
@@ -646,6 +646,17 @@
           <w:rFonts w:ascii="Calibri" w:hAnsi="Calibri" w:eastAsia="Microsoft YaHei"/>
         </w:rPr>
         <w:t>GUI 逐点圈定简单多边形，计算平面量并数值估算地表面积和水平基准面挖填方。</w:t>
+      </w:r>
+    </w:p>
+    <w:p>
+      <w:pPr>
+        <w:pStyle w:val="ListBullet"/>
+      </w:pPr>
+      <w:r>
+        <w:rPr>
+          <w:rFonts w:ascii="Calibri" w:hAnsi="Calibri" w:eastAsia="Microsoft YaHei"/>
+        </w:rPr>
+        <w:t>普通 TIN、约束 CDT 和仿射 GRID 统一返回局部高程梯度、坡度、下坡坡向、单位法向与支撑单元。</w:t>
       </w:r>
     </w:p>
     <w:p>
@@ -1208,7 +1219,7 @@
         <w:rPr>
           <w:rFonts w:ascii="Calibri" w:hAnsi="Calibri" w:eastAsia="Microsoft YaHei"/>
         </w:rPr>
-        <w:t>GRID→TIN 和等高线→TIN 都重建普通 Delaunay；严格折线、边界和孔洞应使用独立 dt_cdt_handle。v0.15 单项约束编辑仍采用候选网全量重建；批量事务把 N 次重建降为 1 次，但尚未达到百万点实时局部 CDT 编辑。GUI 土方量测针对水平基准面并使用固定预算数值积分，不等同于工程结算。</w:t>
+        <w:t>GRID→TIN 和等高线→TIN 都重建普通 Delaunay；严格折线、边界和孔洞应使用独立 dt_cdt_handle。v0.16 单项约束编辑仍采用候选网全量重建；批量事务把 N 次重建降为 1 次，但尚未达到百万点实时局部 CDT 编辑。GUI 土方量测针对水平基准面并使用固定预算数值积分，不等同于工程结算。</w:t>
       </w:r>
     </w:p>
     <w:p>
@@ -8122,7 +8133,548 @@
         <w:rPr>
           <w:rFonts w:ascii="Calibri" w:hAnsi="Calibri" w:eastAsia="Microsoft YaHei"/>
         </w:rPr>
-        <w:t>v0.12 单项约束编辑仍完整重建候选 CDT；批量事务只重建一次。100,000 基础点添加 12 条断裂线的本机对比为逐条 3.259 s、批量 0.528 s，约 6.17 倍。请求 output_effect 还会计算完整域差异。未分段交叉仍须先加入共享顶点。</w:t>
+        <w:t>v0.16 单项约束编辑仍完整重建候选 CDT；批量事务只重建一次。100,000 基础点添加 12 条断裂线的本机对比为逐条 3.259 s、批量 0.528 s，约 6.17 倍。请求 output_effect 还会计算完整域差异。未分段交叉仍须先加入共享顶点。</w:t>
+      </w:r>
+    </w:p>
+    <w:p>
+      <w:pPr>
+        <w:pStyle w:val="Heading2"/>
+      </w:pPr>
+      <w:r>
+        <w:t>4.9 坡度、坡向与地形法向</w:t>
+      </w:r>
+    </w:p>
+    <w:p>
+      <w:r>
+        <w:rPr>
+          <w:rFonts w:ascii="Calibri" w:hAnsi="Calibri" w:eastAsia="Microsoft YaHei"/>
+        </w:rPr>
+        <w:t>v0.16 由普通 TIN、约束 CDT 和仿射 GRID 共用 dt_surface_analysis 结果结构。三个入口分别是 dt_analyze_tin_surface_xy()、dt_cdt_analyze_surface_xy() 和 dt_grid_analyze_surface_xy()；查询 Z 被忽略，成功结果给出插值 Z、世界 XY 梯度、坡度角、下坡坡向、向上单位法向和实际支撑点。接口只写调用方结构，不分配跨 DLL 内存。</w:t>
+      </w:r>
+    </w:p>
+    <w:p>
+      <w:pPr>
+        <w:pStyle w:val="DterrainCode"/>
+        <w:shd w:fill="F2F4F7"/>
+      </w:pPr>
+      <w:r>
+        <w:rPr>
+          <w:rFonts w:ascii="Consolas" w:hAnsi="Consolas" w:eastAsia="Microsoft YaHei"/>
+          <w:sz w:val="17"/>
+        </w:rPr>
+        <w:t>dt_surface_analysis a{};</w:t>
+      </w:r>
+      <w:r>
+        <w:br/>
+      </w:r>
+      <w:r>
+        <w:rPr>
+          <w:rFonts w:ascii="Consolas" w:hAnsi="Consolas" w:eastAsia="Microsoft YaHei"/>
+          <w:sz w:val="17"/>
+        </w:rPr>
+        <w:t>dt_point3 q{500000.0, 3200000.0, 0.0};</w:t>
+      </w:r>
+      <w:r>
+        <w:br/>
+      </w:r>
+      <w:r>
+        <w:rPr>
+          <w:rFonts w:ascii="Consolas" w:hAnsi="Consolas" w:eastAsia="Microsoft YaHei"/>
+          <w:sz w:val="17"/>
+        </w:rPr>
+        <w:t>dt_status s = dt_analyze_tin_surface_xy(tin, &amp;q, &amp;a);</w:t>
+      </w:r>
+      <w:r>
+        <w:br/>
+      </w:r>
+      <w:r>
+        <w:rPr>
+          <w:rFonts w:ascii="Consolas" w:hAnsi="Consolas" w:eastAsia="Microsoft YaHei"/>
+          <w:sz w:val="17"/>
+        </w:rPr>
+        <w:t>if (s == DT_OK) {</w:t>
+      </w:r>
+      <w:r>
+        <w:br/>
+      </w:r>
+      <w:r>
+        <w:rPr>
+          <w:rFonts w:ascii="Consolas" w:hAnsi="Consolas" w:eastAsia="Microsoft YaHei"/>
+          <w:sz w:val="17"/>
+        </w:rPr>
+        <w:t xml:space="preserve">    // a.slope_degrees: 相对水平面的坡度角</w:t>
+      </w:r>
+      <w:r>
+        <w:br/>
+      </w:r>
+      <w:r>
+        <w:rPr>
+          <w:rFonts w:ascii="Consolas" w:hAnsi="Consolas" w:eastAsia="Microsoft YaHei"/>
+          <w:sz w:val="17"/>
+        </w:rPr>
+        <w:t xml:space="preserve">    // a.aspect_degrees: 从 +Y 北向顺时针的下坡坡向</w:t>
+      </w:r>
+      <w:r>
+        <w:br/>
+      </w:r>
+      <w:r>
+        <w:rPr>
+          <w:rFonts w:ascii="Consolas" w:hAnsi="Consolas" w:eastAsia="Microsoft YaHei"/>
+          <w:sz w:val="17"/>
+        </w:rPr>
+        <w:t xml:space="preserve">    // a.normal_*: 指向上方的单位法向</w:t>
+      </w:r>
+      <w:r>
+        <w:br/>
+      </w:r>
+      <w:r>
+        <w:rPr>
+          <w:rFonts w:ascii="Consolas" w:hAnsi="Consolas" w:eastAsia="Microsoft YaHei"/>
+          <w:sz w:val="17"/>
+        </w:rPr>
+        <w:t>}</w:t>
+      </w:r>
+    </w:p>
+    <w:tbl>
+      <w:tblPr>
+        <w:tblStyle w:val="TableGrid"/>
+        <w:tblW w:type="dxa" w:w="9360"/>
+        <w:jc w:val="left"/>
+        <w:tblLayout w:type="fixed"/>
+        <w:tblLook w:firstColumn="1" w:firstRow="1" w:lastColumn="0" w:lastRow="0" w:noHBand="0" w:noVBand="1" w:val="04A0"/>
+        <w:tblInd w:w="120" w:type="dxa"/>
+      </w:tblPr>
+      <w:tblGrid>
+        <w:gridCol w:w="3100"/>
+        <w:gridCol w:w="6260"/>
+      </w:tblGrid>
+      <w:tr>
+        <w:trPr>
+          <w:cantSplit/>
+          <w:tblHeader w:val="true"/>
+        </w:trPr>
+        <w:tc>
+          <w:tcPr>
+            <w:tcW w:type="dxa" w:w="3100"/>
+            <w:shd w:fill="E8EEF5"/>
+            <w:tcMar>
+              <w:top w:w="80" w:type="dxa"/>
+              <w:start w:w="120" w:type="dxa"/>
+              <w:bottom w:w="80" w:type="dxa"/>
+              <w:end w:w="120" w:type="dxa"/>
+            </w:tcMar>
+            <w:vAlign w:val="center"/>
+          </w:tcPr>
+          <w:p>
+            <w:pPr>
+              <w:keepNext/>
+              <w:spacing w:before="0" w:after="0"/>
+              <w:jc w:val="center"/>
+            </w:pPr>
+            <w:r>
+              <w:rPr>
+                <w:rFonts w:ascii="Calibri" w:hAnsi="Calibri" w:eastAsia="Microsoft YaHei"/>
+                <w:b/>
+                <w:color w:val="203748"/>
+                <w:sz w:val="19"/>
+              </w:rPr>
+              <w:t>字段/标志</w:t>
+            </w:r>
+          </w:p>
+        </w:tc>
+        <w:tc>
+          <w:tcPr>
+            <w:tcW w:type="dxa" w:w="6260"/>
+            <w:shd w:fill="E8EEF5"/>
+            <w:tcMar>
+              <w:top w:w="80" w:type="dxa"/>
+              <w:start w:w="120" w:type="dxa"/>
+              <w:bottom w:w="80" w:type="dxa"/>
+              <w:end w:w="120" w:type="dxa"/>
+            </w:tcMar>
+            <w:vAlign w:val="center"/>
+          </w:tcPr>
+          <w:p>
+            <w:pPr>
+              <w:keepNext/>
+              <w:spacing w:before="0" w:after="0"/>
+              <w:jc w:val="center"/>
+            </w:pPr>
+            <w:r>
+              <w:rPr>
+                <w:rFonts w:ascii="Calibri" w:hAnsi="Calibri" w:eastAsia="Microsoft YaHei"/>
+                <w:b/>
+                <w:color w:val="203748"/>
+                <w:sz w:val="19"/>
+              </w:rPr>
+              <w:t>约定</w:t>
+            </w:r>
+          </w:p>
+        </w:tc>
+      </w:tr>
+      <w:tr>
+        <w:trPr>
+          <w:cantSplit/>
+        </w:trPr>
+        <w:tc>
+          <w:tcPr>
+            <w:tcW w:type="dxa" w:w="3100"/>
+            <w:tcMar>
+              <w:top w:w="80" w:type="dxa"/>
+              <w:start w:w="120" w:type="dxa"/>
+              <w:bottom w:w="80" w:type="dxa"/>
+              <w:end w:w="120" w:type="dxa"/>
+            </w:tcMar>
+            <w:vAlign w:val="center"/>
+          </w:tcPr>
+          <w:p>
+            <w:pPr>
+              <w:spacing w:before="0" w:after="0" w:line="276" w:lineRule="auto"/>
+              <w:jc w:val="left"/>
+            </w:pPr>
+            <w:r>
+              <w:rPr>
+                <w:rFonts w:ascii="Calibri" w:hAnsi="Calibri" w:eastAsia="Microsoft YaHei"/>
+                <w:sz w:val="18"/>
+              </w:rPr>
+              <w:t>dz_dx / dz_dy</w:t>
+            </w:r>
+          </w:p>
+        </w:tc>
+        <w:tc>
+          <w:tcPr>
+            <w:tcW w:type="dxa" w:w="6260"/>
+            <w:tcMar>
+              <w:top w:w="80" w:type="dxa"/>
+              <w:start w:w="120" w:type="dxa"/>
+              <w:bottom w:w="80" w:type="dxa"/>
+              <w:end w:w="120" w:type="dxa"/>
+            </w:tcMar>
+            <w:vAlign w:val="center"/>
+          </w:tcPr>
+          <w:p>
+            <w:pPr>
+              <w:spacing w:before="0" w:after="0" w:line="276" w:lineRule="auto"/>
+              <w:jc w:val="left"/>
+            </w:pPr>
+            <w:r>
+              <w:rPr>
+                <w:rFonts w:ascii="Calibri" w:hAnsi="Calibri" w:eastAsia="Microsoft YaHei"/>
+                <w:sz w:val="18"/>
+              </w:rPr>
+              <w:t>世界 XY 坐标中的局部高程梯度。</w:t>
+            </w:r>
+          </w:p>
+        </w:tc>
+      </w:tr>
+      <w:tr>
+        <w:trPr>
+          <w:cantSplit/>
+        </w:trPr>
+        <w:tc>
+          <w:tcPr>
+            <w:tcW w:type="dxa" w:w="3100"/>
+            <w:tcMar>
+              <w:top w:w="80" w:type="dxa"/>
+              <w:start w:w="120" w:type="dxa"/>
+              <w:bottom w:w="80" w:type="dxa"/>
+              <w:end w:w="120" w:type="dxa"/>
+            </w:tcMar>
+            <w:vAlign w:val="center"/>
+          </w:tcPr>
+          <w:p>
+            <w:pPr>
+              <w:spacing w:before="0" w:after="0" w:line="276" w:lineRule="auto"/>
+              <w:jc w:val="left"/>
+            </w:pPr>
+            <w:r>
+              <w:rPr>
+                <w:rFonts w:ascii="Calibri" w:hAnsi="Calibri" w:eastAsia="Microsoft YaHei"/>
+                <w:sz w:val="18"/>
+              </w:rPr>
+              <w:t>slope_degrees</w:t>
+            </w:r>
+          </w:p>
+        </w:tc>
+        <w:tc>
+          <w:tcPr>
+            <w:tcW w:type="dxa" w:w="6260"/>
+            <w:tcMar>
+              <w:top w:w="80" w:type="dxa"/>
+              <w:start w:w="120" w:type="dxa"/>
+              <w:bottom w:w="80" w:type="dxa"/>
+              <w:end w:w="120" w:type="dxa"/>
+            </w:tcMar>
+            <w:vAlign w:val="center"/>
+          </w:tcPr>
+          <w:p>
+            <w:pPr>
+              <w:spacing w:before="0" w:after="0" w:line="276" w:lineRule="auto"/>
+              <w:jc w:val="left"/>
+            </w:pPr>
+            <w:r>
+              <w:rPr>
+                <w:rFonts w:ascii="Calibri" w:hAnsi="Calibri" w:eastAsia="Microsoft YaHei"/>
+                <w:sz w:val="18"/>
+              </w:rPr>
+              <w:t>atan(hypot(dz_dx,dz_dy))，水平面为 0°。</w:t>
+            </w:r>
+          </w:p>
+        </w:tc>
+      </w:tr>
+      <w:tr>
+        <w:trPr>
+          <w:cantSplit/>
+        </w:trPr>
+        <w:tc>
+          <w:tcPr>
+            <w:tcW w:type="dxa" w:w="3100"/>
+            <w:tcMar>
+              <w:top w:w="80" w:type="dxa"/>
+              <w:start w:w="120" w:type="dxa"/>
+              <w:bottom w:w="80" w:type="dxa"/>
+              <w:end w:w="120" w:type="dxa"/>
+            </w:tcMar>
+            <w:vAlign w:val="center"/>
+          </w:tcPr>
+          <w:p>
+            <w:pPr>
+              <w:spacing w:before="0" w:after="0" w:line="276" w:lineRule="auto"/>
+              <w:jc w:val="left"/>
+            </w:pPr>
+            <w:r>
+              <w:rPr>
+                <w:rFonts w:ascii="Calibri" w:hAnsi="Calibri" w:eastAsia="Microsoft YaHei"/>
+                <w:sz w:val="18"/>
+              </w:rPr>
+              <w:t>aspect_degrees</w:t>
+            </w:r>
+          </w:p>
+        </w:tc>
+        <w:tc>
+          <w:tcPr>
+            <w:tcW w:type="dxa" w:w="6260"/>
+            <w:tcMar>
+              <w:top w:w="80" w:type="dxa"/>
+              <w:start w:w="120" w:type="dxa"/>
+              <w:bottom w:w="80" w:type="dxa"/>
+              <w:end w:w="120" w:type="dxa"/>
+            </w:tcMar>
+            <w:vAlign w:val="center"/>
+          </w:tcPr>
+          <w:p>
+            <w:pPr>
+              <w:spacing w:before="0" w:after="0" w:line="276" w:lineRule="auto"/>
+              <w:jc w:val="left"/>
+            </w:pPr>
+            <w:r>
+              <w:rPr>
+                <w:rFonts w:ascii="Calibri" w:hAnsi="Calibri" w:eastAsia="Microsoft YaHei"/>
+                <w:sz w:val="18"/>
+              </w:rPr>
+              <w:t>最大下降方向；+Y 为北，顺时针 0～360°。</w:t>
+            </w:r>
+          </w:p>
+        </w:tc>
+      </w:tr>
+      <w:tr>
+        <w:trPr>
+          <w:cantSplit/>
+        </w:trPr>
+        <w:tc>
+          <w:tcPr>
+            <w:tcW w:type="dxa" w:w="3100"/>
+            <w:tcMar>
+              <w:top w:w="80" w:type="dxa"/>
+              <w:start w:w="120" w:type="dxa"/>
+              <w:bottom w:w="80" w:type="dxa"/>
+              <w:end w:w="120" w:type="dxa"/>
+            </w:tcMar>
+            <w:vAlign w:val="center"/>
+          </w:tcPr>
+          <w:p>
+            <w:pPr>
+              <w:spacing w:before="0" w:after="0" w:line="276" w:lineRule="auto"/>
+              <w:jc w:val="left"/>
+            </w:pPr>
+            <w:r>
+              <w:rPr>
+                <w:rFonts w:ascii="Calibri" w:hAnsi="Calibri" w:eastAsia="Microsoft YaHei"/>
+                <w:sz w:val="18"/>
+              </w:rPr>
+              <w:t>DT_SURFACE_ASPECT_UNDEFINED</w:t>
+            </w:r>
+          </w:p>
+        </w:tc>
+        <w:tc>
+          <w:tcPr>
+            <w:tcW w:type="dxa" w:w="6260"/>
+            <w:tcMar>
+              <w:top w:w="80" w:type="dxa"/>
+              <w:start w:w="120" w:type="dxa"/>
+              <w:bottom w:w="80" w:type="dxa"/>
+              <w:end w:w="120" w:type="dxa"/>
+            </w:tcMar>
+            <w:vAlign w:val="center"/>
+          </w:tcPr>
+          <w:p>
+            <w:pPr>
+              <w:spacing w:before="0" w:after="0" w:line="276" w:lineRule="auto"/>
+              <w:jc w:val="left"/>
+            </w:pPr>
+            <w:r>
+              <w:rPr>
+                <w:rFonts w:ascii="Calibri" w:hAnsi="Calibri" w:eastAsia="Microsoft YaHei"/>
+                <w:sz w:val="18"/>
+              </w:rPr>
+              <w:t>水平面没有唯一坡向，此时角度字段为 0。</w:t>
+            </w:r>
+          </w:p>
+        </w:tc>
+      </w:tr>
+      <w:tr>
+        <w:trPr>
+          <w:cantSplit/>
+        </w:trPr>
+        <w:tc>
+          <w:tcPr>
+            <w:tcW w:type="dxa" w:w="3100"/>
+            <w:tcMar>
+              <w:top w:w="80" w:type="dxa"/>
+              <w:start w:w="120" w:type="dxa"/>
+              <w:bottom w:w="80" w:type="dxa"/>
+              <w:end w:w="120" w:type="dxa"/>
+            </w:tcMar>
+            <w:vAlign w:val="center"/>
+          </w:tcPr>
+          <w:p>
+            <w:pPr>
+              <w:spacing w:before="0" w:after="0" w:line="276" w:lineRule="auto"/>
+              <w:jc w:val="left"/>
+            </w:pPr>
+            <w:r>
+              <w:rPr>
+                <w:rFonts w:ascii="Calibri" w:hAnsi="Calibri" w:eastAsia="Microsoft YaHei"/>
+                <w:sz w:val="18"/>
+              </w:rPr>
+              <w:t>QUERY_ON_EDGE / QUERY_ON_VERTEX</w:t>
+            </w:r>
+          </w:p>
+        </w:tc>
+        <w:tc>
+          <w:tcPr>
+            <w:tcW w:type="dxa" w:w="6260"/>
+            <w:tcMar>
+              <w:top w:w="80" w:type="dxa"/>
+              <w:start w:w="120" w:type="dxa"/>
+              <w:bottom w:w="80" w:type="dxa"/>
+              <w:end w:w="120" w:type="dxa"/>
+            </w:tcMar>
+            <w:vAlign w:val="center"/>
+          </w:tcPr>
+          <w:p>
+            <w:pPr>
+              <w:spacing w:before="0" w:after="0" w:line="276" w:lineRule="auto"/>
+              <w:jc w:val="left"/>
+            </w:pPr>
+            <w:r>
+              <w:rPr>
+                <w:rFonts w:ascii="Calibri" w:hAnsi="Calibri" w:eastAsia="Microsoft YaHei"/>
+                <w:sz w:val="18"/>
+              </w:rPr>
+              <w:t>TIN/CDT 在多个邻面处选择一个有效支撑面。</w:t>
+            </w:r>
+          </w:p>
+        </w:tc>
+      </w:tr>
+      <w:tr>
+        <w:trPr>
+          <w:cantSplit/>
+        </w:trPr>
+        <w:tc>
+          <w:tcPr>
+            <w:tcW w:type="dxa" w:w="3100"/>
+            <w:tcMar>
+              <w:top w:w="80" w:type="dxa"/>
+              <w:start w:w="120" w:type="dxa"/>
+              <w:bottom w:w="80" w:type="dxa"/>
+              <w:end w:w="120" w:type="dxa"/>
+            </w:tcMar>
+            <w:vAlign w:val="center"/>
+          </w:tcPr>
+          <w:p>
+            <w:pPr>
+              <w:spacing w:before="0" w:after="0" w:line="276" w:lineRule="auto"/>
+              <w:jc w:val="left"/>
+            </w:pPr>
+            <w:r>
+              <w:rPr>
+                <w:rFonts w:ascii="Calibri" w:hAnsi="Calibri" w:eastAsia="Microsoft YaHei"/>
+                <w:sz w:val="18"/>
+              </w:rPr>
+              <w:t>DT_SURFACE_BILINEAR</w:t>
+            </w:r>
+          </w:p>
+        </w:tc>
+        <w:tc>
+          <w:tcPr>
+            <w:tcW w:type="dxa" w:w="6260"/>
+            <w:tcMar>
+              <w:top w:w="80" w:type="dxa"/>
+              <w:start w:w="120" w:type="dxa"/>
+              <w:bottom w:w="80" w:type="dxa"/>
+              <w:end w:w="120" w:type="dxa"/>
+            </w:tcMar>
+            <w:vAlign w:val="center"/>
+          </w:tcPr>
+          <w:p>
+            <w:pPr>
+              <w:spacing w:before="0" w:after="0" w:line="276" w:lineRule="auto"/>
+              <w:jc w:val="left"/>
+            </w:pPr>
+            <w:r>
+              <w:rPr>
+                <w:rFonts w:ascii="Calibri" w:hAnsi="Calibri" w:eastAsia="Microsoft YaHei"/>
+                <w:sz w:val="18"/>
+              </w:rPr>
+              <w:t>GRID 使用局部 2×2 节点双线性导数。</w:t>
+            </w:r>
+          </w:p>
+        </w:tc>
+      </w:tr>
+    </w:tbl>
+    <w:p>
+      <w:pPr>
+        <w:spacing w:before="0" w:after="40"/>
+      </w:pPr>
+    </w:p>
+    <w:p>
+      <w:r>
+        <w:rPr>
+          <w:rFonts w:ascii="Calibri" w:hAnsi="Calibri" w:eastAsia="Microsoft YaHei"/>
+        </w:rPr>
+        <w:t>TIN 与 CDT 在支撑三角面内使用解析平面梯度；CDT 外域和孔洞返回 DT_E_NOT_FOUND。GRID 先反算完整六参数仿射坐标，在 2×2 单元求双线性导数，再转换到世界 XY；四个支撑节点任一为 NoData 时拒绝分析。成功时 DLL 在 struct_size 中写入本版本结构大小，接口不分配需要调用方释放的内存。</w:t>
+      </w:r>
+    </w:p>
+    <w:p>
+      <w:pPr>
+        <w:spacing w:before="100" w:after="160" w:line="288" w:lineRule="auto"/>
+        <w:ind w:left="230" w:right="230"/>
+        <w:shd w:fill="FFF7E0"/>
+      </w:pPr>
+      <w:r>
+        <w:rPr>
+          <w:rFonts w:ascii="Calibri" w:hAnsi="Calibri" w:eastAsia="Microsoft YaHei"/>
+          <w:b/>
+          <w:color w:val="7A5A00"/>
+        </w:rPr>
+        <w:t xml:space="preserve">边和顶点  </w:t>
+      </w:r>
+      <w:r>
+        <w:rPr>
+          <w:rFonts w:ascii="Calibri" w:hAnsi="Calibri" w:eastAsia="Microsoft YaHei"/>
+        </w:rPr>
+        <w:t>分片线性 TIN/CDT 在断裂边两侧可有不同坡度。查询恰落在边或顶点时，本版本确定性选择一个有限有效邻面并返回位置标志，不做跨断裂线平滑平均。</w:t>
       </w:r>
     </w:p>
     <w:p>
@@ -12463,7 +13015,7 @@
         <w:rPr>
           <w:rFonts w:ascii="Calibri" w:hAnsi="Calibri" w:eastAsia="Microsoft YaHei"/>
         </w:rPr>
-        <w:t>测试覆盖生命周期、普通 TIN 动态编辑、DTIN/DTMESH/XYZ、TIN/GRID/等高线、等高线反向重建与高程冲突回滚、异步任务，以及 CDT 空网清理、外边界、孔洞、断裂线、交叉失败原子性、TIN→CDT、域内采样、CDT→GRID/等高线、共享顶点保护、批量新增/更新/删除、整批失败回滚和 DCDT 往返。独立剖面数学测试覆盖线性采样、三角形高程、旋转仿射 GRID 双线性插值、NoData 断点和升降/坡度统计；多边形量测测试覆盖凹多边形耳切、大坐标面积稳定性、自相交拒绝、平面解析结果、挖填符号和部分/完全无效域。GDAL 构建还执行 GTiff、COG、GPKG 驱动探测和真实文件往返。</w:t>
+        <w:t>测试覆盖生命周期、普通 TIN 动态编辑、DTIN/DTMESH/XYZ、TIN/GRID/等高线、等高线反向重建与高程冲突回滚、异步任务，以及 CDT 空网清理、外边界、孔洞、断裂线、交叉失败原子性、TIN→CDT、域内采样、CDT→GRID/等高线、共享顶点保护、批量新增/更新/删除、整批失败回滚和 DCDT 往返。v0.16 坡面测试用解析平面验证 TIN/CDT 的 Z、世界梯度、坡度、坡向和法向，并覆盖孔洞/凸包外拒绝、旋转仿射 GRID 梯度变换、双线性标志和 NoData 拒绝。独立剖面数学测试覆盖线性采样、三角形高程、旋转仿射 GRID 双线性插值、NoData 断点和升降/坡度统计；多边形量测测试覆盖凹多边形耳切、大坐标面积稳定性、自相交拒绝、平面解析结果、挖填符号和部分/完全无效域。GDAL 构建还执行 GTiff、COG、GPKG 驱动探测和真实文件往返。</w:t>
       </w:r>
     </w:p>
     <w:p>
@@ -12538,6 +13090,17 @@
           <w:rFonts w:ascii="Calibri" w:hAnsi="Calibri" w:eastAsia="Microsoft YaHei"/>
         </w:rPr>
         <w:t>保存后重新加载，顶点数、范围、高程和查询结果通过核对。</w:t>
+      </w:r>
+    </w:p>
+    <w:p>
+      <w:pPr>
+        <w:pStyle w:val="ListBullet"/>
+      </w:pPr>
+      <w:r>
+        <w:rPr>
+          <w:rFonts w:ascii="Calibri" w:hAnsi="Calibri" w:eastAsia="Microsoft YaHei"/>
+        </w:rPr>
+        <w:t>使用解析平面核对三种坡面接口的梯度、坡度、下坡坡向与单位法向约定。</w:t>
       </w:r>
     </w:p>
     <w:p>
@@ -13169,7 +13732,7 @@
         <w:color w:val="66727D"/>
         <w:sz w:val="18"/>
       </w:rPr>
-      <w:t xml:space="preserve">版本 0.15.0  |  第 </w:t>
+      <w:t xml:space="preserve">版本 0.16.0  |  第 </w:t>
     </w:r>
     <w:r>
       <w:rPr>

</xml_diff>

<commit_message>
feat: add terrain raster analysis products
</commit_message>
<xml_diff>
--- a/docs/manuals/dterrain_DLL开发使用手册.docx
+++ b/docs/manuals/dterrain_DLL开发使用手册.docx
@@ -85,7 +85,7 @@
           <w:color w:val="203748"/>
           <w:sz w:val="22"/>
         </w:rPr>
-        <w:t>版本 0.16.0  |  2026-07-17</w:t>
+        <w:t>版本 0.20.0  |  2026-07-17</w:t>
       </w:r>
     </w:p>
     <w:p>
@@ -243,7 +243,7 @@
                 <w:rFonts w:ascii="Calibri" w:hAnsi="Calibri" w:eastAsia="Microsoft YaHei"/>
                 <w:sz w:val="18"/>
               </w:rPr>
-              <w:t>0.16.0</w:t>
+              <w:t>0.20.0</w:t>
             </w:r>
           </w:p>
         </w:tc>
@@ -463,7 +463,7 @@
                 <w:rFonts w:ascii="Calibri" w:hAnsi="Calibri" w:eastAsia="Microsoft YaHei"/>
                 <w:sz w:val="18"/>
               </w:rPr>
-              <w:t>架构、构建部署、稳定 C ABI、坡度/坡向/法向分析、约束 Delaunay、GRID/等高线转换、GDAL 格式交换、异步任务、12 个兼容接口、文件格式、性能、线程安全、故障排查。</w:t>
+              <w:t>架构、构建部署、稳定 C ABI、局部与全幅坡度/坡向/阴影分析、约束 Delaunay、GRID/等高线转换、GDAL 格式交换、异步任务、12 个兼容接口、文件格式、性能、线程安全、故障排查。</w:t>
             </w:r>
           </w:p>
         </w:tc>
@@ -555,7 +555,7 @@
         <w:rPr>
           <w:rFonts w:ascii="Calibri" w:hAnsi="Calibri" w:eastAsia="Microsoft YaHei"/>
         </w:rPr>
-        <w:t>本手册对应 dterrain 0.16.0：稳定 C ABI 已统一支持普通 TIN、约束 CDT 和仿射 GRID 的坡度、下坡坡向与单位法向分析；Win32 GUI 可单击显示支撑单元、下坡箭头和数值面板，并保留剖面、面积/土方、GDAL 交换、等高线反向转换和原子批量约束事务。工程级双表面土方、真正局部 CDT 更新和生产级 GPU LOD 属于后续阶段。</w:t>
+        <w:t>本手册对应 dterrain 0.20.0：稳定 C ABI 在普通 TIN、约束 CDT 和仿射 GRID 的局部坡面分析基础上，新增全幅 GRID 坡度、坡向与阴影地形派生；Win32 GUI 提供固定量纲专题色带、图例、高程/专题切换及 DGRID/GeoTIFF 导出，并保留剖面、面积/土方、GDAL 交换、等高线反向转换和原子批量约束事务。工程级双表面土方、真正局部 CDT 更新和生产级 GPU LOD 属于后续阶段。</w:t>
       </w:r>
     </w:p>
     <w:p>
@@ -657,6 +657,17 @@
           <w:rFonts w:ascii="Calibri" w:hAnsi="Calibri" w:eastAsia="Microsoft YaHei"/>
         </w:rPr>
         <w:t>普通 TIN、约束 CDT 和仿射 GRID 统一返回局部高程梯度、坡度、下坡坡向、单位法向与支撑单元。</w:t>
+      </w:r>
+    </w:p>
+    <w:p>
+      <w:pPr>
+        <w:pStyle w:val="ListBullet"/>
+      </w:pPr>
+      <w:r>
+        <w:rPr>
+          <w:rFonts w:ascii="Calibri" w:hAnsi="Calibri" w:eastAsia="Microsoft YaHei"/>
+        </w:rPr>
+        <w:t>从任意仿射 GRID 派生全幅坡度角、下坡坡向角或 0～255 分析阴影，并继承 CRS/NoData。</w:t>
       </w:r>
     </w:p>
     <w:p>
@@ -1219,7 +1230,7 @@
         <w:rPr>
           <w:rFonts w:ascii="Calibri" w:hAnsi="Calibri" w:eastAsia="Microsoft YaHei"/>
         </w:rPr>
-        <w:t>GRID→TIN 和等高线→TIN 都重建普通 Delaunay；严格折线、边界和孔洞应使用独立 dt_cdt_handle。v0.16 单项约束编辑仍采用候选网全量重建；批量事务把 N 次重建降为 1 次，但尚未达到百万点实时局部 CDT 编辑。GUI 土方量测针对水平基准面并使用固定预算数值积分，不等同于工程结算。</w:t>
+        <w:t>GRID→TIN 和等高线→TIN 都重建普通 Delaunay；严格折线、边界和孔洞应使用独立 dt_cdt_handle。v0.20 单项约束编辑仍采用候选网全量重建；批量事务把 N 次重建降为 1 次，但尚未达到百万点实时局部 CDT 编辑。GUI 土方量测针对水平基准面并使用固定预算数值积分，不等同于工程结算。</w:t>
       </w:r>
     </w:p>
     <w:p>
@@ -8133,7 +8144,7 @@
         <w:rPr>
           <w:rFonts w:ascii="Calibri" w:hAnsi="Calibri" w:eastAsia="Microsoft YaHei"/>
         </w:rPr>
-        <w:t>v0.16 单项约束编辑仍完整重建候选 CDT；批量事务只重建一次。100,000 基础点添加 12 条断裂线的本机对比为逐条 3.259 s、批量 0.528 s，约 6.17 倍。请求 output_effect 还会计算完整域差异。未分段交叉仍须先加入共享顶点。</w:t>
+        <w:t>v0.20 单项约束编辑仍完整重建候选 CDT；批量事务只重建一次。100,000 基础点添加 12 条断裂线的本机对比为逐条 3.259 s、批量 0.528 s，约 6.17 倍。请求 output_effect 还会计算完整域差异。未分段交叉仍须先加入共享顶点。</w:t>
       </w:r>
     </w:p>
     <w:p>
@@ -8675,6 +8686,526 @@
           <w:rFonts w:ascii="Calibri" w:hAnsi="Calibri" w:eastAsia="Microsoft YaHei"/>
         </w:rPr>
         <w:t>分片线性 TIN/CDT 在断裂边两侧可有不同坡度。查询恰落在边或顶点时，本版本确定性选择一个有限有效邻面并返回位置标志，不做跨断裂线平滑平均。</w:t>
+      </w:r>
+    </w:p>
+    <w:p>
+      <w:pPr>
+        <w:pStyle w:val="Heading2"/>
+      </w:pPr>
+      <w:r>
+        <w:t>4.10 全幅 GRID 地形专题分析</w:t>
+      </w:r>
+    </w:p>
+    <w:p>
+      <w:r>
+        <w:rPr>
+          <w:rFonts w:ascii="Calibri" w:hAnsi="Calibri" w:eastAsia="Microsoft YaHei"/>
+        </w:rPr>
+        <w:t>v0.20 新增 dt_grid_derive_terrain()。它从源高程 GRID 创建同尺寸、同六参数仿射变换和同 CRS 的标准 dt_grid_handle；源句柄保持不变，输出可继续使用窗口读取、DGRID 保存或 GDAL GeoTIFF/COG 导出。输出始终具有 NoData。</w:t>
+      </w:r>
+    </w:p>
+    <w:p>
+      <w:pPr>
+        <w:pStyle w:val="DterrainCode"/>
+        <w:shd w:fill="F2F4F7"/>
+      </w:pPr>
+      <w:r>
+        <w:rPr>
+          <w:rFonts w:ascii="Consolas" w:hAnsi="Consolas" w:eastAsia="Microsoft YaHei"/>
+          <w:sz w:val="17"/>
+        </w:rPr>
+        <w:t>dt_grid_terrain_options o{};</w:t>
+      </w:r>
+      <w:r>
+        <w:br/>
+      </w:r>
+      <w:r>
+        <w:rPr>
+          <w:rFonts w:ascii="Consolas" w:hAnsi="Consolas" w:eastAsia="Microsoft YaHei"/>
+          <w:sz w:val="17"/>
+        </w:rPr>
+        <w:t>o.struct_size = sizeof(o);</w:t>
+      </w:r>
+      <w:r>
+        <w:br/>
+      </w:r>
+      <w:r>
+        <w:rPr>
+          <w:rFonts w:ascii="Consolas" w:hAnsi="Consolas" w:eastAsia="Microsoft YaHei"/>
+          <w:sz w:val="17"/>
+        </w:rPr>
+        <w:t>o.kind = DT_GRID_TERRAIN_SLOPE_DEGREES;</w:t>
+      </w:r>
+      <w:r>
+        <w:br/>
+      </w:r>
+      <w:r>
+        <w:rPr>
+          <w:rFonts w:ascii="Consolas" w:hAnsi="Consolas" w:eastAsia="Microsoft YaHei"/>
+          <w:sz w:val="17"/>
+        </w:rPr>
+        <w:t>o.z_factor = 1.0;</w:t>
+      </w:r>
+      <w:r>
+        <w:br/>
+      </w:r>
+      <w:r>
+        <w:rPr>
+          <w:rFonts w:ascii="Consolas" w:hAnsi="Consolas" w:eastAsia="Microsoft YaHei"/>
+          <w:sz w:val="17"/>
+        </w:rPr>
+        <w:t>o.output_nodata_value = -9999.0;</w:t>
+      </w:r>
+      <w:r>
+        <w:br/>
+      </w:r>
+      <w:r>
+        <w:rPr>
+          <w:rFonts w:ascii="Consolas" w:hAnsi="Consolas" w:eastAsia="Microsoft YaHei"/>
+          <w:sz w:val="17"/>
+        </w:rPr>
+      </w:r>
+      <w:r>
+        <w:br/>
+      </w:r>
+      <w:r>
+        <w:rPr>
+          <w:rFonts w:ascii="Consolas" w:hAnsi="Consolas" w:eastAsia="Microsoft YaHei"/>
+          <w:sz w:val="17"/>
+        </w:rPr>
+        <w:t>dt_grid_handle slope = nullptr;</w:t>
+      </w:r>
+      <w:r>
+        <w:br/>
+      </w:r>
+      <w:r>
+        <w:rPr>
+          <w:rFonts w:ascii="Consolas" w:hAnsi="Consolas" w:eastAsia="Microsoft YaHei"/>
+          <w:sz w:val="17"/>
+        </w:rPr>
+        <w:t>dt_status s = dt_grid_derive_terrain(elevation, &amp;o, &amp;slope);</w:t>
+      </w:r>
+      <w:r>
+        <w:br/>
+      </w:r>
+      <w:r>
+        <w:rPr>
+          <w:rFonts w:ascii="Consolas" w:hAnsi="Consolas" w:eastAsia="Microsoft YaHei"/>
+          <w:sz w:val="17"/>
+        </w:rPr>
+        <w:t>if (s == DT_OK) {</w:t>
+      </w:r>
+      <w:r>
+        <w:br/>
+      </w:r>
+      <w:r>
+        <w:rPr>
+          <w:rFonts w:ascii="Consolas" w:hAnsi="Consolas" w:eastAsia="Microsoft YaHei"/>
+          <w:sz w:val="17"/>
+        </w:rPr>
+        <w:t xml:space="preserve">    dt_grid_save_text(slope, "slope.dgrid");</w:t>
+      </w:r>
+      <w:r>
+        <w:br/>
+      </w:r>
+      <w:r>
+        <w:rPr>
+          <w:rFonts w:ascii="Consolas" w:hAnsi="Consolas" w:eastAsia="Microsoft YaHei"/>
+          <w:sz w:val="17"/>
+        </w:rPr>
+        <w:t xml:space="preserve">    dt_grid_destroy(slope);</w:t>
+      </w:r>
+      <w:r>
+        <w:br/>
+      </w:r>
+      <w:r>
+        <w:rPr>
+          <w:rFonts w:ascii="Consolas" w:hAnsi="Consolas" w:eastAsia="Microsoft YaHei"/>
+          <w:sz w:val="17"/>
+        </w:rPr>
+        <w:t>}</w:t>
+      </w:r>
+    </w:p>
+    <w:tbl>
+      <w:tblPr>
+        <w:tblStyle w:val="TableGrid"/>
+        <w:tblW w:type="dxa" w:w="9360"/>
+        <w:jc w:val="left"/>
+        <w:tblLayout w:type="fixed"/>
+        <w:tblLook w:firstColumn="1" w:firstRow="1" w:lastColumn="0" w:lastRow="0" w:noHBand="0" w:noVBand="1" w:val="04A0"/>
+        <w:tblInd w:w="120" w:type="dxa"/>
+      </w:tblPr>
+      <w:tblGrid>
+        <w:gridCol w:w="2600"/>
+        <w:gridCol w:w="3000"/>
+        <w:gridCol w:w="3760"/>
+      </w:tblGrid>
+      <w:tr>
+        <w:trPr>
+          <w:cantSplit/>
+          <w:tblHeader w:val="true"/>
+        </w:trPr>
+        <w:tc>
+          <w:tcPr>
+            <w:tcW w:type="dxa" w:w="2600"/>
+            <w:shd w:fill="E8EEF5"/>
+            <w:tcMar>
+              <w:top w:w="80" w:type="dxa"/>
+              <w:start w:w="120" w:type="dxa"/>
+              <w:bottom w:w="80" w:type="dxa"/>
+              <w:end w:w="120" w:type="dxa"/>
+            </w:tcMar>
+            <w:vAlign w:val="center"/>
+          </w:tcPr>
+          <w:p>
+            <w:pPr>
+              <w:keepNext/>
+              <w:spacing w:before="0" w:after="0"/>
+              <w:jc w:val="center"/>
+            </w:pPr>
+            <w:r>
+              <w:rPr>
+                <w:rFonts w:ascii="Calibri" w:hAnsi="Calibri" w:eastAsia="Microsoft YaHei"/>
+                <w:b/>
+                <w:color w:val="203748"/>
+                <w:sz w:val="19"/>
+              </w:rPr>
+              <w:t>kind</w:t>
+            </w:r>
+          </w:p>
+        </w:tc>
+        <w:tc>
+          <w:tcPr>
+            <w:tcW w:type="dxa" w:w="3000"/>
+            <w:shd w:fill="E8EEF5"/>
+            <w:tcMar>
+              <w:top w:w="80" w:type="dxa"/>
+              <w:start w:w="120" w:type="dxa"/>
+              <w:bottom w:w="80" w:type="dxa"/>
+              <w:end w:w="120" w:type="dxa"/>
+            </w:tcMar>
+            <w:vAlign w:val="center"/>
+          </w:tcPr>
+          <w:p>
+            <w:pPr>
+              <w:keepNext/>
+              <w:spacing w:before="0" w:after="0"/>
+              <w:jc w:val="center"/>
+            </w:pPr>
+            <w:r>
+              <w:rPr>
+                <w:rFonts w:ascii="Calibri" w:hAnsi="Calibri" w:eastAsia="Microsoft YaHei"/>
+                <w:b/>
+                <w:color w:val="203748"/>
+                <w:sz w:val="19"/>
+              </w:rPr>
+              <w:t>输出</w:t>
+            </w:r>
+          </w:p>
+        </w:tc>
+        <w:tc>
+          <w:tcPr>
+            <w:tcW w:type="dxa" w:w="3760"/>
+            <w:shd w:fill="E8EEF5"/>
+            <w:tcMar>
+              <w:top w:w="80" w:type="dxa"/>
+              <w:start w:w="120" w:type="dxa"/>
+              <w:bottom w:w="80" w:type="dxa"/>
+              <w:end w:w="120" w:type="dxa"/>
+            </w:tcMar>
+            <w:vAlign w:val="center"/>
+          </w:tcPr>
+          <w:p>
+            <w:pPr>
+              <w:keepNext/>
+              <w:spacing w:before="0" w:after="0"/>
+              <w:jc w:val="center"/>
+            </w:pPr>
+            <w:r>
+              <w:rPr>
+                <w:rFonts w:ascii="Calibri" w:hAnsi="Calibri" w:eastAsia="Microsoft YaHei"/>
+                <w:b/>
+                <w:color w:val="203748"/>
+                <w:sz w:val="19"/>
+              </w:rPr>
+              <w:t>特殊语义</w:t>
+            </w:r>
+          </w:p>
+        </w:tc>
+      </w:tr>
+      <w:tr>
+        <w:trPr>
+          <w:cantSplit/>
+        </w:trPr>
+        <w:tc>
+          <w:tcPr>
+            <w:tcW w:type="dxa" w:w="2600"/>
+            <w:tcMar>
+              <w:top w:w="80" w:type="dxa"/>
+              <w:start w:w="120" w:type="dxa"/>
+              <w:bottom w:w="80" w:type="dxa"/>
+              <w:end w:w="120" w:type="dxa"/>
+            </w:tcMar>
+            <w:vAlign w:val="center"/>
+          </w:tcPr>
+          <w:p>
+            <w:pPr>
+              <w:spacing w:before="0" w:after="0" w:line="276" w:lineRule="auto"/>
+              <w:jc w:val="left"/>
+            </w:pPr>
+            <w:r>
+              <w:rPr>
+                <w:rFonts w:ascii="Calibri" w:hAnsi="Calibri" w:eastAsia="Microsoft YaHei"/>
+                <w:sz w:val="18"/>
+              </w:rPr>
+              <w:t>SLOPE_DEGREES</w:t>
+            </w:r>
+          </w:p>
+        </w:tc>
+        <w:tc>
+          <w:tcPr>
+            <w:tcW w:type="dxa" w:w="3000"/>
+            <w:tcMar>
+              <w:top w:w="80" w:type="dxa"/>
+              <w:start w:w="120" w:type="dxa"/>
+              <w:bottom w:w="80" w:type="dxa"/>
+              <w:end w:w="120" w:type="dxa"/>
+            </w:tcMar>
+            <w:vAlign w:val="center"/>
+          </w:tcPr>
+          <w:p>
+            <w:pPr>
+              <w:spacing w:before="0" w:after="0" w:line="276" w:lineRule="auto"/>
+              <w:jc w:val="left"/>
+            </w:pPr>
+            <w:r>
+              <w:rPr>
+                <w:rFonts w:ascii="Calibri" w:hAnsi="Calibri" w:eastAsia="Microsoft YaHei"/>
+                <w:sz w:val="18"/>
+              </w:rPr>
+              <w:t>坡度角 0～90°</w:t>
+            </w:r>
+          </w:p>
+        </w:tc>
+        <w:tc>
+          <w:tcPr>
+            <w:tcW w:type="dxa" w:w="3760"/>
+            <w:tcMar>
+              <w:top w:w="80" w:type="dxa"/>
+              <w:start w:w="120" w:type="dxa"/>
+              <w:bottom w:w="80" w:type="dxa"/>
+              <w:end w:w="120" w:type="dxa"/>
+            </w:tcMar>
+            <w:vAlign w:val="center"/>
+          </w:tcPr>
+          <w:p>
+            <w:pPr>
+              <w:spacing w:before="0" w:after="0" w:line="276" w:lineRule="auto"/>
+              <w:jc w:val="left"/>
+            </w:pPr>
+            <w:r>
+              <w:rPr>
+                <w:rFonts w:ascii="Calibri" w:hAnsi="Calibri" w:eastAsia="Microsoft YaHei"/>
+                <w:sz w:val="18"/>
+              </w:rPr>
+              <w:t>水平面为 0°</w:t>
+            </w:r>
+          </w:p>
+        </w:tc>
+      </w:tr>
+      <w:tr>
+        <w:trPr>
+          <w:cantSplit/>
+        </w:trPr>
+        <w:tc>
+          <w:tcPr>
+            <w:tcW w:type="dxa" w:w="2600"/>
+            <w:tcMar>
+              <w:top w:w="80" w:type="dxa"/>
+              <w:start w:w="120" w:type="dxa"/>
+              <w:bottom w:w="80" w:type="dxa"/>
+              <w:end w:w="120" w:type="dxa"/>
+            </w:tcMar>
+            <w:vAlign w:val="center"/>
+          </w:tcPr>
+          <w:p>
+            <w:pPr>
+              <w:spacing w:before="0" w:after="0" w:line="276" w:lineRule="auto"/>
+              <w:jc w:val="left"/>
+            </w:pPr>
+            <w:r>
+              <w:rPr>
+                <w:rFonts w:ascii="Calibri" w:hAnsi="Calibri" w:eastAsia="Microsoft YaHei"/>
+                <w:sz w:val="18"/>
+              </w:rPr>
+              <w:t>ASPECT_DEGREES</w:t>
+            </w:r>
+          </w:p>
+        </w:tc>
+        <w:tc>
+          <w:tcPr>
+            <w:tcW w:type="dxa" w:w="3000"/>
+            <w:tcMar>
+              <w:top w:w="80" w:type="dxa"/>
+              <w:start w:w="120" w:type="dxa"/>
+              <w:bottom w:w="80" w:type="dxa"/>
+              <w:end w:w="120" w:type="dxa"/>
+            </w:tcMar>
+            <w:vAlign w:val="center"/>
+          </w:tcPr>
+          <w:p>
+            <w:pPr>
+              <w:spacing w:before="0" w:after="0" w:line="276" w:lineRule="auto"/>
+              <w:jc w:val="left"/>
+            </w:pPr>
+            <w:r>
+              <w:rPr>
+                <w:rFonts w:ascii="Calibri" w:hAnsi="Calibri" w:eastAsia="Microsoft YaHei"/>
+                <w:sz w:val="18"/>
+              </w:rPr>
+              <w:t>下坡方位角 0～360°</w:t>
+            </w:r>
+          </w:p>
+        </w:tc>
+        <w:tc>
+          <w:tcPr>
+            <w:tcW w:type="dxa" w:w="3760"/>
+            <w:tcMar>
+              <w:top w:w="80" w:type="dxa"/>
+              <w:start w:w="120" w:type="dxa"/>
+              <w:bottom w:w="80" w:type="dxa"/>
+              <w:end w:w="120" w:type="dxa"/>
+            </w:tcMar>
+            <w:vAlign w:val="center"/>
+          </w:tcPr>
+          <w:p>
+            <w:pPr>
+              <w:spacing w:before="0" w:after="0" w:line="276" w:lineRule="auto"/>
+              <w:jc w:val="left"/>
+            </w:pPr>
+            <w:r>
+              <w:rPr>
+                <w:rFonts w:ascii="Calibri" w:hAnsi="Calibri" w:eastAsia="Microsoft YaHei"/>
+                <w:sz w:val="18"/>
+              </w:rPr>
+              <w:t>水平面无唯一坡向，写 NoData</w:t>
+            </w:r>
+          </w:p>
+        </w:tc>
+      </w:tr>
+      <w:tr>
+        <w:trPr>
+          <w:cantSplit/>
+        </w:trPr>
+        <w:tc>
+          <w:tcPr>
+            <w:tcW w:type="dxa" w:w="2600"/>
+            <w:tcMar>
+              <w:top w:w="80" w:type="dxa"/>
+              <w:start w:w="120" w:type="dxa"/>
+              <w:bottom w:w="80" w:type="dxa"/>
+              <w:end w:w="120" w:type="dxa"/>
+            </w:tcMar>
+            <w:vAlign w:val="center"/>
+          </w:tcPr>
+          <w:p>
+            <w:pPr>
+              <w:spacing w:before="0" w:after="0" w:line="276" w:lineRule="auto"/>
+              <w:jc w:val="left"/>
+            </w:pPr>
+            <w:r>
+              <w:rPr>
+                <w:rFonts w:ascii="Calibri" w:hAnsi="Calibri" w:eastAsia="Microsoft YaHei"/>
+                <w:sz w:val="18"/>
+              </w:rPr>
+              <w:t>HILLSHADE</w:t>
+            </w:r>
+          </w:p>
+        </w:tc>
+        <w:tc>
+          <w:tcPr>
+            <w:tcW w:type="dxa" w:w="3000"/>
+            <w:tcMar>
+              <w:top w:w="80" w:type="dxa"/>
+              <w:start w:w="120" w:type="dxa"/>
+              <w:bottom w:w="80" w:type="dxa"/>
+              <w:end w:w="120" w:type="dxa"/>
+            </w:tcMar>
+            <w:vAlign w:val="center"/>
+          </w:tcPr>
+          <w:p>
+            <w:pPr>
+              <w:spacing w:before="0" w:after="0" w:line="276" w:lineRule="auto"/>
+              <w:jc w:val="left"/>
+            </w:pPr>
+            <w:r>
+              <w:rPr>
+                <w:rFonts w:ascii="Calibri" w:hAnsi="Calibri" w:eastAsia="Microsoft YaHei"/>
+                <w:sz w:val="18"/>
+              </w:rPr>
+              <w:t>分析阴影 0～255</w:t>
+            </w:r>
+          </w:p>
+        </w:tc>
+        <w:tc>
+          <w:tcPr>
+            <w:tcW w:type="dxa" w:w="3760"/>
+            <w:tcMar>
+              <w:top w:w="80" w:type="dxa"/>
+              <w:start w:w="120" w:type="dxa"/>
+              <w:bottom w:w="80" w:type="dxa"/>
+              <w:end w:w="120" w:type="dxa"/>
+            </w:tcMar>
+            <w:vAlign w:val="center"/>
+          </w:tcPr>
+          <w:p>
+            <w:pPr>
+              <w:spacing w:before="0" w:after="0" w:line="276" w:lineRule="auto"/>
+              <w:jc w:val="left"/>
+            </w:pPr>
+            <w:r>
+              <w:rPr>
+                <w:rFonts w:ascii="Calibri" w:hAnsi="Calibri" w:eastAsia="Microsoft YaHei"/>
+                <w:sz w:val="18"/>
+              </w:rPr>
+              <w:t>默认光源方位/高度 315°/45°</w:t>
+            </w:r>
+          </w:p>
+        </w:tc>
+      </w:tr>
+    </w:tbl>
+    <w:p>
+      <w:pPr>
+        <w:spacing w:before="0" w:after="40"/>
+      </w:pPr>
+    </w:p>
+    <w:p>
+      <w:r>
+        <w:rPr>
+          <w:rFonts w:ascii="Calibri" w:hAnsi="Calibri" w:eastAsia="Microsoft YaHei"/>
+        </w:rPr>
+        <w:t>内部节点采用中心差分，边界采用单边差分；列/行导数通过完整仿射雅可比转换为世界 XY 梯度。中心或所需四邻域含 NoData 时结果节点写 NoData，在空洞边缘形成一节点安全带。z_factor 为零时选择 1.0，否则必须有限且大于零。output_nodata_value 为零时自动选择 NaN，避免与有效 0°/0 灰度冲突。输出句柄必须由 dt_grid_destroy() 释放。</w:t>
+      </w:r>
+    </w:p>
+    <w:p>
+      <w:pPr>
+        <w:spacing w:before="100" w:after="160" w:line="288" w:lineRule="auto"/>
+        <w:ind w:left="230" w:right="230"/>
+        <w:shd w:fill="E8EEF5"/>
+      </w:pPr>
+      <w:r>
+        <w:rPr>
+          <w:rFonts w:ascii="Calibri" w:hAnsi="Calibri" w:eastAsia="Microsoft YaHei"/>
+          <w:b/>
+          <w:color w:val="1F4D78"/>
+        </w:rPr>
+        <w:t xml:space="preserve">内存与量纲  </w:t>
+      </w:r>
+      <w:r>
+        <w:rPr>
+          <w:rFonts w:ascii="Calibri" w:hAnsi="Calibri" w:eastAsia="Microsoft YaHei"/>
+        </w:rPr>
+        <w:t>同步派生时间为 O(width×height)，除源 GRID 外还需一个同尺寸 double 输出 GRID。z_factor 用于高程和平面单位换算；如果 XY 为米而 Z 为毫米，应使用 0.001。专题色彩只属于 GUI，DLL 输出的是可计算的实际角度或阴影值。</w:t>
       </w:r>
     </w:p>
     <w:p>
@@ -13015,7 +13546,7 @@
         <w:rPr>
           <w:rFonts w:ascii="Calibri" w:hAnsi="Calibri" w:eastAsia="Microsoft YaHei"/>
         </w:rPr>
-        <w:t>测试覆盖生命周期、普通 TIN 动态编辑、DTIN/DTMESH/XYZ、TIN/GRID/等高线、等高线反向重建与高程冲突回滚、异步任务，以及 CDT 空网清理、外边界、孔洞、断裂线、交叉失败原子性、TIN→CDT、域内采样、CDT→GRID/等高线、共享顶点保护、批量新增/更新/删除、整批失败回滚和 DCDT 往返。v0.16 坡面测试用解析平面验证 TIN/CDT 的 Z、世界梯度、坡度、坡向和法向，并覆盖孔洞/凸包外拒绝、旋转仿射 GRID 梯度变换、双线性标志和 NoData 拒绝。独立剖面数学测试覆盖线性采样、三角形高程、旋转仿射 GRID 双线性插值、NoData 断点和升降/坡度统计；多边形量测测试覆盖凹多边形耳切、大坐标面积稳定性、自相交拒绝、平面解析结果、挖填符号和部分/完全无效域。GDAL 构建还执行 GTiff、COG、GPKG 驱动探测和真实文件往返。</w:t>
+        <w:t>测试覆盖生命周期、普通 TIN 动态编辑、DTIN/DTMESH/XYZ、TIN/GRID/等高线、等高线反向重建与高程冲突回滚、异步任务，以及 CDT 空网清理、外边界、孔洞、断裂线、交叉失败原子性、TIN→CDT、域内采样、CDT→GRID/等高线、共享顶点保护、批量新增/更新/删除、整批失败回滚和 DCDT 往返。局部坡面测试用解析平面验证 TIN/CDT 的 Z、世界梯度、坡度、坡向和法向，并覆盖孔洞/凸包外拒绝、旋转仿射 GRID 梯度变换、双线性标志和 NoData 拒绝。v0.20 全幅测试覆盖坡度、坡向、默认光照阴影、CRS 继承、旋转仿射差分、水平坡向 NoData 和空洞邻域传播。独立剖面数学测试覆盖线性采样、三角形高程、旋转仿射 GRID 双线性插值、NoData 断点和升降/坡度统计；多边形量测测试覆盖凹多边形耳切、大坐标面积稳定性、自相交拒绝、平面解析结果、挖填符号和部分/完全无效域。GDAL 构建还执行 GTiff、COG、GPKG 驱动探测和真实文件往返。</w:t>
       </w:r>
     </w:p>
     <w:p>
@@ -13732,7 +14263,7 @@
         <w:color w:val="66727D"/>
         <w:sz w:val="18"/>
       </w:rPr>
-      <w:t xml:space="preserve">版本 0.16.0  |  第 </w:t>
+      <w:t xml:space="preserve">版本 0.20.0  |  第 </w:t>
     </w:r>
     <w:r>
       <w:rPr>

</xml_diff>

<commit_message>
feat: add cancellable terrain analysis tasks
</commit_message>
<xml_diff>
--- a/docs/manuals/dterrain_DLL开发使用手册.docx
+++ b/docs/manuals/dterrain_DLL开发使用手册.docx
@@ -85,7 +85,7 @@
           <w:color w:val="203748"/>
           <w:sz w:val="22"/>
         </w:rPr>
-        <w:t>版本 0.20.0  |  2026-07-17</w:t>
+        <w:t>版本 0.21.0  |  2026-07-17</w:t>
       </w:r>
     </w:p>
     <w:p>
@@ -243,7 +243,7 @@
                 <w:rFonts w:ascii="Calibri" w:hAnsi="Calibri" w:eastAsia="Microsoft YaHei"/>
                 <w:sz w:val="18"/>
               </w:rPr>
-              <w:t>0.20.0</w:t>
+              <w:t>0.21.0</w:t>
             </w:r>
           </w:p>
         </w:tc>
@@ -555,7 +555,7 @@
         <w:rPr>
           <w:rFonts w:ascii="Calibri" w:hAnsi="Calibri" w:eastAsia="Microsoft YaHei"/>
         </w:rPr>
-        <w:t>本手册对应 dterrain 0.20.0：稳定 C ABI 在普通 TIN、约束 CDT 和仿射 GRID 的局部坡面分析基础上，新增全幅 GRID 坡度、坡向与阴影地形派生；Win32 GUI 提供固定量纲专题色带、图例、高程/专题切换及 DGRID/GeoTIFF 导出，并保留剖面、面积/土方、GDAL 交换、等高线反向转换和原子批量约束事务。工程级双表面土方、真正局部 CDT 更新和生产级 GPU LOD 属于后续阶段。</w:t>
+        <w:t>本手册对应 dterrain 0.21.0：全幅 GRID 专题已接入异步任务，支持进度、Esc/菜单/关闭安全取消和 z-factor/光照参数；同步接口、专题导出、剖面、土方、GDAL 与约束事务保持兼容。双表面土方、局部 CDT 和 GPU LOD 属于后续阶段。</w:t>
       </w:r>
     </w:p>
     <w:p>
@@ -1230,7 +1230,7 @@
         <w:rPr>
           <w:rFonts w:ascii="Calibri" w:hAnsi="Calibri" w:eastAsia="Microsoft YaHei"/>
         </w:rPr>
-        <w:t>GRID→TIN 和等高线→TIN 都重建普通 Delaunay；严格折线、边界和孔洞应使用独立 dt_cdt_handle。v0.20 单项约束编辑仍采用候选网全量重建；批量事务把 N 次重建降为 1 次，但尚未达到百万点实时局部 CDT 编辑。GUI 土方量测针对水平基准面并使用固定预算数值积分，不等同于工程结算。</w:t>
+        <w:t>GRID→TIN 和等高线→TIN 都重建普通 Delaunay；严格折线、边界和孔洞应使用独立 dt_cdt_handle。v0.21 单项约束编辑仍采用候选网全量重建；批量事务把 N 次重建降为 1 次，但尚未达到百万点实时局部 CDT 编辑。GUI 土方量测针对水平基准面并使用固定预算数值积分，不等同于工程结算。</w:t>
       </w:r>
     </w:p>
     <w:p>
@@ -8144,7 +8144,7 @@
         <w:rPr>
           <w:rFonts w:ascii="Calibri" w:hAnsi="Calibri" w:eastAsia="Microsoft YaHei"/>
         </w:rPr>
-        <w:t>v0.20 单项约束编辑仍完整重建候选 CDT；批量事务只重建一次。100,000 基础点添加 12 条断裂线的本机对比为逐条 3.259 s、批量 0.528 s，约 6.17 倍。请求 output_effect 还会计算完整域差异。未分段交叉仍须先加入共享顶点。</w:t>
+        <w:t>v0.21 单项约束编辑仍完整重建候选 CDT；批量事务只重建一次。100,000 基础点添加 12 条断裂线的本机对比为逐条 3.259 s、批量 0.528 s，约 6.17 倍。请求 output_effect 还会计算完整域差异。未分段交叉仍须先加入共享顶点。</w:t>
       </w:r>
     </w:p>
     <w:p>
@@ -8701,7 +8701,7 @@
         <w:rPr>
           <w:rFonts w:ascii="Calibri" w:hAnsi="Calibri" w:eastAsia="Microsoft YaHei"/>
         </w:rPr>
-        <w:t>v0.20 新增 dt_grid_derive_terrain()。它从源高程 GRID 创建同尺寸、同六参数仿射变换和同 CRS 的标准 dt_grid_handle；源句柄保持不变，输出可继续使用窗口读取、DGRID 保存或 GDAL GeoTIFF/COG 导出。输出始终具有 NoData。</w:t>
+        <w:t>dt_grid_derive_terrain() 从源高程 GRID 创建同尺寸、同六参数仿射变换和同 CRS 的标准 dt_grid_handle；源句柄保持不变，输出可继续使用窗口读取、DGRID 保存或 GDAL GeoTIFF/COG 导出。v0.21 新增 dt_grid_derive_terrain_async()，复用统一任务状态、进度和取消接口。输出始终具有 NoData。</w:t>
       </w:r>
     </w:p>
     <w:p>
@@ -8824,6 +8824,159 @@
           <w:sz w:val="17"/>
         </w:rPr>
         <w:t>}</w:t>
+      </w:r>
+    </w:p>
+    <w:p>
+      <w:pPr>
+        <w:pStyle w:val="DterrainCode"/>
+        <w:shd w:fill="F2F4F7"/>
+      </w:pPr>
+      <w:r>
+        <w:rPr>
+          <w:rFonts w:ascii="Consolas" w:hAnsi="Consolas" w:eastAsia="Microsoft YaHei"/>
+          <w:sz w:val="17"/>
+        </w:rPr>
+        <w:t>dt_task_handle task = nullptr;</w:t>
+      </w:r>
+      <w:r>
+        <w:br/>
+      </w:r>
+      <w:r>
+        <w:rPr>
+          <w:rFonts w:ascii="Consolas" w:hAnsi="Consolas" w:eastAsia="Microsoft YaHei"/>
+          <w:sz w:val="17"/>
+        </w:rPr>
+        <w:t>dt_grid_derive_terrain_async(elevation, &amp;o, &amp;task);</w:t>
+      </w:r>
+      <w:r>
+        <w:br/>
+      </w:r>
+      <w:r>
+        <w:rPr>
+          <w:rFonts w:ascii="Consolas" w:hAnsi="Consolas" w:eastAsia="Microsoft YaHei"/>
+          <w:sz w:val="17"/>
+        </w:rPr>
+        <w:t>for (;;) {</w:t>
+      </w:r>
+      <w:r>
+        <w:br/>
+      </w:r>
+      <w:r>
+        <w:rPr>
+          <w:rFonts w:ascii="Consolas" w:hAnsi="Consolas" w:eastAsia="Microsoft YaHei"/>
+          <w:sz w:val="17"/>
+        </w:rPr>
+        <w:t xml:space="preserve">    int32_t done = 0;</w:t>
+      </w:r>
+      <w:r>
+        <w:br/>
+      </w:r>
+      <w:r>
+        <w:rPr>
+          <w:rFonts w:ascii="Consolas" w:hAnsi="Consolas" w:eastAsia="Microsoft YaHei"/>
+          <w:sz w:val="17"/>
+        </w:rPr>
+        <w:t xml:space="preserve">    dt_task_wait(task, 50, &amp;done);</w:t>
+      </w:r>
+      <w:r>
+        <w:br/>
+      </w:r>
+      <w:r>
+        <w:rPr>
+          <w:rFonts w:ascii="Consolas" w:hAnsi="Consolas" w:eastAsia="Microsoft YaHei"/>
+          <w:sz w:val="17"/>
+        </w:rPr>
+        <w:t xml:space="preserve">    dt_task_info info{};</w:t>
+      </w:r>
+      <w:r>
+        <w:br/>
+      </w:r>
+      <w:r>
+        <w:rPr>
+          <w:rFonts w:ascii="Consolas" w:hAnsi="Consolas" w:eastAsia="Microsoft YaHei"/>
+          <w:sz w:val="17"/>
+        </w:rPr>
+        <w:t xml:space="preserve">    dt_task_get_info(task, &amp;info);  // progress: 0..1</w:t>
+      </w:r>
+      <w:r>
+        <w:br/>
+      </w:r>
+      <w:r>
+        <w:rPr>
+          <w:rFonts w:ascii="Consolas" w:hAnsi="Consolas" w:eastAsia="Microsoft YaHei"/>
+          <w:sz w:val="17"/>
+        </w:rPr>
+        <w:t xml:space="preserve">    if (done) break;</w:t>
+      </w:r>
+      <w:r>
+        <w:br/>
+      </w:r>
+      <w:r>
+        <w:rPr>
+          <w:rFonts w:ascii="Consolas" w:hAnsi="Consolas" w:eastAsia="Microsoft YaHei"/>
+          <w:sz w:val="17"/>
+        </w:rPr>
+        <w:t xml:space="preserve">    // 用户取消：dt_task_request_cancel(task);</w:t>
+      </w:r>
+      <w:r>
+        <w:br/>
+      </w:r>
+      <w:r>
+        <w:rPr>
+          <w:rFonts w:ascii="Consolas" w:hAnsi="Consolas" w:eastAsia="Microsoft YaHei"/>
+          <w:sz w:val="17"/>
+        </w:rPr>
+        <w:t>}</w:t>
+      </w:r>
+      <w:r>
+        <w:br/>
+      </w:r>
+      <w:r>
+        <w:rPr>
+          <w:rFonts w:ascii="Consolas" w:hAnsi="Consolas" w:eastAsia="Microsoft YaHei"/>
+          <w:sz w:val="17"/>
+        </w:rPr>
+        <w:t>dt_grid_handle result = nullptr;</w:t>
+      </w:r>
+      <w:r>
+        <w:br/>
+      </w:r>
+      <w:r>
+        <w:rPr>
+          <w:rFonts w:ascii="Consolas" w:hAnsi="Consolas" w:eastAsia="Microsoft YaHei"/>
+          <w:sz w:val="17"/>
+        </w:rPr>
+        <w:t>if (dt_task_get_grid_result(task, &amp;result) == DT_OK) {</w:t>
+      </w:r>
+      <w:r>
+        <w:br/>
+      </w:r>
+      <w:r>
+        <w:rPr>
+          <w:rFonts w:ascii="Consolas" w:hAnsi="Consolas" w:eastAsia="Microsoft YaHei"/>
+          <w:sz w:val="17"/>
+        </w:rPr>
+        <w:t xml:space="preserve">    // 使用 result，最终 dt_grid_destroy(result)</w:t>
+      </w:r>
+      <w:r>
+        <w:br/>
+      </w:r>
+      <w:r>
+        <w:rPr>
+          <w:rFonts w:ascii="Consolas" w:hAnsi="Consolas" w:eastAsia="Microsoft YaHei"/>
+          <w:sz w:val="17"/>
+        </w:rPr>
+        <w:t>}</w:t>
+      </w:r>
+      <w:r>
+        <w:br/>
+      </w:r>
+      <w:r>
+        <w:rPr>
+          <w:rFonts w:ascii="Consolas" w:hAnsi="Consolas" w:eastAsia="Microsoft YaHei"/>
+          <w:sz w:val="17"/>
+        </w:rPr>
+        <w:t>dt_task_destroy(task);</w:t>
       </w:r>
     </w:p>
     <w:tbl>
@@ -9199,13 +9352,13 @@
           <w:b/>
           <w:color w:val="1F4D78"/>
         </w:rPr>
-        <w:t xml:space="preserve">内存与量纲  </w:t>
+        <w:t xml:space="preserve">异步、内存与量纲  </w:t>
       </w:r>
       <w:r>
         <w:rPr>
           <w:rFonts w:ascii="Calibri" w:hAnsi="Calibri" w:eastAsia="Microsoft YaHei"/>
         </w:rPr>
-        <w:t>同步派生时间为 O(width×height)，除源 GRID 外还需一个同尺寸 double 输出 GRID。z_factor 用于高程和平面单位换算；如果 XY 为米而 Z 为毫米，应使用 0.001。专题色彩只属于 GUI，DLL 输出的是可计算的实际角度或阴影值。</w:t>
+        <w:t>异步任务按输出行更新进度并在下一行前检查取消；取消状态为 DT_TASK_CANCELLED/DT_E_CANCELLED，不发布半成品。任务持有源 GRID 生命周期，成功结果仍是标准 GRID。时间为 O(width×height)，除源 GRID 外还需一个同尺寸 double 输出 GRID。z_factor 用于高程和平面单位换算；如果 XY 为米而 Z 为毫米，应使用 0.001。</w:t>
       </w:r>
     </w:p>
     <w:p>
@@ -13546,7 +13699,7 @@
         <w:rPr>
           <w:rFonts w:ascii="Calibri" w:hAnsi="Calibri" w:eastAsia="Microsoft YaHei"/>
         </w:rPr>
-        <w:t>测试覆盖生命周期、普通 TIN 动态编辑、DTIN/DTMESH/XYZ、TIN/GRID/等高线、等高线反向重建与高程冲突回滚、异步任务，以及 CDT 空网清理、外边界、孔洞、断裂线、交叉失败原子性、TIN→CDT、域内采样、CDT→GRID/等高线、共享顶点保护、批量新增/更新/删除、整批失败回滚和 DCDT 往返。局部坡面测试用解析平面验证 TIN/CDT 的 Z、世界梯度、坡度、坡向和法向，并覆盖孔洞/凸包外拒绝、旋转仿射 GRID 梯度变换、双线性标志和 NoData 拒绝。v0.20 全幅测试覆盖坡度、坡向、默认光照阴影、CRS 继承、旋转仿射差分、水平坡向 NoData 和空洞邻域传播。独立剖面数学测试覆盖线性采样、三角形高程、旋转仿射 GRID 双线性插值、NoData 断点和升降/坡度统计；多边形量测测试覆盖凹多边形耳切、大坐标面积稳定性、自相交拒绝、平面解析结果、挖填符号和部分/完全无效域。GDAL 构建还执行 GTiff、COG、GPKG 驱动探测和真实文件往返。</w:t>
+        <w:t>测试覆盖生命周期、普通 TIN 动态编辑、DTIN/DTMESH/XYZ、TIN/GRID/等高线、等高线反向重建与高程冲突回滚、异步任务，以及 CDT 空网清理、外边界、孔洞、断裂线、交叉失败原子性、TIN→CDT、域内采样、CDT→GRID/等高线、共享顶点保护、批量新增/更新/删除、整批失败回滚和 DCDT 往返。局部坡面测试用解析平面验证 TIN/CDT 的 Z、世界梯度、坡度、坡向和法向，并覆盖孔洞/凸包外拒绝、旋转仿射 GRID 梯度变换、双线性标志和 NoData 拒绝。全幅测试覆盖坡度、坡向、默认光照阴影、CRS 继承、旋转仿射差分、水平坡向 NoData、空洞邻域传播，以及 v0.21 异步专题结果、进度和大 GRID 取消状态。独立剖面数学测试覆盖线性采样、三角形高程、旋转仿射 GRID 双线性插值、NoData 断点和升降/坡度统计；多边形量测测试覆盖凹多边形耳切、大坐标面积稳定性、自相交拒绝、平面解析结果、挖填符号和部分/完全无效域。GDAL 构建还执行 GTiff、COG、GPKG 驱动探测和真实文件往返。</w:t>
       </w:r>
     </w:p>
     <w:p>
@@ -14263,7 +14416,7 @@
         <w:color w:val="66727D"/>
         <w:sz w:val="18"/>
       </w:rPr>
-      <w:t xml:space="preserve">版本 0.20.0  |  第 </w:t>
+      <w:t xml:space="preserve">版本 0.21.0  |  第 </w:t>
     </w:r>
     <w:r>
       <w:rPr>

</xml_diff>

<commit_message>
feat: parallelize terrain raster analysis
</commit_message>
<xml_diff>
--- a/docs/manuals/dterrain_DLL开发使用手册.docx
+++ b/docs/manuals/dterrain_DLL开发使用手册.docx
@@ -85,7 +85,7 @@
           <w:color w:val="203748"/>
           <w:sz w:val="22"/>
         </w:rPr>
-        <w:t>版本 0.21.0  |  2026-07-17</w:t>
+        <w:t>版本 0.22.0  |  2026-07-17</w:t>
       </w:r>
     </w:p>
     <w:p>
@@ -243,7 +243,7 @@
                 <w:rFonts w:ascii="Calibri" w:hAnsi="Calibri" w:eastAsia="Microsoft YaHei"/>
                 <w:sz w:val="18"/>
               </w:rPr>
-              <w:t>0.21.0</w:t>
+              <w:t>0.22.0</w:t>
             </w:r>
           </w:p>
         </w:tc>
@@ -555,7 +555,7 @@
         <w:rPr>
           <w:rFonts w:ascii="Calibri" w:hAnsi="Calibri" w:eastAsia="Microsoft YaHei"/>
         </w:rPr>
-        <w:t>本手册对应 dterrain 0.21.0：全幅 GRID 专题已接入异步任务，支持进度、Esc/菜单/关闭安全取消和 z-factor/光照参数；同步接口、专题导出、剖面、土方、GDAL 与约束事务保持兼容。双表面土方、局部 CDT 和 GPU LOD 属于后续阶段。</w:t>
+        <w:t>本手册对应 dterrain 0.22.0：全幅 GRID 专题已支持分块多线程、进度、安全取消以及 z-factor/光照/线程/块高参数；选项结构仍为 80 字节，旧零初始化调用兼容。同步接口、专题导出、剖面、土方、GDAL 与约束事务保持兼容。双表面土方、局部 CDT 和 GPU LOD 属于后续阶段。</w:t>
       </w:r>
     </w:p>
     <w:p>
@@ -1230,7 +1230,7 @@
         <w:rPr>
           <w:rFonts w:ascii="Calibri" w:hAnsi="Calibri" w:eastAsia="Microsoft YaHei"/>
         </w:rPr>
-        <w:t>GRID→TIN 和等高线→TIN 都重建普通 Delaunay；严格折线、边界和孔洞应使用独立 dt_cdt_handle。v0.21 单项约束编辑仍采用候选网全量重建；批量事务把 N 次重建降为 1 次，但尚未达到百万点实时局部 CDT 编辑。GUI 土方量测针对水平基准面并使用固定预算数值积分，不等同于工程结算。</w:t>
+        <w:t>GRID→TIN 和等高线→TIN 都重建普通 Delaunay；严格折线、边界和孔洞应使用独立 dt_cdt_handle。v0.22 单项约束编辑仍采用候选网全量重建；批量事务把 N 次重建降为 1 次，但尚未达到百万点实时局部 CDT 编辑。GUI 土方量测针对水平基准面并使用固定预算数值积分，不等同于工程结算。</w:t>
       </w:r>
     </w:p>
     <w:p>
@@ -8144,7 +8144,7 @@
         <w:rPr>
           <w:rFonts w:ascii="Calibri" w:hAnsi="Calibri" w:eastAsia="Microsoft YaHei"/>
         </w:rPr>
-        <w:t>v0.21 单项约束编辑仍完整重建候选 CDT；批量事务只重建一次。100,000 基础点添加 12 条断裂线的本机对比为逐条 3.259 s、批量 0.528 s，约 6.17 倍。请求 output_effect 还会计算完整域差异。未分段交叉仍须先加入共享顶点。</w:t>
+        <w:t>v0.22 单项约束编辑仍完整重建候选 CDT；批量事务只重建一次。100,000 基础点添加 12 条断裂线的本机对比为逐条 3.259 s、批量 0.528 s，约 6.17 倍。请求 output_effect 还会计算完整域差异。未分段交叉仍须先加入共享顶点。</w:t>
       </w:r>
     </w:p>
     <w:p>
@@ -8701,7 +8701,7 @@
         <w:rPr>
           <w:rFonts w:ascii="Calibri" w:hAnsi="Calibri" w:eastAsia="Microsoft YaHei"/>
         </w:rPr>
-        <w:t>dt_grid_derive_terrain() 从源高程 GRID 创建同尺寸、同六参数仿射变换和同 CRS 的标准 dt_grid_handle；源句柄保持不变，输出可继续使用窗口读取、DGRID 保存或 GDAL GeoTIFF/COG 导出。v0.21 新增 dt_grid_derive_terrain_async()，复用统一任务状态、进度和取消接口。输出始终具有 NoData。</w:t>
+        <w:t>dt_grid_derive_terrain() 从源高程 GRID 创建同尺寸、同六参数仿射变换和同 CRS 的标准 dt_grid_handle；源句柄保持不变，输出可继续使用窗口读取、DGRID 保存或 GDAL GeoTIFF/COG 导出。v0.21 接入统一异步任务，v0.22 在相同同步/异步入口下增加分块多线程。输出始终具有 NoData。</w:t>
       </w:r>
     </w:p>
     <w:p>
@@ -8755,6 +8755,26 @@
           <w:sz w:val="17"/>
         </w:rPr>
         <w:t>o.output_nodata_value = -9999.0;</w:t>
+      </w:r>
+      <w:r>
+        <w:br/>
+      </w:r>
+      <w:r>
+        <w:rPr>
+          <w:rFonts w:ascii="Consolas" w:hAnsi="Consolas" w:eastAsia="Microsoft YaHei"/>
+          <w:sz w:val="17"/>
+        </w:rPr>
+        <w:t>o.worker_count = 0;    // 自动线程，内部最多 32</w:t>
+      </w:r>
+      <w:r>
+        <w:br/>
+      </w:r>
+      <w:r>
+        <w:rPr>
+          <w:rFonts w:ascii="Consolas" w:hAnsi="Consolas" w:eastAsia="Microsoft YaHei"/>
+          <w:sz w:val="17"/>
+        </w:rPr>
+        <w:t>o.tile_row_count = 0;  // 默认 64 行一块</w:t>
       </w:r>
       <w:r>
         <w:br/>
@@ -9340,6 +9360,279 @@
         <w:t>内部节点采用中心差分，边界采用单边差分；列/行导数通过完整仿射雅可比转换为世界 XY 梯度。中心或所需四邻域含 NoData 时结果节点写 NoData，在空洞边缘形成一节点安全带。z_factor 为零时选择 1.0，否则必须有限且大于零。output_nodata_value 为零时自动选择 NaN，避免与有效 0°/0 灰度冲突。输出句柄必须由 dt_grid_destroy() 释放。</w:t>
       </w:r>
     </w:p>
+    <w:tbl>
+      <w:tblPr>
+        <w:tblStyle w:val="TableGrid"/>
+        <w:tblW w:type="dxa" w:w="9360"/>
+        <w:jc w:val="left"/>
+        <w:tblLayout w:type="fixed"/>
+        <w:tblLook w:firstColumn="1" w:firstRow="1" w:lastColumn="0" w:lastRow="0" w:noHBand="0" w:noVBand="1" w:val="04A0"/>
+        <w:tblInd w:w="120" w:type="dxa"/>
+      </w:tblPr>
+      <w:tblGrid>
+        <w:gridCol w:w="2500"/>
+        <w:gridCol w:w="2800"/>
+        <w:gridCol w:w="4060"/>
+      </w:tblGrid>
+      <w:tr>
+        <w:trPr>
+          <w:cantSplit/>
+          <w:tblHeader w:val="true"/>
+        </w:trPr>
+        <w:tc>
+          <w:tcPr>
+            <w:tcW w:type="dxa" w:w="2500"/>
+            <w:shd w:fill="E8EEF5"/>
+            <w:tcMar>
+              <w:top w:w="80" w:type="dxa"/>
+              <w:start w:w="120" w:type="dxa"/>
+              <w:bottom w:w="80" w:type="dxa"/>
+              <w:end w:w="120" w:type="dxa"/>
+            </w:tcMar>
+            <w:vAlign w:val="center"/>
+          </w:tcPr>
+          <w:p>
+            <w:pPr>
+              <w:keepNext/>
+              <w:spacing w:before="0" w:after="0"/>
+              <w:jc w:val="center"/>
+            </w:pPr>
+            <w:r>
+              <w:rPr>
+                <w:rFonts w:ascii="Calibri" w:hAnsi="Calibri" w:eastAsia="Microsoft YaHei"/>
+                <w:b/>
+                <w:color w:val="203748"/>
+                <w:sz w:val="19"/>
+              </w:rPr>
+              <w:t>字段</w:t>
+            </w:r>
+          </w:p>
+        </w:tc>
+        <w:tc>
+          <w:tcPr>
+            <w:tcW w:type="dxa" w:w="2800"/>
+            <w:shd w:fill="E8EEF5"/>
+            <w:tcMar>
+              <w:top w:w="80" w:type="dxa"/>
+              <w:start w:w="120" w:type="dxa"/>
+              <w:bottom w:w="80" w:type="dxa"/>
+              <w:end w:w="120" w:type="dxa"/>
+            </w:tcMar>
+            <w:vAlign w:val="center"/>
+          </w:tcPr>
+          <w:p>
+            <w:pPr>
+              <w:keepNext/>
+              <w:spacing w:before="0" w:after="0"/>
+              <w:jc w:val="center"/>
+            </w:pPr>
+            <w:r>
+              <w:rPr>
+                <w:rFonts w:ascii="Calibri" w:hAnsi="Calibri" w:eastAsia="Microsoft YaHei"/>
+                <w:b/>
+                <w:color w:val="203748"/>
+                <w:sz w:val="19"/>
+              </w:rPr>
+              <w:t>零值</w:t>
+            </w:r>
+          </w:p>
+        </w:tc>
+        <w:tc>
+          <w:tcPr>
+            <w:tcW w:type="dxa" w:w="4060"/>
+            <w:shd w:fill="E8EEF5"/>
+            <w:tcMar>
+              <w:top w:w="80" w:type="dxa"/>
+              <w:start w:w="120" w:type="dxa"/>
+              <w:bottom w:w="80" w:type="dxa"/>
+              <w:end w:w="120" w:type="dxa"/>
+            </w:tcMar>
+            <w:vAlign w:val="center"/>
+          </w:tcPr>
+          <w:p>
+            <w:pPr>
+              <w:keepNext/>
+              <w:spacing w:before="0" w:after="0"/>
+              <w:jc w:val="center"/>
+            </w:pPr>
+            <w:r>
+              <w:rPr>
+                <w:rFonts w:ascii="Calibri" w:hAnsi="Calibri" w:eastAsia="Microsoft YaHei"/>
+                <w:b/>
+                <w:color w:val="203748"/>
+                <w:sz w:val="19"/>
+              </w:rPr>
+              <w:t>有效非零值</w:t>
+            </w:r>
+          </w:p>
+        </w:tc>
+      </w:tr>
+      <w:tr>
+        <w:trPr>
+          <w:cantSplit/>
+        </w:trPr>
+        <w:tc>
+          <w:tcPr>
+            <w:tcW w:type="dxa" w:w="2500"/>
+            <w:tcMar>
+              <w:top w:w="80" w:type="dxa"/>
+              <w:start w:w="120" w:type="dxa"/>
+              <w:bottom w:w="80" w:type="dxa"/>
+              <w:end w:w="120" w:type="dxa"/>
+            </w:tcMar>
+            <w:vAlign w:val="center"/>
+          </w:tcPr>
+          <w:p>
+            <w:pPr>
+              <w:spacing w:before="0" w:after="0" w:line="276" w:lineRule="auto"/>
+              <w:jc w:val="left"/>
+            </w:pPr>
+            <w:r>
+              <w:rPr>
+                <w:rFonts w:ascii="Calibri" w:hAnsi="Calibri" w:eastAsia="Microsoft YaHei"/>
+                <w:sz w:val="18"/>
+              </w:rPr>
+              <w:t>worker_count</w:t>
+            </w:r>
+          </w:p>
+        </w:tc>
+        <w:tc>
+          <w:tcPr>
+            <w:tcW w:type="dxa" w:w="2800"/>
+            <w:tcMar>
+              <w:top w:w="80" w:type="dxa"/>
+              <w:start w:w="120" w:type="dxa"/>
+              <w:bottom w:w="80" w:type="dxa"/>
+              <w:end w:w="120" w:type="dxa"/>
+            </w:tcMar>
+            <w:vAlign w:val="center"/>
+          </w:tcPr>
+          <w:p>
+            <w:pPr>
+              <w:spacing w:before="0" w:after="0" w:line="276" w:lineRule="auto"/>
+              <w:jc w:val="left"/>
+            </w:pPr>
+            <w:r>
+              <w:rPr>
+                <w:rFonts w:ascii="Calibri" w:hAnsi="Calibri" w:eastAsia="Microsoft YaHei"/>
+                <w:sz w:val="18"/>
+              </w:rPr>
+              <w:t>自动，最多 32</w:t>
+            </w:r>
+          </w:p>
+        </w:tc>
+        <w:tc>
+          <w:tcPr>
+            <w:tcW w:type="dxa" w:w="4060"/>
+            <w:tcMar>
+              <w:top w:w="80" w:type="dxa"/>
+              <w:start w:w="120" w:type="dxa"/>
+              <w:bottom w:w="80" w:type="dxa"/>
+              <w:end w:w="120" w:type="dxa"/>
+            </w:tcMar>
+            <w:vAlign w:val="center"/>
+          </w:tcPr>
+          <w:p>
+            <w:pPr>
+              <w:spacing w:before="0" w:after="0" w:line="276" w:lineRule="auto"/>
+              <w:jc w:val="left"/>
+            </w:pPr>
+            <w:r>
+              <w:rPr>
+                <w:rFonts w:ascii="Calibri" w:hAnsi="Calibri" w:eastAsia="Microsoft YaHei"/>
+                <w:sz w:val="18"/>
+              </w:rPr>
+              <w:t>1 单线程；2～64 请求线程数</w:t>
+            </w:r>
+          </w:p>
+        </w:tc>
+      </w:tr>
+      <w:tr>
+        <w:trPr>
+          <w:cantSplit/>
+        </w:trPr>
+        <w:tc>
+          <w:tcPr>
+            <w:tcW w:type="dxa" w:w="2500"/>
+            <w:tcMar>
+              <w:top w:w="80" w:type="dxa"/>
+              <w:start w:w="120" w:type="dxa"/>
+              <w:bottom w:w="80" w:type="dxa"/>
+              <w:end w:w="120" w:type="dxa"/>
+            </w:tcMar>
+            <w:vAlign w:val="center"/>
+          </w:tcPr>
+          <w:p>
+            <w:pPr>
+              <w:spacing w:before="0" w:after="0" w:line="276" w:lineRule="auto"/>
+              <w:jc w:val="left"/>
+            </w:pPr>
+            <w:r>
+              <w:rPr>
+                <w:rFonts w:ascii="Calibri" w:hAnsi="Calibri" w:eastAsia="Microsoft YaHei"/>
+                <w:sz w:val="18"/>
+              </w:rPr>
+              <w:t>tile_row_count</w:t>
+            </w:r>
+          </w:p>
+        </w:tc>
+        <w:tc>
+          <w:tcPr>
+            <w:tcW w:type="dxa" w:w="2800"/>
+            <w:tcMar>
+              <w:top w:w="80" w:type="dxa"/>
+              <w:start w:w="120" w:type="dxa"/>
+              <w:bottom w:w="80" w:type="dxa"/>
+              <w:end w:w="120" w:type="dxa"/>
+            </w:tcMar>
+            <w:vAlign w:val="center"/>
+          </w:tcPr>
+          <w:p>
+            <w:pPr>
+              <w:spacing w:before="0" w:after="0" w:line="276" w:lineRule="auto"/>
+              <w:jc w:val="left"/>
+            </w:pPr>
+            <w:r>
+              <w:rPr>
+                <w:rFonts w:ascii="Calibri" w:hAnsi="Calibri" w:eastAsia="Microsoft YaHei"/>
+                <w:sz w:val="18"/>
+              </w:rPr>
+              <w:t>64 行</w:t>
+            </w:r>
+          </w:p>
+        </w:tc>
+        <w:tc>
+          <w:tcPr>
+            <w:tcW w:type="dxa" w:w="4060"/>
+            <w:tcMar>
+              <w:top w:w="80" w:type="dxa"/>
+              <w:start w:w="120" w:type="dxa"/>
+              <w:bottom w:w="80" w:type="dxa"/>
+              <w:end w:w="120" w:type="dxa"/>
+            </w:tcMar>
+            <w:vAlign w:val="center"/>
+          </w:tcPr>
+          <w:p>
+            <w:pPr>
+              <w:spacing w:before="0" w:after="0" w:line="276" w:lineRule="auto"/>
+              <w:jc w:val="left"/>
+            </w:pPr>
+            <w:r>
+              <w:rPr>
+                <w:rFonts w:ascii="Calibri" w:hAnsi="Calibri" w:eastAsia="Microsoft YaHei"/>
+                <w:sz w:val="18"/>
+              </w:rPr>
+              <w:t>1～1048576 行</w:t>
+            </w:r>
+          </w:p>
+        </w:tc>
+      </w:tr>
+    </w:tbl>
+    <w:p>
+      <w:pPr>
+        <w:spacing w:before="0" w:after="40"/>
+      </w:pPr>
+    </w:p>
     <w:p>
       <w:pPr>
         <w:spacing w:before="100" w:after="160" w:line="288" w:lineRule="auto"/>
@@ -9352,13 +9645,67 @@
           <w:b/>
           <w:color w:val="1F4D78"/>
         </w:rPr>
-        <w:t xml:space="preserve">异步、内存与量纲  </w:t>
+        <w:t xml:space="preserve">并行、异步与内存  </w:t>
       </w:r>
       <w:r>
         <w:rPr>
           <w:rFonts w:ascii="Calibri" w:hAnsi="Calibri" w:eastAsia="Microsoft YaHei"/>
         </w:rPr>
-        <w:t>异步任务按输出行更新进度并在下一行前检查取消；取消状态为 DT_TASK_CANCELLED/DT_E_CANCELLED，不发布半成品。任务持有源 GRID 生命周期，成功结果仍是标准 GRID。时间为 O(width×height)，除源 GRID 外还需一个同尺寸 double 输出 GRID。z_factor 用于高程和平面单位换算；如果 XY 为米而 Z 为毫米，应使用 0.001。</w:t>
+        <w:t>选项仍为 80 字节，字段复用原 ABI 预留区。工作线程只写互不重叠的输出行，调用线程串行执行进度/取消回调；取消状态为 DT_TASK_CANCELLED/DT_E_CANCELLED，不发布半成品。无需第二份全幅临时数组，除源 GRID 外主要增加一个同尺寸 double 输出 GRID。z_factor 用于高程和平面单位换算；XY 为米、Z 为毫米时使用 0.001。</w:t>
+      </w:r>
+    </w:p>
+    <w:p>
+      <w:pPr>
+        <w:pStyle w:val="DterrainCode"/>
+        <w:shd w:fill="F2F4F7"/>
+      </w:pPr>
+      <w:r>
+        <w:rPr>
+          <w:rFonts w:ascii="Consolas" w:hAnsi="Consolas" w:eastAsia="Microsoft YaHei"/>
+          <w:sz w:val="17"/>
+        </w:rPr>
+        <w:t># DT_BUILD_BENCHMARKS=ON</w:t>
+      </w:r>
+      <w:r>
+        <w:br/>
+      </w:r>
+      <w:r>
+        <w:rPr>
+          <w:rFonts w:ascii="Consolas" w:hAnsi="Consolas" w:eastAsia="Microsoft YaHei"/>
+          <w:sz w:val="17"/>
+        </w:rPr>
+        <w:t>dterrain_terrain_benchmark.exe 4096 4096 0 64</w:t>
+      </w:r>
+      <w:r>
+        <w:br/>
+      </w:r>
+      <w:r>
+        <w:rPr>
+          <w:rFonts w:ascii="Consolas" w:hAnsi="Consolas" w:eastAsia="Microsoft YaHei"/>
+          <w:sz w:val="17"/>
+        </w:rPr>
+        <w:t># 输出串行/并行秒数、加速比和抽样校验和是否一致</w:t>
+      </w:r>
+    </w:p>
+    <w:p>
+      <w:pPr>
+        <w:spacing w:before="100" w:after="160" w:line="288" w:lineRule="auto"/>
+        <w:ind w:left="230" w:right="230"/>
+        <w:shd w:fill="FFF7E0"/>
+      </w:pPr>
+      <w:r>
+        <w:rPr>
+          <w:rFonts w:ascii="Calibri" w:hAnsi="Calibri" w:eastAsia="Microsoft YaHei"/>
+          <w:b/>
+          <w:color w:val="7A5A00"/>
+        </w:rPr>
+        <w:t xml:space="preserve">本机基准  </w:t>
+      </w:r>
+      <w:r>
+        <w:rPr>
+          <w:rFonts w:ascii="Calibri" w:hAnsi="Calibri" w:eastAsia="Microsoft YaHei"/>
+        </w:rPr>
+        <w:t>4096×4096 坡度 GRID：单线程 0.233 s，自动并行 0.0678 s，约 3.44×，64 点抽样校验和一致。收益受 CPU、内存带宽、尺寸、块高和专题类型影响，不是固定承诺。</w:t>
       </w:r>
     </w:p>
     <w:p>
@@ -13699,7 +14046,7 @@
         <w:rPr>
           <w:rFonts w:ascii="Calibri" w:hAnsi="Calibri" w:eastAsia="Microsoft YaHei"/>
         </w:rPr>
-        <w:t>测试覆盖生命周期、普通 TIN 动态编辑、DTIN/DTMESH/XYZ、TIN/GRID/等高线、等高线反向重建与高程冲突回滚、异步任务，以及 CDT 空网清理、外边界、孔洞、断裂线、交叉失败原子性、TIN→CDT、域内采样、CDT→GRID/等高线、共享顶点保护、批量新增/更新/删除、整批失败回滚和 DCDT 往返。局部坡面测试用解析平面验证 TIN/CDT 的 Z、世界梯度、坡度、坡向和法向，并覆盖孔洞/凸包外拒绝、旋转仿射 GRID 梯度变换、双线性标志和 NoData 拒绝。全幅测试覆盖坡度、坡向、默认光照阴影、CRS 继承、旋转仿射差分、水平坡向 NoData、空洞邻域传播，以及 v0.21 异步专题结果、进度和大 GRID 取消状态。独立剖面数学测试覆盖线性采样、三角形高程、旋转仿射 GRID 双线性插值、NoData 断点和升降/坡度统计；多边形量测测试覆盖凹多边形耳切、大坐标面积稳定性、自相交拒绝、平面解析结果、挖填符号和部分/完全无效域。GDAL 构建还执行 GTiff、COG、GPKG 驱动探测和真实文件往返。</w:t>
+        <w:t>测试覆盖生命周期、普通 TIN 动态编辑、DTIN/DTMESH/XYZ、TIN/GRID/等高线、等高线反向重建与高程冲突回滚、异步任务，以及 CDT 空网清理、外边界、孔洞、断裂线、交叉失败原子性、TIN→CDT、域内采样、CDT→GRID/等高线、共享顶点保护、批量新增/更新/删除、整批失败回滚和 DCDT 往返。局部坡面测试用解析平面验证 TIN/CDT 的 Z、世界梯度、坡度、坡向和法向，并覆盖孔洞/凸包外拒绝、旋转仿射 GRID 梯度变换、双线性标志和 NoData 拒绝。全幅测试覆盖坡度、坡向、默认光照阴影、CRS 继承、旋转仿射差分、水平坡向 NoData、空洞邻域传播、异步专题结果和大 GRID 取消；v0.22 还锁定 80 字节 ABI、串行/并行一致、输出 generation 及线程/块高参数边界。独立剖面数学测试覆盖线性采样、三角形高程、旋转仿射 GRID 双线性插值、NoData 断点和升降/坡度统计；多边形量测测试覆盖凹多边形耳切、大坐标面积稳定性、自相交拒绝、平面解析结果、挖填符号和部分/完全无效域。GDAL 构建还执行 GTiff、COG、GPKG 驱动探测和真实文件往返。</w:t>
       </w:r>
     </w:p>
     <w:p>
@@ -14416,7 +14763,7 @@
         <w:color w:val="66727D"/>
         <w:sz w:val="18"/>
       </w:rPr>
-      <w:t xml:space="preserve">版本 0.21.0  |  第 </w:t>
+      <w:t xml:space="preserve">版本 0.22.0  |  第 </w:t>
     </w:r>
     <w:r>
       <w:rPr>

</xml_diff>

<commit_message>
feat: add dual-surface earthwork analysis
</commit_message>
<xml_diff>
--- a/docs/manuals/dterrain_DLL开发使用手册.docx
+++ b/docs/manuals/dterrain_DLL开发使用手册.docx
@@ -85,7 +85,7 @@
           <w:color w:val="203748"/>
           <w:sz w:val="22"/>
         </w:rPr>
-        <w:t>版本 0.22.0  |  2026-07-17</w:t>
+        <w:t>版本 0.23.0  |  2026-07-18</w:t>
       </w:r>
     </w:p>
     <w:p>
@@ -243,7 +243,7 @@
                 <w:rFonts w:ascii="Calibri" w:hAnsi="Calibri" w:eastAsia="Microsoft YaHei"/>
                 <w:sz w:val="18"/>
               </w:rPr>
-              <w:t>0.22.0</w:t>
+              <w:t>0.23.0</w:t>
             </w:r>
           </w:p>
         </w:tc>
@@ -298,7 +298,7 @@
                 <w:rFonts w:ascii="Calibri" w:hAnsi="Calibri" w:eastAsia="Microsoft YaHei"/>
                 <w:sz w:val="18"/>
               </w:rPr>
-              <w:t>2026-07-17</w:t>
+              <w:t>2026-07-18</w:t>
             </w:r>
           </w:p>
         </w:tc>
@@ -463,7 +463,7 @@
                 <w:rFonts w:ascii="Calibri" w:hAnsi="Calibri" w:eastAsia="Microsoft YaHei"/>
                 <w:sz w:val="18"/>
               </w:rPr>
-              <w:t>架构、构建部署、稳定 C ABI、局部与全幅坡度/坡向/阴影分析、约束 Delaunay、GRID/等高线转换、GDAL 格式交换、异步任务、12 个兼容接口、文件格式、性能、线程安全、故障排查。</w:t>
+              <w:t>架构、构建部署、稳定 C ABI、双 GRID 精确挖填方、局部与全幅坡度/坡向/阴影分析、约束 Delaunay、GRID/等高线转换、GDAL 格式交换、异步任务、12 个兼容接口、文件格式、性能、线程安全、故障排查。</w:t>
             </w:r>
           </w:p>
         </w:tc>
@@ -539,6 +539,17 @@
     </w:p>
     <w:p>
       <w:pPr>
+        <w:pStyle w:val="ListBullet"/>
+      </w:pPr>
+      <w:r>
+        <w:rPr>
+          <w:rFonts w:ascii="Calibri" w:hAnsi="Calibri" w:eastAsia="Microsoft YaHei"/>
+        </w:rPr>
+        <w:t>现状/设计面土方：重点阅读第 4.11 节。</w:t>
+      </w:r>
+    </w:p>
+    <w:p>
+      <w:pPr>
         <w:spacing w:before="100" w:after="160" w:line="288" w:lineRule="auto"/>
         <w:ind w:left="230" w:right="230"/>
         <w:shd w:fill="FFF7E0"/>
@@ -555,7 +566,7 @@
         <w:rPr>
           <w:rFonts w:ascii="Calibri" w:hAnsi="Calibri" w:eastAsia="Microsoft YaHei"/>
         </w:rPr>
-        <w:t>本手册对应 dterrain 0.22.0：全幅 GRID 专题已支持分块多线程、进度、安全取消以及 z-factor/光照/线程/块高参数；选项结构仍为 80 字节，旧零初始化调用兼容。同步接口、专题导出、剖面、土方、GDAL 与约束事务保持兼容。双表面土方、局部 CDT 和 GPU LOD 属于后续阶段。</w:t>
+        <w:t>本手册对应 dterrain 0.23.0：新增匹配现状/设计 GRID 的解析挖填方、差值 GRID、分块并行、进度与安全取消；全幅坡度/坡向/阴影、剖面、水平基准面量测、GDAL 与约束事务保持兼容。局部 CDT、流式超大 GRID 和 GPU LOD 属于后续阶段。</w:t>
       </w:r>
     </w:p>
     <w:p>
@@ -668,6 +679,17 @@
           <w:rFonts w:ascii="Calibri" w:hAnsi="Calibri" w:eastAsia="Microsoft YaHei"/>
         </w:rPr>
         <w:t>从任意仿射 GRID 派生全幅坡度角、下坡坡向角或 0～255 分析阴影，并继承 CRS/NoData。</w:t>
+      </w:r>
+    </w:p>
+    <w:p>
+      <w:pPr>
+        <w:pStyle w:val="ListBullet"/>
+      </w:pPr>
+      <w:r>
+        <w:rPr>
+          <w:rFonts w:ascii="Calibri" w:hAnsi="Calibri" w:eastAsia="Microsoft YaHei"/>
+        </w:rPr>
+        <w:t>匹配现状/设计 GRID 逐单元解析积分挖填方，支持差值 GRID、并行、进度和取消。</w:t>
       </w:r>
     </w:p>
     <w:p>
@@ -1230,7 +1252,7 @@
         <w:rPr>
           <w:rFonts w:ascii="Calibri" w:hAnsi="Calibri" w:eastAsia="Microsoft YaHei"/>
         </w:rPr>
-        <w:t>GRID→TIN 和等高线→TIN 都重建普通 Delaunay；严格折线、边界和孔洞应使用独立 dt_cdt_handle。v0.22 单项约束编辑仍采用候选网全量重建；批量事务把 N 次重建降为 1 次，但尚未达到百万点实时局部 CDT 编辑。GUI 土方量测针对水平基准面并使用固定预算数值积分，不等同于工程结算。</w:t>
+        <w:t>GRID→TIN 和等高线→TIN 都重建普通 Delaunay；严格折线、边界和孔洞应使用独立 dt_cdt_handle。v0.23 单项约束编辑仍采用候选网全量重建；批量事务把 N 次重建降为 1 次，但尚未达到百万点实时局部 CDT 编辑。GUI 多边形土方针对水平基准面并使用固定预算数值积分；双 GRID 接口则对节点匹配的现状/设计面作分片线性解析积分。二者均需结合项目规范复核后用于工程结算。</w:t>
       </w:r>
     </w:p>
     <w:p>
@@ -8144,7 +8166,7 @@
         <w:rPr>
           <w:rFonts w:ascii="Calibri" w:hAnsi="Calibri" w:eastAsia="Microsoft YaHei"/>
         </w:rPr>
-        <w:t>v0.22 单项约束编辑仍完整重建候选 CDT；批量事务只重建一次。100,000 基础点添加 12 条断裂线的本机对比为逐条 3.259 s、批量 0.528 s，约 6.17 倍。请求 output_effect 还会计算完整域差异。未分段交叉仍须先加入共享顶点。</w:t>
+        <w:t>v0.23 单项约束编辑仍完整重建候选 CDT；批量事务只重建一次。100,000 基础点添加 12 条断裂线的本机对比为逐条 3.259 s、批量 0.528 s，约 6.17 倍。请求 output_effect 还会计算完整域差异。未分段交叉仍须先加入共享顶点。</w:t>
       </w:r>
     </w:p>
     <w:p>
@@ -9706,6 +9728,890 @@
           <w:rFonts w:ascii="Calibri" w:hAnsi="Calibri" w:eastAsia="Microsoft YaHei"/>
         </w:rPr>
         <w:t>4096×4096 坡度 GRID：单线程 0.233 s，自动并行 0.0678 s，约 3.44×，64 点抽样校验和一致。收益受 CPU、内存带宽、尺寸、块高和专题类型影响，不是固定承诺。</w:t>
+      </w:r>
+    </w:p>
+    <w:p>
+      <w:pPr>
+        <w:pStyle w:val="Heading2"/>
+      </w:pPr>
+      <w:r>
+        <w:t>4.11 现状/设计双 GRID 精确挖填方</w:t>
+      </w:r>
+    </w:p>
+    <w:p>
+      <w:r>
+        <w:rPr>
+          <w:rFonts w:ascii="Calibri" w:hAnsi="Calibri" w:eastAsia="Microsoft YaHei"/>
+        </w:rPr>
+        <w:t>dt_grid_compare_earthwork() 比较节点数、完整六参数仿射变换和 CRS 一致的现状 GRID 与设计 GRID。高差定义为 existing×existing_z_factor − design×design_z_factor：正值计挖方，负值的绝对体积计填方，净方为挖方减填方。输出统计按世界 XY 面积计算，因此旋转、剪切或负像元高的仿射 GRID 同样适用。</w:t>
+      </w:r>
+    </w:p>
+    <w:p>
+      <w:pPr>
+        <w:pStyle w:val="DterrainCode"/>
+        <w:shd w:fill="F2F4F7"/>
+      </w:pPr>
+      <w:r>
+        <w:rPr>
+          <w:rFonts w:ascii="Consolas" w:hAnsi="Consolas" w:eastAsia="Microsoft YaHei"/>
+          <w:sz w:val="17"/>
+        </w:rPr>
+        <w:t>dt_grid_earthwork_options o{};</w:t>
+      </w:r>
+      <w:r>
+        <w:br/>
+      </w:r>
+      <w:r>
+        <w:rPr>
+          <w:rFonts w:ascii="Consolas" w:hAnsi="Consolas" w:eastAsia="Microsoft YaHei"/>
+          <w:sz w:val="17"/>
+        </w:rPr>
+        <w:t>o.struct_size = sizeof(o);</w:t>
+      </w:r>
+      <w:r>
+        <w:br/>
+      </w:r>
+      <w:r>
+        <w:rPr>
+          <w:rFonts w:ascii="Consolas" w:hAnsi="Consolas" w:eastAsia="Microsoft YaHei"/>
+          <w:sz w:val="17"/>
+        </w:rPr>
+        <w:t>o.flags = DT_GRID_EARTHWORK_OUTPUT_DIFFERENCE_GRID;</w:t>
+      </w:r>
+      <w:r>
+        <w:br/>
+      </w:r>
+      <w:r>
+        <w:rPr>
+          <w:rFonts w:ascii="Consolas" w:hAnsi="Consolas" w:eastAsia="Microsoft YaHei"/>
+          <w:sz w:val="17"/>
+        </w:rPr>
+        <w:t>o.worker_count = 0;   // 自动线程，最多 64</w:t>
+      </w:r>
+      <w:r>
+        <w:br/>
+      </w:r>
+      <w:r>
+        <w:rPr>
+          <w:rFonts w:ascii="Consolas" w:hAnsi="Consolas" w:eastAsia="Microsoft YaHei"/>
+          <w:sz w:val="17"/>
+        </w:rPr>
+        <w:t>o.tile_row_count = 0; // 默认 64 个单元行</w:t>
+      </w:r>
+      <w:r>
+        <w:br/>
+      </w:r>
+      <w:r>
+        <w:rPr>
+          <w:rFonts w:ascii="Consolas" w:hAnsi="Consolas" w:eastAsia="Microsoft YaHei"/>
+          <w:sz w:val="17"/>
+        </w:rPr>
+        <w:t>o.existing_z_factor = 1.0;</w:t>
+      </w:r>
+      <w:r>
+        <w:br/>
+      </w:r>
+      <w:r>
+        <w:rPr>
+          <w:rFonts w:ascii="Consolas" w:hAnsi="Consolas" w:eastAsia="Microsoft YaHei"/>
+          <w:sz w:val="17"/>
+        </w:rPr>
+        <w:t>o.design_z_factor = 1.0;</w:t>
+      </w:r>
+      <w:r>
+        <w:br/>
+      </w:r>
+      <w:r>
+        <w:rPr>
+          <w:rFonts w:ascii="Consolas" w:hAnsi="Consolas" w:eastAsia="Microsoft YaHei"/>
+          <w:sz w:val="17"/>
+        </w:rPr>
+        <w:t>o.output_nodata_value = -9999.0;</w:t>
+      </w:r>
+      <w:r>
+        <w:br/>
+      </w:r>
+      <w:r>
+        <w:rPr>
+          <w:rFonts w:ascii="Consolas" w:hAnsi="Consolas" w:eastAsia="Microsoft YaHei"/>
+          <w:sz w:val="17"/>
+        </w:rPr>
+      </w:r>
+      <w:r>
+        <w:br/>
+      </w:r>
+      <w:r>
+        <w:rPr>
+          <w:rFonts w:ascii="Consolas" w:hAnsi="Consolas" w:eastAsia="Microsoft YaHei"/>
+          <w:sz w:val="17"/>
+        </w:rPr>
+        <w:t>dt_grid_earthwork_result r{};</w:t>
+      </w:r>
+      <w:r>
+        <w:br/>
+      </w:r>
+      <w:r>
+        <w:rPr>
+          <w:rFonts w:ascii="Consolas" w:hAnsi="Consolas" w:eastAsia="Microsoft YaHei"/>
+          <w:sz w:val="17"/>
+        </w:rPr>
+        <w:t>r.struct_size = sizeof(r);</w:t>
+      </w:r>
+      <w:r>
+        <w:br/>
+      </w:r>
+      <w:r>
+        <w:rPr>
+          <w:rFonts w:ascii="Consolas" w:hAnsi="Consolas" w:eastAsia="Microsoft YaHei"/>
+          <w:sz w:val="17"/>
+        </w:rPr>
+        <w:t>dt_grid_handle difference = nullptr;</w:t>
+      </w:r>
+      <w:r>
+        <w:br/>
+      </w:r>
+      <w:r>
+        <w:rPr>
+          <w:rFonts w:ascii="Consolas" w:hAnsi="Consolas" w:eastAsia="Microsoft YaHei"/>
+          <w:sz w:val="17"/>
+        </w:rPr>
+        <w:t>dt_status s = dt_grid_compare_earthwork(existing, design, &amp;o,</w:t>
+      </w:r>
+      <w:r>
+        <w:br/>
+      </w:r>
+      <w:r>
+        <w:rPr>
+          <w:rFonts w:ascii="Consolas" w:hAnsi="Consolas" w:eastAsia="Microsoft YaHei"/>
+          <w:sz w:val="17"/>
+        </w:rPr>
+        <w:t xml:space="preserve">                                        &amp;r, &amp;difference);</w:t>
+      </w:r>
+      <w:r>
+        <w:br/>
+      </w:r>
+      <w:r>
+        <w:rPr>
+          <w:rFonts w:ascii="Consolas" w:hAnsi="Consolas" w:eastAsia="Microsoft YaHei"/>
+          <w:sz w:val="17"/>
+        </w:rPr>
+        <w:t>if (s == DT_OK) {</w:t>
+      </w:r>
+      <w:r>
+        <w:br/>
+      </w:r>
+      <w:r>
+        <w:rPr>
+          <w:rFonts w:ascii="Consolas" w:hAnsi="Consolas" w:eastAsia="Microsoft YaHei"/>
+          <w:sz w:val="17"/>
+        </w:rPr>
+        <w:t xml:space="preserve">    // 使用 r.cut_volume / r.fill_volume / r.net_volume</w:t>
+      </w:r>
+      <w:r>
+        <w:br/>
+      </w:r>
+      <w:r>
+        <w:rPr>
+          <w:rFonts w:ascii="Consolas" w:hAnsi="Consolas" w:eastAsia="Microsoft YaHei"/>
+          <w:sz w:val="17"/>
+        </w:rPr>
+        <w:t xml:space="preserve">    dt_grid_save_text(difference, "difference.dgrid");</w:t>
+      </w:r>
+      <w:r>
+        <w:br/>
+      </w:r>
+      <w:r>
+        <w:rPr>
+          <w:rFonts w:ascii="Consolas" w:hAnsi="Consolas" w:eastAsia="Microsoft YaHei"/>
+          <w:sz w:val="17"/>
+        </w:rPr>
+        <w:t xml:space="preserve">    dt_grid_destroy(difference);</w:t>
+      </w:r>
+      <w:r>
+        <w:br/>
+      </w:r>
+      <w:r>
+        <w:rPr>
+          <w:rFonts w:ascii="Consolas" w:hAnsi="Consolas" w:eastAsia="Microsoft YaHei"/>
+          <w:sz w:val="17"/>
+        </w:rPr>
+        <w:t>}</w:t>
+      </w:r>
+    </w:p>
+    <w:tbl>
+      <w:tblPr>
+        <w:tblStyle w:val="TableGrid"/>
+        <w:tblW w:type="dxa" w:w="9360"/>
+        <w:jc w:val="left"/>
+        <w:tblLayout w:type="fixed"/>
+        <w:tblLook w:firstColumn="1" w:firstRow="1" w:lastColumn="0" w:lastRow="0" w:noHBand="0" w:noVBand="1" w:val="04A0"/>
+        <w:tblInd w:w="120" w:type="dxa"/>
+      </w:tblPr>
+      <w:tblGrid>
+        <w:gridCol w:w="2300"/>
+        <w:gridCol w:w="3300"/>
+        <w:gridCol w:w="3760"/>
+      </w:tblGrid>
+      <w:tr>
+        <w:trPr>
+          <w:cantSplit/>
+          <w:tblHeader w:val="true"/>
+        </w:trPr>
+        <w:tc>
+          <w:tcPr>
+            <w:tcW w:type="dxa" w:w="2300"/>
+            <w:shd w:fill="E8EEF5"/>
+            <w:tcMar>
+              <w:top w:w="80" w:type="dxa"/>
+              <w:start w:w="120" w:type="dxa"/>
+              <w:bottom w:w="80" w:type="dxa"/>
+              <w:end w:w="120" w:type="dxa"/>
+            </w:tcMar>
+            <w:vAlign w:val="center"/>
+          </w:tcPr>
+          <w:p>
+            <w:pPr>
+              <w:keepNext/>
+              <w:spacing w:before="0" w:after="0"/>
+              <w:jc w:val="center"/>
+            </w:pPr>
+            <w:r>
+              <w:rPr>
+                <w:rFonts w:ascii="Calibri" w:hAnsi="Calibri" w:eastAsia="Microsoft YaHei"/>
+                <w:b/>
+                <w:color w:val="203748"/>
+                <w:sz w:val="19"/>
+              </w:rPr>
+              <w:t>结果</w:t>
+            </w:r>
+          </w:p>
+        </w:tc>
+        <w:tc>
+          <w:tcPr>
+            <w:tcW w:type="dxa" w:w="3300"/>
+            <w:shd w:fill="E8EEF5"/>
+            <w:tcMar>
+              <w:top w:w="80" w:type="dxa"/>
+              <w:start w:w="120" w:type="dxa"/>
+              <w:bottom w:w="80" w:type="dxa"/>
+              <w:end w:w="120" w:type="dxa"/>
+            </w:tcMar>
+            <w:vAlign w:val="center"/>
+          </w:tcPr>
+          <w:p>
+            <w:pPr>
+              <w:keepNext/>
+              <w:spacing w:before="0" w:after="0"/>
+              <w:jc w:val="center"/>
+            </w:pPr>
+            <w:r>
+              <w:rPr>
+                <w:rFonts w:ascii="Calibri" w:hAnsi="Calibri" w:eastAsia="Microsoft YaHei"/>
+                <w:b/>
+                <w:color w:val="203748"/>
+                <w:sz w:val="19"/>
+              </w:rPr>
+              <w:t>定义</w:t>
+            </w:r>
+          </w:p>
+        </w:tc>
+        <w:tc>
+          <w:tcPr>
+            <w:tcW w:type="dxa" w:w="3760"/>
+            <w:shd w:fill="E8EEF5"/>
+            <w:tcMar>
+              <w:top w:w="80" w:type="dxa"/>
+              <w:start w:w="120" w:type="dxa"/>
+              <w:bottom w:w="80" w:type="dxa"/>
+              <w:end w:w="120" w:type="dxa"/>
+            </w:tcMar>
+            <w:vAlign w:val="center"/>
+          </w:tcPr>
+          <w:p>
+            <w:pPr>
+              <w:keepNext/>
+              <w:spacing w:before="0" w:after="0"/>
+              <w:jc w:val="center"/>
+            </w:pPr>
+            <w:r>
+              <w:rPr>
+                <w:rFonts w:ascii="Calibri" w:hAnsi="Calibri" w:eastAsia="Microsoft YaHei"/>
+                <w:b/>
+                <w:color w:val="203748"/>
+                <w:sz w:val="19"/>
+              </w:rPr>
+              <w:t>说明</w:t>
+            </w:r>
+          </w:p>
+        </w:tc>
+      </w:tr>
+      <w:tr>
+        <w:trPr>
+          <w:cantSplit/>
+        </w:trPr>
+        <w:tc>
+          <w:tcPr>
+            <w:tcW w:type="dxa" w:w="2300"/>
+            <w:tcMar>
+              <w:top w:w="80" w:type="dxa"/>
+              <w:start w:w="120" w:type="dxa"/>
+              <w:bottom w:w="80" w:type="dxa"/>
+              <w:end w:w="120" w:type="dxa"/>
+            </w:tcMar>
+            <w:vAlign w:val="center"/>
+          </w:tcPr>
+          <w:p>
+            <w:pPr>
+              <w:spacing w:before="0" w:after="0" w:line="276" w:lineRule="auto"/>
+              <w:jc w:val="center"/>
+            </w:pPr>
+            <w:r>
+              <w:rPr>
+                <w:rFonts w:ascii="Calibri" w:hAnsi="Calibri" w:eastAsia="Microsoft YaHei"/>
+                <w:sz w:val="18"/>
+              </w:rPr>
+              <w:t>cut/fill/net_volume</w:t>
+            </w:r>
+          </w:p>
+        </w:tc>
+        <w:tc>
+          <w:tcPr>
+            <w:tcW w:type="dxa" w:w="3300"/>
+            <w:tcMar>
+              <w:top w:w="80" w:type="dxa"/>
+              <w:start w:w="120" w:type="dxa"/>
+              <w:bottom w:w="80" w:type="dxa"/>
+              <w:end w:w="120" w:type="dxa"/>
+            </w:tcMar>
+            <w:vAlign w:val="center"/>
+          </w:tcPr>
+          <w:p>
+            <w:pPr>
+              <w:spacing w:before="0" w:after="0" w:line="276" w:lineRule="auto"/>
+              <w:jc w:val="left"/>
+            </w:pPr>
+            <w:r>
+              <w:rPr>
+                <w:rFonts w:ascii="Calibri" w:hAnsi="Calibri" w:eastAsia="Microsoft YaHei"/>
+                <w:sz w:val="18"/>
+              </w:rPr>
+              <w:t>挖方、填方、挖方−填方</w:t>
+            </w:r>
+          </w:p>
+        </w:tc>
+        <w:tc>
+          <w:tcPr>
+            <w:tcW w:type="dxa" w:w="3760"/>
+            <w:tcMar>
+              <w:top w:w="80" w:type="dxa"/>
+              <w:start w:w="120" w:type="dxa"/>
+              <w:bottom w:w="80" w:type="dxa"/>
+              <w:end w:w="120" w:type="dxa"/>
+            </w:tcMar>
+            <w:vAlign w:val="center"/>
+          </w:tcPr>
+          <w:p>
+            <w:pPr>
+              <w:spacing w:before="0" w:after="0" w:line="276" w:lineRule="auto"/>
+              <w:jc w:val="left"/>
+            </w:pPr>
+            <w:r>
+              <w:rPr>
+                <w:rFonts w:ascii="Calibri" w:hAnsi="Calibri" w:eastAsia="Microsoft YaHei"/>
+                <w:sz w:val="18"/>
+              </w:rPr>
+              <w:t>按每个网格单元的两个线性三角面解析积分</w:t>
+            </w:r>
+          </w:p>
+        </w:tc>
+      </w:tr>
+      <w:tr>
+        <w:trPr>
+          <w:cantSplit/>
+        </w:trPr>
+        <w:tc>
+          <w:tcPr>
+            <w:tcW w:type="dxa" w:w="2300"/>
+            <w:tcMar>
+              <w:top w:w="80" w:type="dxa"/>
+              <w:start w:w="120" w:type="dxa"/>
+              <w:bottom w:w="80" w:type="dxa"/>
+              <w:end w:w="120" w:type="dxa"/>
+            </w:tcMar>
+            <w:vAlign w:val="center"/>
+          </w:tcPr>
+          <w:p>
+            <w:pPr>
+              <w:spacing w:before="0" w:after="0" w:line="276" w:lineRule="auto"/>
+              <w:jc w:val="center"/>
+            </w:pPr>
+            <w:r>
+              <w:rPr>
+                <w:rFonts w:ascii="Calibri" w:hAnsi="Calibri" w:eastAsia="Microsoft YaHei"/>
+                <w:sz w:val="18"/>
+              </w:rPr>
+              <w:t>total/valid_area</w:t>
+            </w:r>
+          </w:p>
+        </w:tc>
+        <w:tc>
+          <w:tcPr>
+            <w:tcW w:type="dxa" w:w="3300"/>
+            <w:tcMar>
+              <w:top w:w="80" w:type="dxa"/>
+              <w:start w:w="120" w:type="dxa"/>
+              <w:bottom w:w="80" w:type="dxa"/>
+              <w:end w:w="120" w:type="dxa"/>
+            </w:tcMar>
+            <w:vAlign w:val="center"/>
+          </w:tcPr>
+          <w:p>
+            <w:pPr>
+              <w:spacing w:before="0" w:after="0" w:line="276" w:lineRule="auto"/>
+              <w:jc w:val="left"/>
+            </w:pPr>
+            <w:r>
+              <w:rPr>
+                <w:rFonts w:ascii="Calibri" w:hAnsi="Calibri" w:eastAsia="Microsoft YaHei"/>
+                <w:sz w:val="18"/>
+              </w:rPr>
+              <w:t>总平面面积、有效平面面积</w:t>
+            </w:r>
+          </w:p>
+        </w:tc>
+        <w:tc>
+          <w:tcPr>
+            <w:tcW w:type="dxa" w:w="3760"/>
+            <w:tcMar>
+              <w:top w:w="80" w:type="dxa"/>
+              <w:start w:w="120" w:type="dxa"/>
+              <w:bottom w:w="80" w:type="dxa"/>
+              <w:end w:w="120" w:type="dxa"/>
+            </w:tcMar>
+            <w:vAlign w:val="center"/>
+          </w:tcPr>
+          <w:p>
+            <w:pPr>
+              <w:spacing w:before="0" w:after="0" w:line="276" w:lineRule="auto"/>
+              <w:jc w:val="left"/>
+            </w:pPr>
+            <w:r>
+              <w:rPr>
+                <w:rFonts w:ascii="Calibri" w:hAnsi="Calibri" w:eastAsia="Microsoft YaHei"/>
+                <w:sz w:val="18"/>
+              </w:rPr>
+              <w:t>coverage_ratio = valid_area / total_area</w:t>
+            </w:r>
+          </w:p>
+        </w:tc>
+      </w:tr>
+      <w:tr>
+        <w:trPr>
+          <w:cantSplit/>
+        </w:trPr>
+        <w:tc>
+          <w:tcPr>
+            <w:tcW w:type="dxa" w:w="2300"/>
+            <w:tcMar>
+              <w:top w:w="80" w:type="dxa"/>
+              <w:start w:w="120" w:type="dxa"/>
+              <w:bottom w:w="80" w:type="dxa"/>
+              <w:end w:w="120" w:type="dxa"/>
+            </w:tcMar>
+            <w:vAlign w:val="center"/>
+          </w:tcPr>
+          <w:p>
+            <w:pPr>
+              <w:spacing w:before="0" w:after="0" w:line="276" w:lineRule="auto"/>
+              <w:jc w:val="center"/>
+            </w:pPr>
+            <w:r>
+              <w:rPr>
+                <w:rFonts w:ascii="Calibri" w:hAnsi="Calibri" w:eastAsia="Microsoft YaHei"/>
+                <w:sz w:val="18"/>
+              </w:rPr>
+              <w:t>min/max/mean_difference</w:t>
+            </w:r>
+          </w:p>
+        </w:tc>
+        <w:tc>
+          <w:tcPr>
+            <w:tcW w:type="dxa" w:w="3300"/>
+            <w:tcMar>
+              <w:top w:w="80" w:type="dxa"/>
+              <w:start w:w="120" w:type="dxa"/>
+              <w:bottom w:w="80" w:type="dxa"/>
+              <w:end w:w="120" w:type="dxa"/>
+            </w:tcMar>
+            <w:vAlign w:val="center"/>
+          </w:tcPr>
+          <w:p>
+            <w:pPr>
+              <w:spacing w:before="0" w:after="0" w:line="276" w:lineRule="auto"/>
+              <w:jc w:val="left"/>
+            </w:pPr>
+            <w:r>
+              <w:rPr>
+                <w:rFonts w:ascii="Calibri" w:hAnsi="Calibri" w:eastAsia="Microsoft YaHei"/>
+                <w:sz w:val="18"/>
+              </w:rPr>
+              <w:t>节点高差范围与面积加权均值</w:t>
+            </w:r>
+          </w:p>
+        </w:tc>
+        <w:tc>
+          <w:tcPr>
+            <w:tcW w:type="dxa" w:w="3760"/>
+            <w:tcMar>
+              <w:top w:w="80" w:type="dxa"/>
+              <w:start w:w="120" w:type="dxa"/>
+              <w:bottom w:w="80" w:type="dxa"/>
+              <w:end w:w="120" w:type="dxa"/>
+            </w:tcMar>
+            <w:vAlign w:val="center"/>
+          </w:tcPr>
+          <w:p>
+            <w:pPr>
+              <w:spacing w:before="0" w:after="0" w:line="276" w:lineRule="auto"/>
+              <w:jc w:val="left"/>
+            </w:pPr>
+            <w:r>
+              <w:rPr>
+                <w:rFonts w:ascii="Calibri" w:hAnsi="Calibri" w:eastAsia="Microsoft YaHei"/>
+                <w:sz w:val="18"/>
+              </w:rPr>
+              <w:t>符号遵循现状减设计</w:t>
+            </w:r>
+          </w:p>
+        </w:tc>
+      </w:tr>
+      <w:tr>
+        <w:trPr>
+          <w:cantSplit/>
+        </w:trPr>
+        <w:tc>
+          <w:tcPr>
+            <w:tcW w:type="dxa" w:w="2300"/>
+            <w:tcMar>
+              <w:top w:w="80" w:type="dxa"/>
+              <w:start w:w="120" w:type="dxa"/>
+              <w:bottom w:w="80" w:type="dxa"/>
+              <w:end w:w="120" w:type="dxa"/>
+            </w:tcMar>
+            <w:vAlign w:val="center"/>
+          </w:tcPr>
+          <w:p>
+            <w:pPr>
+              <w:spacing w:before="0" w:after="0" w:line="276" w:lineRule="auto"/>
+              <w:jc w:val="center"/>
+            </w:pPr>
+            <w:r>
+              <w:rPr>
+                <w:rFonts w:ascii="Calibri" w:hAnsi="Calibri" w:eastAsia="Microsoft YaHei"/>
+                <w:sz w:val="18"/>
+              </w:rPr>
+              <w:t>rms_difference</w:t>
+            </w:r>
+          </w:p>
+        </w:tc>
+        <w:tc>
+          <w:tcPr>
+            <w:tcW w:type="dxa" w:w="3300"/>
+            <w:tcMar>
+              <w:top w:w="80" w:type="dxa"/>
+              <w:start w:w="120" w:type="dxa"/>
+              <w:bottom w:w="80" w:type="dxa"/>
+              <w:end w:w="120" w:type="dxa"/>
+            </w:tcMar>
+            <w:vAlign w:val="center"/>
+          </w:tcPr>
+          <w:p>
+            <w:pPr>
+              <w:spacing w:before="0" w:after="0" w:line="276" w:lineRule="auto"/>
+              <w:jc w:val="left"/>
+            </w:pPr>
+            <w:r>
+              <w:rPr>
+                <w:rFonts w:ascii="Calibri" w:hAnsi="Calibri" w:eastAsia="Microsoft YaHei"/>
+                <w:sz w:val="18"/>
+              </w:rPr>
+              <w:t>高差均方根</w:t>
+            </w:r>
+          </w:p>
+        </w:tc>
+        <w:tc>
+          <w:tcPr>
+            <w:tcW w:type="dxa" w:w="3760"/>
+            <w:tcMar>
+              <w:top w:w="80" w:type="dxa"/>
+              <w:start w:w="120" w:type="dxa"/>
+              <w:bottom w:w="80" w:type="dxa"/>
+              <w:end w:w="120" w:type="dxa"/>
+            </w:tcMar>
+            <w:vAlign w:val="center"/>
+          </w:tcPr>
+          <w:p>
+            <w:pPr>
+              <w:spacing w:before="0" w:after="0" w:line="276" w:lineRule="auto"/>
+              <w:jc w:val="left"/>
+            </w:pPr>
+            <w:r>
+              <w:rPr>
+                <w:rFonts w:ascii="Calibri" w:hAnsi="Calibri" w:eastAsia="Microsoft YaHei"/>
+                <w:sz w:val="18"/>
+              </w:rPr>
+              <w:t>使用线性三角面上 d² 的解析积分</w:t>
+            </w:r>
+          </w:p>
+        </w:tc>
+      </w:tr>
+      <w:tr>
+        <w:trPr>
+          <w:cantSplit/>
+        </w:trPr>
+        <w:tc>
+          <w:tcPr>
+            <w:tcW w:type="dxa" w:w="2300"/>
+            <w:tcMar>
+              <w:top w:w="80" w:type="dxa"/>
+              <w:start w:w="120" w:type="dxa"/>
+              <w:bottom w:w="80" w:type="dxa"/>
+              <w:end w:w="120" w:type="dxa"/>
+            </w:tcMar>
+            <w:vAlign w:val="center"/>
+          </w:tcPr>
+          <w:p>
+            <w:pPr>
+              <w:spacing w:before="0" w:after="0" w:line="276" w:lineRule="auto"/>
+              <w:jc w:val="center"/>
+            </w:pPr>
+            <w:r>
+              <w:rPr>
+                <w:rFonts w:ascii="Calibri" w:hAnsi="Calibri" w:eastAsia="Microsoft YaHei"/>
+                <w:sz w:val="18"/>
+              </w:rPr>
+              <w:t>difference GRID</w:t>
+            </w:r>
+          </w:p>
+        </w:tc>
+        <w:tc>
+          <w:tcPr>
+            <w:tcW w:type="dxa" w:w="3300"/>
+            <w:tcMar>
+              <w:top w:w="80" w:type="dxa"/>
+              <w:start w:w="120" w:type="dxa"/>
+              <w:bottom w:w="80" w:type="dxa"/>
+              <w:end w:w="120" w:type="dxa"/>
+            </w:tcMar>
+            <w:vAlign w:val="center"/>
+          </w:tcPr>
+          <w:p>
+            <w:pPr>
+              <w:spacing w:before="0" w:after="0" w:line="276" w:lineRule="auto"/>
+              <w:jc w:val="left"/>
+            </w:pPr>
+            <w:r>
+              <w:rPr>
+                <w:rFonts w:ascii="Calibri" w:hAnsi="Calibri" w:eastAsia="Microsoft YaHei"/>
+                <w:sz w:val="18"/>
+              </w:rPr>
+              <w:t>逐节点现状减设计</w:t>
+            </w:r>
+          </w:p>
+        </w:tc>
+        <w:tc>
+          <w:tcPr>
+            <w:tcW w:type="dxa" w:w="3760"/>
+            <w:tcMar>
+              <w:top w:w="80" w:type="dxa"/>
+              <w:start w:w="120" w:type="dxa"/>
+              <w:bottom w:w="80" w:type="dxa"/>
+              <w:end w:w="120" w:type="dxa"/>
+            </w:tcMar>
+            <w:vAlign w:val="center"/>
+          </w:tcPr>
+          <w:p>
+            <w:pPr>
+              <w:spacing w:before="0" w:after="0" w:line="276" w:lineRule="auto"/>
+              <w:jc w:val="left"/>
+            </w:pPr>
+            <w:r>
+              <w:rPr>
+                <w:rFonts w:ascii="Calibri" w:hAnsi="Calibri" w:eastAsia="Microsoft YaHei"/>
+                <w:sz w:val="18"/>
+              </w:rPr>
+              <w:t>可选；保持现状 GRID 的仿射和 CRS</w:t>
+            </w:r>
+          </w:p>
+        </w:tc>
+      </w:tr>
+    </w:tbl>
+    <w:p>
+      <w:pPr>
+        <w:spacing w:before="0" w:after="40"/>
+      </w:pPr>
+    </w:p>
+    <w:p>
+      <w:r>
+        <w:rPr>
+          <w:rFonts w:ascii="Calibri" w:hAnsi="Calibri" w:eastAsia="Microsoft YaHei"/>
+        </w:rPr>
+        <w:t>每个四节点单元固定按左上—右下对角线剖分。高差全同号时直接积分；跨越零高差线时，在三角形边上解析求交并分别积分挖、填子多边形，不依赖采样密度。默认任一角点为 NoData 就跳过整个单元；设置 DT_GRID_EARTHWORK_ALLOW_PARTIAL_CELLS 后，可独立保留四角均有效的半单元三角形。</w:t>
+      </w:r>
+    </w:p>
+    <w:p>
+      <w:pPr>
+        <w:pStyle w:val="DterrainCode"/>
+        <w:shd w:fill="F2F4F7"/>
+      </w:pPr>
+      <w:r>
+        <w:rPr>
+          <w:rFonts w:ascii="Consolas" w:hAnsi="Consolas" w:eastAsia="Microsoft YaHei"/>
+          <w:sz w:val="17"/>
+        </w:rPr>
+        <w:t>dt_task_handle task = nullptr;</w:t>
+      </w:r>
+      <w:r>
+        <w:br/>
+      </w:r>
+      <w:r>
+        <w:rPr>
+          <w:rFonts w:ascii="Consolas" w:hAnsi="Consolas" w:eastAsia="Microsoft YaHei"/>
+          <w:sz w:val="17"/>
+        </w:rPr>
+        <w:t>dt_grid_compare_earthwork_async(existing, design, &amp;o, &amp;task);</w:t>
+      </w:r>
+      <w:r>
+        <w:br/>
+      </w:r>
+      <w:r>
+        <w:rPr>
+          <w:rFonts w:ascii="Consolas" w:hAnsi="Consolas" w:eastAsia="Microsoft YaHei"/>
+          <w:sz w:val="17"/>
+        </w:rPr>
+        <w:t>// 用 dt_task_get_info() 读取 0..1 进度；需要时请求取消</w:t>
+      </w:r>
+      <w:r>
+        <w:br/>
+      </w:r>
+      <w:r>
+        <w:rPr>
+          <w:rFonts w:ascii="Consolas" w:hAnsi="Consolas" w:eastAsia="Microsoft YaHei"/>
+          <w:sz w:val="17"/>
+        </w:rPr>
+        <w:t>dt_grid_earthwork_result r{};</w:t>
+      </w:r>
+      <w:r>
+        <w:br/>
+      </w:r>
+      <w:r>
+        <w:rPr>
+          <w:rFonts w:ascii="Consolas" w:hAnsi="Consolas" w:eastAsia="Microsoft YaHei"/>
+          <w:sz w:val="17"/>
+        </w:rPr>
+        <w:t>r.struct_size = sizeof(r);</w:t>
+      </w:r>
+      <w:r>
+        <w:br/>
+      </w:r>
+      <w:r>
+        <w:rPr>
+          <w:rFonts w:ascii="Consolas" w:hAnsi="Consolas" w:eastAsia="Microsoft YaHei"/>
+          <w:sz w:val="17"/>
+        </w:rPr>
+        <w:t>dt_grid_handle difference = nullptr;</w:t>
+      </w:r>
+      <w:r>
+        <w:br/>
+      </w:r>
+      <w:r>
+        <w:rPr>
+          <w:rFonts w:ascii="Consolas" w:hAnsi="Consolas" w:eastAsia="Microsoft YaHei"/>
+          <w:sz w:val="17"/>
+        </w:rPr>
+        <w:t>if (dt_task_get_earthwork_result(task, &amp;r, &amp;difference) == DT_OK) {</w:t>
+      </w:r>
+      <w:r>
+        <w:br/>
+      </w:r>
+      <w:r>
+        <w:rPr>
+          <w:rFonts w:ascii="Consolas" w:hAnsi="Consolas" w:eastAsia="Microsoft YaHei"/>
+          <w:sz w:val="17"/>
+        </w:rPr>
+        <w:t xml:space="preserve">    // difference 为调用方拥有的新句柄</w:t>
+      </w:r>
+      <w:r>
+        <w:br/>
+      </w:r>
+      <w:r>
+        <w:rPr>
+          <w:rFonts w:ascii="Consolas" w:hAnsi="Consolas" w:eastAsia="Microsoft YaHei"/>
+          <w:sz w:val="17"/>
+        </w:rPr>
+        <w:t xml:space="preserve">    dt_grid_destroy(difference);</w:t>
+      </w:r>
+      <w:r>
+        <w:br/>
+      </w:r>
+      <w:r>
+        <w:rPr>
+          <w:rFonts w:ascii="Consolas" w:hAnsi="Consolas" w:eastAsia="Microsoft YaHei"/>
+          <w:sz w:val="17"/>
+        </w:rPr>
+        <w:t>}</w:t>
+      </w:r>
+      <w:r>
+        <w:br/>
+      </w:r>
+      <w:r>
+        <w:rPr>
+          <w:rFonts w:ascii="Consolas" w:hAnsi="Consolas" w:eastAsia="Microsoft YaHei"/>
+          <w:sz w:val="17"/>
+        </w:rPr>
+        <w:t>dt_task_destroy(task);</w:t>
+      </w:r>
+    </w:p>
+    <w:p>
+      <w:pPr>
+        <w:spacing w:before="100" w:after="160" w:line="288" w:lineRule="auto"/>
+        <w:ind w:left="230" w:right="230"/>
+        <w:shd w:fill="E8EEF5"/>
+      </w:pPr>
+      <w:r>
+        <w:rPr>
+          <w:rFonts w:ascii="Calibri" w:hAnsi="Calibri" w:eastAsia="Microsoft YaHei"/>
+          <w:b/>
+          <w:color w:val="1F4D78"/>
+        </w:rPr>
+        <w:t xml:space="preserve">校验与所有权  </w:t>
+      </w:r>
+      <w:r>
+        <w:rPr>
+          <w:rFonts w:ascii="Calibri" w:hAnsi="Calibri" w:eastAsia="Microsoft YaHei"/>
+        </w:rPr>
+        <w:t>两幅 GRID 的行列数、六参数仿射和 CRS WKT 必须匹配；源句柄在计算期间不得由其他线程修改。同步/异步取消或失败均不发布半成品。options/result 的 ABI 大小分别为 64/112 字节；返回的差值 GRID 由调用方 dt_grid_destroy()。</w:t>
+      </w:r>
+    </w:p>
+    <w:p>
+      <w:pPr>
+        <w:spacing w:before="100" w:after="160" w:line="288" w:lineRule="auto"/>
+        <w:ind w:left="230" w:right="230"/>
+        <w:shd w:fill="FFF7E0"/>
+      </w:pPr>
+      <w:r>
+        <w:rPr>
+          <w:rFonts w:ascii="Calibri" w:hAnsi="Calibri" w:eastAsia="Microsoft YaHei"/>
+          <w:b/>
+          <w:color w:val="7A5A00"/>
+        </w:rPr>
+        <w:t xml:space="preserve">本机基准  </w:t>
+      </w:r>
+      <w:r>
+        <w:rPr>
+          <w:rFonts w:ascii="Calibri" w:hAnsi="Calibri" w:eastAsia="Microsoft YaHei"/>
+        </w:rPr>
+        <w:t>4096×4096 双 GRID：单线程 0.439 s，自动并行 0.0381 s，约 11.50×；串并行体积差为 0。结果受 CPU、内存带宽、数据分布和块高影响，不是固定承诺。</w:t>
       </w:r>
     </w:p>
     <w:p>
@@ -14046,7 +14952,7 @@
         <w:rPr>
           <w:rFonts w:ascii="Calibri" w:hAnsi="Calibri" w:eastAsia="Microsoft YaHei"/>
         </w:rPr>
-        <w:t>测试覆盖生命周期、普通 TIN 动态编辑、DTIN/DTMESH/XYZ、TIN/GRID/等高线、等高线反向重建与高程冲突回滚、异步任务，以及 CDT 空网清理、外边界、孔洞、断裂线、交叉失败原子性、TIN→CDT、域内采样、CDT→GRID/等高线、共享顶点保护、批量新增/更新/删除、整批失败回滚和 DCDT 往返。局部坡面测试用解析平面验证 TIN/CDT 的 Z、世界梯度、坡度、坡向和法向，并覆盖孔洞/凸包外拒绝、旋转仿射 GRID 梯度变换、双线性标志和 NoData 拒绝。全幅测试覆盖坡度、坡向、默认光照阴影、CRS 继承、旋转仿射差分、水平坡向 NoData、空洞邻域传播、异步专题结果和大 GRID 取消；v0.22 还锁定 80 字节 ABI、串行/并行一致、输出 generation 及线程/块高参数边界。独立剖面数学测试覆盖线性采样、三角形高程、旋转仿射 GRID 双线性插值、NoData 断点和升降/坡度统计；多边形量测测试覆盖凹多边形耳切、大坐标面积稳定性、自相交拒绝、平面解析结果、挖填符号和部分/完全无效域。GDAL 构建还执行 GTiff、COG、GPKG 驱动探测和真实文件往返。</w:t>
+        <w:t>测试覆盖生命周期、普通 TIN 动态编辑、DTIN/DTMESH/XYZ、TIN/GRID/等高线、等高线反向重建与高程冲突回滚、异步任务，以及 CDT 空网清理、外边界、孔洞、断裂线、交叉失败原子性、TIN→CDT、域内采样、CDT→GRID/等高线、共享顶点保护、批量新增/更新/删除、整批失败回滚和 DCDT 往返。局部坡面测试用解析平面验证 TIN/CDT 的 Z、世界梯度、坡度、坡向和法向；全幅测试覆盖坡度、坡向、阴影、CRS、旋转仿射、NoData、串并行一致和取消。v0.23 独立土方测试锁定 64/112 字节 ABI、常量与零线穿越解析体积、旋转面积、严格/半单元 NoData、差值 GRID、异步结果、参数拒绝及大 GRID 取消。剖面、多边形量测和 GDAL 构建另有数学与真实文件往返测试。</w:t>
       </w:r>
     </w:p>
     <w:p>
@@ -14763,7 +15669,7 @@
         <w:color w:val="66727D"/>
         <w:sz w:val="18"/>
       </w:rPr>
-      <w:t xml:space="preserve">版本 0.22.0  |  第 </w:t>
+      <w:t xml:space="preserve">版本 0.23.0  |  第 </w:t>
     </w:r>
     <w:r>
       <w:rPr>

</xml_diff>

<commit_message>
feat: add explicit GRID resampling
</commit_message>
<xml_diff>
--- a/docs/manuals/dterrain_DLL开发使用手册.docx
+++ b/docs/manuals/dterrain_DLL开发使用手册.docx
@@ -85,7 +85,7 @@
           <w:color w:val="203748"/>
           <w:sz w:val="22"/>
         </w:rPr>
-        <w:t>版本 0.23.0  |  2026-07-18</w:t>
+        <w:t>版本 0.24.0  |  2026-07-18</w:t>
       </w:r>
     </w:p>
     <w:p>
@@ -243,7 +243,7 @@
                 <w:rFonts w:ascii="Calibri" w:hAnsi="Calibri" w:eastAsia="Microsoft YaHei"/>
                 <w:sz w:val="18"/>
               </w:rPr>
-              <w:t>0.23.0</w:t>
+              <w:t>0.24.0</w:t>
             </w:r>
           </w:p>
         </w:tc>
@@ -463,7 +463,7 @@
                 <w:rFonts w:ascii="Calibri" w:hAnsi="Calibri" w:eastAsia="Microsoft YaHei"/>
                 <w:sz w:val="18"/>
               </w:rPr>
-              <w:t>架构、构建部署、稳定 C ABI、双 GRID 精确挖填方、局部与全幅坡度/坡向/阴影分析、约束 Delaunay、GRID/等高线转换、GDAL 格式交换、异步任务、12 个兼容接口、文件格式、性能、线程安全、故障排查。</w:t>
+              <w:t>架构、构建部署、稳定 C ABI、GRID 显式重采样、双 GRID 精确挖填方、局部与全幅坡度/坡向/阴影分析、约束 Delaunay、GRID/等高线转换、GDAL 格式交换、异步任务、12 个兼容接口、文件格式、性能、线程安全、故障排查。</w:t>
             </w:r>
           </w:p>
         </w:tc>
@@ -550,6 +550,17 @@
     </w:p>
     <w:p>
       <w:pPr>
+        <w:pStyle w:val="ListBullet"/>
+      </w:pPr>
+      <w:r>
+        <w:rPr>
+          <w:rFonts w:ascii="Calibri" w:hAnsi="Calibri" w:eastAsia="Microsoft YaHei"/>
+        </w:rPr>
+        <w:t>错位 GRID 对齐：重点阅读第 4.12 节。</w:t>
+      </w:r>
+    </w:p>
+    <w:p>
+      <w:pPr>
         <w:spacing w:before="100" w:after="160" w:line="288" w:lineRule="auto"/>
         <w:ind w:left="230" w:right="230"/>
         <w:shd w:fill="FFF7E0"/>
@@ -566,7 +577,7 @@
         <w:rPr>
           <w:rFonts w:ascii="Calibri" w:hAnsi="Calibri" w:eastAsia="Microsoft YaHei"/>
         </w:rPr>
-        <w:t>本手册对应 dterrain 0.23.0：新增匹配现状/设计 GRID 的解析挖填方、差值 GRID、分块并行、进度与安全取消；全幅坡度/坡向/阴影、剖面、水平基准面量测、GDAL 与约束事务保持兼容。局部 CDT、流式超大 GRID 和 GPU LOD 属于后续阶段。</w:t>
+        <w:t>本手册对应 dterrain 0.24.0：新增同 CRS GRID 的最近邻/双线性显式重采样，可把错位设计面严格对齐到现状 GRID 后再作解析挖填方；全幅地形专题、剖面、GDAL 与约束事务保持兼容。坐标重投影、流式超大 GRID、局部 CDT 和 GPU LOD 属于后续阶段。</w:t>
       </w:r>
     </w:p>
     <w:p>
@@ -690,6 +701,17 @@
           <w:rFonts w:ascii="Calibri" w:hAnsi="Calibri" w:eastAsia="Microsoft YaHei"/>
         </w:rPr>
         <w:t>匹配现状/设计 GRID 逐单元解析积分挖填方，支持差值 GRID、并行、进度和取消。</w:t>
+      </w:r>
+    </w:p>
+    <w:p>
+      <w:pPr>
+        <w:pStyle w:val="ListBullet"/>
+      </w:pPr>
+      <w:r>
+        <w:rPr>
+          <w:rFonts w:ascii="Calibri" w:hAnsi="Calibri" w:eastAsia="Microsoft YaHei"/>
+        </w:rPr>
+        <w:t>同 CRS GRID 按完整六参数仿射显式对齐，支持最近邻、双线性、NoData 策略、并行与取消。</w:t>
       </w:r>
     </w:p>
     <w:p>
@@ -1252,7 +1274,7 @@
         <w:rPr>
           <w:rFonts w:ascii="Calibri" w:hAnsi="Calibri" w:eastAsia="Microsoft YaHei"/>
         </w:rPr>
-        <w:t>GRID→TIN 和等高线→TIN 都重建普通 Delaunay；严格折线、边界和孔洞应使用独立 dt_cdt_handle。v0.23 单项约束编辑仍采用候选网全量重建；批量事务把 N 次重建降为 1 次，但尚未达到百万点实时局部 CDT 编辑。GUI 多边形土方针对水平基准面并使用固定预算数值积分；双 GRID 接口则对节点匹配的现状/设计面作分片线性解析积分。二者均需结合项目规范复核后用于工程结算。</w:t>
+        <w:t>GRID→TIN 和等高线→TIN 都重建普通 Delaunay；严格折线、边界和孔洞应使用独立 dt_cdt_handle。v0.24 单项约束编辑仍采用候选网全量重建；批量事务把 N 次重建降为 1 次，但尚未达到百万点实时局部 CDT 编辑。GUI 多边形土方针对水平基准面并使用固定预算数值积分；双 GRID 接口要求节点对齐，错位表面可先显式重采样。所有土方结果均需结合项目规范复核后用于工程结算。</w:t>
       </w:r>
     </w:p>
     <w:p>
@@ -8166,7 +8188,7 @@
         <w:rPr>
           <w:rFonts w:ascii="Calibri" w:hAnsi="Calibri" w:eastAsia="Microsoft YaHei"/>
         </w:rPr>
-        <w:t>v0.23 单项约束编辑仍完整重建候选 CDT；批量事务只重建一次。100,000 基础点添加 12 条断裂线的本机对比为逐条 3.259 s、批量 0.528 s，约 6.17 倍。请求 output_effect 还会计算完整域差异。未分段交叉仍须先加入共享顶点。</w:t>
+        <w:t>v0.24 单项约束编辑仍完整重建候选 CDT；批量事务只重建一次。100,000 基础点添加 12 条断裂线的本机对比为逐条 3.259 s、批量 0.528 s，约 6.17 倍。请求 output_effect 还会计算完整域差异。未分段交叉仍须先加入共享顶点。</w:t>
       </w:r>
     </w:p>
     <w:p>
@@ -9786,7 +9808,7 @@
           <w:rFonts w:ascii="Consolas" w:hAnsi="Consolas" w:eastAsia="Microsoft YaHei"/>
           <w:sz w:val="17"/>
         </w:rPr>
-        <w:t>o.worker_count = 0;   // 自动线程，最多 64</w:t>
+        <w:t>o.worker_count = 0;   // 自动最多 32；显式最多 64</w:t>
       </w:r>
       <w:r>
         <w:br/>
@@ -10612,6 +10634,740 @@
           <w:rFonts w:ascii="Calibri" w:hAnsi="Calibri" w:eastAsia="Microsoft YaHei"/>
         </w:rPr>
         <w:t>4096×4096 双 GRID：单线程 0.439 s，自动并行 0.0381 s，约 11.50×；串并行体积差为 0。结果受 CPU、内存带宽、数据分布和块高影响，不是固定承诺。</w:t>
+      </w:r>
+    </w:p>
+    <w:p>
+      <w:pPr>
+        <w:pStyle w:val="Heading2"/>
+      </w:pPr>
+      <w:r>
+        <w:t>4.12 GRID 显式重采样与设计面对齐</w:t>
+      </w:r>
+    </w:p>
+    <w:p>
+      <w:r>
+        <w:rPr>
+          <w:rFonts w:ascii="Calibri" w:hAnsi="Calibri" w:eastAsia="Microsoft YaHei"/>
+        </w:rPr>
+        <w:t>dt_grid_resample_like() 把 source_grid 显式采样到 reference_grid 的行列数和完整六参数仿射几何上，输出继承参考 GRID 的 CRS。两者 CRS WKT 必须完全一致；接口绝不隐式重投影。该设计把坐标变换、插值和土方积分拆成可检查的步骤：先对齐设计面，再调用 dt_grid_compare_earthwork()。</w:t>
+      </w:r>
+    </w:p>
+    <w:p>
+      <w:pPr>
+        <w:pStyle w:val="DterrainCode"/>
+        <w:shd w:fill="F2F4F7"/>
+      </w:pPr>
+      <w:r>
+        <w:rPr>
+          <w:rFonts w:ascii="Consolas" w:hAnsi="Consolas" w:eastAsia="Microsoft YaHei"/>
+          <w:sz w:val="17"/>
+        </w:rPr>
+        <w:t>dt_grid_resample_options o{};</w:t>
+      </w:r>
+      <w:r>
+        <w:br/>
+      </w:r>
+      <w:r>
+        <w:rPr>
+          <w:rFonts w:ascii="Consolas" w:hAnsi="Consolas" w:eastAsia="Microsoft YaHei"/>
+          <w:sz w:val="17"/>
+        </w:rPr>
+        <w:t>o.struct_size = sizeof(o);</w:t>
+      </w:r>
+      <w:r>
+        <w:br/>
+      </w:r>
+      <w:r>
+        <w:rPr>
+          <w:rFonts w:ascii="Consolas" w:hAnsi="Consolas" w:eastAsia="Microsoft YaHei"/>
+          <w:sz w:val="17"/>
+        </w:rPr>
+        <w:t>o.method = DT_GRID_RESAMPLE_BILINEAR; // 0 也表示双线性</w:t>
+      </w:r>
+      <w:r>
+        <w:br/>
+      </w:r>
+      <w:r>
+        <w:rPr>
+          <w:rFonts w:ascii="Consolas" w:hAnsi="Consolas" w:eastAsia="Microsoft YaHei"/>
+          <w:sz w:val="17"/>
+        </w:rPr>
+        <w:t>o.flags = 0;                          // 严格 NoData</w:t>
+      </w:r>
+      <w:r>
+        <w:br/>
+      </w:r>
+      <w:r>
+        <w:rPr>
+          <w:rFonts w:ascii="Consolas" w:hAnsi="Consolas" w:eastAsia="Microsoft YaHei"/>
+          <w:sz w:val="17"/>
+        </w:rPr>
+        <w:t>o.worker_count = 0;                   // 自动最多 32；显式最多 64</w:t>
+      </w:r>
+      <w:r>
+        <w:br/>
+      </w:r>
+      <w:r>
+        <w:rPr>
+          <w:rFonts w:ascii="Consolas" w:hAnsi="Consolas" w:eastAsia="Microsoft YaHei"/>
+          <w:sz w:val="17"/>
+        </w:rPr>
+        <w:t>o.tile_row_count = 64;</w:t>
+      </w:r>
+      <w:r>
+        <w:br/>
+      </w:r>
+      <w:r>
+        <w:rPr>
+          <w:rFonts w:ascii="Consolas" w:hAnsi="Consolas" w:eastAsia="Microsoft YaHei"/>
+          <w:sz w:val="17"/>
+        </w:rPr>
+        <w:t>o.output_nodata_value = -9999.0;</w:t>
+      </w:r>
+      <w:r>
+        <w:br/>
+      </w:r>
+      <w:r>
+        <w:rPr>
+          <w:rFonts w:ascii="Consolas" w:hAnsi="Consolas" w:eastAsia="Microsoft YaHei"/>
+          <w:sz w:val="17"/>
+        </w:rPr>
+      </w:r>
+      <w:r>
+        <w:br/>
+      </w:r>
+      <w:r>
+        <w:rPr>
+          <w:rFonts w:ascii="Consolas" w:hAnsi="Consolas" w:eastAsia="Microsoft YaHei"/>
+          <w:sz w:val="17"/>
+        </w:rPr>
+        <w:t>dt_grid_handle aligned = nullptr;</w:t>
+      </w:r>
+      <w:r>
+        <w:br/>
+      </w:r>
+      <w:r>
+        <w:rPr>
+          <w:rFonts w:ascii="Consolas" w:hAnsi="Consolas" w:eastAsia="Microsoft YaHei"/>
+          <w:sz w:val="17"/>
+        </w:rPr>
+        <w:t>dt_status s = dt_grid_resample_like(design, existing, &amp;o, &amp;aligned);</w:t>
+      </w:r>
+      <w:r>
+        <w:br/>
+      </w:r>
+      <w:r>
+        <w:rPr>
+          <w:rFonts w:ascii="Consolas" w:hAnsi="Consolas" w:eastAsia="Microsoft YaHei"/>
+          <w:sz w:val="17"/>
+        </w:rPr>
+        <w:t>if (s == DT_OK) {</w:t>
+      </w:r>
+      <w:r>
+        <w:br/>
+      </w:r>
+      <w:r>
+        <w:rPr>
+          <w:rFonts w:ascii="Consolas" w:hAnsi="Consolas" w:eastAsia="Microsoft YaHei"/>
+          <w:sz w:val="17"/>
+        </w:rPr>
+        <w:t xml:space="preserve">    // aligned 与 existing 节点严格对齐，可继续作双 GRID 土方</w:t>
+      </w:r>
+      <w:r>
+        <w:br/>
+      </w:r>
+      <w:r>
+        <w:rPr>
+          <w:rFonts w:ascii="Consolas" w:hAnsi="Consolas" w:eastAsia="Microsoft YaHei"/>
+          <w:sz w:val="17"/>
+        </w:rPr>
+        <w:t xml:space="preserve">    dt_grid_destroy(aligned);</w:t>
+      </w:r>
+      <w:r>
+        <w:br/>
+      </w:r>
+      <w:r>
+        <w:rPr>
+          <w:rFonts w:ascii="Consolas" w:hAnsi="Consolas" w:eastAsia="Microsoft YaHei"/>
+          <w:sz w:val="17"/>
+        </w:rPr>
+        <w:t>}</w:t>
+      </w:r>
+    </w:p>
+    <w:tbl>
+      <w:tblPr>
+        <w:tblStyle w:val="TableGrid"/>
+        <w:tblW w:type="dxa" w:w="9360"/>
+        <w:jc w:val="left"/>
+        <w:tblLayout w:type="fixed"/>
+        <w:tblLook w:firstColumn="1" w:firstRow="1" w:lastColumn="0" w:lastRow="0" w:noHBand="0" w:noVBand="1" w:val="04A0"/>
+        <w:tblInd w:w="120" w:type="dxa"/>
+      </w:tblPr>
+      <w:tblGrid>
+        <w:gridCol w:w="2600"/>
+        <w:gridCol w:w="3740"/>
+        <w:gridCol w:w="3020"/>
+      </w:tblGrid>
+      <w:tr>
+        <w:trPr>
+          <w:cantSplit/>
+          <w:tblHeader w:val="true"/>
+        </w:trPr>
+        <w:tc>
+          <w:tcPr>
+            <w:tcW w:type="dxa" w:w="2600"/>
+            <w:shd w:fill="E8EEF5"/>
+            <w:tcMar>
+              <w:top w:w="80" w:type="dxa"/>
+              <w:start w:w="120" w:type="dxa"/>
+              <w:bottom w:w="80" w:type="dxa"/>
+              <w:end w:w="120" w:type="dxa"/>
+            </w:tcMar>
+            <w:vAlign w:val="center"/>
+          </w:tcPr>
+          <w:p>
+            <w:pPr>
+              <w:keepNext/>
+              <w:spacing w:before="0" w:after="0"/>
+              <w:jc w:val="center"/>
+            </w:pPr>
+            <w:r>
+              <w:rPr>
+                <w:rFonts w:ascii="Calibri" w:hAnsi="Calibri" w:eastAsia="Microsoft YaHei"/>
+                <w:b/>
+                <w:color w:val="203748"/>
+                <w:sz w:val="19"/>
+              </w:rPr>
+              <w:t>方法/标志</w:t>
+            </w:r>
+          </w:p>
+        </w:tc>
+        <w:tc>
+          <w:tcPr>
+            <w:tcW w:type="dxa" w:w="3740"/>
+            <w:shd w:fill="E8EEF5"/>
+            <w:tcMar>
+              <w:top w:w="80" w:type="dxa"/>
+              <w:start w:w="120" w:type="dxa"/>
+              <w:bottom w:w="80" w:type="dxa"/>
+              <w:end w:w="120" w:type="dxa"/>
+            </w:tcMar>
+            <w:vAlign w:val="center"/>
+          </w:tcPr>
+          <w:p>
+            <w:pPr>
+              <w:keepNext/>
+              <w:spacing w:before="0" w:after="0"/>
+              <w:jc w:val="center"/>
+            </w:pPr>
+            <w:r>
+              <w:rPr>
+                <w:rFonts w:ascii="Calibri" w:hAnsi="Calibri" w:eastAsia="Microsoft YaHei"/>
+                <w:b/>
+                <w:color w:val="203748"/>
+                <w:sz w:val="19"/>
+              </w:rPr>
+              <w:t>行为</w:t>
+            </w:r>
+          </w:p>
+        </w:tc>
+        <w:tc>
+          <w:tcPr>
+            <w:tcW w:type="dxa" w:w="3020"/>
+            <w:shd w:fill="E8EEF5"/>
+            <w:tcMar>
+              <w:top w:w="80" w:type="dxa"/>
+              <w:start w:w="120" w:type="dxa"/>
+              <w:bottom w:w="80" w:type="dxa"/>
+              <w:end w:w="120" w:type="dxa"/>
+            </w:tcMar>
+            <w:vAlign w:val="center"/>
+          </w:tcPr>
+          <w:p>
+            <w:pPr>
+              <w:keepNext/>
+              <w:spacing w:before="0" w:after="0"/>
+              <w:jc w:val="center"/>
+            </w:pPr>
+            <w:r>
+              <w:rPr>
+                <w:rFonts w:ascii="Calibri" w:hAnsi="Calibri" w:eastAsia="Microsoft YaHei"/>
+                <w:b/>
+                <w:color w:val="203748"/>
+                <w:sz w:val="19"/>
+              </w:rPr>
+              <w:t>适用场景</w:t>
+            </w:r>
+          </w:p>
+        </w:tc>
+      </w:tr>
+      <w:tr>
+        <w:trPr>
+          <w:cantSplit/>
+        </w:trPr>
+        <w:tc>
+          <w:tcPr>
+            <w:tcW w:type="dxa" w:w="2600"/>
+            <w:tcMar>
+              <w:top w:w="80" w:type="dxa"/>
+              <w:start w:w="120" w:type="dxa"/>
+              <w:bottom w:w="80" w:type="dxa"/>
+              <w:end w:w="120" w:type="dxa"/>
+            </w:tcMar>
+            <w:vAlign w:val="center"/>
+          </w:tcPr>
+          <w:p>
+            <w:pPr>
+              <w:spacing w:before="0" w:after="0" w:line="276" w:lineRule="auto"/>
+              <w:jc w:val="left"/>
+            </w:pPr>
+            <w:r>
+              <w:rPr>
+                <w:rFonts w:ascii="Calibri" w:hAnsi="Calibri" w:eastAsia="Microsoft YaHei"/>
+                <w:sz w:val="18"/>
+              </w:rPr>
+              <w:t>NEAREST</w:t>
+            </w:r>
+          </w:p>
+        </w:tc>
+        <w:tc>
+          <w:tcPr>
+            <w:tcW w:type="dxa" w:w="3740"/>
+            <w:tcMar>
+              <w:top w:w="80" w:type="dxa"/>
+              <w:start w:w="120" w:type="dxa"/>
+              <w:bottom w:w="80" w:type="dxa"/>
+              <w:end w:w="120" w:type="dxa"/>
+            </w:tcMar>
+            <w:vAlign w:val="center"/>
+          </w:tcPr>
+          <w:p>
+            <w:pPr>
+              <w:spacing w:before="0" w:after="0" w:line="276" w:lineRule="auto"/>
+              <w:jc w:val="left"/>
+            </w:pPr>
+            <w:r>
+              <w:rPr>
+                <w:rFonts w:ascii="Calibri" w:hAnsi="Calibri" w:eastAsia="Microsoft YaHei"/>
+                <w:sz w:val="18"/>
+              </w:rPr>
+              <w:t>按源 GRID 最近节点取值</w:t>
+            </w:r>
+          </w:p>
+        </w:tc>
+        <w:tc>
+          <w:tcPr>
+            <w:tcW w:type="dxa" w:w="3020"/>
+            <w:tcMar>
+              <w:top w:w="80" w:type="dxa"/>
+              <w:start w:w="120" w:type="dxa"/>
+              <w:bottom w:w="80" w:type="dxa"/>
+              <w:end w:w="120" w:type="dxa"/>
+            </w:tcMar>
+            <w:vAlign w:val="center"/>
+          </w:tcPr>
+          <w:p>
+            <w:pPr>
+              <w:spacing w:before="0" w:after="0" w:line="276" w:lineRule="auto"/>
+              <w:jc w:val="left"/>
+            </w:pPr>
+            <w:r>
+              <w:rPr>
+                <w:rFonts w:ascii="Calibri" w:hAnsi="Calibri" w:eastAsia="Microsoft YaHei"/>
+                <w:sz w:val="18"/>
+              </w:rPr>
+              <w:t>分类值、快速预览或不希望平滑</w:t>
+            </w:r>
+          </w:p>
+        </w:tc>
+      </w:tr>
+      <w:tr>
+        <w:trPr>
+          <w:cantSplit/>
+        </w:trPr>
+        <w:tc>
+          <w:tcPr>
+            <w:tcW w:type="dxa" w:w="2600"/>
+            <w:tcMar>
+              <w:top w:w="80" w:type="dxa"/>
+              <w:start w:w="120" w:type="dxa"/>
+              <w:bottom w:w="80" w:type="dxa"/>
+              <w:end w:w="120" w:type="dxa"/>
+            </w:tcMar>
+            <w:vAlign w:val="center"/>
+          </w:tcPr>
+          <w:p>
+            <w:pPr>
+              <w:spacing w:before="0" w:after="0" w:line="276" w:lineRule="auto"/>
+              <w:jc w:val="left"/>
+            </w:pPr>
+            <w:r>
+              <w:rPr>
+                <w:rFonts w:ascii="Calibri" w:hAnsi="Calibri" w:eastAsia="Microsoft YaHei"/>
+                <w:sz w:val="18"/>
+              </w:rPr>
+              <w:t>BILINEAR</w:t>
+            </w:r>
+          </w:p>
+        </w:tc>
+        <w:tc>
+          <w:tcPr>
+            <w:tcW w:type="dxa" w:w="3740"/>
+            <w:tcMar>
+              <w:top w:w="80" w:type="dxa"/>
+              <w:start w:w="120" w:type="dxa"/>
+              <w:bottom w:w="80" w:type="dxa"/>
+              <w:end w:w="120" w:type="dxa"/>
+            </w:tcMar>
+            <w:vAlign w:val="center"/>
+          </w:tcPr>
+          <w:p>
+            <w:pPr>
+              <w:spacing w:before="0" w:after="0" w:line="276" w:lineRule="auto"/>
+              <w:jc w:val="left"/>
+            </w:pPr>
+            <w:r>
+              <w:rPr>
+                <w:rFonts w:ascii="Calibri" w:hAnsi="Calibri" w:eastAsia="Microsoft YaHei"/>
+                <w:sz w:val="18"/>
+              </w:rPr>
+              <w:t>在源 GRID 的 2×2 节点上双线性插值</w:t>
+            </w:r>
+          </w:p>
+        </w:tc>
+        <w:tc>
+          <w:tcPr>
+            <w:tcW w:type="dxa" w:w="3020"/>
+            <w:tcMar>
+              <w:top w:w="80" w:type="dxa"/>
+              <w:start w:w="120" w:type="dxa"/>
+              <w:bottom w:w="80" w:type="dxa"/>
+              <w:end w:w="120" w:type="dxa"/>
+            </w:tcMar>
+            <w:vAlign w:val="center"/>
+          </w:tcPr>
+          <w:p>
+            <w:pPr>
+              <w:spacing w:before="0" w:after="0" w:line="276" w:lineRule="auto"/>
+              <w:jc w:val="left"/>
+            </w:pPr>
+            <w:r>
+              <w:rPr>
+                <w:rFonts w:ascii="Calibri" w:hAnsi="Calibri" w:eastAsia="Microsoft YaHei"/>
+                <w:sz w:val="18"/>
+              </w:rPr>
+              <w:t>连续高程设计面，GUI 默认推荐</w:t>
+            </w:r>
+          </w:p>
+        </w:tc>
+      </w:tr>
+      <w:tr>
+        <w:trPr>
+          <w:cantSplit/>
+        </w:trPr>
+        <w:tc>
+          <w:tcPr>
+            <w:tcW w:type="dxa" w:w="2600"/>
+            <w:tcMar>
+              <w:top w:w="80" w:type="dxa"/>
+              <w:start w:w="120" w:type="dxa"/>
+              <w:bottom w:w="80" w:type="dxa"/>
+              <w:end w:w="120" w:type="dxa"/>
+            </w:tcMar>
+            <w:vAlign w:val="center"/>
+          </w:tcPr>
+          <w:p>
+            <w:pPr>
+              <w:spacing w:before="0" w:after="0" w:line="276" w:lineRule="auto"/>
+              <w:jc w:val="left"/>
+            </w:pPr>
+            <w:r>
+              <w:rPr>
+                <w:rFonts w:ascii="Calibri" w:hAnsi="Calibri" w:eastAsia="Microsoft YaHei"/>
+                <w:sz w:val="18"/>
+              </w:rPr>
+              <w:t>严格 NoData</w:t>
+            </w:r>
+          </w:p>
+        </w:tc>
+        <w:tc>
+          <w:tcPr>
+            <w:tcW w:type="dxa" w:w="3740"/>
+            <w:tcMar>
+              <w:top w:w="80" w:type="dxa"/>
+              <w:start w:w="120" w:type="dxa"/>
+              <w:bottom w:w="80" w:type="dxa"/>
+              <w:end w:w="120" w:type="dxa"/>
+            </w:tcMar>
+            <w:vAlign w:val="center"/>
+          </w:tcPr>
+          <w:p>
+            <w:pPr>
+              <w:spacing w:before="0" w:after="0" w:line="276" w:lineRule="auto"/>
+              <w:jc w:val="left"/>
+            </w:pPr>
+            <w:r>
+              <w:rPr>
+                <w:rFonts w:ascii="Calibri" w:hAnsi="Calibri" w:eastAsia="Microsoft YaHei"/>
+                <w:sz w:val="18"/>
+              </w:rPr>
+              <w:t>四个支撑点任一无效即输出 NoData</w:t>
+            </w:r>
+          </w:p>
+        </w:tc>
+        <w:tc>
+          <w:tcPr>
+            <w:tcW w:type="dxa" w:w="3020"/>
+            <w:tcMar>
+              <w:top w:w="80" w:type="dxa"/>
+              <w:start w:w="120" w:type="dxa"/>
+              <w:bottom w:w="80" w:type="dxa"/>
+              <w:end w:w="120" w:type="dxa"/>
+            </w:tcMar>
+            <w:vAlign w:val="center"/>
+          </w:tcPr>
+          <w:p>
+            <w:pPr>
+              <w:spacing w:before="0" w:after="0" w:line="276" w:lineRule="auto"/>
+              <w:jc w:val="left"/>
+            </w:pPr>
+            <w:r>
+              <w:rPr>
+                <w:rFonts w:ascii="Calibri" w:hAnsi="Calibri" w:eastAsia="Microsoft YaHei"/>
+                <w:sz w:val="18"/>
+              </w:rPr>
+              <w:t>避免跨越空洞插值；默认</w:t>
+            </w:r>
+          </w:p>
+        </w:tc>
+      </w:tr>
+      <w:tr>
+        <w:trPr>
+          <w:cantSplit/>
+        </w:trPr>
+        <w:tc>
+          <w:tcPr>
+            <w:tcW w:type="dxa" w:w="2600"/>
+            <w:tcMar>
+              <w:top w:w="80" w:type="dxa"/>
+              <w:start w:w="120" w:type="dxa"/>
+              <w:bottom w:w="80" w:type="dxa"/>
+              <w:end w:w="120" w:type="dxa"/>
+            </w:tcMar>
+            <w:vAlign w:val="center"/>
+          </w:tcPr>
+          <w:p>
+            <w:pPr>
+              <w:spacing w:before="0" w:after="0" w:line="276" w:lineRule="auto"/>
+              <w:jc w:val="left"/>
+            </w:pPr>
+            <w:r>
+              <w:rPr>
+                <w:rFonts w:ascii="Calibri" w:hAnsi="Calibri" w:eastAsia="Microsoft YaHei"/>
+                <w:sz w:val="18"/>
+              </w:rPr>
+              <w:t>RENORMALIZE_NODATA</w:t>
+            </w:r>
+          </w:p>
+        </w:tc>
+        <w:tc>
+          <w:tcPr>
+            <w:tcW w:type="dxa" w:w="3740"/>
+            <w:tcMar>
+              <w:top w:w="80" w:type="dxa"/>
+              <w:start w:w="120" w:type="dxa"/>
+              <w:bottom w:w="80" w:type="dxa"/>
+              <w:end w:w="120" w:type="dxa"/>
+            </w:tcMar>
+            <w:vAlign w:val="center"/>
+          </w:tcPr>
+          <w:p>
+            <w:pPr>
+              <w:spacing w:before="0" w:after="0" w:line="276" w:lineRule="auto"/>
+              <w:jc w:val="left"/>
+            </w:pPr>
+            <w:r>
+              <w:rPr>
+                <w:rFonts w:ascii="Calibri" w:hAnsi="Calibri" w:eastAsia="Microsoft YaHei"/>
+                <w:sz w:val="18"/>
+              </w:rPr>
+              <w:t>忽略无效支撑点并归一化剩余权重</w:t>
+            </w:r>
+          </w:p>
+        </w:tc>
+        <w:tc>
+          <w:tcPr>
+            <w:tcW w:type="dxa" w:w="3020"/>
+            <w:tcMar>
+              <w:top w:w="80" w:type="dxa"/>
+              <w:start w:w="120" w:type="dxa"/>
+              <w:bottom w:w="80" w:type="dxa"/>
+              <w:end w:w="120" w:type="dxa"/>
+            </w:tcMar>
+            <w:vAlign w:val="center"/>
+          </w:tcPr>
+          <w:p>
+            <w:pPr>
+              <w:spacing w:before="0" w:after="0" w:line="276" w:lineRule="auto"/>
+              <w:jc w:val="left"/>
+            </w:pPr>
+            <w:r>
+              <w:rPr>
+                <w:rFonts w:ascii="Calibri" w:hAnsi="Calibri" w:eastAsia="Microsoft YaHei"/>
+                <w:sz w:val="18"/>
+              </w:rPr>
+              <w:t>明确接受空洞边缘外推时使用</w:t>
+            </w:r>
+          </w:p>
+        </w:tc>
+      </w:tr>
+    </w:tbl>
+    <w:p>
+      <w:pPr>
+        <w:spacing w:before="0" w:after="40"/>
+      </w:pPr>
+    </w:p>
+    <w:p>
+      <w:r>
+        <w:rPr>
+          <w:rFonts w:ascii="Calibri" w:hAnsi="Calibri" w:eastAsia="Microsoft YaHei"/>
+        </w:rPr>
+        <w:t>实现先把参考节点的世界 XY 仿射映射与源 GRID 逆仿射组合成列、行增量，因此旋转、剪切和负像元高均可正确处理。落在源节点包络以外的位置写输出 NoData。双线性模式要求源 GRID 至少 2×2；最近邻可处理单行或单列。output_nodata_value 为零时选择 NaN。</w:t>
+      </w:r>
+    </w:p>
+    <w:p>
+      <w:pPr>
+        <w:pStyle w:val="DterrainCode"/>
+        <w:shd w:fill="F2F4F7"/>
+      </w:pPr>
+      <w:r>
+        <w:rPr>
+          <w:rFonts w:ascii="Consolas" w:hAnsi="Consolas" w:eastAsia="Microsoft YaHei"/>
+          <w:sz w:val="17"/>
+        </w:rPr>
+        <w:t>dt_task_handle task = nullptr;</w:t>
+      </w:r>
+      <w:r>
+        <w:br/>
+      </w:r>
+      <w:r>
+        <w:rPr>
+          <w:rFonts w:ascii="Consolas" w:hAnsi="Consolas" w:eastAsia="Microsoft YaHei"/>
+          <w:sz w:val="17"/>
+        </w:rPr>
+        <w:t>dt_grid_resample_like_async(design, existing, &amp;o, &amp;task);</w:t>
+      </w:r>
+      <w:r>
+        <w:br/>
+      </w:r>
+      <w:r>
+        <w:rPr>
+          <w:rFonts w:ascii="Consolas" w:hAnsi="Consolas" w:eastAsia="Microsoft YaHei"/>
+          <w:sz w:val="17"/>
+        </w:rPr>
+        <w:t>// dt_task_get_info() 读取进度；Esc 等 UI 动作可请求协作取消</w:t>
+      </w:r>
+      <w:r>
+        <w:br/>
+      </w:r>
+      <w:r>
+        <w:rPr>
+          <w:rFonts w:ascii="Consolas" w:hAnsi="Consolas" w:eastAsia="Microsoft YaHei"/>
+          <w:sz w:val="17"/>
+        </w:rPr>
+        <w:t>dt_grid_handle aligned = nullptr;</w:t>
+      </w:r>
+      <w:r>
+        <w:br/>
+      </w:r>
+      <w:r>
+        <w:rPr>
+          <w:rFonts w:ascii="Consolas" w:hAnsi="Consolas" w:eastAsia="Microsoft YaHei"/>
+          <w:sz w:val="17"/>
+        </w:rPr>
+        <w:t>if (dt_task_get_grid_result(task, &amp;aligned) == DT_OK) {</w:t>
+      </w:r>
+      <w:r>
+        <w:br/>
+      </w:r>
+      <w:r>
+        <w:rPr>
+          <w:rFonts w:ascii="Consolas" w:hAnsi="Consolas" w:eastAsia="Microsoft YaHei"/>
+          <w:sz w:val="17"/>
+        </w:rPr>
+        <w:t xml:space="preserve">    // aligned 是调用方拥有的新句柄</w:t>
+      </w:r>
+      <w:r>
+        <w:br/>
+      </w:r>
+      <w:r>
+        <w:rPr>
+          <w:rFonts w:ascii="Consolas" w:hAnsi="Consolas" w:eastAsia="Microsoft YaHei"/>
+          <w:sz w:val="17"/>
+        </w:rPr>
+        <w:t xml:space="preserve">    dt_grid_destroy(aligned);</w:t>
+      </w:r>
+      <w:r>
+        <w:br/>
+      </w:r>
+      <w:r>
+        <w:rPr>
+          <w:rFonts w:ascii="Consolas" w:hAnsi="Consolas" w:eastAsia="Microsoft YaHei"/>
+          <w:sz w:val="17"/>
+        </w:rPr>
+        <w:t>}</w:t>
+      </w:r>
+      <w:r>
+        <w:br/>
+      </w:r>
+      <w:r>
+        <w:rPr>
+          <w:rFonts w:ascii="Consolas" w:hAnsi="Consolas" w:eastAsia="Microsoft YaHei"/>
+          <w:sz w:val="17"/>
+        </w:rPr>
+        <w:t>dt_task_destroy(task);</w:t>
+      </w:r>
+    </w:p>
+    <w:p>
+      <w:pPr>
+        <w:spacing w:before="100" w:after="160" w:line="288" w:lineRule="auto"/>
+        <w:ind w:left="230" w:right="230"/>
+        <w:shd w:fill="E8EEF5"/>
+      </w:pPr>
+      <w:r>
+        <w:rPr>
+          <w:rFonts w:ascii="Calibri" w:hAnsi="Calibri" w:eastAsia="Microsoft YaHei"/>
+          <w:b/>
+          <w:color w:val="1F4D78"/>
+        </w:rPr>
+        <w:t xml:space="preserve">并行、取消与所有权  </w:t>
+      </w:r>
+      <w:r>
+        <w:rPr>
+          <w:rFonts w:ascii="Calibri" w:hAnsi="Calibri" w:eastAsia="Microsoft YaHei"/>
+        </w:rPr>
+        <w:t>options 固定为 64 字节。工作线程按输出行块写互不重叠的区域，只有协调线程调用进度/取消回调；同步或异步失败、取消均不发布半成品。计算期间不得修改源和参考句柄，成功结果由调用方 dt_grid_destroy()。</w:t>
+      </w:r>
+    </w:p>
+    <w:p>
+      <w:pPr>
+        <w:spacing w:before="100" w:after="160" w:line="288" w:lineRule="auto"/>
+        <w:ind w:left="230" w:right="230"/>
+        <w:shd w:fill="FFF7E0"/>
+      </w:pPr>
+      <w:r>
+        <w:rPr>
+          <w:rFonts w:ascii="Calibri" w:hAnsi="Calibri" w:eastAsia="Microsoft YaHei"/>
+          <w:b/>
+          <w:color w:val="7A5A00"/>
+        </w:rPr>
+        <w:t xml:space="preserve">本机基准  </w:t>
+      </w:r>
+      <w:r>
+        <w:rPr>
+          <w:rFonts w:ascii="Calibri" w:hAnsi="Calibri" w:eastAsia="Microsoft YaHei"/>
+        </w:rPr>
+        <w:t>4096×4096 双线性重采样：单线程 0.243 s，自动并行 0.0538 s，约 4.53×，串并行抽样校验和误差为 0。收益受 CPU、内存带宽、仿射关系和块高影响，不是固定承诺。</w:t>
       </w:r>
     </w:p>
     <w:p>
@@ -14952,7 +15708,7 @@
         <w:rPr>
           <w:rFonts w:ascii="Calibri" w:hAnsi="Calibri" w:eastAsia="Microsoft YaHei"/>
         </w:rPr>
-        <w:t>测试覆盖生命周期、普通 TIN 动态编辑、DTIN/DTMESH/XYZ、TIN/GRID/等高线、等高线反向重建与高程冲突回滚、异步任务，以及 CDT 空网清理、外边界、孔洞、断裂线、交叉失败原子性、TIN→CDT、域内采样、CDT→GRID/等高线、共享顶点保护、批量新增/更新/删除、整批失败回滚和 DCDT 往返。局部坡面测试用解析平面验证 TIN/CDT 的 Z、世界梯度、坡度、坡向和法向；全幅测试覆盖坡度、坡向、阴影、CRS、旋转仿射、NoData、串并行一致和取消。v0.23 独立土方测试锁定 64/112 字节 ABI、常量与零线穿越解析体积、旋转面积、严格/半单元 NoData、差值 GRID、异步结果、参数拒绝及大 GRID 取消。剖面、多边形量测和 GDAL 构建另有数学与真实文件往返测试。</w:t>
+        <w:t>测试覆盖生命周期、普通 TIN 动态编辑、DTIN/DTMESH/XYZ、TIN/GRID/等高线、等高线反向重建与高程冲突回滚、异步任务，以及 CDT 空网清理、外边界、孔洞、断裂线、交叉失败原子性、TIN→CDT、域内采样、CDT→GRID/等高线、共享顶点保护、批量新增/更新/删除、整批失败回滚和 DCDT 往返。局部坡面测试用解析平面验证 TIN/CDT 的 Z、世界梯度、坡度、坡向和法向；全幅测试覆盖坡度、坡向、阴影、CRS、旋转仿射、NoData、串并行一致和取消。土方测试锁定 64/112 字节 ABI、零线穿越解析体积、旋转面积、NoData、差值 GRID、异步结果和取消。v0.24 重采样测试另锁定 64 字节 ABI、旋转/剪切解析平面、最近邻与双线性、严格/归一化 NoData、串并行一致、异步结果、CRS 拒绝及大 GRID 取消。剖面、多边形量测和 GDAL 构建另有数学与真实文件往返测试。</w:t>
       </w:r>
     </w:p>
     <w:p>
@@ -15669,7 +16425,7 @@
         <w:color w:val="66727D"/>
         <w:sz w:val="18"/>
       </w:rPr>
-      <w:t xml:space="preserve">版本 0.23.0  |  第 </w:t>
+      <w:t xml:space="preserve">版本 0.24.0  |  第 </w:t>
     </w:r>
     <w:r>
       <w:rPr>

</xml_diff>

<commit_message>
feat: add polygon GRID clipping
</commit_message>
<xml_diff>
--- a/docs/manuals/dterrain_DLL开发使用手册.docx
+++ b/docs/manuals/dterrain_DLL开发使用手册.docx
@@ -85,7 +85,7 @@
           <w:color w:val="203748"/>
           <w:sz w:val="22"/>
         </w:rPr>
-        <w:t>版本 0.24.0  |  2026-07-18</w:t>
+        <w:t>版本 0.25.0  |  2026-07-18</w:t>
       </w:r>
     </w:p>
     <w:p>
@@ -243,7 +243,7 @@
                 <w:rFonts w:ascii="Calibri" w:hAnsi="Calibri" w:eastAsia="Microsoft YaHei"/>
                 <w:sz w:val="18"/>
               </w:rPr>
-              <w:t>0.24.0</w:t>
+              <w:t>0.25.0</w:t>
             </w:r>
           </w:p>
         </w:tc>
@@ -463,7 +463,7 @@
                 <w:rFonts w:ascii="Calibri" w:hAnsi="Calibri" w:eastAsia="Microsoft YaHei"/>
                 <w:sz w:val="18"/>
               </w:rPr>
-              <w:t>架构、构建部署、稳定 C ABI、GRID 显式重采样、双 GRID 精确挖填方、局部与全幅坡度/坡向/阴影分析、约束 Delaunay、GRID/等高线转换、GDAL 格式交换、异步任务、12 个兼容接口、文件格式、性能、线程安全、故障排查。</w:t>
+              <w:t>架构、构建部署、稳定 C ABI、GRID 多边形裁剪/掩膜、GRID 显式重采样、双 GRID 精确挖填方、局部与全幅坡度/坡向/阴影分析、约束 Delaunay、GRID/等高线转换、GDAL 格式交换、异步任务、12 个兼容接口、文件格式、性能、线程安全、故障排查。</w:t>
             </w:r>
           </w:p>
         </w:tc>
@@ -561,6 +561,17 @@
     </w:p>
     <w:p>
       <w:pPr>
+        <w:pStyle w:val="ListBullet"/>
+      </w:pPr>
+      <w:r>
+        <w:rPr>
+          <w:rFonts w:ascii="Calibri" w:hAnsi="Calibri" w:eastAsia="Microsoft YaHei"/>
+        </w:rPr>
+        <w:t>任意区域 GRID 裁剪：重点阅读第 4.13 节。</w:t>
+      </w:r>
+    </w:p>
+    <w:p>
+      <w:pPr>
         <w:spacing w:before="100" w:after="160" w:line="288" w:lineRule="auto"/>
         <w:ind w:left="230" w:right="230"/>
         <w:shd w:fill="FFF7E0"/>
@@ -577,7 +588,7 @@
         <w:rPr>
           <w:rFonts w:ascii="Calibri" w:hAnsi="Calibri" w:eastAsia="Microsoft YaHei"/>
         </w:rPr>
-        <w:t>本手册对应 dterrain 0.24.0：新增同 CRS GRID 的最近邻/双线性显式重采样，可把错位设计面严格对齐到现状 GRID 后再作解析挖填方；全幅地形专题、剖面、GDAL 与约束事务保持兼容。坐标重投影、流式超大 GRID、局部 CDT 和 GPU LOD 属于后续阶段。</w:t>
+        <w:t>本手册对应 dterrain 0.25.0：新增任意简单多边形 GRID 掩膜、紧凑裁剪与反向掩膜，同步/异步接口均支持完整六参数仿射、NoData、并行和取消；显式重采样、解析挖填方、全幅地形专题、剖面、GDAL 与约束事务保持兼容。坐标重投影、流式超大 GRID、网格单元解析边界裁剪、局部 CDT 和 GPU LOD 属于后续阶段。</w:t>
       </w:r>
     </w:p>
     <w:p>
@@ -712,6 +723,17 @@
           <w:rFonts w:ascii="Calibri" w:hAnsi="Calibri" w:eastAsia="Microsoft YaHei"/>
         </w:rPr>
         <w:t>同 CRS GRID 按完整六参数仿射显式对齐，支持最近邻、双线性、NoData 策略、并行与取消。</w:t>
+      </w:r>
+    </w:p>
+    <w:p>
+      <w:pPr>
+        <w:pStyle w:val="ListBullet"/>
+      </w:pPr>
+      <w:r>
+        <w:rPr>
+          <w:rFonts w:ascii="Calibri" w:hAnsi="Calibri" w:eastAsia="Microsoft YaHei"/>
+        </w:rPr>
+        <w:t>GRID 按任意简单多边形作保持范围掩膜、紧凑裁剪或反向掩膜，支持旋转/剪切仿射、并行与取消。</w:t>
       </w:r>
     </w:p>
     <w:p>
@@ -8188,7 +8210,7 @@
         <w:rPr>
           <w:rFonts w:ascii="Calibri" w:hAnsi="Calibri" w:eastAsia="Microsoft YaHei"/>
         </w:rPr>
-        <w:t>v0.24 单项约束编辑仍完整重建候选 CDT；批量事务只重建一次。100,000 基础点添加 12 条断裂线的本机对比为逐条 3.259 s、批量 0.528 s，约 6.17 倍。请求 output_effect 还会计算完整域差异。未分段交叉仍须先加入共享顶点。</w:t>
+        <w:t>v0.25 单项约束编辑仍完整重建候选 CDT；批量事务只重建一次。100,000 基础点添加 12 条断裂线的本机对比为逐条 3.259 s、批量 0.528 s，约 6.17 倍。请求 output_effect 还会计算完整域差异。未分段交叉仍须先加入共享顶点。</w:t>
       </w:r>
     </w:p>
     <w:p>
@@ -11368,6 +11390,711 @@
           <w:rFonts w:ascii="Calibri" w:hAnsi="Calibri" w:eastAsia="Microsoft YaHei"/>
         </w:rPr>
         <w:t>4096×4096 双线性重采样：单线程 0.243 s，自动并行 0.0538 s，约 4.53×，串并行抽样校验和误差为 0。收益受 CPU、内存带宽、仿射关系和块高影响，不是固定承诺。</w:t>
+      </w:r>
+    </w:p>
+    <w:p>
+      <w:pPr>
+        <w:pStyle w:val="Heading2"/>
+      </w:pPr>
+      <w:r>
+        <w:t>4.13 GRID 任意多边形裁剪与掩膜</w:t>
+      </w:r>
+    </w:p>
+    <w:p>
+      <w:r>
+        <w:rPr>
+          <w:rFonts w:ascii="Calibri" w:hAnsi="Calibri" w:eastAsia="Microsoft YaHei"/>
+        </w:rPr>
+        <w:t>dt_grid_clip_polygon() 用多边形的 XY 投影选择 GRID 节点。输入点的 Z 被忽略，多边形可省略重复闭合点，接口会隐式闭合。边界节点按内部处理；采用偶奇规则，因此结果对顺、逆时针一致。输出继承源 GRID 的 CRS 和 NoData 语义。</w:t>
+      </w:r>
+    </w:p>
+    <w:p>
+      <w:pPr>
+        <w:pStyle w:val="DterrainCode"/>
+        <w:shd w:fill="F2F4F7"/>
+      </w:pPr>
+      <w:r>
+        <w:rPr>
+          <w:rFonts w:ascii="Consolas" w:hAnsi="Consolas" w:eastAsia="Microsoft YaHei"/>
+          <w:sz w:val="17"/>
+        </w:rPr>
+        <w:t>dt_grid_clip_options o{};</w:t>
+      </w:r>
+      <w:r>
+        <w:br/>
+      </w:r>
+      <w:r>
+        <w:rPr>
+          <w:rFonts w:ascii="Consolas" w:hAnsi="Consolas" w:eastAsia="Microsoft YaHei"/>
+          <w:sz w:val="17"/>
+        </w:rPr>
+        <w:t>o.struct_size = sizeof(o);</w:t>
+      </w:r>
+      <w:r>
+        <w:br/>
+      </w:r>
+      <w:r>
+        <w:rPr>
+          <w:rFonts w:ascii="Consolas" w:hAnsi="Consolas" w:eastAsia="Microsoft YaHei"/>
+          <w:sz w:val="17"/>
+        </w:rPr>
+        <w:t>o.flags = DT_GRID_CLIP_CROP_TO_BOUNDS;</w:t>
+      </w:r>
+      <w:r>
+        <w:br/>
+      </w:r>
+      <w:r>
+        <w:rPr>
+          <w:rFonts w:ascii="Consolas" w:hAnsi="Consolas" w:eastAsia="Microsoft YaHei"/>
+          <w:sz w:val="17"/>
+        </w:rPr>
+        <w:t>o.worker_count = 0;       // 自动最多 32；显式最多 64</w:t>
+      </w:r>
+      <w:r>
+        <w:br/>
+      </w:r>
+      <w:r>
+        <w:rPr>
+          <w:rFonts w:ascii="Consolas" w:hAnsi="Consolas" w:eastAsia="Microsoft YaHei"/>
+          <w:sz w:val="17"/>
+        </w:rPr>
+        <w:t>o.tile_row_count = 64;</w:t>
+      </w:r>
+      <w:r>
+        <w:br/>
+      </w:r>
+      <w:r>
+        <w:rPr>
+          <w:rFonts w:ascii="Consolas" w:hAnsi="Consolas" w:eastAsia="Microsoft YaHei"/>
+          <w:sz w:val="17"/>
+        </w:rPr>
+        <w:t>o.output_nodata_value = -9999.0;</w:t>
+      </w:r>
+      <w:r>
+        <w:br/>
+      </w:r>
+      <w:r>
+        <w:rPr>
+          <w:rFonts w:ascii="Consolas" w:hAnsi="Consolas" w:eastAsia="Microsoft YaHei"/>
+          <w:sz w:val="17"/>
+        </w:rPr>
+      </w:r>
+      <w:r>
+        <w:br/>
+      </w:r>
+      <w:r>
+        <w:rPr>
+          <w:rFonts w:ascii="Consolas" w:hAnsi="Consolas" w:eastAsia="Microsoft YaHei"/>
+          <w:sz w:val="17"/>
+        </w:rPr>
+        <w:t>dt_point3 polygon[] = {</w:t>
+      </w:r>
+      <w:r>
+        <w:br/>
+      </w:r>
+      <w:r>
+        <w:rPr>
+          <w:rFonts w:ascii="Consolas" w:hAnsi="Consolas" w:eastAsia="Microsoft YaHei"/>
+          <w:sz w:val="17"/>
+        </w:rPr>
+        <w:t xml:space="preserve">    {500000.0, 3200000.0, 0.0},</w:t>
+      </w:r>
+      <w:r>
+        <w:br/>
+      </w:r>
+      <w:r>
+        <w:rPr>
+          <w:rFonts w:ascii="Consolas" w:hAnsi="Consolas" w:eastAsia="Microsoft YaHei"/>
+          <w:sz w:val="17"/>
+        </w:rPr>
+        <w:t xml:space="preserve">    {500600.0, 3200050.0, 0.0},</w:t>
+      </w:r>
+      <w:r>
+        <w:br/>
+      </w:r>
+      <w:r>
+        <w:rPr>
+          <w:rFonts w:ascii="Consolas" w:hAnsi="Consolas" w:eastAsia="Microsoft YaHei"/>
+          <w:sz w:val="17"/>
+        </w:rPr>
+        <w:t xml:space="preserve">    {500450.0, 3200500.0, 0.0},</w:t>
+      </w:r>
+      <w:r>
+        <w:br/>
+      </w:r>
+      <w:r>
+        <w:rPr>
+          <w:rFonts w:ascii="Consolas" w:hAnsi="Consolas" w:eastAsia="Microsoft YaHei"/>
+          <w:sz w:val="17"/>
+        </w:rPr>
+        <w:t xml:space="preserve">    {499950.0, 3200400.0, 0.0},</w:t>
+      </w:r>
+      <w:r>
+        <w:br/>
+      </w:r>
+      <w:r>
+        <w:rPr>
+          <w:rFonts w:ascii="Consolas" w:hAnsi="Consolas" w:eastAsia="Microsoft YaHei"/>
+          <w:sz w:val="17"/>
+        </w:rPr>
+        <w:t>};</w:t>
+      </w:r>
+      <w:r>
+        <w:br/>
+      </w:r>
+      <w:r>
+        <w:rPr>
+          <w:rFonts w:ascii="Consolas" w:hAnsi="Consolas" w:eastAsia="Microsoft YaHei"/>
+          <w:sz w:val="17"/>
+        </w:rPr>
+        <w:t>dt_grid_handle clipped = nullptr;</w:t>
+      </w:r>
+      <w:r>
+        <w:br/>
+      </w:r>
+      <w:r>
+        <w:rPr>
+          <w:rFonts w:ascii="Consolas" w:hAnsi="Consolas" w:eastAsia="Microsoft YaHei"/>
+          <w:sz w:val="17"/>
+        </w:rPr>
+        <w:t>dt_status s = dt_grid_clip_polygon(source, polygon, 4, &amp;o, &amp;clipped);</w:t>
+      </w:r>
+      <w:r>
+        <w:br/>
+      </w:r>
+      <w:r>
+        <w:rPr>
+          <w:rFonts w:ascii="Consolas" w:hAnsi="Consolas" w:eastAsia="Microsoft YaHei"/>
+          <w:sz w:val="17"/>
+        </w:rPr>
+        <w:t>if (s == DT_OK) {</w:t>
+      </w:r>
+      <w:r>
+        <w:br/>
+      </w:r>
+      <w:r>
+        <w:rPr>
+          <w:rFonts w:ascii="Consolas" w:hAnsi="Consolas" w:eastAsia="Microsoft YaHei"/>
+          <w:sz w:val="17"/>
+        </w:rPr>
+        <w:t xml:space="preserve">    dt_grid_destroy(clipped);</w:t>
+      </w:r>
+      <w:r>
+        <w:br/>
+      </w:r>
+      <w:r>
+        <w:rPr>
+          <w:rFonts w:ascii="Consolas" w:hAnsi="Consolas" w:eastAsia="Microsoft YaHei"/>
+          <w:sz w:val="17"/>
+        </w:rPr>
+        <w:t>}</w:t>
+      </w:r>
+    </w:p>
+    <w:tbl>
+      <w:tblPr>
+        <w:tblStyle w:val="TableGrid"/>
+        <w:tblW w:type="dxa" w:w="9360"/>
+        <w:jc w:val="left"/>
+        <w:tblLayout w:type="fixed"/>
+        <w:tblLook w:firstColumn="1" w:firstRow="1" w:lastColumn="0" w:lastRow="0" w:noHBand="0" w:noVBand="1" w:val="04A0"/>
+        <w:tblInd w:w="120" w:type="dxa"/>
+      </w:tblPr>
+      <w:tblGrid>
+        <w:gridCol w:w="2500"/>
+        <w:gridCol w:w="3000"/>
+        <w:gridCol w:w="3860"/>
+      </w:tblGrid>
+      <w:tr>
+        <w:trPr>
+          <w:cantSplit/>
+          <w:tblHeader w:val="true"/>
+        </w:trPr>
+        <w:tc>
+          <w:tcPr>
+            <w:tcW w:type="dxa" w:w="2500"/>
+            <w:shd w:fill="E8EEF5"/>
+            <w:tcMar>
+              <w:top w:w="80" w:type="dxa"/>
+              <w:start w:w="120" w:type="dxa"/>
+              <w:bottom w:w="80" w:type="dxa"/>
+              <w:end w:w="120" w:type="dxa"/>
+            </w:tcMar>
+            <w:vAlign w:val="center"/>
+          </w:tcPr>
+          <w:p>
+            <w:pPr>
+              <w:keepNext/>
+              <w:spacing w:before="0" w:after="0"/>
+              <w:jc w:val="center"/>
+            </w:pPr>
+            <w:r>
+              <w:rPr>
+                <w:rFonts w:ascii="Calibri" w:hAnsi="Calibri" w:eastAsia="Microsoft YaHei"/>
+                <w:b/>
+                <w:color w:val="203748"/>
+                <w:sz w:val="19"/>
+              </w:rPr>
+              <w:t>模式/标志</w:t>
+            </w:r>
+          </w:p>
+        </w:tc>
+        <w:tc>
+          <w:tcPr>
+            <w:tcW w:type="dxa" w:w="3000"/>
+            <w:shd w:fill="E8EEF5"/>
+            <w:tcMar>
+              <w:top w:w="80" w:type="dxa"/>
+              <w:start w:w="120" w:type="dxa"/>
+              <w:bottom w:w="80" w:type="dxa"/>
+              <w:end w:w="120" w:type="dxa"/>
+            </w:tcMar>
+            <w:vAlign w:val="center"/>
+          </w:tcPr>
+          <w:p>
+            <w:pPr>
+              <w:keepNext/>
+              <w:spacing w:before="0" w:after="0"/>
+              <w:jc w:val="center"/>
+            </w:pPr>
+            <w:r>
+              <w:rPr>
+                <w:rFonts w:ascii="Calibri" w:hAnsi="Calibri" w:eastAsia="Microsoft YaHei"/>
+                <w:b/>
+                <w:color w:val="203748"/>
+                <w:sz w:val="19"/>
+              </w:rPr>
+              <w:t>输出范围</w:t>
+            </w:r>
+          </w:p>
+        </w:tc>
+        <w:tc>
+          <w:tcPr>
+            <w:tcW w:type="dxa" w:w="3860"/>
+            <w:shd w:fill="E8EEF5"/>
+            <w:tcMar>
+              <w:top w:w="80" w:type="dxa"/>
+              <w:start w:w="120" w:type="dxa"/>
+              <w:bottom w:w="80" w:type="dxa"/>
+              <w:end w:w="120" w:type="dxa"/>
+            </w:tcMar>
+            <w:vAlign w:val="center"/>
+          </w:tcPr>
+          <w:p>
+            <w:pPr>
+              <w:keepNext/>
+              <w:spacing w:before="0" w:after="0"/>
+              <w:jc w:val="center"/>
+            </w:pPr>
+            <w:r>
+              <w:rPr>
+                <w:rFonts w:ascii="Calibri" w:hAnsi="Calibri" w:eastAsia="Microsoft YaHei"/>
+                <w:b/>
+                <w:color w:val="203748"/>
+                <w:sz w:val="19"/>
+              </w:rPr>
+              <w:t>选择规则与用途</w:t>
+            </w:r>
+          </w:p>
+        </w:tc>
+      </w:tr>
+      <w:tr>
+        <w:trPr>
+          <w:cantSplit/>
+        </w:trPr>
+        <w:tc>
+          <w:tcPr>
+            <w:tcW w:type="dxa" w:w="2500"/>
+            <w:tcMar>
+              <w:top w:w="80" w:type="dxa"/>
+              <w:start w:w="120" w:type="dxa"/>
+              <w:bottom w:w="80" w:type="dxa"/>
+              <w:end w:w="120" w:type="dxa"/>
+            </w:tcMar>
+            <w:vAlign w:val="center"/>
+          </w:tcPr>
+          <w:p>
+            <w:pPr>
+              <w:spacing w:before="0" w:after="0" w:line="276" w:lineRule="auto"/>
+              <w:jc w:val="left"/>
+            </w:pPr>
+            <w:r>
+              <w:rPr>
+                <w:rFonts w:ascii="Calibri" w:hAnsi="Calibri" w:eastAsia="Microsoft YaHei"/>
+                <w:sz w:val="18"/>
+              </w:rPr>
+              <w:t>flags = 0</w:t>
+            </w:r>
+          </w:p>
+        </w:tc>
+        <w:tc>
+          <w:tcPr>
+            <w:tcW w:type="dxa" w:w="3000"/>
+            <w:tcMar>
+              <w:top w:w="80" w:type="dxa"/>
+              <w:start w:w="120" w:type="dxa"/>
+              <w:bottom w:w="80" w:type="dxa"/>
+              <w:end w:w="120" w:type="dxa"/>
+            </w:tcMar>
+            <w:vAlign w:val="center"/>
+          </w:tcPr>
+          <w:p>
+            <w:pPr>
+              <w:spacing w:before="0" w:after="0" w:line="276" w:lineRule="auto"/>
+              <w:jc w:val="left"/>
+            </w:pPr>
+            <w:r>
+              <w:rPr>
+                <w:rFonts w:ascii="Calibri" w:hAnsi="Calibri" w:eastAsia="Microsoft YaHei"/>
+                <w:sz w:val="18"/>
+              </w:rPr>
+              <w:t>保持源行列数和仿射</w:t>
+            </w:r>
+          </w:p>
+        </w:tc>
+        <w:tc>
+          <w:tcPr>
+            <w:tcW w:type="dxa" w:w="3860"/>
+            <w:tcMar>
+              <w:top w:w="80" w:type="dxa"/>
+              <w:start w:w="120" w:type="dxa"/>
+              <w:bottom w:w="80" w:type="dxa"/>
+              <w:end w:w="120" w:type="dxa"/>
+            </w:tcMar>
+            <w:vAlign w:val="center"/>
+          </w:tcPr>
+          <w:p>
+            <w:pPr>
+              <w:spacing w:before="0" w:after="0" w:line="276" w:lineRule="auto"/>
+              <w:jc w:val="left"/>
+            </w:pPr>
+            <w:r>
+              <w:rPr>
+                <w:rFonts w:ascii="Calibri" w:hAnsi="Calibri" w:eastAsia="Microsoft YaHei"/>
+                <w:sz w:val="18"/>
+              </w:rPr>
+              <w:t>多边形内保留，外部写 NoData；适合图层对齐</w:t>
+            </w:r>
+          </w:p>
+        </w:tc>
+      </w:tr>
+      <w:tr>
+        <w:trPr>
+          <w:cantSplit/>
+        </w:trPr>
+        <w:tc>
+          <w:tcPr>
+            <w:tcW w:type="dxa" w:w="2500"/>
+            <w:tcMar>
+              <w:top w:w="80" w:type="dxa"/>
+              <w:start w:w="120" w:type="dxa"/>
+              <w:bottom w:w="80" w:type="dxa"/>
+              <w:end w:w="120" w:type="dxa"/>
+            </w:tcMar>
+            <w:vAlign w:val="center"/>
+          </w:tcPr>
+          <w:p>
+            <w:pPr>
+              <w:spacing w:before="0" w:after="0" w:line="276" w:lineRule="auto"/>
+              <w:jc w:val="left"/>
+            </w:pPr>
+            <w:r>
+              <w:rPr>
+                <w:rFonts w:ascii="Calibri" w:hAnsi="Calibri" w:eastAsia="Microsoft YaHei"/>
+                <w:sz w:val="18"/>
+              </w:rPr>
+              <w:t>CROP_TO_BOUNDS</w:t>
+            </w:r>
+          </w:p>
+        </w:tc>
+        <w:tc>
+          <w:tcPr>
+            <w:tcW w:type="dxa" w:w="3000"/>
+            <w:tcMar>
+              <w:top w:w="80" w:type="dxa"/>
+              <w:start w:w="120" w:type="dxa"/>
+              <w:bottom w:w="80" w:type="dxa"/>
+              <w:end w:w="120" w:type="dxa"/>
+            </w:tcMar>
+            <w:vAlign w:val="center"/>
+          </w:tcPr>
+          <w:p>
+            <w:pPr>
+              <w:spacing w:before="0" w:after="0" w:line="276" w:lineRule="auto"/>
+              <w:jc w:val="left"/>
+            </w:pPr>
+            <w:r>
+              <w:rPr>
+                <w:rFonts w:ascii="Calibri" w:hAnsi="Calibri" w:eastAsia="Microsoft YaHei"/>
+                <w:sz w:val="18"/>
+              </w:rPr>
+              <w:t>裁到包含入选节点的最小行列包络</w:t>
+            </w:r>
+          </w:p>
+        </w:tc>
+        <w:tc>
+          <w:tcPr>
+            <w:tcW w:type="dxa" w:w="3860"/>
+            <w:tcMar>
+              <w:top w:w="80" w:type="dxa"/>
+              <w:start w:w="120" w:type="dxa"/>
+              <w:bottom w:w="80" w:type="dxa"/>
+              <w:end w:w="120" w:type="dxa"/>
+            </w:tcMar>
+            <w:vAlign w:val="center"/>
+          </w:tcPr>
+          <w:p>
+            <w:pPr>
+              <w:spacing w:before="0" w:after="0" w:line="276" w:lineRule="auto"/>
+              <w:jc w:val="left"/>
+            </w:pPr>
+            <w:r>
+              <w:rPr>
+                <w:rFonts w:ascii="Calibri" w:hAnsi="Calibri" w:eastAsia="Microsoft YaHei"/>
+                <w:sz w:val="18"/>
+              </w:rPr>
+              <w:t>多边形内保留；减小后续显示和交换范围</w:t>
+            </w:r>
+          </w:p>
+        </w:tc>
+      </w:tr>
+      <w:tr>
+        <w:trPr>
+          <w:cantSplit/>
+        </w:trPr>
+        <w:tc>
+          <w:tcPr>
+            <w:tcW w:type="dxa" w:w="2500"/>
+            <w:tcMar>
+              <w:top w:w="80" w:type="dxa"/>
+              <w:start w:w="120" w:type="dxa"/>
+              <w:bottom w:w="80" w:type="dxa"/>
+              <w:end w:w="120" w:type="dxa"/>
+            </w:tcMar>
+            <w:vAlign w:val="center"/>
+          </w:tcPr>
+          <w:p>
+            <w:pPr>
+              <w:spacing w:before="0" w:after="0" w:line="276" w:lineRule="auto"/>
+              <w:jc w:val="left"/>
+            </w:pPr>
+            <w:r>
+              <w:rPr>
+                <w:rFonts w:ascii="Calibri" w:hAnsi="Calibri" w:eastAsia="Microsoft YaHei"/>
+                <w:sz w:val="18"/>
+              </w:rPr>
+              <w:t>INVERT</w:t>
+            </w:r>
+          </w:p>
+        </w:tc>
+        <w:tc>
+          <w:tcPr>
+            <w:tcW w:type="dxa" w:w="3000"/>
+            <w:tcMar>
+              <w:top w:w="80" w:type="dxa"/>
+              <w:start w:w="120" w:type="dxa"/>
+              <w:bottom w:w="80" w:type="dxa"/>
+              <w:end w:w="120" w:type="dxa"/>
+            </w:tcMar>
+            <w:vAlign w:val="center"/>
+          </w:tcPr>
+          <w:p>
+            <w:pPr>
+              <w:spacing w:before="0" w:after="0" w:line="276" w:lineRule="auto"/>
+              <w:jc w:val="left"/>
+            </w:pPr>
+            <w:r>
+              <w:rPr>
+                <w:rFonts w:ascii="Calibri" w:hAnsi="Calibri" w:eastAsia="Microsoft YaHei"/>
+                <w:sz w:val="18"/>
+              </w:rPr>
+              <w:t>保持源行列数和仿射</w:t>
+            </w:r>
+          </w:p>
+        </w:tc>
+        <w:tc>
+          <w:tcPr>
+            <w:tcW w:type="dxa" w:w="3860"/>
+            <w:tcMar>
+              <w:top w:w="80" w:type="dxa"/>
+              <w:start w:w="120" w:type="dxa"/>
+              <w:bottom w:w="80" w:type="dxa"/>
+              <w:end w:w="120" w:type="dxa"/>
+            </w:tcMar>
+            <w:vAlign w:val="center"/>
+          </w:tcPr>
+          <w:p>
+            <w:pPr>
+              <w:spacing w:before="0" w:after="0" w:line="276" w:lineRule="auto"/>
+              <w:jc w:val="left"/>
+            </w:pPr>
+            <w:r>
+              <w:rPr>
+                <w:rFonts w:ascii="Calibri" w:hAnsi="Calibri" w:eastAsia="Microsoft YaHei"/>
+                <w:sz w:val="18"/>
+              </w:rPr>
+              <w:t>多边形内及边界写 NoData，外部保留；适合挖孔</w:t>
+            </w:r>
+          </w:p>
+        </w:tc>
+      </w:tr>
+    </w:tbl>
+    <w:p>
+      <w:pPr>
+        <w:spacing w:before="0" w:after="40"/>
+      </w:pPr>
+    </w:p>
+    <w:p>
+      <w:r>
+        <w:rPr>
+          <w:rFonts w:ascii="Calibri" w:hAnsi="Calibri" w:eastAsia="Microsoft YaHei"/>
+        </w:rPr>
+        <w:t>实现先用源 GRID 完整六参数逆仿射把世界坐标多边形一次变换到连续列、行空间，再对每个整数节点执行边界判断和偶奇射线判定，所以旋转、剪切和负像元高都能正确工作。紧凑裁剪会平移输出仿射原点，使输出 (0,0) 节点仍对应原 GRID 的同一世界位置。源 NoData/NaN 永远不会因裁剪变成有效值。</w:t>
+      </w:r>
+    </w:p>
+    <w:p>
+      <w:pPr>
+        <w:pStyle w:val="DterrainCode"/>
+        <w:shd w:fill="F2F4F7"/>
+      </w:pPr>
+      <w:r>
+        <w:rPr>
+          <w:rFonts w:ascii="Consolas" w:hAnsi="Consolas" w:eastAsia="Microsoft YaHei"/>
+          <w:sz w:val="17"/>
+        </w:rPr>
+        <w:t>dt_task_handle task = nullptr;</w:t>
+      </w:r>
+      <w:r>
+        <w:br/>
+      </w:r>
+      <w:r>
+        <w:rPr>
+          <w:rFonts w:ascii="Consolas" w:hAnsi="Consolas" w:eastAsia="Microsoft YaHei"/>
+          <w:sz w:val="17"/>
+        </w:rPr>
+        <w:t>dt_grid_clip_polygon_async(source, polygon, 4, &amp;o, &amp;task);</w:t>
+      </w:r>
+      <w:r>
+        <w:br/>
+      </w:r>
+      <w:r>
+        <w:rPr>
+          <w:rFonts w:ascii="Consolas" w:hAnsi="Consolas" w:eastAsia="Microsoft YaHei"/>
+          <w:sz w:val="17"/>
+        </w:rPr>
+        <w:t>// 输入多边形和 options 在创建任务时已深拷贝；可立即释放调用方数组</w:t>
+      </w:r>
+      <w:r>
+        <w:br/>
+      </w:r>
+      <w:r>
+        <w:rPr>
+          <w:rFonts w:ascii="Consolas" w:hAnsi="Consolas" w:eastAsia="Microsoft YaHei"/>
+          <w:sz w:val="17"/>
+        </w:rPr>
+        <w:t>dt_grid_handle clipped = nullptr;</w:t>
+      </w:r>
+      <w:r>
+        <w:br/>
+      </w:r>
+      <w:r>
+        <w:rPr>
+          <w:rFonts w:ascii="Consolas" w:hAnsi="Consolas" w:eastAsia="Microsoft YaHei"/>
+          <w:sz w:val="17"/>
+        </w:rPr>
+        <w:t>if (dt_task_get_grid_result(task, &amp;clipped) == DT_OK) {</w:t>
+      </w:r>
+      <w:r>
+        <w:br/>
+      </w:r>
+      <w:r>
+        <w:rPr>
+          <w:rFonts w:ascii="Consolas" w:hAnsi="Consolas" w:eastAsia="Microsoft YaHei"/>
+          <w:sz w:val="17"/>
+        </w:rPr>
+        <w:t xml:space="preserve">    dt_grid_destroy(clipped); // 调用方拥有结果句柄</w:t>
+      </w:r>
+      <w:r>
+        <w:br/>
+      </w:r>
+      <w:r>
+        <w:rPr>
+          <w:rFonts w:ascii="Consolas" w:hAnsi="Consolas" w:eastAsia="Microsoft YaHei"/>
+          <w:sz w:val="17"/>
+        </w:rPr>
+        <w:t>}</w:t>
+      </w:r>
+      <w:r>
+        <w:br/>
+      </w:r>
+      <w:r>
+        <w:rPr>
+          <w:rFonts w:ascii="Consolas" w:hAnsi="Consolas" w:eastAsia="Microsoft YaHei"/>
+          <w:sz w:val="17"/>
+        </w:rPr>
+        <w:t>dt_task_destroy(task);</w:t>
+      </w:r>
+    </w:p>
+    <w:p>
+      <w:pPr>
+        <w:spacing w:before="100" w:after="160" w:line="288" w:lineRule="auto"/>
+        <w:ind w:left="230" w:right="230"/>
+        <w:shd w:fill="E8EEF5"/>
+      </w:pPr>
+      <w:r>
+        <w:rPr>
+          <w:rFonts w:ascii="Calibri" w:hAnsi="Calibri" w:eastAsia="Microsoft YaHei"/>
+          <w:b/>
+          <w:color w:val="1F4D78"/>
+        </w:rPr>
+        <w:t xml:space="preserve">输入、取消与原子性  </w:t>
+      </w:r>
+      <w:r>
+        <w:rPr>
+          <w:rFonts w:ascii="Calibri" w:hAnsi="Calibri" w:eastAsia="Microsoft YaHei"/>
+        </w:rPr>
+        <w:t>options 固定为 64 字节；至少 3 个非退化顶点，相邻点不得重复，CROP_TO_BOUNDS 与 INVERT 不可同时设置。异步创建时深拷贝多边形；工作线程按行块写互不重叠区域，只有协调线程报告进度。失败、无入选节点或取消均不发布半成品，源 GRID 保持不变。</w:t>
+      </w:r>
+    </w:p>
+    <w:p>
+      <w:pPr>
+        <w:spacing w:before="100" w:after="160" w:line="288" w:lineRule="auto"/>
+        <w:ind w:left="230" w:right="230"/>
+        <w:shd w:fill="FFF7E0"/>
+      </w:pPr>
+      <w:r>
+        <w:rPr>
+          <w:rFonts w:ascii="Calibri" w:hAnsi="Calibri" w:eastAsia="Microsoft YaHei"/>
+          <w:b/>
+          <w:color w:val="7A5A00"/>
+        </w:rPr>
+        <w:t xml:space="preserve">节点级边界  </w:t>
+      </w:r>
+      <w:r>
+        <w:rPr>
+          <w:rFonts w:ascii="Calibri" w:hAnsi="Calibri" w:eastAsia="Microsoft YaHei"/>
+        </w:rPr>
+        <w:t>本接口裁剪的是 GRID 节点值，不会沿多边形切开栅格单元；紧凑范围也按入选节点包络确定。若工程流程要求像元覆盖率或单元解析边界，应在后续矢量/栅格叠加模块中处理。</w:t>
+      </w:r>
+    </w:p>
+    <w:p>
+      <w:pPr>
+        <w:spacing w:before="100" w:after="160" w:line="288" w:lineRule="auto"/>
+        <w:ind w:left="230" w:right="230"/>
+        <w:shd w:fill="FFF7E0"/>
+      </w:pPr>
+      <w:r>
+        <w:rPr>
+          <w:rFonts w:ascii="Calibri" w:hAnsi="Calibri" w:eastAsia="Microsoft YaHei"/>
+          <w:b/>
+          <w:color w:val="7A5A00"/>
+        </w:rPr>
+        <w:t xml:space="preserve">本机基准  </w:t>
+      </w:r>
+      <w:r>
+        <w:rPr>
+          <w:rFonts w:ascii="Calibri" w:hAnsi="Calibri" w:eastAsia="Microsoft YaHei"/>
+        </w:rPr>
+        <w:t>4096×4096、8 顶点多边形保持范围掩膜：单线程 0.378 s，自动并行 0.0755 s，约 5.01×；串并行校验和误差为 0。收益受多边形复杂度、CPU、内存带宽和块高影响，不是固定承诺。</w:t>
       </w:r>
     </w:p>
     <w:p>
@@ -15708,7 +16435,7 @@
         <w:rPr>
           <w:rFonts w:ascii="Calibri" w:hAnsi="Calibri" w:eastAsia="Microsoft YaHei"/>
         </w:rPr>
-        <w:t>测试覆盖生命周期、普通 TIN 动态编辑、DTIN/DTMESH/XYZ、TIN/GRID/等高线、等高线反向重建与高程冲突回滚、异步任务，以及 CDT 空网清理、外边界、孔洞、断裂线、交叉失败原子性、TIN→CDT、域内采样、CDT→GRID/等高线、共享顶点保护、批量新增/更新/删除、整批失败回滚和 DCDT 往返。局部坡面测试用解析平面验证 TIN/CDT 的 Z、世界梯度、坡度、坡向和法向；全幅测试覆盖坡度、坡向、阴影、CRS、旋转仿射、NoData、串并行一致和取消。土方测试锁定 64/112 字节 ABI、零线穿越解析体积、旋转面积、NoData、差值 GRID、异步结果和取消。v0.24 重采样测试另锁定 64 字节 ABI、旋转/剪切解析平面、最近邻与双线性、严格/归一化 NoData、串并行一致、异步结果、CRS 拒绝及大 GRID 取消。剖面、多边形量测和 GDAL 构建另有数学与真实文件往返测试。</w:t>
+        <w:t>测试覆盖生命周期、普通 TIN 动态编辑、DTIN/DTMESH/XYZ、TIN/GRID/等高线、等高线反向重建与高程冲突回滚、异步任务，以及 CDT 空网清理、外边界、孔洞、断裂线、交叉失败原子性、TIN→CDT、域内采样、CDT→GRID/等高线、共享顶点保护、批量新增/更新/删除、整批失败回滚和 DCDT 往返。局部坡面测试用解析平面验证 TIN/CDT 的 Z、世界梯度、坡度、坡向和法向；全幅测试覆盖坡度、坡向、阴影、CRS、旋转仿射、NoData、串并行一致和取消。土方测试锁定 64/112 字节 ABI、零线穿越解析体积、旋转面积、NoData、差值 GRID、异步结果和取消。v0.24 重采样测试另锁定 64 字节 ABI、旋转/剪切解析平面、最近邻与双线性、严格/归一化 NoData、串并行一致、异步结果、CRS 拒绝及大 GRID 取消。v0.25 多边形裁剪测试锁定 64 字节 ABI、旋转/剪切仿射、边界内含、保持/紧凑/反向三种模式、NoData、串并行一致、异步结果、非法选项、范围外与大 GRID 取消。剖面、多边形量测和 GDAL 构建另有数学与真实文件往返测试。</w:t>
       </w:r>
     </w:p>
     <w:p>
@@ -16425,7 +17152,7 @@
         <w:color w:val="66727D"/>
         <w:sz w:val="18"/>
       </w:rPr>
-      <w:t xml:space="preserve">版本 0.24.0  |  第 </w:t>
+      <w:t xml:space="preserve">版本 0.25.0  |  第 </w:t>
     </w:r>
     <w:r>
       <w:rPr>

</xml_diff>

<commit_message>
feat: add GRID overview LOD
</commit_message>
<xml_diff>
--- a/docs/manuals/dterrain_DLL开发使用手册.docx
+++ b/docs/manuals/dterrain_DLL开发使用手册.docx
@@ -70,7 +70,7 @@
           <w:color w:val="1F4D78"/>
           <w:sz w:val="28"/>
         </w:rPr>
-        <w:t>面向测绘地形建模的 TIN、GRID、等高线转换、动态编辑与空间查询</w:t>
+        <w:t>面向测绘地形建模的 TIN、GRID、等高线转换、大 GRID LOD、动态编辑与空间查询</w:t>
       </w:r>
     </w:p>
     <w:p>
@@ -85,7 +85,7 @@
           <w:color w:val="203748"/>
           <w:sz w:val="22"/>
         </w:rPr>
-        <w:t>版本 0.25.0  |  2026-07-18</w:t>
+        <w:t>版本 0.26.0  |  2026-07-18</w:t>
       </w:r>
     </w:p>
     <w:p>
@@ -243,7 +243,7 @@
                 <w:rFonts w:ascii="Calibri" w:hAnsi="Calibri" w:eastAsia="Microsoft YaHei"/>
                 <w:sz w:val="18"/>
               </w:rPr>
-              <w:t>0.25.0</w:t>
+              <w:t>0.26.0</w:t>
             </w:r>
           </w:p>
         </w:tc>
@@ -463,7 +463,7 @@
                 <w:rFonts w:ascii="Calibri" w:hAnsi="Calibri" w:eastAsia="Microsoft YaHei"/>
                 <w:sz w:val="18"/>
               </w:rPr>
-              <w:t>架构、构建部署、稳定 C ABI、GRID 多边形裁剪/掩膜、GRID 显式重采样、双 GRID 精确挖填方、局部与全幅坡度/坡向/阴影分析、约束 Delaunay、GRID/等高线转换、GDAL 格式交换、异步任务、12 个兼容接口、文件格式、性能、线程安全、故障排查。</w:t>
+              <w:t>架构、构建部署、稳定 C ABI、GRID 窗口概览/LOD、GRID 多边形裁剪/掩膜、GRID 显式重采样、双 GRID 精确挖填方、局部与全幅坡度/坡向/阴影分析、约束 Delaunay、GRID/等高线转换、GDAL 格式交换、异步任务、12 个兼容接口、文件格式、性能、线程安全、故障排查。</w:t>
             </w:r>
           </w:p>
         </w:tc>
@@ -572,6 +572,17 @@
     </w:p>
     <w:p>
       <w:pPr>
+        <w:pStyle w:val="ListBullet"/>
+      </w:pPr>
+      <w:r>
+        <w:rPr>
+          <w:rFonts w:ascii="Calibri" w:hAnsi="Calibri" w:eastAsia="Microsoft YaHei"/>
+        </w:rPr>
+        <w:t>大 GRID 概览与 LOD：重点阅读第 4.14 节。</w:t>
+      </w:r>
+    </w:p>
+    <w:p>
+      <w:pPr>
         <w:spacing w:before="100" w:after="160" w:line="288" w:lineRule="auto"/>
         <w:ind w:left="230" w:right="230"/>
         <w:shd w:fill="FFF7E0"/>
@@ -588,7 +599,7 @@
         <w:rPr>
           <w:rFonts w:ascii="Calibri" w:hAnsi="Calibri" w:eastAsia="Microsoft YaHei"/>
         </w:rPr>
-        <w:t>本手册对应 dterrain 0.25.0：新增任意简单多边形 GRID 掩膜、紧凑裁剪与反向掩膜，同步/异步接口均支持完整六参数仿射、NoData、并行和取消；显式重采样、解析挖填方、全幅地形专题、剖面、GDAL 与约束事务保持兼容。坐标重投影、流式超大 GRID、网格单元解析边界裁剪、局部 CDT 和 GPU LOD 属于后续阶段。</w:t>
+        <w:t>本手册对应 dterrain 0.26.0：新增 caller-owned GRID 窗口概览/LOD 读取，提供平均、最近邻、最小值、最大值、严格 NoData、精确源窗口统计和确定性并行；GUI 由此可预览超过 2000 万节点的大 GRID。多边形裁剪、显式重采样、解析挖填方、全幅地形专题、剖面、GDAL 与约束事务保持兼容。坐标重投影、磁盘流式瓦片、持久化多级金字塔、网格单元解析边界裁剪、局部 CDT 和 GPU LOD 属于后续阶段。</w:t>
       </w:r>
     </w:p>
     <w:p>
@@ -734,6 +745,17 @@
           <w:rFonts w:ascii="Calibri" w:hAnsi="Calibri" w:eastAsia="Microsoft YaHei"/>
         </w:rPr>
         <w:t>GRID 按任意简单多边形作保持范围掩膜、紧凑裁剪或反向掩膜，支持旋转/剪切仿射、并行与取消。</w:t>
+      </w:r>
+    </w:p>
+    <w:p>
+      <w:pPr>
+        <w:pStyle w:val="ListBullet"/>
+      </w:pPr>
+      <w:r>
+        <w:rPr>
+          <w:rFonts w:ascii="Calibri" w:hAnsi="Calibri" w:eastAsia="Microsoft YaHei"/>
+        </w:rPr>
+        <w:t>GRID 指定窗口直接读取 caller-owned 概览，支持平均、最近邻、最小值、最大值、NoData、精确统计与确定性并行。</w:t>
       </w:r>
     </w:p>
     <w:p>
@@ -8210,7 +8232,7 @@
         <w:rPr>
           <w:rFonts w:ascii="Calibri" w:hAnsi="Calibri" w:eastAsia="Microsoft YaHei"/>
         </w:rPr>
-        <w:t>v0.25 单项约束编辑仍完整重建候选 CDT；批量事务只重建一次。100,000 基础点添加 12 条断裂线的本机对比为逐条 3.259 s、批量 0.528 s，约 6.17 倍。请求 output_effect 还会计算完整域差异。未分段交叉仍须先加入共享顶点。</w:t>
+        <w:t>v0.26 单项约束编辑仍完整重建候选 CDT；批量事务只重建一次。100,000 基础点添加 12 条断裂线的本机对比为逐条 3.259 s、批量 0.528 s，约 6.17 倍。请求 output_effect 还会计算完整域差异。未分段交叉仍须先加入共享顶点。</w:t>
       </w:r>
     </w:p>
     <w:p>
@@ -12095,6 +12117,625 @@
           <w:rFonts w:ascii="Calibri" w:hAnsi="Calibri" w:eastAsia="Microsoft YaHei"/>
         </w:rPr>
         <w:t>4096×4096、8 顶点多边形保持范围掩膜：单线程 0.378 s，自动并行 0.0755 s，约 5.01×；串并行校验和误差为 0。收益受多边形复杂度、CPU、内存带宽和块高影响，不是固定承诺。</w:t>
+      </w:r>
+    </w:p>
+    <w:p>
+      <w:pPr>
+        <w:pStyle w:val="Heading2"/>
+      </w:pPr>
+      <w:r>
+        <w:t>4.14 GRID 窗口概览与 LOD 读取</w:t>
+      </w:r>
+    </w:p>
+    <w:p>
+      <w:r>
+        <w:rPr>
+          <w:rFonts w:ascii="Calibri" w:hAnsi="Calibri" w:eastAsia="Microsoft YaHei"/>
+        </w:rPr>
+        <w:t>dt_grid_read_overview() 从任意源窗口直接生成较小的概览矩阵，避免 GUI 或集成系统先读取整幅超大 GRID。输出数组由调用方分配，接口同步填充，不创建第二个 GRID 句柄；因此热路径只有小型输出和每输出行统计的临时开销。source_width/source_height 为 0 时表示从起点延伸到源 GRID 剩余范围。</w:t>
+      </w:r>
+    </w:p>
+    <w:p>
+      <w:pPr>
+        <w:pStyle w:val="DterrainCode"/>
+        <w:shd w:fill="F2F4F7"/>
+      </w:pPr>
+      <w:r>
+        <w:rPr>
+          <w:rFonts w:ascii="Consolas" w:hAnsi="Consolas" w:eastAsia="Microsoft YaHei"/>
+          <w:sz w:val="17"/>
+        </w:rPr>
+        <w:t>dt_grid_overview_options o{};</w:t>
+      </w:r>
+      <w:r>
+        <w:br/>
+      </w:r>
+      <w:r>
+        <w:rPr>
+          <w:rFonts w:ascii="Consolas" w:hAnsi="Consolas" w:eastAsia="Microsoft YaHei"/>
+          <w:sz w:val="17"/>
+        </w:rPr>
+        <w:t>o.struct_size = sizeof(o);</w:t>
+      </w:r>
+      <w:r>
+        <w:br/>
+      </w:r>
+      <w:r>
+        <w:rPr>
+          <w:rFonts w:ascii="Consolas" w:hAnsi="Consolas" w:eastAsia="Microsoft YaHei"/>
+          <w:sz w:val="17"/>
+        </w:rPr>
+        <w:t>o.method = DT_GRID_OVERVIEW_AVERAGE;</w:t>
+      </w:r>
+      <w:r>
+        <w:br/>
+      </w:r>
+      <w:r>
+        <w:rPr>
+          <w:rFonts w:ascii="Consolas" w:hAnsi="Consolas" w:eastAsia="Microsoft YaHei"/>
+          <w:sz w:val="17"/>
+        </w:rPr>
+        <w:t>o.worker_count = 0;       // 自动最多 32；显式最多 64</w:t>
+      </w:r>
+      <w:r>
+        <w:br/>
+      </w:r>
+      <w:r>
+        <w:rPr>
+          <w:rFonts w:ascii="Consolas" w:hAnsi="Consolas" w:eastAsia="Microsoft YaHei"/>
+          <w:sz w:val="17"/>
+        </w:rPr>
+        <w:t>o.tile_row_count = 16;</w:t>
+      </w:r>
+      <w:r>
+        <w:br/>
+      </w:r>
+      <w:r>
+        <w:rPr>
+          <w:rFonts w:ascii="Consolas" w:hAnsi="Consolas" w:eastAsia="Microsoft YaHei"/>
+          <w:sz w:val="17"/>
+        </w:rPr>
+      </w:r>
+      <w:r>
+        <w:br/>
+      </w:r>
+      <w:r>
+        <w:rPr>
+          <w:rFonts w:ascii="Consolas" w:hAnsi="Consolas" w:eastAsia="Microsoft YaHei"/>
+          <w:sz w:val="17"/>
+        </w:rPr>
+        <w:t>std::vector&lt;double&gt; preview(512 * 512);</w:t>
+      </w:r>
+      <w:r>
+        <w:br/>
+      </w:r>
+      <w:r>
+        <w:rPr>
+          <w:rFonts w:ascii="Consolas" w:hAnsi="Consolas" w:eastAsia="Microsoft YaHei"/>
+          <w:sz w:val="17"/>
+        </w:rPr>
+        <w:t>dt_grid_overview_result r{};</w:t>
+      </w:r>
+      <w:r>
+        <w:br/>
+      </w:r>
+      <w:r>
+        <w:rPr>
+          <w:rFonts w:ascii="Consolas" w:hAnsi="Consolas" w:eastAsia="Microsoft YaHei"/>
+          <w:sz w:val="17"/>
+        </w:rPr>
+        <w:t>r.struct_size = sizeof(r);</w:t>
+      </w:r>
+      <w:r>
+        <w:br/>
+      </w:r>
+      <w:r>
+        <w:rPr>
+          <w:rFonts w:ascii="Consolas" w:hAnsi="Consolas" w:eastAsia="Microsoft YaHei"/>
+          <w:sz w:val="17"/>
+        </w:rPr>
+        <w:t>dt_status s = dt_grid_read_overview(</w:t>
+      </w:r>
+      <w:r>
+        <w:br/>
+      </w:r>
+      <w:r>
+        <w:rPr>
+          <w:rFonts w:ascii="Consolas" w:hAnsi="Consolas" w:eastAsia="Microsoft YaHei"/>
+          <w:sz w:val="17"/>
+        </w:rPr>
+        <w:t xml:space="preserve">    grid, &amp;o, 512, 512, preview.data(), 512, &amp;r);</w:t>
+      </w:r>
+    </w:p>
+    <w:tbl>
+      <w:tblPr>
+        <w:tblStyle w:val="TableGrid"/>
+        <w:tblW w:type="dxa" w:w="9260"/>
+        <w:jc w:val="left"/>
+        <w:tblLayout w:type="fixed"/>
+        <w:tblLook w:firstColumn="1" w:firstRow="1" w:lastColumn="0" w:lastRow="0" w:noHBand="0" w:noVBand="1" w:val="04A0"/>
+        <w:tblInd w:w="120" w:type="dxa"/>
+      </w:tblPr>
+      <w:tblGrid>
+        <w:gridCol w:w="2100"/>
+        <w:gridCol w:w="3950"/>
+        <w:gridCol w:w="3210"/>
+      </w:tblGrid>
+      <w:tr>
+        <w:trPr>
+          <w:cantSplit/>
+          <w:tblHeader w:val="true"/>
+        </w:trPr>
+        <w:tc>
+          <w:tcPr>
+            <w:tcW w:type="dxa" w:w="2100"/>
+            <w:shd w:fill="E8EEF5"/>
+            <w:tcMar>
+              <w:top w:w="80" w:type="dxa"/>
+              <w:start w:w="120" w:type="dxa"/>
+              <w:bottom w:w="80" w:type="dxa"/>
+              <w:end w:w="120" w:type="dxa"/>
+            </w:tcMar>
+            <w:vAlign w:val="center"/>
+          </w:tcPr>
+          <w:p>
+            <w:pPr>
+              <w:keepNext/>
+              <w:spacing w:before="0" w:after="0"/>
+              <w:jc w:val="center"/>
+            </w:pPr>
+            <w:r>
+              <w:rPr>
+                <w:rFonts w:ascii="Calibri" w:hAnsi="Calibri" w:eastAsia="Microsoft YaHei"/>
+                <w:b/>
+                <w:color w:val="203748"/>
+                <w:sz w:val="19"/>
+              </w:rPr>
+              <w:t>方法</w:t>
+            </w:r>
+          </w:p>
+        </w:tc>
+        <w:tc>
+          <w:tcPr>
+            <w:tcW w:type="dxa" w:w="3950"/>
+            <w:shd w:fill="E8EEF5"/>
+            <w:tcMar>
+              <w:top w:w="80" w:type="dxa"/>
+              <w:start w:w="120" w:type="dxa"/>
+              <w:bottom w:w="80" w:type="dxa"/>
+              <w:end w:w="120" w:type="dxa"/>
+            </w:tcMar>
+            <w:vAlign w:val="center"/>
+          </w:tcPr>
+          <w:p>
+            <w:pPr>
+              <w:keepNext/>
+              <w:spacing w:before="0" w:after="0"/>
+              <w:jc w:val="center"/>
+            </w:pPr>
+            <w:r>
+              <w:rPr>
+                <w:rFonts w:ascii="Calibri" w:hAnsi="Calibri" w:eastAsia="Microsoft YaHei"/>
+                <w:b/>
+                <w:color w:val="203748"/>
+                <w:sz w:val="19"/>
+              </w:rPr>
+              <w:t>每个输出值</w:t>
+            </w:r>
+          </w:p>
+        </w:tc>
+        <w:tc>
+          <w:tcPr>
+            <w:tcW w:type="dxa" w:w="3210"/>
+            <w:shd w:fill="E8EEF5"/>
+            <w:tcMar>
+              <w:top w:w="80" w:type="dxa"/>
+              <w:start w:w="120" w:type="dxa"/>
+              <w:bottom w:w="80" w:type="dxa"/>
+              <w:end w:w="120" w:type="dxa"/>
+            </w:tcMar>
+            <w:vAlign w:val="center"/>
+          </w:tcPr>
+          <w:p>
+            <w:pPr>
+              <w:keepNext/>
+              <w:spacing w:before="0" w:after="0"/>
+              <w:jc w:val="center"/>
+            </w:pPr>
+            <w:r>
+              <w:rPr>
+                <w:rFonts w:ascii="Calibri" w:hAnsi="Calibri" w:eastAsia="Microsoft YaHei"/>
+                <w:b/>
+                <w:color w:val="203748"/>
+                <w:sz w:val="19"/>
+              </w:rPr>
+              <w:t>建议用途</w:t>
+            </w:r>
+          </w:p>
+        </w:tc>
+      </w:tr>
+      <w:tr>
+        <w:trPr>
+          <w:cantSplit/>
+        </w:trPr>
+        <w:tc>
+          <w:tcPr>
+            <w:tcW w:type="dxa" w:w="2100"/>
+            <w:tcMar>
+              <w:top w:w="80" w:type="dxa"/>
+              <w:start w:w="120" w:type="dxa"/>
+              <w:bottom w:w="80" w:type="dxa"/>
+              <w:end w:w="120" w:type="dxa"/>
+            </w:tcMar>
+            <w:vAlign w:val="center"/>
+          </w:tcPr>
+          <w:p>
+            <w:pPr>
+              <w:spacing w:before="0" w:after="0" w:line="276" w:lineRule="auto"/>
+              <w:jc w:val="center"/>
+            </w:pPr>
+            <w:r>
+              <w:rPr>
+                <w:rFonts w:ascii="Calibri" w:hAnsi="Calibri" w:eastAsia="Microsoft YaHei"/>
+                <w:sz w:val="18"/>
+              </w:rPr>
+              <w:t>AVERAGE（0/1）</w:t>
+            </w:r>
+          </w:p>
+        </w:tc>
+        <w:tc>
+          <w:tcPr>
+            <w:tcW w:type="dxa" w:w="3950"/>
+            <w:tcMar>
+              <w:top w:w="80" w:type="dxa"/>
+              <w:start w:w="120" w:type="dxa"/>
+              <w:bottom w:w="80" w:type="dxa"/>
+              <w:end w:w="120" w:type="dxa"/>
+            </w:tcMar>
+            <w:vAlign w:val="center"/>
+          </w:tcPr>
+          <w:p>
+            <w:pPr>
+              <w:spacing w:before="0" w:after="0" w:line="276" w:lineRule="auto"/>
+              <w:jc w:val="left"/>
+            </w:pPr>
+            <w:r>
+              <w:rPr>
+                <w:rFonts w:ascii="Calibri" w:hAnsi="Calibri" w:eastAsia="Microsoft YaHei"/>
+                <w:sz w:val="18"/>
+              </w:rPr>
+              <w:t>整数分箱内所有有效源节点的平均值</w:t>
+            </w:r>
+          </w:p>
+        </w:tc>
+        <w:tc>
+          <w:tcPr>
+            <w:tcW w:type="dxa" w:w="3210"/>
+            <w:tcMar>
+              <w:top w:w="80" w:type="dxa"/>
+              <w:start w:w="120" w:type="dxa"/>
+              <w:bottom w:w="80" w:type="dxa"/>
+              <w:end w:w="120" w:type="dxa"/>
+            </w:tcMar>
+            <w:vAlign w:val="center"/>
+          </w:tcPr>
+          <w:p>
+            <w:pPr>
+              <w:spacing w:before="0" w:after="0" w:line="276" w:lineRule="auto"/>
+              <w:jc w:val="left"/>
+            </w:pPr>
+            <w:r>
+              <w:rPr>
+                <w:rFonts w:ascii="Calibri" w:hAnsi="Calibri" w:eastAsia="Microsoft YaHei"/>
+                <w:sz w:val="18"/>
+              </w:rPr>
+              <w:t>连续高程与坡度/阴影概览；GUI 默认</w:t>
+            </w:r>
+          </w:p>
+        </w:tc>
+      </w:tr>
+      <w:tr>
+        <w:trPr>
+          <w:cantSplit/>
+        </w:trPr>
+        <w:tc>
+          <w:tcPr>
+            <w:tcW w:type="dxa" w:w="2100"/>
+            <w:tcMar>
+              <w:top w:w="80" w:type="dxa"/>
+              <w:start w:w="120" w:type="dxa"/>
+              <w:bottom w:w="80" w:type="dxa"/>
+              <w:end w:w="120" w:type="dxa"/>
+            </w:tcMar>
+            <w:vAlign w:val="center"/>
+          </w:tcPr>
+          <w:p>
+            <w:pPr>
+              <w:spacing w:before="0" w:after="0" w:line="276" w:lineRule="auto"/>
+              <w:jc w:val="center"/>
+            </w:pPr>
+            <w:r>
+              <w:rPr>
+                <w:rFonts w:ascii="Calibri" w:hAnsi="Calibri" w:eastAsia="Microsoft YaHei"/>
+                <w:sz w:val="18"/>
+              </w:rPr>
+              <w:t>NEAREST</w:t>
+            </w:r>
+          </w:p>
+        </w:tc>
+        <w:tc>
+          <w:tcPr>
+            <w:tcW w:type="dxa" w:w="3950"/>
+            <w:tcMar>
+              <w:top w:w="80" w:type="dxa"/>
+              <w:start w:w="120" w:type="dxa"/>
+              <w:bottom w:w="80" w:type="dxa"/>
+              <w:end w:w="120" w:type="dxa"/>
+            </w:tcMar>
+            <w:vAlign w:val="center"/>
+          </w:tcPr>
+          <w:p>
+            <w:pPr>
+              <w:spacing w:before="0" w:after="0" w:line="276" w:lineRule="auto"/>
+              <w:jc w:val="left"/>
+            </w:pPr>
+            <w:r>
+              <w:rPr>
+                <w:rFonts w:ascii="Calibri" w:hAnsi="Calibri" w:eastAsia="Microsoft YaHei"/>
+                <w:sz w:val="18"/>
+              </w:rPr>
+              <w:t>取分箱中心对应的最近源节点；允许上采样</w:t>
+            </w:r>
+          </w:p>
+        </w:tc>
+        <w:tc>
+          <w:tcPr>
+            <w:tcW w:type="dxa" w:w="3210"/>
+            <w:tcMar>
+              <w:top w:w="80" w:type="dxa"/>
+              <w:start w:w="120" w:type="dxa"/>
+              <w:bottom w:w="80" w:type="dxa"/>
+              <w:end w:w="120" w:type="dxa"/>
+            </w:tcMar>
+            <w:vAlign w:val="center"/>
+          </w:tcPr>
+          <w:p>
+            <w:pPr>
+              <w:spacing w:before="0" w:after="0" w:line="276" w:lineRule="auto"/>
+              <w:jc w:val="left"/>
+            </w:pPr>
+            <w:r>
+              <w:rPr>
+                <w:rFonts w:ascii="Calibri" w:hAnsi="Calibri" w:eastAsia="Microsoft YaHei"/>
+                <w:sz w:val="18"/>
+              </w:rPr>
+              <w:t>坡向角、分类或离散值，避免角度环绕平均</w:t>
+            </w:r>
+          </w:p>
+        </w:tc>
+      </w:tr>
+      <w:tr>
+        <w:trPr>
+          <w:cantSplit/>
+        </w:trPr>
+        <w:tc>
+          <w:tcPr>
+            <w:tcW w:type="dxa" w:w="2100"/>
+            <w:tcMar>
+              <w:top w:w="80" w:type="dxa"/>
+              <w:start w:w="120" w:type="dxa"/>
+              <w:bottom w:w="80" w:type="dxa"/>
+              <w:end w:w="120" w:type="dxa"/>
+            </w:tcMar>
+            <w:vAlign w:val="center"/>
+          </w:tcPr>
+          <w:p>
+            <w:pPr>
+              <w:spacing w:before="0" w:after="0" w:line="276" w:lineRule="auto"/>
+              <w:jc w:val="center"/>
+            </w:pPr>
+            <w:r>
+              <w:rPr>
+                <w:rFonts w:ascii="Calibri" w:hAnsi="Calibri" w:eastAsia="Microsoft YaHei"/>
+                <w:sz w:val="18"/>
+              </w:rPr>
+              <w:t>MINIMUM</w:t>
+            </w:r>
+          </w:p>
+        </w:tc>
+        <w:tc>
+          <w:tcPr>
+            <w:tcW w:type="dxa" w:w="3950"/>
+            <w:tcMar>
+              <w:top w:w="80" w:type="dxa"/>
+              <w:start w:w="120" w:type="dxa"/>
+              <w:bottom w:w="80" w:type="dxa"/>
+              <w:end w:w="120" w:type="dxa"/>
+            </w:tcMar>
+            <w:vAlign w:val="center"/>
+          </w:tcPr>
+          <w:p>
+            <w:pPr>
+              <w:spacing w:before="0" w:after="0" w:line="276" w:lineRule="auto"/>
+              <w:jc w:val="left"/>
+            </w:pPr>
+            <w:r>
+              <w:rPr>
+                <w:rFonts w:ascii="Calibri" w:hAnsi="Calibri" w:eastAsia="Microsoft YaHei"/>
+                <w:sz w:val="18"/>
+              </w:rPr>
+              <w:t>整数分箱内有效源节点最小值</w:t>
+            </w:r>
+          </w:p>
+        </w:tc>
+        <w:tc>
+          <w:tcPr>
+            <w:tcW w:type="dxa" w:w="3210"/>
+            <w:tcMar>
+              <w:top w:w="80" w:type="dxa"/>
+              <w:start w:w="120" w:type="dxa"/>
+              <w:bottom w:w="80" w:type="dxa"/>
+              <w:end w:w="120" w:type="dxa"/>
+            </w:tcMar>
+            <w:vAlign w:val="center"/>
+          </w:tcPr>
+          <w:p>
+            <w:pPr>
+              <w:spacing w:before="0" w:after="0" w:line="276" w:lineRule="auto"/>
+              <w:jc w:val="left"/>
+            </w:pPr>
+            <w:r>
+              <w:rPr>
+                <w:rFonts w:ascii="Calibri" w:hAnsi="Calibri" w:eastAsia="Microsoft YaHei"/>
+                <w:sz w:val="18"/>
+              </w:rPr>
+              <w:t>保留下包络或极低点</w:t>
+            </w:r>
+          </w:p>
+        </w:tc>
+      </w:tr>
+      <w:tr>
+        <w:trPr>
+          <w:cantSplit/>
+        </w:trPr>
+        <w:tc>
+          <w:tcPr>
+            <w:tcW w:type="dxa" w:w="2100"/>
+            <w:tcMar>
+              <w:top w:w="80" w:type="dxa"/>
+              <w:start w:w="120" w:type="dxa"/>
+              <w:bottom w:w="80" w:type="dxa"/>
+              <w:end w:w="120" w:type="dxa"/>
+            </w:tcMar>
+            <w:vAlign w:val="center"/>
+          </w:tcPr>
+          <w:p>
+            <w:pPr>
+              <w:spacing w:before="0" w:after="0" w:line="276" w:lineRule="auto"/>
+              <w:jc w:val="center"/>
+            </w:pPr>
+            <w:r>
+              <w:rPr>
+                <w:rFonts w:ascii="Calibri" w:hAnsi="Calibri" w:eastAsia="Microsoft YaHei"/>
+                <w:sz w:val="18"/>
+              </w:rPr>
+              <w:t>MAXIMUM</w:t>
+            </w:r>
+          </w:p>
+        </w:tc>
+        <w:tc>
+          <w:tcPr>
+            <w:tcW w:type="dxa" w:w="3950"/>
+            <w:tcMar>
+              <w:top w:w="80" w:type="dxa"/>
+              <w:start w:w="120" w:type="dxa"/>
+              <w:bottom w:w="80" w:type="dxa"/>
+              <w:end w:w="120" w:type="dxa"/>
+            </w:tcMar>
+            <w:vAlign w:val="center"/>
+          </w:tcPr>
+          <w:p>
+            <w:pPr>
+              <w:spacing w:before="0" w:after="0" w:line="276" w:lineRule="auto"/>
+              <w:jc w:val="left"/>
+            </w:pPr>
+            <w:r>
+              <w:rPr>
+                <w:rFonts w:ascii="Calibri" w:hAnsi="Calibri" w:eastAsia="Microsoft YaHei"/>
+                <w:sz w:val="18"/>
+              </w:rPr>
+              <w:t>整数分箱内有效源节点最大值</w:t>
+            </w:r>
+          </w:p>
+        </w:tc>
+        <w:tc>
+          <w:tcPr>
+            <w:tcW w:type="dxa" w:w="3210"/>
+            <w:tcMar>
+              <w:top w:w="80" w:type="dxa"/>
+              <w:start w:w="120" w:type="dxa"/>
+              <w:bottom w:w="80" w:type="dxa"/>
+              <w:end w:w="120" w:type="dxa"/>
+            </w:tcMar>
+            <w:vAlign w:val="center"/>
+          </w:tcPr>
+          <w:p>
+            <w:pPr>
+              <w:spacing w:before="0" w:after="0" w:line="276" w:lineRule="auto"/>
+              <w:jc w:val="left"/>
+            </w:pPr>
+            <w:r>
+              <w:rPr>
+                <w:rFonts w:ascii="Calibri" w:hAnsi="Calibri" w:eastAsia="Microsoft YaHei"/>
+                <w:sz w:val="18"/>
+              </w:rPr>
+              <w:t>保留上包络或极高点</w:t>
+            </w:r>
+          </w:p>
+        </w:tc>
+      </w:tr>
+    </w:tbl>
+    <w:p>
+      <w:pPr>
+        <w:spacing w:before="0" w:after="40"/>
+      </w:pPr>
+    </w:p>
+    <w:p>
+      <w:r>
+        <w:rPr>
+          <w:rFonts w:ascii="Calibri" w:hAnsi="Calibri" w:eastAsia="Microsoft YaHei"/>
+        </w:rPr>
+        <w:t>聚合方法使用 floor(i×源尺寸/输出尺寸) 的整数边界，每个源节点恰好进入一个输出分箱，因而拒绝上采样；最近邻按分箱中心取样并允许上采样。默认忽略分箱内 NoData/NaN，若没有有效值则输出源 NoData（源未定义时为 NaN）；DT_GRID_OVERVIEW_STRICT_NODATA 使任一无效源节点将整个分箱标为 NoData。</w:t>
+      </w:r>
+    </w:p>
+    <w:p>
+      <w:r>
+        <w:rPr>
+          <w:rFonts w:ascii="Calibri" w:hAnsi="Calibri" w:eastAsia="Microsoft YaHei"/>
+        </w:rPr>
+        <w:t>dt_grid_overview_options 与 dt_grid_overview_result 均固定为 64 字节。平均、最小和最大方法的结果统计覆盖完整源窗口，并设置 DT_GRID_OVERVIEW_EXACT_SOURCE_STATISTICS；最近邻的统计只覆盖实际输出样本。output_result 可省略，row_stride 以 double 数量计，便于直接写入带行填充的图像或矩阵。</w:t>
+      </w:r>
+    </w:p>
+    <w:p>
+      <w:pPr>
+        <w:spacing w:before="100" w:after="160" w:line="288" w:lineRule="auto"/>
+        <w:ind w:left="230" w:right="230"/>
+        <w:shd w:fill="E8EEF5"/>
+      </w:pPr>
+      <w:r>
+        <w:rPr>
+          <w:rFonts w:ascii="Calibri" w:hAnsi="Calibri" w:eastAsia="Microsoft YaHei"/>
+          <w:b/>
+          <w:color w:val="1F4D78"/>
+        </w:rPr>
+        <w:t xml:space="preserve">并行与所有权  </w:t>
+      </w:r>
+      <w:r>
+        <w:rPr>
+          <w:rFonts w:ascii="Calibri" w:hAnsi="Calibri" w:eastAsia="Microsoft YaHei"/>
+        </w:rPr>
+        <w:t>工作线程动态领取输出行块，只写互不重叠的调用方行和统计槽；协调线程按输出行顺序归并 long double 和，保证串并行结果确定。单轴最多 1,048,576，输出总数最多 10 亿。接口仅在同步调用期间借用 grid、options 和输出数组，返回后即可安全复用或释放调用方缓存。</w:t>
+      </w:r>
+    </w:p>
+    <w:p>
+      <w:pPr>
+        <w:spacing w:before="100" w:after="160" w:line="288" w:lineRule="auto"/>
+        <w:ind w:left="230" w:right="230"/>
+        <w:shd w:fill="FFF7E0"/>
+      </w:pPr>
+      <w:r>
+        <w:rPr>
+          <w:rFonts w:ascii="Calibri" w:hAnsi="Calibri" w:eastAsia="Microsoft YaHei"/>
+          <w:b/>
+          <w:color w:val="7A5A00"/>
+        </w:rPr>
+        <w:t xml:space="preserve">本机基准  </w:t>
+      </w:r>
+      <w:r>
+        <w:rPr>
+          <w:rFonts w:ascii="Calibri" w:hAnsi="Calibri" w:eastAsia="Microsoft YaHei"/>
+        </w:rPr>
+        <w:t>8192×4096 源 GRID 缩至 512×512 平均概览：单线程 0.0427 s，自动并行 0.00963 s，约 4.43×；串并行输出与统计误差为 0。收益受 CPU、内存带宽、源窗口和块高影响，不是固定承诺。</w:t>
       </w:r>
     </w:p>
     <w:p>
@@ -16435,7 +17076,7 @@
         <w:rPr>
           <w:rFonts w:ascii="Calibri" w:hAnsi="Calibri" w:eastAsia="Microsoft YaHei"/>
         </w:rPr>
-        <w:t>测试覆盖生命周期、普通 TIN 动态编辑、DTIN/DTMESH/XYZ、TIN/GRID/等高线、等高线反向重建与高程冲突回滚、异步任务，以及 CDT 空网清理、外边界、孔洞、断裂线、交叉失败原子性、TIN→CDT、域内采样、CDT→GRID/等高线、共享顶点保护、批量新增/更新/删除、整批失败回滚和 DCDT 往返。局部坡面测试用解析平面验证 TIN/CDT 的 Z、世界梯度、坡度、坡向和法向；全幅测试覆盖坡度、坡向、阴影、CRS、旋转仿射、NoData、串并行一致和取消。土方测试锁定 64/112 字节 ABI、零线穿越解析体积、旋转面积、NoData、差值 GRID、异步结果和取消。v0.24 重采样测试另锁定 64 字节 ABI、旋转/剪切解析平面、最近邻与双线性、严格/归一化 NoData、串并行一致、异步结果、CRS 拒绝及大 GRID 取消。v0.25 多边形裁剪测试锁定 64 字节 ABI、旋转/剪切仿射、边界内含、保持/紧凑/反向三种模式、NoData、串并行一致、异步结果、非法选项、范围外与大 GRID 取消。剖面、多边形量测和 GDAL 构建另有数学与真实文件往返测试。</w:t>
+        <w:t>测试覆盖生命周期、普通 TIN 动态编辑、DTIN/DTMESH/XYZ、TIN/GRID/等高线、等高线反向重建与高程冲突回滚、异步任务，以及 CDT 空网清理、外边界、孔洞、断裂线、交叉失败原子性、TIN→CDT、域内采样、CDT→GRID/等高线、共享顶点保护、批量新增/更新/删除、整批失败回滚和 DCDT 往返。局部坡面测试用解析平面验证 TIN/CDT 的 Z、世界梯度、坡度、坡向和法向；全幅测试覆盖坡度、坡向、阴影、CRS、旋转仿射、NoData、串并行一致和取消。土方测试锁定 64/112 字节 ABI、零线穿越解析体积、旋转面积、NoData、差值 GRID、异步结果和取消。v0.24 重采样测试另锁定 64 字节 ABI、旋转/剪切解析平面、最近邻与双线性、严格/归一化 NoData、串并行一致、异步结果、CRS 拒绝及大 GRID 取消。v0.25 多边形裁剪测试锁定 64 字节 ABI、旋转/剪切仿射、边界内含、保持/紧凑/反向三种模式、NoData、串并行一致、异步结果、非法选项、范围外与大 GRID 取消。v0.26 概览测试锁定 64/64 字节 ABI、平均/最近邻/最小/最大、严格 NoData、源子窗口、上采样规则、带填充步长以及串并行确定性。剖面、多边形量测和 GDAL 构建另有数学与真实文件往返测试。</w:t>
       </w:r>
     </w:p>
     <w:p>
@@ -17152,7 +17793,7 @@
         <w:color w:val="66727D"/>
         <w:sz w:val="18"/>
       </w:rPr>
-      <w:t xml:space="preserve">版本 0.25.0  |  第 </w:t>
+      <w:t xml:space="preserve">版本 0.26.0  |  第 </w:t>
     </w:r>
     <w:r>
       <w:rPr>

</xml_diff>

<commit_message>
feat: add adaptive GRID view LOD
</commit_message>
<xml_diff>
--- a/docs/manuals/dterrain_DLL开发使用手册.docx
+++ b/docs/manuals/dterrain_DLL开发使用手册.docx
@@ -70,7 +70,7 @@
           <w:color w:val="1F4D78"/>
           <w:sz w:val="28"/>
         </w:rPr>
-        <w:t>面向测绘地形建模的 TIN、GRID、等高线转换、大 GRID LOD、动态编辑与空间查询</w:t>
+        <w:t>面向测绘地形建模的 TIN、GRID、等高线转换、视口自适应 GRID LOD、动态编辑与空间查询</w:t>
       </w:r>
     </w:p>
     <w:p>
@@ -85,7 +85,7 @@
           <w:color w:val="203748"/>
           <w:sz w:val="22"/>
         </w:rPr>
-        <w:t>版本 0.26.0  |  2026-07-18</w:t>
+        <w:t>版本 0.27.0  |  2026-07-18</w:t>
       </w:r>
     </w:p>
     <w:p>
@@ -243,7 +243,7 @@
                 <w:rFonts w:ascii="Calibri" w:hAnsi="Calibri" w:eastAsia="Microsoft YaHei"/>
                 <w:sz w:val="18"/>
               </w:rPr>
-              <w:t>0.26.0</w:t>
+              <w:t>0.27.0</w:t>
             </w:r>
           </w:p>
         </w:tc>
@@ -463,7 +463,7 @@
                 <w:rFonts w:ascii="Calibri" w:hAnsi="Calibri" w:eastAsia="Microsoft YaHei"/>
                 <w:sz w:val="18"/>
               </w:rPr>
-              <w:t>架构、构建部署、稳定 C ABI、GRID 窗口概览/LOD、GRID 多边形裁剪/掩膜、GRID 显式重采样、双 GRID 精确挖填方、局部与全幅坡度/坡向/阴影分析、约束 Delaunay、GRID/等高线转换、GDAL 格式交换、异步任务、12 个兼容接口、文件格式、性能、线程安全、故障排查。</w:t>
+              <w:t>架构、构建部署、稳定 C ABI、世界视口 GRID 裁剪与自适应 LOD、GRID 窗口概览、GRID 多边形裁剪/掩膜、GRID 显式重采样、双 GRID 精确挖填方、局部与全幅坡度/坡向/阴影分析、约束 Delaunay、GRID/等高线转换、GDAL 格式交换、异步任务、12 个兼容接口、文件格式、性能、线程安全、故障排查。</w:t>
             </w:r>
           </w:p>
         </w:tc>
@@ -583,6 +583,17 @@
     </w:p>
     <w:p>
       <w:pPr>
+        <w:pStyle w:val="ListBullet"/>
+      </w:pPr>
+      <w:r>
+        <w:rPr>
+          <w:rFonts w:ascii="Calibri" w:hAnsi="Calibri" w:eastAsia="Microsoft YaHei"/>
+        </w:rPr>
+        <w:t>视口自适应 GRID LOD：重点阅读第 4.15 节。</w:t>
+      </w:r>
+    </w:p>
+    <w:p>
+      <w:pPr>
         <w:spacing w:before="100" w:after="160" w:line="288" w:lineRule="auto"/>
         <w:ind w:left="230" w:right="230"/>
         <w:shd w:fill="FFF7E0"/>
@@ -599,7 +610,7 @@
         <w:rPr>
           <w:rFonts w:ascii="Calibri" w:hAnsi="Calibri" w:eastAsia="Microsoft YaHei"/>
         </w:rPr>
-        <w:t>本手册对应 dterrain 0.26.0：新增 caller-owned GRID 窗口概览/LOD 读取，提供平均、最近邻、最小值、最大值、严格 NoData、精确源窗口统计和确定性并行；GUI 由此可预览超过 2000 万节点的大 GRID。多边形裁剪、显式重采样、解析挖填方、全幅地形专题、剖面、GDAL 与约束事务保持兼容。坐标重投影、磁盘流式瓦片、持久化多级金字塔、网格单元解析边界裁剪、局部 CDT 和 GPU LOD 属于后续阶段。</w:t>
+        <w:t>本手册对应 dterrain 0.27.0：新增世界 XY 视口到 GRID 最小源节点窗口的仿射裁剪接口，并由 GUI 在缩放、平移、拉框放大和全图适屏后，仅重读当前视口的最多 512×512 局部 LOD。接口支持旋转、剪切和负像素高仿射；完整 GRID 仍参与统计、等高线、分析与导出。窗口概览、多边形裁剪、显式重采样、解析挖填方、全幅地形专题、剖面、GDAL 与约束事务保持兼容。坐标重投影、磁盘流式瓦片、持久化多级金字塔、网格单元解析边界裁剪、局部 CDT 和 GPU LOD 属于后续阶段。</w:t>
       </w:r>
     </w:p>
     <w:p>
@@ -756,6 +767,17 @@
           <w:rFonts w:ascii="Calibri" w:hAnsi="Calibri" w:eastAsia="Microsoft YaHei"/>
         </w:rPr>
         <w:t>GRID 指定窗口直接读取 caller-owned 概览，支持平均、最近邻、最小值、最大值、NoData、精确统计与确定性并行。</w:t>
+      </w:r>
+    </w:p>
+    <w:p>
+      <w:pPr>
+        <w:pStyle w:val="ListBullet"/>
+      </w:pPr>
+      <w:r>
+        <w:rPr>
+          <w:rFonts w:ascii="Calibri" w:hAnsi="Calibri" w:eastAsia="Microsoft YaHei"/>
+        </w:rPr>
+        <w:t>世界 XY 视口经完整六参数仿射反算与多边形裁剪得到最小 GRID 节点窗口，可直接组合窗口概览生成局部 LOD。</w:t>
       </w:r>
     </w:p>
     <w:p>
@@ -8232,7 +8254,7 @@
         <w:rPr>
           <w:rFonts w:ascii="Calibri" w:hAnsi="Calibri" w:eastAsia="Microsoft YaHei"/>
         </w:rPr>
-        <w:t>v0.26 单项约束编辑仍完整重建候选 CDT；批量事务只重建一次。100,000 基础点添加 12 条断裂线的本机对比为逐条 3.259 s、批量 0.528 s，约 6.17 倍。请求 output_effect 还会计算完整域差异。未分段交叉仍须先加入共享顶点。</w:t>
+        <w:t>v0.27 单项约束编辑仍完整重建候选 CDT；批量事务只重建一次。100,000 基础点添加 12 条断裂线的本机对比为逐条 3.259 s、批量 0.528 s，约 6.17 倍。请求 output_effect 还会计算完整域差异。未分段交叉仍须先加入共享顶点。</w:t>
       </w:r>
     </w:p>
     <w:p>
@@ -12736,6 +12758,254 @@
           <w:rFonts w:ascii="Calibri" w:hAnsi="Calibri" w:eastAsia="Microsoft YaHei"/>
         </w:rPr>
         <w:t>8192×4096 源 GRID 缩至 512×512 平均概览：单线程 0.0427 s，自动并行 0.00963 s，约 4.43×；串并行输出与统计误差为 0。收益受 CPU、内存带宽、源窗口和块高影响，不是固定承诺。</w:t>
+      </w:r>
+    </w:p>
+    <w:p>
+      <w:pPr>
+        <w:pStyle w:val="Heading2"/>
+      </w:pPr>
+      <w:r>
+        <w:t>4.15 世界视口裁剪与自适应 LOD</w:t>
+      </w:r>
+    </w:p>
+    <w:p>
+      <w:r>
+        <w:rPr>
+          <w:rFonts w:ascii="Calibri" w:hAnsi="Calibri" w:eastAsia="Microsoft YaHei"/>
+        </w:rPr>
+        <w:t>dt_grid_get_view_window() 把轴对齐的世界 XY 视口转换为与 GRID 覆盖相交的最小源节点窗口。它先使用完整六参数仿射的逆变换把视口四角映射到连续列行坐标，再把所得四边形裁剪到 [-0.5,width-0.5]×[-0.5,height-0.5] 的节点覆盖域；因此旋转、剪切、负 pixel_height 以及只覆盖边缘半个像元的视口都能得到一致结果。</w:t>
+      </w:r>
+    </w:p>
+    <w:p>
+      <w:pPr>
+        <w:pStyle w:val="DterrainCode"/>
+        <w:shd w:fill="F2F4F7"/>
+      </w:pPr>
+      <w:r>
+        <w:rPr>
+          <w:rFonts w:ascii="Consolas" w:hAnsi="Consolas" w:eastAsia="Microsoft YaHei"/>
+          <w:sz w:val="17"/>
+        </w:rPr>
+        <w:t>dt_grid_view_options v{};</w:t>
+      </w:r>
+      <w:r>
+        <w:br/>
+      </w:r>
+      <w:r>
+        <w:rPr>
+          <w:rFonts w:ascii="Consolas" w:hAnsi="Consolas" w:eastAsia="Microsoft YaHei"/>
+          <w:sz w:val="17"/>
+        </w:rPr>
+        <w:t>v.struct_size = sizeof(v);</w:t>
+      </w:r>
+      <w:r>
+        <w:br/>
+      </w:r>
+      <w:r>
+        <w:rPr>
+          <w:rFonts w:ascii="Consolas" w:hAnsi="Consolas" w:eastAsia="Microsoft YaHei"/>
+          <w:sz w:val="17"/>
+        </w:rPr>
+        <w:t>v.world_bounds = {xmin, ymin, xmax, ymax};</w:t>
+      </w:r>
+      <w:r>
+        <w:br/>
+      </w:r>
+      <w:r>
+        <w:rPr>
+          <w:rFonts w:ascii="Consolas" w:hAnsi="Consolas" w:eastAsia="Microsoft YaHei"/>
+          <w:sz w:val="17"/>
+        </w:rPr>
+        <w:t>v.padding_nodes = 2;       // GUI 用于避免边缘采样缝隙</w:t>
+      </w:r>
+      <w:r>
+        <w:br/>
+      </w:r>
+      <w:r>
+        <w:rPr>
+          <w:rFonts w:ascii="Consolas" w:hAnsi="Consolas" w:eastAsia="Microsoft YaHei"/>
+          <w:sz w:val="17"/>
+        </w:rPr>
+      </w:r>
+      <w:r>
+        <w:br/>
+      </w:r>
+      <w:r>
+        <w:rPr>
+          <w:rFonts w:ascii="Consolas" w:hAnsi="Consolas" w:eastAsia="Microsoft YaHei"/>
+          <w:sz w:val="17"/>
+        </w:rPr>
+        <w:t>dt_grid_window w{};</w:t>
+      </w:r>
+      <w:r>
+        <w:br/>
+      </w:r>
+      <w:r>
+        <w:rPr>
+          <w:rFonts w:ascii="Consolas" w:hAnsi="Consolas" w:eastAsia="Microsoft YaHei"/>
+          <w:sz w:val="17"/>
+        </w:rPr>
+        <w:t>w.struct_size = sizeof(w);</w:t>
+      </w:r>
+      <w:r>
+        <w:br/>
+      </w:r>
+      <w:r>
+        <w:rPr>
+          <w:rFonts w:ascii="Consolas" w:hAnsi="Consolas" w:eastAsia="Microsoft YaHei"/>
+          <w:sz w:val="17"/>
+        </w:rPr>
+        <w:t>dt_status s = dt_grid_get_view_window(grid, &amp;v, &amp;w);</w:t>
+      </w:r>
+      <w:r>
+        <w:br/>
+      </w:r>
+      <w:r>
+        <w:rPr>
+          <w:rFonts w:ascii="Consolas" w:hAnsi="Consolas" w:eastAsia="Microsoft YaHei"/>
+          <w:sz w:val="17"/>
+        </w:rPr>
+        <w:t>if (s == DT_OK) {</w:t>
+      </w:r>
+      <w:r>
+        <w:br/>
+      </w:r>
+      <w:r>
+        <w:rPr>
+          <w:rFonts w:ascii="Consolas" w:hAnsi="Consolas" w:eastAsia="Microsoft YaHei"/>
+          <w:sz w:val="17"/>
+        </w:rPr>
+        <w:t xml:space="preserve">    dt_grid_overview_options o{};</w:t>
+      </w:r>
+      <w:r>
+        <w:br/>
+      </w:r>
+      <w:r>
+        <w:rPr>
+          <w:rFonts w:ascii="Consolas" w:hAnsi="Consolas" w:eastAsia="Microsoft YaHei"/>
+          <w:sz w:val="17"/>
+        </w:rPr>
+        <w:t xml:space="preserve">    o.struct_size = sizeof(o);</w:t>
+      </w:r>
+      <w:r>
+        <w:br/>
+      </w:r>
+      <w:r>
+        <w:rPr>
+          <w:rFonts w:ascii="Consolas" w:hAnsi="Consolas" w:eastAsia="Microsoft YaHei"/>
+          <w:sz w:val="17"/>
+        </w:rPr>
+        <w:t xml:space="preserve">    o.method = DT_GRID_OVERVIEW_AVERAGE;</w:t>
+      </w:r>
+      <w:r>
+        <w:br/>
+      </w:r>
+      <w:r>
+        <w:rPr>
+          <w:rFonts w:ascii="Consolas" w:hAnsi="Consolas" w:eastAsia="Microsoft YaHei"/>
+          <w:sz w:val="17"/>
+        </w:rPr>
+        <w:t xml:space="preserve">    o.source_column = w.column;</w:t>
+      </w:r>
+      <w:r>
+        <w:br/>
+      </w:r>
+      <w:r>
+        <w:rPr>
+          <w:rFonts w:ascii="Consolas" w:hAnsi="Consolas" w:eastAsia="Microsoft YaHei"/>
+          <w:sz w:val="17"/>
+        </w:rPr>
+        <w:t xml:space="preserve">    o.source_row = w.row;</w:t>
+      </w:r>
+      <w:r>
+        <w:br/>
+      </w:r>
+      <w:r>
+        <w:rPr>
+          <w:rFonts w:ascii="Consolas" w:hAnsi="Consolas" w:eastAsia="Microsoft YaHei"/>
+          <w:sz w:val="17"/>
+        </w:rPr>
+        <w:t xml:space="preserve">    o.source_width = w.width;</w:t>
+      </w:r>
+      <w:r>
+        <w:br/>
+      </w:r>
+      <w:r>
+        <w:rPr>
+          <w:rFonts w:ascii="Consolas" w:hAnsi="Consolas" w:eastAsia="Microsoft YaHei"/>
+          <w:sz w:val="17"/>
+        </w:rPr>
+        <w:t xml:space="preserve">    o.source_height = w.height;</w:t>
+      </w:r>
+      <w:r>
+        <w:br/>
+      </w:r>
+      <w:r>
+        <w:rPr>
+          <w:rFonts w:ascii="Consolas" w:hAnsi="Consolas" w:eastAsia="Microsoft YaHei"/>
+          <w:sz w:val="17"/>
+        </w:rPr>
+        <w:t xml:space="preserve">    // 继续调用 dt_grid_read_overview() 生成屏幕大小的局部 LOD</w:t>
+      </w:r>
+      <w:r>
+        <w:br/>
+      </w:r>
+      <w:r>
+        <w:rPr>
+          <w:rFonts w:ascii="Consolas" w:hAnsi="Consolas" w:eastAsia="Microsoft YaHei"/>
+          <w:sz w:val="17"/>
+        </w:rPr>
+        <w:t>}</w:t>
+      </w:r>
+    </w:p>
+    <w:p>
+      <w:r>
+        <w:rPr>
+          <w:rFonts w:ascii="Calibri" w:hAnsi="Calibri" w:eastAsia="Microsoft YaHei"/>
+        </w:rPr>
+        <w:t>dt_grid_view_options 与 dt_grid_window 均固定为 64 字节。padding_nodes 以源节点计并在裁剪后扩展窗口；结果设置 DT_GRID_VIEW_WINDOW_CLIPPED 表示原视口有部分超出 GRID 覆盖范围。完全无交集返回 DT_E_NOT_FOUND；未知标志、非有限或反向范围、退化仿射及过大 padding 返回 DT_E_INVALID_ARGUMENT。</w:t>
+      </w:r>
+    </w:p>
+    <w:p>
+      <w:pPr>
+        <w:spacing w:before="100" w:after="160" w:line="288" w:lineRule="auto"/>
+        <w:ind w:left="230" w:right="230"/>
+        <w:shd w:fill="E8EEF5"/>
+      </w:pPr>
+      <w:r>
+        <w:rPr>
+          <w:rFonts w:ascii="Calibri" w:hAnsi="Calibri" w:eastAsia="Microsoft YaHei"/>
+          <w:b/>
+          <w:color w:val="1F4D78"/>
+        </w:rPr>
+        <w:t xml:space="preserve">热路径特性  </w:t>
+      </w:r>
+      <w:r>
+        <w:rPr>
+          <w:rFonts w:ascii="Calibri" w:hAnsi="Calibri" w:eastAsia="Microsoft YaHei"/>
+        </w:rPr>
+        <w:t>该调用不读取高程、不分配结果数组，也不构造新 GRID；返回的 column/row/width/height 可原样复制到 dt_grid_overview_options。GUI 在滚轮缩放、拉框放大、全图适屏及平移结束后刷新，平移过程中复用旧缓存，减少交互抖动。完整源统计维持稳定色带，所有分析、等高线与导出仍读取完整 GRID。</w:t>
+      </w:r>
+    </w:p>
+    <w:p>
+      <w:pPr>
+        <w:spacing w:before="100" w:after="160" w:line="288" w:lineRule="auto"/>
+        <w:ind w:left="230" w:right="230"/>
+        <w:shd w:fill="FFF7E0"/>
+      </w:pPr>
+      <w:r>
+        <w:rPr>
+          <w:rFonts w:ascii="Calibri" w:hAnsi="Calibri" w:eastAsia="Microsoft YaHei"/>
+          <w:b/>
+          <w:color w:val="7A5A00"/>
+        </w:rPr>
+        <w:t xml:space="preserve">本机基准  </w:t>
+      </w:r>
+      <w:r>
+        <w:rPr>
+          <w:rFonts w:ascii="Calibri" w:hAnsi="Calibri" w:eastAsia="Microsoft YaHei"/>
+        </w:rPr>
+        <w:t>8192×4096 GRID、1024×768 局部视口、512×512 输出：视口窗口查询约 15 μs；全幅概览 0.0128 s，局部概览 0.00264 s，约 4.85×。局部窗口约占源节点 2.34%；收益随当前视口、硬件和内存带宽变化。</w:t>
       </w:r>
     </w:p>
     <w:p>
@@ -17076,7 +17346,7 @@
         <w:rPr>
           <w:rFonts w:ascii="Calibri" w:hAnsi="Calibri" w:eastAsia="Microsoft YaHei"/>
         </w:rPr>
-        <w:t>测试覆盖生命周期、普通 TIN 动态编辑、DTIN/DTMESH/XYZ、TIN/GRID/等高线、等高线反向重建与高程冲突回滚、异步任务，以及 CDT 空网清理、外边界、孔洞、断裂线、交叉失败原子性、TIN→CDT、域内采样、CDT→GRID/等高线、共享顶点保护、批量新增/更新/删除、整批失败回滚和 DCDT 往返。局部坡面测试用解析平面验证 TIN/CDT 的 Z、世界梯度、坡度、坡向和法向；全幅测试覆盖坡度、坡向、阴影、CRS、旋转仿射、NoData、串并行一致和取消。土方测试锁定 64/112 字节 ABI、零线穿越解析体积、旋转面积、NoData、差值 GRID、异步结果和取消。v0.24 重采样测试另锁定 64 字节 ABI、旋转/剪切解析平面、最近邻与双线性、严格/归一化 NoData、串并行一致、异步结果、CRS 拒绝及大 GRID 取消。v0.25 多边形裁剪测试锁定 64 字节 ABI、旋转/剪切仿射、边界内含、保持/紧凑/反向三种模式、NoData、串并行一致、异步结果、非法选项、范围外与大 GRID 取消。v0.26 概览测试锁定 64/64 字节 ABI、平均/最近邻/最小/最大、严格 NoData、源子窗口、上采样规则、带填充步长以及串并行确定性。剖面、多边形量测和 GDAL 构建另有数学与真实文件往返测试。</w:t>
+        <w:t>测试覆盖生命周期、普通 TIN 动态编辑、DTIN/DTMESH/XYZ、TIN/GRID/等高线、等高线反向重建与高程冲突回滚、异步任务，以及 CDT 空网清理、外边界、孔洞、断裂线、交叉失败原子性、TIN→CDT、域内采样、CDT→GRID/等高线、共享顶点保护、批量新增/更新/删除、整批失败回滚和 DCDT 往返。局部坡面测试用解析平面验证 TIN/CDT 的 Z、世界梯度、坡度、坡向和法向；全幅测试覆盖坡度、坡向、阴影、CRS、旋转仿射、NoData、串并行一致和取消。土方测试锁定 64/112 字节 ABI、零线穿越解析体积、旋转面积、NoData、差值 GRID、异步结果和取消。v0.24 重采样测试另锁定 64 字节 ABI、旋转/剪切解析平面、最近邻与双线性、严格/归一化 NoData、串并行一致、异步结果、CRS 拒绝及大 GRID 取消。v0.25 多边形裁剪测试锁定 64 字节 ABI、旋转/剪切仿射、边界内含、保持/紧凑/反向三种模式、NoData、串并行一致、异步结果、非法选项、范围外与大 GRID 取消。v0.26 概览测试锁定 64/64 字节 ABI、平均/最近邻/最小/最大、严格 NoData、源子窗口、上采样规则、带填充步长以及串并行确定性。v0.27 视口窗口测试锁定 64/64 字节 ABI、负像素高、旋转/剪切、边界裁剪、padding、无交集与非法参数，并验证结果窗口可直接组合概览读取。剖面、多边形量测和 GDAL 构建另有数学与真实文件往返测试。</w:t>
       </w:r>
     </w:p>
     <w:p>
@@ -17793,7 +18063,7 @@
         <w:color w:val="66727D"/>
         <w:sz w:val="18"/>
       </w:rPr>
-      <w:t xml:space="preserve">版本 0.26.0  |  第 </w:t>
+      <w:t xml:space="preserve">版本 0.27.0  |  第 </w:t>
     </w:r>
     <w:r>
       <w:rPr>

</xml_diff>

<commit_message>
feat: add memory-mapped DGRIDB terrain storage
</commit_message>
<xml_diff>
--- a/docs/manuals/dterrain_DLL开发使用手册.docx
+++ b/docs/manuals/dterrain_DLL开发使用手册.docx
@@ -70,7 +70,7 @@
           <w:color w:val="1F4D78"/>
           <w:sz w:val="28"/>
         </w:rPr>
-        <w:t>面向测绘地形建模的 TIN、GRID、等高线转换、视口自适应 GRID LOD、动态编辑与空间查询</w:t>
+        <w:t>面向测绘地形建模的 TIN、GRID、等高线转换、DGRIDB 映射存储、视口自适应 LOD、动态编辑与空间查询</w:t>
       </w:r>
     </w:p>
     <w:p>
@@ -85,7 +85,7 @@
           <w:color w:val="203748"/>
           <w:sz w:val="22"/>
         </w:rPr>
-        <w:t>版本 0.27.0  |  2026-07-18</w:t>
+        <w:t>版本 0.28.0  |  2026-07-18</w:t>
       </w:r>
     </w:p>
     <w:p>
@@ -243,7 +243,7 @@
                 <w:rFonts w:ascii="Calibri" w:hAnsi="Calibri" w:eastAsia="Microsoft YaHei"/>
                 <w:sz w:val="18"/>
               </w:rPr>
-              <w:t>0.27.0</w:t>
+              <w:t>0.28.0</w:t>
             </w:r>
           </w:p>
         </w:tc>
@@ -463,7 +463,7 @@
                 <w:rFonts w:ascii="Calibri" w:hAnsi="Calibri" w:eastAsia="Microsoft YaHei"/>
                 <w:sz w:val="18"/>
               </w:rPr>
-              <w:t>架构、构建部署、稳定 C ABI、世界视口 GRID 裁剪与自适应 LOD、GRID 窗口概览、GRID 多边形裁剪/掩膜、GRID 显式重采样、双 GRID 精确挖填方、局部与全幅坡度/坡向/阴影分析、约束 Delaunay、GRID/等高线转换、GDAL 格式交换、异步任务、12 个兼容接口、文件格式、性能、线程安全、故障排查。</w:t>
+              <w:t>架构、构建部署、稳定 C ABI、DGRIDB 二进制映射存储、世界视口 GRID 裁剪与自适应 LOD、GRID 窗口概览、GRID 多边形裁剪/掩膜、GRID 显式重采样、双 GRID 精确挖填方、局部与全幅坡度/坡向/阴影分析、约束 Delaunay、GRID/等高线转换、GDAL 格式交换、异步任务、12 个兼容接口、文件格式、性能、线程安全、故障排查。</w:t>
             </w:r>
           </w:p>
         </w:tc>
@@ -594,6 +594,17 @@
     </w:p>
     <w:p>
       <w:pPr>
+        <w:pStyle w:val="ListBullet"/>
+      </w:pPr>
+      <w:r>
+        <w:rPr>
+          <w:rFonts w:ascii="Calibri" w:hAnsi="Calibri" w:eastAsia="Microsoft YaHei"/>
+        </w:rPr>
+        <w:t>DGRIDB 映射存储：重点阅读第 4.16 节和第 6.5 节。</w:t>
+      </w:r>
+    </w:p>
+    <w:p>
+      <w:pPr>
         <w:spacing w:before="100" w:after="160" w:line="288" w:lineRule="auto"/>
         <w:ind w:left="230" w:right="230"/>
         <w:shd w:fill="FFF7E0"/>
@@ -610,7 +621,7 @@
         <w:rPr>
           <w:rFonts w:ascii="Calibri" w:hAnsi="Calibri" w:eastAsia="Microsoft YaHei"/>
         </w:rPr>
-        <w:t>本手册对应 dterrain 0.27.0：新增世界 XY 视口到 GRID 最小源节点窗口的仿射裁剪接口，并由 GUI 在缩放、平移、拉框放大和全图适屏后，仅重读当前视口的最多 512×512 局部 LOD。接口支持旋转、剪切和负像素高仿射；完整 GRID 仍参与统计、等高线、分析与导出。窗口概览、多边形裁剪、显式重采样、解析挖填方、全幅地形专题、剖面、GDAL 与约束事务保持兼容。坐标重投影、磁盘流式瓦片、持久化多级金字塔、网格单元解析边界裁剪、局部 CDT 和 GPU LOD 属于后续阶段。</w:t>
+        <w:t>本手册对应 dterrain 0.28.0：新增 DGRIDB 二进制大 GRID 格式。Windows 加载以写时复制方式映射原始 double 节点，文件内保存全幅 512 级平均概览、统计、CRS 和 NoData；保存采用临时文件完成后原子替换。GUI 可直接导入/导出 DGRIDB，并继续使用 v0.27 世界视口局部 LOD。完整 GRID 仍参与等高线、分析与转换。坐标重投影、流式瓦片、多级金字塔、网格单元解析边界裁剪、局部 CDT 和 GPU LOD 属于后续阶段。</w:t>
       </w:r>
     </w:p>
     <w:p>
@@ -778,6 +789,17 @@
           <w:rFonts w:ascii="Calibri" w:hAnsi="Calibri" w:eastAsia="Microsoft YaHei"/>
         </w:rPr>
         <w:t>世界 XY 视口经完整六参数仿射反算与多边形裁剪得到最小 GRID 节点窗口，可直接组合窗口概览生成局部 LOD。</w:t>
+      </w:r>
+    </w:p>
+    <w:p>
+      <w:pPr>
+        <w:pStyle w:val="ListBullet"/>
+      </w:pPr>
+      <w:r>
+        <w:rPr>
+          <w:rFonts w:ascii="Calibri" w:hAnsi="Calibri" w:eastAsia="Microsoft YaHei"/>
+        </w:rPr>
+        <w:t>DGRIDB 二进制 GRID 支持写时复制映射、持久全幅概览、原子保存以及 CRS/NoData 往返。</w:t>
       </w:r>
     </w:p>
     <w:p>
@@ -5790,6 +5812,86 @@
                 <w:rFonts w:ascii="Calibri" w:hAnsi="Calibri" w:eastAsia="Microsoft YaHei"/>
                 <w:sz w:val="18"/>
               </w:rPr>
+              <w:t>dt_grid_save/load_binary</w:t>
+            </w:r>
+          </w:p>
+        </w:tc>
+        <w:tc>
+          <w:tcPr>
+            <w:tcW w:type="dxa" w:w="1800"/>
+            <w:tcMar>
+              <w:top w:w="80" w:type="dxa"/>
+              <w:start w:w="120" w:type="dxa"/>
+              <w:bottom w:w="80" w:type="dxa"/>
+              <w:end w:w="120" w:type="dxa"/>
+            </w:tcMar>
+            <w:vAlign w:val="center"/>
+          </w:tcPr>
+          <w:p>
+            <w:pPr>
+              <w:spacing w:before="0" w:after="0" w:line="276" w:lineRule="auto"/>
+              <w:jc w:val="center"/>
+            </w:pPr>
+            <w:r>
+              <w:rPr>
+                <w:rFonts w:ascii="Calibri" w:hAnsi="Calibri" w:eastAsia="Microsoft YaHei"/>
+                <w:sz w:val="18"/>
+              </w:rPr>
+              <w:t>DGRIDB 1</w:t>
+            </w:r>
+          </w:p>
+        </w:tc>
+        <w:tc>
+          <w:tcPr>
+            <w:tcW w:type="dxa" w:w="4360"/>
+            <w:tcMar>
+              <w:top w:w="80" w:type="dxa"/>
+              <w:start w:w="120" w:type="dxa"/>
+              <w:bottom w:w="80" w:type="dxa"/>
+              <w:end w:w="120" w:type="dxa"/>
+            </w:tcMar>
+            <w:vAlign w:val="center"/>
+          </w:tcPr>
+          <w:p>
+            <w:pPr>
+              <w:spacing w:before="0" w:after="0" w:line="276" w:lineRule="auto"/>
+              <w:jc w:val="left"/>
+            </w:pPr>
+            <w:r>
+              <w:rPr>
+                <w:rFonts w:ascii="Calibri" w:hAnsi="Calibri" w:eastAsia="Microsoft YaHei"/>
+                <w:sz w:val="18"/>
+              </w:rPr>
+              <w:t>大 GRID 映射加载、持久概览和原子保存。</w:t>
+            </w:r>
+          </w:p>
+        </w:tc>
+      </w:tr>
+      <w:tr>
+        <w:trPr>
+          <w:cantSplit/>
+        </w:trPr>
+        <w:tc>
+          <w:tcPr>
+            <w:tcW w:type="dxa" w:w="3200"/>
+            <w:tcMar>
+              <w:top w:w="80" w:type="dxa"/>
+              <w:start w:w="120" w:type="dxa"/>
+              <w:bottom w:w="80" w:type="dxa"/>
+              <w:end w:w="120" w:type="dxa"/>
+            </w:tcMar>
+            <w:vAlign w:val="center"/>
+          </w:tcPr>
+          <w:p>
+            <w:pPr>
+              <w:spacing w:before="0" w:after="0" w:line="276" w:lineRule="auto"/>
+              <w:jc w:val="left"/>
+            </w:pPr>
+            <w:r>
+              <w:rPr>
+                <w:rFonts w:ascii="Calibri" w:hAnsi="Calibri" w:eastAsia="Microsoft YaHei"/>
+                <w:sz w:val="18"/>
+              </w:rPr>
               <w:t>dt_contours_save/load_text</w:t>
             </w:r>
           </w:p>
@@ -8254,7 +8356,7 @@
         <w:rPr>
           <w:rFonts w:ascii="Calibri" w:hAnsi="Calibri" w:eastAsia="Microsoft YaHei"/>
         </w:rPr>
-        <w:t>v0.27 单项约束编辑仍完整重建候选 CDT；批量事务只重建一次。100,000 基础点添加 12 条断裂线的本机对比为逐条 3.259 s、批量 0.528 s，约 6.17 倍。请求 output_effect 还会计算完整域差异。未分段交叉仍须先加入共享顶点。</w:t>
+        <w:t>v0.28 单项约束编辑仍完整重建候选 CDT；批量事务只重建一次。100,000 基础点添加 12 条断裂线的本机对比为逐条 3.259 s、批量 0.528 s，约 6.17 倍。请求 output_effect 还会计算完整域差异。未分段交叉仍须先加入共享顶点。</w:t>
       </w:r>
     </w:p>
     <w:p>
@@ -13010,6 +13112,194 @@
     </w:p>
     <w:p>
       <w:pPr>
+        <w:pStyle w:val="Heading2"/>
+      </w:pPr>
+      <w:r>
+        <w:t>4.16 DGRIDB 二进制映射存储</w:t>
+      </w:r>
+    </w:p>
+    <w:p>
+      <w:r>
+        <w:rPr>
+          <w:rFonts w:ascii="Calibri" w:hAnsi="Calibri" w:eastAsia="Microsoft YaHei"/>
+        </w:rPr>
+        <w:t>dt_grid_save_binary() 保存 DGRIDB 1，dt_grid_load_binary() 加载后仍返回普通 dt_grid_handle。文件包含固定 64 KiB 校验头、完整六参数仿射、NoData、UTF-8 CRS、有效值统计、最多 512×512 的全幅平均概览，以及按行优先排列的原始 double 节点。Windows 使用 PAGE_WRITECOPY / FILE_MAP_COPY 映射原始节点，不在打开时分配第二份完整数组；非 Windows 构建回退为读入内存。</w:t>
+      </w:r>
+    </w:p>
+    <w:p>
+      <w:pPr>
+        <w:pStyle w:val="DterrainCode"/>
+        <w:shd w:fill="F2F4F7"/>
+      </w:pPr>
+      <w:r>
+        <w:rPr>
+          <w:rFonts w:ascii="Consolas" w:hAnsi="Consolas" w:eastAsia="Microsoft YaHei"/>
+          <w:sz w:val="17"/>
+        </w:rPr>
+        <w:t>dt_grid_save_binary(grid, "terrain.dgridb");</w:t>
+      </w:r>
+      <w:r>
+        <w:br/>
+      </w:r>
+      <w:r>
+        <w:rPr>
+          <w:rFonts w:ascii="Consolas" w:hAnsi="Consolas" w:eastAsia="Microsoft YaHei"/>
+          <w:sz w:val="17"/>
+        </w:rPr>
+      </w:r>
+      <w:r>
+        <w:br/>
+      </w:r>
+      <w:r>
+        <w:rPr>
+          <w:rFonts w:ascii="Consolas" w:hAnsi="Consolas" w:eastAsia="Microsoft YaHei"/>
+          <w:sz w:val="17"/>
+        </w:rPr>
+        <w:t>dt_grid_handle mapped = nullptr;</w:t>
+      </w:r>
+      <w:r>
+        <w:br/>
+      </w:r>
+      <w:r>
+        <w:rPr>
+          <w:rFonts w:ascii="Consolas" w:hAnsi="Consolas" w:eastAsia="Microsoft YaHei"/>
+          <w:sz w:val="17"/>
+        </w:rPr>
+        <w:t>if (dt_grid_load_binary("terrain.dgridb", &amp;mapped) == DT_OK) {</w:t>
+      </w:r>
+      <w:r>
+        <w:br/>
+      </w:r>
+      <w:r>
+        <w:rPr>
+          <w:rFonts w:ascii="Consolas" w:hAnsi="Consolas" w:eastAsia="Microsoft YaHei"/>
+          <w:sz w:val="17"/>
+        </w:rPr>
+        <w:t xml:space="preserve">    dt_grid_info info{};</w:t>
+      </w:r>
+      <w:r>
+        <w:br/>
+      </w:r>
+      <w:r>
+        <w:rPr>
+          <w:rFonts w:ascii="Consolas" w:hAnsi="Consolas" w:eastAsia="Microsoft YaHei"/>
+          <w:sz w:val="17"/>
+        </w:rPr>
+        <w:t xml:space="preserve">    info.struct_size = sizeof(info);</w:t>
+      </w:r>
+      <w:r>
+        <w:br/>
+      </w:r>
+      <w:r>
+        <w:rPr>
+          <w:rFonts w:ascii="Consolas" w:hAnsi="Consolas" w:eastAsia="Microsoft YaHei"/>
+          <w:sz w:val="17"/>
+        </w:rPr>
+        <w:t xml:space="preserve">    dt_grid_get_info(mapped, &amp;info);</w:t>
+      </w:r>
+      <w:r>
+        <w:br/>
+      </w:r>
+      <w:r>
+        <w:rPr>
+          <w:rFonts w:ascii="Consolas" w:hAnsi="Consolas" w:eastAsia="Microsoft YaHei"/>
+          <w:sz w:val="17"/>
+        </w:rPr>
+        <w:t xml:space="preserve">    bool is_mapped =</w:t>
+      </w:r>
+      <w:r>
+        <w:br/>
+      </w:r>
+      <w:r>
+        <w:rPr>
+          <w:rFonts w:ascii="Consolas" w:hAnsi="Consolas" w:eastAsia="Microsoft YaHei"/>
+          <w:sz w:val="17"/>
+        </w:rPr>
+        <w:t xml:space="preserve">        (info.flags &amp; DT_GRID_STORAGE_MEMORY_MAPPED) != 0;</w:t>
+      </w:r>
+      <w:r>
+        <w:br/>
+      </w:r>
+      <w:r>
+        <w:rPr>
+          <w:rFonts w:ascii="Consolas" w:hAnsi="Consolas" w:eastAsia="Microsoft YaHei"/>
+          <w:sz w:val="17"/>
+        </w:rPr>
+        <w:t xml:space="preserve">    // mapped 可继续传给窗口、概览、分析、等高线和转换 API</w:t>
+      </w:r>
+      <w:r>
+        <w:br/>
+      </w:r>
+      <w:r>
+        <w:rPr>
+          <w:rFonts w:ascii="Consolas" w:hAnsi="Consolas" w:eastAsia="Microsoft YaHei"/>
+          <w:sz w:val="17"/>
+        </w:rPr>
+        <w:t xml:space="preserve">    dt_grid_destroy(mapped);</w:t>
+      </w:r>
+      <w:r>
+        <w:br/>
+      </w:r>
+      <w:r>
+        <w:rPr>
+          <w:rFonts w:ascii="Consolas" w:hAnsi="Consolas" w:eastAsia="Microsoft YaHei"/>
+          <w:sz w:val="17"/>
+        </w:rPr>
+        <w:t>}</w:t>
+      </w:r>
+    </w:p>
+    <w:p>
+      <w:r>
+        <w:rPr>
+          <w:rFonts w:ascii="Calibri" w:hAnsi="Calibri" w:eastAsia="Microsoft YaHei"/>
+        </w:rPr>
+        <w:t>DT_GRID_STORAGE_MEMORY_MAPPED 和 DT_GRID_HAS_PERSISTENT_OVERVIEW 是 dt_grid_info.flags 的输出能力位，不可传入 dt_grid_create_options。完整源、平均方法、默认 NoData 策略且输出尺寸与文件记录一致时，dt_grid_read_overview() 直接复制持久概览；局部视口及最近邻/最小/最大仍读取原始节点。任意窗口写入会清除旧概览，但写时复制页面不会回写源文件。</w:t>
+      </w:r>
+    </w:p>
+    <w:p>
+      <w:pPr>
+        <w:spacing w:before="100" w:after="160" w:line="288" w:lineRule="auto"/>
+        <w:ind w:left="230" w:right="230"/>
+        <w:shd w:fill="E8EEF5"/>
+      </w:pPr>
+      <w:r>
+        <w:rPr>
+          <w:rFonts w:ascii="Calibri" w:hAnsi="Calibri" w:eastAsia="Microsoft YaHei"/>
+          <w:b/>
+          <w:color w:val="1F4D78"/>
+        </w:rPr>
+        <w:t xml:space="preserve">事务与同路径保存  </w:t>
+      </w:r>
+      <w:r>
+        <w:rPr>
+          <w:rFonts w:ascii="Calibri" w:hAnsi="Calibri" w:eastAsia="Microsoft YaHei"/>
+        </w:rPr>
+        <w:t>保存先在目标目录写完唯一临时文件并刷新，成功后才原子替换。若目标就是当前映射源，Windows 不允许替换仍被映射的文件；库会等临时文件完成后才把私有视图实体化、解除映射并替换，所以该特殊路径会短时占用一份完整节点内存。另存为其他文件始终保留映射。</w:t>
+      </w:r>
+    </w:p>
+    <w:p>
+      <w:pPr>
+        <w:spacing w:before="100" w:after="160" w:line="288" w:lineRule="auto"/>
+        <w:ind w:left="230" w:right="230"/>
+        <w:shd w:fill="FFF7E0"/>
+      </w:pPr>
+      <w:r>
+        <w:rPr>
+          <w:rFonts w:ascii="Calibri" w:hAnsi="Calibri" w:eastAsia="Microsoft YaHei"/>
+          <w:b/>
+          <w:color w:val="7A5A00"/>
+        </w:rPr>
+        <w:t xml:space="preserve">本机基准  </w:t>
+      </w:r>
+      <w:r>
+        <w:rPr>
+          <w:rFonts w:ascii="Calibri" w:hAnsi="Calibri" w:eastAsia="Microsoft YaHei"/>
+        </w:rPr>
+        <w:t>8192×4096、258.06 MiB DGRIDB：保存 0.243 s，映射打开 6.65 ms，内置 512×512 概览 0.177 ms，1024×768 局部读取 3.50 ms。打开和持久概览不扫描完整节点；结果受系统文件缓存和存储设备影响。</w:t>
+      </w:r>
+    </w:p>
+    <w:p>
+      <w:pPr>
         <w:pStyle w:val="Heading1"/>
       </w:pPr>
       <w:r>
@@ -14573,7 +14863,7 @@
         <w:pStyle w:val="Heading2"/>
       </w:pPr>
       <w:r>
-        <w:t>6.5 DCONTOUR 等高线文本</w:t>
+        <w:t>6.5 DGRIDB 二进制规则网格</w:t>
       </w:r>
     </w:p>
     <w:p>
@@ -14581,7 +14871,7 @@
         <w:rPr>
           <w:rFonts w:ascii="Calibri" w:hAnsi="Calibri" w:eastAsia="Microsoft YaHei"/>
         </w:rPr>
-        <w:t>DCONTOUR 1 由 LINES 计数和若干 LINE 记录组成。每条 LINE 保存等高值、闭合标志、点数及 XYZ 顶点。逐线视图中的点数组只在等高线句柄释放前有效。</w:t>
+        <w:t>DGRIDB 1 是本机大 GRID 工作格式。固定头记录段偏移、源统计和 FNV-1a 头校验；概览段位于原始节点前，节点段按 64 KiB 对齐以便 Windows 映射。头校验不覆盖节点载荷，跨设备传输需要端到端完整性时应另配 SHA-256。格式要求小端序 IEEE-754 double；人工审阅和异构交换仍优先 DGRID 文本或 GeoTIFF/COG。</w:t>
       </w:r>
     </w:p>
     <w:p>
@@ -14589,7 +14879,7 @@
         <w:pStyle w:val="Heading2"/>
       </w:pPr>
       <w:r>
-        <w:t>6.6 GeoTIFF、COG 与 GeoPackage</w:t>
+        <w:t>6.6 DCONTOUR 等高线文本</w:t>
       </w:r>
     </w:p>
     <w:p>
@@ -14597,7 +14887,7 @@
         <w:rPr>
           <w:rFonts w:ascii="Calibri" w:hAnsi="Calibri" w:eastAsia="Microsoft YaHei"/>
         </w:rPr>
-        <w:t>启用 DT_WITH_GDAL 后，dt_grid_load/save_gdal_raster 读写 GDAL 单波段高程栅格；dt_contours_load/save_gdal_vector 读写等高线矢量层。普通 GeoTIFF 逐行写入；COG 按驱动要求通过临时数据集 CreateCopy；GeoPackage 输出 LineStringZ 和 elevation/closed 字段。</w:t>
+        <w:t>DCONTOUR 1 由 LINES 计数和若干 LINE 记录组成。每条 LINE 保存等高值、闭合标志、点数及 XYZ 顶点。逐线视图中的点数组只在等高线句柄释放前有效。</w:t>
       </w:r>
     </w:p>
     <w:p>
@@ -14605,7 +14895,23 @@
         <w:pStyle w:val="Heading2"/>
       </w:pPr>
       <w:r>
-        <w:t>6.7 DCDT 约束网文本</w:t>
+        <w:t>6.7 GeoTIFF、COG 与 GeoPackage</w:t>
+      </w:r>
+    </w:p>
+    <w:p>
+      <w:r>
+        <w:rPr>
+          <w:rFonts w:ascii="Calibri" w:hAnsi="Calibri" w:eastAsia="Microsoft YaHei"/>
+        </w:rPr>
+        <w:t>启用 DT_WITH_GDAL 后，dt_grid_load/save_gdal_raster 读写 GDAL 单波段高程栅格；dt_contours_load/save_gdal_vector 读写等高线矢量层。普通 GeoTIFF 逐行写入；COG 按驱动要求通过临时数据集 CreateCopy；GeoPackage 输出 LineStringZ 和 elevation/closed 字段。</w:t>
+      </w:r>
+    </w:p>
+    <w:p>
+      <w:pPr>
+        <w:pStyle w:val="Heading2"/>
+      </w:pPr>
+      <w:r>
+        <w:t>6.8 DCDT 约束网文本</w:t>
       </w:r>
     </w:p>
     <w:p>
@@ -17346,7 +17652,7 @@
         <w:rPr>
           <w:rFonts w:ascii="Calibri" w:hAnsi="Calibri" w:eastAsia="Microsoft YaHei"/>
         </w:rPr>
-        <w:t>测试覆盖生命周期、普通 TIN 动态编辑、DTIN/DTMESH/XYZ、TIN/GRID/等高线、等高线反向重建与高程冲突回滚、异步任务，以及 CDT 空网清理、外边界、孔洞、断裂线、交叉失败原子性、TIN→CDT、域内采样、CDT→GRID/等高线、共享顶点保护、批量新增/更新/删除、整批失败回滚和 DCDT 往返。局部坡面测试用解析平面验证 TIN/CDT 的 Z、世界梯度、坡度、坡向和法向；全幅测试覆盖坡度、坡向、阴影、CRS、旋转仿射、NoData、串并行一致和取消。土方测试锁定 64/112 字节 ABI、零线穿越解析体积、旋转面积、NoData、差值 GRID、异步结果和取消。v0.24 重采样测试另锁定 64 字节 ABI、旋转/剪切解析平面、最近邻与双线性、严格/归一化 NoData、串并行一致、异步结果、CRS 拒绝及大 GRID 取消。v0.25 多边形裁剪测试锁定 64 字节 ABI、旋转/剪切仿射、边界内含、保持/紧凑/反向三种模式、NoData、串并行一致、异步结果、非法选项、范围外与大 GRID 取消。v0.26 概览测试锁定 64/64 字节 ABI、平均/最近邻/最小/最大、严格 NoData、源子窗口、上采样规则、带填充步长以及串并行确定性。v0.27 视口窗口测试锁定 64/64 字节 ABI、负像素高、旋转/剪切、边界裁剪、padding、无交集与非法参数，并验证结果窗口可直接组合概览读取。剖面、多边形量测和 GDAL 构建另有数学与真实文件往返测试。</w:t>
+        <w:t>测试覆盖生命周期、普通 TIN 动态编辑、DTIN/DTMESH/XYZ、TIN/GRID/等高线、等高线反向重建与高程冲突回滚、异步任务，以及 CDT 空网清理、外边界、孔洞、断裂线、交叉失败原子性、TIN→CDT、域内采样、CDT→GRID/等高线、共享顶点保护、批量新增/更新/删除、整批失败回滚和 DCDT 往返。局部坡面测试用解析平面验证 TIN/CDT 的 Z、世界梯度、坡度、坡向和法向；全幅测试覆盖坡度、坡向、阴影、CRS、旋转仿射、NoData、串并行一致和取消。土方测试锁定 64/112 字节 ABI、零线穿越解析体积、旋转面积、NoData、差值 GRID、异步结果和取消。v0.24 重采样测试另锁定 64 字节 ABI、旋转/剪切解析平面、最近邻与双线性、严格/归一化 NoData、串并行一致、异步结果、CRS 拒绝及大 GRID 取消。v0.25 多边形裁剪测试锁定 64 字节 ABI、旋转/剪切仿射、边界内含、保持/紧凑/反向三种模式、NoData、串并行一致、异步结果、非法选项、范围外与大 GRID 取消。v0.26 概览测试锁定 64/64 字节 ABI、平均/最近邻/最小/最大、严格 NoData、源子窗口、上采样规则、带填充步长以及串并行确定性。v0.27 视口窗口测试锁定 64/64 字节 ABI、负像素高、旋转/剪切、边界裁剪、padding、无交集与非法参数。v0.28 二进制测试覆盖仿射、NoData、CRS、持久概览、映射标志、写时复制隔离、同路径原子提交、另存、损坏头和截断文件拒绝。剖面、多边形量测和 GDAL 构建另有数学与真实文件往返测试。</w:t>
       </w:r>
     </w:p>
     <w:p>
@@ -18063,7 +18369,7 @@
         <w:color w:val="66727D"/>
         <w:sz w:val="18"/>
       </w:rPr>
-      <w:t xml:space="preserve">版本 0.27.0  |  第 </w:t>
+      <w:t xml:space="preserve">版本 0.28.0  |  第 </w:t>
     </w:r>
     <w:r>
       <w:rPr>

</xml_diff>

<commit_message>
feat: add DGRIDB pyramid and block verification
</commit_message>
<xml_diff>
--- a/docs/manuals/dterrain_DLL开发使用手册.docx
+++ b/docs/manuals/dterrain_DLL开发使用手册.docx
@@ -70,7 +70,7 @@
           <w:color w:val="1F4D78"/>
           <w:sz w:val="28"/>
         </w:rPr>
-        <w:t>面向测绘地形建模的 TIN、GRID、等高线转换、DGRIDB 映射存储、视口自适应 LOD、动态编辑与空间查询</w:t>
+        <w:t>面向测绘地形建模的 TIN、GRID、等高线转换、DGRIDB 映射/金字塔存储、视口自适应 LOD、动态编辑与空间查询</w:t>
       </w:r>
     </w:p>
     <w:p>
@@ -85,7 +85,7 @@
           <w:color w:val="203748"/>
           <w:sz w:val="22"/>
         </w:rPr>
-        <w:t>版本 0.28.0  |  2026-07-18</w:t>
+        <w:t>版本 0.29.0  |  2026-07-18</w:t>
       </w:r>
     </w:p>
     <w:p>
@@ -243,7 +243,7 @@
                 <w:rFonts w:ascii="Calibri" w:hAnsi="Calibri" w:eastAsia="Microsoft YaHei"/>
                 <w:sz w:val="18"/>
               </w:rPr>
-              <w:t>0.28.0</w:t>
+              <w:t>0.29.0</w:t>
             </w:r>
           </w:p>
         </w:tc>
@@ -463,7 +463,7 @@
                 <w:rFonts w:ascii="Calibri" w:hAnsi="Calibri" w:eastAsia="Microsoft YaHei"/>
                 <w:sz w:val="18"/>
               </w:rPr>
-              <w:t>架构、构建部署、稳定 C ABI、DGRIDB 二进制映射存储、世界视口 GRID 裁剪与自适应 LOD、GRID 窗口概览、GRID 多边形裁剪/掩膜、GRID 显式重采样、双 GRID 精确挖填方、局部与全幅坡度/坡向/阴影分析、约束 Delaunay、GRID/等高线转换、GDAL 格式交换、异步任务、12 个兼容接口、文件格式、性能、线程安全、故障排查。</w:t>
+              <w:t>架构、构建部署、稳定 C ABI、DGRIDB 二进制映射/金字塔/块校验、世界视口 GRID 裁剪与自适应 LOD、GRID 窗口概览、GRID 多边形裁剪/掩膜、GRID 显式重采样、双 GRID 精确挖填方、局部与全幅坡度/坡向/阴影分析、约束 Delaunay、GRID/等高线转换、GDAL 格式交换、异步任务、12 个兼容接口、文件格式、性能、线程安全、故障排查。</w:t>
             </w:r>
           </w:p>
         </w:tc>
@@ -621,7 +621,7 @@
         <w:rPr>
           <w:rFonts w:ascii="Calibri" w:hAnsi="Calibri" w:eastAsia="Microsoft YaHei"/>
         </w:rPr>
-        <w:t>本手册对应 dterrain 0.28.0：新增 DGRIDB 二进制大 GRID 格式。Windows 加载以写时复制方式映射原始 double 节点，文件内保存全幅 512 级平均概览、统计、CRS 和 NoData；保存采用临时文件完成后原子替换。GUI 可直接导入/导出 DGRIDB，并继续使用 v0.27 世界视口局部 LOD。完整 GRID 仍参与等高线、分析与转换。坐标重投影、流式瓦片、多级金字塔、网格单元解析边界裁剪、局部 CDT 和 GPU LOD 属于后续阶段。</w:t>
+        <w:t>本手册对应 dterrain 0.29.0：DGRIDB 新增多级金字塔、块校验、视口预取与主动验证；GUI 自动选择金字塔 LOD。文件仍兼容 v0.28。</w:t>
       </w:r>
     </w:p>
     <w:p>
@@ -799,7 +799,7 @@
         <w:rPr>
           <w:rFonts w:ascii="Calibri" w:hAnsi="Calibri" w:eastAsia="Microsoft YaHei"/>
         </w:rPr>
-        <w:t>DGRIDB 二进制 GRID 支持写时复制映射、持久全幅概览、原子保存以及 CRS/NoData 往返。</w:t>
+        <w:t>DGRIDB 二进制 GRID 支持写时复制映射、持久全幅概览、2× 多级金字塔、视口预取、4 MiB 块校验、原子保存以及 CRS/NoData 往返。</w:t>
       </w:r>
     </w:p>
     <w:p>
@@ -8356,7 +8356,7 @@
         <w:rPr>
           <w:rFonts w:ascii="Calibri" w:hAnsi="Calibri" w:eastAsia="Microsoft YaHei"/>
         </w:rPr>
-        <w:t>v0.28 单项约束编辑仍完整重建候选 CDT；批量事务只重建一次。100,000 基础点添加 12 条断裂线的本机对比为逐条 3.259 s、批量 0.528 s，约 6.17 倍。请求 output_effect 还会计算完整域差异。未分段交叉仍须先加入共享顶点。</w:t>
+        <w:t>当前单项约束编辑仍完整重建候选 CDT；批量事务只重建一次。100,000 基础点添加 12 条断裂线的本机对比为逐条 3.259 s、批量 0.528 s，约 6.17 倍。请求 output_effect 还会计算完整域差异。未分段交叉仍须先加入共享顶点。</w:t>
       </w:r>
     </w:p>
     <w:p>
@@ -13115,7 +13115,7 @@
         <w:pStyle w:val="Heading2"/>
       </w:pPr>
       <w:r>
-        <w:t>4.16 DGRIDB 二进制映射存储</w:t>
+        <w:t>4.16 DGRIDB 映射、金字塔与块校验</w:t>
       </w:r>
     </w:p>
     <w:p>
@@ -13123,7 +13123,7 @@
         <w:rPr>
           <w:rFonts w:ascii="Calibri" w:hAnsi="Calibri" w:eastAsia="Microsoft YaHei"/>
         </w:rPr>
-        <w:t>dt_grid_save_binary() 保存 DGRIDB 1，dt_grid_load_binary() 加载后仍返回普通 dt_grid_handle。文件包含固定 64 KiB 校验头、完整六参数仿射、NoData、UTF-8 CRS、有效值统计、最多 512×512 的全幅平均概览，以及按行优先排列的原始 double 节点。Windows 使用 PAGE_WRITECOPY / FILE_MAP_COPY 映射原始节点，不在打开时分配第二份完整数组；非 Windows 构建回退为读入内存。</w:t>
+        <w:t>dt_grid_save_binary() 保存 DGRIDB 1，dt_grid_load_binary() 加载后仍返回普通 dt_grid_handle。文件包含固定 64 KiB 校验头、完整六参数仿射、NoData、UTF-8 CRS、有效值统计、最多 512×512 的兼容全幅概览、从 1/2 分辨率逐级生成的平均金字塔、4 MiB 原始节点块校验表和行优先 double 节点。Windows 分别用 PAGE_WRITECOPY / FILE_MAP_COPY 映射原始节点和各金字塔层；非 Windows 构建回退为读入内存。</w:t>
       </w:r>
     </w:p>
     <w:p>
@@ -13253,7 +13253,69 @@
         <w:rPr>
           <w:rFonts w:ascii="Calibri" w:hAnsi="Calibri" w:eastAsia="Microsoft YaHei"/>
         </w:rPr>
-        <w:t>DT_GRID_STORAGE_MEMORY_MAPPED 和 DT_GRID_HAS_PERSISTENT_OVERVIEW 是 dt_grid_info.flags 的输出能力位，不可传入 dt_grid_create_options。完整源、平均方法、默认 NoData 策略且输出尺寸与文件记录一致时，dt_grid_read_overview() 直接复制持久概览；局部视口及最近邻/最小/最大仍读取原始节点。任意窗口写入会清除旧概览，但写时复制页面不会回写源文件。</w:t>
+        <w:t>DT_GRID_STORAGE_MEMORY_MAPPED、DT_GRID_HAS_PERSISTENT_OVERVIEW、DT_GRID_HAS_PYRAMID 和 DT_GRID_HAS_BLOCK_CHECKSUMS 是 dt_grid_info.flags 的输出能力位，不可传入 dt_grid_create_options。平均概览显式设置 DT_GRID_OVERVIEW_USE_PYRAMID 后，库选择仍不小于输出的最低分辨率层，并以 USED_PYRAMID 标识显示近似；未设置时保持逐源节点精确分箱。dt_grid_prefetch_window() 提示操作系统预取原始映射页面。</w:t>
+      </w:r>
+    </w:p>
+    <w:p>
+      <w:pPr>
+        <w:pStyle w:val="DterrainCode"/>
+        <w:shd w:fill="F2F4F7"/>
+      </w:pPr>
+      <w:r>
+        <w:rPr>
+          <w:rFonts w:ascii="Consolas" w:hAnsi="Consolas" w:eastAsia="Microsoft YaHei"/>
+          <w:sz w:val="17"/>
+        </w:rPr>
+        <w:t>options.flags |= DT_GRID_OVERVIEW_USE_PYRAMID;</w:t>
+      </w:r>
+      <w:r>
+        <w:br/>
+      </w:r>
+      <w:r>
+        <w:rPr>
+          <w:rFonts w:ascii="Consolas" w:hAnsi="Consolas" w:eastAsia="Microsoft YaHei"/>
+          <w:sz w:val="17"/>
+        </w:rPr>
+        <w:t>dt_grid_read_overview(mapped, &amp;options, 512, 256, pixels, 0, &amp;result);</w:t>
+      </w:r>
+      <w:r>
+        <w:br/>
+      </w:r>
+      <w:r>
+        <w:rPr>
+          <w:rFonts w:ascii="Consolas" w:hAnsi="Consolas" w:eastAsia="Microsoft YaHei"/>
+          <w:sz w:val="17"/>
+        </w:rPr>
+        <w:t>bool fast_lod = (result.flags &amp; DT_GRID_OVERVIEW_USED_PYRAMID) != 0;</w:t>
+      </w:r>
+      <w:r>
+        <w:br/>
+      </w:r>
+      <w:r>
+        <w:rPr>
+          <w:rFonts w:ascii="Consolas" w:hAnsi="Consolas" w:eastAsia="Microsoft YaHei"/>
+          <w:sz w:val="17"/>
+        </w:rPr>
+      </w:r>
+      <w:r>
+        <w:br/>
+      </w:r>
+      <w:r>
+        <w:rPr>
+          <w:rFonts w:ascii="Consolas" w:hAnsi="Consolas" w:eastAsia="Microsoft YaHei"/>
+          <w:sz w:val="17"/>
+        </w:rPr>
+        <w:t>// 归档或传输后主动完整扫描；普通打开不会扫描所有节点</w:t>
+      </w:r>
+      <w:r>
+        <w:br/>
+      </w:r>
+      <w:r>
+        <w:rPr>
+          <w:rFonts w:ascii="Consolas" w:hAnsi="Consolas" w:eastAsia="Microsoft YaHei"/>
+          <w:sz w:val="17"/>
+        </w:rPr>
+        <w:t>dt_status verified = dt_grid_verify_binary_file("terrain.dgridb");</w:t>
       </w:r>
     </w:p>
     <w:p>
@@ -13268,6 +13330,27 @@
           <w:b/>
           <w:color w:val="1F4D78"/>
         </w:rPr>
+        <w:t xml:space="preserve">编辑失效规则  </w:t>
+      </w:r>
+      <w:r>
+        <w:rPr>
+          <w:rFonts w:ascii="Calibri" w:hAnsi="Calibri" w:eastAsia="Microsoft YaHei"/>
+        </w:rPr>
+        <w:t>任意窗口写入都会清除当前句柄的持久概览、金字塔和块校验能力，避免继续使用陈旧派生数据；写时复制页面仍不会回写源文件。下一次二进制保存统一重建这些段。</w:t>
+      </w:r>
+    </w:p>
+    <w:p>
+      <w:pPr>
+        <w:spacing w:before="100" w:after="160" w:line="288" w:lineRule="auto"/>
+        <w:ind w:left="230" w:right="230"/>
+        <w:shd w:fill="E8EEF5"/>
+      </w:pPr>
+      <w:r>
+        <w:rPr>
+          <w:rFonts w:ascii="Calibri" w:hAnsi="Calibri" w:eastAsia="Microsoft YaHei"/>
+          <w:b/>
+          <w:color w:val="1F4D78"/>
+        </w:rPr>
         <w:t xml:space="preserve">事务与同路径保存  </w:t>
       </w:r>
       <w:r>
@@ -13295,7 +13378,7 @@
         <w:rPr>
           <w:rFonts w:ascii="Calibri" w:hAnsi="Calibri" w:eastAsia="Microsoft YaHei"/>
         </w:rPr>
-        <w:t>8192×4096、258.06 MiB DGRIDB：保存 0.243 s，映射打开 6.65 ms，内置 512×512 概览 0.177 ms，1024×768 局部读取 3.50 ms。打开和持久概览不扫描完整节点；结果受系统文件缓存和存储设备影响。</w:t>
+        <w:t>8192×4096、343.19 MiB DGRIDB：保存 0.594 s，映射打开 5.17 ms，内置全幅概览 0.107 ms；4096×2048 局部窗口到 512×256 时，精确概览 11.06 ms、金字塔 2.10 ms（5.26×）；完整块校验 0.352 s。金字塔增加约三分之一磁盘空间。</w:t>
       </w:r>
     </w:p>
     <w:p>
@@ -14871,7 +14954,7 @@
         <w:rPr>
           <w:rFonts w:ascii="Calibri" w:hAnsi="Calibri" w:eastAsia="Microsoft YaHei"/>
         </w:rPr>
-        <w:t>DGRIDB 1 是本机大 GRID 工作格式。固定头记录段偏移、源统计和 FNV-1a 头校验；概览段位于原始节点前，节点段按 64 KiB 对齐以便 Windows 映射。头校验不覆盖节点载荷，跨设备传输需要端到端完整性时应另配 SHA-256。格式要求小端序 IEEE-754 double；人工审阅和异构交换仍优先 DGRID 文本或 GeoTIFF/COG。</w:t>
+        <w:t>DGRIDB 1 是本机大 GRID 工作格式。固定头记录源统计、兼容概览、金字塔目录、校验表和原始节点偏移；各映射数据段按 64 KiB 对齐。v0.29 扩展放在旧概览与原始节点之间，旧加载器依靠原始节点偏移跳过扩展，新加载器也接受无扩展 v0.28 布局。头校验不覆盖载荷；内置块校验只覆盖原始节点，若需覆盖整个文件或抵抗恶意篡改仍应配 SHA-256。</w:t>
       </w:r>
     </w:p>
     <w:p>
@@ -17594,6 +17677,28 @@
         <w:rPr>
           <w:rFonts w:ascii="Calibri" w:hAnsi="Calibri" w:eastAsia="Microsoft YaHei"/>
         </w:rPr>
+        <w:t>大 GRID 本机工作优先 DGRIDB；显示概览可显式启用金字塔，分析计算保持精确原始节点路径。</w:t>
+      </w:r>
+    </w:p>
+    <w:p>
+      <w:pPr>
+        <w:pStyle w:val="ListBullet"/>
+      </w:pPr>
+      <w:r>
+        <w:rPr>
+          <w:rFonts w:ascii="Calibri" w:hAnsi="Calibri" w:eastAsia="Microsoft YaHei"/>
+        </w:rPr>
+        <w:t>DGRIDB 复制传输或归档后调用 dt_grid_verify_binary_file()；普通打开不做全量扫描。</w:t>
+      </w:r>
+    </w:p>
+    <w:p>
+      <w:pPr>
+        <w:pStyle w:val="ListBullet"/>
+      </w:pPr>
+      <w:r>
+        <w:rPr>
+          <w:rFonts w:ascii="Calibri" w:hAnsi="Calibri" w:eastAsia="Microsoft YaHei"/>
+        </w:rPr>
         <w:t>保存交换时，DTIN 更紧凑；DTMESH 更可读但体积更大。</w:t>
       </w:r>
     </w:p>
@@ -17652,7 +17757,7 @@
         <w:rPr>
           <w:rFonts w:ascii="Calibri" w:hAnsi="Calibri" w:eastAsia="Microsoft YaHei"/>
         </w:rPr>
-        <w:t>测试覆盖生命周期、普通 TIN 动态编辑、DTIN/DTMESH/XYZ、TIN/GRID/等高线、等高线反向重建与高程冲突回滚、异步任务，以及 CDT 空网清理、外边界、孔洞、断裂线、交叉失败原子性、TIN→CDT、域内采样、CDT→GRID/等高线、共享顶点保护、批量新增/更新/删除、整批失败回滚和 DCDT 往返。局部坡面测试用解析平面验证 TIN/CDT 的 Z、世界梯度、坡度、坡向和法向；全幅测试覆盖坡度、坡向、阴影、CRS、旋转仿射、NoData、串并行一致和取消。土方测试锁定 64/112 字节 ABI、零线穿越解析体积、旋转面积、NoData、差值 GRID、异步结果和取消。v0.24 重采样测试另锁定 64 字节 ABI、旋转/剪切解析平面、最近邻与双线性、严格/归一化 NoData、串并行一致、异步结果、CRS 拒绝及大 GRID 取消。v0.25 多边形裁剪测试锁定 64 字节 ABI、旋转/剪切仿射、边界内含、保持/紧凑/反向三种模式、NoData、串并行一致、异步结果、非法选项、范围外与大 GRID 取消。v0.26 概览测试锁定 64/64 字节 ABI、平均/最近邻/最小/最大、严格 NoData、源子窗口、上采样规则、带填充步长以及串并行确定性。v0.27 视口窗口测试锁定 64/64 字节 ABI、负像素高、旋转/剪切、边界裁剪、padding、无交集与非法参数。v0.28 二进制测试覆盖仿射、NoData、CRS、持久概览、映射标志、写时复制隔离、同路径原子提交、另存、损坏头和截断文件拒绝。剖面、多边形量测和 GDAL 构建另有数学与真实文件往返测试。</w:t>
+        <w:t>测试覆盖生命周期、普通 TIN 动态编辑、DTIN/DTMESH/XYZ、TIN/GRID/等高线、等高线反向重建与高程冲突回滚、异步任务，以及 CDT 空网清理、外边界、孔洞、断裂线、交叉失败原子性、TIN→CDT、域内采样、CDT→GRID/等高线、共享顶点保护、批量新增/更新/删除、整批失败回滚和 DCDT 往返。局部坡面测试用解析平面验证 TIN/CDT 的 Z、世界梯度、坡度、坡向和法向；全幅测试覆盖坡度、坡向、阴影、CRS、旋转仿射、NoData、串并行一致和取消。土方、重采样、裁剪、窗口概览与世界视口测试分别锁定 ABI、解析结果、并行确定性、取消和非法参数。v0.29 二进制测试覆盖仿射、NoData、CRS、v0.28 无扩展兼容、多级金字塔选择、预取、块校验、载荷延迟损坏检测、写时复制失效、同路径原子提交、另存、损坏头和截断拒绝。剖面、多边形量测和 GDAL 构建另有数学与真实文件往返测试。</w:t>
       </w:r>
     </w:p>
     <w:p>
@@ -18369,7 +18474,7 @@
         <w:color w:val="66727D"/>
         <w:sz w:val="18"/>
       </w:rPr>
-      <w:t xml:space="preserve">版本 0.28.0  |  第 </w:t>
+      <w:t xml:space="preserve">版本 0.29.0  |  第 </w:t>
     </w:r>
     <w:r>
       <w:rPr>

</xml_diff>

<commit_message>
feat: add asynchronous GRID viewport LOD
</commit_message>
<xml_diff>
--- a/docs/manuals/dterrain_DLL开发使用手册.docx
+++ b/docs/manuals/dterrain_DLL开发使用手册.docx
@@ -70,7 +70,7 @@
           <w:color w:val="1F4D78"/>
           <w:sz w:val="28"/>
         </w:rPr>
-        <w:t>面向测绘地形建模的 TIN、GRID、等高线转换、DGRIDB 映射/金字塔存储、视口自适应 LOD、动态编辑与空间查询</w:t>
+        <w:t>面向测绘地形建模的 TIN、GRID、等高线转换、DGRIDB 映射/金字塔存储、异步视口 LOD、动态编辑与空间查询</w:t>
       </w:r>
     </w:p>
     <w:p>
@@ -85,7 +85,7 @@
           <w:color w:val="203748"/>
           <w:sz w:val="22"/>
         </w:rPr>
-        <w:t>版本 0.29.0  |  2026-07-18</w:t>
+        <w:t>版本 0.30.0  |  2026-07-18</w:t>
       </w:r>
     </w:p>
     <w:p>
@@ -243,7 +243,7 @@
                 <w:rFonts w:ascii="Calibri" w:hAnsi="Calibri" w:eastAsia="Microsoft YaHei"/>
                 <w:sz w:val="18"/>
               </w:rPr>
-              <w:t>0.29.0</w:t>
+              <w:t>0.30.0</w:t>
             </w:r>
           </w:p>
         </w:tc>
@@ -463,7 +463,7 @@
                 <w:rFonts w:ascii="Calibri" w:hAnsi="Calibri" w:eastAsia="Microsoft YaHei"/>
                 <w:sz w:val="18"/>
               </w:rPr>
-              <w:t>架构、构建部署、稳定 C ABI、DGRIDB 二进制映射/金字塔/块校验、世界视口 GRID 裁剪与自适应 LOD、GRID 窗口概览、GRID 多边形裁剪/掩膜、GRID 显式重采样、双 GRID 精确挖填方、局部与全幅坡度/坡向/阴影分析、约束 Delaunay、GRID/等高线转换、GDAL 格式交换、异步任务、12 个兼容接口、文件格式、性能、线程安全、故障排查。</w:t>
+              <w:t>架构、构建部署、稳定 C ABI、DGRIDB 二进制映射/金字塔/块校验、世界视口 GRID 裁剪与异步 LOD、GRID 窗口概览、GRID 多边形裁剪/掩膜、GRID 显式重采样、双 GRID 精确挖填方、局部与全幅坡度/坡向/阴影分析、约束 Delaunay、GRID/等高线转换、GDAL 格式交换、异步任务、12 个兼容接口、文件格式、性能、线程安全、故障排查。</w:t>
             </w:r>
           </w:p>
         </w:tc>
@@ -605,6 +605,17 @@
     </w:p>
     <w:p>
       <w:pPr>
+        <w:pStyle w:val="ListBullet"/>
+      </w:pPr>
+      <w:r>
+        <w:rPr>
+          <w:rFonts w:ascii="Calibri" w:hAnsi="Calibri" w:eastAsia="Microsoft YaHei"/>
+        </w:rPr>
+        <w:t>非阻塞 GRID 视口：重点阅读第 4.17 节。</w:t>
+      </w:r>
+    </w:p>
+    <w:p>
+      <w:pPr>
         <w:spacing w:before="100" w:after="160" w:line="288" w:lineRule="auto"/>
         <w:ind w:left="230" w:right="230"/>
         <w:shd w:fill="FFF7E0"/>
@@ -621,7 +632,7 @@
         <w:rPr>
           <w:rFonts w:ascii="Calibri" w:hAnsi="Calibri" w:eastAsia="Microsoft YaHei"/>
         </w:rPr>
-        <w:t>本手册对应 dterrain 0.29.0：DGRIDB 新增多级金字塔、块校验、视口预取与主动验证；GUI 自动选择金字塔 LOD。文件仍兼容 v0.28。</w:t>
+        <w:t>本手册对应 dterrain 0.30.0：GRID 概览新增任务自有异步结果、进度与低延迟取消；GUI 采用非阻塞视口调度。DGRIDB 仍兼容 v0.28/v0.29。</w:t>
       </w:r>
     </w:p>
     <w:p>
@@ -777,7 +788,7 @@
         <w:rPr>
           <w:rFonts w:ascii="Calibri" w:hAnsi="Calibri" w:eastAsia="Microsoft YaHei"/>
         </w:rPr>
-        <w:t>GRID 指定窗口直接读取 caller-owned 概览，支持平均、最近邻、最小值、最大值、NoData、精确统计与确定性并行。</w:t>
+        <w:t>GRID 指定窗口支持同步 caller-owned 或异步 task-owned 概览，具备平均、最近邻、最小值、最大值、NoData、确定性并行、进度与取消。</w:t>
       </w:r>
     </w:p>
     <w:p>
@@ -843,7 +854,7 @@
         <w:rPr>
           <w:rFonts w:ascii="Calibri" w:hAnsi="Calibri" w:eastAsia="Microsoft YaHei"/>
         </w:rPr>
-        <w:t>耗时转换的异步任务、进度、等待、协作取消和结果提取。</w:t>
+        <w:t>耗时转换和 GRID 概览的异步任务、进度、等待、协作取消和结果提取。</w:t>
       </w:r>
     </w:p>
     <w:p>
@@ -3368,7 +3379,7 @@
                 <w:rFonts w:ascii="Calibri" w:hAnsi="Calibri" w:eastAsia="Microsoft YaHei"/>
                 <w:sz w:val="18"/>
               </w:rPr>
-              <w:t>异步转换任务接口。</w:t>
+              <w:t>异步转换与 GRID 概览任务接口。</w:t>
             </w:r>
           </w:p>
         </w:tc>
@@ -6672,7 +6683,7 @@
                 <w:rFonts w:ascii="Calibri" w:hAnsi="Calibri" w:eastAsia="Microsoft YaHei"/>
                 <w:sz w:val="18"/>
               </w:rPr>
-              <w:t>异步启动、进度、等待、取消、结果提取</w:t>
+              <w:t>异步转换/概览、进度、等待、取消、结果提取</w:t>
             </w:r>
           </w:p>
         </w:tc>
@@ -13379,6 +13390,239 @@
           <w:rFonts w:ascii="Calibri" w:hAnsi="Calibri" w:eastAsia="Microsoft YaHei"/>
         </w:rPr>
         <w:t>8192×4096、343.19 MiB DGRIDB：保存 0.594 s，映射打开 5.17 ms，内置全幅概览 0.107 ms；4096×2048 局部窗口到 512×256 时，精确概览 11.06 ms、金字塔 2.10 ms（5.26×）；完整块校验 0.352 s。金字塔增加约三分之一磁盘空间。</w:t>
+      </w:r>
+    </w:p>
+    <w:p>
+      <w:pPr>
+        <w:pStyle w:val="Heading2"/>
+      </w:pPr>
+      <w:r>
+        <w:t>4.17 异步 GRID 概览与请求取消</w:t>
+      </w:r>
+    </w:p>
+    <w:p>
+      <w:r>
+        <w:rPr>
+          <w:rFonts w:ascii="Calibri" w:hAnsi="Calibri" w:eastAsia="Microsoft YaHei"/>
+        </w:rPr>
+        <w:t>dt_grid_read_overview_async() 把第 4.14 节的窗口概览提交到统一任务运行时，立即返回 dt_task_handle。任务完成后以 DT_TASK_RESULT_GRID_OVERVIEW 标识结果；dt_task_get_grid_overview_result() 返回任务自有的只读矩阵视图及与同步接口相同的统计。它适合滚轮缩放、框选、平移和窗口尺寸变化等不能阻塞 UI 线程的场景。</w:t>
+      </w:r>
+    </w:p>
+    <w:p>
+      <w:pPr>
+        <w:pStyle w:val="DterrainCode"/>
+        <w:shd w:fill="F2F4F7"/>
+      </w:pPr>
+      <w:r>
+        <w:rPr>
+          <w:rFonts w:ascii="Consolas" w:hAnsi="Consolas" w:eastAsia="Microsoft YaHei"/>
+          <w:sz w:val="17"/>
+        </w:rPr>
+        <w:t>dt_task_handle task = nullptr;</w:t>
+      </w:r>
+      <w:r>
+        <w:br/>
+      </w:r>
+      <w:r>
+        <w:rPr>
+          <w:rFonts w:ascii="Consolas" w:hAnsi="Consolas" w:eastAsia="Microsoft YaHei"/>
+          <w:sz w:val="17"/>
+        </w:rPr>
+        <w:t>dt_status s = dt_grid_read_overview_async(</w:t>
+      </w:r>
+      <w:r>
+        <w:br/>
+      </w:r>
+      <w:r>
+        <w:rPr>
+          <w:rFonts w:ascii="Consolas" w:hAnsi="Consolas" w:eastAsia="Microsoft YaHei"/>
+          <w:sz w:val="17"/>
+        </w:rPr>
+        <w:t xml:space="preserve">    grid, &amp;options, 512, 512, &amp;task);</w:t>
+      </w:r>
+      <w:r>
+        <w:br/>
+      </w:r>
+      <w:r>
+        <w:rPr>
+          <w:rFonts w:ascii="Consolas" w:hAnsi="Consolas" w:eastAsia="Microsoft YaHei"/>
+          <w:sz w:val="17"/>
+        </w:rPr>
+        <w:t>if (s == DT_OK &amp;&amp; dt_task_wait(task, UINT32_MAX) == DT_OK) {</w:t>
+      </w:r>
+      <w:r>
+        <w:br/>
+      </w:r>
+      <w:r>
+        <w:rPr>
+          <w:rFonts w:ascii="Consolas" w:hAnsi="Consolas" w:eastAsia="Microsoft YaHei"/>
+          <w:sz w:val="17"/>
+        </w:rPr>
+        <w:t xml:space="preserve">    dt_grid_overview_view view{};</w:t>
+      </w:r>
+      <w:r>
+        <w:br/>
+      </w:r>
+      <w:r>
+        <w:rPr>
+          <w:rFonts w:ascii="Consolas" w:hAnsi="Consolas" w:eastAsia="Microsoft YaHei"/>
+          <w:sz w:val="17"/>
+        </w:rPr>
+        <w:t xml:space="preserve">    view.struct_size = sizeof(view);</w:t>
+      </w:r>
+      <w:r>
+        <w:br/>
+      </w:r>
+      <w:r>
+        <w:rPr>
+          <w:rFonts w:ascii="Consolas" w:hAnsi="Consolas" w:eastAsia="Microsoft YaHei"/>
+          <w:sz w:val="17"/>
+        </w:rPr>
+        <w:t xml:space="preserve">    if (dt_task_get_grid_overview_result(task, &amp;view) == DT_OK) {</w:t>
+      </w:r>
+      <w:r>
+        <w:br/>
+      </w:r>
+      <w:r>
+        <w:rPr>
+          <w:rFonts w:ascii="Consolas" w:hAnsi="Consolas" w:eastAsia="Microsoft YaHei"/>
+          <w:sz w:val="17"/>
+        </w:rPr>
+        <w:t xml:space="preserve">        // view.values：row_stride×height 个 task-owned double</w:t>
+      </w:r>
+      <w:r>
+        <w:br/>
+      </w:r>
+      <w:r>
+        <w:rPr>
+          <w:rFonts w:ascii="Consolas" w:hAnsi="Consolas" w:eastAsia="Microsoft YaHei"/>
+          <w:sz w:val="17"/>
+        </w:rPr>
+        <w:t xml:space="preserve">        upload_preview(view.values, view.width, view.height,</w:t>
+      </w:r>
+      <w:r>
+        <w:br/>
+      </w:r>
+      <w:r>
+        <w:rPr>
+          <w:rFonts w:ascii="Consolas" w:hAnsi="Consolas" w:eastAsia="Microsoft YaHei"/>
+          <w:sz w:val="17"/>
+        </w:rPr>
+        <w:t xml:space="preserve">                       view.row_stride);</w:t>
+      </w:r>
+      <w:r>
+        <w:br/>
+      </w:r>
+      <w:r>
+        <w:rPr>
+          <w:rFonts w:ascii="Consolas" w:hAnsi="Consolas" w:eastAsia="Microsoft YaHei"/>
+          <w:sz w:val="17"/>
+        </w:rPr>
+        <w:t xml:space="preserve">    }</w:t>
+      </w:r>
+      <w:r>
+        <w:br/>
+      </w:r>
+      <w:r>
+        <w:rPr>
+          <w:rFonts w:ascii="Consolas" w:hAnsi="Consolas" w:eastAsia="Microsoft YaHei"/>
+          <w:sz w:val="17"/>
+        </w:rPr>
+        <w:t>}</w:t>
+      </w:r>
+      <w:r>
+        <w:br/>
+      </w:r>
+      <w:r>
+        <w:rPr>
+          <w:rFonts w:ascii="Consolas" w:hAnsi="Consolas" w:eastAsia="Microsoft YaHei"/>
+          <w:sz w:val="17"/>
+        </w:rPr>
+        <w:t>dt_task_destroy(task);</w:t>
+      </w:r>
+    </w:p>
+    <w:p>
+      <w:pPr>
+        <w:spacing w:before="100" w:after="160" w:line="288" w:lineRule="auto"/>
+        <w:ind w:left="230" w:right="230"/>
+        <w:shd w:fill="E8EEF5"/>
+      </w:pPr>
+      <w:r>
+        <w:rPr>
+          <w:rFonts w:ascii="Calibri" w:hAnsi="Calibri" w:eastAsia="Microsoft YaHei"/>
+          <w:b/>
+          <w:color w:val="1F4D78"/>
+        </w:rPr>
+        <w:t xml:space="preserve">结果所有权  </w:t>
+      </w:r>
+      <w:r>
+        <w:rPr>
+          <w:rFonts w:ascii="Calibri" w:hAnsi="Calibri" w:eastAsia="Microsoft YaHei"/>
+        </w:rPr>
+        <w:t>异步任务复制 options，并在任务内部持有源 GRID 的共享生命周期；提交后可销毁调用方的公开 grid 句柄。view.values 是借用的只读指针，仅在 task 未销毁且结果未被释放时有效，调用方不得释放或修改。失败或取消不发布结果，getter 返回相应状态。</w:t>
+      </w:r>
+    </w:p>
+    <w:p>
+      <w:pPr>
+        <w:spacing w:before="100" w:after="160" w:line="288" w:lineRule="auto"/>
+        <w:ind w:left="230" w:right="230"/>
+        <w:shd w:fill="E8EEF5"/>
+      </w:pPr>
+      <w:r>
+        <w:rPr>
+          <w:rFonts w:ascii="Calibri" w:hAnsi="Calibri" w:eastAsia="Microsoft YaHei"/>
+          <w:b/>
+          <w:color w:val="1F4D78"/>
+        </w:rPr>
+        <w:t xml:space="preserve">进度与取消  </w:t>
+      </w:r>
+      <w:r>
+        <w:rPr>
+          <w:rFonts w:ascii="Calibri" w:hAnsi="Calibri" w:eastAsia="Microsoft YaHei"/>
+        </w:rPr>
+        <w:t>可用 dt_task_get_info() 轮询 0～1 进度，或用 dt_task_wait() 等待。dt_task_request_cancel() 是协作取消：精确聚合在输出行及大分箱内部检查，金字塔和持久概览逐输出行检查；并行工作线程会停止并汇合，不留下可见半成品。GUI 应取消过期视口，但仍须在完成后销毁任务。</w:t>
+      </w:r>
+    </w:p>
+    <w:p>
+      <w:pPr>
+        <w:spacing w:before="100" w:after="160" w:line="288" w:lineRule="auto"/>
+        <w:ind w:left="230" w:right="230"/>
+        <w:shd w:fill="FFF7E0"/>
+      </w:pPr>
+      <w:r>
+        <w:rPr>
+          <w:rFonts w:ascii="Calibri" w:hAnsi="Calibri" w:eastAsia="Microsoft YaHei"/>
+          <w:b/>
+          <w:color w:val="7A5A00"/>
+        </w:rPr>
+        <w:t xml:space="preserve">并发约束  </w:t>
+      </w:r>
+      <w:r>
+        <w:rPr>
+          <w:rFonts w:ascii="Calibri" w:hAnsi="Calibri" w:eastAsia="Microsoft YaHei"/>
+        </w:rPr>
+        <w:t>任务运行期间不得从其他线程修改同一 GRID。输出单轴最多 1,048,576、总值最多 10 亿；非法尺寸会形成 FAILED 任务并报告 DT_E_INVALID_ARGUMENT。可在后台保留上一帧缓存，只有当前请求成功时才原子替换，避免闪烁和过期结果覆盖新视口。</w:t>
+      </w:r>
+    </w:p>
+    <w:p>
+      <w:pPr>
+        <w:spacing w:before="100" w:after="160" w:line="288" w:lineRule="auto"/>
+        <w:ind w:left="230" w:right="230"/>
+        <w:shd w:fill="FFF7E0"/>
+      </w:pPr>
+      <w:r>
+        <w:rPr>
+          <w:rFonts w:ascii="Calibri" w:hAnsi="Calibri" w:eastAsia="Microsoft YaHei"/>
+          <w:b/>
+          <w:color w:val="7A5A00"/>
+        </w:rPr>
+        <w:t xml:space="preserve">本机基准  </w:t>
+      </w:r>
+      <w:r>
+        <w:rPr>
+          <w:rFonts w:ascii="Calibri" w:hAnsi="Calibri" w:eastAsia="Microsoft YaHei"/>
+        </w:rPr>
+        <w:t>4096×4096→512×512：单线程 111.81 ms，自动并行 14.69 ms，约 7.61×；异步提交约 112 μs、等待 15.58 ms，输出误差为 0；取消延迟约 0.36 ms。结果随硬件、缓存和数据分布变化，不是固定承诺。</w:t>
       </w:r>
     </w:p>
     <w:p>
@@ -17677,7 +17921,7 @@
         <w:rPr>
           <w:rFonts w:ascii="Calibri" w:hAnsi="Calibri" w:eastAsia="Microsoft YaHei"/>
         </w:rPr>
-        <w:t>大 GRID 本机工作优先 DGRIDB；显示概览可显式启用金字塔，分析计算保持精确原始节点路径。</w:t>
+        <w:t>大 GRID 本机工作优先 DGRIDB；交互显示使用异步概览并可显式启用金字塔，分析计算保持精确原始节点路径。</w:t>
       </w:r>
     </w:p>
     <w:p>
@@ -17757,7 +18001,7 @@
         <w:rPr>
           <w:rFonts w:ascii="Calibri" w:hAnsi="Calibri" w:eastAsia="Microsoft YaHei"/>
         </w:rPr>
-        <w:t>测试覆盖生命周期、普通 TIN 动态编辑、DTIN/DTMESH/XYZ、TIN/GRID/等高线、等高线反向重建与高程冲突回滚、异步任务，以及 CDT 空网清理、外边界、孔洞、断裂线、交叉失败原子性、TIN→CDT、域内采样、CDT→GRID/等高线、共享顶点保护、批量新增/更新/删除、整批失败回滚和 DCDT 往返。局部坡面测试用解析平面验证 TIN/CDT 的 Z、世界梯度、坡度、坡向和法向；全幅测试覆盖坡度、坡向、阴影、CRS、旋转仿射、NoData、串并行一致和取消。土方、重采样、裁剪、窗口概览与世界视口测试分别锁定 ABI、解析结果、并行确定性、取消和非法参数。v0.29 二进制测试覆盖仿射、NoData、CRS、v0.28 无扩展兼容、多级金字塔选择、预取、块校验、载荷延迟损坏检测、写时复制失效、同路径原子提交、另存、损坏头和截断拒绝。剖面、多边形量测和 GDAL 构建另有数学与真实文件往返测试。</w:t>
+        <w:t>测试覆盖生命周期、普通 TIN 动态编辑、DTIN/DTMESH/XYZ、TIN/GRID/等高线、等高线反向重建与高程冲突回滚、异步任务，以及 CDT 空网清理、外边界、孔洞、断裂线、交叉失败原子性、TIN→CDT、域内采样、CDT→GRID/等高线、共享顶点保护、批量新增/更新/删除、整批失败回滚和 DCDT 往返。局部坡面测试用解析平面验证 TIN/CDT 的 Z、世界梯度、坡度、坡向和法向；全幅测试覆盖坡度、坡向、阴影、CRS、旋转仿射、NoData、串并行一致和取消。土方、重采样、裁剪、窗口概览与世界视口测试分别锁定 ABI、解析结果、并行确定性、取消和非法参数；v0.30 另覆盖异步概览同步等价、任务持有源生命周期、借用结果、取消及非法尺寸失败。v0.29 二进制测试覆盖仿射、NoData、CRS、v0.28 无扩展兼容、多级金字塔选择、预取、块校验、载荷延迟损坏检测、写时复制失效、同路径原子提交、另存、损坏头和截断拒绝。剖面、多边形量测和 GDAL 构建另有数学与真实文件往返测试。</w:t>
       </w:r>
     </w:p>
     <w:p>
@@ -18474,7 +18718,7 @@
         <w:color w:val="66727D"/>
         <w:sz w:val="18"/>
       </w:rPr>
-      <w:t xml:space="preserve">版本 0.29.0  |  第 </w:t>
+      <w:t xml:space="preserve">版本 0.30.0  |  第 </w:t>
     </w:r>
     <w:r>
       <w:rPr>

</xml_diff>

<commit_message>
feat: verify mapped GRID viewport blocks
</commit_message>
<xml_diff>
--- a/docs/manuals/dterrain_DLL开发使用手册.docx
+++ b/docs/manuals/dterrain_DLL开发使用手册.docx
@@ -70,7 +70,7 @@
           <w:color w:val="1F4D78"/>
           <w:sz w:val="28"/>
         </w:rPr>
-        <w:t>面向测绘地形建模的 TIN、GRID、等高线转换、DGRIDB 映射/金字塔存储、异步视口 LOD、动态编辑与空间查询</w:t>
+        <w:t>面向测绘地形建模的 TIN、GRID、等高线转换、DGRIDB 映射/金字塔/按需校验、异步视口 LOD、动态编辑与空间查询</w:t>
       </w:r>
     </w:p>
     <w:p>
@@ -85,7 +85,7 @@
           <w:color w:val="203748"/>
           <w:sz w:val="22"/>
         </w:rPr>
-        <w:t>版本 0.30.0  |  2026-07-18</w:t>
+        <w:t>版本 0.31.0  |  2026-07-18</w:t>
       </w:r>
     </w:p>
     <w:p>
@@ -243,7 +243,7 @@
                 <w:rFonts w:ascii="Calibri" w:hAnsi="Calibri" w:eastAsia="Microsoft YaHei"/>
                 <w:sz w:val="18"/>
               </w:rPr>
-              <w:t>0.30.0</w:t>
+              <w:t>0.31.0</w:t>
             </w:r>
           </w:p>
         </w:tc>
@@ -463,7 +463,7 @@
                 <w:rFonts w:ascii="Calibri" w:hAnsi="Calibri" w:eastAsia="Microsoft YaHei"/>
                 <w:sz w:val="18"/>
               </w:rPr>
-              <w:t>架构、构建部署、稳定 C ABI、DGRIDB 二进制映射/金字塔/块校验、世界视口 GRID 裁剪与异步 LOD、GRID 窗口概览、GRID 多边形裁剪/掩膜、GRID 显式重采样、双 GRID 精确挖填方、局部与全幅坡度/坡向/阴影分析、约束 Delaunay、GRID/等高线转换、GDAL 格式交换、异步任务、12 个兼容接口、文件格式、性能、线程安全、故障排查。</w:t>
+              <w:t>架构、构建部署、稳定 C ABI、DGRIDB 二进制映射/金字塔/视口块校验缓存、世界视口 GRID 裁剪与异步 LOD、GRID 窗口概览、GRID 多边形裁剪/掩膜、GRID 显式重采样、双 GRID 精确挖填方、局部与全幅坡度/坡向/阴影分析、约束 Delaunay、GRID/等高线转换、GDAL 格式交换、异步任务、12 个兼容接口、文件格式、性能、线程安全、故障排查。</w:t>
             </w:r>
           </w:p>
         </w:tc>
@@ -616,6 +616,17 @@
     </w:p>
     <w:p>
       <w:pPr>
+        <w:pStyle w:val="ListBullet"/>
+      </w:pPr>
+      <w:r>
+        <w:rPr>
+          <w:rFonts w:ascii="Calibri" w:hAnsi="Calibri" w:eastAsia="Microsoft YaHei"/>
+        </w:rPr>
+        <w:t>DGRIDB 视口按需校验：重点阅读第 4.18 节。</w:t>
+      </w:r>
+    </w:p>
+    <w:p>
+      <w:pPr>
         <w:spacing w:before="100" w:after="160" w:line="288" w:lineRule="auto"/>
         <w:ind w:left="230" w:right="230"/>
         <w:shd w:fill="FFF7E0"/>
@@ -632,7 +643,7 @@
         <w:rPr>
           <w:rFonts w:ascii="Calibri" w:hAnsi="Calibri" w:eastAsia="Microsoft YaHei"/>
         </w:rPr>
-        <w:t>本手册对应 dterrain 0.30.0：GRID 概览新增任务自有异步结果、进度与低延迟取消；GUI 采用非阻塞视口调度。DGRIDB 仍兼容 v0.28/v0.29。</w:t>
+        <w:t>本手册对应 dterrain 0.31.0：DGRIDB 新增同步/异步视口原始节点块校验、句柄级缓存和概览前自动验证；GUI 在非阻塞视口 LOD 中按需启用。文件布局仍兼容 v0.28/v0.29。</w:t>
       </w:r>
     </w:p>
     <w:p>
@@ -13448,7 +13459,27 @@
           <w:rFonts w:ascii="Consolas" w:hAnsi="Consolas" w:eastAsia="Microsoft YaHei"/>
           <w:sz w:val="17"/>
         </w:rPr>
-        <w:t>if (s == DT_OK &amp;&amp; dt_task_wait(task, UINT32_MAX) == DT_OK) {</w:t>
+        <w:t>int32_t completed = 0;</w:t>
+      </w:r>
+      <w:r>
+        <w:br/>
+      </w:r>
+      <w:r>
+        <w:rPr>
+          <w:rFonts w:ascii="Consolas" w:hAnsi="Consolas" w:eastAsia="Microsoft YaHei"/>
+          <w:sz w:val="17"/>
+        </w:rPr>
+        <w:t>if (s == DT_OK &amp;&amp;</w:t>
+      </w:r>
+      <w:r>
+        <w:br/>
+      </w:r>
+      <w:r>
+        <w:rPr>
+          <w:rFonts w:ascii="Consolas" w:hAnsi="Consolas" w:eastAsia="Microsoft YaHei"/>
+          <w:sz w:val="17"/>
+        </w:rPr>
+        <w:t xml:space="preserve">    dt_task_wait(task, UINT32_MAX, &amp;completed) == DT_OK &amp;&amp; completed) {</w:t>
       </w:r>
       <w:r>
         <w:br/>
@@ -13623,6 +13654,288 @@
           <w:rFonts w:ascii="Calibri" w:hAnsi="Calibri" w:eastAsia="Microsoft YaHei"/>
         </w:rPr>
         <w:t>4096×4096→512×512：单线程 111.81 ms，自动并行 14.69 ms，约 7.61×；异步提交约 112 μs、等待 15.58 ms，输出误差为 0；取消延迟约 0.36 ms。结果随硬件、缓存和数据分布变化，不是固定承诺。</w:t>
+      </w:r>
+    </w:p>
+    <w:p>
+      <w:pPr>
+        <w:pStyle w:val="Heading2"/>
+      </w:pPr>
+      <w:r>
+        <w:t>4.18 DGRIDB 视口块校验与缓存</w:t>
+      </w:r>
+    </w:p>
+    <w:p>
+      <w:r>
+        <w:rPr>
+          <w:rFonts w:ascii="Calibri" w:hAnsi="Calibri" w:eastAsia="Microsoft YaHei"/>
+        </w:rPr>
+        <w:t>v0.31 可只校验当前准备读取的 DGRIDB 原始节点窗口。dt_grid_verify_window() 把二维窗口逐行映射到既有 4 MiB 连续校验块，去重后读取完整相交块；dt_grid_verify_result 固定为 64 字节，分别报告块总数、本次冷校验数、缓存命中数和实际检查字节数。后者可能大于窗口本身，因为校验粒度是完整块。</w:t>
+      </w:r>
+    </w:p>
+    <w:p>
+      <w:pPr>
+        <w:pStyle w:val="DterrainCode"/>
+        <w:shd w:fill="F2F4F7"/>
+      </w:pPr>
+      <w:r>
+        <w:rPr>
+          <w:rFonts w:ascii="Consolas" w:hAnsi="Consolas" w:eastAsia="Microsoft YaHei"/>
+          <w:sz w:val="17"/>
+        </w:rPr>
+        <w:t>dt_grid_verify_result vr{};</w:t>
+      </w:r>
+      <w:r>
+        <w:br/>
+      </w:r>
+      <w:r>
+        <w:rPr>
+          <w:rFonts w:ascii="Consolas" w:hAnsi="Consolas" w:eastAsia="Microsoft YaHei"/>
+          <w:sz w:val="17"/>
+        </w:rPr>
+        <w:t>vr.struct_size = sizeof(vr);</w:t>
+      </w:r>
+      <w:r>
+        <w:br/>
+      </w:r>
+      <w:r>
+        <w:rPr>
+          <w:rFonts w:ascii="Consolas" w:hAnsi="Consolas" w:eastAsia="Microsoft YaHei"/>
+          <w:sz w:val="17"/>
+        </w:rPr>
+        <w:t>dt_status s = dt_grid_verify_window(</w:t>
+      </w:r>
+      <w:r>
+        <w:br/>
+      </w:r>
+      <w:r>
+        <w:rPr>
+          <w:rFonts w:ascii="Consolas" w:hAnsi="Consolas" w:eastAsia="Microsoft YaHei"/>
+          <w:sz w:val="17"/>
+        </w:rPr>
+        <w:t xml:space="preserve">    mapped, column, row, width, height, &amp;vr);</w:t>
+      </w:r>
+      <w:r>
+        <w:br/>
+      </w:r>
+      <w:r>
+        <w:rPr>
+          <w:rFonts w:ascii="Consolas" w:hAnsi="Consolas" w:eastAsia="Microsoft YaHei"/>
+          <w:sz w:val="17"/>
+        </w:rPr>
+      </w:r>
+      <w:r>
+        <w:br/>
+      </w:r>
+      <w:r>
+        <w:rPr>
+          <w:rFonts w:ascii="Consolas" w:hAnsi="Consolas" w:eastAsia="Microsoft YaHei"/>
+          <w:sz w:val="17"/>
+        </w:rPr>
+        <w:t>// 也可提交到统一任务运行时</w:t>
+      </w:r>
+      <w:r>
+        <w:br/>
+      </w:r>
+      <w:r>
+        <w:rPr>
+          <w:rFonts w:ascii="Consolas" w:hAnsi="Consolas" w:eastAsia="Microsoft YaHei"/>
+          <w:sz w:val="17"/>
+        </w:rPr>
+        <w:t>dt_task_handle task = nullptr;</w:t>
+      </w:r>
+      <w:r>
+        <w:br/>
+      </w:r>
+      <w:r>
+        <w:rPr>
+          <w:rFonts w:ascii="Consolas" w:hAnsi="Consolas" w:eastAsia="Microsoft YaHei"/>
+          <w:sz w:val="17"/>
+        </w:rPr>
+        <w:t>dt_grid_verify_window_async(</w:t>
+      </w:r>
+      <w:r>
+        <w:br/>
+      </w:r>
+      <w:r>
+        <w:rPr>
+          <w:rFonts w:ascii="Consolas" w:hAnsi="Consolas" w:eastAsia="Microsoft YaHei"/>
+          <w:sz w:val="17"/>
+        </w:rPr>
+        <w:t xml:space="preserve">    mapped, column, row, width, height, &amp;task);</w:t>
+      </w:r>
+      <w:r>
+        <w:br/>
+      </w:r>
+      <w:r>
+        <w:rPr>
+          <w:rFonts w:ascii="Consolas" w:hAnsi="Consolas" w:eastAsia="Microsoft YaHei"/>
+          <w:sz w:val="17"/>
+        </w:rPr>
+        <w:t>int32_t completed = 0;</w:t>
+      </w:r>
+      <w:r>
+        <w:br/>
+      </w:r>
+      <w:r>
+        <w:rPr>
+          <w:rFonts w:ascii="Consolas" w:hAnsi="Consolas" w:eastAsia="Microsoft YaHei"/>
+          <w:sz w:val="17"/>
+        </w:rPr>
+        <w:t>dt_task_wait(task, UINT32_MAX, &amp;completed);</w:t>
+      </w:r>
+      <w:r>
+        <w:br/>
+      </w:r>
+      <w:r>
+        <w:rPr>
+          <w:rFonts w:ascii="Consolas" w:hAnsi="Consolas" w:eastAsia="Microsoft YaHei"/>
+          <w:sz w:val="17"/>
+        </w:rPr>
+        <w:t>dt_grid_verify_result async_vr{};</w:t>
+      </w:r>
+      <w:r>
+        <w:br/>
+      </w:r>
+      <w:r>
+        <w:rPr>
+          <w:rFonts w:ascii="Consolas" w:hAnsi="Consolas" w:eastAsia="Microsoft YaHei"/>
+          <w:sz w:val="17"/>
+        </w:rPr>
+        <w:t>async_vr.struct_size = sizeof(async_vr);</w:t>
+      </w:r>
+      <w:r>
+        <w:br/>
+      </w:r>
+      <w:r>
+        <w:rPr>
+          <w:rFonts w:ascii="Consolas" w:hAnsi="Consolas" w:eastAsia="Microsoft YaHei"/>
+          <w:sz w:val="17"/>
+        </w:rPr>
+        <w:t>dt_task_get_grid_verification_result(task, &amp;async_vr);</w:t>
+      </w:r>
+      <w:r>
+        <w:br/>
+      </w:r>
+      <w:r>
+        <w:rPr>
+          <w:rFonts w:ascii="Consolas" w:hAnsi="Consolas" w:eastAsia="Microsoft YaHei"/>
+          <w:sz w:val="17"/>
+        </w:rPr>
+        <w:t>dt_task_destroy(task);</w:t>
+      </w:r>
+    </w:p>
+    <w:p>
+      <w:r>
+        <w:rPr>
+          <w:rFonts w:ascii="Calibri" w:hAnsi="Calibri" w:eastAsia="Microsoft YaHei"/>
+        </w:rPr>
+        <w:t>异步结果类型为 DT_TASK_RESULT_GRID_VERIFICATION。任务共享持有源 GRID，按块报告进度，在块边界响应协作取消；失败或取消不发布部分统计。无校验扩展的 v0.28 文件和普通内存 GRID 返回 DT_E_UNSUPPORTED。</w:t>
+      </w:r>
+    </w:p>
+    <w:p>
+      <w:pPr>
+        <w:pStyle w:val="DterrainCode"/>
+        <w:shd w:fill="F2F4F7"/>
+      </w:pPr>
+      <w:r>
+        <w:rPr>
+          <w:rFonts w:ascii="Consolas" w:hAnsi="Consolas" w:eastAsia="Microsoft YaHei"/>
+          <w:sz w:val="17"/>
+        </w:rPr>
+        <w:t>// 在概览读取前自动验证同一源窗口</w:t>
+      </w:r>
+      <w:r>
+        <w:br/>
+      </w:r>
+      <w:r>
+        <w:rPr>
+          <w:rFonts w:ascii="Consolas" w:hAnsi="Consolas" w:eastAsia="Microsoft YaHei"/>
+          <w:sz w:val="17"/>
+        </w:rPr>
+        <w:t>options.flags |= DT_GRID_OVERVIEW_VERIFY_SOURCE_BLOCKS;</w:t>
+      </w:r>
+      <w:r>
+        <w:br/>
+      </w:r>
+      <w:r>
+        <w:rPr>
+          <w:rFonts w:ascii="Consolas" w:hAnsi="Consolas" w:eastAsia="Microsoft YaHei"/>
+          <w:sz w:val="17"/>
+        </w:rPr>
+        <w:t>options.flags |= DT_GRID_OVERVIEW_USE_PYRAMID;</w:t>
+      </w:r>
+      <w:r>
+        <w:br/>
+      </w:r>
+      <w:r>
+        <w:rPr>
+          <w:rFonts w:ascii="Consolas" w:hAnsi="Consolas" w:eastAsia="Microsoft YaHei"/>
+          <w:sz w:val="17"/>
+        </w:rPr>
+        <w:t>dt_grid_read_overview_async(grid, &amp;options, 512, 512, &amp;task);</w:t>
+      </w:r>
+    </w:p>
+    <w:p>
+      <w:pPr>
+        <w:spacing w:before="100" w:after="160" w:line="288" w:lineRule="auto"/>
+        <w:ind w:left="230" w:right="230"/>
+        <w:shd w:fill="E8EEF5"/>
+      </w:pPr>
+      <w:r>
+        <w:rPr>
+          <w:rFonts w:ascii="Calibri" w:hAnsi="Calibri" w:eastAsia="Microsoft YaHei"/>
+          <w:b/>
+          <w:color w:val="1F4D78"/>
+        </w:rPr>
+        <w:t xml:space="preserve">缓存与并发  </w:t>
+      </w:r>
+      <w:r>
+        <w:rPr>
+          <w:rFonts w:ascii="Calibri" w:hAnsi="Calibri" w:eastAsia="Microsoft YaHei"/>
+        </w:rPr>
+        <w:t>通过块和失败块状态都保存在当前已加载 GRID 句柄中并受互斥保护；重复窗口通常直接命中缓存。并发只读校验安全，但不得同时写入同一 GRID。任意节点写入会清除旧校验能力和缓存，重新保存 DGRIDB 时重建。</w:t>
+      </w:r>
+    </w:p>
+    <w:p>
+      <w:pPr>
+        <w:spacing w:before="100" w:after="160" w:line="288" w:lineRule="auto"/>
+        <w:ind w:left="230" w:right="230"/>
+        <w:shd w:fill="FFF7E0"/>
+      </w:pPr>
+      <w:r>
+        <w:rPr>
+          <w:rFonts w:ascii="Calibri" w:hAnsi="Calibri" w:eastAsia="Microsoft YaHei"/>
+          <w:b/>
+          <w:color w:val="7A5A00"/>
+        </w:rPr>
+        <w:t xml:space="preserve">保护边界  </w:t>
+      </w:r>
+      <w:r>
+        <w:rPr>
+          <w:rFonts w:ascii="Calibri" w:hAnsi="Calibri" w:eastAsia="Microsoft YaHei"/>
+        </w:rPr>
+        <w:t>VERIFY_SOURCE_BLOCKS 验证的是请求窗口对应的原始 double 节点块，即使后续概览直接来自持久全幅缓存或金字塔。它不校验概览/金字塔载荷，也不能替代归档或复制后的 dt_grid_verify_binary_file() 全量审计；高保障分发还应配合外部 SHA-256。</w:t>
+      </w:r>
+    </w:p>
+    <w:p>
+      <w:pPr>
+        <w:spacing w:before="100" w:after="160" w:line="288" w:lineRule="auto"/>
+        <w:ind w:left="230" w:right="230"/>
+        <w:shd w:fill="FFF7E0"/>
+      </w:pPr>
+      <w:r>
+        <w:rPr>
+          <w:rFonts w:ascii="Calibri" w:hAnsi="Calibri" w:eastAsia="Microsoft YaHei"/>
+          <w:b/>
+          <w:color w:val="7A5A00"/>
+        </w:rPr>
+        <w:t xml:space="preserve">本机基准  </w:t>
+      </w:r>
+      <w:r>
+        <w:rPr>
+          <w:rFonts w:ascii="Calibri" w:hAnsi="Calibri" w:eastAsia="Microsoft YaHei"/>
+        </w:rPr>
+        <w:t>8192×4096、343.19 MiB DGRIDB：12 个相交块（48 MiB）冷校验约 58.56 ms，同一窗口缓存复查约 6 μs，完整原始节点扫描约 384.06 ms；冷窗口路径约快 6.56×。</w:t>
       </w:r>
     </w:p>
     <w:p>
@@ -17921,7 +18234,7 @@
         <w:rPr>
           <w:rFonts w:ascii="Calibri" w:hAnsi="Calibri" w:eastAsia="Microsoft YaHei"/>
         </w:rPr>
-        <w:t>大 GRID 本机工作优先 DGRIDB；交互显示使用异步概览并可显式启用金字塔，分析计算保持精确原始节点路径。</w:t>
+        <w:t>大 GRID 本机工作优先 DGRIDB；交互显示使用异步概览、金字塔和 VERIFY_SOURCE_BLOCKS 按需校验，分析计算保持精确原始节点路径。</w:t>
       </w:r>
     </w:p>
     <w:p>
@@ -17932,7 +18245,7 @@
         <w:rPr>
           <w:rFonts w:ascii="Calibri" w:hAnsi="Calibri" w:eastAsia="Microsoft YaHei"/>
         </w:rPr>
-        <w:t>DGRIDB 复制传输或归档后调用 dt_grid_verify_binary_file()；普通打开不做全量扫描。</w:t>
+        <w:t>DGRIDB 视口按需校验只覆盖已访问的原始节点块；复制传输或归档后仍调用 dt_grid_verify_binary_file() 完整扫描。</w:t>
       </w:r>
     </w:p>
     <w:p>
@@ -18001,7 +18314,7 @@
         <w:rPr>
           <w:rFonts w:ascii="Calibri" w:hAnsi="Calibri" w:eastAsia="Microsoft YaHei"/>
         </w:rPr>
-        <w:t>测试覆盖生命周期、普通 TIN 动态编辑、DTIN/DTMESH/XYZ、TIN/GRID/等高线、等高线反向重建与高程冲突回滚、异步任务，以及 CDT 空网清理、外边界、孔洞、断裂线、交叉失败原子性、TIN→CDT、域内采样、CDT→GRID/等高线、共享顶点保护、批量新增/更新/删除、整批失败回滚和 DCDT 往返。局部坡面测试用解析平面验证 TIN/CDT 的 Z、世界梯度、坡度、坡向和法向；全幅测试覆盖坡度、坡向、阴影、CRS、旋转仿射、NoData、串并行一致和取消。土方、重采样、裁剪、窗口概览与世界视口测试分别锁定 ABI、解析结果、并行确定性、取消和非法参数；v0.30 另覆盖异步概览同步等价、任务持有源生命周期、借用结果、取消及非法尺寸失败。v0.29 二进制测试覆盖仿射、NoData、CRS、v0.28 无扩展兼容、多级金字塔选择、预取、块校验、载荷延迟损坏检测、写时复制失效、同路径原子提交、另存、损坏头和截断拒绝。剖面、多边形量测和 GDAL 构建另有数学与真实文件往返测试。</w:t>
+        <w:t>测试覆盖生命周期、普通 TIN 动态编辑、DTIN/DTMESH/XYZ、TIN/GRID/等高线、等高线反向重建与高程冲突回滚、异步任务，以及 CDT 空网清理、外边界、孔洞、断裂线、交叉失败原子性、TIN→CDT、域内采样、CDT→GRID/等高线、共享顶点保护、批量新增/更新/删除、整批失败回滚和 DCDT 往返。局部坡面测试用解析平面验证 TIN/CDT 的 Z、世界梯度、坡度、坡向和法向；全幅测试覆盖坡度、坡向、阴影、CRS、旋转仿射、NoData、串并行一致和取消。土方、重采样、裁剪、窗口概览与世界视口测试分别锁定 ABI、解析结果、并行确定性、取消和非法参数；v0.30 覆盖异步概览同步等价、任务持有源生命周期、借用结果、取消及非法尺寸失败。v0.31 新增冷块、缓存命中、跨块窗口、异步生命周期/取消、概览前校验和定点损坏失败缓存测试。v0.29 二进制测试覆盖仿射、NoData、CRS、v0.28 无扩展兼容、多级金字塔选择、预取、块校验、载荷延迟损坏检测、写时复制失效、同路径原子提交、另存、损坏头和截断拒绝。剖面、多边形量测和 GDAL 构建另有数学与真实文件往返测试。</w:t>
       </w:r>
     </w:p>
     <w:p>
@@ -18718,7 +19031,7 @@
         <w:color w:val="66727D"/>
         <w:sz w:val="18"/>
       </w:rPr>
-      <w:t xml:space="preserve">版本 0.30.0  |  第 </w:t>
+      <w:t xml:space="preserve">版本 0.31.0  |  第 </w:t>
     </w:r>
     <w:r>
       <w:rPr>

</xml_diff>

<commit_message>
feat: stream DGRIDB pyramid generation
</commit_message>
<xml_diff>
--- a/docs/manuals/dterrain_DLL开发使用手册.docx
+++ b/docs/manuals/dterrain_DLL开发使用手册.docx
@@ -70,7 +70,7 @@
           <w:color w:val="1F4D78"/>
           <w:sz w:val="28"/>
         </w:rPr>
-        <w:t>面向测绘地形建模的 TIN、GRID、等高线转换、DGRIDB 映射/金字塔/按需校验、异步视口 LOD、动态编辑与空间查询</w:t>
+        <w:t>面向测绘地形建模的 TIN、GRID、等高线转换、DGRIDB 映射/流式金字塔/按需校验、异步视口 LOD、动态编辑与空间查询</w:t>
       </w:r>
     </w:p>
     <w:p>
@@ -85,7 +85,7 @@
           <w:color w:val="203748"/>
           <w:sz w:val="22"/>
         </w:rPr>
-        <w:t>版本 0.31.0  |  2026-07-18</w:t>
+        <w:t>版本 0.32.0  |  2026-07-18</w:t>
       </w:r>
     </w:p>
     <w:p>
@@ -243,7 +243,7 @@
                 <w:rFonts w:ascii="Calibri" w:hAnsi="Calibri" w:eastAsia="Microsoft YaHei"/>
                 <w:sz w:val="18"/>
               </w:rPr>
-              <w:t>0.31.0</w:t>
+              <w:t>0.32.0</w:t>
             </w:r>
           </w:p>
         </w:tc>
@@ -643,7 +643,7 @@
         <w:rPr>
           <w:rFonts w:ascii="Calibri" w:hAnsi="Calibri" w:eastAsia="Microsoft YaHei"/>
         </w:rPr>
-        <w:t>本手册对应 dterrain 0.31.0：DGRIDB 新增同步/异步视口原始节点块校验、句柄级缓存和概览前自动验证；GUI 在非阻塞视口 LOD 中按需启用。文件布局仍兼容 v0.28/v0.29。</w:t>
+        <w:t>本手册对应 dterrain 0.32.0：DGRIDB 保存改为逐层逐行流式生成金字塔，显著降低超大 GRID 保存峰值内存；同步/异步视口块校验、句柄缓存和非阻塞 LOD 保持可用。文件布局仍兼容 v0.28/v0.29。</w:t>
       </w:r>
     </w:p>
     <w:p>
@@ -13936,6 +13936,118 @@
           <w:rFonts w:ascii="Calibri" w:hAnsi="Calibri" w:eastAsia="Microsoft YaHei"/>
         </w:rPr>
         <w:t>8192×4096、343.19 MiB DGRIDB：12 个相交块（48 MiB）冷校验约 58.56 ms，同一窗口缓存复查约 6 μs，完整原始节点扫描约 384.06 ms；冷窗口路径约快 6.56×。</w:t>
+      </w:r>
+    </w:p>
+    <w:p>
+      <w:pPr>
+        <w:pStyle w:val="Heading2"/>
+      </w:pPr>
+      <w:r>
+        <w:t>4.19 DGRIDB 流式金字塔保存</w:t>
+      </w:r>
+    </w:p>
+    <w:p>
+      <w:r>
+        <w:rPr>
+          <w:rFonts w:ascii="Calibri" w:hAnsi="Calibri" w:eastAsia="Microsoft YaHei"/>
+        </w:rPr>
+        <w:t>v0.32 保持 dt_grid_save_binary() 的 C ABI 和 DGRIDB 1 文件布局不变，但不再把全部 2× 平均金字塔层同时构造在内存。保存先计算每层尺寸、比例尺和 64 KiB 对齐偏移；第一层从源 GRID 读取，后续层每次从临时文件中的上一层读取两行，生成一行后直接写入当前层。峰值临时内存由约三分之一原始节点量降为约两条源行加一条输出行。</w:t>
+      </w:r>
+    </w:p>
+    <w:p>
+      <w:pPr>
+        <w:pStyle w:val="DterrainCode"/>
+        <w:shd w:fill="F2F4F7"/>
+      </w:pPr>
+      <w:r>
+        <w:rPr>
+          <w:rFonts w:ascii="Consolas" w:hAnsi="Consolas" w:eastAsia="Microsoft YaHei"/>
+          <w:sz w:val="17"/>
+        </w:rPr>
+        <w:t>dt_status s = dt_grid_save_binary(grid, "terrain.dgridb");</w:t>
+      </w:r>
+      <w:r>
+        <w:br/>
+      </w:r>
+      <w:r>
+        <w:rPr>
+          <w:rFonts w:ascii="Consolas" w:hAnsi="Consolas" w:eastAsia="Microsoft YaHei"/>
+          <w:sz w:val="17"/>
+        </w:rPr>
+        <w:t>// 公开调用方式与旧版本相同；保存后的文件仍包含：</w:t>
+      </w:r>
+      <w:r>
+        <w:br/>
+      </w:r>
+      <w:r>
+        <w:rPr>
+          <w:rFonts w:ascii="Consolas" w:hAnsi="Consolas" w:eastAsia="Microsoft YaHei"/>
+          <w:sz w:val="17"/>
+        </w:rPr>
+        <w:t>// 512×512 以内全幅概览、2× 多级金字塔、4 MiB 块校验和原始节点。</w:t>
+      </w:r>
+    </w:p>
+    <w:p>
+      <w:pPr>
+        <w:spacing w:before="100" w:after="160" w:line="288" w:lineRule="auto"/>
+        <w:ind w:left="230" w:right="230"/>
+        <w:shd w:fill="E8EEF5"/>
+      </w:pPr>
+      <w:r>
+        <w:rPr>
+          <w:rFonts w:ascii="Calibri" w:hAnsi="Calibri" w:eastAsia="Microsoft YaHei"/>
+          <w:b/>
+          <w:color w:val="1F4D78"/>
+        </w:rPr>
+        <w:t xml:space="preserve">同路径覆盖  </w:t>
+      </w:r>
+      <w:r>
+        <w:rPr>
+          <w:rFonts w:ascii="Calibri" w:hAnsi="Calibri" w:eastAsia="Microsoft YaHei"/>
+        </w:rPr>
+        <w:t>若 grid 本身映射自目标 DGRIDB，库会在临时文件完成后实体化当前 COW 修改并释放旧映射，原子替换成功后重新映射新原始节点和各级金字塔；句柄继续有效。任何失败都删除临时文件，原目标不被半成品覆盖。</w:t>
+      </w:r>
+    </w:p>
+    <w:p>
+      <w:pPr>
+        <w:spacing w:before="100" w:after="160" w:line="288" w:lineRule="auto"/>
+        <w:ind w:left="230" w:right="230"/>
+        <w:shd w:fill="FFF7E0"/>
+      </w:pPr>
+      <w:r>
+        <w:rPr>
+          <w:rFonts w:ascii="Calibri" w:hAnsi="Calibri" w:eastAsia="Microsoft YaHei"/>
+          <w:b/>
+          <w:color w:val="7A5A00"/>
+        </w:rPr>
+        <w:t xml:space="preserve">普通内存句柄  </w:t>
+      </w:r>
+      <w:r>
+        <w:rPr>
+          <w:rFonts w:ascii="Calibri" w:hAnsi="Calibri" w:eastAsia="Microsoft YaHei"/>
+        </w:rPr>
+        <w:t>普通内存 GRID 保存后不让当前句柄映射刚写出的金字塔，以免活动 Windows section 阻碍其他句柄覆盖同一目标。文件内金字塔完整存在；需要立即使用 LOD 时，销毁普通内存句柄并重新加载刚保存的 DGRIDB。</w:t>
+      </w:r>
+    </w:p>
+    <w:p>
+      <w:pPr>
+        <w:spacing w:before="100" w:after="160" w:line="288" w:lineRule="auto"/>
+        <w:ind w:left="230" w:right="230"/>
+        <w:shd w:fill="FFF7E0"/>
+      </w:pPr>
+      <w:r>
+        <w:rPr>
+          <w:rFonts w:ascii="Calibri" w:hAnsi="Calibri" w:eastAsia="Microsoft YaHei"/>
+          <w:b/>
+          <w:color w:val="7A5A00"/>
+        </w:rPr>
+        <w:t xml:space="preserve">本机基准  </w:t>
+      </w:r>
+      <w:r>
+        <w:rPr>
+          <w:rFonts w:ascii="Calibri" w:hAnsi="Calibri" w:eastAsia="Microsoft YaHei"/>
+        </w:rPr>
+        <w:t>8192×4096、343.19 MiB：旧完整金字塔临时数组理论值 85.00 MiB，v0.32 逐行缓冲约 0.078 MiB，保存约 0.576 s；4096×2048 由 21.00 MiB 降至 0.039 MiB，保存约 0.158 s。</w:t>
       </w:r>
     </w:p>
     <w:p>
@@ -18314,7 +18426,7 @@
         <w:rPr>
           <w:rFonts w:ascii="Calibri" w:hAnsi="Calibri" w:eastAsia="Microsoft YaHei"/>
         </w:rPr>
-        <w:t>测试覆盖生命周期、普通 TIN 动态编辑、DTIN/DTMESH/XYZ、TIN/GRID/等高线、等高线反向重建与高程冲突回滚、异步任务，以及 CDT 空网清理、外边界、孔洞、断裂线、交叉失败原子性、TIN→CDT、域内采样、CDT→GRID/等高线、共享顶点保护、批量新增/更新/删除、整批失败回滚和 DCDT 往返。局部坡面测试用解析平面验证 TIN/CDT 的 Z、世界梯度、坡度、坡向和法向；全幅测试覆盖坡度、坡向、阴影、CRS、旋转仿射、NoData、串并行一致和取消。土方、重采样、裁剪、窗口概览与世界视口测试分别锁定 ABI、解析结果、并行确定性、取消和非法参数；v0.30 覆盖异步概览同步等价、任务持有源生命周期、借用结果、取消及非法尺寸失败。v0.31 新增冷块、缓存命中、跨块窗口、异步生命周期/取消、概览前校验和定点损坏失败缓存测试。v0.29 二进制测试覆盖仿射、NoData、CRS、v0.28 无扩展兼容、多级金字塔选择、预取、块校验、载荷延迟损坏检测、写时复制失效、同路径原子提交、另存、损坏头和截断拒绝。剖面、多边形量测和 GDAL 构建另有数学与真实文件往返测试。</w:t>
+        <w:t>测试覆盖生命周期、普通 TIN 动态编辑、DTIN/DTMESH/XYZ、TIN/GRID/等高线、等高线反向重建与高程冲突回滚、异步任务，以及 CDT 空网清理、外边界、孔洞、断裂线、交叉失败原子性、TIN→CDT、域内采样、CDT→GRID/等高线、共享顶点保护、批量新增/更新/删除、整批失败回滚和 DCDT 往返。局部坡面测试用解析平面验证 TIN/CDT 的 Z、世界梯度、坡度、坡向和法向；全幅测试覆盖坡度、坡向、阴影、CRS、旋转仿射、NoData、串并行一致和取消。土方、重采样、裁剪、窗口概览与世界视口测试分别锁定 ABI、解析结果、并行确定性、取消和非法参数；v0.30 覆盖异步概览同步等价、任务持有源生命周期、借用结果、取消及非法尺寸失败。v0.31 新增冷块、缓存命中、跨块窗口、异步生命周期/取消、概览前校验和定点损坏失败缓存测试。v0.32 新增流式金字塔数值、映射修改后同路径覆盖、覆盖后重映射能力和另存回归。v0.29 二进制测试继续覆盖仿射、NoData、CRS、v0.28 无扩展兼容、多级金字塔选择、预取、块校验、载荷延迟损坏检测、写时复制失效、损坏头和截断拒绝。剖面、多边形量测和 GDAL 构建另有数学与真实文件往返测试。</w:t>
       </w:r>
     </w:p>
     <w:p>
@@ -19031,7 +19143,7 @@
         <w:color w:val="66727D"/>
         <w:sz w:val="18"/>
       </w:rPr>
-      <w:t xml:space="preserve">版本 0.31.0  |  第 </w:t>
+      <w:t xml:space="preserve">版本 0.32.0  |  第 </w:t>
     </w:r>
     <w:r>
       <w:rPr>

</xml_diff>

<commit_message>
feat: unify asynchronous GRID viewport requests
</commit_message>
<xml_diff>
--- a/docs/manuals/dterrain_DLL开发使用手册.docx
+++ b/docs/manuals/dterrain_DLL开发使用手册.docx
@@ -70,7 +70,7 @@
           <w:color w:val="1F4D78"/>
           <w:sz w:val="28"/>
         </w:rPr>
-        <w:t>面向测绘地形建模的 TIN、GRID、等高线转换、DGRIDB 映射/流式金字塔/按需校验、异步视口 LOD、动态编辑与空间查询</w:t>
+        <w:t>面向测绘地形建模的 TIN、GRID、等高线转换、DGRIDB 映射/流式金字塔/按需校验、统一异步视口流水线、动态编辑与空间查询</w:t>
       </w:r>
     </w:p>
     <w:p>
@@ -85,7 +85,7 @@
           <w:color w:val="203748"/>
           <w:sz w:val="22"/>
         </w:rPr>
-        <w:t>版本 0.32.0  |  2026-07-18</w:t>
+        <w:t>版本 0.33.0  |  2026-07-19</w:t>
       </w:r>
     </w:p>
     <w:p>
@@ -243,7 +243,7 @@
                 <w:rFonts w:ascii="Calibri" w:hAnsi="Calibri" w:eastAsia="Microsoft YaHei"/>
                 <w:sz w:val="18"/>
               </w:rPr>
-              <w:t>0.32.0</w:t>
+              <w:t>0.33.0</w:t>
             </w:r>
           </w:p>
         </w:tc>
@@ -298,7 +298,7 @@
                 <w:rFonts w:ascii="Calibri" w:hAnsi="Calibri" w:eastAsia="Microsoft YaHei"/>
                 <w:sz w:val="18"/>
               </w:rPr>
-              <w:t>2026-07-18</w:t>
+              <w:t>2026-07-19</w:t>
             </w:r>
           </w:p>
         </w:tc>
@@ -643,7 +643,7 @@
         <w:rPr>
           <w:rFonts w:ascii="Calibri" w:hAnsi="Calibri" w:eastAsia="Microsoft YaHei"/>
         </w:rPr>
-        <w:t>本手册对应 dterrain 0.32.0：DGRIDB 保存改为逐层逐行流式生成金字塔，显著降低超大 GRID 保存峰值内存；同步/异步视口块校验、句柄缓存和非阻塞 LOD 保持可用。文件布局仍兼容 v0.28/v0.29。</w:t>
+        <w:t>本手册对应 dterrain 0.33.0：新增统一异步视口流水线，在一个可取消任务中完成世界窗口映射、预取、可选块校验和 LOD，并返回统一结果；v0.32 流式金字塔保存及旧同步/异步接口保持兼容。</w:t>
       </w:r>
     </w:p>
     <w:p>
@@ -14048,6 +14048,328 @@
           <w:rFonts w:ascii="Calibri" w:hAnsi="Calibri" w:eastAsia="Microsoft YaHei"/>
         </w:rPr>
         <w:t>8192×4096、343.19 MiB：旧完整金字塔临时数组理论值 85.00 MiB，v0.32 逐行缓冲约 0.078 MiB，保存约 0.576 s；4096×2048 由 21.00 MiB 降至 0.039 MiB，保存约 0.158 s。</w:t>
+      </w:r>
+    </w:p>
+    <w:p>
+      <w:pPr>
+        <w:pStyle w:val="Heading2"/>
+      </w:pPr>
+      <w:r>
+        <w:t>4.20 统一异步视口流水线</w:t>
+      </w:r>
+    </w:p>
+    <w:p>
+      <w:r>
+        <w:rPr>
+          <w:rFonts w:ascii="Calibri" w:hAnsi="Calibri" w:eastAsia="Microsoft YaHei"/>
+        </w:rPr>
+        <w:t>v0.33 的 dt_grid_read_view_async() 把世界坐标视口映射、操作系统预取、可选 DGRIDB 块校验和金字塔/精确 LOD 合并为一个任务。调用方只提交 dt_grid_view_request_options；任务成功后以 DT_TASK_RESULT_GRID_VIEW 标识，dt_task_get_grid_view_result() 同时返回实际源窗口、任务自有只读像素、LOD 统计和可选校验摘要。旧窗口、预取、校验和异步概览接口继续可独立使用。</w:t>
+      </w:r>
+    </w:p>
+    <w:p>
+      <w:pPr>
+        <w:pStyle w:val="DterrainCode"/>
+        <w:shd w:fill="F2F4F7"/>
+      </w:pPr>
+      <w:r>
+        <w:rPr>
+          <w:rFonts w:ascii="Consolas" w:hAnsi="Consolas" w:eastAsia="Microsoft YaHei"/>
+          <w:sz w:val="17"/>
+        </w:rPr>
+        <w:t>dt_grid_view_request_options request{};</w:t>
+      </w:r>
+      <w:r>
+        <w:br/>
+      </w:r>
+      <w:r>
+        <w:rPr>
+          <w:rFonts w:ascii="Consolas" w:hAnsi="Consolas" w:eastAsia="Microsoft YaHei"/>
+          <w:sz w:val="17"/>
+        </w:rPr>
+        <w:t>request.struct_size = sizeof(request);</w:t>
+      </w:r>
+      <w:r>
+        <w:br/>
+      </w:r>
+      <w:r>
+        <w:rPr>
+          <w:rFonts w:ascii="Consolas" w:hAnsi="Consolas" w:eastAsia="Microsoft YaHei"/>
+          <w:sz w:val="17"/>
+        </w:rPr>
+        <w:t>request.flags = DT_GRID_VIEW_REQUEST_PREFETCH_SOURCE |</w:t>
+      </w:r>
+      <w:r>
+        <w:br/>
+      </w:r>
+      <w:r>
+        <w:rPr>
+          <w:rFonts w:ascii="Consolas" w:hAnsi="Consolas" w:eastAsia="Microsoft YaHei"/>
+          <w:sz w:val="17"/>
+        </w:rPr>
+        <w:t xml:space="preserve">                DT_GRID_VIEW_REQUEST_VERIFY_SOURCE_BLOCKS |</w:t>
+      </w:r>
+      <w:r>
+        <w:br/>
+      </w:r>
+      <w:r>
+        <w:rPr>
+          <w:rFonts w:ascii="Consolas" w:hAnsi="Consolas" w:eastAsia="Microsoft YaHei"/>
+          <w:sz w:val="17"/>
+        </w:rPr>
+        <w:t xml:space="preserve">                DT_GRID_VIEW_REQUEST_USE_PYRAMID;</w:t>
+      </w:r>
+      <w:r>
+        <w:br/>
+      </w:r>
+      <w:r>
+        <w:rPr>
+          <w:rFonts w:ascii="Consolas" w:hAnsi="Consolas" w:eastAsia="Microsoft YaHei"/>
+          <w:sz w:val="17"/>
+        </w:rPr>
+        <w:t>request.world_bounds = {xmin, ymin, xmax, ymax};</w:t>
+      </w:r>
+      <w:r>
+        <w:br/>
+      </w:r>
+      <w:r>
+        <w:rPr>
+          <w:rFonts w:ascii="Consolas" w:hAnsi="Consolas" w:eastAsia="Microsoft YaHei"/>
+          <w:sz w:val="17"/>
+        </w:rPr>
+        <w:t>request.output_width = 512;</w:t>
+      </w:r>
+      <w:r>
+        <w:br/>
+      </w:r>
+      <w:r>
+        <w:rPr>
+          <w:rFonts w:ascii="Consolas" w:hAnsi="Consolas" w:eastAsia="Microsoft YaHei"/>
+          <w:sz w:val="17"/>
+        </w:rPr>
+        <w:t>request.output_height = 384;</w:t>
+      </w:r>
+      <w:r>
+        <w:br/>
+      </w:r>
+      <w:r>
+        <w:rPr>
+          <w:rFonts w:ascii="Consolas" w:hAnsi="Consolas" w:eastAsia="Microsoft YaHei"/>
+          <w:sz w:val="17"/>
+        </w:rPr>
+        <w:t>request.padding_nodes = 2;</w:t>
+      </w:r>
+      <w:r>
+        <w:br/>
+      </w:r>
+      <w:r>
+        <w:rPr>
+          <w:rFonts w:ascii="Consolas" w:hAnsi="Consolas" w:eastAsia="Microsoft YaHei"/>
+          <w:sz w:val="17"/>
+        </w:rPr>
+        <w:t>request.overview_method = DT_GRID_OVERVIEW_AVERAGE;</w:t>
+      </w:r>
+      <w:r>
+        <w:br/>
+      </w:r>
+      <w:r>
+        <w:rPr>
+          <w:rFonts w:ascii="Consolas" w:hAnsi="Consolas" w:eastAsia="Microsoft YaHei"/>
+          <w:sz w:val="17"/>
+        </w:rPr>
+      </w:r>
+      <w:r>
+        <w:br/>
+      </w:r>
+      <w:r>
+        <w:rPr>
+          <w:rFonts w:ascii="Consolas" w:hAnsi="Consolas" w:eastAsia="Microsoft YaHei"/>
+          <w:sz w:val="17"/>
+        </w:rPr>
+        <w:t>dt_task_handle task = nullptr;</w:t>
+      </w:r>
+      <w:r>
+        <w:br/>
+      </w:r>
+      <w:r>
+        <w:rPr>
+          <w:rFonts w:ascii="Consolas" w:hAnsi="Consolas" w:eastAsia="Microsoft YaHei"/>
+          <w:sz w:val="17"/>
+        </w:rPr>
+        <w:t>dt_grid_read_view_async(grid, &amp;request, &amp;task);</w:t>
+      </w:r>
+      <w:r>
+        <w:br/>
+      </w:r>
+      <w:r>
+        <w:rPr>
+          <w:rFonts w:ascii="Consolas" w:hAnsi="Consolas" w:eastAsia="Microsoft YaHei"/>
+          <w:sz w:val="17"/>
+        </w:rPr>
+        <w:t>int32_t completed = 0;</w:t>
+      </w:r>
+      <w:r>
+        <w:br/>
+      </w:r>
+      <w:r>
+        <w:rPr>
+          <w:rFonts w:ascii="Consolas" w:hAnsi="Consolas" w:eastAsia="Microsoft YaHei"/>
+          <w:sz w:val="17"/>
+        </w:rPr>
+        <w:t>dt_task_wait(task, UINT32_MAX, &amp;completed);</w:t>
+      </w:r>
+      <w:r>
+        <w:br/>
+      </w:r>
+      <w:r>
+        <w:rPr>
+          <w:rFonts w:ascii="Consolas" w:hAnsi="Consolas" w:eastAsia="Microsoft YaHei"/>
+          <w:sz w:val="17"/>
+        </w:rPr>
+        <w:t>dt_grid_view_result result{};</w:t>
+      </w:r>
+      <w:r>
+        <w:br/>
+      </w:r>
+      <w:r>
+        <w:rPr>
+          <w:rFonts w:ascii="Consolas" w:hAnsi="Consolas" w:eastAsia="Microsoft YaHei"/>
+          <w:sz w:val="17"/>
+        </w:rPr>
+        <w:t>result.struct_size = sizeof(result);</w:t>
+      </w:r>
+      <w:r>
+        <w:br/>
+      </w:r>
+      <w:r>
+        <w:rPr>
+          <w:rFonts w:ascii="Consolas" w:hAnsi="Consolas" w:eastAsia="Microsoft YaHei"/>
+          <w:sz w:val="17"/>
+        </w:rPr>
+        <w:t>if (dt_task_get_grid_view_result(task, &amp;result) == DT_OK) {</w:t>
+      </w:r>
+      <w:r>
+        <w:br/>
+      </w:r>
+      <w:r>
+        <w:rPr>
+          <w:rFonts w:ascii="Consolas" w:hAnsi="Consolas" w:eastAsia="Microsoft YaHei"/>
+          <w:sz w:val="17"/>
+        </w:rPr>
+        <w:t xml:space="preserve">    upload_preview(result.values, result.width,</w:t>
+      </w:r>
+      <w:r>
+        <w:br/>
+      </w:r>
+      <w:r>
+        <w:rPr>
+          <w:rFonts w:ascii="Consolas" w:hAnsi="Consolas" w:eastAsia="Microsoft YaHei"/>
+          <w:sz w:val="17"/>
+        </w:rPr>
+        <w:t xml:space="preserve">                   result.height, result.row_stride);</w:t>
+      </w:r>
+      <w:r>
+        <w:br/>
+      </w:r>
+      <w:r>
+        <w:rPr>
+          <w:rFonts w:ascii="Consolas" w:hAnsi="Consolas" w:eastAsia="Microsoft YaHei"/>
+          <w:sz w:val="17"/>
+        </w:rPr>
+        <w:t>}</w:t>
+      </w:r>
+      <w:r>
+        <w:br/>
+      </w:r>
+      <w:r>
+        <w:rPr>
+          <w:rFonts w:ascii="Consolas" w:hAnsi="Consolas" w:eastAsia="Microsoft YaHei"/>
+          <w:sz w:val="17"/>
+        </w:rPr>
+        <w:t>dt_task_destroy(task);</w:t>
+      </w:r>
+    </w:p>
+    <w:p>
+      <w:pPr>
+        <w:spacing w:before="100" w:after="160" w:line="288" w:lineRule="auto"/>
+        <w:ind w:left="230" w:right="230"/>
+        <w:shd w:fill="E8EEF5"/>
+      </w:pPr>
+      <w:r>
+        <w:rPr>
+          <w:rFonts w:ascii="Calibri" w:hAnsi="Calibri" w:eastAsia="Microsoft YaHei"/>
+          <w:b/>
+          <w:color w:val="1F4D78"/>
+        </w:rPr>
+        <w:t xml:space="preserve">进度与失败原子性  </w:t>
+      </w:r>
+      <w:r>
+        <w:rPr>
+          <w:rFonts w:ascii="Calibri" w:hAnsi="Calibri" w:eastAsia="Microsoft YaHei"/>
+        </w:rPr>
+        <w:t>请求校验时，校验占进度 0～30%，LOD 占 30～100%；未请求校验时 LOD 占全部进度。世界视口无交集、校验损坏、非法尺寸和协作取消均不会发布部分像素，getter 只接受完整成功结果。</w:t>
+      </w:r>
+    </w:p>
+    <w:p>
+      <w:pPr>
+        <w:spacing w:before="100" w:after="160" w:line="288" w:lineRule="auto"/>
+        <w:ind w:left="230" w:right="230"/>
+        <w:shd w:fill="FFF7E0"/>
+      </w:pPr>
+      <w:r>
+        <w:rPr>
+          <w:rFonts w:ascii="Calibri" w:hAnsi="Calibri" w:eastAsia="Microsoft YaHei"/>
+          <w:b/>
+          <w:color w:val="7A5A00"/>
+        </w:rPr>
+        <w:t xml:space="preserve">选项与能力  </w:t>
+      </w:r>
+      <w:r>
+        <w:rPr>
+          <w:rFonts w:ascii="Calibri" w:hAnsi="Calibri" w:eastAsia="Microsoft YaHei"/>
+        </w:rPr>
+        <w:t>STRICT_NODATA 和 USE_PYRAMID 对应显示采样策略；PREFETCH_SOURCE 是最佳努力提示；VERIFY_SOURCE_BLOCKS 要求句柄声明 DT_GRID_HAS_BLOCK_CHECKSUMS，否则任务以 DT_E_UNSUPPORTED 失败。请求选项固定 96 字节，结果中的 values 只在 task 销毁前有效。</w:t>
+      </w:r>
+    </w:p>
+    <w:p>
+      <w:pPr>
+        <w:spacing w:before="100" w:after="160" w:line="288" w:lineRule="auto"/>
+        <w:ind w:left="230" w:right="230"/>
+        <w:shd w:fill="E8EEF5"/>
+      </w:pPr>
+      <w:r>
+        <w:rPr>
+          <w:rFonts w:ascii="Calibri" w:hAnsi="Calibri" w:eastAsia="Microsoft YaHei"/>
+          <w:b/>
+          <w:color w:val="1F4D78"/>
+        </w:rPr>
+        <w:t xml:space="preserve">GUI 集成  </w:t>
+      </w:r>
+      <w:r>
+        <w:rPr>
+          <w:rFonts w:ascii="Calibri" w:hAnsi="Calibri" w:eastAsia="Microsoft YaHei"/>
+        </w:rPr>
+        <w:t>演示程序仍用同步窗口查询建立轻量去重键，但后台统一任务会重新计算并返回实际窗口，发布前再次核对。上一帧保留、25 ms 轮询、最多三个退休任务、过期取消和同键失败抑制保持不变。</w:t>
+      </w:r>
+    </w:p>
+    <w:p>
+      <w:pPr>
+        <w:spacing w:before="100" w:after="160" w:line="288" w:lineRule="auto"/>
+        <w:ind w:left="230" w:right="230"/>
+        <w:shd w:fill="FFF7E0"/>
+      </w:pPr>
+      <w:r>
+        <w:rPr>
+          <w:rFonts w:ascii="Calibri" w:hAnsi="Calibri" w:eastAsia="Microsoft YaHei"/>
+          <w:b/>
+          <w:color w:val="7A5A00"/>
+        </w:rPr>
+        <w:t xml:space="preserve">本机基准  </w:t>
+      </w:r>
+      <w:r>
+        <w:rPr>
+          <w:rFonts w:ascii="Calibri" w:hAnsi="Calibri" w:eastAsia="Microsoft YaHei"/>
+        </w:rPr>
+        <w:t>4096×4096、1024×768 源窗口到 512×512：同步局部 LOD 约 2.28 ms，统一任务提交 54.3 μs、后台完成 2.65 ms，与同步结果抽样校验和误差为 0。</w:t>
       </w:r>
     </w:p>
     <w:p>
@@ -18426,7 +18748,7 @@
         <w:rPr>
           <w:rFonts w:ascii="Calibri" w:hAnsi="Calibri" w:eastAsia="Microsoft YaHei"/>
         </w:rPr>
-        <w:t>测试覆盖生命周期、普通 TIN 动态编辑、DTIN/DTMESH/XYZ、TIN/GRID/等高线、等高线反向重建与高程冲突回滚、异步任务，以及 CDT 空网清理、外边界、孔洞、断裂线、交叉失败原子性、TIN→CDT、域内采样、CDT→GRID/等高线、共享顶点保护、批量新增/更新/删除、整批失败回滚和 DCDT 往返。局部坡面测试用解析平面验证 TIN/CDT 的 Z、世界梯度、坡度、坡向和法向；全幅测试覆盖坡度、坡向、阴影、CRS、旋转仿射、NoData、串并行一致和取消。土方、重采样、裁剪、窗口概览与世界视口测试分别锁定 ABI、解析结果、并行确定性、取消和非法参数；v0.30 覆盖异步概览同步等价、任务持有源生命周期、借用结果、取消及非法尺寸失败。v0.31 新增冷块、缓存命中、跨块窗口、异步生命周期/取消、概览前校验和定点损坏失败缓存测试。v0.32 新增流式金字塔数值、映射修改后同路径覆盖、覆盖后重映射能力和另存回归。v0.29 二进制测试继续覆盖仿射、NoData、CRS、v0.28 无扩展兼容、多级金字塔选择、预取、块校验、载荷延迟损坏检测、写时复制失效、损坏头和截断拒绝。剖面、多边形量测和 GDAL 构建另有数学与真实文件往返测试。</w:t>
+        <w:t>测试覆盖生命周期、普通 TIN 动态编辑、DTIN/DTMESH/XYZ、TIN/GRID/等高线、等高线反向重建与高程冲突回滚、异步任务，以及 CDT 空网清理、外边界、孔洞、断裂线、交叉失败原子性、TIN→CDT、域内采样、CDT→GRID/等高线、共享顶点保护、批量新增/更新/删除、整批失败回滚和 DCDT 往返。局部坡面测试用解析平面验证 TIN/CDT 的 Z、世界梯度、坡度、坡向和法向；全幅测试覆盖坡度、坡向、阴影、CRS、旋转仿射、NoData、串并行一致和取消。土方、重采样、裁剪、窗口概览与世界视口测试分别锁定 ABI、解析结果、并行确定性、取消和非法参数；v0.30 覆盖异步概览同步等价、任务持有源生命周期、借用结果、取消及非法尺寸失败。v0.31 新增冷块、缓存命中、跨块窗口、异步生命周期/取消、概览前校验和定点损坏失败缓存测试。v0.32 新增流式金字塔数值、映射修改后同路径覆盖、覆盖后重映射能力和另存回归。v0.33 新增统一视口任务的源窗口一致性、预取/校验/金字塔标志、进度、借用结果、无交集失败及定点损坏不发布测试。v0.29 二进制测试继续覆盖仿射、NoData、CRS、v0.28 无扩展兼容、多级金字塔选择、预取、块校验、载荷延迟损坏检测、写时复制失效、损坏头和截断拒绝。剖面、多边形量测和 GDAL 构建另有数学与真实文件往返测试。</w:t>
       </w:r>
     </w:p>
     <w:p>
@@ -19143,7 +19465,7 @@
         <w:color w:val="66727D"/>
         <w:sz w:val="18"/>
       </w:rPr>
-      <w:t xml:space="preserve">版本 0.32.0  |  第 </w:t>
+      <w:t xml:space="preserve">版本 0.33.0  |  第 </w:t>
     </w:r>
     <w:r>
       <w:rPr>

</xml_diff>

<commit_message>
feat: add shared GRID viewport tile cache
</commit_message>
<xml_diff>
--- a/docs/manuals/dterrain_DLL开发使用手册.docx
+++ b/docs/manuals/dterrain_DLL开发使用手册.docx
@@ -70,7 +70,7 @@
           <w:color w:val="1F4D78"/>
           <w:sz w:val="28"/>
         </w:rPr>
-        <w:t>面向测绘地形建模的 TIN、GRID、等高线转换、DGRIDB 映射/流式金字塔/按需校验、统一异步视口流水线、动态编辑与空间查询</w:t>
+        <w:t>面向测绘地形建模的 TIN、GRID、等高线转换、DGRIDB 映射/流式金字塔/按需校验、二维瓦片缓存与统一异步视口、动态编辑与空间查询</w:t>
       </w:r>
     </w:p>
     <w:p>
@@ -85,7 +85,7 @@
           <w:color w:val="203748"/>
           <w:sz w:val="22"/>
         </w:rPr>
-        <w:t>版本 0.33.0  |  2026-07-19</w:t>
+        <w:t>版本 0.34.0  |  2026-07-19</w:t>
       </w:r>
     </w:p>
     <w:p>
@@ -243,7 +243,7 @@
                 <w:rFonts w:ascii="Calibri" w:hAnsi="Calibri" w:eastAsia="Microsoft YaHei"/>
                 <w:sz w:val="18"/>
               </w:rPr>
-              <w:t>0.33.0</w:t>
+              <w:t>0.34.0</w:t>
             </w:r>
           </w:p>
         </w:tc>
@@ -643,7 +643,7 @@
         <w:rPr>
           <w:rFonts w:ascii="Calibri" w:hAnsi="Calibri" w:eastAsia="Microsoft YaHei"/>
         </w:rPr>
-        <w:t>本手册对应 dterrain 0.33.0：新增统一异步视口流水线，在一个可取消任务中完成世界窗口映射、预取、可选块校验和 LOD，并返回统一结果；v0.32 流式金字塔保存及旧同步/异步接口保持兼容。</w:t>
+        <w:t>本手册对应 dterrain 0.34.0：新增二维空间瓦片目录、视口中心优先调度、跨请求在途合并和容量受控 LRU 淘汰；v0.33 统一异步视口流水线及旧同步/异步接口保持兼容。</w:t>
       </w:r>
     </w:p>
     <w:p>
@@ -822,6 +822,17 @@
           <w:rFonts w:ascii="Calibri" w:hAnsi="Calibri" w:eastAsia="Microsoft YaHei"/>
         </w:rPr>
         <w:t>DGRIDB 二进制 GRID 支持写时复制映射、持久全幅概览、2× 多级金字塔、视口预取、4 MiB 块校验、原子保存以及 CRS/NoData 往返。</w:t>
+      </w:r>
+    </w:p>
+    <w:p>
+      <w:pPr>
+        <w:pStyle w:val="ListBullet"/>
+      </w:pPr>
+      <w:r>
+        <w:rPr>
+          <w:rFonts w:ascii="Calibri" w:hAnsi="Calibri" w:eastAsia="Microsoft YaHei"/>
+        </w:rPr>
+        <w:t>二维空间瓦片目录按视口中心优先生产，跨请求共享完成或在途瓦片，并以字节/数量双限额执行 LRU 淘汰。</w:t>
       </w:r>
     </w:p>
     <w:p>
@@ -14374,6 +14385,336 @@
     </w:p>
     <w:p>
       <w:pPr>
+        <w:pStyle w:val="Heading2"/>
+      </w:pPr>
+      <w:r>
+        <w:t>4.21 二维空间瓦片缓存与跨请求合并</w:t>
+      </w:r>
+    </w:p>
+    <w:p>
+      <w:r>
+        <w:rPr>
+          <w:rFonts w:ascii="Calibri" w:hAnsi="Calibri" w:eastAsia="Microsoft YaHei"/>
+        </w:rPr>
+        <w:t>v0.34 的 dt_grid_view_cache_handle 在统一视口任务之上增加可复用显示缓存。目录键包含 GRID generation、2 次幂 LOD、二维瓦片坐标、概览方法和影响数值的 NoData/金字塔策略。dt_grid_read_view_cached_async() 仍返回 DT_TASK_RESULT_GRID_VIEW，并继续用 dt_task_get_grid_view_result() 取得任务自有像素。缓存路径明确设置 DT_GRID_OVERVIEW_USED_TILE_CACHE，不替代精确分析。</w:t>
+      </w:r>
+    </w:p>
+    <w:p>
+      <w:pPr>
+        <w:pStyle w:val="DterrainCode"/>
+        <w:shd w:fill="F2F4F7"/>
+      </w:pPr>
+      <w:r>
+        <w:rPr>
+          <w:rFonts w:ascii="Consolas" w:hAnsi="Consolas" w:eastAsia="Microsoft YaHei"/>
+          <w:sz w:val="17"/>
+        </w:rPr>
+        <w:t>dt_grid_view_cache_options cache_options{};</w:t>
+      </w:r>
+      <w:r>
+        <w:br/>
+      </w:r>
+      <w:r>
+        <w:rPr>
+          <w:rFonts w:ascii="Consolas" w:hAnsi="Consolas" w:eastAsia="Microsoft YaHei"/>
+          <w:sz w:val="17"/>
+        </w:rPr>
+        <w:t>cache_options.struct_size = sizeof(cache_options);</w:t>
+      </w:r>
+      <w:r>
+        <w:br/>
+      </w:r>
+      <w:r>
+        <w:rPr>
+          <w:rFonts w:ascii="Consolas" w:hAnsi="Consolas" w:eastAsia="Microsoft YaHei"/>
+          <w:sz w:val="17"/>
+        </w:rPr>
+        <w:t>cache_options.tile_width = cache_options.tile_height = 128;</w:t>
+      </w:r>
+      <w:r>
+        <w:br/>
+      </w:r>
+      <w:r>
+        <w:rPr>
+          <w:rFonts w:ascii="Consolas" w:hAnsi="Consolas" w:eastAsia="Microsoft YaHei"/>
+          <w:sz w:val="17"/>
+        </w:rPr>
+        <w:t>cache_options.worker_count = 4;</w:t>
+      </w:r>
+      <w:r>
+        <w:br/>
+      </w:r>
+      <w:r>
+        <w:rPr>
+          <w:rFonts w:ascii="Consolas" w:hAnsi="Consolas" w:eastAsia="Microsoft YaHei"/>
+          <w:sz w:val="17"/>
+        </w:rPr>
+        <w:t>cache_options.maximum_bytes = 128ULL * 1024ULL * 1024ULL;</w:t>
+      </w:r>
+      <w:r>
+        <w:br/>
+      </w:r>
+      <w:r>
+        <w:rPr>
+          <w:rFonts w:ascii="Consolas" w:hAnsi="Consolas" w:eastAsia="Microsoft YaHei"/>
+          <w:sz w:val="17"/>
+        </w:rPr>
+        <w:t>cache_options.maximum_tiles = 4096;</w:t>
+      </w:r>
+      <w:r>
+        <w:br/>
+      </w:r>
+      <w:r>
+        <w:rPr>
+          <w:rFonts w:ascii="Consolas" w:hAnsi="Consolas" w:eastAsia="Microsoft YaHei"/>
+          <w:sz w:val="17"/>
+        </w:rPr>
+      </w:r>
+      <w:r>
+        <w:br/>
+      </w:r>
+      <w:r>
+        <w:rPr>
+          <w:rFonts w:ascii="Consolas" w:hAnsi="Consolas" w:eastAsia="Microsoft YaHei"/>
+          <w:sz w:val="17"/>
+        </w:rPr>
+        <w:t>dt_grid_view_cache_handle cache = nullptr;</w:t>
+      </w:r>
+      <w:r>
+        <w:br/>
+      </w:r>
+      <w:r>
+        <w:rPr>
+          <w:rFonts w:ascii="Consolas" w:hAnsi="Consolas" w:eastAsia="Microsoft YaHei"/>
+          <w:sz w:val="17"/>
+        </w:rPr>
+        <w:t>dt_grid_view_cache_create(grid, &amp;cache_options, &amp;cache);</w:t>
+      </w:r>
+      <w:r>
+        <w:br/>
+      </w:r>
+      <w:r>
+        <w:rPr>
+          <w:rFonts w:ascii="Consolas" w:hAnsi="Consolas" w:eastAsia="Microsoft YaHei"/>
+          <w:sz w:val="17"/>
+        </w:rPr>
+      </w:r>
+      <w:r>
+        <w:br/>
+      </w:r>
+      <w:r>
+        <w:rPr>
+          <w:rFonts w:ascii="Consolas" w:hAnsi="Consolas" w:eastAsia="Microsoft YaHei"/>
+          <w:sz w:val="17"/>
+        </w:rPr>
+        <w:t>dt_task_handle task = nullptr;</w:t>
+      </w:r>
+      <w:r>
+        <w:br/>
+      </w:r>
+      <w:r>
+        <w:rPr>
+          <w:rFonts w:ascii="Consolas" w:hAnsi="Consolas" w:eastAsia="Microsoft YaHei"/>
+          <w:sz w:val="17"/>
+        </w:rPr>
+        <w:t>dt_grid_read_view_cached_async(cache, &amp;request, &amp;task);</w:t>
+      </w:r>
+      <w:r>
+        <w:br/>
+      </w:r>
+      <w:r>
+        <w:rPr>
+          <w:rFonts w:ascii="Consolas" w:hAnsi="Consolas" w:eastAsia="Microsoft YaHei"/>
+          <w:sz w:val="17"/>
+        </w:rPr>
+        <w:t>dt_task_wait(task, UINT32_MAX, &amp;completed);</w:t>
+      </w:r>
+      <w:r>
+        <w:br/>
+      </w:r>
+      <w:r>
+        <w:rPr>
+          <w:rFonts w:ascii="Consolas" w:hAnsi="Consolas" w:eastAsia="Microsoft YaHei"/>
+          <w:sz w:val="17"/>
+        </w:rPr>
+        <w:t>dt_grid_view_result view{};</w:t>
+      </w:r>
+      <w:r>
+        <w:br/>
+      </w:r>
+      <w:r>
+        <w:rPr>
+          <w:rFonts w:ascii="Consolas" w:hAnsi="Consolas" w:eastAsia="Microsoft YaHei"/>
+          <w:sz w:val="17"/>
+        </w:rPr>
+        <w:t>view.struct_size = sizeof(view);</w:t>
+      </w:r>
+      <w:r>
+        <w:br/>
+      </w:r>
+      <w:r>
+        <w:rPr>
+          <w:rFonts w:ascii="Consolas" w:hAnsi="Consolas" w:eastAsia="Microsoft YaHei"/>
+          <w:sz w:val="17"/>
+        </w:rPr>
+        <w:t>dt_task_get_grid_view_result(task, &amp;view);</w:t>
+      </w:r>
+      <w:r>
+        <w:br/>
+      </w:r>
+      <w:r>
+        <w:rPr>
+          <w:rFonts w:ascii="Consolas" w:hAnsi="Consolas" w:eastAsia="Microsoft YaHei"/>
+          <w:sz w:val="17"/>
+        </w:rPr>
+        <w:t>// view.lod_scale / tile_count / reused_tile_count</w:t>
+      </w:r>
+      <w:r>
+        <w:br/>
+      </w:r>
+      <w:r>
+        <w:rPr>
+          <w:rFonts w:ascii="Consolas" w:hAnsi="Consolas" w:eastAsia="Microsoft YaHei"/>
+          <w:sz w:val="17"/>
+        </w:rPr>
+        <w:t>dt_task_destroy(task);</w:t>
+      </w:r>
+      <w:r>
+        <w:br/>
+      </w:r>
+      <w:r>
+        <w:rPr>
+          <w:rFonts w:ascii="Consolas" w:hAnsi="Consolas" w:eastAsia="Microsoft YaHei"/>
+          <w:sz w:val="17"/>
+        </w:rPr>
+      </w:r>
+      <w:r>
+        <w:br/>
+      </w:r>
+      <w:r>
+        <w:rPr>
+          <w:rFonts w:ascii="Consolas" w:hAnsi="Consolas" w:eastAsia="Microsoft YaHei"/>
+          <w:sz w:val="17"/>
+        </w:rPr>
+        <w:t>dt_grid_view_cache_statistics stats{};</w:t>
+      </w:r>
+      <w:r>
+        <w:br/>
+      </w:r>
+      <w:r>
+        <w:rPr>
+          <w:rFonts w:ascii="Consolas" w:hAnsi="Consolas" w:eastAsia="Microsoft YaHei"/>
+          <w:sz w:val="17"/>
+        </w:rPr>
+        <w:t>stats.struct_size = sizeof(stats);</w:t>
+      </w:r>
+      <w:r>
+        <w:br/>
+      </w:r>
+      <w:r>
+        <w:rPr>
+          <w:rFonts w:ascii="Consolas" w:hAnsi="Consolas" w:eastAsia="Microsoft YaHei"/>
+          <w:sz w:val="17"/>
+        </w:rPr>
+        <w:t>dt_grid_view_cache_get_statistics(cache, &amp;stats);</w:t>
+      </w:r>
+      <w:r>
+        <w:br/>
+      </w:r>
+      <w:r>
+        <w:rPr>
+          <w:rFonts w:ascii="Consolas" w:hAnsi="Consolas" w:eastAsia="Microsoft YaHei"/>
+          <w:sz w:val="17"/>
+        </w:rPr>
+        <w:t>dt_grid_view_cache_destroy(cache);</w:t>
+      </w:r>
+    </w:p>
+    <w:p>
+      <w:pPr>
+        <w:spacing w:before="100" w:after="160" w:line="288" w:lineRule="auto"/>
+        <w:ind w:left="230" w:right="230"/>
+        <w:shd w:fill="E8EEF5"/>
+      </w:pPr>
+      <w:r>
+        <w:rPr>
+          <w:rFonts w:ascii="Calibri" w:hAnsi="Calibri" w:eastAsia="Microsoft YaHei"/>
+          <w:b/>
+          <w:color w:val="1F4D78"/>
+        </w:rPr>
+        <w:t xml:space="preserve">调度与合并  </w:t>
+      </w:r>
+      <w:r>
+        <w:rPr>
+          <w:rFonts w:ascii="Calibri" w:hAnsi="Calibri" w:eastAsia="Microsoft YaHei"/>
+        </w:rPr>
+        <w:t>每个视口按瓦片中心到视口中心的距离排序；共享优先队列允许新视口的中心瓦片越过旧视口边缘瓦片。相同键若已排队或加载，后来的任务只增加需求计数并等待同一结果，不重复聚合。单个订阅者取消不会中断仍被其他请求需要的瓦片。</w:t>
+      </w:r>
+    </w:p>
+    <w:p>
+      <w:pPr>
+        <w:spacing w:before="100" w:after="160" w:line="288" w:lineRule="auto"/>
+        <w:ind w:left="230" w:right="230"/>
+        <w:shd w:fill="FFF7E0"/>
+      </w:pPr>
+      <w:r>
+        <w:rPr>
+          <w:rFonts w:ascii="Calibri" w:hAnsi="Calibri" w:eastAsia="Microsoft YaHei"/>
+          <w:b/>
+          <w:color w:val="7A5A00"/>
+        </w:rPr>
+        <w:t xml:space="preserve">容量与生命周期  </w:t>
+      </w:r>
+      <w:r>
+        <w:rPr>
+          <w:rFonts w:ascii="Calibri" w:hAnsi="Calibri" w:eastAsia="Microsoft YaHei"/>
+        </w:rPr>
+        <w:t>默认 128×128、128 MiB、4096 项、最多 8 个自动生产线程；完成项同时按字节和数量 LRU 淘汰。活动任务以 shared_ptr 借用瓦片和缓存实现，所以目录项或公开缓存句柄删除后，已提交任务仍安全。GRID generation 改变后自动使用新键。</w:t>
+      </w:r>
+    </w:p>
+    <w:p>
+      <w:pPr>
+        <w:spacing w:before="100" w:after="160" w:line="288" w:lineRule="auto"/>
+        <w:ind w:left="230" w:right="230"/>
+        <w:shd w:fill="FFF7E0"/>
+      </w:pPr>
+      <w:r>
+        <w:rPr>
+          <w:rFonts w:ascii="Calibri" w:hAnsi="Calibri" w:eastAsia="Microsoft YaHei"/>
+          <w:b/>
+          <w:color w:val="7A5A00"/>
+        </w:rPr>
+        <w:t xml:space="preserve">结果语义  </w:t>
+      </w:r>
+      <w:r>
+        <w:rPr>
+          <w:rFonts w:ascii="Calibri" w:hAnsi="Calibri" w:eastAsia="Microsoft YaHei"/>
+        </w:rPr>
+        <w:t>缓存 LOD 是交互显示近似。USED_TILE_CACHE 表示该路径，CACHE_HIT 和 CACHE_COALESCED 分别表示命中完成项和加入在途项；overview 统计只覆盖返回像素，不设置 EXACT_SOURCE_STATISTICS。体积、坡度、等高线、转换和导出继续使用完整 GRID。</w:t>
+      </w:r>
+    </w:p>
+    <w:p>
+      <w:pPr>
+        <w:spacing w:before="100" w:after="160" w:line="288" w:lineRule="auto"/>
+        <w:ind w:left="230" w:right="230"/>
+        <w:shd w:fill="E8EEF5"/>
+      </w:pPr>
+      <w:r>
+        <w:rPr>
+          <w:rFonts w:ascii="Calibri" w:hAnsi="Calibri" w:eastAsia="Microsoft YaHei"/>
+          <w:b/>
+          <w:color w:val="1F4D78"/>
+        </w:rPr>
+        <w:t xml:space="preserve">本机基准  </w:t>
+      </w:r>
+      <w:r>
+        <w:rPr>
+          <w:rFonts w:ascii="Calibri" w:hAnsi="Calibri" w:eastAsia="Microsoft YaHei"/>
+        </w:rPr>
+        <w:t>8192×4096、1024×768→512×512：冷缓存约 6.64 ms，热缓存约 3.30 ms，48/48 瓦片复用、约 2.01×；平移 128 个源节点后复用 42 个瓦片并约 5.00 ms。</w:t>
+      </w:r>
+    </w:p>
+    <w:p>
+      <w:pPr>
         <w:pStyle w:val="Heading1"/>
       </w:pPr>
       <w:r>
@@ -17345,6 +17686,86 @@
                 <w:sz w:val="18"/>
               </w:rPr>
               <w:t>dt_grid_destroy</w:t>
+            </w:r>
+          </w:p>
+        </w:tc>
+      </w:tr>
+      <w:tr>
+        <w:trPr>
+          <w:cantSplit/>
+        </w:trPr>
+        <w:tc>
+          <w:tcPr>
+            <w:tcW w:type="dxa" w:w="2500"/>
+            <w:tcMar>
+              <w:top w:w="80" w:type="dxa"/>
+              <w:start w:w="120" w:type="dxa"/>
+              <w:bottom w:w="80" w:type="dxa"/>
+              <w:end w:w="120" w:type="dxa"/>
+            </w:tcMar>
+            <w:vAlign w:val="center"/>
+          </w:tcPr>
+          <w:p>
+            <w:pPr>
+              <w:spacing w:before="0" w:after="0" w:line="276" w:lineRule="auto"/>
+              <w:jc w:val="left"/>
+            </w:pPr>
+            <w:r>
+              <w:rPr>
+                <w:rFonts w:ascii="Calibri" w:hAnsi="Calibri" w:eastAsia="Microsoft YaHei"/>
+                <w:sz w:val="18"/>
+              </w:rPr>
+              <w:t>dt_grid_view_cache_handle</w:t>
+            </w:r>
+          </w:p>
+        </w:tc>
+        <w:tc>
+          <w:tcPr>
+            <w:tcW w:type="dxa" w:w="3100"/>
+            <w:tcMar>
+              <w:top w:w="80" w:type="dxa"/>
+              <w:start w:w="120" w:type="dxa"/>
+              <w:bottom w:w="80" w:type="dxa"/>
+              <w:end w:w="120" w:type="dxa"/>
+            </w:tcMar>
+            <w:vAlign w:val="center"/>
+          </w:tcPr>
+          <w:p>
+            <w:pPr>
+              <w:spacing w:before="0" w:after="0" w:line="276" w:lineRule="auto"/>
+              <w:jc w:val="left"/>
+            </w:pPr>
+            <w:r>
+              <w:rPr>
+                <w:rFonts w:ascii="Calibri" w:hAnsi="Calibri" w:eastAsia="Microsoft YaHei"/>
+                <w:sz w:val="18"/>
+              </w:rPr>
+              <w:t>dt_grid_view_cache_create</w:t>
+            </w:r>
+          </w:p>
+        </w:tc>
+        <w:tc>
+          <w:tcPr>
+            <w:tcW w:type="dxa" w:w="3760"/>
+            <w:tcMar>
+              <w:top w:w="80" w:type="dxa"/>
+              <w:start w:w="120" w:type="dxa"/>
+              <w:bottom w:w="80" w:type="dxa"/>
+              <w:end w:w="120" w:type="dxa"/>
+            </w:tcMar>
+            <w:vAlign w:val="center"/>
+          </w:tcPr>
+          <w:p>
+            <w:pPr>
+              <w:spacing w:before="0" w:after="0" w:line="276" w:lineRule="auto"/>
+              <w:jc w:val="left"/>
+            </w:pPr>
+            <w:r>
+              <w:rPr>
+                <w:rFonts w:ascii="Calibri" w:hAnsi="Calibri" w:eastAsia="Microsoft YaHei"/>
+                <w:sz w:val="18"/>
+              </w:rPr>
+              <w:t>dt_grid_view_cache_destroy</w:t>
             </w:r>
           </w:p>
         </w:tc>
@@ -18748,7 +19169,7 @@
         <w:rPr>
           <w:rFonts w:ascii="Calibri" w:hAnsi="Calibri" w:eastAsia="Microsoft YaHei"/>
         </w:rPr>
-        <w:t>测试覆盖生命周期、普通 TIN 动态编辑、DTIN/DTMESH/XYZ、TIN/GRID/等高线、等高线反向重建与高程冲突回滚、异步任务，以及 CDT 空网清理、外边界、孔洞、断裂线、交叉失败原子性、TIN→CDT、域内采样、CDT→GRID/等高线、共享顶点保护、批量新增/更新/删除、整批失败回滚和 DCDT 往返。局部坡面测试用解析平面验证 TIN/CDT 的 Z、世界梯度、坡度、坡向和法向；全幅测试覆盖坡度、坡向、阴影、CRS、旋转仿射、NoData、串并行一致和取消。土方、重采样、裁剪、窗口概览与世界视口测试分别锁定 ABI、解析结果、并行确定性、取消和非法参数；v0.30 覆盖异步概览同步等价、任务持有源生命周期、借用结果、取消及非法尺寸失败。v0.31 新增冷块、缓存命中、跨块窗口、异步生命周期/取消、概览前校验和定点损坏失败缓存测试。v0.32 新增流式金字塔数值、映射修改后同路径覆盖、覆盖后重映射能力和另存回归。v0.33 新增统一视口任务的源窗口一致性、预取/校验/金字塔标志、进度、借用结果、无交集失败及定点损坏不发布测试。v0.29 二进制测试继续覆盖仿射、NoData、CRS、v0.28 无扩展兼容、多级金字塔选择、预取、块校验、载荷延迟损坏检测、写时复制失效、损坏头和截断拒绝。剖面、多边形量测和 GDAL 构建另有数学与真实文件往返测试。</w:t>
+        <w:t>测试覆盖生命周期、普通 TIN 动态编辑、DTIN/DTMESH/XYZ、TIN/GRID/等高线、等高线反向重建与高程冲突回滚、异步任务，以及 CDT 空网清理、外边界、孔洞、断裂线、交叉失败原子性、TIN→CDT、域内采样、CDT→GRID/等高线、共享顶点保护、批量新增/更新/删除、整批失败回滚和 DCDT 往返。局部坡面测试用解析平面验证 TIN/CDT 的 Z、世界梯度、坡度、坡向和法向；全幅测试覆盖坡度、坡向、阴影、CRS、旋转仿射、NoData、串并行一致和取消。土方、重采样、裁剪、窗口概览与世界视口测试分别锁定 ABI、解析结果、并行确定性、取消和非法参数；v0.30 覆盖异步概览同步等价、任务持有源生命周期、借用结果、取消及非法尺寸失败。v0.31 新增冷块、缓存命中、跨块窗口、异步生命周期/取消、概览前校验和定点损坏失败缓存测试。v0.32 新增流式金字塔数值、映射修改后同路径覆盖、覆盖后重映射能力和另存回归。v0.33 新增统一视口任务的源窗口一致性、预取/校验/金字塔标志、进度、借用结果、无交集失败及定点损坏不发布测试。v0.34 新增二维瓦片命中、容量淘汰、缓存保留源生命周期和 1024 瓦片并发在途合并测试。v0.29 二进制测试继续覆盖仿射、NoData、CRS、v0.28 无扩展兼容、多级金字塔选择、预取、块校验、载荷延迟损坏检测、写时复制失效、损坏头和截断拒绝。剖面、多边形量测和 GDAL 构建另有数学与真实文件往返测试。</w:t>
       </w:r>
     </w:p>
     <w:p>
@@ -19465,7 +19886,7 @@
         <w:color w:val="66727D"/>
         <w:sz w:val="18"/>
       </w:rPr>
-      <w:t xml:space="preserve">版本 0.33.0  |  第 </w:t>
+      <w:t xml:space="preserve">版本 0.34.0  |  第 </w:t>
     </w:r>
     <w:r>
       <w:rPr>

</xml_diff>

<commit_message>
feat: persist GRID viewport tile cache
</commit_message>
<xml_diff>
--- a/docs/manuals/dterrain_DLL开发使用手册.docx
+++ b/docs/manuals/dterrain_DLL开发使用手册.docx
@@ -70,7 +70,7 @@
           <w:color w:val="1F4D78"/>
           <w:sz w:val="28"/>
         </w:rPr>
-        <w:t>面向测绘地形建模的 TIN、GRID、等高线转换、DGRIDB 映射/流式金字塔/按需校验、二维瓦片缓存与统一异步视口、动态编辑与空间查询</w:t>
+        <w:t>面向测绘地形建模的 TIN、GRID、等高线转换、DGRIDB 映射/流式金字塔/按需校验、DGTILE 持久显示瓦片与统一异步视口、动态编辑与空间查询</w:t>
       </w:r>
     </w:p>
     <w:p>
@@ -85,7 +85,7 @@
           <w:color w:val="203748"/>
           <w:sz w:val="22"/>
         </w:rPr>
-        <w:t>版本 0.34.0  |  2026-07-19</w:t>
+        <w:t>版本 0.35.0  |  2026-07-19</w:t>
       </w:r>
     </w:p>
     <w:p>
@@ -243,7 +243,7 @@
                 <w:rFonts w:ascii="Calibri" w:hAnsi="Calibri" w:eastAsia="Microsoft YaHei"/>
                 <w:sz w:val="18"/>
               </w:rPr>
-              <w:t>0.34.0</w:t>
+              <w:t>0.35.0</w:t>
             </w:r>
           </w:p>
         </w:tc>
@@ -463,7 +463,7 @@
                 <w:rFonts w:ascii="Calibri" w:hAnsi="Calibri" w:eastAsia="Microsoft YaHei"/>
                 <w:sz w:val="18"/>
               </w:rPr>
-              <w:t>架构、构建部署、稳定 C ABI、DGRIDB 二进制映射/金字塔/视口块校验缓存、世界视口 GRID 裁剪与异步 LOD、GRID 窗口概览、GRID 多边形裁剪/掩膜、GRID 显式重采样、双 GRID 精确挖填方、局部与全幅坡度/坡向/阴影分析、约束 Delaunay、GRID/等高线转换、GDAL 格式交换、异步任务、12 个兼容接口、文件格式、性能、线程安全、故障排查。</w:t>
+              <w:t>架构、构建部署、稳定 C ABI、DGRIDB 二进制映射/金字塔/视口块校验缓存、DGTILE 稀疏持久显示瓦片、世界视口 GRID 裁剪与异步 LOD、GRID 窗口概览、GRID 多边形裁剪/掩膜、GRID 显式重采样、双 GRID 精确挖填方、局部与全幅坡度/坡向/阴影分析、约束 Delaunay、GRID/等高线转换、GDAL 格式交换、异步任务、12 个兼容接口、文件格式、性能、线程安全、故障排查。</w:t>
             </w:r>
           </w:p>
         </w:tc>
@@ -627,6 +627,17 @@
     </w:p>
     <w:p>
       <w:pPr>
+        <w:pStyle w:val="ListBullet"/>
+      </w:pPr>
+      <w:r>
+        <w:rPr>
+          <w:rFonts w:ascii="Calibri" w:hAnsi="Calibri" w:eastAsia="Microsoft YaHei"/>
+        </w:rPr>
+        <w:t>跨会话显示缓存：重点阅读第 4.22 节。</w:t>
+      </w:r>
+    </w:p>
+    <w:p>
+      <w:pPr>
         <w:spacing w:before="100" w:after="160" w:line="288" w:lineRule="auto"/>
         <w:ind w:left="230" w:right="230"/>
         <w:shd w:fill="FFF7E0"/>
@@ -643,7 +654,7 @@
         <w:rPr>
           <w:rFonts w:ascii="Calibri" w:hAnsi="Calibri" w:eastAsia="Microsoft YaHei"/>
         </w:rPr>
-        <w:t>本手册对应 dterrain 0.34.0：新增二维空间瓦片目录、视口中心优先调度、跨请求在途合并和容量受控 LRU 淘汰；v0.33 统一异步视口流水线及旧同步/异步接口保持兼容。</w:t>
+        <w:t>本手册对应 dterrain 0.35.0：新增 DGTILE 跨会话稀疏显示瓦片包、源指纹失效、按需负载校验和无损回退；v0.34 内存瓦片目录及全部旧接口保持兼容。</w:t>
       </w:r>
     </w:p>
     <w:p>
@@ -833,6 +844,17 @@
           <w:rFonts w:ascii="Calibri" w:hAnsi="Calibri" w:eastAsia="Microsoft YaHei"/>
         </w:rPr>
         <w:t>二维空间瓦片目录按视口中心优先生产，跨请求共享完成或在途瓦片，并以字节/数量双限额执行 LRU 淘汰。</w:t>
+      </w:r>
+    </w:p>
+    <w:p>
+      <w:pPr>
+        <w:pStyle w:val="ListBullet"/>
+      </w:pPr>
+      <w:r>
+        <w:rPr>
+          <w:rFonts w:ascii="Calibri" w:hAnsi="Calibri" w:eastAsia="Microsoft YaHei"/>
+        </w:rPr>
+        <w:t>DGTILE 稀疏旁车按需保存已浏览瓦片，跨会话复用且在过期、损坏、满容量或不可写时无损回退。</w:t>
       </w:r>
     </w:p>
     <w:p>
@@ -14711,6 +14733,257 @@
           <w:rFonts w:ascii="Calibri" w:hAnsi="Calibri" w:eastAsia="Microsoft YaHei"/>
         </w:rPr>
         <w:t>8192×4096、1024×768→512×512：冷缓存约 6.64 ms，热缓存约 3.30 ms，48/48 瓦片复用、约 2.01×；平移 128 个源节点后复用 42 个瓦片并约 5.00 ms。</w:t>
+      </w:r>
+    </w:p>
+    <w:p>
+      <w:pPr>
+        <w:pStyle w:val="Heading2"/>
+      </w:pPr>
+      <w:r>
+        <w:t>4.22 DGTILE 跨会话显示缓存</w:t>
+      </w:r>
+    </w:p>
+    <w:p>
+      <w:r>
+        <w:rPr>
+          <w:rFonts w:ascii="Calibri" w:hAnsi="Calibri" w:eastAsia="Microsoft YaHei"/>
+        </w:rPr>
+        <w:t>v0.35 的 dt_grid_view_cache_create_persistent() 在原内存目录下增加 DGTILE 1 稀疏旁车。打开时只扫描 4 KiB 文件头和 128 字节记录头，像素负载在瓦片命中后才读取并校验；没有命中的瓦片仍从源 GRID 生成并按需追加。后续任务接口、结果生命周期、中心优先调度、在途合并和内存 LRU 与 v0.34 完全相同。</w:t>
+      </w:r>
+    </w:p>
+    <w:p>
+      <w:pPr>
+        <w:pStyle w:val="DterrainCode"/>
+        <w:shd w:fill="F2F4F7"/>
+      </w:pPr>
+      <w:r>
+        <w:rPr>
+          <w:rFonts w:ascii="Consolas" w:hAnsi="Consolas" w:eastAsia="Microsoft YaHei"/>
+          <w:sz w:val="17"/>
+        </w:rPr>
+        <w:t>dt_grid_view_disk_cache_options disk{};</w:t>
+      </w:r>
+      <w:r>
+        <w:br/>
+      </w:r>
+      <w:r>
+        <w:rPr>
+          <w:rFonts w:ascii="Consolas" w:hAnsi="Consolas" w:eastAsia="Microsoft YaHei"/>
+          <w:sz w:val="17"/>
+        </w:rPr>
+        <w:t>disk.struct_size = sizeof(disk);</w:t>
+      </w:r>
+      <w:r>
+        <w:br/>
+      </w:r>
+      <w:r>
+        <w:rPr>
+          <w:rFonts w:ascii="Consolas" w:hAnsi="Consolas" w:eastAsia="Microsoft YaHei"/>
+          <w:sz w:val="17"/>
+        </w:rPr>
+        <w:t>disk.flags = DT_GRID_VIEW_DISK_CACHE_RESET_STALE |</w:t>
+      </w:r>
+      <w:r>
+        <w:br/>
+      </w:r>
+      <w:r>
+        <w:rPr>
+          <w:rFonts w:ascii="Consolas" w:hAnsi="Consolas" w:eastAsia="Microsoft YaHei"/>
+          <w:sz w:val="17"/>
+        </w:rPr>
+        <w:t xml:space="preserve">             DT_GRID_VIEW_DISK_CACHE_RESET_CORRUPTED;</w:t>
+      </w:r>
+      <w:r>
+        <w:br/>
+      </w:r>
+      <w:r>
+        <w:rPr>
+          <w:rFonts w:ascii="Consolas" w:hAnsi="Consolas" w:eastAsia="Microsoft YaHei"/>
+          <w:sz w:val="17"/>
+        </w:rPr>
+        <w:t>disk.utf8_file_name = "terrain.dgridb.dgtile";</w:t>
+      </w:r>
+      <w:r>
+        <w:br/>
+      </w:r>
+      <w:r>
+        <w:rPr>
+          <w:rFonts w:ascii="Consolas" w:hAnsi="Consolas" w:eastAsia="Microsoft YaHei"/>
+          <w:sz w:val="17"/>
+        </w:rPr>
+        <w:t>disk.source_revision = application_revision;</w:t>
+      </w:r>
+      <w:r>
+        <w:br/>
+      </w:r>
+      <w:r>
+        <w:rPr>
+          <w:rFonts w:ascii="Consolas" w:hAnsi="Consolas" w:eastAsia="Microsoft YaHei"/>
+          <w:sz w:val="17"/>
+        </w:rPr>
+        <w:t>disk.maximum_file_bytes = 2ULL * 1024 * 1024 * 1024;</w:t>
+      </w:r>
+      <w:r>
+        <w:br/>
+      </w:r>
+      <w:r>
+        <w:rPr>
+          <w:rFonts w:ascii="Consolas" w:hAnsi="Consolas" w:eastAsia="Microsoft YaHei"/>
+          <w:sz w:val="17"/>
+        </w:rPr>
+      </w:r>
+      <w:r>
+        <w:br/>
+      </w:r>
+      <w:r>
+        <w:rPr>
+          <w:rFonts w:ascii="Consolas" w:hAnsi="Consolas" w:eastAsia="Microsoft YaHei"/>
+          <w:sz w:val="17"/>
+        </w:rPr>
+        <w:t>dt_grid_view_cache_handle cache = nullptr;</w:t>
+      </w:r>
+      <w:r>
+        <w:br/>
+      </w:r>
+      <w:r>
+        <w:rPr>
+          <w:rFonts w:ascii="Consolas" w:hAnsi="Consolas" w:eastAsia="Microsoft YaHei"/>
+          <w:sz w:val="17"/>
+        </w:rPr>
+        <w:t>dt_status s = dt_grid_view_cache_create_persistent(</w:t>
+      </w:r>
+      <w:r>
+        <w:br/>
+      </w:r>
+      <w:r>
+        <w:rPr>
+          <w:rFonts w:ascii="Consolas" w:hAnsi="Consolas" w:eastAsia="Microsoft YaHei"/>
+          <w:sz w:val="17"/>
+        </w:rPr>
+        <w:t xml:space="preserve">    grid, &amp;cache_options, &amp;disk, &amp;cache);</w:t>
+      </w:r>
+      <w:r>
+        <w:br/>
+      </w:r>
+      <w:r>
+        <w:rPr>
+          <w:rFonts w:ascii="Consolas" w:hAnsi="Consolas" w:eastAsia="Microsoft YaHei"/>
+          <w:sz w:val="17"/>
+        </w:rPr>
+      </w:r>
+      <w:r>
+        <w:br/>
+      </w:r>
+      <w:r>
+        <w:rPr>
+          <w:rFonts w:ascii="Consolas" w:hAnsi="Consolas" w:eastAsia="Microsoft YaHei"/>
+          <w:sz w:val="17"/>
+        </w:rPr>
+        <w:t>dt_grid_view_disk_cache_statistics ds{};</w:t>
+      </w:r>
+      <w:r>
+        <w:br/>
+      </w:r>
+      <w:r>
+        <w:rPr>
+          <w:rFonts w:ascii="Consolas" w:hAnsi="Consolas" w:eastAsia="Microsoft YaHei"/>
+          <w:sz w:val="17"/>
+        </w:rPr>
+        <w:t>ds.struct_size = sizeof(ds);</w:t>
+      </w:r>
+      <w:r>
+        <w:br/>
+      </w:r>
+      <w:r>
+        <w:rPr>
+          <w:rFonts w:ascii="Consolas" w:hAnsi="Consolas" w:eastAsia="Microsoft YaHei"/>
+          <w:sz w:val="17"/>
+        </w:rPr>
+        <w:t>dt_grid_view_cache_get_disk_statistics(cache, &amp;ds);</w:t>
+      </w:r>
+    </w:p>
+    <w:p>
+      <w:pPr>
+        <w:spacing w:before="100" w:after="160" w:line="288" w:lineRule="auto"/>
+        <w:ind w:left="230" w:right="230"/>
+        <w:shd w:fill="E8EEF5"/>
+      </w:pPr>
+      <w:r>
+        <w:rPr>
+          <w:rFonts w:ascii="Calibri" w:hAnsi="Calibri" w:eastAsia="Microsoft YaHei"/>
+          <w:b/>
+          <w:color w:val="1F4D78"/>
+        </w:rPr>
+        <w:t xml:space="preserve">失效与恢复  </w:t>
+      </w:r>
+      <w:r>
+        <w:rPr>
+          <w:rFonts w:ascii="Calibri" w:hAnsi="Calibri" w:eastAsia="Microsoft YaHei"/>
+        </w:rPr>
+        <w:t>源指纹包含应用 revision、GRID 尺寸、仿射、CRS、NoData 和最多 64×64 个确定性样本。内存 GRID 任意语义修改仍应更新 revision。RESET_STALE 原子重建不匹配包；RESET_CORRUPTED 重建坏头/目录，并在延迟发现坏负载时重算该瓦片。只有实际成功读取磁盘负载的任务才设置 DISK_CACHE_HIT。</w:t>
+      </w:r>
+    </w:p>
+    <w:p>
+      <w:pPr>
+        <w:spacing w:before="100" w:after="160" w:line="288" w:lineRule="auto"/>
+        <w:ind w:left="230" w:right="230"/>
+        <w:shd w:fill="FFF7E0"/>
+      </w:pPr>
+      <w:r>
+        <w:rPr>
+          <w:rFonts w:ascii="Calibri" w:hAnsi="Calibri" w:eastAsia="Microsoft YaHei"/>
+          <w:b/>
+          <w:color w:val="7A5A00"/>
+        </w:rPr>
+        <w:t xml:space="preserve">降级边界  </w:t>
+      </w:r>
+      <w:r>
+        <w:rPr>
+          <w:rFonts w:ascii="Calibri" w:hAnsi="Calibri" w:eastAsia="Microsoft YaHei"/>
+        </w:rPr>
+        <w:t>默认容量 2 GiB，包满、只读或写失败只停止追加，显示继续从内存/源数据完成。dt_grid_view_cache_clear() 不删除旁车；DGTILE 不是权威地形数据，关闭句柄后可直接删除。文件追加式且当前不在线压缩。</w:t>
+      </w:r>
+    </w:p>
+    <w:p>
+      <w:pPr>
+        <w:spacing w:before="100" w:after="160" w:line="288" w:lineRule="auto"/>
+        <w:ind w:left="230" w:right="230"/>
+        <w:shd w:fill="FDECEC"/>
+      </w:pPr>
+      <w:r>
+        <w:rPr>
+          <w:rFonts w:ascii="Calibri" w:hAnsi="Calibri" w:eastAsia="Microsoft YaHei"/>
+          <w:b/>
+          <w:color w:val="9B1C1C"/>
+        </w:rPr>
+        <w:t xml:space="preserve">并发约束  </w:t>
+      </w:r>
+      <w:r>
+        <w:rPr>
+          <w:rFonts w:ascii="Calibri" w:hAnsi="Calibri" w:eastAsia="Microsoft YaHei"/>
+        </w:rPr>
+        <w:t>单进程同一规范化路径只允许一个可写缓存，可并存多个只读缓存；尚无跨进程写锁。多个进程不得同时写同一个 .dgtile。GUI 自动为 DGRIDB 使用 .dgridb.dgtile，失败时回退为纯内存目录。</w:t>
+      </w:r>
+    </w:p>
+    <w:p>
+      <w:pPr>
+        <w:spacing w:before="100" w:after="160" w:line="288" w:lineRule="auto"/>
+        <w:ind w:left="230" w:right="230"/>
+        <w:shd w:fill="E8EEF5"/>
+      </w:pPr>
+      <w:r>
+        <w:rPr>
+          <w:rFonts w:ascii="Calibri" w:hAnsi="Calibri" w:eastAsia="Microsoft YaHei"/>
+          <w:b/>
+          <w:color w:val="1F4D78"/>
+        </w:rPr>
+        <w:t xml:space="preserve">本机基准  </w:t>
+      </w:r>
+      <w:r>
+        <w:rPr>
+          <w:rFonts w:ascii="Calibri" w:hAnsi="Calibri" w:eastAsia="Microsoft YaHei"/>
+        </w:rPr>
+        <w:t>8192×4096、128×128 瓦片、1024×768→512×512：首次填充约 14.47 ms；重建缓存句柄后从磁盘复用约 8.78 ms，48/48 瓦片命中，抽样误差为 0。</w:t>
       </w:r>
     </w:p>
     <w:p>
@@ -19169,7 +19442,7 @@
         <w:rPr>
           <w:rFonts w:ascii="Calibri" w:hAnsi="Calibri" w:eastAsia="Microsoft YaHei"/>
         </w:rPr>
-        <w:t>测试覆盖生命周期、普通 TIN 动态编辑、DTIN/DTMESH/XYZ、TIN/GRID/等高线、等高线反向重建与高程冲突回滚、异步任务，以及 CDT 空网清理、外边界、孔洞、断裂线、交叉失败原子性、TIN→CDT、域内采样、CDT→GRID/等高线、共享顶点保护、批量新增/更新/删除、整批失败回滚和 DCDT 往返。局部坡面测试用解析平面验证 TIN/CDT 的 Z、世界梯度、坡度、坡向和法向；全幅测试覆盖坡度、坡向、阴影、CRS、旋转仿射、NoData、串并行一致和取消。土方、重采样、裁剪、窗口概览与世界视口测试分别锁定 ABI、解析结果、并行确定性、取消和非法参数；v0.30 覆盖异步概览同步等价、任务持有源生命周期、借用结果、取消及非法尺寸失败。v0.31 新增冷块、缓存命中、跨块窗口、异步生命周期/取消、概览前校验和定点损坏失败缓存测试。v0.32 新增流式金字塔数值、映射修改后同路径覆盖、覆盖后重映射能力和另存回归。v0.33 新增统一视口任务的源窗口一致性、预取/校验/金字塔标志、进度、借用结果、无交集失败及定点损坏不发布测试。v0.34 新增二维瓦片命中、容量淘汰、缓存保留源生命周期和 1024 瓦片并发在途合并测试。v0.29 二进制测试继续覆盖仿射、NoData、CRS、v0.28 无扩展兼容、多级金字塔选择、预取、块校验、载荷延迟损坏检测、写时复制失效、损坏头和截断拒绝。剖面、多边形量测和 GDAL 构建另有数学与真实文件往返测试。</w:t>
+        <w:t>测试覆盖生命周期、普通 TIN 动态编辑、DTIN/DTMESH/XYZ、TIN/GRID/等高线、等高线反向重建与高程冲突回滚、异步任务，以及 CDT 空网清理、外边界、孔洞、断裂线、交叉失败原子性、TIN→CDT、域内采样、CDT→GRID/等高线、共享顶点保护、批量新增/更新/删除、整批失败回滚和 DCDT 往返。局部坡面测试用解析平面验证 TIN/CDT 的 Z、世界梯度、坡度、坡向和法向；全幅测试覆盖坡度、坡向、阴影、CRS、旋转仿射、NoData、串并行一致和取消。土方、重采样、裁剪、窗口概览与世界视口测试分别锁定 ABI、解析结果、并行确定性、取消和非法参数；v0.30 覆盖异步概览同步等价、任务持有源生命周期、借用结果、取消及非法尺寸失败。v0.31 新增冷块、缓存命中、跨块窗口、异步生命周期/取消、概览前校验和定点损坏失败缓存测试。v0.32 新增流式金字塔数值、映射修改后同路径覆盖、覆盖后重映射能力和另存回归。v0.33 新增统一视口任务的源窗口一致性、预取/校验/金字塔标志、进度、借用结果、无交集失败及定点损坏不发布测试。v0.34 新增二维瓦片命中、容量淘汰、缓存保留源生命周期和 1024 瓦片并发在途合并测试。v0.35 新增 DGTILE 首次写入/跨句柄命中、数值一致、过期重建、坏头/延迟坏负载恢复、只读、容量停写、单写者及并发只读测试。v0.29 二进制测试继续覆盖仿射、NoData、CRS、v0.28 无扩展兼容、多级金字塔选择、预取、块校验、载荷延迟损坏检测、写时复制失效、损坏头和截断拒绝。剖面、多边形量测和 GDAL 构建另有数学与真实文件往返测试。</w:t>
       </w:r>
     </w:p>
     <w:p>
@@ -19886,7 +20159,7 @@
         <w:color w:val="66727D"/>
         <w:sz w:val="18"/>
       </w:rPr>
-      <w:t xml:space="preserve">版本 0.34.0  |  第 </w:t>
+      <w:t xml:space="preserve">版本 0.35.0  |  第 </w:t>
     </w:r>
     <w:r>
       <w:rPr>

</xml_diff>

<commit_message>
feat: add DGTILE lifecycle maintenance
</commit_message>
<xml_diff>
--- a/docs/manuals/dterrain_DLL开发使用手册.docx
+++ b/docs/manuals/dterrain_DLL开发使用手册.docx
@@ -85,7 +85,7 @@
           <w:color w:val="203748"/>
           <w:sz w:val="22"/>
         </w:rPr>
-        <w:t>版本 0.35.0  |  2026-07-19</w:t>
+        <w:t>版本 0.36.0  |  2026-07-19</w:t>
       </w:r>
     </w:p>
     <w:p>
@@ -243,7 +243,7 @@
                 <w:rFonts w:ascii="Calibri" w:hAnsi="Calibri" w:eastAsia="Microsoft YaHei"/>
                 <w:sz w:val="18"/>
               </w:rPr>
-              <w:t>0.35.0</w:t>
+              <w:t>0.36.0</w:t>
             </w:r>
           </w:p>
         </w:tc>
@@ -633,7 +633,7 @@
         <w:rPr>
           <w:rFonts w:ascii="Calibri" w:hAnsi="Calibri" w:eastAsia="Microsoft YaHei"/>
         </w:rPr>
-        <w:t>跨会话显示缓存：重点阅读第 4.22 节。</w:t>
+        <w:t>跨会话显示缓存：重点阅读第 4.22～4.23 节。</w:t>
       </w:r>
     </w:p>
     <w:p>
@@ -654,7 +654,7 @@
         <w:rPr>
           <w:rFonts w:ascii="Calibri" w:hAnsi="Calibri" w:eastAsia="Microsoft YaHei"/>
         </w:rPr>
-        <w:t>本手册对应 dterrain 0.35.0：新增 DGTILE 跨会话稀疏显示瓦片包、源指纹失效、按需负载校验和无损回退；v0.34 内存瓦片目录及全部旧接口保持兼容。</w:t>
+        <w:t>本手册对应 dterrain 0.36.0：新增 DGTILE 在线校验压缩、空间回收、Windows 跨进程单写保护和 GUI 维护入口；v0.35 持久旁车及全部旧接口保持兼容。</w:t>
       </w:r>
     </w:p>
     <w:p>
@@ -854,7 +854,7 @@
         <w:rPr>
           <w:rFonts w:ascii="Calibri" w:hAnsi="Calibri" w:eastAsia="Microsoft YaHei"/>
         </w:rPr>
-        <w:t>DGTILE 稀疏旁车按需保存已浏览瓦片，跨会话复用且在过期、损坏、满容量或不可写时无损回退。</w:t>
+        <w:t>DGTILE 稀疏旁车按需保存已浏览瓦片，支持跨会话复用、在线校验压缩、空间回收和 Windows 跨进程单写保护。</w:t>
       </w:r>
     </w:p>
     <w:p>
@@ -14941,7 +14941,7 @@
         <w:rPr>
           <w:rFonts w:ascii="Calibri" w:hAnsi="Calibri" w:eastAsia="Microsoft YaHei"/>
         </w:rPr>
-        <w:t>默认容量 2 GiB，包满、只读或写失败只停止追加，显示继续从内存/源数据完成。dt_grid_view_cache_clear() 不删除旁车；DGTILE 不是权威地形数据，关闭句柄后可直接删除。文件追加式且当前不在线压缩。</w:t>
+        <w:t>默认容量 2 GiB，包满、只读或写失败只停止追加，显示继续从内存/源数据完成。dt_grid_view_cache_clear() 不删除旁车；DGTILE 不是权威地形数据，关闭句柄后可直接删除。</w:t>
       </w:r>
     </w:p>
     <w:p>
@@ -14962,7 +14962,7 @@
         <w:rPr>
           <w:rFonts w:ascii="Calibri" w:hAnsi="Calibri" w:eastAsia="Microsoft YaHei"/>
         </w:rPr>
-        <w:t>单进程同一规范化路径只允许一个可写缓存，可并存多个只读缓存；尚无跨进程写锁。多个进程不得同时写同一个 .dgtile。GUI 自动为 DGRIDB 使用 .dgridb.dgtile，失败时回退为纯内存目录。</w:t>
+        <w:t>同一规范化路径只允许一个可写缓存；Windows 还通过命名互斥量拒绝另一进程的第二写者。只读句柄不获取写者互斥量。GUI 自动为 DGRIDB 使用 .dgridb.dgtile，失败时回退为纯内存目录。</w:t>
       </w:r>
     </w:p>
     <w:p>
@@ -14984,6 +14984,117 @@
           <w:rFonts w:ascii="Calibri" w:hAnsi="Calibri" w:eastAsia="Microsoft YaHei"/>
         </w:rPr>
         <w:t>8192×4096、128×128 瓦片、1024×768→512×512：首次填充约 14.47 ms；重建缓存句柄后从磁盘复用约 8.78 ms，48/48 瓦片命中，抽样误差为 0。</w:t>
+      </w:r>
+    </w:p>
+    <w:p>
+      <w:pPr>
+        <w:pStyle w:val="Heading2"/>
+      </w:pPr>
+      <w:r>
+        <w:t>4.23 DGTILE 在线压缩与空间回收</w:t>
+      </w:r>
+    </w:p>
+    <w:p>
+      <w:r>
+        <w:rPr>
+          <w:rFonts w:ascii="Calibri" w:hAnsi="Calibri" w:eastAsia="Microsoft YaHei"/>
+        </w:rPr>
+        <w:t>v0.36 的 dt_grid_view_cache_compact() 在缓存句柄存活时，把当前旁车重写为每个键最后一条有效记录。库按稳定键序逐块读取并复核校验，只在新文件完整刷新后原子替换旧文件。后台瓦片读取持有共享文件锁，追加和压缩持有独占文件锁；压缩提交后加载任务会按键重新取得最新偏移，因此不会读取替换前的陈旧位置。</w:t>
+      </w:r>
+    </w:p>
+    <w:p>
+      <w:pPr>
+        <w:pStyle w:val="DterrainCode"/>
+        <w:shd w:fill="F2F4F7"/>
+      </w:pPr>
+      <w:r>
+        <w:rPr>
+          <w:rFonts w:ascii="Consolas" w:hAnsi="Consolas" w:eastAsia="Microsoft YaHei"/>
+          <w:sz w:val="17"/>
+        </w:rPr>
+        <w:t>dt_grid_view_cache_compact_result compact{};</w:t>
+      </w:r>
+      <w:r>
+        <w:br/>
+      </w:r>
+      <w:r>
+        <w:rPr>
+          <w:rFonts w:ascii="Consolas" w:hAnsi="Consolas" w:eastAsia="Microsoft YaHei"/>
+          <w:sz w:val="17"/>
+        </w:rPr>
+        <w:t>compact.struct_size = sizeof(compact);</w:t>
+      </w:r>
+      <w:r>
+        <w:br/>
+      </w:r>
+      <w:r>
+        <w:rPr>
+          <w:rFonts w:ascii="Consolas" w:hAnsi="Consolas" w:eastAsia="Microsoft YaHei"/>
+          <w:sz w:val="17"/>
+        </w:rPr>
+        <w:t>dt_status s = dt_grid_view_cache_compact(cache, &amp;compact);</w:t>
+      </w:r>
+      <w:r>
+        <w:br/>
+      </w:r>
+      <w:r>
+        <w:rPr>
+          <w:rFonts w:ascii="Consolas" w:hAnsi="Consolas" w:eastAsia="Microsoft YaHei"/>
+          <w:sz w:val="17"/>
+        </w:rPr>
+        <w:t>// input/output_file_bytes、reclaimed_bytes</w:t>
+      </w:r>
+      <w:r>
+        <w:br/>
+      </w:r>
+      <w:r>
+        <w:rPr>
+          <w:rFonts w:ascii="Consolas" w:hAnsi="Consolas" w:eastAsia="Microsoft YaHei"/>
+          <w:sz w:val="17"/>
+        </w:rPr>
+        <w:t>// dropped_duplicate_record_count、dropped_corrupt_tile_count</w:t>
+      </w:r>
+    </w:p>
+    <w:p>
+      <w:pPr>
+        <w:spacing w:before="100" w:after="160" w:line="288" w:lineRule="auto"/>
+        <w:ind w:left="230" w:right="230"/>
+        <w:shd w:fill="E8EEF5"/>
+      </w:pPr>
+      <w:r>
+        <w:rPr>
+          <w:rFonts w:ascii="Calibri" w:hAnsi="Calibri" w:eastAsia="Microsoft YaHei"/>
+          <w:b/>
+          <w:color w:val="1F4D78"/>
+        </w:rPr>
+        <w:t xml:space="preserve">结果与错误码  </w:t>
+      </w:r>
+      <w:r>
+        <w:rPr>
+          <w:rFonts w:ascii="Calibri" w:hAnsi="Calibri" w:eastAsia="Microsoft YaHei"/>
+        </w:rPr>
+        <w:t>结果结构固定 96 字节。历史同键记录被回收；当前坏负载被省略，后续视口从源 GRID 重建。磁盘统计新增 stored_record_count 和 reclaimable_bytes，后者是不读负载即可确定的历史记录空间。普通内存缓存返回 DT_E_NOT_FOUND，只读包返回 DT_E_UNSUPPORTED。压缩可能使达到容量上限的包恢复追加能力。</w:t>
+      </w:r>
+    </w:p>
+    <w:p>
+      <w:pPr>
+        <w:spacing w:before="100" w:after="160" w:line="288" w:lineRule="auto"/>
+        <w:ind w:left="230" w:right="230"/>
+        <w:shd w:fill="FFF7E0"/>
+      </w:pPr>
+      <w:r>
+        <w:rPr>
+          <w:rFonts w:ascii="Calibri" w:hAnsi="Calibri" w:eastAsia="Microsoft YaHei"/>
+          <w:b/>
+          <w:color w:val="7A5A00"/>
+        </w:rPr>
+        <w:t xml:space="preserve">提交安全  </w:t>
+      </w:r>
+      <w:r>
+        <w:rPr>
+          <w:rFonts w:ascii="Calibri" w:hAnsi="Calibri" w:eastAsia="Microsoft YaHei"/>
+        </w:rPr>
+        <w:t>临时文件与原包位于同一目录。提交前失败会删除临时文件并继续使用原包；DGTILE 只是显示缓存，即使坏负载被丢弃也不影响正式高程、分析或导出。</w:t>
       </w:r>
     </w:p>
     <w:p>
@@ -19442,7 +19553,7 @@
         <w:rPr>
           <w:rFonts w:ascii="Calibri" w:hAnsi="Calibri" w:eastAsia="Microsoft YaHei"/>
         </w:rPr>
-        <w:t>测试覆盖生命周期、普通 TIN 动态编辑、DTIN/DTMESH/XYZ、TIN/GRID/等高线、等高线反向重建与高程冲突回滚、异步任务，以及 CDT 空网清理、外边界、孔洞、断裂线、交叉失败原子性、TIN→CDT、域内采样、CDT→GRID/等高线、共享顶点保护、批量新增/更新/删除、整批失败回滚和 DCDT 往返。局部坡面测试用解析平面验证 TIN/CDT 的 Z、世界梯度、坡度、坡向和法向；全幅测试覆盖坡度、坡向、阴影、CRS、旋转仿射、NoData、串并行一致和取消。土方、重采样、裁剪、窗口概览与世界视口测试分别锁定 ABI、解析结果、并行确定性、取消和非法参数；v0.30 覆盖异步概览同步等价、任务持有源生命周期、借用结果、取消及非法尺寸失败。v0.31 新增冷块、缓存命中、跨块窗口、异步生命周期/取消、概览前校验和定点损坏失败缓存测试。v0.32 新增流式金字塔数值、映射修改后同路径覆盖、覆盖后重映射能力和另存回归。v0.33 新增统一视口任务的源窗口一致性、预取/校验/金字塔标志、进度、借用结果、无交集失败及定点损坏不发布测试。v0.34 新增二维瓦片命中、容量淘汰、缓存保留源生命周期和 1024 瓦片并发在途合并测试。v0.35 新增 DGTILE 首次写入/跨句柄命中、数值一致、过期重建、坏头/延迟坏负载恢复、只读、容量停写、单写者及并发只读测试。v0.29 二进制测试继续覆盖仿射、NoData、CRS、v0.28 无扩展兼容、多级金字塔选择、预取、块校验、载荷延迟损坏检测、写时复制失效、损坏头和截断拒绝。剖面、多边形量测和 GDAL 构建另有数学与真实文件往返测试。</w:t>
+        <w:t>测试覆盖生命周期、普通 TIN 动态编辑、DTIN/DTMESH/XYZ、TIN/GRID/等高线、等高线反向重建与高程冲突回滚、异步任务，以及 CDT 空网清理、外边界、孔洞、断裂线、交叉失败原子性、TIN→CDT、域内采样、CDT→GRID/等高线、共享顶点保护、批量新增/更新/删除、整批失败回滚和 DCDT 往返。局部坡面测试用解析平面验证 TIN/CDT 的 Z、世界梯度、坡度、坡向和法向；全幅测试覆盖坡度、坡向、阴影、CRS、旋转仿射、NoData、串并行一致和取消。土方、重采样、裁剪、窗口概览与世界视口测试分别锁定 ABI、解析结果、并行确定性、取消和非法参数；v0.30 覆盖异步概览同步等价、任务持有源生命周期、借用结果、取消及非法尺寸失败。v0.31 新增冷块、缓存命中、跨块窗口、异步生命周期/取消、概览前校验和定点损坏失败缓存测试。v0.32 新增流式金字塔数值、映射修改后同路径覆盖、覆盖后重映射能力和另存回归。v0.33 新增统一视口任务的源窗口一致性、预取/校验/金字塔标志、进度、借用结果、无交集失败及定点损坏不发布测试。v0.34 新增二维瓦片命中、容量淘汰、缓存保留源生命周期和 1024 瓦片并发在途合并测试。v0.35 新增 DGTILE 首次写入/跨句柄命中、数值一致、过期重建、坏头/延迟坏负载恢复、只读、容量停写、单写者及并发只读测试。v0.36 新增重复记录回收、当前坏负载审计丢弃、只读/纯内存错误码、96 字节 ABI 和 Windows 子进程单写互斥回归。v0.29 二进制测试继续覆盖仿射、NoData、CRS、v0.28 无扩展兼容、多级金字塔选择、预取、块校验、载荷延迟损坏检测、写时复制失效、损坏头和截断拒绝。剖面、多边形量测和 GDAL 构建另有数学与真实文件往返测试。</w:t>
       </w:r>
     </w:p>
     <w:p>
@@ -20159,7 +20270,7 @@
         <w:color w:val="66727D"/>
         <w:sz w:val="18"/>
       </w:rPr>
-      <w:t xml:space="preserve">版本 0.35.0  |  第 </w:t>
+      <w:t xml:space="preserve">版本 0.36.0  |  第 </w:t>
     </w:r>
     <w:r>
       <w:rPr>

</xml_diff>

<commit_message>
feat: publish progressive cross-LOD grid views
</commit_message>
<xml_diff>
--- a/docs/manuals/dterrain_DLL开发使用手册.docx
+++ b/docs/manuals/dterrain_DLL开发使用手册.docx
@@ -70,7 +70,7 @@
           <w:color w:val="1F4D78"/>
           <w:sz w:val="28"/>
         </w:rPr>
-        <w:t>面向测绘地形建模的 TIN、GRID、等高线转换、DGRIDB 映射/流式金字塔/按需校验、DGTILE 持久显示瓦片与统一异步视口、动态编辑与空间查询</w:t>
+        <w:t>面向测绘地形建模的 TIN、GRID、等高线转换、DGRIDB 映射/流式金字塔/按需校验、DGTILE 持久瓦片与跨层级渐进视口、动态编辑与空间查询</w:t>
       </w:r>
     </w:p>
     <w:p>
@@ -85,7 +85,7 @@
           <w:color w:val="203748"/>
           <w:sz w:val="22"/>
         </w:rPr>
-        <w:t>版本 0.36.0  |  2026-07-19</w:t>
+        <w:t>版本 0.37.0  |  2026-07-19</w:t>
       </w:r>
     </w:p>
     <w:p>
@@ -243,7 +243,7 @@
                 <w:rFonts w:ascii="Calibri" w:hAnsi="Calibri" w:eastAsia="Microsoft YaHei"/>
                 <w:sz w:val="18"/>
               </w:rPr>
-              <w:t>0.36.0</w:t>
+              <w:t>0.37.0</w:t>
             </w:r>
           </w:p>
         </w:tc>
@@ -638,6 +638,17 @@
     </w:p>
     <w:p>
       <w:pPr>
+        <w:pStyle w:val="ListBullet"/>
+      </w:pPr>
+      <w:r>
+        <w:rPr>
+          <w:rFonts w:ascii="Calibri" w:hAnsi="Calibri" w:eastAsia="Microsoft YaHei"/>
+        </w:rPr>
+        <w:t>粗到细渐进视口：重点阅读第 4.24 节。</w:t>
+      </w:r>
+    </w:p>
+    <w:p>
+      <w:pPr>
         <w:spacing w:before="100" w:after="160" w:line="288" w:lineRule="auto"/>
         <w:ind w:left="230" w:right="230"/>
         <w:shd w:fill="FFF7E0"/>
@@ -654,7 +665,7 @@
         <w:rPr>
           <w:rFonts w:ascii="Calibri" w:hAnsi="Calibri" w:eastAsia="Microsoft YaHei"/>
         </w:rPr>
-        <w:t>本手册对应 dterrain 0.36.0：新增 DGTILE 在线校验压缩、空间回收、Windows 跨进程单写保护和 GUI 维护入口；v0.35 持久旁车及全部旧接口保持兼容。</w:t>
+        <w:t>本手册对应 dterrain 0.37.0：新增粗到细的跨层级渐进视口帧、序列等待/读取和 GUI 连续发布；v0.36 DGTILE 在线压缩、跨进程单写保护及全部旧接口保持兼容。</w:t>
       </w:r>
     </w:p>
     <w:p>
@@ -855,6 +866,17 @@
           <w:rFonts w:ascii="Calibri" w:hAnsi="Calibri" w:eastAsia="Microsoft YaHei"/>
         </w:rPr>
         <w:t>DGTILE 稀疏旁车按需保存已浏览瓦片，支持跨会话复用、在线校验压缩、空间回收和 Windows 跨进程单写保护。</w:t>
+      </w:r>
+    </w:p>
+    <w:p>
+      <w:pPr>
+        <w:pStyle w:val="ListBullet"/>
+      </w:pPr>
+      <w:r>
+        <w:rPr>
+          <w:rFonts w:ascii="Calibri" w:hAnsi="Calibri" w:eastAsia="Microsoft YaHei"/>
+        </w:rPr>
+        <w:t>同一异步任务按粗到细发布不可变 GRID 视口帧，支持序列等待、协作取消、最终结果兼容和 GUI 连续换图。</w:t>
       </w:r>
     </w:p>
     <w:p>
@@ -15095,6 +15117,297 @@
           <w:rFonts w:ascii="Calibri" w:hAnsi="Calibri" w:eastAsia="Microsoft YaHei"/>
         </w:rPr>
         <w:t>临时文件与原包位于同一目录。提交前失败会删除临时文件并继续使用原包；DGTILE 只是显示缓存，即使坏负载被丢弃也不影响正式高程、分析或导出。</w:t>
+      </w:r>
+    </w:p>
+    <w:p>
+      <w:pPr>
+        <w:pStyle w:val="Heading2"/>
+      </w:pPr>
+      <w:r>
+        <w:t>4.24 跨层级渐进视口</w:t>
+      </w:r>
+    </w:p>
+    <w:p>
+      <w:r>
+        <w:rPr>
+          <w:rFonts w:ascii="Calibri" w:hAnsi="Calibri" w:eastAsia="Microsoft YaHei"/>
+        </w:rPr>
+        <w:t>v0.37 的 dt_grid_read_view_progressive_async() 继续返回普通 dt_task_handle，但在任务运行期间按粗到细发布完整、不可变的 GRID 视口帧。默认尺度序列是目标 LOD 的 4 倍、2 倍和目标层；所有层复用同一个二维瓦片目录、中心优先队列、在途合并、LRU 与可选 DGTILE 后端。</w:t>
+      </w:r>
+    </w:p>
+    <w:p>
+      <w:pPr>
+        <w:pStyle w:val="DterrainCode"/>
+        <w:shd w:fill="F2F4F7"/>
+      </w:pPr>
+      <w:r>
+        <w:rPr>
+          <w:rFonts w:ascii="Consolas" w:hAnsi="Consolas" w:eastAsia="Microsoft YaHei"/>
+          <w:sz w:val="17"/>
+        </w:rPr>
+        <w:t>dt_grid_progressive_view_options p{};</w:t>
+      </w:r>
+      <w:r>
+        <w:br/>
+      </w:r>
+      <w:r>
+        <w:rPr>
+          <w:rFonts w:ascii="Consolas" w:hAnsi="Consolas" w:eastAsia="Microsoft YaHei"/>
+          <w:sz w:val="17"/>
+        </w:rPr>
+        <w:t>p.struct_size = sizeof(p);</w:t>
+      </w:r>
+      <w:r>
+        <w:br/>
+      </w:r>
+      <w:r>
+        <w:rPr>
+          <w:rFonts w:ascii="Consolas" w:hAnsi="Consolas" w:eastAsia="Microsoft YaHei"/>
+          <w:sz w:val="17"/>
+        </w:rPr>
+        <w:t>p.initial_lod_multiplier = 4; // 2 的幂，0 选择 4</w:t>
+      </w:r>
+      <w:r>
+        <w:br/>
+      </w:r>
+      <w:r>
+        <w:rPr>
+          <w:rFonts w:ascii="Consolas" w:hAnsi="Consolas" w:eastAsia="Microsoft YaHei"/>
+          <w:sz w:val="17"/>
+        </w:rPr>
+        <w:t>p.maximum_frame_count = 3;    // 1..8，0 选择 3</w:t>
+      </w:r>
+      <w:r>
+        <w:br/>
+      </w:r>
+      <w:r>
+        <w:rPr>
+          <w:rFonts w:ascii="Consolas" w:hAnsi="Consolas" w:eastAsia="Microsoft YaHei"/>
+          <w:sz w:val="17"/>
+        </w:rPr>
+      </w:r>
+      <w:r>
+        <w:br/>
+      </w:r>
+      <w:r>
+        <w:rPr>
+          <w:rFonts w:ascii="Consolas" w:hAnsi="Consolas" w:eastAsia="Microsoft YaHei"/>
+          <w:sz w:val="17"/>
+        </w:rPr>
+        <w:t>dt_task_handle task = nullptr;</w:t>
+      </w:r>
+      <w:r>
+        <w:br/>
+      </w:r>
+      <w:r>
+        <w:rPr>
+          <w:rFonts w:ascii="Consolas" w:hAnsi="Consolas" w:eastAsia="Microsoft YaHei"/>
+          <w:sz w:val="17"/>
+        </w:rPr>
+        <w:t>dt_grid_read_view_progressive_async(cache, &amp;request, &amp;p, &amp;task);</w:t>
+      </w:r>
+      <w:r>
+        <w:br/>
+      </w:r>
+      <w:r>
+        <w:rPr>
+          <w:rFonts w:ascii="Consolas" w:hAnsi="Consolas" w:eastAsia="Microsoft YaHei"/>
+          <w:sz w:val="17"/>
+        </w:rPr>
+        <w:t>uint64_t sequence = 0;</w:t>
+      </w:r>
+      <w:r>
+        <w:br/>
+      </w:r>
+      <w:r>
+        <w:rPr>
+          <w:rFonts w:ascii="Consolas" w:hAnsi="Consolas" w:eastAsia="Microsoft YaHei"/>
+          <w:sz w:val="17"/>
+        </w:rPr>
+        <w:t>for (;;) {</w:t>
+      </w:r>
+      <w:r>
+        <w:br/>
+      </w:r>
+      <w:r>
+        <w:rPr>
+          <w:rFonts w:ascii="Consolas" w:hAnsi="Consolas" w:eastAsia="Microsoft YaHei"/>
+          <w:sz w:val="17"/>
+        </w:rPr>
+        <w:t xml:space="preserve">    int32_t available = 0;</w:t>
+      </w:r>
+      <w:r>
+        <w:br/>
+      </w:r>
+      <w:r>
+        <w:rPr>
+          <w:rFonts w:ascii="Consolas" w:hAnsi="Consolas" w:eastAsia="Microsoft YaHei"/>
+          <w:sz w:val="17"/>
+        </w:rPr>
+        <w:t xml:space="preserve">    dt_task_wait_for_grid_view_frame(task, sequence, 25, &amp;available);</w:t>
+      </w:r>
+      <w:r>
+        <w:br/>
+      </w:r>
+      <w:r>
+        <w:rPr>
+          <w:rFonts w:ascii="Consolas" w:hAnsi="Consolas" w:eastAsia="Microsoft YaHei"/>
+          <w:sz w:val="17"/>
+        </w:rPr>
+        <w:t xml:space="preserve">    if (!available) continue;</w:t>
+      </w:r>
+      <w:r>
+        <w:br/>
+      </w:r>
+      <w:r>
+        <w:rPr>
+          <w:rFonts w:ascii="Consolas" w:hAnsi="Consolas" w:eastAsia="Microsoft YaHei"/>
+          <w:sz w:val="17"/>
+        </w:rPr>
+        <w:t xml:space="preserve">    dt_grid_progressive_view_frame frame{};</w:t>
+      </w:r>
+      <w:r>
+        <w:br/>
+      </w:r>
+      <w:r>
+        <w:rPr>
+          <w:rFonts w:ascii="Consolas" w:hAnsi="Consolas" w:eastAsia="Microsoft YaHei"/>
+          <w:sz w:val="17"/>
+        </w:rPr>
+        <w:t xml:space="preserve">    frame.struct_size = sizeof(frame);</w:t>
+      </w:r>
+      <w:r>
+        <w:br/>
+      </w:r>
+      <w:r>
+        <w:rPr>
+          <w:rFonts w:ascii="Consolas" w:hAnsi="Consolas" w:eastAsia="Microsoft YaHei"/>
+          <w:sz w:val="17"/>
+        </w:rPr>
+        <w:t xml:space="preserve">    if (dt_task_get_grid_view_frame(task, sequence, &amp;frame) != DT_OK) continue;</w:t>
+      </w:r>
+      <w:r>
+        <w:br/>
+      </w:r>
+      <w:r>
+        <w:rPr>
+          <w:rFonts w:ascii="Consolas" w:hAnsi="Consolas" w:eastAsia="Microsoft YaHei"/>
+          <w:sz w:val="17"/>
+        </w:rPr>
+        <w:t xml:space="preserve">    sequence = frame.sequence;</w:t>
+      </w:r>
+      <w:r>
+        <w:br/>
+      </w:r>
+      <w:r>
+        <w:rPr>
+          <w:rFonts w:ascii="Consolas" w:hAnsi="Consolas" w:eastAsia="Microsoft YaHei"/>
+          <w:sz w:val="17"/>
+        </w:rPr>
+        <w:t xml:space="preserve">    upload_preview(frame.view.values, frame.view.width,</w:t>
+      </w:r>
+      <w:r>
+        <w:br/>
+      </w:r>
+      <w:r>
+        <w:rPr>
+          <w:rFonts w:ascii="Consolas" w:hAnsi="Consolas" w:eastAsia="Microsoft YaHei"/>
+          <w:sz w:val="17"/>
+        </w:rPr>
+        <w:t xml:space="preserve">                   frame.view.height, frame.view.row_stride);</w:t>
+      </w:r>
+      <w:r>
+        <w:br/>
+      </w:r>
+      <w:r>
+        <w:rPr>
+          <w:rFonts w:ascii="Consolas" w:hAnsi="Consolas" w:eastAsia="Microsoft YaHei"/>
+          <w:sz w:val="17"/>
+        </w:rPr>
+        <w:t xml:space="preserve">    if (frame.flags &amp; DT_GRID_PROGRESSIVE_FRAME_FINAL) break;</w:t>
+      </w:r>
+      <w:r>
+        <w:br/>
+      </w:r>
+      <w:r>
+        <w:rPr>
+          <w:rFonts w:ascii="Consolas" w:hAnsi="Consolas" w:eastAsia="Microsoft YaHei"/>
+          <w:sz w:val="17"/>
+        </w:rPr>
+        <w:t>}</w:t>
+      </w:r>
+      <w:r>
+        <w:br/>
+      </w:r>
+      <w:r>
+        <w:rPr>
+          <w:rFonts w:ascii="Consolas" w:hAnsi="Consolas" w:eastAsia="Microsoft YaHei"/>
+          <w:sz w:val="17"/>
+        </w:rPr>
+        <w:t>dt_task_destroy(task);</w:t>
+      </w:r>
+    </w:p>
+    <w:p>
+      <w:pPr>
+        <w:spacing w:before="100" w:after="160" w:line="288" w:lineRule="auto"/>
+        <w:ind w:left="230" w:right="230"/>
+        <w:shd w:fill="FFF7E0"/>
+      </w:pPr>
+      <w:r>
+        <w:rPr>
+          <w:rFonts w:ascii="Calibri" w:hAnsi="Calibri" w:eastAsia="Microsoft YaHei"/>
+          <w:b/>
+          <w:color w:val="7A5A00"/>
+        </w:rPr>
+        <w:t xml:space="preserve">帧与内存  </w:t>
+      </w:r>
+      <w:r>
+        <w:rPr>
+          <w:rFonts w:ascii="Calibri" w:hAnsi="Calibri" w:eastAsia="Microsoft YaHei"/>
+        </w:rPr>
+        <w:t>sequence 从 1 单调递增，getter 返回第一个大于 after_sequence 的帧。每帧 values 在任务销毁前都有效，后台细化不会使旧指针悬空。为此任务会保留最多 8 个显示缓冲，全部帧像素总量上限 512 MiB；输出应限制在屏幕级尺寸，并及时取消和销毁过期任务。</w:t>
+      </w:r>
+    </w:p>
+    <w:p>
+      <w:pPr>
+        <w:spacing w:before="100" w:after="160" w:line="288" w:lineRule="auto"/>
+        <w:ind w:left="230" w:right="230"/>
+        <w:shd w:fill="E8EEF5"/>
+      </w:pPr>
+      <w:r>
+        <w:rPr>
+          <w:rFonts w:ascii="Calibri" w:hAnsi="Calibri" w:eastAsia="Microsoft YaHei"/>
+          <w:b/>
+          <w:color w:val="1F4D78"/>
+        </w:rPr>
+        <w:t xml:space="preserve">兼容与取消  </w:t>
+      </w:r>
+      <w:r>
+        <w:rPr>
+          <w:rFonts w:ascii="Calibri" w:hAnsi="Calibri" w:eastAsia="Microsoft YaHei"/>
+        </w:rPr>
+        <w:t>结果种类仍为 DT_TASK_RESULT_GRID_VIEW；成功后旧的 dt_task_get_grid_view_result() 返回最终帧。预取和 DGRIDB 窗口块校验只在首层执行一次并传播摘要；取消不发布半帧，已发布帧仍是完整历史画面。</w:t>
+      </w:r>
+    </w:p>
+    <w:p>
+      <w:pPr>
+        <w:spacing w:before="100" w:after="160" w:line="288" w:lineRule="auto"/>
+        <w:ind w:left="230" w:right="230"/>
+        <w:shd w:fill="E8EEF5"/>
+      </w:pPr>
+      <w:r>
+        <w:rPr>
+          <w:rFonts w:ascii="Calibri" w:hAnsi="Calibri" w:eastAsia="Microsoft YaHei"/>
+          <w:b/>
+          <w:color w:val="1F4D78"/>
+        </w:rPr>
+        <w:t xml:space="preserve">本机基准  </w:t>
+      </w:r>
+      <w:r>
+        <w:rPr>
+          <w:rFonts w:ascii="Calibri" w:hAnsi="Calibri" w:eastAsia="Microsoft YaHei"/>
+        </w:rPr>
+        <w:t>4096×2048、1024×768→512×512：默认 s4/s2/s1 三层首帧约 5.18 ms，最终约 13.86 ms；同轮单层冷缓存约 7.24 ms。渐进模式用更多总工作量换取更早首个可用画面。</w:t>
       </w:r>
     </w:p>
     <w:p>
@@ -20270,7 +20583,7 @@
         <w:color w:val="66727D"/>
         <w:sz w:val="18"/>
       </w:rPr>
-      <w:t xml:space="preserve">版本 0.36.0  |  第 </w:t>
+      <w:t xml:space="preserve">版本 0.37.0  |  第 </w:t>
     </w:r>
     <w:r>
       <w:rPr>

</xml_diff>

<commit_message>
feat: add chunked Direct3D terrain rendering
</commit_message>
<xml_diff>
--- a/docs/manuals/dterrain_DLL开发使用手册.docx
+++ b/docs/manuals/dterrain_DLL开发使用手册.docx
@@ -85,7 +85,7 @@
           <w:color w:val="203748"/>
           <w:sz w:val="22"/>
         </w:rPr>
-        <w:t>版本 0.37.0  |  2026-07-19</w:t>
+        <w:t>版本 0.40.0  |  2026-07-19</w:t>
       </w:r>
     </w:p>
     <w:p>
@@ -243,7 +243,7 @@
                 <w:rFonts w:ascii="Calibri" w:hAnsi="Calibri" w:eastAsia="Microsoft YaHei"/>
                 <w:sz w:val="18"/>
               </w:rPr>
-              <w:t>0.37.0</w:t>
+              <w:t>0.40.0</w:t>
             </w:r>
           </w:p>
         </w:tc>
@@ -665,7 +665,7 @@
         <w:rPr>
           <w:rFonts w:ascii="Calibri" w:hAnsi="Calibri" w:eastAsia="Microsoft YaHei"/>
         </w:rPr>
-        <w:t>本手册对应 dterrain 0.37.0：新增粗到细的跨层级渐进视口帧、序列等待/读取和 GUI 连续发布；v0.36 DGTILE 在线压缩、跨进程单写保护及全部旧接口保持兼容。</w:t>
+        <w:t>本手册对应 dterrain 0.40.0：GUI 新增 Direct3D 11 分块地形、GPU ID 拾取和 TIN 贴地漫游；v0.37 粗到细渐进视口、v0.36 DGTILE 生命周期管理及全部旧 DLL 接口保持兼容。</w:t>
       </w:r>
     </w:p>
     <w:p>
@@ -15408,6 +15408,51 @@
           <w:rFonts w:ascii="Calibri" w:hAnsi="Calibri" w:eastAsia="Microsoft YaHei"/>
         </w:rPr>
         <w:t>4096×2048、1024×768→512×512：默认 s4/s2/s1 三层首帧约 5.18 ms，最终约 13.86 ms；同轮单层冷缓存约 7.24 ms。渐进模式用更多总工作量换取更早首个可用画面。</w:t>
+      </w:r>
+    </w:p>
+    <w:p>
+      <w:pPr>
+        <w:pStyle w:val="Heading2"/>
+      </w:pPr>
+      <w:r>
+        <w:t>4.25 Direct3D 11 分块三维集成</w:t>
+      </w:r>
+    </w:p>
+    <w:p>
+      <w:r>
+        <w:rPr>
+          <w:rFonts w:ascii="Calibri" w:hAnsi="Calibri" w:eastAsia="Microsoft YaHei"/>
+        </w:rPr>
+        <w:t>v0.40 的三维实现位于 GUI 集成层，不改变 DLL C ABI。terrain_gpu.cpp 把完整 TIN 按 16,384 面切分为不可变顶点缓冲，每个顶点携带归一化位置、高程比例、面法向和全局三角形 ID；块包围球用于相机视锥粗裁剪，GPU 深度缓冲替代软件画家排序。硬件设备失败后尝试 WARP，仍失败则隐藏 D3D 子窗口并回退原 GDI 路径。</w:t>
+      </w:r>
+    </w:p>
+    <w:p>
+      <w:r>
+        <w:rPr>
+          <w:rFonts w:ascii="Calibri" w:hAnsi="Calibri" w:eastAsia="Microsoft YaHei"/>
+        </w:rPr>
+        <w:t>拾取通道把三角形 ID 写入 R32_UINT 离屏目标，只将点击处一个像素复制到 1×1 staging 纹理。贴地漫游把归一化相机目标反算为世界 XY，通过 dt_locate_point_xy() 获得支撑顶点、边或面并作线性高程插值。该策略保证拾取颜色和贴地高度不依赖近似显示 LOD。</w:t>
+      </w:r>
+    </w:p>
+    <w:p>
+      <w:pPr>
+        <w:spacing w:before="100" w:after="160" w:line="288" w:lineRule="auto"/>
+        <w:ind w:left="230" w:right="230"/>
+        <w:shd w:fill="FFF7E0"/>
+      </w:pPr>
+      <w:r>
+        <w:rPr>
+          <w:rFonts w:ascii="Calibri" w:hAnsi="Calibri" w:eastAsia="Microsoft YaHei"/>
+          <w:b/>
+          <w:color w:val="7A5A00"/>
+        </w:rPr>
+        <w:t xml:space="preserve">资源边界  </w:t>
+      </w:r>
+      <w:r>
+        <w:rPr>
+          <w:rFonts w:ascii="Calibri" w:hAnsi="Calibri" w:eastAsia="Microsoft YaHei"/>
+        </w:rPr>
+        <w:t>当前 TIN 改变或垂直夸张改变时同步重建全部 GPU 块；尚未实现三维块后台上传、显存 LRU、几何 LOD 与跨块裂缝处理。千万点连续三维仍需后续流式化，二维编辑、分析和导出不受此限制。</w:t>
       </w:r>
     </w:p>
     <w:p>
@@ -20583,7 +20628,7 @@
         <w:color w:val="66727D"/>
         <w:sz w:val="18"/>
       </w:rPr>
-      <w:t xml:space="preserve">版本 0.37.0  |  第 </w:t>
+      <w:t xml:space="preserve">版本 0.40.0  |  第 </w:t>
     </w:r>
     <w:r>
       <w:rPr>

</xml_diff>

<commit_message>
feat: add CRS reprojection and standard terrain exchange
</commit_message>
<xml_diff>
--- a/docs/manuals/dterrain_DLL开发使用手册.docx
+++ b/docs/manuals/dterrain_DLL开发使用手册.docx
@@ -85,7 +85,7 @@
           <w:color w:val="203748"/>
           <w:sz w:val="22"/>
         </w:rPr>
-        <w:t>版本 0.40.0  |  2026-07-19</w:t>
+        <w:t>版本 0.55.0  |  2026-07-19</w:t>
       </w:r>
     </w:p>
     <w:p>
@@ -243,7 +243,7 @@
                 <w:rFonts w:ascii="Calibri" w:hAnsi="Calibri" w:eastAsia="Microsoft YaHei"/>
                 <w:sz w:val="18"/>
               </w:rPr>
-              <w:t>0.40.0</w:t>
+              <w:t>0.55.0</w:t>
             </w:r>
           </w:p>
         </w:tc>
@@ -665,7 +665,7 @@
         <w:rPr>
           <w:rFonts w:ascii="Calibri" w:hAnsi="Calibri" w:eastAsia="Microsoft YaHei"/>
         </w:rPr>
-        <w:t>本手册对应 dterrain 0.40.0：GUI 新增 Direct3D 11 分块地形、GPU ID 拾取和 TIN 贴地漫游；v0.37 粗到细渐进视口、v0.36 DGTILE 生命周期管理及全部旧 DLL 接口保持兼容。</w:t>
+        <w:t>本手册对应 dterrain 0.55.0：新增 CRS 规范化、等价判断、批量坐标转换，以及 TIN、GRID、等高线的显式 GDAL/PROJ 重投影；v0.40 Direct3D 分块地形、GPU 拾取和贴地漫游及全部旧 DLL 接口保持兼容。</w:t>
       </w:r>
     </w:p>
     <w:p>
@@ -7031,7 +7031,7 @@
         <w:rPr>
           <w:rFonts w:ascii="Calibri" w:hAnsi="Calibri" w:eastAsia="Microsoft YaHei"/>
         </w:rPr>
-        <w:t>dt_gdal_api.h 是可选适配层。默认 DT_WITH_GDAL=OFF 时函数仍然导出，但返回 DT_E_UNSUPPORTED；启用后可导入导出 GeoTIFF/COG GRID 和 GeoPackage 等高线。TIN、GRID 与等高线的 CRS 以 UTF-8 WKT 保存并在转换时传播，当前不执行坐标重投影。</w:t>
+        <w:t>dt_gdal_api.h 是可选适配层。默认 DT_WITH_GDAL=OFF 时函数仍然导出，但返回 DT_E_UNSUPPORTED；启用后可通过 GDAL 驱动读写常见单波段地形栅格和 LineString 等高线。TIN、GRID 与等高线的 CRS 以 UTF-8 WKT 保存；v0.55 起可显式执行 CRS 规范化、等价判断、批量点转换和三类地形对象重投影。</w:t>
       </w:r>
     </w:p>
     <w:p>
@@ -7547,7 +7547,7 @@
         <w:rPr>
           <w:rFonts w:ascii="Calibri" w:hAnsi="Calibri" w:eastAsia="Microsoft YaHei"/>
         </w:rPr>
-        <w:t>v0.13 的演示程序启动时探测 GTiff、COG、GPKG 驱动，按能力启用五个数据交换菜单。栅格导入只替换 GRID，GeoPackage 导入只替换等高线，普通 TIN、CDT 和无关图层保持不变。</w:t>
+        <w:t>演示程序启动时探测 GDAL 及 GTiff、COG、GPKG 写驱动。普通导入仍只替换同类图层；v0.55 的显式重投影替换当前同类图层并隐藏其他坐标系图层，避免误叠加。</w:t>
       </w:r>
     </w:p>
     <w:p>
@@ -15453,6 +15453,163 @@
           <w:rFonts w:ascii="Calibri" w:hAnsi="Calibri" w:eastAsia="Microsoft YaHei"/>
         </w:rPr>
         <w:t>当前 TIN 改变或垂直夸张改变时同步重建全部 GPU 块；尚未实现三维块后台上传、显存 LRU、几何 LOD 与跨块裂缝处理。千万点连续三维仍需后续流式化，二维编辑、分析和导出不受此限制。</w:t>
+      </w:r>
+    </w:p>
+    <w:p>
+      <w:pPr>
+        <w:pStyle w:val="Heading2"/>
+      </w:pPr>
+      <w:r>
+        <w:t>4.26 CRS 与三类地形对象重投影</w:t>
+      </w:r>
+    </w:p>
+    <w:p>
+      <w:r>
+        <w:rPr>
+          <w:rFonts w:ascii="Calibri" w:hAnsi="Calibri" w:eastAsia="Microsoft YaHei"/>
+        </w:rPr>
+        <w:t>v0.55 的 dt_crs_normalize_wkt() 接受 EPSG:xxxx、WKT、PROJ 字符串等 GDAL user input 并输出规范 WKT；dt_crs_is_same() 用语义等价而不是字符串相等判断坐标系。dt_crs_transform_points() 按传统 GIS XY 轴序分批转换，先在临时缓冲完成全部点，任一点失败都不改写调用方输出。</w:t>
+      </w:r>
+    </w:p>
+    <w:p>
+      <w:pPr>
+        <w:pStyle w:val="DterrainCode"/>
+        <w:shd w:fill="F2F4F7"/>
+      </w:pPr>
+      <w:r>
+        <w:rPr>
+          <w:rFonts w:ascii="Consolas" w:hAnsi="Consolas" w:eastAsia="Microsoft YaHei"/>
+          <w:sz w:val="17"/>
+        </w:rPr>
+        <w:t>dt_point3 input[] = {{116.0, 40.0, 100.0}};</w:t>
+      </w:r>
+      <w:r>
+        <w:br/>
+      </w:r>
+      <w:r>
+        <w:rPr>
+          <w:rFonts w:ascii="Consolas" w:hAnsi="Consolas" w:eastAsia="Microsoft YaHei"/>
+          <w:sz w:val="17"/>
+        </w:rPr>
+        <w:t>dt_point3 output[1]{};</w:t>
+      </w:r>
+      <w:r>
+        <w:br/>
+      </w:r>
+      <w:r>
+        <w:rPr>
+          <w:rFonts w:ascii="Consolas" w:hAnsi="Consolas" w:eastAsia="Microsoft YaHei"/>
+          <w:sz w:val="17"/>
+        </w:rPr>
+        <w:t>dt_crs_transform_points("EPSG:4326", "EPSG:3857",</w:t>
+      </w:r>
+      <w:r>
+        <w:br/>
+      </w:r>
+      <w:r>
+        <w:rPr>
+          <w:rFonts w:ascii="Consolas" w:hAnsi="Consolas" w:eastAsia="Microsoft YaHei"/>
+          <w:sz w:val="17"/>
+        </w:rPr>
+        <w:t xml:space="preserve">                        input, 1, output);</w:t>
+      </w:r>
+      <w:r>
+        <w:br/>
+      </w:r>
+      <w:r>
+        <w:rPr>
+          <w:rFonts w:ascii="Consolas" w:hAnsi="Consolas" w:eastAsia="Microsoft YaHei"/>
+          <w:sz w:val="17"/>
+        </w:rPr>
+      </w:r>
+      <w:r>
+        <w:br/>
+      </w:r>
+      <w:r>
+        <w:rPr>
+          <w:rFonts w:ascii="Consolas" w:hAnsi="Consolas" w:eastAsia="Microsoft YaHei"/>
+          <w:sz w:val="17"/>
+        </w:rPr>
+        <w:t>dt_gdal_reproject_options opt{};</w:t>
+      </w:r>
+      <w:r>
+        <w:br/>
+      </w:r>
+      <w:r>
+        <w:rPr>
+          <w:rFonts w:ascii="Consolas" w:hAnsi="Consolas" w:eastAsia="Microsoft YaHei"/>
+          <w:sz w:val="17"/>
+        </w:rPr>
+        <w:t>opt.struct_size = sizeof(opt);</w:t>
+      </w:r>
+      <w:r>
+        <w:br/>
+      </w:r>
+      <w:r>
+        <w:rPr>
+          <w:rFonts w:ascii="Consolas" w:hAnsi="Consolas" w:eastAsia="Microsoft YaHei"/>
+          <w:sz w:val="17"/>
+        </w:rPr>
+        <w:t>opt.target_crs = "EPSG:4490";</w:t>
+      </w:r>
+      <w:r>
+        <w:br/>
+      </w:r>
+      <w:r>
+        <w:rPr>
+          <w:rFonts w:ascii="Consolas" w:hAnsi="Consolas" w:eastAsia="Microsoft YaHei"/>
+          <w:sz w:val="17"/>
+        </w:rPr>
+        <w:t>opt.resample_algorithm = DT_GDAL_RESAMPLE_BILINEAR;</w:t>
+      </w:r>
+      <w:r>
+        <w:br/>
+      </w:r>
+      <w:r>
+        <w:rPr>
+          <w:rFonts w:ascii="Consolas" w:hAnsi="Consolas" w:eastAsia="Microsoft YaHei"/>
+          <w:sz w:val="17"/>
+        </w:rPr>
+        <w:t>dt_grid_handle projected = nullptr;</w:t>
+      </w:r>
+      <w:r>
+        <w:br/>
+      </w:r>
+      <w:r>
+        <w:rPr>
+          <w:rFonts w:ascii="Consolas" w:hAnsi="Consolas" w:eastAsia="Microsoft YaHei"/>
+          <w:sz w:val="17"/>
+        </w:rPr>
+        <w:t>dt_grid_reproject_gdal(source, &amp;opt, &amp;projected);</w:t>
+      </w:r>
+    </w:p>
+    <w:p>
+      <w:r>
+        <w:rPr>
+          <w:rFonts w:ascii="Calibri" w:hAnsi="Calibri" w:eastAsia="Microsoft YaHei"/>
+        </w:rPr>
+        <w:t>dt_tin_reproject_gdal() 转换全部顶点后在目标平面重新构建 Delaunay；dt_grid_reproject_gdal() 默认用 GDAL 推导北向上输出范围与分辨率，也可用 DT_GDAL_REPROJECT_EXPLICIT_GRID 指定节点中心仿射、宽高和重采样方法；dt_contours_reproject_gdal() 保留折线分组与闭合标志。三个入口都返回独立句柄，源对象保持不变。</w:t>
+      </w:r>
+    </w:p>
+    <w:p>
+      <w:pPr>
+        <w:spacing w:before="100" w:after="160" w:line="288" w:lineRule="auto"/>
+        <w:ind w:left="230" w:right="230"/>
+        <w:shd w:fill="FFF7E0"/>
+      </w:pPr>
+      <w:r>
+        <w:rPr>
+          <w:rFonts w:ascii="Calibri" w:hAnsi="Calibri" w:eastAsia="Microsoft YaHei"/>
+          <w:b/>
+          <w:color w:val="7A5A00"/>
+        </w:rPr>
+        <w:t xml:space="preserve">工程约束  </w:t>
+      </w:r>
+      <w:r>
+        <w:rPr>
+          <w:rFonts w:ascii="Calibri" w:hAnsi="Calibri" w:eastAsia="Microsoft YaHei"/>
+        </w:rPr>
+        <w:t>重投影必须由调用方显式发起，原有 GRID 对齐、土方和转换接口仍不静默改坐标。源对象必须携带有效 CRS；调用方负责确认 XY/Z 单位与目标用途。自动 GRID 输出适合通用交换，工程对齐应使用显式输出网格。</w:t>
       </w:r>
     </w:p>
     <w:p>
@@ -20628,7 +20785,7 @@
         <w:color w:val="66727D"/>
         <w:sz w:val="18"/>
       </w:rPr>
-      <w:t xml:space="preserve">版本 0.40.0  |  第 </w:t>
+      <w:t xml:space="preserve">版本 0.55.0  |  第 </w:t>
     </w:r>
     <w:r>
       <w:rPr>

</xml_diff>

<commit_message>
feat: add local CDT editing and indexed binary exchange
</commit_message>
<xml_diff>
--- a/docs/manuals/dterrain_DLL开发使用手册.docx
+++ b/docs/manuals/dterrain_DLL开发使用手册.docx
@@ -85,7 +85,7 @@
           <w:color w:val="203748"/>
           <w:sz w:val="22"/>
         </w:rPr>
-        <w:t>版本 0.55.0  |  2026-07-19</w:t>
+        <w:t>版本 0.70.0  |  2026-07-19</w:t>
       </w:r>
     </w:p>
     <w:p>
@@ -243,7 +243,7 @@
                 <w:rFonts w:ascii="Calibri" w:hAnsi="Calibri" w:eastAsia="Microsoft YaHei"/>
                 <w:sz w:val="18"/>
               </w:rPr>
-              <w:t>0.55.0</w:t>
+              <w:t>0.70.0</w:t>
             </w:r>
           </w:p>
         </w:tc>
@@ -665,7 +665,7 @@
         <w:rPr>
           <w:rFonts w:ascii="Calibri" w:hAnsi="Calibri" w:eastAsia="Microsoft YaHei"/>
         </w:rPr>
-        <w:t>本手册对应 dterrain 0.55.0：新增 CRS 规范化、等价判断、批量坐标转换，以及 TIN、GRID、等高线的显式 GDAL/PROJ 重投影；v0.40 Direct3D 分块地形、GPU 拾取和贴地漫游及全部旧 DLL 接口保持兼容。</w:t>
+        <w:t>本手册对应 dterrain 0.70.0：新增 CDT 无交叉断裂线局部拓扑插入、可配置交叉自动节点化，以及带范围目录和校验的 DCDTB 二进制交换；v0.55 CRS 重投影、v0.40 Direct3D 三维显示及全部旧 DLL 接口保持兼容。</w:t>
       </w:r>
     </w:p>
     <w:p>
@@ -942,7 +942,7 @@
         <w:rPr>
           <w:rFonts w:ascii="Calibri" w:hAnsi="Calibri" w:eastAsia="Microsoft YaHei"/>
         </w:rPr>
-        <w:t>独立 CDT 句柄、断裂线、外边界、孔洞、域内查询、约束增删与 DCDT 文本往返。</w:t>
+        <w:t>独立 CDT 句柄、断裂线、外边界、孔洞、局部新增、交叉节点化，以及 DCDT/DCDTB 往返。</w:t>
       </w:r>
     </w:p>
     <w:p>
@@ -1439,7 +1439,7 @@
         <w:rPr>
           <w:rFonts w:ascii="Calibri" w:hAnsi="Calibri" w:eastAsia="Microsoft YaHei"/>
         </w:rPr>
-        <w:t>GRID→TIN 和等高线→TIN 都重建普通 Delaunay；严格折线、边界和孔洞应使用独立 dt_cdt_handle。v0.24 单项约束编辑仍采用候选网全量重建；批量事务把 N 次重建降为 1 次，但尚未达到百万点实时局部 CDT 编辑。GUI 多边形土方针对水平基准面并使用固定预算数值积分；双 GRID 接口要求节点对齐，错位表面可先显式重采样。所有土方结果均需结合项目规范复核后用于工程结算。</w:t>
+        <w:t>GRID→TIN 和等高线→TIN 都重建普通 Delaunay；严格折线、边界和孔洞应使用独立 dt_cdt_handle。v0.70 新增无交叉断裂线局部拓扑路径；边界、改形、删除、自动节点化和批量事务仍完整构建原子候选网。GUI 多边形土方针对水平基准面并使用固定预算数值积分；双 GRID 接口要求节点对齐，错位表面可先显式重采样。所有土方结果均需结合项目规范复核后用于工程结算。</w:t>
       </w:r>
     </w:p>
     <w:p>
@@ -6104,6 +6104,86 @@
           </w:p>
         </w:tc>
       </w:tr>
+      <w:tr>
+        <w:trPr>
+          <w:cantSplit/>
+        </w:trPr>
+        <w:tc>
+          <w:tcPr>
+            <w:tcW w:type="dxa" w:w="3200"/>
+            <w:tcMar>
+              <w:top w:w="80" w:type="dxa"/>
+              <w:start w:w="120" w:type="dxa"/>
+              <w:bottom w:w="80" w:type="dxa"/>
+              <w:end w:w="120" w:type="dxa"/>
+            </w:tcMar>
+            <w:vAlign w:val="center"/>
+          </w:tcPr>
+          <w:p>
+            <w:pPr>
+              <w:spacing w:before="0" w:after="0" w:line="276" w:lineRule="auto"/>
+              <w:jc w:val="left"/>
+            </w:pPr>
+            <w:r>
+              <w:rPr>
+                <w:rFonts w:ascii="Calibri" w:hAnsi="Calibri" w:eastAsia="Microsoft YaHei"/>
+                <w:sz w:val="18"/>
+              </w:rPr>
+              <w:t>dt_cdt_save/load_binary</w:t>
+            </w:r>
+          </w:p>
+        </w:tc>
+        <w:tc>
+          <w:tcPr>
+            <w:tcW w:type="dxa" w:w="1800"/>
+            <w:tcMar>
+              <w:top w:w="80" w:type="dxa"/>
+              <w:start w:w="120" w:type="dxa"/>
+              <w:bottom w:w="80" w:type="dxa"/>
+              <w:end w:w="120" w:type="dxa"/>
+            </w:tcMar>
+            <w:vAlign w:val="center"/>
+          </w:tcPr>
+          <w:p>
+            <w:pPr>
+              <w:spacing w:before="0" w:after="0" w:line="276" w:lineRule="auto"/>
+              <w:jc w:val="center"/>
+            </w:pPr>
+            <w:r>
+              <w:rPr>
+                <w:rFonts w:ascii="Calibri" w:hAnsi="Calibri" w:eastAsia="Microsoft YaHei"/>
+                <w:sz w:val="18"/>
+              </w:rPr>
+              <w:t>DCDTB 1</w:t>
+            </w:r>
+          </w:p>
+        </w:tc>
+        <w:tc>
+          <w:tcPr>
+            <w:tcW w:type="dxa" w:w="4360"/>
+            <w:tcMar>
+              <w:top w:w="80" w:type="dxa"/>
+              <w:start w:w="120" w:type="dxa"/>
+              <w:bottom w:w="80" w:type="dxa"/>
+              <w:end w:w="120" w:type="dxa"/>
+            </w:tcMar>
+            <w:vAlign w:val="center"/>
+          </w:tcPr>
+          <w:p>
+            <w:pPr>
+              <w:spacing w:before="0" w:after="0" w:line="276" w:lineRule="auto"/>
+              <w:jc w:val="left"/>
+            </w:pPr>
+            <w:r>
+              <w:rPr>
+                <w:rFonts w:ascii="Calibri" w:hAnsi="Calibri" w:eastAsia="Microsoft YaHei"/>
+                <w:sz w:val="18"/>
+              </w:rPr>
+              <w:t>带范围目录、偏移和全载荷校验的约束网二进制。</w:t>
+            </w:r>
+          </w:p>
+        </w:tc>
+      </w:tr>
     </w:tbl>
     <w:p>
       <w:pPr>
@@ -8433,7 +8513,109 @@
         <w:rPr>
           <w:rFonts w:ascii="Calibri" w:hAnsi="Calibri" w:eastAsia="Microsoft YaHei"/>
         </w:rPr>
-        <w:t>当前单项约束编辑仍完整重建候选 CDT；批量事务只重建一次。100,000 基础点添加 12 条断裂线的本机对比为逐条 3.259 s、批量 0.528 s，约 6.17 倍。请求 output_effect 还会计算完整域差异。未分段交叉仍须先加入共享顶点。</w:t>
+        <w:t>拒绝交叉模式下新增普通断裂线复制原子候选后直接局部插入 CGAL 拓扑，不从全部基础点重建；边界、改形、删除和自动节点化仍完整重建。SPLIT_COMPATIBLE_Z 用 R-tree 筛选相交段，并仅在两线插值 Z 满足显式容差时写入共享交点；共线重叠始终拒绝。dt_cdt_get_edit_metrics() 可核实实际路径。</w:t>
+      </w:r>
+    </w:p>
+    <w:p>
+      <w:pPr>
+        <w:pStyle w:val="DterrainCode"/>
+        <w:shd w:fill="F2F4F7"/>
+      </w:pPr>
+      <w:r>
+        <w:rPr>
+          <w:rFonts w:ascii="Consolas" w:hAnsi="Consolas" w:eastAsia="Microsoft YaHei"/>
+          <w:sz w:val="17"/>
+        </w:rPr>
+        <w:t>dt_cdt_options options{};</w:t>
+      </w:r>
+      <w:r>
+        <w:br/>
+      </w:r>
+      <w:r>
+        <w:rPr>
+          <w:rFonts w:ascii="Consolas" w:hAnsi="Consolas" w:eastAsia="Microsoft YaHei"/>
+          <w:sz w:val="17"/>
+        </w:rPr>
+        <w:t>options.struct_size = sizeof(options);</w:t>
+      </w:r>
+      <w:r>
+        <w:br/>
+      </w:r>
+      <w:r>
+        <w:rPr>
+          <w:rFonts w:ascii="Consolas" w:hAnsi="Consolas" w:eastAsia="Microsoft YaHei"/>
+          <w:sz w:val="17"/>
+        </w:rPr>
+        <w:t>options.crossing_policy = DT_CDT_CROSSING_SPLIT_COMPATIBLE_Z;</w:t>
+      </w:r>
+      <w:r>
+        <w:br/>
+      </w:r>
+      <w:r>
+        <w:rPr>
+          <w:rFonts w:ascii="Consolas" w:hAnsi="Consolas" w:eastAsia="Microsoft YaHei"/>
+          <w:sz w:val="17"/>
+        </w:rPr>
+        <w:t>options.crossing_z_tolerance = 0.001;</w:t>
+      </w:r>
+      <w:r>
+        <w:br/>
+      </w:r>
+      <w:r>
+        <w:rPr>
+          <w:rFonts w:ascii="Consolas" w:hAnsi="Consolas" w:eastAsia="Microsoft YaHei"/>
+          <w:sz w:val="17"/>
+        </w:rPr>
+        <w:t>dt_cdt_create(&amp;options, &amp;cdt);</w:t>
+      </w:r>
+      <w:r>
+        <w:br/>
+      </w:r>
+      <w:r>
+        <w:rPr>
+          <w:rFonts w:ascii="Consolas" w:hAnsi="Consolas" w:eastAsia="Microsoft YaHei"/>
+          <w:sz w:val="17"/>
+        </w:rPr>
+      </w:r>
+      <w:r>
+        <w:br/>
+      </w:r>
+      <w:r>
+        <w:rPr>
+          <w:rFonts w:ascii="Consolas" w:hAnsi="Consolas" w:eastAsia="Microsoft YaHei"/>
+          <w:sz w:val="17"/>
+        </w:rPr>
+        <w:t>dt_cdt_save_binary(cdt, "terrain.dcdtb");</w:t>
+      </w:r>
+      <w:r>
+        <w:br/>
+      </w:r>
+      <w:r>
+        <w:rPr>
+          <w:rFonts w:ascii="Consolas" w:hAnsi="Consolas" w:eastAsia="Microsoft YaHei"/>
+          <w:sz w:val="17"/>
+        </w:rPr>
+        <w:t>dt_bounds2 window{500000, 3000000, 501000, 3001000};</w:t>
+      </w:r>
+      <w:r>
+        <w:br/>
+      </w:r>
+      <w:r>
+        <w:rPr>
+          <w:rFonts w:ascii="Consolas" w:hAnsi="Consolas" w:eastAsia="Microsoft YaHei"/>
+          <w:sz w:val="17"/>
+        </w:rPr>
+        <w:t>uint64_t count = 0;</w:t>
+      </w:r>
+      <w:r>
+        <w:br/>
+      </w:r>
+      <w:r>
+        <w:rPr>
+          <w:rFonts w:ascii="Consolas" w:hAnsi="Consolas" w:eastAsia="Microsoft YaHei"/>
+          <w:sz w:val="17"/>
+        </w:rPr>
+        <w:t>dt_cdt_query_binary_index("terrain.dcdtb", &amp;window, nullptr, 0, &amp;count);</w:t>
       </w:r>
     </w:p>
     <w:p>
@@ -17225,7 +17407,7 @@
         <w:pStyle w:val="Heading2"/>
       </w:pPr>
       <w:r>
-        <w:t>6.8 DCDT 约束网文本</w:t>
+        <w:t>6.8 DCDT / DCDTB 约束网</w:t>
       </w:r>
     </w:p>
     <w:p>
@@ -17233,7 +17415,15 @@
         <w:rPr>
           <w:rFonts w:ascii="Calibri" w:hAnsi="Calibri" w:eastAsia="Microsoft YaHei"/>
         </w:rPr>
-        <w:t>DCDT 1 保存 CRS、基础 XYZ 点和约束记录。每条约束包含稳定 ID、类型、闭合标志、点数和 XYZ；加载时完整重建 CDT 并重新标记域，失败不会覆盖原对象。</w:t>
+        <w:t>DCDT 1 保存 CRS、基础 XYZ 点和约束记录。每条约束包含稳定 ID、类型、闭合标志、点数和 XYZ；加载时完整重建 CDT 并重新标记域，失败不会覆盖原对象。DCDTB 1 增加固定 64 字节约束目录、XY 包围盒、点载荷绝对偏移及 FNV-1a 全载荷校验，适合大约束网。</w:t>
+      </w:r>
+    </w:p>
+    <w:p>
+      <w:r>
+        <w:rPr>
+          <w:rFonts w:ascii="Calibri" w:hAnsi="Calibri" w:eastAsia="Microsoft YaHei"/>
+        </w:rPr>
+        <w:t>dt_cdt_query_binary_index() 只扫描目录即可按窗口列出约束；dt_cdt_read_binary_constraint() 按稳定 ID 直接读取一条折线，均不要求创建或构建 CDT。完整加载会先验证校验值，再原子替换目标句柄。</w:t>
       </w:r>
     </w:p>
     <w:p>
@@ -20785,7 +20975,7 @@
         <w:color w:val="66727D"/>
         <w:sz w:val="18"/>
       </w:rPr>
-      <w:t xml:space="preserve">版本 0.55.0  |  第 </w:t>
+      <w:t xml:space="preserve">版本 0.70.0  |  第 </w:t>
     </w:r>
     <w:r>
       <w:rPr>

</xml_diff>

<commit_message>
feat: add exact terrain clipping and surface registration
</commit_message>
<xml_diff>
--- a/docs/manuals/dterrain_DLL开发使用手册.docx
+++ b/docs/manuals/dterrain_DLL开发使用手册.docx
@@ -85,7 +85,7 @@
           <w:color w:val="203748"/>
           <w:sz w:val="22"/>
         </w:rPr>
-        <w:t>版本 0.70.0  |  2026-07-19</w:t>
+        <w:t>版本 0.85.0  |  2026-07-19</w:t>
       </w:r>
     </w:p>
     <w:p>
@@ -243,7 +243,7 @@
                 <w:rFonts w:ascii="Calibri" w:hAnsi="Calibri" w:eastAsia="Microsoft YaHei"/>
                 <w:sz w:val="18"/>
               </w:rPr>
-              <w:t>0.70.0</w:t>
+              <w:t>0.85.0</w:t>
             </w:r>
           </w:p>
         </w:tc>
@@ -665,7 +665,7 @@
         <w:rPr>
           <w:rFonts w:ascii="Calibri" w:hAnsi="Calibri" w:eastAsia="Microsoft YaHei"/>
         </w:rPr>
-        <w:t>本手册对应 dterrain 0.70.0：新增 CDT 无交叉断裂线局部拓扑插入、可配置交叉自动节点化，以及带范围目录和校验的 DCDTB 二进制交换；v0.55 CRS 重投影、v0.40 Direct3D 三维显示及全部旧 DLL 接口保持兼容。</w:t>
+        <w:t>本手册对应 dterrain 0.85.0：新增 TIN/CDT 多环精确边界裁剪、双 GRID 2.5D 平移配准、配准后重采样和带 RMSE 标准误差停止条件的自适应误差评估；v0.70 CDT/DCDTB、v0.55 CRS 重投影及全部旧 DLL 接口保持兼容。</w:t>
       </w:r>
     </w:p>
     <w:p>
@@ -12500,6 +12500,225 @@
           <w:rFonts w:ascii="Calibri" w:hAnsi="Calibri" w:eastAsia="Microsoft YaHei"/>
         </w:rPr>
         <w:t>4096×4096、8 顶点多边形保持范围掩膜：单线程 0.378 s，自动并行 0.0755 s，约 5.01×；串并行校验和误差为 0。收益受多边形复杂度、CPU、内存带宽和块高影响，不是固定承诺。</w:t>
+      </w:r>
+    </w:p>
+    <w:p>
+      <w:pPr>
+        <w:pStyle w:val="Heading2"/>
+      </w:pPr>
+      <w:r>
+        <w:t>4.13A 精确三角面裁剪、曲面配准与自适应误差</w:t>
+      </w:r>
+    </w:p>
+    <w:p>
+      <w:r>
+        <w:rPr>
+          <w:rFonts w:ascii="Calibri" w:hAnsi="Calibri" w:eastAsia="Microsoft YaHei"/>
+        </w:rPr>
+        <w:t>dt_tin_clip_polygon_exact() 与 dt_cdt_clip_polygon_exact() 接收一个外环和零个或多个孔洞。实现先用多边形包围盒查询 TIN/CDT 范围索引，再逐候选三角形求解析交集。结果保留 piece→ring→XYZ 层级；孔洞不会被三角扇填满，交点 Z 来自源三角面平面插值，exact_plan_area 是外环减孔洞后的面积和。</w:t>
+      </w:r>
+    </w:p>
+    <w:p>
+      <w:pPr>
+        <w:pStyle w:val="DterrainCode"/>
+        <w:shd w:fill="F2F4F7"/>
+      </w:pPr>
+      <w:r>
+        <w:rPr>
+          <w:rFonts w:ascii="Consolas" w:hAnsi="Consolas" w:eastAsia="Microsoft YaHei"/>
+          <w:sz w:val="17"/>
+        </w:rPr>
+        <w:t>uint64_t offsets[] = {0, outer_count, outer_count + hole_count};</w:t>
+      </w:r>
+      <w:r>
+        <w:br/>
+      </w:r>
+      <w:r>
+        <w:rPr>
+          <w:rFonts w:ascii="Consolas" w:hAnsi="Consolas" w:eastAsia="Microsoft YaHei"/>
+          <w:sz w:val="17"/>
+        </w:rPr>
+        <w:t>dt_polygon_rings polygon{sizeof(dt_polygon_rings), 0,</w:t>
+      </w:r>
+      <w:r>
+        <w:br/>
+      </w:r>
+      <w:r>
+        <w:rPr>
+          <w:rFonts w:ascii="Consolas" w:hAnsi="Consolas" w:eastAsia="Microsoft YaHei"/>
+          <w:sz w:val="17"/>
+        </w:rPr>
+        <w:t xml:space="preserve">                         points, point_count, offsets, 2, {0, 0}};</w:t>
+      </w:r>
+      <w:r>
+        <w:br/>
+      </w:r>
+      <w:r>
+        <w:rPr>
+          <w:rFonts w:ascii="Consolas" w:hAnsi="Consolas" w:eastAsia="Microsoft YaHei"/>
+          <w:sz w:val="17"/>
+        </w:rPr>
+        <w:t>dt_surface_clip_result clipped = nullptr;</w:t>
+      </w:r>
+      <w:r>
+        <w:br/>
+      </w:r>
+      <w:r>
+        <w:rPr>
+          <w:rFonts w:ascii="Consolas" w:hAnsi="Consolas" w:eastAsia="Microsoft YaHei"/>
+          <w:sz w:val="17"/>
+        </w:rPr>
+        <w:t>dt_tin_clip_polygon_exact(tin, &amp;polygon, &amp;clipped);</w:t>
+      </w:r>
+      <w:r>
+        <w:br/>
+      </w:r>
+      <w:r>
+        <w:rPr>
+          <w:rFonts w:ascii="Consolas" w:hAnsi="Consolas" w:eastAsia="Microsoft YaHei"/>
+          <w:sz w:val="17"/>
+        </w:rPr>
+        <w:t>dt_surface_clip_result_view view{};</w:t>
+      </w:r>
+      <w:r>
+        <w:br/>
+      </w:r>
+      <w:r>
+        <w:rPr>
+          <w:rFonts w:ascii="Consolas" w:hAnsi="Consolas" w:eastAsia="Microsoft YaHei"/>
+          <w:sz w:val="17"/>
+        </w:rPr>
+        <w:t>dt_surface_clip_result_get_view(clipped, &amp;view);</w:t>
+      </w:r>
+      <w:r>
+        <w:br/>
+      </w:r>
+      <w:r>
+        <w:rPr>
+          <w:rFonts w:ascii="Consolas" w:hAnsi="Consolas" w:eastAsia="Microsoft YaHei"/>
+          <w:sz w:val="17"/>
+        </w:rPr>
+        <w:t>dt_surface_clip_result_destroy(clipped);</w:t>
+      </w:r>
+    </w:p>
+    <w:p>
+      <w:r>
+        <w:rPr>
+          <w:rFonts w:ascii="Calibri" w:hAnsi="Calibri" w:eastAsia="Microsoft YaHei"/>
+        </w:rPr>
+        <w:t>dt_grid_register_surface() 使用共同的确定性 Halton 样本，由粗到细估计施加到移动面的 XY 平移；ESTIMATE_Z_OFFSET 为每个候选拟合常量 DZ。约定是 (x+dx,y+dy,z+dz)，因此参考位置从原移动面的 (x-dx,y-dy) 采样。dt_grid_apply_registration() 将结果双线性重采样到参考 GRID 的完整六参数仿射。</w:t>
+      </w:r>
+    </w:p>
+    <w:p>
+      <w:pPr>
+        <w:pStyle w:val="DterrainCode"/>
+        <w:shd w:fill="F2F4F7"/>
+      </w:pPr>
+      <w:r>
+        <w:rPr>
+          <w:rFonts w:ascii="Consolas" w:hAnsi="Consolas" w:eastAsia="Microsoft YaHei"/>
+          <w:sz w:val="17"/>
+        </w:rPr>
+        <w:t>dt_surface_registration_options ro{};</w:t>
+      </w:r>
+      <w:r>
+        <w:br/>
+      </w:r>
+      <w:r>
+        <w:rPr>
+          <w:rFonts w:ascii="Consolas" w:hAnsi="Consolas" w:eastAsia="Microsoft YaHei"/>
+          <w:sz w:val="17"/>
+        </w:rPr>
+        <w:t>ro.struct_size = sizeof(ro);</w:t>
+      </w:r>
+      <w:r>
+        <w:br/>
+      </w:r>
+      <w:r>
+        <w:rPr>
+          <w:rFonts w:ascii="Consolas" w:hAnsi="Consolas" w:eastAsia="Microsoft YaHei"/>
+          <w:sz w:val="17"/>
+        </w:rPr>
+        <w:t>ro.flags = DT_SURFACE_REGISTRATION_ESTIMATE_Z_OFFSET;</w:t>
+      </w:r>
+      <w:r>
+        <w:br/>
+      </w:r>
+      <w:r>
+        <w:rPr>
+          <w:rFonts w:ascii="Consolas" w:hAnsi="Consolas" w:eastAsia="Microsoft YaHei"/>
+          <w:sz w:val="17"/>
+        </w:rPr>
+        <w:t>ro.sample_budget = 4096;</w:t>
+      </w:r>
+      <w:r>
+        <w:br/>
+      </w:r>
+      <w:r>
+        <w:rPr>
+          <w:rFonts w:ascii="Consolas" w:hAnsi="Consolas" w:eastAsia="Microsoft YaHei"/>
+          <w:sz w:val="17"/>
+        </w:rPr>
+        <w:t>dt_surface_registration_result rr{};</w:t>
+      </w:r>
+      <w:r>
+        <w:br/>
+      </w:r>
+      <w:r>
+        <w:rPr>
+          <w:rFonts w:ascii="Consolas" w:hAnsi="Consolas" w:eastAsia="Microsoft YaHei"/>
+          <w:sz w:val="17"/>
+        </w:rPr>
+        <w:t>dt_grid_register_surface(reference, moving, &amp;ro, &amp;rr);</w:t>
+      </w:r>
+      <w:r>
+        <w:br/>
+      </w:r>
+      <w:r>
+        <w:rPr>
+          <w:rFonts w:ascii="Consolas" w:hAnsi="Consolas" w:eastAsia="Microsoft YaHei"/>
+          <w:sz w:val="17"/>
+        </w:rPr>
+        <w:t>dt_grid_handle aligned = nullptr;</w:t>
+      </w:r>
+      <w:r>
+        <w:br/>
+      </w:r>
+      <w:r>
+        <w:rPr>
+          <w:rFonts w:ascii="Consolas" w:hAnsi="Consolas" w:eastAsia="Microsoft YaHei"/>
+          <w:sz w:val="17"/>
+        </w:rPr>
+        <w:t>dt_grid_apply_registration(moving, reference, &amp;rr, &amp;aligned);</w:t>
+      </w:r>
+    </w:p>
+    <w:p>
+      <w:r>
+        <w:rPr>
+          <w:rFonts w:ascii="Calibri" w:hAnsi="Calibri" w:eastAsia="Microsoft YaHei"/>
+        </w:rPr>
+        <w:t>dt_grid_compare_surface_adaptive() 累积误差极值、均值、MAE、RMSE、最大绝对误差和覆盖率，并由平方误差的二阶/四阶矩估计 RMSE 标准误差。达到 target_rmse_standard_error 后设置 DT_SURFACE_ERROR_CONVERGED 并提前停止，否则使用到 maximum_samples。</w:t>
+      </w:r>
+    </w:p>
+    <w:p>
+      <w:pPr>
+        <w:spacing w:before="100" w:after="160" w:line="288" w:lineRule="auto"/>
+        <w:ind w:left="230" w:right="230"/>
+        <w:shd w:fill="FFF7E0"/>
+      </w:pPr>
+      <w:r>
+        <w:rPr>
+          <w:rFonts w:ascii="Calibri" w:hAnsi="Calibri" w:eastAsia="Microsoft YaHei"/>
+          <w:b/>
+          <w:color w:val="7A5A00"/>
+        </w:rPr>
+        <w:t xml:space="preserve">模型边界  </w:t>
+      </w:r>
+      <w:r>
+        <w:rPr>
+          <w:rFonts w:ascii="Calibri" w:hAnsi="Calibri" w:eastAsia="Microsoft YaHei"/>
+        </w:rPr>
+        <w:t>配准只估计 XYZ 平移，不估计旋转、尺度或非刚性形变，也不隐式重投影 CRS。强空间自相关下的 RMSE 标准误差不能替代项目控制点和行业统计规范。精确裁剪结果保留多边形环；若调用方需要 GPU 三角形，应使用支持孔洞的三角化器。</w:t>
       </w:r>
     </w:p>
     <w:p>
@@ -20975,7 +21194,7 @@
         <w:color w:val="66727D"/>
         <w:sz w:val="18"/>
       </w:rPr>
-      <w:t xml:space="preserve">版本 0.70.0  |  第 </w:t>
+      <w:t xml:space="preserve">版本 0.85.0  |  第 </w:t>
     </w:r>
     <w:r>
       <w:rPr>

</xml_diff>

<commit_message>
release: prepare dterrain 1.0 SDK
</commit_message>
<xml_diff>
--- a/docs/manuals/dterrain_DLL开发使用手册.docx
+++ b/docs/manuals/dterrain_DLL开发使用手册.docx
@@ -85,7 +85,7 @@
           <w:color w:val="203748"/>
           <w:sz w:val="22"/>
         </w:rPr>
-        <w:t>版本 0.85.0  |  2026-07-19</w:t>
+        <w:t>版本 1.0.0  |  2026-07-19</w:t>
       </w:r>
     </w:p>
     <w:p>
@@ -243,7 +243,7 @@
                 <w:rFonts w:ascii="Calibri" w:hAnsi="Calibri" w:eastAsia="Microsoft YaHei"/>
                 <w:sz w:val="18"/>
               </w:rPr>
-              <w:t>0.85.0</w:t>
+              <w:t>1.0.0</w:t>
             </w:r>
           </w:p>
         </w:tc>
@@ -665,7 +665,7 @@
         <w:rPr>
           <w:rFonts w:ascii="Calibri" w:hAnsi="Calibri" w:eastAsia="Microsoft YaHei"/>
         </w:rPr>
-        <w:t>本手册对应 dterrain 0.85.0：新增 TIN/CDT 多环精确边界裁剪、双 GRID 2.5D 平移配准、配准后重采样和带 RMSE 标准误差停止条件的自适应误差评估；v0.70 CDT/DCDTB、v0.55 CRS 重投影及全部旧 DLL 接口保持兼容。</w:t>
+        <w:t>本手册对应 dterrain 1.0.0：提供可安装 CMake SDK、统一 C/C++ 入口、RAII 包装、DLL 导出门禁、独立下游集成验证和目标规模发布验收；v0.85 精确裁剪/配准、v0.70 CDT/DCDTB、v0.55 CRS 重投影及全部旧 DLL 接口保持兼容。</w:t>
       </w:r>
     </w:p>
     <w:p>
@@ -20567,6 +20567,126 @@
     </w:p>
     <w:p>
       <w:pPr>
+        <w:pStyle w:val="Heading2"/>
+      </w:pPr>
+      <w:r>
+        <w:t>9.3 v1.0 SDK 安装后验收</w:t>
+      </w:r>
+    </w:p>
+    <w:p>
+      <w:r>
+        <w:rPr>
+          <w:rFonts w:ascii="Calibri" w:hAnsi="Calibri" w:eastAsia="Microsoft YaHei"/>
+        </w:rPr>
+        <w:t>v1.0 不再只验证源码树内链接。安装规则提供 dterrain::dterrain CMake 目标、统一 dterrain.h、C++17 dterrain.hpp、示例源码和版本配置；tests/sdk_consumer 在独立构建目录中只通过 find_package(dterrain 1 CONFIG REQUIRED) 消费安装树。</w:t>
+      </w:r>
+    </w:p>
+    <w:p>
+      <w:pPr>
+        <w:pStyle w:val="DterrainCode"/>
+        <w:shd w:fill="F2F4F7"/>
+      </w:pPr>
+      <w:r>
+        <w:rPr>
+          <w:rFonts w:ascii="Consolas" w:hAnsi="Consolas" w:eastAsia="Microsoft YaHei"/>
+          <w:sz w:val="17"/>
+        </w:rPr>
+        <w:t>$env:VCPKG_ROOT = "E:/dev/vcpkg"</w:t>
+      </w:r>
+      <w:r>
+        <w:br/>
+      </w:r>
+      <w:r>
+        <w:rPr>
+          <w:rFonts w:ascii="Consolas" w:hAnsi="Consolas" w:eastAsia="Microsoft YaHei"/>
+          <w:sz w:val="17"/>
+        </w:rPr>
+        <w:t>./tools/run_release_acceptance.ps1</w:t>
+      </w:r>
+      <w:r>
+        <w:br/>
+      </w:r>
+      <w:r>
+        <w:rPr>
+          <w:rFonts w:ascii="Consolas" w:hAnsi="Consolas" w:eastAsia="Microsoft YaHei"/>
+          <w:sz w:val="17"/>
+        </w:rPr>
+      </w:r>
+      <w:r>
+        <w:br/>
+      </w:r>
+      <w:r>
+        <w:rPr>
+          <w:rFonts w:ascii="Consolas" w:hAnsi="Consolas" w:eastAsia="Microsoft YaHei"/>
+          <w:sz w:val="17"/>
+        </w:rPr>
+        <w:t># 自定义低负载试跑</w:t>
+      </w:r>
+      <w:r>
+        <w:br/>
+      </w:r>
+      <w:r>
+        <w:rPr>
+          <w:rFonts w:ascii="Consolas" w:hAnsi="Consolas" w:eastAsia="Microsoft YaHei"/>
+          <w:sz w:val="17"/>
+        </w:rPr>
+        <w:t>./tools/run_release_acceptance.ps1 `</w:t>
+      </w:r>
+      <w:r>
+        <w:br/>
+      </w:r>
+      <w:r>
+        <w:rPr>
+          <w:rFonts w:ascii="Consolas" w:hAnsi="Consolas" w:eastAsia="Microsoft YaHei"/>
+          <w:sz w:val="17"/>
+        </w:rPr>
+        <w:t xml:space="preserve">  -StressPoints 100000 -StressGridSide 2048 -SkipGdal</w:t>
+      </w:r>
+    </w:p>
+    <w:p>
+      <w:pPr>
+        <w:spacing w:before="100" w:after="160" w:line="288" w:lineRule="auto"/>
+        <w:ind w:left="230" w:right="230"/>
+        <w:shd w:fill="E8EEF5"/>
+      </w:pPr>
+      <w:r>
+        <w:rPr>
+          <w:rFonts w:ascii="Calibri" w:hAnsi="Calibri" w:eastAsia="Microsoft YaHei"/>
+          <w:b/>
+          <w:color w:val="1F4D78"/>
+        </w:rPr>
+        <w:t xml:space="preserve">自动门禁  </w:t>
+      </w:r>
+      <w:r>
+        <w:rPr>
+          <w:rFonts w:ascii="Calibri" w:hAnsi="Calibri" w:eastAsia="Microsoft YaHei"/>
+        </w:rPr>
+        <w:t>脚本依次执行核心/GDAL Release、两轮 16 项 CTest、31 个关键 DLL 导出检查、安装后消费工程、百万点 TIN 与 4096² GRID/DGRIDB 压力流程，并从同一安装规则生成 ZIP SDK。压力数值是机器基线而非跨硬件承诺。</w:t>
+      </w:r>
+    </w:p>
+    <w:p>
+      <w:pPr>
+        <w:spacing w:before="100" w:after="160" w:line="288" w:lineRule="auto"/>
+        <w:ind w:left="230" w:right="230"/>
+        <w:shd w:fill="FFF7E0"/>
+      </w:pPr>
+      <w:r>
+        <w:rPr>
+          <w:rFonts w:ascii="Calibri" w:hAnsi="Calibri" w:eastAsia="Microsoft YaHei"/>
+          <w:b/>
+          <w:color w:val="7A5A00"/>
+        </w:rPr>
+        <w:t xml:space="preserve">二进制兼容  </w:t>
+      </w:r>
+      <w:r>
+        <w:rPr>
+          <w:rFonts w:ascii="Calibri" w:hAnsi="Calibri" w:eastAsia="Microsoft YaHei"/>
+        </w:rPr>
+        <w:t>跨 DLL 边界继续只使用 C ABI、固定宽度整数、POD 结构和不透明句柄。所有可扩展结构应先清零并填写 struct_size；C++ RAII 只在调用方头文件层工作，不改变 DLL ABI。</w:t>
+      </w:r>
+    </w:p>
+    <w:p>
+      <w:pPr>
         <w:pStyle w:val="Heading1"/>
       </w:pPr>
       <w:r>
@@ -21194,7 +21314,7 @@
         <w:color w:val="66727D"/>
         <w:sz w:val="18"/>
       </w:rPr>
-      <w:t xml:space="preserve">版本 0.85.0  |  第 </w:t>
+      <w:t xml:space="preserve">版本 1.0.0  |  第 </w:t>
     </w:r>
     <w:r>
       <w:rPr>

</xml_diff>